<commit_message>
Fix classification for superseded PRs, add claude-mem and add tests
</commit_message>
<xml_diff>
--- a/resume.docx
+++ b/resume.docx
@@ -2029,7 +2029,7 @@
       <w:pPr>
         <w:spacing w:before="60" w:line="276" w:lineRule="auto"/>
         <w:rPr>
-          <w:rFonts w:ascii="HelveticaNeueLT Pro 55 Roman" w:hAnsi="HelveticaNeueLT Pro 55 Roman" w:cs="Arial"/>
+          <w:rFonts w:ascii="HelveticaNeueLT Pro 55 Roman" w:hAnsi="HelveticaNeueLT Pro 55 Roman"/>
           <w:sz w:val="22"/>
           <w:szCs w:val="22"/>
         </w:rPr>
@@ -2040,7 +2040,23 @@
           <w:sz w:val="22"/>
           <w:szCs w:val="22"/>
         </w:rPr>
-        <w:t xml:space="preserve">150+ PRs across </w:t>
+        <w:t xml:space="preserve">150+ PRs </w:t>
+      </w:r>
+      <w:r>
+        <w:rPr>
+          <w:rFonts w:ascii="HelveticaNeueLT Pro 55 Roman" w:hAnsi="HelveticaNeueLT Pro 55 Roman"/>
+          <w:sz w:val="22"/>
+          <w:szCs w:val="22"/>
+        </w:rPr>
+        <w:t>to</w:t>
+      </w:r>
+      <w:r>
+        <w:rPr>
+          <w:rFonts w:ascii="HelveticaNeueLT Pro 55 Roman" w:hAnsi="HelveticaNeueLT Pro 55 Roman"/>
+          <w:sz w:val="22"/>
+          <w:szCs w:val="22"/>
+        </w:rPr>
+        <w:t xml:space="preserve"> </w:t>
       </w:r>
       <w:proofErr w:type="spellStart"/>
       <w:r>
@@ -2090,7 +2106,7 @@
           <w:sz w:val="22"/>
           <w:szCs w:val="22"/>
         </w:rPr>
-        <w:t xml:space="preserve"> to </w:t>
+        <w:t xml:space="preserve"> </w:t>
       </w:r>
       <w:r>
         <w:rPr>
@@ -2098,26 +2114,52 @@
           <w:sz w:val="22"/>
           <w:szCs w:val="22"/>
         </w:rPr>
-        <w:t xml:space="preserve">agent UX, reliability, streaming behavior, provider infrastructure, security hardening and other production-facing </w:t>
-      </w:r>
-      <w:proofErr w:type="gramStart"/>
+        <w:t>for</w:t>
+      </w:r>
       <w:r>
         <w:rPr>
           <w:rFonts w:ascii="HelveticaNeueLT Pro 55 Roman" w:hAnsi="HelveticaNeueLT Pro 55 Roman"/>
           <w:sz w:val="22"/>
           <w:szCs w:val="22"/>
         </w:rPr>
-        <w:t>open source</w:t>
-      </w:r>
-      <w:proofErr w:type="gramEnd"/>
+        <w:t xml:space="preserve"> </w:t>
+      </w:r>
       <w:r>
         <w:rPr>
           <w:rFonts w:ascii="HelveticaNeueLT Pro 55 Roman" w:hAnsi="HelveticaNeueLT Pro 55 Roman"/>
           <w:sz w:val="22"/>
           <w:szCs w:val="22"/>
         </w:rPr>
-        <w:t xml:space="preserve"> work. </w:t>
-      </w:r>
+        <w:t>agent UX, reliability, streaming behavior, provider infrastructure, security hardening and other production-facing work</w:t>
+      </w:r>
+      <w:r>
+        <w:rPr>
+          <w:rFonts w:ascii="HelveticaNeueLT Pro 55 Roman" w:hAnsi="HelveticaNeueLT Pro 55 Roman"/>
+          <w:sz w:val="22"/>
+          <w:szCs w:val="22"/>
+        </w:rPr>
+        <w:t>:</w:t>
+      </w:r>
+      <w:r>
+        <w:rPr>
+          <w:rFonts w:ascii="HelveticaNeueLT Pro 55 Roman" w:hAnsi="HelveticaNeueLT Pro 55 Roman"/>
+          <w:sz w:val="22"/>
+          <w:szCs w:val="22"/>
+        </w:rPr>
+        <w:t xml:space="preserve"> </w:t>
+      </w:r>
+      <w:hyperlink r:id="rId10" w:history="1">
+        <w:r>
+          <w:rPr>
+            <w:rStyle w:val="Hyperlink"/>
+            <w:rFonts w:ascii="HelveticaNeueLT Pro 55 Roman" w:hAnsi="HelveticaNeueLT Pro 55 Roman"/>
+            <w:color w:val="auto"/>
+            <w:sz w:val="22"/>
+            <w:szCs w:val="22"/>
+          </w:rPr>
+          <w:t>https://basedin.nyc/pr-stats</w:t>
+        </w:r>
+      </w:hyperlink>
     </w:p>
     <w:p>
       <w:pPr>
@@ -4251,7 +4293,6 @@
   <w:style w:type="character" w:default="1" w:styleId="DefaultParagraphFont">
     <w:name w:val="Default Paragraph Font"/>
     <w:uiPriority w:val="1"/>
-    <w:semiHidden/>
     <w:unhideWhenUsed/>
   </w:style>
   <w:style w:type="table" w:default="1" w:styleId="TableNormal">

</xml_diff>

<commit_message>
Update resume to latest and stats to reflect actual shipped for all contributors
</commit_message>
<xml_diff>
--- a/resume.docx
+++ b/resume.docx
@@ -427,25 +427,7 @@
                 <w:sz w:val="22"/>
                 <w:szCs w:val="20"/>
               </w:rPr>
-              <w:t xml:space="preserve">WordPress Core contributor and architect of </w:t>
-            </w:r>
-            <w:proofErr w:type="gramStart"/>
-            <w:r>
-              <w:rPr>
-                <w:rFonts w:ascii="HelveticaNeueLT Pro 55 Roman" w:hAnsi="HelveticaNeueLT Pro 55 Roman" w:cs="Arial"/>
-                <w:sz w:val="22"/>
-                <w:szCs w:val="20"/>
-              </w:rPr>
-              <w:t>the WordPress.com</w:t>
-            </w:r>
-            <w:proofErr w:type="gramEnd"/>
-            <w:r>
-              <w:rPr>
-                <w:rFonts w:ascii="HelveticaNeueLT Pro 55 Roman" w:hAnsi="HelveticaNeueLT Pro 55 Roman" w:cs="Arial"/>
-                <w:sz w:val="22"/>
-                <w:szCs w:val="20"/>
-              </w:rPr>
-              <w:t xml:space="preserve"> VIP Partnership at NBC Sports.</w:t>
+              <w:t>WordPress Core contributor and architect of the WordPress.com VIP Partnership at NBC Sports.</w:t>
             </w:r>
           </w:p>
           <w:p>
@@ -461,59 +443,13 @@
                 <w:szCs w:val="20"/>
               </w:rPr>
             </w:pPr>
-            <w:proofErr w:type="gramStart"/>
             <w:r>
               <w:rPr>
                 <w:rFonts w:ascii="HelveticaNeueLT Pro 55 Roman" w:hAnsi="HelveticaNeueLT Pro 55 Roman" w:cs="Arial"/>
                 <w:sz w:val="22"/>
                 <w:szCs w:val="20"/>
               </w:rPr>
-              <w:t>Open source</w:t>
-            </w:r>
-            <w:proofErr w:type="gramEnd"/>
-            <w:r>
-              <w:rPr>
-                <w:rFonts w:ascii="HelveticaNeueLT Pro 55 Roman" w:hAnsi="HelveticaNeueLT Pro 55 Roman" w:cs="Arial"/>
-                <w:sz w:val="22"/>
-                <w:szCs w:val="20"/>
-              </w:rPr>
-              <w:t xml:space="preserve"> maintainer in the MCP ecosystem: top contributor to </w:t>
-            </w:r>
-            <w:proofErr w:type="spellStart"/>
-            <w:r>
-              <w:rPr>
-                <w:rFonts w:ascii="HelveticaNeueLT Pro 55 Roman" w:hAnsi="HelveticaNeueLT Pro 55 Roman" w:cs="Arial"/>
-                <w:sz w:val="22"/>
-                <w:szCs w:val="20"/>
-              </w:rPr>
-              <w:t>claude</w:t>
-            </w:r>
-            <w:proofErr w:type="spellEnd"/>
-            <w:r>
-              <w:rPr>
-                <w:rFonts w:ascii="HelveticaNeueLT Pro 55 Roman" w:hAnsi="HelveticaNeueLT Pro 55 Roman" w:cs="Arial"/>
-                <w:sz w:val="22"/>
-                <w:szCs w:val="20"/>
-              </w:rPr>
-              <w:t xml:space="preserve">-mem (77K+ stars) and maintainer of </w:t>
-            </w:r>
-            <w:proofErr w:type="spellStart"/>
-            <w:r>
-              <w:rPr>
-                <w:rFonts w:ascii="HelveticaNeueLT Pro 55 Roman" w:hAnsi="HelveticaNeueLT Pro 55 Roman" w:cs="Arial"/>
-                <w:sz w:val="22"/>
-                <w:szCs w:val="20"/>
-              </w:rPr>
-              <w:t>mcp</w:t>
-            </w:r>
-            <w:proofErr w:type="spellEnd"/>
-            <w:r>
-              <w:rPr>
-                <w:rFonts w:ascii="HelveticaNeueLT Pro 55 Roman" w:hAnsi="HelveticaNeueLT Pro 55 Roman" w:cs="Arial"/>
-                <w:sz w:val="22"/>
-                <w:szCs w:val="20"/>
-              </w:rPr>
-              <w:t>-memory-service (1.9K+ stars).</w:t>
+              <w:t>Open source maintainer in the MCP ecosystem: top contributor to claude-mem (77K+ stars) and maintainer of mcp-memory-service (1.9K+ stars).</w:t>
             </w:r>
           </w:p>
           <w:p>
@@ -636,7 +572,6 @@
                 <w:rFonts w:ascii="HelveticaNeueLT Pro 55 Roman" w:hAnsi="HelveticaNeueLT Pro 55 Roman" w:cs="Arial"/>
               </w:rPr>
             </w:pPr>
-            <w:proofErr w:type="spellStart"/>
             <w:r>
               <w:rPr>
                 <w:rFonts w:ascii="HelveticaNeueLT Pro 55 Roman" w:hAnsi="HelveticaNeueLT Pro 55 Roman" w:cs="Arial"/>
@@ -645,7 +580,6 @@
               </w:rPr>
               <w:t>Inkreel</w:t>
             </w:r>
-            <w:proofErr w:type="spellEnd"/>
             <w:r>
               <w:rPr>
                 <w:rFonts w:ascii="HelveticaNeueLT Pro 55 Roman" w:hAnsi="HelveticaNeueLT Pro 55 Roman" w:cs="Arial"/>
@@ -658,46 +592,17 @@
               </w:rPr>
               <w:t>(</w:t>
             </w:r>
-            <w:proofErr w:type="spellStart"/>
-            <w:r>
-              <w:rPr>
-                <w:rFonts w:ascii="HelveticaNeueLT Pro 55 Roman" w:hAnsi="HelveticaNeueLT Pro 55 Roman" w:cs="Arial"/>
-              </w:rPr>
-              <w:fldChar w:fldCharType="begin"/>
-            </w:r>
-            <w:r>
-              <w:rPr>
-                <w:rFonts w:ascii="HelveticaNeueLT Pro 55 Roman" w:hAnsi="HelveticaNeueLT Pro 55 Roman" w:cs="Arial"/>
-              </w:rPr>
-              <w:instrText xml:space="preserve"> HYPERLINK "https://basedin.nyc/" </w:instrText>
-            </w:r>
-            <w:r>
-              <w:rPr>
-                <w:rFonts w:ascii="HelveticaNeueLT Pro 55 Roman" w:hAnsi="HelveticaNeueLT Pro 55 Roman" w:cs="Arial"/>
-              </w:rPr>
-            </w:r>
-            <w:r>
-              <w:rPr>
-                <w:rFonts w:ascii="HelveticaNeueLT Pro 55 Roman" w:hAnsi="HelveticaNeueLT Pro 55 Roman" w:cs="Arial"/>
-              </w:rPr>
-              <w:fldChar w:fldCharType="separate"/>
-            </w:r>
-            <w:r>
-              <w:rPr>
-                <w:rStyle w:val="Hyperlink"/>
-                <w:rFonts w:ascii="HelveticaNeueLT Pro 55 Roman" w:hAnsi="HelveticaNeueLT Pro 55 Roman" w:cs="Arial"/>
-                <w:color w:val="auto"/>
-                <w:u w:val="none"/>
-              </w:rPr>
-              <w:t>basedin.nyc</w:t>
-            </w:r>
-            <w:proofErr w:type="spellEnd"/>
-            <w:r>
-              <w:rPr>
-                <w:rFonts w:ascii="HelveticaNeueLT Pro 55 Roman" w:hAnsi="HelveticaNeueLT Pro 55 Roman" w:cs="Arial"/>
-              </w:rPr>
-              <w:fldChar w:fldCharType="end"/>
-            </w:r>
+            <w:hyperlink r:id="rId10" w:history="1">
+              <w:r>
+                <w:rPr>
+                  <w:rStyle w:val="Hyperlink"/>
+                  <w:rFonts w:ascii="HelveticaNeueLT Pro 55 Roman" w:hAnsi="HelveticaNeueLT Pro 55 Roman" w:cs="Arial"/>
+                  <w:color w:val="auto"/>
+                  <w:u w:val="none"/>
+                </w:rPr>
+                <w:t>basedin.nyc</w:t>
+              </w:r>
+            </w:hyperlink>
             <w:r>
               <w:rPr>
                 <w:rFonts w:ascii="HelveticaNeueLT Pro 55 Roman" w:hAnsi="HelveticaNeueLT Pro 55 Roman" w:cs="Arial"/>
@@ -1041,39 +946,7 @@
           <w:rFonts w:ascii="HelveticaNeueLT Pro 55 Roman" w:hAnsi="HelveticaNeueLT Pro 55 Roman"/>
           <w:sz w:val="18"/>
         </w:rPr>
-        <w:t>React, Vite, Tailwind CSS, Node.js/Express, OpenAI API, Firebase, MS SQL Server (</w:t>
-      </w:r>
-      <w:proofErr w:type="spellStart"/>
-      <w:r>
-        <w:rPr>
-          <w:rFonts w:ascii="HelveticaNeueLT Pro 55 Roman" w:hAnsi="HelveticaNeueLT Pro 55 Roman"/>
-          <w:sz w:val="18"/>
-        </w:rPr>
-        <w:t>FreeTDS</w:t>
-      </w:r>
-      <w:proofErr w:type="spellEnd"/>
-      <w:r>
-        <w:rPr>
-          <w:rFonts w:ascii="HelveticaNeueLT Pro 55 Roman" w:hAnsi="HelveticaNeueLT Pro 55 Roman"/>
-          <w:sz w:val="18"/>
-        </w:rPr>
-        <w:t xml:space="preserve">), </w:t>
-      </w:r>
-      <w:proofErr w:type="spellStart"/>
-      <w:r>
-        <w:rPr>
-          <w:rFonts w:ascii="HelveticaNeueLT Pro 55 Roman" w:hAnsi="HelveticaNeueLT Pro 55 Roman"/>
-          <w:sz w:val="18"/>
-        </w:rPr>
-        <w:t>TanStack</w:t>
-      </w:r>
-      <w:proofErr w:type="spellEnd"/>
-      <w:r>
-        <w:rPr>
-          <w:rFonts w:ascii="HelveticaNeueLT Pro 55 Roman" w:hAnsi="HelveticaNeueLT Pro 55 Roman"/>
-          <w:sz w:val="18"/>
-        </w:rPr>
-        <w:t xml:space="preserve"> Query.</w:t>
+        <w:t>React, Vite, Tailwind CSS, Node.js/Express, OpenAI API, Firebase, MS SQL Server (FreeTDS), TanStack Query.</w:t>
       </w:r>
     </w:p>
     <w:p>
@@ -1283,25 +1156,7 @@
           <w:bCs/>
           <w:sz w:val="18"/>
         </w:rPr>
-        <w:t>Next.js (App Router), React, Tailwind CSS, Node.js Worker Threads, Leaflet/</w:t>
-      </w:r>
-      <w:proofErr w:type="spellStart"/>
-      <w:r>
-        <w:rPr>
-          <w:rFonts w:ascii="HelveticaNeueLT Pro 55 Roman" w:hAnsi="HelveticaNeueLT Pro 55 Roman"/>
-          <w:bCs/>
-          <w:sz w:val="18"/>
-        </w:rPr>
-        <w:t>Mapbox</w:t>
-      </w:r>
-      <w:proofErr w:type="spellEnd"/>
-      <w:r>
-        <w:rPr>
-          <w:rFonts w:ascii="HelveticaNeueLT Pro 55 Roman" w:hAnsi="HelveticaNeueLT Pro 55 Roman"/>
-          <w:bCs/>
-          <w:sz w:val="18"/>
-        </w:rPr>
-        <w:t>, Turf.js, MS SQL Server.</w:t>
+        <w:t>Next.js (App Router), React, Tailwind CSS, Node.js Worker Threads, Leaflet/Mapbox, Turf.js, MS SQL Server.</w:t>
       </w:r>
     </w:p>
     <w:p>
@@ -1454,7 +1309,6 @@
                 <w:i/>
               </w:rPr>
             </w:pPr>
-            <w:proofErr w:type="spellStart"/>
             <w:r>
               <w:rPr>
                 <w:rFonts w:ascii="HelveticaNeueLT Pro 55 Roman" w:hAnsi="HelveticaNeueLT Pro 55 Roman" w:cs="Arial"/>
@@ -1463,7 +1317,6 @@
               </w:rPr>
               <w:t>Mezocliq</w:t>
             </w:r>
-            <w:proofErr w:type="spellEnd"/>
           </w:p>
         </w:tc>
         <w:tc>
@@ -1632,25 +1485,7 @@
           <w:sz w:val="22"/>
           <w:szCs w:val="20"/>
         </w:rPr>
-        <w:t xml:space="preserve">Practice </w:t>
-      </w:r>
-      <w:proofErr w:type="gramStart"/>
-      <w:r>
-        <w:rPr>
-          <w:rFonts w:ascii="HelveticaNeueLT Pro 55 Roman" w:hAnsi="HelveticaNeueLT Pro 55 Roman" w:cs="Arial"/>
-          <w:sz w:val="22"/>
-          <w:szCs w:val="20"/>
-        </w:rPr>
-        <w:t>lead</w:t>
-      </w:r>
-      <w:proofErr w:type="gramEnd"/>
-      <w:r>
-        <w:rPr>
-          <w:rFonts w:ascii="HelveticaNeueLT Pro 55 Roman" w:hAnsi="HelveticaNeueLT Pro 55 Roman" w:cs="Arial"/>
-          <w:sz w:val="22"/>
-          <w:szCs w:val="20"/>
-        </w:rPr>
-        <w:t xml:space="preserve"> of full-stack development spanning frontend, mobile, UX/IA, backend, and server configuration. Supervised and mentored developers across parallel client engagements.</w:t>
+        <w:t>Practice lead of full-stack development spanning frontend, mobile, UX/IA, backend, and server configuration. Supervised and mentored developers across parallel client engagements.</w:t>
       </w:r>
     </w:p>
     <w:p>
@@ -1922,7 +1757,7 @@
           <w:sz w:val="22"/>
           <w:szCs w:val="20"/>
         </w:rPr>
-        <w:t>Managed NBCSports.com relaunch and led frontend development. Code designated “best in class” by 360i in comScore’s Top 10 Digital Media Sports.</w:t>
+        <w:t>Established the WordPress.com VIP Partnership with Automattic and contributed to WordPress Core. Brought development in-house, reducing costs and improving delivery speed.</w:t>
       </w:r>
     </w:p>
     <w:p>
@@ -1945,7 +1780,7 @@
           <w:sz w:val="22"/>
           <w:szCs w:val="20"/>
         </w:rPr>
-        <w:t>Designed NBCOlympics.com video player, viewed 1.3 billion times by 50 million people.</w:t>
+        <w:t>Managed NBCSports.com relaunch and led frontend development. Code designated “best in class” by 360i in comScore’s Top 10 Digital Media Sports.</w:t>
       </w:r>
     </w:p>
     <w:p>
@@ -1968,7 +1803,7 @@
           <w:sz w:val="22"/>
           <w:szCs w:val="20"/>
         </w:rPr>
-        <w:t>Established the WordPress.com VIP Partnership with Automattic and contributed to WordPress Core. Brought development in-house, reducing costs and improving delivery speed.</w:t>
+        <w:t>Designed NBCOlympics.com video player, viewed 1.3 billion times by 50 million people.</w:t>
       </w:r>
     </w:p>
     <w:p>
@@ -2040,7 +1875,7 @@
           <w:sz w:val="22"/>
           <w:szCs w:val="22"/>
         </w:rPr>
-        <w:t xml:space="preserve">150+ PRs </w:t>
+        <w:t>200</w:t>
       </w:r>
       <w:r>
         <w:rPr>
@@ -2048,6 +1883,14 @@
           <w:sz w:val="22"/>
           <w:szCs w:val="22"/>
         </w:rPr>
+        <w:t xml:space="preserve">+ PRs </w:t>
+      </w:r>
+      <w:r>
+        <w:rPr>
+          <w:rFonts w:ascii="HelveticaNeueLT Pro 55 Roman" w:hAnsi="HelveticaNeueLT Pro 55 Roman"/>
+          <w:sz w:val="22"/>
+          <w:szCs w:val="22"/>
+        </w:rPr>
         <w:t>to</w:t>
       </w:r>
       <w:r>
@@ -2058,7 +1901,6 @@
         </w:rPr>
         <w:t xml:space="preserve"> </w:t>
       </w:r>
-      <w:proofErr w:type="spellStart"/>
       <w:r>
         <w:rPr>
           <w:rFonts w:ascii="HelveticaNeueLT Pro 55 Roman" w:hAnsi="HelveticaNeueLT Pro 55 Roman"/>
@@ -2069,7 +1911,6 @@
         </w:rPr>
         <w:t>hermes-webui</w:t>
       </w:r>
-      <w:proofErr w:type="spellEnd"/>
       <w:r>
         <w:rPr>
           <w:rFonts w:ascii="HelveticaNeueLT Pro 55 Roman" w:hAnsi="HelveticaNeueLT Pro 55 Roman"/>
@@ -2078,7 +1919,6 @@
         </w:rPr>
         <w:t xml:space="preserve"> and </w:t>
       </w:r>
-      <w:proofErr w:type="spellStart"/>
       <w:r>
         <w:rPr>
           <w:rFonts w:ascii="HelveticaNeueLT Pro 55 Roman" w:hAnsi="HelveticaNeueLT Pro 55 Roman"/>
@@ -2087,18 +1927,15 @@
           <w:sz w:val="22"/>
           <w:szCs w:val="22"/>
         </w:rPr>
-        <w:t>hermes</w:t>
-      </w:r>
-      <w:proofErr w:type="spellEnd"/>
-      <w:r>
-        <w:rPr>
-          <w:rFonts w:ascii="HelveticaNeueLT Pro 55 Roman" w:hAnsi="HelveticaNeueLT Pro 55 Roman"/>
-          <w:b/>
-          <w:bCs/>
+        <w:t>hermes-agent</w:t>
+      </w:r>
+      <w:r>
+        <w:rPr>
+          <w:rFonts w:ascii="HelveticaNeueLT Pro 55 Roman" w:hAnsi="HelveticaNeueLT Pro 55 Roman"/>
           <w:sz w:val="22"/>
           <w:szCs w:val="22"/>
         </w:rPr>
-        <w:t>-agent</w:t>
+        <w:t xml:space="preserve"> </w:t>
       </w:r>
       <w:r>
         <w:rPr>
@@ -2106,6 +1943,14 @@
           <w:sz w:val="22"/>
           <w:szCs w:val="22"/>
         </w:rPr>
+        <w:t>for</w:t>
+      </w:r>
+      <w:r>
+        <w:rPr>
+          <w:rFonts w:ascii="HelveticaNeueLT Pro 55 Roman" w:hAnsi="HelveticaNeueLT Pro 55 Roman"/>
+          <w:sz w:val="22"/>
+          <w:szCs w:val="22"/>
+        </w:rPr>
         <w:t xml:space="preserve"> </w:t>
       </w:r>
       <w:r>
@@ -2114,7 +1959,7 @@
           <w:sz w:val="22"/>
           <w:szCs w:val="22"/>
         </w:rPr>
-        <w:t>for</w:t>
+        <w:t>agent UX, reliability, streaming behavior, provider infrastructure, security hardening and other production-facing work</w:t>
       </w:r>
       <w:r>
         <w:rPr>
@@ -2122,33 +1967,17 @@
           <w:sz w:val="22"/>
           <w:szCs w:val="22"/>
         </w:rPr>
+        <w:t>:</w:t>
+      </w:r>
+      <w:r>
+        <w:rPr>
+          <w:rFonts w:ascii="HelveticaNeueLT Pro 55 Roman" w:hAnsi="HelveticaNeueLT Pro 55 Roman"/>
+          <w:sz w:val="22"/>
+          <w:szCs w:val="22"/>
+        </w:rPr>
         <w:t xml:space="preserve"> </w:t>
       </w:r>
-      <w:r>
-        <w:rPr>
-          <w:rFonts w:ascii="HelveticaNeueLT Pro 55 Roman" w:hAnsi="HelveticaNeueLT Pro 55 Roman"/>
-          <w:sz w:val="22"/>
-          <w:szCs w:val="22"/>
-        </w:rPr>
-        <w:t>agent UX, reliability, streaming behavior, provider infrastructure, security hardening and other production-facing work</w:t>
-      </w:r>
-      <w:r>
-        <w:rPr>
-          <w:rFonts w:ascii="HelveticaNeueLT Pro 55 Roman" w:hAnsi="HelveticaNeueLT Pro 55 Roman"/>
-          <w:sz w:val="22"/>
-          <w:szCs w:val="22"/>
-        </w:rPr>
-        <w:t>:</w:t>
-      </w:r>
-      <w:r>
-        <w:rPr>
-          <w:rFonts w:ascii="HelveticaNeueLT Pro 55 Roman" w:hAnsi="HelveticaNeueLT Pro 55 Roman"/>
-          <w:sz w:val="22"/>
-          <w:szCs w:val="22"/>
-        </w:rPr>
-        <w:t xml:space="preserve"> </w:t>
-      </w:r>
-      <w:hyperlink r:id="rId10" w:history="1">
+      <w:hyperlink r:id="rId11" w:history="1">
         <w:r>
           <w:rPr>
             <w:rStyle w:val="Hyperlink"/>
@@ -2181,62 +2010,20 @@
           <w:szCs w:val="22"/>
         </w:rPr>
       </w:pPr>
-      <w:proofErr w:type="spellStart"/>
       <w:r>
         <w:rPr>
           <w:rFonts w:ascii="HelveticaNeueLT Pro 55 Roman" w:hAnsi="HelveticaNeueLT Pro 55 Roman"/>
           <w:b/>
           <w:sz w:val="22"/>
         </w:rPr>
-        <w:t>claude</w:t>
-      </w:r>
-      <w:proofErr w:type="spellEnd"/>
-      <w:r>
-        <w:rPr>
-          <w:rFonts w:ascii="HelveticaNeueLT Pro 55 Roman" w:hAnsi="HelveticaNeueLT Pro 55 Roman"/>
-          <w:b/>
-          <w:sz w:val="22"/>
-        </w:rPr>
-        <w:t>-mem</w:t>
+        <w:t>claude-mem</w:t>
       </w:r>
       <w:r>
         <w:rPr>
           <w:rFonts w:ascii="HelveticaNeueLT Pro 55 Roman" w:hAnsi="HelveticaNeueLT Pro 55 Roman"/>
           <w:sz w:val="18"/>
         </w:rPr>
-        <w:t xml:space="preserve">  ·  github.com/</w:t>
-      </w:r>
-      <w:proofErr w:type="spellStart"/>
-      <w:r>
-        <w:rPr>
-          <w:rFonts w:ascii="HelveticaNeueLT Pro 55 Roman" w:hAnsi="HelveticaNeueLT Pro 55 Roman"/>
-          <w:sz w:val="18"/>
-        </w:rPr>
-        <w:t>thedotmack</w:t>
-      </w:r>
-      <w:proofErr w:type="spellEnd"/>
-      <w:r>
-        <w:rPr>
-          <w:rFonts w:ascii="HelveticaNeueLT Pro 55 Roman" w:hAnsi="HelveticaNeueLT Pro 55 Roman"/>
-          <w:sz w:val="18"/>
-        </w:rPr>
-        <w:t>/</w:t>
-      </w:r>
-      <w:proofErr w:type="spellStart"/>
-      <w:r>
-        <w:rPr>
-          <w:rFonts w:ascii="HelveticaNeueLT Pro 55 Roman" w:hAnsi="HelveticaNeueLT Pro 55 Roman"/>
-          <w:sz w:val="18"/>
-        </w:rPr>
-        <w:t>claude</w:t>
-      </w:r>
-      <w:proofErr w:type="spellEnd"/>
-      <w:r>
-        <w:rPr>
-          <w:rFonts w:ascii="HelveticaNeueLT Pro 55 Roman" w:hAnsi="HelveticaNeueLT Pro 55 Roman"/>
-          <w:sz w:val="18"/>
-        </w:rPr>
-        <w:t>-mem (77K+ stars)</w:t>
+        <w:t xml:space="preserve">  ·  github.com/thedotmack/claude-mem (77K+ stars)</w:t>
       </w:r>
       <w:r>
         <w:rPr>
@@ -2420,85 +2207,27 @@
           <w:sz w:val="18"/>
         </w:rPr>
       </w:pPr>
-      <w:proofErr w:type="spellStart"/>
       <w:r>
         <w:rPr>
           <w:rFonts w:ascii="HelveticaNeueLT Pro 55 Roman" w:hAnsi="HelveticaNeueLT Pro 55 Roman"/>
           <w:b/>
           <w:sz w:val="22"/>
         </w:rPr>
-        <w:t>mcp</w:t>
-      </w:r>
-      <w:proofErr w:type="spellEnd"/>
-      <w:r>
-        <w:rPr>
-          <w:rFonts w:ascii="HelveticaNeueLT Pro 55 Roman" w:hAnsi="HelveticaNeueLT Pro 55 Roman"/>
-          <w:b/>
-          <w:sz w:val="22"/>
-        </w:rPr>
-        <w:t>-memory-service</w:t>
+        <w:t>mcp-memory-service</w:t>
       </w:r>
       <w:r>
         <w:rPr>
           <w:rFonts w:ascii="HelveticaNeueLT Pro 55 Roman" w:hAnsi="HelveticaNeueLT Pro 55 Roman"/>
           <w:sz w:val="18"/>
         </w:rPr>
-        <w:t xml:space="preserve">  ·  github.com/</w:t>
-      </w:r>
-      <w:proofErr w:type="spellStart"/>
+        <w:t xml:space="preserve">  ·  github.com/doobidoo/mcp-memory-service (1.9K+ stars)</w:t>
+      </w:r>
       <w:r>
         <w:rPr>
           <w:rFonts w:ascii="HelveticaNeueLT Pro 55 Roman" w:hAnsi="HelveticaNeueLT Pro 55 Roman"/>
           <w:sz w:val="18"/>
         </w:rPr>
-        <w:t>doobidoo</w:t>
-      </w:r>
-      <w:proofErr w:type="spellEnd"/>
-      <w:r>
-        <w:rPr>
-          <w:rFonts w:ascii="HelveticaNeueLT Pro 55 Roman" w:hAnsi="HelveticaNeueLT Pro 55 Roman"/>
-          <w:sz w:val="18"/>
-        </w:rPr>
-        <w:t>/</w:t>
-      </w:r>
-      <w:proofErr w:type="spellStart"/>
-      <w:r>
-        <w:rPr>
-          <w:rFonts w:ascii="HelveticaNeueLT Pro 55 Roman" w:hAnsi="HelveticaNeueLT Pro 55 Roman"/>
-          <w:sz w:val="18"/>
-        </w:rPr>
-        <w:t>mcp</w:t>
-      </w:r>
-      <w:proofErr w:type="spellEnd"/>
-      <w:r>
-        <w:rPr>
-          <w:rFonts w:ascii="HelveticaNeueLT Pro 55 Roman" w:hAnsi="HelveticaNeueLT Pro 55 Roman"/>
-          <w:sz w:val="18"/>
-        </w:rPr>
-        <w:t xml:space="preserve">-memory-service (1.9K+ </w:t>
-      </w:r>
-      <w:proofErr w:type="gramStart"/>
-      <w:r>
-        <w:rPr>
-          <w:rFonts w:ascii="HelveticaNeueLT Pro 55 Roman" w:hAnsi="HelveticaNeueLT Pro 55 Roman"/>
-          <w:sz w:val="18"/>
-        </w:rPr>
-        <w:t>stars)</w:t>
-      </w:r>
-      <w:r>
-        <w:rPr>
-          <w:rFonts w:ascii="HelveticaNeueLT Pro 55 Roman" w:hAnsi="HelveticaNeueLT Pro 55 Roman"/>
-          <w:sz w:val="18"/>
-        </w:rPr>
-        <w:t xml:space="preserve">  · </w:t>
-      </w:r>
-      <w:proofErr w:type="gramEnd"/>
-      <w:r>
-        <w:rPr>
-          <w:rFonts w:ascii="HelveticaNeueLT Pro 55 Roman" w:hAnsi="HelveticaNeueLT Pro 55 Roman"/>
-          <w:sz w:val="18"/>
-        </w:rPr>
-        <w:t xml:space="preserve"> </w:t>
+        <w:t xml:space="preserve">  ·  </w:t>
       </w:r>
       <w:r>
         <w:rPr>
@@ -2702,19 +2431,37 @@
                 <w:sz w:val="20"/>
                 <w:szCs w:val="20"/>
               </w:rPr>
-              <w:t xml:space="preserve">, Anthropic API, MCP, REST APIs, </w:t>
-            </w:r>
-            <w:proofErr w:type="spellStart"/>
-            <w:r>
+              <w:t>, Anthropic API, MCP, REST APIs, GraphQL, WPGraphQL</w:t>
+            </w:r>
+          </w:p>
+          <w:p>
+            <w:pPr>
+              <w:spacing w:after="40" w:line="288" w:lineRule="auto"/>
               <w:rPr>
                 <w:rFonts w:ascii="HelveticaNeueLT Pro 55 Roman" w:hAnsi="HelveticaNeueLT Pro 55 Roman"/>
                 <w:bCs/>
                 <w:sz w:val="20"/>
                 <w:szCs w:val="20"/>
               </w:rPr>
-              <w:t>GraphQL</w:t>
-            </w:r>
-            <w:proofErr w:type="spellEnd"/>
+            </w:pPr>
+            <w:r>
+              <w:rPr>
+                <w:rFonts w:ascii="HelveticaNeueLT Pro 55 Roman" w:hAnsi="HelveticaNeueLT Pro 55 Roman"/>
+                <w:b/>
+                <w:sz w:val="20"/>
+                <w:szCs w:val="20"/>
+              </w:rPr>
+              <w:t>E-commerce &amp; CMS:</w:t>
+            </w:r>
+            <w:r>
+              <w:rPr>
+                <w:rFonts w:ascii="HelveticaNeueLT Pro 55 Roman" w:hAnsi="HelveticaNeueLT Pro 55 Roman"/>
+                <w:b/>
+                <w:sz w:val="20"/>
+                <w:szCs w:val="20"/>
+              </w:rPr>
+              <w:t xml:space="preserve"> </w:t>
+            </w:r>
             <w:r>
               <w:rPr>
                 <w:rFonts w:ascii="HelveticaNeueLT Pro 55 Roman" w:hAnsi="HelveticaNeueLT Pro 55 Roman"/>
@@ -2722,9 +2469,36 @@
                 <w:sz w:val="20"/>
                 <w:szCs w:val="20"/>
               </w:rPr>
-              <w:t xml:space="preserve">, </w:t>
-            </w:r>
-            <w:proofErr w:type="spellStart"/>
+              <w:t>Shopify Hydrogen/Liquid, WordPress (Core contributor), WordPress.com VIP, Faust.js</w:t>
+            </w:r>
+          </w:p>
+          <w:p>
+            <w:pPr>
+              <w:spacing w:after="40" w:line="288" w:lineRule="auto"/>
+              <w:rPr>
+                <w:bCs/>
+                <w:sz w:val="20"/>
+                <w:szCs w:val="20"/>
+              </w:rPr>
+            </w:pPr>
+            <w:r>
+              <w:rPr>
+                <w:rFonts w:ascii="HelveticaNeueLT Pro 55 Roman" w:hAnsi="HelveticaNeueLT Pro 55 Roman"/>
+                <w:b/>
+                <w:sz w:val="20"/>
+                <w:szCs w:val="20"/>
+              </w:rPr>
+              <w:t>Data &amp; Infrastructure:</w:t>
+            </w:r>
+            <w:r>
+              <w:rPr>
+                <w:rFonts w:ascii="HelveticaNeueLT Pro 55 Roman" w:hAnsi="HelveticaNeueLT Pro 55 Roman"/>
+                <w:b/>
+                <w:sz w:val="20"/>
+                <w:szCs w:val="20"/>
+              </w:rPr>
+              <w:t xml:space="preserve"> </w:t>
+            </w:r>
             <w:r>
               <w:rPr>
                 <w:rFonts w:ascii="HelveticaNeueLT Pro 55 Roman" w:hAnsi="HelveticaNeueLT Pro 55 Roman"/>
@@ -2732,123 +2506,7 @@
                 <w:sz w:val="20"/>
                 <w:szCs w:val="20"/>
               </w:rPr>
-              <w:t>WPGraphQL</w:t>
-            </w:r>
-            <w:proofErr w:type="spellEnd"/>
-          </w:p>
-          <w:p>
-            <w:pPr>
-              <w:spacing w:after="40" w:line="288" w:lineRule="auto"/>
-              <w:rPr>
-                <w:rFonts w:ascii="HelveticaNeueLT Pro 55 Roman" w:hAnsi="HelveticaNeueLT Pro 55 Roman"/>
-                <w:bCs/>
-                <w:sz w:val="20"/>
-                <w:szCs w:val="20"/>
-              </w:rPr>
-            </w:pPr>
-            <w:r>
-              <w:rPr>
-                <w:rFonts w:ascii="HelveticaNeueLT Pro 55 Roman" w:hAnsi="HelveticaNeueLT Pro 55 Roman"/>
-                <w:b/>
-                <w:sz w:val="20"/>
-                <w:szCs w:val="20"/>
-              </w:rPr>
-              <w:t>E-commerce &amp; CMS:</w:t>
-            </w:r>
-            <w:r>
-              <w:rPr>
-                <w:rFonts w:ascii="HelveticaNeueLT Pro 55 Roman" w:hAnsi="HelveticaNeueLT Pro 55 Roman"/>
-                <w:b/>
-                <w:sz w:val="20"/>
-                <w:szCs w:val="20"/>
-              </w:rPr>
-              <w:t xml:space="preserve"> </w:t>
-            </w:r>
-            <w:r>
-              <w:rPr>
-                <w:rFonts w:ascii="HelveticaNeueLT Pro 55 Roman" w:hAnsi="HelveticaNeueLT Pro 55 Roman"/>
-                <w:bCs/>
-                <w:sz w:val="20"/>
-                <w:szCs w:val="20"/>
-              </w:rPr>
-              <w:t>Shopify Hydrogen/Liquid, WordPress (Core contributor), WordPress.com VIP, Faust.js</w:t>
-            </w:r>
-          </w:p>
-          <w:p>
-            <w:pPr>
-              <w:spacing w:after="40" w:line="288" w:lineRule="auto"/>
-              <w:rPr>
-                <w:bCs/>
-                <w:sz w:val="20"/>
-                <w:szCs w:val="20"/>
-              </w:rPr>
-            </w:pPr>
-            <w:r>
-              <w:rPr>
-                <w:rFonts w:ascii="HelveticaNeueLT Pro 55 Roman" w:hAnsi="HelveticaNeueLT Pro 55 Roman"/>
-                <w:b/>
-                <w:sz w:val="20"/>
-                <w:szCs w:val="20"/>
-              </w:rPr>
-              <w:t>Data &amp; Infrastructure:</w:t>
-            </w:r>
-            <w:r>
-              <w:rPr>
-                <w:rFonts w:ascii="HelveticaNeueLT Pro 55 Roman" w:hAnsi="HelveticaNeueLT Pro 55 Roman"/>
-                <w:b/>
-                <w:sz w:val="20"/>
-                <w:szCs w:val="20"/>
-              </w:rPr>
-              <w:t xml:space="preserve"> </w:t>
-            </w:r>
-            <w:r>
-              <w:rPr>
-                <w:rFonts w:ascii="HelveticaNeueLT Pro 55 Roman" w:hAnsi="HelveticaNeueLT Pro 55 Roman"/>
-                <w:bCs/>
-                <w:sz w:val="20"/>
-                <w:szCs w:val="20"/>
-              </w:rPr>
-              <w:t>Firebase, SQL Server, MongoDB, Leaflet/</w:t>
-            </w:r>
-            <w:proofErr w:type="spellStart"/>
-            <w:r>
-              <w:rPr>
-                <w:rFonts w:ascii="HelveticaNeueLT Pro 55 Roman" w:hAnsi="HelveticaNeueLT Pro 55 Roman"/>
-                <w:bCs/>
-                <w:sz w:val="20"/>
-                <w:szCs w:val="20"/>
-              </w:rPr>
-              <w:t>Mapbox</w:t>
-            </w:r>
-            <w:proofErr w:type="spellEnd"/>
-            <w:r>
-              <w:rPr>
-                <w:rFonts w:ascii="HelveticaNeueLT Pro 55 Roman" w:hAnsi="HelveticaNeueLT Pro 55 Roman"/>
-                <w:bCs/>
-                <w:sz w:val="20"/>
-                <w:szCs w:val="20"/>
-              </w:rPr>
-              <w:t xml:space="preserve">, Turf.js, Vite, </w:t>
-            </w:r>
-            <w:proofErr w:type="spellStart"/>
-            <w:r>
-              <w:rPr>
-                <w:rFonts w:ascii="HelveticaNeueLT Pro 55 Roman" w:hAnsi="HelveticaNeueLT Pro 55 Roman"/>
-                <w:bCs/>
-                <w:sz w:val="20"/>
-                <w:szCs w:val="20"/>
-              </w:rPr>
-              <w:t>Vercel</w:t>
-            </w:r>
-            <w:proofErr w:type="spellEnd"/>
-            <w:r>
-              <w:rPr>
-                <w:rFonts w:ascii="HelveticaNeueLT Pro 55 Roman" w:hAnsi="HelveticaNeueLT Pro 55 Roman"/>
-                <w:bCs/>
-                <w:sz w:val="20"/>
-                <w:szCs w:val="20"/>
-              </w:rPr>
-              <w:t>, Netlify, Cloudflare</w:t>
+              <w:t>Firebase, SQL Server, MongoDB, Leaflet/Mapbox, Turf.js, Vite, Vercel, Netlify, Cloudflare</w:t>
             </w:r>
           </w:p>
           <w:p>
@@ -4293,6 +3951,7 @@
   <w:style w:type="character" w:default="1" w:styleId="DefaultParagraphFont">
     <w:name w:val="Default Paragraph Font"/>
     <w:uiPriority w:val="1"/>
+    <w:semiHidden/>
     <w:unhideWhenUsed/>
   </w:style>
   <w:style w:type="table" w:default="1" w:styleId="TableNormal">

</xml_diff>

<commit_message>
Highlight the multi-agent orchestration pipeline
</commit_message>
<xml_diff>
--- a/resume.docx
+++ b/resume.docx
@@ -372,7 +372,7 @@
                 <w:sz w:val="22"/>
                 <w:szCs w:val="21"/>
               </w:rPr>
-              <w:t>Full-stack developer and technical lead with 15+ years building for Fortune 500 brands including NBC Sports, Victoria’s Secret, Visa, Apple, Disney, and the NFL. I specialize in AI-integrated web applications and modern frontend architecture, with deep roots in WordPress and e-commerce.</w:t>
+              <w:t>Full-stack developer and technical lead with 15+ years building for Fortune 500 brands including NBC Sports, Victoria's Secret, Visa, Apple, Disney, and the NFL. I specialize in AI integration and orchestration, with deep roots in WordPress and e-commerce.</w:t>
             </w:r>
           </w:p>
           <w:p>
@@ -449,7 +449,55 @@
                 <w:sz w:val="22"/>
                 <w:szCs w:val="20"/>
               </w:rPr>
-              <w:t>Open source maintainer in the MCP ecosystem: top contributor to claude-mem (77K+ stars) and maintainer of mcp-memory-service (1.9K+ stars).</w:t>
+              <w:t>1</w:t>
+            </w:r>
+            <w:r>
+              <w:rPr>
+                <w:rFonts w:ascii="HelveticaNeueLT Pro 55 Roman" w:hAnsi="HelveticaNeueLT Pro 55 Roman" w:cs="Arial"/>
+                <w:sz w:val="22"/>
+                <w:szCs w:val="20"/>
+              </w:rPr>
+              <w:t>50+</w:t>
+            </w:r>
+            <w:r>
+              <w:rPr>
+                <w:rFonts w:ascii="HelveticaNeueLT Pro 55 Roman" w:hAnsi="HelveticaNeueLT Pro 55 Roman" w:cs="Arial"/>
+                <w:sz w:val="22"/>
+                <w:szCs w:val="20"/>
+              </w:rPr>
+              <w:t xml:space="preserve"> PRs shipped across 9 open-source repositories at 9</w:t>
+            </w:r>
+            <w:r>
+              <w:rPr>
+                <w:rFonts w:ascii="HelveticaNeueLT Pro 55 Roman" w:hAnsi="HelveticaNeueLT Pro 55 Roman" w:cs="Arial"/>
+                <w:sz w:val="22"/>
+                <w:szCs w:val="20"/>
+              </w:rPr>
+              <w:t>5</w:t>
+            </w:r>
+            <w:r>
+              <w:rPr>
+                <w:rFonts w:ascii="HelveticaNeueLT Pro 55 Roman" w:hAnsi="HelveticaNeueLT Pro 55 Roman" w:cs="Arial"/>
+                <w:sz w:val="22"/>
+                <w:szCs w:val="20"/>
+              </w:rPr>
+              <w:t>% acceptance. Top-5 contributor to claude-mem (</w:t>
+            </w:r>
+            <w:r>
+              <w:rPr>
+                <w:rFonts w:ascii="HelveticaNeueLT Pro 55 Roman" w:hAnsi="HelveticaNeueLT Pro 55 Roman" w:cs="Arial"/>
+                <w:sz w:val="22"/>
+                <w:szCs w:val="20"/>
+              </w:rPr>
+              <w:t>80</w:t>
+            </w:r>
+            <w:r>
+              <w:rPr>
+                <w:rFonts w:ascii="HelveticaNeueLT Pro 55 Roman" w:hAnsi="HelveticaNeueLT Pro 55 Roman" w:cs="Arial"/>
+                <w:sz w:val="22"/>
+                <w:szCs w:val="20"/>
+              </w:rPr>
+              <w:t>K+ stars) and #3 on hermes-webui (14K+ stars).</w:t>
             </w:r>
           </w:p>
           <w:p>
@@ -759,6 +807,246 @@
           <w:b/>
           <w:sz w:val="22"/>
         </w:rPr>
+        <w:t>Open Source Agent Pipeline</w:t>
+      </w:r>
+      <w:r>
+        <w:rPr>
+          <w:rFonts w:ascii="HelveticaNeueLT Pro 55 Roman" w:hAnsi="HelveticaNeueLT Pro 55 Roman"/>
+          <w:sz w:val="18"/>
+        </w:rPr>
+        <w:t xml:space="preserve">  (2025-2026)</w:t>
+      </w:r>
+    </w:p>
+    <w:p>
+      <w:pPr>
+        <w:numPr>
+          <w:ilvl w:val="0"/>
+          <w:numId w:val="1"/>
+        </w:numPr>
+        <w:tabs>
+          <w:tab w:val="clear" w:pos="288"/>
+          <w:tab w:val="left" w:pos="540"/>
+        </w:tabs>
+        <w:spacing w:after="40" w:line="264" w:lineRule="auto"/>
+        <w:ind w:left="540" w:hanging="252"/>
+        <w:rPr>
+          <w:rFonts w:ascii="HelveticaNeueLT Pro 55 Roman" w:hAnsi="HelveticaNeueLT Pro 55 Roman" w:cs="Arial"/>
+          <w:sz w:val="22"/>
+          <w:szCs w:val="20"/>
+        </w:rPr>
+      </w:pPr>
+      <w:r>
+        <w:rPr>
+          <w:rFonts w:ascii="HelveticaNeueLT Pro 55 Roman" w:hAnsi="HelveticaNeueLT Pro 55 Roman"/>
+          <w:sz w:val="22"/>
+        </w:rPr>
+        <w:t xml:space="preserve">Built </w:t>
+      </w:r>
+      <w:r>
+        <w:rPr>
+          <w:rFonts w:ascii="HelveticaNeueLT Pro 55 Roman" w:hAnsi="HelveticaNeueLT Pro 55 Roman"/>
+          <w:sz w:val="22"/>
+        </w:rPr>
+        <w:t>a multi-agent system that autonomously discovers issues, plans fixes, implements them in isolated git worktrees, runs cross-provider adversarial review, and ships PRs end-to-end.</w:t>
+      </w:r>
+    </w:p>
+    <w:p>
+      <w:pPr>
+        <w:numPr>
+          <w:ilvl w:val="0"/>
+          <w:numId w:val="1"/>
+        </w:numPr>
+        <w:tabs>
+          <w:tab w:val="clear" w:pos="288"/>
+          <w:tab w:val="left" w:pos="540"/>
+          <w:tab w:val="num" w:pos="576"/>
+        </w:tabs>
+        <w:spacing w:after="40" w:line="264" w:lineRule="auto"/>
+        <w:ind w:left="540"/>
+        <w:rPr>
+          <w:rFonts w:ascii="HelveticaNeueLT Pro 55 Roman" w:hAnsi="HelveticaNeueLT Pro 55 Roman" w:cs="Arial"/>
+          <w:sz w:val="22"/>
+          <w:szCs w:val="20"/>
+        </w:rPr>
+      </w:pPr>
+      <w:r>
+        <w:rPr>
+          <w:rFonts w:ascii="HelveticaNeueLT Pro 55 Roman" w:hAnsi="HelveticaNeueLT Pro 55 Roman"/>
+          <w:sz w:val="22"/>
+        </w:rPr>
+        <w:t>Parallelized issue discovery across repo-specific search dimensions; candidate</w:t>
+      </w:r>
+      <w:r>
+        <w:rPr>
+          <w:rFonts w:ascii="HelveticaNeueLT Pro 55 Roman" w:hAnsi="HelveticaNeueLT Pro 55 Roman"/>
+          <w:sz w:val="22"/>
+        </w:rPr>
+        <w:t>s</w:t>
+      </w:r>
+      <w:r>
+        <w:rPr>
+          <w:rFonts w:ascii="HelveticaNeueLT Pro 55 Roman" w:hAnsi="HelveticaNeueLT Pro 55 Roman"/>
+          <w:sz w:val="22"/>
+        </w:rPr>
+        <w:t xml:space="preserve"> verified</w:t>
+      </w:r>
+      <w:r>
+        <w:rPr>
+          <w:rFonts w:ascii="HelveticaNeueLT Pro 55 Roman" w:hAnsi="HelveticaNeueLT Pro 55 Roman"/>
+          <w:sz w:val="22"/>
+        </w:rPr>
+        <w:t xml:space="preserve"> against latest source, gated on prior work and active claims, with issues filed upstream when none exist.</w:t>
+      </w:r>
+    </w:p>
+    <w:p>
+      <w:pPr>
+        <w:numPr>
+          <w:ilvl w:val="0"/>
+          <w:numId w:val="1"/>
+        </w:numPr>
+        <w:tabs>
+          <w:tab w:val="clear" w:pos="288"/>
+          <w:tab w:val="left" w:pos="540"/>
+        </w:tabs>
+        <w:spacing w:after="40" w:line="264" w:lineRule="auto"/>
+        <w:ind w:left="540" w:hanging="252"/>
+        <w:rPr>
+          <w:rFonts w:ascii="HelveticaNeueLT Pro 55 Roman" w:hAnsi="HelveticaNeueLT Pro 55 Roman" w:cs="Arial"/>
+          <w:sz w:val="22"/>
+          <w:szCs w:val="20"/>
+        </w:rPr>
+      </w:pPr>
+      <w:r>
+        <w:rPr>
+          <w:rFonts w:ascii="HelveticaNeueLT Pro 55 Roman" w:hAnsi="HelveticaNeueLT Pro 55 Roman"/>
+          <w:sz w:val="22"/>
+        </w:rPr>
+        <w:t xml:space="preserve">Shipped </w:t>
+      </w:r>
+      <w:r>
+        <w:rPr>
+          <w:rFonts w:ascii="HelveticaNeueLT Pro 55 Roman" w:hAnsi="HelveticaNeueLT Pro 55 Roman"/>
+          <w:sz w:val="22"/>
+        </w:rPr>
+        <w:t>1</w:t>
+      </w:r>
+      <w:r>
+        <w:rPr>
+          <w:rFonts w:ascii="HelveticaNeueLT Pro 55 Roman" w:hAnsi="HelveticaNeueLT Pro 55 Roman"/>
+          <w:sz w:val="22"/>
+        </w:rPr>
+        <w:t>5</w:t>
+      </w:r>
+      <w:r>
+        <w:rPr>
+          <w:rFonts w:ascii="HelveticaNeueLT Pro 55 Roman" w:hAnsi="HelveticaNeueLT Pro 55 Roman"/>
+          <w:sz w:val="22"/>
+        </w:rPr>
+        <w:t xml:space="preserve">0+ </w:t>
+      </w:r>
+      <w:r>
+        <w:rPr>
+          <w:rFonts w:ascii="HelveticaNeueLT Pro 55 Roman" w:hAnsi="HelveticaNeueLT Pro 55 Roman"/>
+          <w:sz w:val="22"/>
+        </w:rPr>
+        <w:t xml:space="preserve">PRs </w:t>
+      </w:r>
+      <w:r>
+        <w:rPr>
+          <w:rFonts w:ascii="HelveticaNeueLT Pro 55 Roman" w:hAnsi="HelveticaNeueLT Pro 55 Roman"/>
+          <w:sz w:val="22"/>
+        </w:rPr>
+        <w:t>across 9 repositories</w:t>
+      </w:r>
+      <w:r>
+        <w:rPr>
+          <w:rFonts w:ascii="HelveticaNeueLT Pro 55 Roman" w:hAnsi="HelveticaNeueLT Pro 55 Roman"/>
+          <w:sz w:val="22"/>
+        </w:rPr>
+        <w:t xml:space="preserve"> with </w:t>
+      </w:r>
+      <w:r>
+        <w:rPr>
+          <w:rFonts w:ascii="HelveticaNeueLT Pro 55 Roman" w:hAnsi="HelveticaNeueLT Pro 55 Roman"/>
+          <w:sz w:val="22"/>
+        </w:rPr>
+        <w:t>9</w:t>
+      </w:r>
+      <w:r>
+        <w:rPr>
+          <w:rFonts w:ascii="HelveticaNeueLT Pro 55 Roman" w:hAnsi="HelveticaNeueLT Pro 55 Roman"/>
+          <w:sz w:val="22"/>
+        </w:rPr>
+        <w:t>5</w:t>
+      </w:r>
+      <w:r>
+        <w:rPr>
+          <w:rFonts w:ascii="HelveticaNeueLT Pro 55 Roman" w:hAnsi="HelveticaNeueLT Pro 55 Roman"/>
+          <w:sz w:val="22"/>
+        </w:rPr>
+        <w:t>% acceptance by external maintainers</w:t>
+      </w:r>
+      <w:r>
+        <w:rPr>
+          <w:rFonts w:ascii="HelveticaNeueLT Pro 55 Roman" w:hAnsi="HelveticaNeueLT Pro 55 Roman"/>
+          <w:sz w:val="22"/>
+        </w:rPr>
+        <w:t>.</w:t>
+      </w:r>
+    </w:p>
+    <w:p>
+      <w:pPr>
+        <w:numPr>
+          <w:ilvl w:val="0"/>
+          <w:numId w:val="1"/>
+        </w:numPr>
+        <w:tabs>
+          <w:tab w:val="clear" w:pos="288"/>
+          <w:tab w:val="left" w:pos="540"/>
+          <w:tab w:val="num" w:pos="576"/>
+        </w:tabs>
+        <w:spacing w:after="40" w:line="264" w:lineRule="auto"/>
+        <w:ind w:left="540"/>
+        <w:rPr>
+          <w:rFonts w:ascii="HelveticaNeueLT Pro 55 Roman" w:hAnsi="HelveticaNeueLT Pro 55 Roman" w:cs="Arial"/>
+          <w:sz w:val="22"/>
+          <w:szCs w:val="20"/>
+        </w:rPr>
+      </w:pPr>
+      <w:r>
+        <w:rPr>
+          <w:rFonts w:ascii="HelveticaNeueLT Pro 55 Roman" w:hAnsi="HelveticaNeueLT Pro 55 Roman" w:cs="Arial"/>
+          <w:sz w:val="22"/>
+          <w:szCs w:val="20"/>
+        </w:rPr>
+        <w:t>Post-push convergence loop diagnoses CI failures from actual run logs, triages per-repo bot comments, and handles reviewer rework autonomously through to merge.</w:t>
+      </w:r>
+    </w:p>
+    <w:p>
+      <w:pPr>
+        <w:spacing w:line="264" w:lineRule="auto"/>
+        <w:rPr>
+          <w:rFonts w:ascii="HelveticaNeueLT Pro 55 Roman" w:hAnsi="HelveticaNeueLT Pro 55 Roman" w:cs="Arial"/>
+          <w:sz w:val="18"/>
+          <w:szCs w:val="18"/>
+        </w:rPr>
+      </w:pPr>
+    </w:p>
+    <w:p>
+      <w:pPr>
+        <w:spacing w:after="80" w:line="264" w:lineRule="auto"/>
+        <w:ind w:left="288"/>
+        <w:rPr>
+          <w:rFonts w:ascii="HelveticaNeueLT Pro 55 Roman" w:hAnsi="HelveticaNeueLT Pro 55 Roman"/>
+          <w:sz w:val="18"/>
+        </w:rPr>
+      </w:pPr>
+      <w:r>
+        <w:rPr>
+          <w:rFonts w:ascii="HelveticaNeueLT Pro 55 Roman" w:hAnsi="HelveticaNeueLT Pro 55 Roman"/>
+          <w:b/>
+          <w:sz w:val="22"/>
+        </w:rPr>
         <w:t>Liberty Pest Control, AI-Powered Business Tools</w:t>
       </w:r>
       <w:r>
@@ -767,6 +1055,236 @@
           <w:sz w:val="18"/>
         </w:rPr>
         <w:t xml:space="preserve">  (2024)</w:t>
+      </w:r>
+    </w:p>
+    <w:p>
+      <w:pPr>
+        <w:numPr>
+          <w:ilvl w:val="0"/>
+          <w:numId w:val="1"/>
+        </w:numPr>
+        <w:tabs>
+          <w:tab w:val="clear" w:pos="288"/>
+        </w:tabs>
+        <w:spacing w:after="40" w:line="264" w:lineRule="auto"/>
+        <w:ind w:left="540" w:hanging="162"/>
+        <w:rPr>
+          <w:rFonts w:ascii="HelveticaNeueLT Pro 55 Roman" w:hAnsi="HelveticaNeueLT Pro 55 Roman" w:cs="Arial"/>
+          <w:sz w:val="22"/>
+          <w:szCs w:val="20"/>
+        </w:rPr>
+      </w:pPr>
+      <w:r>
+        <w:rPr>
+          <w:rFonts w:ascii="HelveticaNeueLT Pro 55 Roman" w:hAnsi="HelveticaNeueLT Pro 55 Roman"/>
+          <w:sz w:val="22"/>
+        </w:rPr>
+        <w:t>Built an internal platform that reads technician field notes from PestPac (MS SQL Server), processes them through GPT-4</w:t>
+      </w:r>
+      <w:r>
+        <w:rPr>
+          <w:rFonts w:ascii="HelveticaNeueLT Pro 55 Roman" w:hAnsi="HelveticaNeueLT Pro 55 Roman"/>
+          <w:sz w:val="22"/>
+        </w:rPr>
+        <w:t>o</w:t>
+      </w:r>
+      <w:r>
+        <w:rPr>
+          <w:rFonts w:ascii="HelveticaNeueLT Pro 55 Roman" w:hAnsi="HelveticaNeueLT Pro 55 Roman"/>
+          <w:sz w:val="22"/>
+        </w:rPr>
+        <w:t>, and generates contextual customer communications.</w:t>
+      </w:r>
+    </w:p>
+    <w:p>
+      <w:pPr>
+        <w:numPr>
+          <w:ilvl w:val="0"/>
+          <w:numId w:val="1"/>
+        </w:numPr>
+        <w:tabs>
+          <w:tab w:val="clear" w:pos="288"/>
+          <w:tab w:val="num" w:pos="576"/>
+        </w:tabs>
+        <w:spacing w:after="40" w:line="264" w:lineRule="auto"/>
+        <w:ind w:left="540" w:hanging="162"/>
+        <w:rPr>
+          <w:rFonts w:ascii="HelveticaNeueLT Pro 55 Roman" w:hAnsi="HelveticaNeueLT Pro 55 Roman" w:cs="Arial"/>
+          <w:sz w:val="22"/>
+          <w:szCs w:val="20"/>
+        </w:rPr>
+      </w:pPr>
+      <w:r>
+        <w:rPr>
+          <w:rFonts w:ascii="HelveticaNeueLT Pro 55 Roman" w:hAnsi="HelveticaNeueLT Pro 55 Roman"/>
+          <w:sz w:val="22"/>
+        </w:rPr>
+        <w:t>Implemented OpenAI’s</w:t>
+      </w:r>
+      <w:r>
+        <w:rPr>
+          <w:rFonts w:ascii="HelveticaNeueLT Pro 55 Roman" w:hAnsi="HelveticaNeueLT Pro 55 Roman"/>
+          <w:sz w:val="22"/>
+        </w:rPr>
+        <w:t xml:space="preserve"> streaming C</w:t>
+      </w:r>
+      <w:r>
+        <w:rPr>
+          <w:rFonts w:ascii="HelveticaNeueLT Pro 55 Roman" w:hAnsi="HelveticaNeueLT Pro 55 Roman"/>
+          <w:sz w:val="22"/>
+        </w:rPr>
+        <w:t>hat Completions API with real-time partial JSON parsing for progressive UI rendering, and the</w:t>
+      </w:r>
+      <w:r>
+        <w:rPr>
+          <w:rFonts w:ascii="HelveticaNeueLT Pro 55 Roman" w:hAnsi="HelveticaNeueLT Pro 55 Roman"/>
+          <w:sz w:val="22"/>
+        </w:rPr>
+        <w:t xml:space="preserve"> Realtime Voice API with WebSocket relay for live AI-driven phone calls</w:t>
+      </w:r>
+      <w:r>
+        <w:rPr>
+          <w:rFonts w:ascii="HelveticaNeueLT Pro 55 Roman" w:hAnsi="HelveticaNeueLT Pro 55 Roman"/>
+          <w:sz w:val="22"/>
+        </w:rPr>
+        <w:t>.</w:t>
+      </w:r>
+    </w:p>
+    <w:p>
+      <w:pPr>
+        <w:numPr>
+          <w:ilvl w:val="0"/>
+          <w:numId w:val="1"/>
+        </w:numPr>
+        <w:tabs>
+          <w:tab w:val="clear" w:pos="288"/>
+          <w:tab w:val="num" w:pos="576"/>
+        </w:tabs>
+        <w:spacing w:after="40" w:line="264" w:lineRule="auto"/>
+        <w:ind w:left="540" w:hanging="162"/>
+        <w:rPr>
+          <w:rFonts w:ascii="HelveticaNeueLT Pro 55 Roman" w:hAnsi="HelveticaNeueLT Pro 55 Roman" w:cs="Arial"/>
+          <w:sz w:val="22"/>
+          <w:szCs w:val="20"/>
+        </w:rPr>
+      </w:pPr>
+      <w:r>
+        <w:rPr>
+          <w:rFonts w:ascii="HelveticaNeueLT Pro 55 Roman" w:hAnsi="HelveticaNeueLT Pro 55 Roman"/>
+          <w:sz w:val="22"/>
+        </w:rPr>
+        <w:t>Designed a three-tier caching system (in-memory</w:t>
+      </w:r>
+      <w:r>
+        <w:rPr>
+          <w:rFonts w:ascii="HelveticaNeueLT Pro 55 Roman" w:hAnsi="HelveticaNeueLT Pro 55 Roman"/>
+          <w:sz w:val="22"/>
+        </w:rPr>
+        <w:t>,</w:t>
+      </w:r>
+      <w:r>
+        <w:rPr>
+          <w:rFonts w:ascii="HelveticaNeueLT Pro 55 Roman" w:hAnsi="HelveticaNeueLT Pro 55 Roman"/>
+          <w:sz w:val="22"/>
+        </w:rPr>
+        <w:t xml:space="preserve"> disk</w:t>
+      </w:r>
+      <w:r>
+        <w:rPr>
+          <w:rFonts w:ascii="HelveticaNeueLT Pro 55 Roman" w:hAnsi="HelveticaNeueLT Pro 55 Roman"/>
+          <w:sz w:val="22"/>
+        </w:rPr>
+        <w:t>,</w:t>
+      </w:r>
+      <w:r>
+        <w:rPr>
+          <w:rFonts w:ascii="HelveticaNeueLT Pro 55 Roman" w:hAnsi="HelveticaNeueLT Pro 55 Roman"/>
+          <w:sz w:val="22"/>
+        </w:rPr>
+        <w:t xml:space="preserve"> Firebase</w:t>
+      </w:r>
+      <w:r>
+        <w:rPr>
+          <w:rFonts w:ascii="HelveticaNeueLT Pro 55 Roman" w:hAnsi="HelveticaNeueLT Pro 55 Roman"/>
+          <w:sz w:val="22"/>
+        </w:rPr>
+        <w:t xml:space="preserve"> Firestore</w:t>
+      </w:r>
+      <w:r>
+        <w:rPr>
+          <w:rFonts w:ascii="HelveticaNeueLT Pro 55 Roman" w:hAnsi="HelveticaNeueLT Pro 55 Roman"/>
+          <w:sz w:val="22"/>
+        </w:rPr>
+        <w:t>) with SHA-1 fingerprinting for deduplication</w:t>
+      </w:r>
+      <w:r>
+        <w:rPr>
+          <w:rFonts w:ascii="HelveticaNeueLT Pro 55 Roman" w:hAnsi="HelveticaNeueLT Pro 55 Roman"/>
+          <w:sz w:val="22"/>
+        </w:rPr>
+        <w:t>. Built hot-swappable prompt management editable at runtime.</w:t>
+      </w:r>
+    </w:p>
+    <w:p>
+      <w:pPr>
+        <w:spacing w:before="80" w:after="40" w:line="264" w:lineRule="auto"/>
+        <w:ind w:left="259"/>
+        <w:rPr>
+          <w:rFonts w:ascii="HelveticaNeueLT Pro 55 Roman" w:hAnsi="HelveticaNeueLT Pro 55 Roman" w:cs="Arial"/>
+          <w:sz w:val="22"/>
+          <w:szCs w:val="20"/>
+        </w:rPr>
+      </w:pPr>
+      <w:r>
+        <w:rPr>
+          <w:rFonts w:ascii="HelveticaNeueLT Pro 55 Roman" w:hAnsi="HelveticaNeueLT Pro 55 Roman"/>
+          <w:b/>
+          <w:sz w:val="18"/>
+        </w:rPr>
+        <w:t xml:space="preserve">Stack: </w:t>
+      </w:r>
+      <w:r>
+        <w:rPr>
+          <w:rFonts w:ascii="HelveticaNeueLT Pro 55 Roman" w:hAnsi="HelveticaNeueLT Pro 55 Roman"/>
+          <w:sz w:val="18"/>
+        </w:rPr>
+        <w:t>React, Vite, Tailwind CSS, Node.js/Express, OpenAI API, Firebase, MS SQL Server (FreeTDS), TanStack Query.</w:t>
+      </w:r>
+    </w:p>
+    <w:p>
+      <w:pPr>
+        <w:spacing w:line="264" w:lineRule="auto"/>
+        <w:rPr>
+          <w:rFonts w:ascii="HelveticaNeueLT Pro 55 Roman" w:hAnsi="HelveticaNeueLT Pro 55 Roman" w:cs="Arial"/>
+          <w:sz w:val="18"/>
+          <w:szCs w:val="18"/>
+        </w:rPr>
+      </w:pPr>
+    </w:p>
+    <w:p>
+      <w:pPr>
+        <w:spacing w:after="80" w:line="264" w:lineRule="auto"/>
+        <w:ind w:left="288"/>
+        <w:rPr>
+          <w:rFonts w:ascii="HelveticaNeueLT Pro 55 Roman" w:hAnsi="HelveticaNeueLT Pro 55 Roman"/>
+          <w:sz w:val="18"/>
+        </w:rPr>
+      </w:pPr>
+      <w:r>
+        <w:rPr>
+          <w:rFonts w:ascii="HelveticaNeueLT Pro 55 Roman" w:hAnsi="HelveticaNeueLT Pro 55 Roman"/>
+          <w:b/>
+          <w:sz w:val="22"/>
+        </w:rPr>
+        <w:lastRenderedPageBreak/>
+        <w:t>Liberty Pest Control, Scheduling Optimization Engine</w:t>
+      </w:r>
+      <w:r>
+        <w:rPr>
+          <w:rFonts w:ascii="HelveticaNeueLT Pro 55 Roman" w:hAnsi="HelveticaNeueLT Pro 55 Roman"/>
+          <w:sz w:val="18"/>
+        </w:rPr>
+        <w:t xml:space="preserve">  (2023–2024)</w:t>
       </w:r>
     </w:p>
     <w:p>
@@ -783,15 +1301,56 @@
         <w:rPr>
           <w:rFonts w:ascii="HelveticaNeueLT Pro 55 Roman" w:hAnsi="HelveticaNeueLT Pro 55 Roman" w:cs="Arial"/>
           <w:sz w:val="22"/>
-          <w:szCs w:val="20"/>
-        </w:rPr>
-      </w:pPr>
-      <w:r>
-        <w:rPr>
-          <w:rFonts w:ascii="HelveticaNeueLT Pro 55 Roman" w:hAnsi="HelveticaNeueLT Pro 55 Roman"/>
-          <w:sz w:val="22"/>
-        </w:rPr>
-        <w:t>Built an internal platform that reads technician field notes from PestPac (MS SQL Server), processes them through GPT-4, and generates contextual customer communications.</w:t>
+          <w:szCs w:val="22"/>
+        </w:rPr>
+      </w:pPr>
+      <w:r>
+        <w:rPr>
+          <w:rFonts w:ascii="HelveticaNeueLT Pro 55 Roman" w:hAnsi="HelveticaNeueLT Pro 55 Roman"/>
+          <w:sz w:val="22"/>
+          <w:szCs w:val="22"/>
+        </w:rPr>
+        <w:t>Designed a Vehicle Routing Problem solver assigning 5,500+ recurring services across 80 technicians in the NYC metro area. ~1,900-line algorithm in Node.js Worker Threads with</w:t>
+      </w:r>
+      <w:r>
+        <w:rPr>
+          <w:rFonts w:ascii="HelveticaNeueLT Pro 55 Roman" w:hAnsi="HelveticaNeueLT Pro 55 Roman"/>
+          <w:sz w:val="22"/>
+          <w:szCs w:val="22"/>
+        </w:rPr>
+        <w:t xml:space="preserve"> gap-packing</w:t>
+      </w:r>
+      <w:r>
+        <w:rPr>
+          <w:rFonts w:ascii="HelveticaNeueLT Pro 55 Roman" w:hAnsi="HelveticaNeueLT Pro 55 Roman"/>
+          <w:sz w:val="22"/>
+          <w:szCs w:val="22"/>
+        </w:rPr>
+        <w:t xml:space="preserve">, </w:t>
+      </w:r>
+      <w:r>
+        <w:rPr>
+          <w:rFonts w:ascii="HelveticaNeueLT Pro 55 Roman" w:hAnsi="HelveticaNeueLT Pro 55 Roman"/>
+          <w:sz w:val="22"/>
+          <w:szCs w:val="22"/>
+        </w:rPr>
+        <w:t xml:space="preserve">weighted scoring, </w:t>
+      </w:r>
+      <w:r>
+        <w:rPr>
+          <w:rFonts w:ascii="HelveticaNeueLT Pro 55 Roman" w:hAnsi="HelveticaNeueLT Pro 55 Roman"/>
+          <w:sz w:val="22"/>
+          <w:szCs w:val="22"/>
+        </w:rPr>
+        <w:t>and</w:t>
+      </w:r>
+      <w:r>
+        <w:rPr>
+          <w:rFonts w:ascii="HelveticaNeueLT Pro 55 Roman" w:hAnsi="HelveticaNeueLT Pro 55 Roman"/>
+          <w:sz w:val="22"/>
+          <w:szCs w:val="22"/>
+        </w:rPr>
+        <w:t xml:space="preserve"> geographic continuity.</w:t>
       </w:r>
     </w:p>
     <w:p>
@@ -816,36 +1375,38 @@
         <w:rPr>
           <w:rFonts w:ascii="HelveticaNeueLT Pro 55 Roman" w:hAnsi="HelveticaNeueLT Pro 55 Roman"/>
           <w:sz w:val="22"/>
-        </w:rPr>
-        <w:t>Implemented OpenAI’s</w:t>
-      </w:r>
-      <w:r>
-        <w:rPr>
-          <w:rFonts w:ascii="HelveticaNeueLT Pro 55 Roman" w:hAnsi="HelveticaNeueLT Pro 55 Roman"/>
-          <w:sz w:val="22"/>
-        </w:rPr>
-        <w:t xml:space="preserve"> streaming C</w:t>
-      </w:r>
-      <w:r>
-        <w:rPr>
-          <w:rFonts w:ascii="HelveticaNeueLT Pro 55 Roman" w:hAnsi="HelveticaNeueLT Pro 55 Roman"/>
-          <w:sz w:val="22"/>
-        </w:rPr>
-        <w:t>hat Completions API with real-time partial JSON parsing for progressive UI rendering, and the</w:t>
-      </w:r>
-      <w:r>
-        <w:rPr>
-          <w:rFonts w:ascii="HelveticaNeueLT Pro 55 Roman" w:hAnsi="HelveticaNeueLT Pro 55 Roman"/>
-          <w:sz w:val="22"/>
-        </w:rPr>
-        <w:t xml:space="preserve"> Realtime Voice API with WebSocket relay for live AI-driven phone calls</w:t>
-      </w:r>
-      <w:r>
-        <w:rPr>
-          <w:rFonts w:ascii="HelveticaNeueLT Pro 55 Roman" w:hAnsi="HelveticaNeueLT Pro 55 Roman"/>
-          <w:sz w:val="22"/>
-        </w:rPr>
-        <w:t>.</w:t>
+          <w:szCs w:val="22"/>
+        </w:rPr>
+        <w:t>T</w:t>
+      </w:r>
+      <w:r>
+        <w:rPr>
+          <w:rFonts w:ascii="HelveticaNeueLT Pro 55 Roman" w:hAnsi="HelveticaNeueLT Pro 55 Roman"/>
+          <w:sz w:val="22"/>
+          <w:szCs w:val="22"/>
+        </w:rPr>
+        <w:t>hree-layer API: legacy SQL → Next.js API routes (data</w:t>
+      </w:r>
+      <w:r>
+        <w:rPr>
+          <w:rFonts w:ascii="HelveticaNeueLT Pro 55 Roman" w:hAnsi="HelveticaNeueLT Pro 55 Roman"/>
+          <w:sz w:val="22"/>
+        </w:rPr>
+        <w:t xml:space="preserve"> transformation, </w:t>
+      </w:r>
+      <w:r>
+        <w:rPr>
+          <w:rFonts w:ascii="HelveticaNeueLT Pro 55 Roman" w:hAnsi="HelveticaNeueLT Pro 55 Roman"/>
+          <w:sz w:val="22"/>
+        </w:rPr>
+        <w:t>validation</w:t>
+      </w:r>
+      <w:r>
+        <w:rPr>
+          <w:rFonts w:ascii="HelveticaNeueLT Pro 55 Roman" w:hAnsi="HelveticaNeueLT Pro 55 Roman"/>
+          <w:sz w:val="22"/>
+        </w:rPr>
+        <w:t>) → frontend visualization (Leaflet maps, react-big-calendar with per-technician views).</w:t>
       </w:r>
     </w:p>
     <w:p>
@@ -871,283 +1432,25 @@
           <w:rFonts w:ascii="HelveticaNeueLT Pro 55 Roman" w:hAnsi="HelveticaNeueLT Pro 55 Roman"/>
           <w:sz w:val="22"/>
         </w:rPr>
-        <w:t>Designed a three-tier caching system (in-memory</w:t>
-      </w:r>
-      <w:r>
-        <w:rPr>
-          <w:rFonts w:ascii="HelveticaNeueLT Pro 55 Roman" w:hAnsi="HelveticaNeueLT Pro 55 Roman"/>
-          <w:sz w:val="22"/>
-        </w:rPr>
-        <w:t>,</w:t>
-      </w:r>
-      <w:r>
-        <w:rPr>
-          <w:rFonts w:ascii="HelveticaNeueLT Pro 55 Roman" w:hAnsi="HelveticaNeueLT Pro 55 Roman"/>
-          <w:sz w:val="22"/>
-        </w:rPr>
-        <w:t xml:space="preserve"> disk</w:t>
-      </w:r>
-      <w:r>
-        <w:rPr>
-          <w:rFonts w:ascii="HelveticaNeueLT Pro 55 Roman" w:hAnsi="HelveticaNeueLT Pro 55 Roman"/>
-          <w:sz w:val="22"/>
-        </w:rPr>
-        <w:t>,</w:t>
-      </w:r>
-      <w:r>
-        <w:rPr>
-          <w:rFonts w:ascii="HelveticaNeueLT Pro 55 Roman" w:hAnsi="HelveticaNeueLT Pro 55 Roman"/>
-          <w:sz w:val="22"/>
-        </w:rPr>
-        <w:t xml:space="preserve"> Firebase</w:t>
-      </w:r>
-      <w:r>
-        <w:rPr>
-          <w:rFonts w:ascii="HelveticaNeueLT Pro 55 Roman" w:hAnsi="HelveticaNeueLT Pro 55 Roman"/>
-          <w:sz w:val="22"/>
-        </w:rPr>
-        <w:t xml:space="preserve"> Firestore</w:t>
-      </w:r>
-      <w:r>
-        <w:rPr>
-          <w:rFonts w:ascii="HelveticaNeueLT Pro 55 Roman" w:hAnsi="HelveticaNeueLT Pro 55 Roman"/>
-          <w:sz w:val="22"/>
-        </w:rPr>
-        <w:t>) with SHA-1 fingerprinting for deduplication</w:t>
-      </w:r>
-      <w:r>
-        <w:rPr>
-          <w:rFonts w:ascii="HelveticaNeueLT Pro 55 Roman" w:hAnsi="HelveticaNeueLT Pro 55 Roman"/>
-          <w:sz w:val="22"/>
-        </w:rPr>
-        <w:t>. Built hot-swappable prompt management editable at runtime.</w:t>
-      </w:r>
-    </w:p>
-    <w:p>
-      <w:pPr>
-        <w:spacing w:before="80" w:after="40" w:line="264" w:lineRule="auto"/>
+        <w:t>Implemented Haversine distance matrices, GeoJSON ray-casting for NYC borough containment, and batch rendering to keep the UI responsive with thousands of calendar events.</w:t>
+      </w:r>
+    </w:p>
+    <w:p>
+      <w:pPr>
+        <w:spacing w:before="120" w:after="40" w:line="264" w:lineRule="auto"/>
         <w:ind w:left="259"/>
-        <w:rPr>
-          <w:rFonts w:ascii="HelveticaNeueLT Pro 55 Roman" w:hAnsi="HelveticaNeueLT Pro 55 Roman" w:cs="Arial"/>
-          <w:sz w:val="22"/>
-          <w:szCs w:val="20"/>
-        </w:rPr>
-      </w:pPr>
-      <w:r>
         <w:rPr>
           <w:rFonts w:ascii="HelveticaNeueLT Pro 55 Roman" w:hAnsi="HelveticaNeueLT Pro 55 Roman"/>
           <w:b/>
           <w:sz w:val="18"/>
         </w:rPr>
-        <w:t xml:space="preserve">Stack: </w:t>
-      </w:r>
-      <w:r>
-        <w:rPr>
-          <w:rFonts w:ascii="HelveticaNeueLT Pro 55 Roman" w:hAnsi="HelveticaNeueLT Pro 55 Roman"/>
-          <w:sz w:val="18"/>
-        </w:rPr>
-        <w:t>React, Vite, Tailwind CSS, Node.js/Express, OpenAI API, Firebase, MS SQL Server (FreeTDS), TanStack Query.</w:t>
-      </w:r>
-    </w:p>
-    <w:p>
-      <w:pPr>
-        <w:spacing w:line="264" w:lineRule="auto"/>
-        <w:rPr>
-          <w:rFonts w:ascii="HelveticaNeueLT Pro 55 Roman" w:hAnsi="HelveticaNeueLT Pro 55 Roman" w:cs="Arial"/>
-          <w:sz w:val="18"/>
-          <w:szCs w:val="18"/>
-        </w:rPr>
-      </w:pPr>
-    </w:p>
-    <w:p>
-      <w:pPr>
-        <w:spacing w:after="80" w:line="264" w:lineRule="auto"/>
-        <w:ind w:left="288"/>
-        <w:rPr>
-          <w:rFonts w:ascii="HelveticaNeueLT Pro 55 Roman" w:hAnsi="HelveticaNeueLT Pro 55 Roman"/>
-          <w:sz w:val="18"/>
-        </w:rPr>
-      </w:pPr>
-      <w:r>
-        <w:rPr>
-          <w:rFonts w:ascii="HelveticaNeueLT Pro 55 Roman" w:hAnsi="HelveticaNeueLT Pro 55 Roman"/>
-          <w:b/>
-          <w:sz w:val="22"/>
-        </w:rPr>
-        <w:t>Liberty Pest Control, Scheduling Optimization Engine</w:t>
-      </w:r>
-      <w:r>
-        <w:rPr>
-          <w:rFonts w:ascii="HelveticaNeueLT Pro 55 Roman" w:hAnsi="HelveticaNeueLT Pro 55 Roman"/>
-          <w:sz w:val="18"/>
-        </w:rPr>
-        <w:t xml:space="preserve">  (2023–2024)</w:t>
-      </w:r>
-    </w:p>
-    <w:p>
-      <w:pPr>
-        <w:numPr>
-          <w:ilvl w:val="0"/>
-          <w:numId w:val="1"/>
-        </w:numPr>
-        <w:tabs>
-          <w:tab w:val="clear" w:pos="288"/>
-        </w:tabs>
-        <w:spacing w:after="40" w:line="264" w:lineRule="auto"/>
-        <w:ind w:left="540" w:hanging="252"/>
-        <w:rPr>
-          <w:rFonts w:ascii="HelveticaNeueLT Pro 55 Roman" w:hAnsi="HelveticaNeueLT Pro 55 Roman" w:cs="Arial"/>
-          <w:sz w:val="22"/>
-          <w:szCs w:val="22"/>
-        </w:rPr>
-      </w:pPr>
-      <w:r>
-        <w:rPr>
-          <w:rFonts w:ascii="HelveticaNeueLT Pro 55 Roman" w:hAnsi="HelveticaNeueLT Pro 55 Roman"/>
-          <w:sz w:val="22"/>
-          <w:szCs w:val="22"/>
-        </w:rPr>
-        <w:t>Designed a Vehicle Routing Problem solver assigning 5,500+ recurring services across 80 technicians in the NYC metro area. ~1,900-line algorithm in Node.js Worker Threads with</w:t>
-      </w:r>
-      <w:r>
-        <w:rPr>
-          <w:rFonts w:ascii="HelveticaNeueLT Pro 55 Roman" w:hAnsi="HelveticaNeueLT Pro 55 Roman"/>
-          <w:sz w:val="22"/>
-          <w:szCs w:val="22"/>
-        </w:rPr>
-        <w:t xml:space="preserve"> gap-packing</w:t>
-      </w:r>
-      <w:r>
-        <w:rPr>
-          <w:rFonts w:ascii="HelveticaNeueLT Pro 55 Roman" w:hAnsi="HelveticaNeueLT Pro 55 Roman"/>
-          <w:sz w:val="22"/>
-          <w:szCs w:val="22"/>
-        </w:rPr>
-        <w:t xml:space="preserve">, </w:t>
-      </w:r>
-      <w:r>
-        <w:rPr>
-          <w:rFonts w:ascii="HelveticaNeueLT Pro 55 Roman" w:hAnsi="HelveticaNeueLT Pro 55 Roman"/>
-          <w:sz w:val="22"/>
-          <w:szCs w:val="22"/>
-        </w:rPr>
-        <w:t xml:space="preserve">weighted scoring, </w:t>
-      </w:r>
-      <w:r>
-        <w:rPr>
-          <w:rFonts w:ascii="HelveticaNeueLT Pro 55 Roman" w:hAnsi="HelveticaNeueLT Pro 55 Roman"/>
-          <w:sz w:val="22"/>
-          <w:szCs w:val="22"/>
-        </w:rPr>
-        <w:t>and</w:t>
-      </w:r>
-      <w:r>
-        <w:rPr>
-          <w:rFonts w:ascii="HelveticaNeueLT Pro 55 Roman" w:hAnsi="HelveticaNeueLT Pro 55 Roman"/>
-          <w:sz w:val="22"/>
-          <w:szCs w:val="22"/>
-        </w:rPr>
-        <w:t xml:space="preserve"> geographic continuity.</w:t>
-      </w:r>
-    </w:p>
-    <w:p>
-      <w:pPr>
-        <w:numPr>
-          <w:ilvl w:val="0"/>
-          <w:numId w:val="1"/>
-        </w:numPr>
-        <w:tabs>
-          <w:tab w:val="clear" w:pos="288"/>
-          <w:tab w:val="num" w:pos="576"/>
-        </w:tabs>
-        <w:spacing w:after="40" w:line="264" w:lineRule="auto"/>
-        <w:ind w:left="540"/>
-        <w:rPr>
-          <w:rFonts w:ascii="HelveticaNeueLT Pro 55 Roman" w:hAnsi="HelveticaNeueLT Pro 55 Roman" w:cs="Arial"/>
-          <w:sz w:val="22"/>
-          <w:szCs w:val="20"/>
-        </w:rPr>
-      </w:pPr>
-      <w:r>
-        <w:rPr>
-          <w:rFonts w:ascii="HelveticaNeueLT Pro 55 Roman" w:hAnsi="HelveticaNeueLT Pro 55 Roman"/>
-          <w:sz w:val="22"/>
-          <w:szCs w:val="22"/>
-        </w:rPr>
-        <w:t>T</w:t>
-      </w:r>
-      <w:r>
-        <w:rPr>
-          <w:rFonts w:ascii="HelveticaNeueLT Pro 55 Roman" w:hAnsi="HelveticaNeueLT Pro 55 Roman"/>
-          <w:sz w:val="22"/>
-          <w:szCs w:val="22"/>
-        </w:rPr>
-        <w:t>hree-layer API: legacy SQL → Next.js API routes (data</w:t>
-      </w:r>
-      <w:r>
-        <w:rPr>
-          <w:rFonts w:ascii="HelveticaNeueLT Pro 55 Roman" w:hAnsi="HelveticaNeueLT Pro 55 Roman"/>
-          <w:sz w:val="22"/>
-        </w:rPr>
-        <w:t xml:space="preserve"> transformation, </w:t>
-      </w:r>
-      <w:r>
-        <w:rPr>
-          <w:rFonts w:ascii="HelveticaNeueLT Pro 55 Roman" w:hAnsi="HelveticaNeueLT Pro 55 Roman"/>
-          <w:sz w:val="22"/>
-        </w:rPr>
-        <w:t>validation</w:t>
-      </w:r>
-      <w:r>
-        <w:rPr>
-          <w:rFonts w:ascii="HelveticaNeueLT Pro 55 Roman" w:hAnsi="HelveticaNeueLT Pro 55 Roman"/>
-          <w:sz w:val="22"/>
-        </w:rPr>
-        <w:t>) → frontend visualization (Leaflet maps, react-big-calendar with per-technician views).</w:t>
-      </w:r>
-    </w:p>
-    <w:p>
-      <w:pPr>
-        <w:numPr>
-          <w:ilvl w:val="0"/>
-          <w:numId w:val="1"/>
-        </w:numPr>
-        <w:tabs>
-          <w:tab w:val="clear" w:pos="288"/>
-          <w:tab w:val="num" w:pos="576"/>
-        </w:tabs>
-        <w:spacing w:after="40" w:line="264" w:lineRule="auto"/>
-        <w:ind w:left="540"/>
-        <w:rPr>
-          <w:rFonts w:ascii="HelveticaNeueLT Pro 55 Roman" w:hAnsi="HelveticaNeueLT Pro 55 Roman" w:cs="Arial"/>
-          <w:sz w:val="22"/>
-          <w:szCs w:val="20"/>
-        </w:rPr>
-      </w:pPr>
-      <w:r>
-        <w:rPr>
-          <w:rFonts w:ascii="HelveticaNeueLT Pro 55 Roman" w:hAnsi="HelveticaNeueLT Pro 55 Roman"/>
-          <w:sz w:val="22"/>
-        </w:rPr>
-        <w:t>Implemented Haversine distance matrices, GeoJSON ray-casting for NYC borough containment, and batch rendering to keep the UI responsive with thousands of calendar events.</w:t>
-      </w:r>
-    </w:p>
-    <w:p>
-      <w:pPr>
-        <w:spacing w:before="120" w:after="40" w:line="264" w:lineRule="auto"/>
-        <w:ind w:left="259"/>
+      </w:pPr>
+      <w:r>
         <w:rPr>
           <w:rFonts w:ascii="HelveticaNeueLT Pro 55 Roman" w:hAnsi="HelveticaNeueLT Pro 55 Roman"/>
           <w:b/>
           <w:sz w:val="18"/>
         </w:rPr>
-      </w:pPr>
-      <w:r>
-        <w:rPr>
-          <w:rFonts w:ascii="HelveticaNeueLT Pro 55 Roman" w:hAnsi="HelveticaNeueLT Pro 55 Roman"/>
-          <w:b/>
-          <w:sz w:val="18"/>
-        </w:rPr>
         <w:t xml:space="preserve">Stack: </w:t>
       </w:r>
       <w:r>
@@ -1157,124 +1460,6 @@
           <w:sz w:val="18"/>
         </w:rPr>
         <w:t>Next.js (App Router), React, Tailwind CSS, Node.js Worker Threads, Leaflet/Mapbox, Turf.js, MS SQL Server.</w:t>
-      </w:r>
-    </w:p>
-    <w:p>
-      <w:pPr>
-        <w:spacing w:after="40" w:line="264" w:lineRule="auto"/>
-        <w:ind w:left="288"/>
-        <w:rPr>
-          <w:rFonts w:ascii="HelveticaNeueLT Pro 55 Roman" w:hAnsi="HelveticaNeueLT Pro 55 Roman"/>
-          <w:sz w:val="18"/>
-        </w:rPr>
-      </w:pPr>
-      <w:r>
-        <w:rPr>
-          <w:rFonts w:ascii="HelveticaNeueLT Pro 55 Roman" w:hAnsi="HelveticaNeueLT Pro 55 Roman"/>
-          <w:b/>
-          <w:sz w:val="22"/>
-        </w:rPr>
-        <w:lastRenderedPageBreak/>
-        <w:t>Featured: Meridian Capital Group</w:t>
-      </w:r>
-      <w:r>
-        <w:rPr>
-          <w:rFonts w:ascii="HelveticaNeueLT Pro 55 Roman" w:hAnsi="HelveticaNeueLT Pro 55 Roman"/>
-          <w:sz w:val="18"/>
-        </w:rPr>
-        <w:t xml:space="preserve">  (2018)</w:t>
-      </w:r>
-    </w:p>
-    <w:p>
-      <w:pPr>
-        <w:spacing w:after="40" w:line="264" w:lineRule="auto"/>
-        <w:ind w:left="288"/>
-        <w:rPr>
-          <w:rFonts w:ascii="HelveticaNeueLT Pro 55 Roman" w:hAnsi="HelveticaNeueLT Pro 55 Roman" w:cs="Arial"/>
-          <w:sz w:val="22"/>
-          <w:szCs w:val="20"/>
-        </w:rPr>
-      </w:pPr>
-      <w:r>
-        <w:rPr>
-          <w:rFonts w:ascii="HelveticaNeueLT Pro 55 Roman" w:hAnsi="HelveticaNeueLT Pro 55 Roman"/>
-          <w:sz w:val="22"/>
-        </w:rPr>
-        <w:t>Built the corporate website for one of America’s largest commercial real estate finance firms on WordPress. Custom theme and plugin with drag-and-drop content widgets</w:t>
-      </w:r>
-      <w:r>
-        <w:rPr>
-          <w:rFonts w:ascii="HelveticaNeueLT Pro 55 Roman" w:hAnsi="HelveticaNeueLT Pro 55 Roman"/>
-          <w:sz w:val="22"/>
-        </w:rPr>
-        <w:t>. M</w:t>
-      </w:r>
-      <w:r>
-        <w:rPr>
-          <w:rFonts w:ascii="HelveticaNeueLT Pro 55 Roman" w:hAnsi="HelveticaNeueLT Pro 55 Roman"/>
-          <w:sz w:val="22"/>
-        </w:rPr>
-        <w:t>anaged phased rollout.</w:t>
-      </w:r>
-    </w:p>
-    <w:p>
-      <w:pPr>
-        <w:spacing w:line="264" w:lineRule="auto"/>
-        <w:rPr>
-          <w:rFonts w:ascii="HelveticaNeueLT Pro 55 Roman" w:hAnsi="HelveticaNeueLT Pro 55 Roman" w:cs="Arial"/>
-          <w:sz w:val="8"/>
-          <w:szCs w:val="8"/>
-        </w:rPr>
-      </w:pPr>
-    </w:p>
-    <w:p>
-      <w:pPr>
-        <w:spacing w:after="40" w:line="264" w:lineRule="auto"/>
-        <w:ind w:left="288"/>
-        <w:rPr>
-          <w:rFonts w:ascii="HelveticaNeueLT Pro 55 Roman" w:hAnsi="HelveticaNeueLT Pro 55 Roman"/>
-          <w:sz w:val="18"/>
-        </w:rPr>
-      </w:pPr>
-      <w:r>
-        <w:rPr>
-          <w:rFonts w:ascii="HelveticaNeueLT Pro 55 Roman" w:hAnsi="HelveticaNeueLT Pro 55 Roman"/>
-          <w:b/>
-          <w:sz w:val="22"/>
-        </w:rPr>
-        <w:t xml:space="preserve">Featured: </w:t>
-      </w:r>
-      <w:r>
-        <w:rPr>
-          <w:rFonts w:ascii="HelveticaNeueLT Pro 55 Roman" w:hAnsi="HelveticaNeueLT Pro 55 Roman"/>
-          <w:b/>
-          <w:sz w:val="22"/>
-        </w:rPr>
-        <w:t>Kim Seybert</w:t>
-      </w:r>
-      <w:r>
-        <w:rPr>
-          <w:rFonts w:ascii="HelveticaNeueLT Pro 55 Roman" w:hAnsi="HelveticaNeueLT Pro 55 Roman"/>
-          <w:sz w:val="18"/>
-        </w:rPr>
-        <w:t xml:space="preserve">  (2017–2019)</w:t>
-      </w:r>
-    </w:p>
-    <w:p>
-      <w:pPr>
-        <w:spacing w:after="40" w:line="264" w:lineRule="auto"/>
-        <w:ind w:left="288"/>
-        <w:rPr>
-          <w:rFonts w:ascii="HelveticaNeueLT Pro 55 Roman" w:hAnsi="HelveticaNeueLT Pro 55 Roman"/>
-          <w:sz w:val="22"/>
-        </w:rPr>
-      </w:pPr>
-      <w:r>
-        <w:rPr>
-          <w:rFonts w:ascii="HelveticaNeueLT Pro 55 Roman" w:hAnsi="HelveticaNeueLT Pro 55 Roman"/>
-          <w:sz w:val="22"/>
-        </w:rPr>
-        <w:t>E-commerce lead on Shopify. Drove 234% conversion rate over industry average, 316% ROAS, and 42% revenue YOY. Reduced time-to-start-render by over 80%. A/B testing, checkout optimization, Apple Pay and PayPal One Touch integration.</w:t>
       </w:r>
     </w:p>
     <w:p>
@@ -1875,7 +2060,7 @@
           <w:sz w:val="22"/>
           <w:szCs w:val="22"/>
         </w:rPr>
-        <w:t>200</w:t>
+        <w:t>2</w:t>
       </w:r>
       <w:r>
         <w:rPr>
@@ -1883,6 +2068,22 @@
           <w:sz w:val="22"/>
           <w:szCs w:val="22"/>
         </w:rPr>
+        <w:t>5</w:t>
+      </w:r>
+      <w:r>
+        <w:rPr>
+          <w:rFonts w:ascii="HelveticaNeueLT Pro 55 Roman" w:hAnsi="HelveticaNeueLT Pro 55 Roman"/>
+          <w:sz w:val="22"/>
+          <w:szCs w:val="22"/>
+        </w:rPr>
+        <w:t>0</w:t>
+      </w:r>
+      <w:r>
+        <w:rPr>
+          <w:rFonts w:ascii="HelveticaNeueLT Pro 55 Roman" w:hAnsi="HelveticaNeueLT Pro 55 Roman"/>
+          <w:sz w:val="22"/>
+          <w:szCs w:val="22"/>
+        </w:rPr>
         <w:t xml:space="preserve">+ PRs </w:t>
       </w:r>
       <w:r>
@@ -1891,7 +2092,7 @@
           <w:sz w:val="22"/>
           <w:szCs w:val="22"/>
         </w:rPr>
-        <w:t>to</w:t>
+        <w:t>across 9 repositories, 1</w:t>
       </w:r>
       <w:r>
         <w:rPr>
@@ -1899,17 +2100,15 @@
           <w:sz w:val="22"/>
           <w:szCs w:val="22"/>
         </w:rPr>
-        <w:t xml:space="preserve"> </w:t>
-      </w:r>
-      <w:r>
-        <w:rPr>
-          <w:rFonts w:ascii="HelveticaNeueLT Pro 55 Roman" w:hAnsi="HelveticaNeueLT Pro 55 Roman"/>
-          <w:b/>
-          <w:bCs/>
+        <w:t>5</w:t>
+      </w:r>
+      <w:r>
+        <w:rPr>
+          <w:rFonts w:ascii="HelveticaNeueLT Pro 55 Roman" w:hAnsi="HelveticaNeueLT Pro 55 Roman"/>
           <w:sz w:val="22"/>
           <w:szCs w:val="22"/>
         </w:rPr>
-        <w:t>hermes-webui</w:t>
+        <w:t>0+ shipped at 9</w:t>
       </w:r>
       <w:r>
         <w:rPr>
@@ -1917,49 +2116,15 @@
           <w:sz w:val="22"/>
           <w:szCs w:val="22"/>
         </w:rPr>
-        <w:t xml:space="preserve"> and </w:t>
-      </w:r>
-      <w:r>
-        <w:rPr>
-          <w:rFonts w:ascii="HelveticaNeueLT Pro 55 Roman" w:hAnsi="HelveticaNeueLT Pro 55 Roman"/>
-          <w:b/>
-          <w:bCs/>
+        <w:t>5</w:t>
+      </w:r>
+      <w:r>
+        <w:rPr>
+          <w:rFonts w:ascii="HelveticaNeueLT Pro 55 Roman" w:hAnsi="HelveticaNeueLT Pro 55 Roman"/>
           <w:sz w:val="22"/>
           <w:szCs w:val="22"/>
         </w:rPr>
-        <w:t>hermes-agent</w:t>
-      </w:r>
-      <w:r>
-        <w:rPr>
-          <w:rFonts w:ascii="HelveticaNeueLT Pro 55 Roman" w:hAnsi="HelveticaNeueLT Pro 55 Roman"/>
-          <w:sz w:val="22"/>
-          <w:szCs w:val="22"/>
-        </w:rPr>
-        <w:t xml:space="preserve"> </w:t>
-      </w:r>
-      <w:r>
-        <w:rPr>
-          <w:rFonts w:ascii="HelveticaNeueLT Pro 55 Roman" w:hAnsi="HelveticaNeueLT Pro 55 Roman"/>
-          <w:sz w:val="22"/>
-          <w:szCs w:val="22"/>
-        </w:rPr>
-        <w:t>for</w:t>
-      </w:r>
-      <w:r>
-        <w:rPr>
-          <w:rFonts w:ascii="HelveticaNeueLT Pro 55 Roman" w:hAnsi="HelveticaNeueLT Pro 55 Roman"/>
-          <w:sz w:val="22"/>
-          <w:szCs w:val="22"/>
-        </w:rPr>
-        <w:t xml:space="preserve"> </w:t>
-      </w:r>
-      <w:r>
-        <w:rPr>
-          <w:rFonts w:ascii="HelveticaNeueLT Pro 55 Roman" w:hAnsi="HelveticaNeueLT Pro 55 Roman"/>
-          <w:sz w:val="22"/>
-          <w:szCs w:val="22"/>
-        </w:rPr>
-        <w:t>agent UX, reliability, streaming behavior, provider infrastructure, security hardening and other production-facing work</w:t>
+        <w:t>% acceptance</w:t>
       </w:r>
       <w:r>
         <w:rPr>
@@ -2005,187 +2170,33 @@
       <w:pPr>
         <w:spacing w:before="60" w:line="276" w:lineRule="auto"/>
         <w:rPr>
+          <w:rFonts w:ascii="HelveticaNeueLT Pro 55 Roman" w:hAnsi="HelveticaNeueLT Pro 55 Roman" w:cs="Arial"/>
+          <w:sz w:val="22"/>
+          <w:szCs w:val="20"/>
+        </w:rPr>
+      </w:pPr>
+      <w:r>
+        <w:rPr>
+          <w:rFonts w:ascii="HelveticaNeueLT Pro 55 Roman" w:hAnsi="HelveticaNeueLT Pro 55 Roman"/>
+          <w:b/>
+          <w:sz w:val="22"/>
+        </w:rPr>
+        <w:t>hermes-webui</w:t>
+      </w:r>
+      <w:r>
+        <w:rPr>
+          <w:rFonts w:ascii="HelveticaNeueLT Pro 55 Roman" w:hAnsi="HelveticaNeueLT Pro 55 Roman"/>
+          <w:sz w:val="18"/>
+        </w:rPr>
+        <w:t xml:space="preserve">  ·  github.com/nesquena/hermes-webui (14K+ stars)  ·  </w:t>
+      </w:r>
+      <w:r>
+        <w:rPr>
           <w:rFonts w:ascii="HelveticaNeueLT Pro 55 Roman" w:hAnsi="HelveticaNeueLT Pro 55 Roman"/>
           <w:sz w:val="22"/>
           <w:szCs w:val="22"/>
         </w:rPr>
-      </w:pPr>
-      <w:r>
-        <w:rPr>
-          <w:rFonts w:ascii="HelveticaNeueLT Pro 55 Roman" w:hAnsi="HelveticaNeueLT Pro 55 Roman"/>
-          <w:b/>
-          <w:sz w:val="22"/>
-        </w:rPr>
-        <w:t>claude-mem</w:t>
-      </w:r>
-      <w:r>
-        <w:rPr>
-          <w:rFonts w:ascii="HelveticaNeueLT Pro 55 Roman" w:hAnsi="HelveticaNeueLT Pro 55 Roman"/>
-          <w:sz w:val="18"/>
-        </w:rPr>
-        <w:t xml:space="preserve">  ·  github.com/thedotmack/claude-mem (77K+ stars)</w:t>
-      </w:r>
-      <w:r>
-        <w:rPr>
-          <w:rFonts w:ascii="HelveticaNeueLT Pro 55 Roman" w:hAnsi="HelveticaNeueLT Pro 55 Roman"/>
-          <w:sz w:val="18"/>
-        </w:rPr>
-        <w:t xml:space="preserve">  ·  </w:t>
-      </w:r>
-      <w:r>
-        <w:rPr>
-          <w:rFonts w:ascii="HelveticaNeueLT Pro 55 Roman" w:hAnsi="HelveticaNeueLT Pro 55 Roman"/>
-          <w:sz w:val="22"/>
-          <w:szCs w:val="22"/>
-        </w:rPr>
-        <w:t>Persistent memory for AI coding agents.</w:t>
-      </w:r>
-    </w:p>
-    <w:p>
-      <w:pPr>
-        <w:spacing w:line="264" w:lineRule="auto"/>
-        <w:rPr>
-          <w:rFonts w:ascii="HelveticaNeueLT Pro 55 Roman" w:hAnsi="HelveticaNeueLT Pro 55 Roman" w:cs="Arial"/>
-          <w:sz w:val="22"/>
-          <w:szCs w:val="22"/>
-        </w:rPr>
-      </w:pPr>
-      <w:r>
-        <w:rPr>
-          <w:rFonts w:ascii="HelveticaNeueLT Pro 55 Roman" w:hAnsi="HelveticaNeueLT Pro 55 Roman" w:cs="Arial"/>
-          <w:sz w:val="22"/>
-          <w:szCs w:val="20"/>
-        </w:rPr>
-        <w:t>4</w:t>
-      </w:r>
-      <w:r>
-        <w:rPr>
-          <w:rFonts w:ascii="HelveticaNeueLT Pro 55 Roman" w:hAnsi="HelveticaNeueLT Pro 55 Roman" w:cs="Arial"/>
-          <w:sz w:val="22"/>
-          <w:szCs w:val="20"/>
-          <w:vertAlign w:val="superscript"/>
-        </w:rPr>
-        <w:t>th</w:t>
-      </w:r>
-      <w:r>
-        <w:rPr>
-          <w:rFonts w:ascii="HelveticaNeueLT Pro 55 Roman" w:hAnsi="HelveticaNeueLT Pro 55 Roman" w:cs="Arial"/>
-          <w:sz w:val="22"/>
-          <w:szCs w:val="20"/>
-        </w:rPr>
-        <w:t xml:space="preserve"> highest contributor: s</w:t>
-      </w:r>
-      <w:r>
-        <w:rPr>
-          <w:rFonts w:ascii="HelveticaNeueLT Pro 55 Roman" w:hAnsi="HelveticaNeueLT Pro 55 Roman" w:cs="Arial"/>
-          <w:sz w:val="22"/>
-          <w:szCs w:val="20"/>
-        </w:rPr>
-        <w:t xml:space="preserve">pawn storm </w:t>
-      </w:r>
-      <w:r>
-        <w:rPr>
-          <w:rFonts w:ascii="HelveticaNeueLT Pro 55 Roman" w:hAnsi="HelveticaNeueLT Pro 55 Roman" w:cs="Arial"/>
-          <w:sz w:val="22"/>
-          <w:szCs w:val="20"/>
-        </w:rPr>
-        <w:t>defense,</w:t>
-      </w:r>
-      <w:r>
-        <w:rPr>
-          <w:rFonts w:ascii="HelveticaNeueLT Pro 55 Roman" w:hAnsi="HelveticaNeueLT Pro 55 Roman" w:cs="Arial"/>
-          <w:sz w:val="22"/>
-          <w:szCs w:val="20"/>
-        </w:rPr>
-        <w:t xml:space="preserve"> </w:t>
-      </w:r>
-      <w:r>
-        <w:rPr>
-          <w:rFonts w:ascii="HelveticaNeueLT Pro 55 Roman" w:hAnsi="HelveticaNeueLT Pro 55 Roman" w:cs="Arial"/>
-          <w:sz w:val="22"/>
-          <w:szCs w:val="20"/>
-        </w:rPr>
-        <w:t>h</w:t>
-      </w:r>
-      <w:r>
-        <w:rPr>
-          <w:rFonts w:ascii="HelveticaNeueLT Pro 55 Roman" w:hAnsi="HelveticaNeueLT Pro 55 Roman" w:cs="Arial"/>
-          <w:sz w:val="22"/>
-          <w:szCs w:val="20"/>
-        </w:rPr>
-        <w:t xml:space="preserve">ook/worker </w:t>
-      </w:r>
-      <w:r>
-        <w:rPr>
-          <w:rFonts w:ascii="HelveticaNeueLT Pro 55 Roman" w:hAnsi="HelveticaNeueLT Pro 55 Roman" w:cs="Arial"/>
-          <w:sz w:val="22"/>
-          <w:szCs w:val="20"/>
-        </w:rPr>
-        <w:t xml:space="preserve">lifecycle </w:t>
-      </w:r>
-      <w:r>
-        <w:rPr>
-          <w:rFonts w:ascii="HelveticaNeueLT Pro 55 Roman" w:hAnsi="HelveticaNeueLT Pro 55 Roman" w:cs="Arial"/>
-          <w:sz w:val="22"/>
-          <w:szCs w:val="20"/>
-        </w:rPr>
-        <w:t>hardening</w:t>
-      </w:r>
-      <w:r>
-        <w:rPr>
-          <w:rFonts w:ascii="HelveticaNeueLT Pro 55 Roman" w:hAnsi="HelveticaNeueLT Pro 55 Roman" w:cs="Arial"/>
-          <w:sz w:val="22"/>
-          <w:szCs w:val="20"/>
-        </w:rPr>
-        <w:t>,</w:t>
-      </w:r>
-      <w:r>
-        <w:rPr>
-          <w:rFonts w:ascii="HelveticaNeueLT Pro 55 Roman" w:hAnsi="HelveticaNeueLT Pro 55 Roman" w:cs="Arial"/>
-          <w:sz w:val="22"/>
-          <w:szCs w:val="20"/>
-        </w:rPr>
-        <w:t xml:space="preserve"> </w:t>
-      </w:r>
-      <w:r>
-        <w:rPr>
-          <w:rFonts w:ascii="HelveticaNeueLT Pro 55 Roman" w:hAnsi="HelveticaNeueLT Pro 55 Roman" w:cs="Arial"/>
-          <w:sz w:val="22"/>
-          <w:szCs w:val="20"/>
-        </w:rPr>
-        <w:t>d</w:t>
-      </w:r>
-      <w:r>
-        <w:rPr>
-          <w:rFonts w:ascii="HelveticaNeueLT Pro 55 Roman" w:hAnsi="HelveticaNeueLT Pro 55 Roman" w:cs="Arial"/>
-          <w:sz w:val="22"/>
-          <w:szCs w:val="20"/>
-        </w:rPr>
-        <w:t>aemon</w:t>
-      </w:r>
-      <w:r>
-        <w:rPr>
-          <w:rFonts w:ascii="HelveticaNeueLT Pro 55 Roman" w:hAnsi="HelveticaNeueLT Pro 55 Roman" w:cs="Arial"/>
-          <w:sz w:val="22"/>
-          <w:szCs w:val="20"/>
-        </w:rPr>
-        <w:t xml:space="preserve"> </w:t>
-      </w:r>
-      <w:r>
-        <w:rPr>
-          <w:rFonts w:ascii="HelveticaNeueLT Pro 55 Roman" w:hAnsi="HelveticaNeueLT Pro 55 Roman" w:cs="Arial"/>
-          <w:sz w:val="22"/>
-          <w:szCs w:val="20"/>
-        </w:rPr>
-        <w:t>resilience</w:t>
-      </w:r>
-      <w:r>
-        <w:rPr>
-          <w:rFonts w:ascii="HelveticaNeueLT Pro 55 Roman" w:hAnsi="HelveticaNeueLT Pro 55 Roman" w:cs="Arial"/>
-          <w:sz w:val="22"/>
-          <w:szCs w:val="20"/>
-        </w:rPr>
-        <w:t>.</w:t>
+        <w:t>Web UI for Hermes Agent. #3 contributor. Agent UX, streaming behavior, provider infrastructure, session recovery, cross-platform support.</w:t>
       </w:r>
     </w:p>
     <w:p>
@@ -2204,29 +2215,44 @@
         <w:spacing w:before="60" w:line="276" w:lineRule="auto"/>
         <w:rPr>
           <w:rFonts w:ascii="HelveticaNeueLT Pro 55 Roman" w:hAnsi="HelveticaNeueLT Pro 55 Roman"/>
+          <w:sz w:val="22"/>
+          <w:szCs w:val="22"/>
+        </w:rPr>
+      </w:pPr>
+      <w:r>
+        <w:rPr>
+          <w:rFonts w:ascii="HelveticaNeueLT Pro 55 Roman" w:hAnsi="HelveticaNeueLT Pro 55 Roman"/>
+          <w:b/>
+          <w:sz w:val="22"/>
+        </w:rPr>
+        <w:t>claude-mem</w:t>
+      </w:r>
+      <w:r>
+        <w:rPr>
+          <w:rFonts w:ascii="HelveticaNeueLT Pro 55 Roman" w:hAnsi="HelveticaNeueLT Pro 55 Roman"/>
           <w:sz w:val="18"/>
         </w:rPr>
-      </w:pPr>
-      <w:r>
-        <w:rPr>
-          <w:rFonts w:ascii="HelveticaNeueLT Pro 55 Roman" w:hAnsi="HelveticaNeueLT Pro 55 Roman"/>
-          <w:b/>
-          <w:sz w:val="22"/>
-        </w:rPr>
-        <w:t>mcp-memory-service</w:t>
+        <w:t xml:space="preserve">  ·  github.com/thedotmack/claude-mem (</w:t>
       </w:r>
       <w:r>
         <w:rPr>
           <w:rFonts w:ascii="HelveticaNeueLT Pro 55 Roman" w:hAnsi="HelveticaNeueLT Pro 55 Roman"/>
           <w:sz w:val="18"/>
         </w:rPr>
-        <w:t xml:space="preserve">  ·  github.com/doobidoo/mcp-memory-service (1.9K+ stars)</w:t>
+        <w:t>80</w:t>
       </w:r>
       <w:r>
         <w:rPr>
           <w:rFonts w:ascii="HelveticaNeueLT Pro 55 Roman" w:hAnsi="HelveticaNeueLT Pro 55 Roman"/>
           <w:sz w:val="18"/>
         </w:rPr>
+        <w:t>K+ stars)</w:t>
+      </w:r>
+      <w:r>
+        <w:rPr>
+          <w:rFonts w:ascii="HelveticaNeueLT Pro 55 Roman" w:hAnsi="HelveticaNeueLT Pro 55 Roman"/>
+          <w:sz w:val="18"/>
+        </w:rPr>
         <w:t xml:space="preserve">  ·  </w:t>
       </w:r>
       <w:r>
@@ -2235,7 +2261,7 @@
           <w:sz w:val="22"/>
           <w:szCs w:val="22"/>
         </w:rPr>
-        <w:t>Memory backend for AI.</w:t>
+        <w:t>Persistent memory for AI coding agents.</w:t>
       </w:r>
     </w:p>
     <w:p>
@@ -2244,38 +2270,46 @@
         <w:rPr>
           <w:rFonts w:ascii="HelveticaNeueLT Pro 55 Roman" w:hAnsi="HelveticaNeueLT Pro 55 Roman" w:cs="Arial"/>
           <w:sz w:val="22"/>
-          <w:szCs w:val="20"/>
-        </w:rPr>
-      </w:pPr>
-      <w:r>
-        <w:rPr>
-          <w:rFonts w:ascii="HelveticaNeueLT Pro 55 Roman" w:hAnsi="HelveticaNeueLT Pro 55 Roman" w:cs="Arial"/>
-          <w:sz w:val="22"/>
           <w:szCs w:val="22"/>
         </w:rPr>
-        <w:t>Maintainer</w:t>
-      </w:r>
-      <w:r>
-        <w:rPr>
-          <w:rFonts w:ascii="HelveticaNeueLT Pro 55 Roman" w:hAnsi="HelveticaNeueLT Pro 55 Roman" w:cs="Arial"/>
-          <w:sz w:val="22"/>
-          <w:szCs w:val="22"/>
-        </w:rPr>
-        <w:t xml:space="preserve">. </w:t>
-      </w:r>
-      <w:r>
-        <w:rPr>
-          <w:rFonts w:ascii="HelveticaNeueLT Pro 55 Roman" w:hAnsi="HelveticaNeueLT Pro 55 Roman" w:cs="Arial"/>
-          <w:sz w:val="22"/>
-          <w:szCs w:val="22"/>
-        </w:rPr>
-        <w:t>Contributed</w:t>
-      </w:r>
-      <w:r>
-        <w:rPr>
-          <w:rFonts w:ascii="HelveticaNeueLT Pro 55 Roman" w:hAnsi="HelveticaNeueLT Pro 55 Roman" w:cs="Arial"/>
-          <w:sz w:val="22"/>
-          <w:szCs w:val="22"/>
+      </w:pPr>
+      <w:r>
+        <w:rPr>
+          <w:rFonts w:ascii="HelveticaNeueLT Pro 55 Roman" w:hAnsi="HelveticaNeueLT Pro 55 Roman" w:cs="Arial"/>
+          <w:sz w:val="22"/>
+          <w:szCs w:val="20"/>
+        </w:rPr>
+        <w:t>Top-5</w:t>
+      </w:r>
+      <w:r>
+        <w:rPr>
+          <w:rFonts w:ascii="HelveticaNeueLT Pro 55 Roman" w:hAnsi="HelveticaNeueLT Pro 55 Roman" w:cs="Arial"/>
+          <w:sz w:val="22"/>
+          <w:szCs w:val="20"/>
+        </w:rPr>
+        <w:t xml:space="preserve"> contributor: s</w:t>
+      </w:r>
+      <w:r>
+        <w:rPr>
+          <w:rFonts w:ascii="HelveticaNeueLT Pro 55 Roman" w:hAnsi="HelveticaNeueLT Pro 55 Roman" w:cs="Arial"/>
+          <w:sz w:val="22"/>
+          <w:szCs w:val="20"/>
+        </w:rPr>
+        <w:t xml:space="preserve">pawn storm </w:t>
+      </w:r>
+      <w:r>
+        <w:rPr>
+          <w:rFonts w:ascii="HelveticaNeueLT Pro 55 Roman" w:hAnsi="HelveticaNeueLT Pro 55 Roman" w:cs="Arial"/>
+          <w:sz w:val="22"/>
+          <w:szCs w:val="20"/>
+        </w:rPr>
+        <w:t>defense,</w:t>
+      </w:r>
+      <w:r>
+        <w:rPr>
+          <w:rFonts w:ascii="HelveticaNeueLT Pro 55 Roman" w:hAnsi="HelveticaNeueLT Pro 55 Roman" w:cs="Arial"/>
+          <w:sz w:val="22"/>
+          <w:szCs w:val="20"/>
         </w:rPr>
         <w:t xml:space="preserve"> </w:t>
       </w:r>
@@ -2283,17 +2317,89 @@
         <w:rPr>
           <w:rFonts w:ascii="HelveticaNeueLT Pro 55 Roman" w:hAnsi="HelveticaNeueLT Pro 55 Roman" w:cs="Arial"/>
           <w:sz w:val="22"/>
-          <w:szCs w:val="22"/>
-        </w:rPr>
-        <w:t>b</w:t>
-      </w:r>
-      <w:r>
-        <w:rPr>
-          <w:rFonts w:ascii="HelveticaNeueLT Pro 55 Roman" w:hAnsi="HelveticaNeueLT Pro 55 Roman" w:cs="Arial"/>
-          <w:sz w:val="22"/>
-          <w:szCs w:val="22"/>
-        </w:rPr>
-        <w:t>atched ONNX inference, SQLite concurrency fixes, and integrity monitoring.</w:t>
+          <w:szCs w:val="20"/>
+        </w:rPr>
+        <w:t>h</w:t>
+      </w:r>
+      <w:r>
+        <w:rPr>
+          <w:rFonts w:ascii="HelveticaNeueLT Pro 55 Roman" w:hAnsi="HelveticaNeueLT Pro 55 Roman" w:cs="Arial"/>
+          <w:sz w:val="22"/>
+          <w:szCs w:val="20"/>
+        </w:rPr>
+        <w:t xml:space="preserve">ook/worker </w:t>
+      </w:r>
+      <w:r>
+        <w:rPr>
+          <w:rFonts w:ascii="HelveticaNeueLT Pro 55 Roman" w:hAnsi="HelveticaNeueLT Pro 55 Roman" w:cs="Arial"/>
+          <w:sz w:val="22"/>
+          <w:szCs w:val="20"/>
+        </w:rPr>
+        <w:t xml:space="preserve">lifecycle </w:t>
+      </w:r>
+      <w:r>
+        <w:rPr>
+          <w:rFonts w:ascii="HelveticaNeueLT Pro 55 Roman" w:hAnsi="HelveticaNeueLT Pro 55 Roman" w:cs="Arial"/>
+          <w:sz w:val="22"/>
+          <w:szCs w:val="20"/>
+        </w:rPr>
+        <w:t>hardening</w:t>
+      </w:r>
+      <w:r>
+        <w:rPr>
+          <w:rFonts w:ascii="HelveticaNeueLT Pro 55 Roman" w:hAnsi="HelveticaNeueLT Pro 55 Roman" w:cs="Arial"/>
+          <w:sz w:val="22"/>
+          <w:szCs w:val="20"/>
+        </w:rPr>
+        <w:t>,</w:t>
+      </w:r>
+      <w:r>
+        <w:rPr>
+          <w:rFonts w:ascii="HelveticaNeueLT Pro 55 Roman" w:hAnsi="HelveticaNeueLT Pro 55 Roman" w:cs="Arial"/>
+          <w:sz w:val="22"/>
+          <w:szCs w:val="20"/>
+        </w:rPr>
+        <w:t xml:space="preserve"> </w:t>
+      </w:r>
+      <w:r>
+        <w:rPr>
+          <w:rFonts w:ascii="HelveticaNeueLT Pro 55 Roman" w:hAnsi="HelveticaNeueLT Pro 55 Roman" w:cs="Arial"/>
+          <w:sz w:val="22"/>
+          <w:szCs w:val="20"/>
+        </w:rPr>
+        <w:t>d</w:t>
+      </w:r>
+      <w:r>
+        <w:rPr>
+          <w:rFonts w:ascii="HelveticaNeueLT Pro 55 Roman" w:hAnsi="HelveticaNeueLT Pro 55 Roman" w:cs="Arial"/>
+          <w:sz w:val="22"/>
+          <w:szCs w:val="20"/>
+        </w:rPr>
+        <w:t>aemon</w:t>
+      </w:r>
+      <w:r>
+        <w:rPr>
+          <w:rFonts w:ascii="HelveticaNeueLT Pro 55 Roman" w:hAnsi="HelveticaNeueLT Pro 55 Roman" w:cs="Arial"/>
+          <w:sz w:val="22"/>
+          <w:szCs w:val="20"/>
+        </w:rPr>
+        <w:t xml:space="preserve"> </w:t>
+      </w:r>
+      <w:r>
+        <w:rPr>
+          <w:rFonts w:ascii="HelveticaNeueLT Pro 55 Roman" w:hAnsi="HelveticaNeueLT Pro 55 Roman" w:cs="Arial"/>
+          <w:sz w:val="22"/>
+          <w:szCs w:val="20"/>
+        </w:rPr>
+        <w:t>resilience</w:t>
+      </w:r>
+      <w:r>
+        <w:rPr>
+          <w:rFonts w:ascii="HelveticaNeueLT Pro 55 Roman" w:hAnsi="HelveticaNeueLT Pro 55 Roman" w:cs="Arial"/>
+          <w:sz w:val="22"/>
+          <w:szCs w:val="20"/>
+        </w:rPr>
+        <w:t>.</w:t>
       </w:r>
     </w:p>
     <w:tbl>
@@ -3942,7 +4048,7 @@
   <w:style w:type="paragraph" w:default="1" w:styleId="Normal">
     <w:name w:val="Normal"/>
     <w:qFormat/>
-    <w:rsid w:val="00E14DAE"/>
+    <w:rsid w:val="00676321"/>
     <w:rPr>
       <w:sz w:val="24"/>
       <w:szCs w:val="24"/>

</xml_diff>

<commit_message>
Replace hermes-agent with agentsview
</commit_message>
<xml_diff>
--- a/resume.docx
+++ b/resume.docx
@@ -481,14 +481,32 @@
                 <w:sz w:val="22"/>
                 <w:szCs w:val="20"/>
               </w:rPr>
-              <w:t>% acceptance. Top-5 contributor to claude-mem (</w:t>
-            </w:r>
+              <w:t xml:space="preserve">% acceptance. Top-5 contributor to </w:t>
+            </w:r>
+            <w:proofErr w:type="spellStart"/>
             <w:r>
               <w:rPr>
                 <w:rFonts w:ascii="HelveticaNeueLT Pro 55 Roman" w:hAnsi="HelveticaNeueLT Pro 55 Roman" w:cs="Arial"/>
                 <w:sz w:val="22"/>
                 <w:szCs w:val="20"/>
               </w:rPr>
+              <w:t>claude</w:t>
+            </w:r>
+            <w:proofErr w:type="spellEnd"/>
+            <w:r>
+              <w:rPr>
+                <w:rFonts w:ascii="HelveticaNeueLT Pro 55 Roman" w:hAnsi="HelveticaNeueLT Pro 55 Roman" w:cs="Arial"/>
+                <w:sz w:val="22"/>
+                <w:szCs w:val="20"/>
+              </w:rPr>
+              <w:t>-mem (</w:t>
+            </w:r>
+            <w:r>
+              <w:rPr>
+                <w:rFonts w:ascii="HelveticaNeueLT Pro 55 Roman" w:hAnsi="HelveticaNeueLT Pro 55 Roman" w:cs="Arial"/>
+                <w:sz w:val="22"/>
+                <w:szCs w:val="20"/>
+              </w:rPr>
               <w:t>80</w:t>
             </w:r>
             <w:r>
@@ -497,7 +515,25 @@
                 <w:sz w:val="22"/>
                 <w:szCs w:val="20"/>
               </w:rPr>
-              <w:t>K+ stars) and #3 on hermes-webui (14K+ stars).</w:t>
+              <w:t xml:space="preserve">K+ stars) and #3 on </w:t>
+            </w:r>
+            <w:proofErr w:type="spellStart"/>
+            <w:r>
+              <w:rPr>
+                <w:rFonts w:ascii="HelveticaNeueLT Pro 55 Roman" w:hAnsi="HelveticaNeueLT Pro 55 Roman" w:cs="Arial"/>
+                <w:sz w:val="22"/>
+                <w:szCs w:val="20"/>
+              </w:rPr>
+              <w:t>hermes-webui</w:t>
+            </w:r>
+            <w:proofErr w:type="spellEnd"/>
+            <w:r>
+              <w:rPr>
+                <w:rFonts w:ascii="HelveticaNeueLT Pro 55 Roman" w:hAnsi="HelveticaNeueLT Pro 55 Roman" w:cs="Arial"/>
+                <w:sz w:val="22"/>
+                <w:szCs w:val="20"/>
+              </w:rPr>
+              <w:t xml:space="preserve"> (14K+ stars).</w:t>
             </w:r>
           </w:p>
           <w:p>
@@ -620,6 +656,7 @@
                 <w:rFonts w:ascii="HelveticaNeueLT Pro 55 Roman" w:hAnsi="HelveticaNeueLT Pro 55 Roman" w:cs="Arial"/>
               </w:rPr>
             </w:pPr>
+            <w:proofErr w:type="spellStart"/>
             <w:r>
               <w:rPr>
                 <w:rFonts w:ascii="HelveticaNeueLT Pro 55 Roman" w:hAnsi="HelveticaNeueLT Pro 55 Roman" w:cs="Arial"/>
@@ -628,6 +665,7 @@
               </w:rPr>
               <w:t>Inkreel</w:t>
             </w:r>
+            <w:proofErr w:type="spellEnd"/>
             <w:r>
               <w:rPr>
                 <w:rFonts w:ascii="HelveticaNeueLT Pro 55 Roman" w:hAnsi="HelveticaNeueLT Pro 55 Roman" w:cs="Arial"/>
@@ -640,17 +678,29 @@
               </w:rPr>
               <w:t>(</w:t>
             </w:r>
-            <w:hyperlink r:id="rId10" w:history="1">
-              <w:r>
-                <w:rPr>
-                  <w:rStyle w:val="Hyperlink"/>
-                  <w:rFonts w:ascii="HelveticaNeueLT Pro 55 Roman" w:hAnsi="HelveticaNeueLT Pro 55 Roman" w:cs="Arial"/>
-                  <w:color w:val="auto"/>
-                  <w:u w:val="none"/>
-                </w:rPr>
-                <w:t>basedin.nyc</w:t>
-              </w:r>
-            </w:hyperlink>
+            <w:proofErr w:type="spellStart"/>
+            <w:r>
+              <w:fldChar w:fldCharType="begin"/>
+            </w:r>
+            <w:r>
+              <w:instrText>HYPERLINK "https://basedin.nyc/"</w:instrText>
+            </w:r>
+            <w:r>
+              <w:fldChar w:fldCharType="separate"/>
+            </w:r>
+            <w:r>
+              <w:rPr>
+                <w:rStyle w:val="Hyperlink"/>
+                <w:rFonts w:ascii="HelveticaNeueLT Pro 55 Roman" w:hAnsi="HelveticaNeueLT Pro 55 Roman" w:cs="Arial"/>
+                <w:color w:val="auto"/>
+                <w:u w:val="none"/>
+              </w:rPr>
+              <w:t>basedin.nyc</w:t>
+            </w:r>
+            <w:proofErr w:type="spellEnd"/>
+            <w:r>
+              <w:fldChar w:fldCharType="end"/>
+            </w:r>
             <w:r>
               <w:rPr>
                 <w:rFonts w:ascii="HelveticaNeueLT Pro 55 Roman" w:hAnsi="HelveticaNeueLT Pro 55 Roman" w:cs="Arial"/>
@@ -847,7 +897,23 @@
           <w:rFonts w:ascii="HelveticaNeueLT Pro 55 Roman" w:hAnsi="HelveticaNeueLT Pro 55 Roman"/>
           <w:sz w:val="22"/>
         </w:rPr>
-        <w:t>a multi-agent system that autonomously discovers issues, plans fixes, implements them in isolated git worktrees, runs cross-provider adversarial review, and ships PRs end-to-end.</w:t>
+        <w:t xml:space="preserve">a multi-agent system that autonomously discovers issues, plans fixes, implements them in isolated git </w:t>
+      </w:r>
+      <w:proofErr w:type="spellStart"/>
+      <w:r>
+        <w:rPr>
+          <w:rFonts w:ascii="HelveticaNeueLT Pro 55 Roman" w:hAnsi="HelveticaNeueLT Pro 55 Roman"/>
+          <w:sz w:val="22"/>
+        </w:rPr>
+        <w:t>worktrees</w:t>
+      </w:r>
+      <w:proofErr w:type="spellEnd"/>
+      <w:r>
+        <w:rPr>
+          <w:rFonts w:ascii="HelveticaNeueLT Pro 55 Roman" w:hAnsi="HelveticaNeueLT Pro 55 Roman"/>
+          <w:sz w:val="22"/>
+        </w:rPr>
+        <w:t>, runs cross-provider adversarial review, and ships PRs end-to-end.</w:t>
       </w:r>
     </w:p>
     <w:p>
@@ -1248,7 +1314,39 @@
           <w:rFonts w:ascii="HelveticaNeueLT Pro 55 Roman" w:hAnsi="HelveticaNeueLT Pro 55 Roman"/>
           <w:sz w:val="18"/>
         </w:rPr>
-        <w:t>React, Vite, Tailwind CSS, Node.js/Express, OpenAI API, Firebase, MS SQL Server (FreeTDS), TanStack Query.</w:t>
+        <w:t>React, Vite, Tailwind CSS, Node.js/Express, OpenAI API, Firebase, MS SQL Server (</w:t>
+      </w:r>
+      <w:proofErr w:type="spellStart"/>
+      <w:r>
+        <w:rPr>
+          <w:rFonts w:ascii="HelveticaNeueLT Pro 55 Roman" w:hAnsi="HelveticaNeueLT Pro 55 Roman"/>
+          <w:sz w:val="18"/>
+        </w:rPr>
+        <w:t>FreeTDS</w:t>
+      </w:r>
+      <w:proofErr w:type="spellEnd"/>
+      <w:r>
+        <w:rPr>
+          <w:rFonts w:ascii="HelveticaNeueLT Pro 55 Roman" w:hAnsi="HelveticaNeueLT Pro 55 Roman"/>
+          <w:sz w:val="18"/>
+        </w:rPr>
+        <w:t xml:space="preserve">), </w:t>
+      </w:r>
+      <w:proofErr w:type="spellStart"/>
+      <w:r>
+        <w:rPr>
+          <w:rFonts w:ascii="HelveticaNeueLT Pro 55 Roman" w:hAnsi="HelveticaNeueLT Pro 55 Roman"/>
+          <w:sz w:val="18"/>
+        </w:rPr>
+        <w:t>TanStack</w:t>
+      </w:r>
+      <w:proofErr w:type="spellEnd"/>
+      <w:r>
+        <w:rPr>
+          <w:rFonts w:ascii="HelveticaNeueLT Pro 55 Roman" w:hAnsi="HelveticaNeueLT Pro 55 Roman"/>
+          <w:sz w:val="18"/>
+        </w:rPr>
+        <w:t xml:space="preserve"> Query.</w:t>
       </w:r>
     </w:p>
     <w:p>
@@ -1459,7 +1557,25 @@
           <w:bCs/>
           <w:sz w:val="18"/>
         </w:rPr>
-        <w:t>Next.js (App Router), React, Tailwind CSS, Node.js Worker Threads, Leaflet/Mapbox, Turf.js, MS SQL Server.</w:t>
+        <w:t>Next.js (App Router), React, Tailwind CSS, Node.js Worker Threads, Leaflet/</w:t>
+      </w:r>
+      <w:proofErr w:type="spellStart"/>
+      <w:r>
+        <w:rPr>
+          <w:rFonts w:ascii="HelveticaNeueLT Pro 55 Roman" w:hAnsi="HelveticaNeueLT Pro 55 Roman"/>
+          <w:bCs/>
+          <w:sz w:val="18"/>
+        </w:rPr>
+        <w:t>Mapbox</w:t>
+      </w:r>
+      <w:proofErr w:type="spellEnd"/>
+      <w:r>
+        <w:rPr>
+          <w:rFonts w:ascii="HelveticaNeueLT Pro 55 Roman" w:hAnsi="HelveticaNeueLT Pro 55 Roman"/>
+          <w:bCs/>
+          <w:sz w:val="18"/>
+        </w:rPr>
+        <w:t>, Turf.js, MS SQL Server.</w:t>
       </w:r>
     </w:p>
     <w:p>
@@ -1494,6 +1610,7 @@
                 <w:i/>
               </w:rPr>
             </w:pPr>
+            <w:proofErr w:type="spellStart"/>
             <w:r>
               <w:rPr>
                 <w:rFonts w:ascii="HelveticaNeueLT Pro 55 Roman" w:hAnsi="HelveticaNeueLT Pro 55 Roman" w:cs="Arial"/>
@@ -1502,6 +1619,7 @@
               </w:rPr>
               <w:t>Mezocliq</w:t>
             </w:r>
+            <w:proofErr w:type="spellEnd"/>
           </w:p>
         </w:tc>
         <w:tc>
@@ -2068,6 +2186,38 @@
           <w:sz w:val="22"/>
           <w:szCs w:val="22"/>
         </w:rPr>
+        <w:t>0</w:t>
+      </w:r>
+      <w:r>
+        <w:rPr>
+          <w:rFonts w:ascii="HelveticaNeueLT Pro 55 Roman" w:hAnsi="HelveticaNeueLT Pro 55 Roman"/>
+          <w:sz w:val="22"/>
+          <w:szCs w:val="22"/>
+        </w:rPr>
+        <w:t>0</w:t>
+      </w:r>
+      <w:r>
+        <w:rPr>
+          <w:rFonts w:ascii="HelveticaNeueLT Pro 55 Roman" w:hAnsi="HelveticaNeueLT Pro 55 Roman"/>
+          <w:sz w:val="22"/>
+          <w:szCs w:val="22"/>
+        </w:rPr>
+        <w:t xml:space="preserve">+ PRs </w:t>
+      </w:r>
+      <w:r>
+        <w:rPr>
+          <w:rFonts w:ascii="HelveticaNeueLT Pro 55 Roman" w:hAnsi="HelveticaNeueLT Pro 55 Roman"/>
+          <w:sz w:val="22"/>
+          <w:szCs w:val="22"/>
+        </w:rPr>
+        <w:t>across 9 repositories, 1</w:t>
+      </w:r>
+      <w:r>
+        <w:rPr>
+          <w:rFonts w:ascii="HelveticaNeueLT Pro 55 Roman" w:hAnsi="HelveticaNeueLT Pro 55 Roman"/>
+          <w:sz w:val="22"/>
+          <w:szCs w:val="22"/>
+        </w:rPr>
         <w:t>5</w:t>
       </w:r>
       <w:r>
@@ -2076,7 +2226,7 @@
           <w:sz w:val="22"/>
           <w:szCs w:val="22"/>
         </w:rPr>
-        <w:t>0</w:t>
+        <w:t>0+ shipped at 9</w:t>
       </w:r>
       <w:r>
         <w:rPr>
@@ -2084,7 +2234,7 @@
           <w:sz w:val="22"/>
           <w:szCs w:val="22"/>
         </w:rPr>
-        <w:t xml:space="preserve">+ PRs </w:t>
+        <w:t>5</w:t>
       </w:r>
       <w:r>
         <w:rPr>
@@ -2092,7 +2242,7 @@
           <w:sz w:val="22"/>
           <w:szCs w:val="22"/>
         </w:rPr>
-        <w:t>across 9 repositories, 1</w:t>
+        <w:t>% acceptance</w:t>
       </w:r>
       <w:r>
         <w:rPr>
@@ -2100,7 +2250,7 @@
           <w:sz w:val="22"/>
           <w:szCs w:val="22"/>
         </w:rPr>
-        <w:t>5</w:t>
+        <w:t>:</w:t>
       </w:r>
       <w:r>
         <w:rPr>
@@ -2108,41 +2258,9 @@
           <w:sz w:val="22"/>
           <w:szCs w:val="22"/>
         </w:rPr>
-        <w:t>0+ shipped at 9</w:t>
-      </w:r>
-      <w:r>
-        <w:rPr>
-          <w:rFonts w:ascii="HelveticaNeueLT Pro 55 Roman" w:hAnsi="HelveticaNeueLT Pro 55 Roman"/>
-          <w:sz w:val="22"/>
-          <w:szCs w:val="22"/>
-        </w:rPr>
-        <w:t>5</w:t>
-      </w:r>
-      <w:r>
-        <w:rPr>
-          <w:rFonts w:ascii="HelveticaNeueLT Pro 55 Roman" w:hAnsi="HelveticaNeueLT Pro 55 Roman"/>
-          <w:sz w:val="22"/>
-          <w:szCs w:val="22"/>
-        </w:rPr>
-        <w:t>% acceptance</w:t>
-      </w:r>
-      <w:r>
-        <w:rPr>
-          <w:rFonts w:ascii="HelveticaNeueLT Pro 55 Roman" w:hAnsi="HelveticaNeueLT Pro 55 Roman"/>
-          <w:sz w:val="22"/>
-          <w:szCs w:val="22"/>
-        </w:rPr>
-        <w:t>:</w:t>
-      </w:r>
-      <w:r>
-        <w:rPr>
-          <w:rFonts w:ascii="HelveticaNeueLT Pro 55 Roman" w:hAnsi="HelveticaNeueLT Pro 55 Roman"/>
-          <w:sz w:val="22"/>
-          <w:szCs w:val="22"/>
-        </w:rPr>
         <w:t xml:space="preserve"> </w:t>
       </w:r>
-      <w:hyperlink r:id="rId11" w:history="1">
+      <w:hyperlink r:id="rId10" w:history="1">
         <w:r>
           <w:rPr>
             <w:rStyle w:val="Hyperlink"/>
@@ -2175,6 +2293,7 @@
           <w:szCs w:val="20"/>
         </w:rPr>
       </w:pPr>
+      <w:proofErr w:type="spellStart"/>
       <w:r>
         <w:rPr>
           <w:rFonts w:ascii="HelveticaNeueLT Pro 55 Roman" w:hAnsi="HelveticaNeueLT Pro 55 Roman"/>
@@ -2183,12 +2302,45 @@
         </w:rPr>
         <w:t>hermes-webui</w:t>
       </w:r>
+      <w:proofErr w:type="spellEnd"/>
       <w:r>
         <w:rPr>
           <w:rFonts w:ascii="HelveticaNeueLT Pro 55 Roman" w:hAnsi="HelveticaNeueLT Pro 55 Roman"/>
           <w:sz w:val="18"/>
         </w:rPr>
-        <w:t xml:space="preserve">  ·  github.com/nesquena/hermes-webui (14K+ stars)  ·  </w:t>
+        <w:t xml:space="preserve">  ·  github.com/</w:t>
+      </w:r>
+      <w:proofErr w:type="spellStart"/>
+      <w:r>
+        <w:rPr>
+          <w:rFonts w:ascii="HelveticaNeueLT Pro 55 Roman" w:hAnsi="HelveticaNeueLT Pro 55 Roman"/>
+          <w:sz w:val="18"/>
+        </w:rPr>
+        <w:t>nesquena</w:t>
+      </w:r>
+      <w:proofErr w:type="spellEnd"/>
+      <w:r>
+        <w:rPr>
+          <w:rFonts w:ascii="HelveticaNeueLT Pro 55 Roman" w:hAnsi="HelveticaNeueLT Pro 55 Roman"/>
+          <w:sz w:val="18"/>
+        </w:rPr>
+        <w:t>/</w:t>
+      </w:r>
+      <w:proofErr w:type="spellStart"/>
+      <w:r>
+        <w:rPr>
+          <w:rFonts w:ascii="HelveticaNeueLT Pro 55 Roman" w:hAnsi="HelveticaNeueLT Pro 55 Roman"/>
+          <w:sz w:val="18"/>
+        </w:rPr>
+        <w:t>hermes-webui</w:t>
+      </w:r>
+      <w:proofErr w:type="spellEnd"/>
+      <w:r>
+        <w:rPr>
+          <w:rFonts w:ascii="HelveticaNeueLT Pro 55 Roman" w:hAnsi="HelveticaNeueLT Pro 55 Roman"/>
+          <w:sz w:val="18"/>
+        </w:rPr>
+        <w:t xml:space="preserve"> (14K+ stars)  ·  </w:t>
       </w:r>
       <w:r>
         <w:rPr>
@@ -2219,20 +2371,62 @@
           <w:szCs w:val="22"/>
         </w:rPr>
       </w:pPr>
+      <w:proofErr w:type="spellStart"/>
       <w:r>
         <w:rPr>
           <w:rFonts w:ascii="HelveticaNeueLT Pro 55 Roman" w:hAnsi="HelveticaNeueLT Pro 55 Roman"/>
           <w:b/>
           <w:sz w:val="22"/>
         </w:rPr>
-        <w:t>claude-mem</w:t>
+        <w:t>claude</w:t>
+      </w:r>
+      <w:proofErr w:type="spellEnd"/>
+      <w:r>
+        <w:rPr>
+          <w:rFonts w:ascii="HelveticaNeueLT Pro 55 Roman" w:hAnsi="HelveticaNeueLT Pro 55 Roman"/>
+          <w:b/>
+          <w:sz w:val="22"/>
+        </w:rPr>
+        <w:t>-mem</w:t>
       </w:r>
       <w:r>
         <w:rPr>
           <w:rFonts w:ascii="HelveticaNeueLT Pro 55 Roman" w:hAnsi="HelveticaNeueLT Pro 55 Roman"/>
           <w:sz w:val="18"/>
         </w:rPr>
-        <w:t xml:space="preserve">  ·  github.com/thedotmack/claude-mem (</w:t>
+        <w:t xml:space="preserve">  ·  github.com/</w:t>
+      </w:r>
+      <w:proofErr w:type="spellStart"/>
+      <w:r>
+        <w:rPr>
+          <w:rFonts w:ascii="HelveticaNeueLT Pro 55 Roman" w:hAnsi="HelveticaNeueLT Pro 55 Roman"/>
+          <w:sz w:val="18"/>
+        </w:rPr>
+        <w:t>thedotmack</w:t>
+      </w:r>
+      <w:proofErr w:type="spellEnd"/>
+      <w:r>
+        <w:rPr>
+          <w:rFonts w:ascii="HelveticaNeueLT Pro 55 Roman" w:hAnsi="HelveticaNeueLT Pro 55 Roman"/>
+          <w:sz w:val="18"/>
+        </w:rPr>
+        <w:t>/</w:t>
+      </w:r>
+      <w:proofErr w:type="spellStart"/>
+      <w:r>
+        <w:rPr>
+          <w:rFonts w:ascii="HelveticaNeueLT Pro 55 Roman" w:hAnsi="HelveticaNeueLT Pro 55 Roman"/>
+          <w:sz w:val="18"/>
+        </w:rPr>
+        <w:t>claude</w:t>
+      </w:r>
+      <w:proofErr w:type="spellEnd"/>
+      <w:r>
+        <w:rPr>
+          <w:rFonts w:ascii="HelveticaNeueLT Pro 55 Roman" w:hAnsi="HelveticaNeueLT Pro 55 Roman"/>
+          <w:sz w:val="18"/>
+        </w:rPr>
+        <w:t>-mem (</w:t>
       </w:r>
       <w:r>
         <w:rPr>
@@ -2537,8 +2731,39 @@
                 <w:sz w:val="20"/>
                 <w:szCs w:val="20"/>
               </w:rPr>
-              <w:t>, Anthropic API, MCP, REST APIs, GraphQL, WPGraphQL</w:t>
-            </w:r>
+              <w:t xml:space="preserve">, Anthropic API, MCP, REST APIs, </w:t>
+            </w:r>
+            <w:proofErr w:type="spellStart"/>
+            <w:r>
+              <w:rPr>
+                <w:rFonts w:ascii="HelveticaNeueLT Pro 55 Roman" w:hAnsi="HelveticaNeueLT Pro 55 Roman"/>
+                <w:bCs/>
+                <w:sz w:val="20"/>
+                <w:szCs w:val="20"/>
+              </w:rPr>
+              <w:t>GraphQL</w:t>
+            </w:r>
+            <w:proofErr w:type="spellEnd"/>
+            <w:r>
+              <w:rPr>
+                <w:rFonts w:ascii="HelveticaNeueLT Pro 55 Roman" w:hAnsi="HelveticaNeueLT Pro 55 Roman"/>
+                <w:bCs/>
+                <w:sz w:val="20"/>
+                <w:szCs w:val="20"/>
+              </w:rPr>
+              <w:t xml:space="preserve">, </w:t>
+            </w:r>
+            <w:proofErr w:type="spellStart"/>
+            <w:r>
+              <w:rPr>
+                <w:rFonts w:ascii="HelveticaNeueLT Pro 55 Roman" w:hAnsi="HelveticaNeueLT Pro 55 Roman"/>
+                <w:bCs/>
+                <w:sz w:val="20"/>
+                <w:szCs w:val="20"/>
+              </w:rPr>
+              <w:t>WPGraphQL</w:t>
+            </w:r>
+            <w:proofErr w:type="spellEnd"/>
           </w:p>
           <w:p>
             <w:pPr>
@@ -2612,7 +2837,47 @@
                 <w:sz w:val="20"/>
                 <w:szCs w:val="20"/>
               </w:rPr>
-              <w:t>Firebase, SQL Server, MongoDB, Leaflet/Mapbox, Turf.js, Vite, Vercel, Netlify, Cloudflare</w:t>
+              <w:t>Firebase, SQL Server, MongoDB, Leaflet/</w:t>
+            </w:r>
+            <w:proofErr w:type="spellStart"/>
+            <w:r>
+              <w:rPr>
+                <w:rFonts w:ascii="HelveticaNeueLT Pro 55 Roman" w:hAnsi="HelveticaNeueLT Pro 55 Roman"/>
+                <w:bCs/>
+                <w:sz w:val="20"/>
+                <w:szCs w:val="20"/>
+              </w:rPr>
+              <w:t>Mapbox</w:t>
+            </w:r>
+            <w:proofErr w:type="spellEnd"/>
+            <w:r>
+              <w:rPr>
+                <w:rFonts w:ascii="HelveticaNeueLT Pro 55 Roman" w:hAnsi="HelveticaNeueLT Pro 55 Roman"/>
+                <w:bCs/>
+                <w:sz w:val="20"/>
+                <w:szCs w:val="20"/>
+              </w:rPr>
+              <w:t xml:space="preserve">, Turf.js, Vite, </w:t>
+            </w:r>
+            <w:proofErr w:type="spellStart"/>
+            <w:r>
+              <w:rPr>
+                <w:rFonts w:ascii="HelveticaNeueLT Pro 55 Roman" w:hAnsi="HelveticaNeueLT Pro 55 Roman"/>
+                <w:bCs/>
+                <w:sz w:val="20"/>
+                <w:szCs w:val="20"/>
+              </w:rPr>
+              <w:t>Vercel</w:t>
+            </w:r>
+            <w:proofErr w:type="spellEnd"/>
+            <w:r>
+              <w:rPr>
+                <w:rFonts w:ascii="HelveticaNeueLT Pro 55 Roman" w:hAnsi="HelveticaNeueLT Pro 55 Roman"/>
+                <w:bCs/>
+                <w:sz w:val="20"/>
+                <w:szCs w:val="20"/>
+              </w:rPr>
+              <w:t>, Netlify, Cloudflare</w:t>
             </w:r>
           </w:p>
           <w:p>

</xml_diff>

<commit_message>
Replicate upstream counting as close as practicable to get relative parity in rankings
</commit_message>
<xml_diff>
--- a/resume.docx
+++ b/resume.docx
@@ -465,7 +465,7 @@
                 <w:sz w:val="22"/>
                 <w:szCs w:val="20"/>
               </w:rPr>
-              <w:t xml:space="preserve"> PRs shipped across 9 open-source repositories at 9</w:t>
+              <w:t xml:space="preserve"> PRs shipped across </w:t>
             </w:r>
             <w:r>
               <w:rPr>
@@ -481,25 +481,23 @@
                 <w:sz w:val="22"/>
                 <w:szCs w:val="20"/>
               </w:rPr>
-              <w:t xml:space="preserve">% acceptance. Top-5 contributor to </w:t>
-            </w:r>
-            <w:proofErr w:type="spellStart"/>
+              <w:t xml:space="preserve"> open-source repositories at 9</w:t>
+            </w:r>
             <w:r>
               <w:rPr>
                 <w:rFonts w:ascii="HelveticaNeueLT Pro 55 Roman" w:hAnsi="HelveticaNeueLT Pro 55 Roman" w:cs="Arial"/>
                 <w:sz w:val="22"/>
                 <w:szCs w:val="20"/>
               </w:rPr>
-              <w:t>claude</w:t>
-            </w:r>
-            <w:proofErr w:type="spellEnd"/>
+              <w:t>5</w:t>
+            </w:r>
             <w:r>
               <w:rPr>
                 <w:rFonts w:ascii="HelveticaNeueLT Pro 55 Roman" w:hAnsi="HelveticaNeueLT Pro 55 Roman" w:cs="Arial"/>
                 <w:sz w:val="22"/>
                 <w:szCs w:val="20"/>
               </w:rPr>
-              <w:t>-mem (</w:t>
+              <w:t>%</w:t>
             </w:r>
             <w:r>
               <w:rPr>
@@ -507,7 +505,7 @@
                 <w:sz w:val="22"/>
                 <w:szCs w:val="20"/>
               </w:rPr>
-              <w:t>80</w:t>
+              <w:t>+</w:t>
             </w:r>
             <w:r>
               <w:rPr>
@@ -515,25 +513,39 @@
                 <w:sz w:val="22"/>
                 <w:szCs w:val="20"/>
               </w:rPr>
-              <w:t xml:space="preserve">K+ stars) and #3 on </w:t>
-            </w:r>
-            <w:proofErr w:type="spellStart"/>
+              <w:t xml:space="preserve"> acceptance. Top-5 contributor to claude-mem (</w:t>
+            </w:r>
             <w:r>
               <w:rPr>
                 <w:rFonts w:ascii="HelveticaNeueLT Pro 55 Roman" w:hAnsi="HelveticaNeueLT Pro 55 Roman" w:cs="Arial"/>
                 <w:sz w:val="22"/>
                 <w:szCs w:val="20"/>
               </w:rPr>
-              <w:t>hermes-webui</w:t>
-            </w:r>
-            <w:proofErr w:type="spellEnd"/>
+              <w:t>80</w:t>
+            </w:r>
             <w:r>
               <w:rPr>
                 <w:rFonts w:ascii="HelveticaNeueLT Pro 55 Roman" w:hAnsi="HelveticaNeueLT Pro 55 Roman" w:cs="Arial"/>
                 <w:sz w:val="22"/>
                 <w:szCs w:val="20"/>
               </w:rPr>
-              <w:t xml:space="preserve"> (14K+ stars).</w:t>
+              <w:t>K+ stars) and #</w:t>
+            </w:r>
+            <w:r>
+              <w:rPr>
+                <w:rFonts w:ascii="HelveticaNeueLT Pro 55 Roman" w:hAnsi="HelveticaNeueLT Pro 55 Roman" w:cs="Arial"/>
+                <w:sz w:val="22"/>
+                <w:szCs w:val="20"/>
+              </w:rPr>
+              <w:t>2</w:t>
+            </w:r>
+            <w:r>
+              <w:rPr>
+                <w:rFonts w:ascii="HelveticaNeueLT Pro 55 Roman" w:hAnsi="HelveticaNeueLT Pro 55 Roman" w:cs="Arial"/>
+                <w:sz w:val="22"/>
+                <w:szCs w:val="20"/>
+              </w:rPr>
+              <w:t xml:space="preserve"> on hermes-webui (14K+ stars).</w:t>
             </w:r>
           </w:p>
           <w:p>
@@ -656,7 +668,6 @@
                 <w:rFonts w:ascii="HelveticaNeueLT Pro 55 Roman" w:hAnsi="HelveticaNeueLT Pro 55 Roman" w:cs="Arial"/>
               </w:rPr>
             </w:pPr>
-            <w:proofErr w:type="spellStart"/>
             <w:r>
               <w:rPr>
                 <w:rFonts w:ascii="HelveticaNeueLT Pro 55 Roman" w:hAnsi="HelveticaNeueLT Pro 55 Roman" w:cs="Arial"/>
@@ -665,7 +676,6 @@
               </w:rPr>
               <w:t>Inkreel</w:t>
             </w:r>
-            <w:proofErr w:type="spellEnd"/>
             <w:r>
               <w:rPr>
                 <w:rFonts w:ascii="HelveticaNeueLT Pro 55 Roman" w:hAnsi="HelveticaNeueLT Pro 55 Roman" w:cs="Arial"/>
@@ -678,29 +688,17 @@
               </w:rPr>
               <w:t>(</w:t>
             </w:r>
-            <w:proofErr w:type="spellStart"/>
-            <w:r>
-              <w:fldChar w:fldCharType="begin"/>
-            </w:r>
-            <w:r>
-              <w:instrText>HYPERLINK "https://basedin.nyc/"</w:instrText>
-            </w:r>
-            <w:r>
-              <w:fldChar w:fldCharType="separate"/>
-            </w:r>
-            <w:r>
-              <w:rPr>
-                <w:rStyle w:val="Hyperlink"/>
-                <w:rFonts w:ascii="HelveticaNeueLT Pro 55 Roman" w:hAnsi="HelveticaNeueLT Pro 55 Roman" w:cs="Arial"/>
-                <w:color w:val="auto"/>
-                <w:u w:val="none"/>
-              </w:rPr>
-              <w:t>basedin.nyc</w:t>
-            </w:r>
-            <w:proofErr w:type="spellEnd"/>
-            <w:r>
-              <w:fldChar w:fldCharType="end"/>
-            </w:r>
+            <w:hyperlink r:id="rId10" w:history="1">
+              <w:r>
+                <w:rPr>
+                  <w:rStyle w:val="Hyperlink"/>
+                  <w:rFonts w:ascii="HelveticaNeueLT Pro 55 Roman" w:hAnsi="HelveticaNeueLT Pro 55 Roman" w:cs="Arial"/>
+                  <w:color w:val="auto"/>
+                  <w:u w:val="none"/>
+                </w:rPr>
+                <w:t>basedin.nyc</w:t>
+              </w:r>
+            </w:hyperlink>
             <w:r>
               <w:rPr>
                 <w:rFonts w:ascii="HelveticaNeueLT Pro 55 Roman" w:hAnsi="HelveticaNeueLT Pro 55 Roman" w:cs="Arial"/>
@@ -897,23 +895,7 @@
           <w:rFonts w:ascii="HelveticaNeueLT Pro 55 Roman" w:hAnsi="HelveticaNeueLT Pro 55 Roman"/>
           <w:sz w:val="22"/>
         </w:rPr>
-        <w:t xml:space="preserve">a multi-agent system that autonomously discovers issues, plans fixes, implements them in isolated git </w:t>
-      </w:r>
-      <w:proofErr w:type="spellStart"/>
-      <w:r>
-        <w:rPr>
-          <w:rFonts w:ascii="HelveticaNeueLT Pro 55 Roman" w:hAnsi="HelveticaNeueLT Pro 55 Roman"/>
-          <w:sz w:val="22"/>
-        </w:rPr>
-        <w:t>worktrees</w:t>
-      </w:r>
-      <w:proofErr w:type="spellEnd"/>
-      <w:r>
-        <w:rPr>
-          <w:rFonts w:ascii="HelveticaNeueLT Pro 55 Roman" w:hAnsi="HelveticaNeueLT Pro 55 Roman"/>
-          <w:sz w:val="22"/>
-        </w:rPr>
-        <w:t>, runs cross-provider adversarial review, and ships PRs end-to-end.</w:t>
+        <w:t>a multi-agent system that autonomously discovers issues, plans fixes, implements them in isolated git worktrees, runs cross-provider adversarial review, and ships PRs end-to-end.</w:t>
       </w:r>
     </w:p>
     <w:p>
@@ -1314,39 +1296,7 @@
           <w:rFonts w:ascii="HelveticaNeueLT Pro 55 Roman" w:hAnsi="HelveticaNeueLT Pro 55 Roman"/>
           <w:sz w:val="18"/>
         </w:rPr>
-        <w:t>React, Vite, Tailwind CSS, Node.js/Express, OpenAI API, Firebase, MS SQL Server (</w:t>
-      </w:r>
-      <w:proofErr w:type="spellStart"/>
-      <w:r>
-        <w:rPr>
-          <w:rFonts w:ascii="HelveticaNeueLT Pro 55 Roman" w:hAnsi="HelveticaNeueLT Pro 55 Roman"/>
-          <w:sz w:val="18"/>
-        </w:rPr>
-        <w:t>FreeTDS</w:t>
-      </w:r>
-      <w:proofErr w:type="spellEnd"/>
-      <w:r>
-        <w:rPr>
-          <w:rFonts w:ascii="HelveticaNeueLT Pro 55 Roman" w:hAnsi="HelveticaNeueLT Pro 55 Roman"/>
-          <w:sz w:val="18"/>
-        </w:rPr>
-        <w:t xml:space="preserve">), </w:t>
-      </w:r>
-      <w:proofErr w:type="spellStart"/>
-      <w:r>
-        <w:rPr>
-          <w:rFonts w:ascii="HelveticaNeueLT Pro 55 Roman" w:hAnsi="HelveticaNeueLT Pro 55 Roman"/>
-          <w:sz w:val="18"/>
-        </w:rPr>
-        <w:t>TanStack</w:t>
-      </w:r>
-      <w:proofErr w:type="spellEnd"/>
-      <w:r>
-        <w:rPr>
-          <w:rFonts w:ascii="HelveticaNeueLT Pro 55 Roman" w:hAnsi="HelveticaNeueLT Pro 55 Roman"/>
-          <w:sz w:val="18"/>
-        </w:rPr>
-        <w:t xml:space="preserve"> Query.</w:t>
+        <w:t>React, Vite, Tailwind CSS, Node.js/Express, OpenAI API, Firebase, MS SQL Server (FreeTDS), TanStack Query.</w:t>
       </w:r>
     </w:p>
     <w:p>
@@ -1557,25 +1507,7 @@
           <w:bCs/>
           <w:sz w:val="18"/>
         </w:rPr>
-        <w:t>Next.js (App Router), React, Tailwind CSS, Node.js Worker Threads, Leaflet/</w:t>
-      </w:r>
-      <w:proofErr w:type="spellStart"/>
-      <w:r>
-        <w:rPr>
-          <w:rFonts w:ascii="HelveticaNeueLT Pro 55 Roman" w:hAnsi="HelveticaNeueLT Pro 55 Roman"/>
-          <w:bCs/>
-          <w:sz w:val="18"/>
-        </w:rPr>
-        <w:t>Mapbox</w:t>
-      </w:r>
-      <w:proofErr w:type="spellEnd"/>
-      <w:r>
-        <w:rPr>
-          <w:rFonts w:ascii="HelveticaNeueLT Pro 55 Roman" w:hAnsi="HelveticaNeueLT Pro 55 Roman"/>
-          <w:bCs/>
-          <w:sz w:val="18"/>
-        </w:rPr>
-        <w:t>, Turf.js, MS SQL Server.</w:t>
+        <w:t>Next.js (App Router), React, Tailwind CSS, Node.js Worker Threads, Leaflet/Mapbox, Turf.js, MS SQL Server.</w:t>
       </w:r>
     </w:p>
     <w:p>
@@ -1610,7 +1542,6 @@
                 <w:i/>
               </w:rPr>
             </w:pPr>
-            <w:proofErr w:type="spellStart"/>
             <w:r>
               <w:rPr>
                 <w:rFonts w:ascii="HelveticaNeueLT Pro 55 Roman" w:hAnsi="HelveticaNeueLT Pro 55 Roman" w:cs="Arial"/>
@@ -1619,7 +1550,6 @@
               </w:rPr>
               <w:t>Mezocliq</w:t>
             </w:r>
-            <w:proofErr w:type="spellEnd"/>
           </w:p>
         </w:tc>
         <w:tc>
@@ -2178,7 +2108,7 @@
           <w:sz w:val="22"/>
           <w:szCs w:val="22"/>
         </w:rPr>
-        <w:t>2</w:t>
+        <w:t>15</w:t>
       </w:r>
       <w:r>
         <w:rPr>
@@ -2194,7 +2124,7 @@
           <w:sz w:val="22"/>
           <w:szCs w:val="22"/>
         </w:rPr>
-        <w:t>0</w:t>
+        <w:t xml:space="preserve">+ PRs </w:t>
       </w:r>
       <w:r>
         <w:rPr>
@@ -2202,7 +2132,7 @@
           <w:sz w:val="22"/>
           <w:szCs w:val="22"/>
         </w:rPr>
-        <w:t xml:space="preserve">+ PRs </w:t>
+        <w:t xml:space="preserve">shipped </w:t>
       </w:r>
       <w:r>
         <w:rPr>
@@ -2210,7 +2140,7 @@
           <w:sz w:val="22"/>
           <w:szCs w:val="22"/>
         </w:rPr>
-        <w:t>across 9 repositories, 1</w:t>
+        <w:t xml:space="preserve">across </w:t>
       </w:r>
       <w:r>
         <w:rPr>
@@ -2226,7 +2156,7 @@
           <w:sz w:val="22"/>
           <w:szCs w:val="22"/>
         </w:rPr>
-        <w:t>0+ shipped at 9</w:t>
+        <w:t xml:space="preserve"> repositories at 9</w:t>
       </w:r>
       <w:r>
         <w:rPr>
@@ -2242,7 +2172,7 @@
           <w:sz w:val="22"/>
           <w:szCs w:val="22"/>
         </w:rPr>
-        <w:t>% acceptance</w:t>
+        <w:t>%</w:t>
       </w:r>
       <w:r>
         <w:rPr>
@@ -2250,6 +2180,22 @@
           <w:sz w:val="22"/>
           <w:szCs w:val="22"/>
         </w:rPr>
+        <w:t>+</w:t>
+      </w:r>
+      <w:r>
+        <w:rPr>
+          <w:rFonts w:ascii="HelveticaNeueLT Pro 55 Roman" w:hAnsi="HelveticaNeueLT Pro 55 Roman"/>
+          <w:sz w:val="22"/>
+          <w:szCs w:val="22"/>
+        </w:rPr>
+        <w:t xml:space="preserve"> acceptance</w:t>
+      </w:r>
+      <w:r>
+        <w:rPr>
+          <w:rFonts w:ascii="HelveticaNeueLT Pro 55 Roman" w:hAnsi="HelveticaNeueLT Pro 55 Roman"/>
+          <w:sz w:val="22"/>
+          <w:szCs w:val="22"/>
+        </w:rPr>
         <w:t>:</w:t>
       </w:r>
       <w:r>
@@ -2260,7 +2206,7 @@
         </w:rPr>
         <w:t xml:space="preserve"> </w:t>
       </w:r>
-      <w:hyperlink r:id="rId10" w:history="1">
+      <w:hyperlink r:id="rId11" w:history="1">
         <w:r>
           <w:rPr>
             <w:rStyle w:val="Hyperlink"/>
@@ -2293,7 +2239,6 @@
           <w:szCs w:val="20"/>
         </w:rPr>
       </w:pPr>
-      <w:proofErr w:type="spellStart"/>
       <w:r>
         <w:rPr>
           <w:rFonts w:ascii="HelveticaNeueLT Pro 55 Roman" w:hAnsi="HelveticaNeueLT Pro 55 Roman"/>
@@ -2302,45 +2247,12 @@
         </w:rPr>
         <w:t>hermes-webui</w:t>
       </w:r>
-      <w:proofErr w:type="spellEnd"/>
       <w:r>
         <w:rPr>
           <w:rFonts w:ascii="HelveticaNeueLT Pro 55 Roman" w:hAnsi="HelveticaNeueLT Pro 55 Roman"/>
           <w:sz w:val="18"/>
         </w:rPr>
-        <w:t xml:space="preserve">  ·  github.com/</w:t>
-      </w:r>
-      <w:proofErr w:type="spellStart"/>
-      <w:r>
-        <w:rPr>
-          <w:rFonts w:ascii="HelveticaNeueLT Pro 55 Roman" w:hAnsi="HelveticaNeueLT Pro 55 Roman"/>
-          <w:sz w:val="18"/>
-        </w:rPr>
-        <w:t>nesquena</w:t>
-      </w:r>
-      <w:proofErr w:type="spellEnd"/>
-      <w:r>
-        <w:rPr>
-          <w:rFonts w:ascii="HelveticaNeueLT Pro 55 Roman" w:hAnsi="HelveticaNeueLT Pro 55 Roman"/>
-          <w:sz w:val="18"/>
-        </w:rPr>
-        <w:t>/</w:t>
-      </w:r>
-      <w:proofErr w:type="spellStart"/>
-      <w:r>
-        <w:rPr>
-          <w:rFonts w:ascii="HelveticaNeueLT Pro 55 Roman" w:hAnsi="HelveticaNeueLT Pro 55 Roman"/>
-          <w:sz w:val="18"/>
-        </w:rPr>
-        <w:t>hermes-webui</w:t>
-      </w:r>
-      <w:proofErr w:type="spellEnd"/>
-      <w:r>
-        <w:rPr>
-          <w:rFonts w:ascii="HelveticaNeueLT Pro 55 Roman" w:hAnsi="HelveticaNeueLT Pro 55 Roman"/>
-          <w:sz w:val="18"/>
-        </w:rPr>
-        <w:t xml:space="preserve"> (14K+ stars)  ·  </w:t>
+        <w:t xml:space="preserve">  ·  github.com/nesquena/hermes-webui (14K+ stars)  ·  </w:t>
       </w:r>
       <w:r>
         <w:rPr>
@@ -2348,7 +2260,23 @@
           <w:sz w:val="22"/>
           <w:szCs w:val="22"/>
         </w:rPr>
-        <w:t>Web UI for Hermes Agent. #3 contributor. Agent UX, streaming behavior, provider infrastructure, session recovery, cross-platform support.</w:t>
+        <w:t>Web UI for Hermes Agent. #</w:t>
+      </w:r>
+      <w:r>
+        <w:rPr>
+          <w:rFonts w:ascii="HelveticaNeueLT Pro 55 Roman" w:hAnsi="HelveticaNeueLT Pro 55 Roman"/>
+          <w:sz w:val="22"/>
+          <w:szCs w:val="22"/>
+        </w:rPr>
+        <w:t>2</w:t>
+      </w:r>
+      <w:r>
+        <w:rPr>
+          <w:rFonts w:ascii="HelveticaNeueLT Pro 55 Roman" w:hAnsi="HelveticaNeueLT Pro 55 Roman"/>
+          <w:sz w:val="22"/>
+          <w:szCs w:val="22"/>
+        </w:rPr>
+        <w:t xml:space="preserve"> contributor. Agent UX, streaming behavior, provider infrastructure, session recovery, cross-platform support.</w:t>
       </w:r>
     </w:p>
     <w:p>
@@ -2371,62 +2299,20 @@
           <w:szCs w:val="22"/>
         </w:rPr>
       </w:pPr>
-      <w:proofErr w:type="spellStart"/>
       <w:r>
         <w:rPr>
           <w:rFonts w:ascii="HelveticaNeueLT Pro 55 Roman" w:hAnsi="HelveticaNeueLT Pro 55 Roman"/>
           <w:b/>
           <w:sz w:val="22"/>
         </w:rPr>
-        <w:t>claude</w:t>
-      </w:r>
-      <w:proofErr w:type="spellEnd"/>
-      <w:r>
-        <w:rPr>
-          <w:rFonts w:ascii="HelveticaNeueLT Pro 55 Roman" w:hAnsi="HelveticaNeueLT Pro 55 Roman"/>
-          <w:b/>
-          <w:sz w:val="22"/>
-        </w:rPr>
-        <w:t>-mem</w:t>
+        <w:t>claude-mem</w:t>
       </w:r>
       <w:r>
         <w:rPr>
           <w:rFonts w:ascii="HelveticaNeueLT Pro 55 Roman" w:hAnsi="HelveticaNeueLT Pro 55 Roman"/>
           <w:sz w:val="18"/>
         </w:rPr>
-        <w:t xml:space="preserve">  ·  github.com/</w:t>
-      </w:r>
-      <w:proofErr w:type="spellStart"/>
-      <w:r>
-        <w:rPr>
-          <w:rFonts w:ascii="HelveticaNeueLT Pro 55 Roman" w:hAnsi="HelveticaNeueLT Pro 55 Roman"/>
-          <w:sz w:val="18"/>
-        </w:rPr>
-        <w:t>thedotmack</w:t>
-      </w:r>
-      <w:proofErr w:type="spellEnd"/>
-      <w:r>
-        <w:rPr>
-          <w:rFonts w:ascii="HelveticaNeueLT Pro 55 Roman" w:hAnsi="HelveticaNeueLT Pro 55 Roman"/>
-          <w:sz w:val="18"/>
-        </w:rPr>
-        <w:t>/</w:t>
-      </w:r>
-      <w:proofErr w:type="spellStart"/>
-      <w:r>
-        <w:rPr>
-          <w:rFonts w:ascii="HelveticaNeueLT Pro 55 Roman" w:hAnsi="HelveticaNeueLT Pro 55 Roman"/>
-          <w:sz w:val="18"/>
-        </w:rPr>
-        <w:t>claude</w:t>
-      </w:r>
-      <w:proofErr w:type="spellEnd"/>
-      <w:r>
-        <w:rPr>
-          <w:rFonts w:ascii="HelveticaNeueLT Pro 55 Roman" w:hAnsi="HelveticaNeueLT Pro 55 Roman"/>
-          <w:sz w:val="18"/>
-        </w:rPr>
-        <w:t>-mem (</w:t>
+        <w:t xml:space="preserve">  ·  github.com/thedotmack/claude-mem (</w:t>
       </w:r>
       <w:r>
         <w:rPr>
@@ -2731,19 +2617,37 @@
                 <w:sz w:val="20"/>
                 <w:szCs w:val="20"/>
               </w:rPr>
-              <w:t xml:space="preserve">, Anthropic API, MCP, REST APIs, </w:t>
-            </w:r>
-            <w:proofErr w:type="spellStart"/>
-            <w:r>
+              <w:t>, Anthropic API, MCP, REST APIs, GraphQL, WPGraphQL</w:t>
+            </w:r>
+          </w:p>
+          <w:p>
+            <w:pPr>
+              <w:spacing w:after="40" w:line="288" w:lineRule="auto"/>
               <w:rPr>
                 <w:rFonts w:ascii="HelveticaNeueLT Pro 55 Roman" w:hAnsi="HelveticaNeueLT Pro 55 Roman"/>
                 <w:bCs/>
                 <w:sz w:val="20"/>
                 <w:szCs w:val="20"/>
               </w:rPr>
-              <w:t>GraphQL</w:t>
-            </w:r>
-            <w:proofErr w:type="spellEnd"/>
+            </w:pPr>
+            <w:r>
+              <w:rPr>
+                <w:rFonts w:ascii="HelveticaNeueLT Pro 55 Roman" w:hAnsi="HelveticaNeueLT Pro 55 Roman"/>
+                <w:b/>
+                <w:sz w:val="20"/>
+                <w:szCs w:val="20"/>
+              </w:rPr>
+              <w:t>E-commerce &amp; CMS:</w:t>
+            </w:r>
+            <w:r>
+              <w:rPr>
+                <w:rFonts w:ascii="HelveticaNeueLT Pro 55 Roman" w:hAnsi="HelveticaNeueLT Pro 55 Roman"/>
+                <w:b/>
+                <w:sz w:val="20"/>
+                <w:szCs w:val="20"/>
+              </w:rPr>
+              <w:t xml:space="preserve"> </w:t>
+            </w:r>
             <w:r>
               <w:rPr>
                 <w:rFonts w:ascii="HelveticaNeueLT Pro 55 Roman" w:hAnsi="HelveticaNeueLT Pro 55 Roman"/>
@@ -2751,9 +2655,36 @@
                 <w:sz w:val="20"/>
                 <w:szCs w:val="20"/>
               </w:rPr>
-              <w:t xml:space="preserve">, </w:t>
-            </w:r>
-            <w:proofErr w:type="spellStart"/>
+              <w:t>Shopify Hydrogen/Liquid, WordPress (Core contributor), WordPress.com VIP, Faust.js</w:t>
+            </w:r>
+          </w:p>
+          <w:p>
+            <w:pPr>
+              <w:spacing w:after="40" w:line="288" w:lineRule="auto"/>
+              <w:rPr>
+                <w:bCs/>
+                <w:sz w:val="20"/>
+                <w:szCs w:val="20"/>
+              </w:rPr>
+            </w:pPr>
+            <w:r>
+              <w:rPr>
+                <w:rFonts w:ascii="HelveticaNeueLT Pro 55 Roman" w:hAnsi="HelveticaNeueLT Pro 55 Roman"/>
+                <w:b/>
+                <w:sz w:val="20"/>
+                <w:szCs w:val="20"/>
+              </w:rPr>
+              <w:t>Data &amp; Infrastructure:</w:t>
+            </w:r>
+            <w:r>
+              <w:rPr>
+                <w:rFonts w:ascii="HelveticaNeueLT Pro 55 Roman" w:hAnsi="HelveticaNeueLT Pro 55 Roman"/>
+                <w:b/>
+                <w:sz w:val="20"/>
+                <w:szCs w:val="20"/>
+              </w:rPr>
+              <w:t xml:space="preserve"> </w:t>
+            </w:r>
             <w:r>
               <w:rPr>
                 <w:rFonts w:ascii="HelveticaNeueLT Pro 55 Roman" w:hAnsi="HelveticaNeueLT Pro 55 Roman"/>
@@ -2761,123 +2692,7 @@
                 <w:sz w:val="20"/>
                 <w:szCs w:val="20"/>
               </w:rPr>
-              <w:t>WPGraphQL</w:t>
-            </w:r>
-            <w:proofErr w:type="spellEnd"/>
-          </w:p>
-          <w:p>
-            <w:pPr>
-              <w:spacing w:after="40" w:line="288" w:lineRule="auto"/>
-              <w:rPr>
-                <w:rFonts w:ascii="HelveticaNeueLT Pro 55 Roman" w:hAnsi="HelveticaNeueLT Pro 55 Roman"/>
-                <w:bCs/>
-                <w:sz w:val="20"/>
-                <w:szCs w:val="20"/>
-              </w:rPr>
-            </w:pPr>
-            <w:r>
-              <w:rPr>
-                <w:rFonts w:ascii="HelveticaNeueLT Pro 55 Roman" w:hAnsi="HelveticaNeueLT Pro 55 Roman"/>
-                <w:b/>
-                <w:sz w:val="20"/>
-                <w:szCs w:val="20"/>
-              </w:rPr>
-              <w:t>E-commerce &amp; CMS:</w:t>
-            </w:r>
-            <w:r>
-              <w:rPr>
-                <w:rFonts w:ascii="HelveticaNeueLT Pro 55 Roman" w:hAnsi="HelveticaNeueLT Pro 55 Roman"/>
-                <w:b/>
-                <w:sz w:val="20"/>
-                <w:szCs w:val="20"/>
-              </w:rPr>
-              <w:t xml:space="preserve"> </w:t>
-            </w:r>
-            <w:r>
-              <w:rPr>
-                <w:rFonts w:ascii="HelveticaNeueLT Pro 55 Roman" w:hAnsi="HelveticaNeueLT Pro 55 Roman"/>
-                <w:bCs/>
-                <w:sz w:val="20"/>
-                <w:szCs w:val="20"/>
-              </w:rPr>
-              <w:t>Shopify Hydrogen/Liquid, WordPress (Core contributor), WordPress.com VIP, Faust.js</w:t>
-            </w:r>
-          </w:p>
-          <w:p>
-            <w:pPr>
-              <w:spacing w:after="40" w:line="288" w:lineRule="auto"/>
-              <w:rPr>
-                <w:bCs/>
-                <w:sz w:val="20"/>
-                <w:szCs w:val="20"/>
-              </w:rPr>
-            </w:pPr>
-            <w:r>
-              <w:rPr>
-                <w:rFonts w:ascii="HelveticaNeueLT Pro 55 Roman" w:hAnsi="HelveticaNeueLT Pro 55 Roman"/>
-                <w:b/>
-                <w:sz w:val="20"/>
-                <w:szCs w:val="20"/>
-              </w:rPr>
-              <w:t>Data &amp; Infrastructure:</w:t>
-            </w:r>
-            <w:r>
-              <w:rPr>
-                <w:rFonts w:ascii="HelveticaNeueLT Pro 55 Roman" w:hAnsi="HelveticaNeueLT Pro 55 Roman"/>
-                <w:b/>
-                <w:sz w:val="20"/>
-                <w:szCs w:val="20"/>
-              </w:rPr>
-              <w:t xml:space="preserve"> </w:t>
-            </w:r>
-            <w:r>
-              <w:rPr>
-                <w:rFonts w:ascii="HelveticaNeueLT Pro 55 Roman" w:hAnsi="HelveticaNeueLT Pro 55 Roman"/>
-                <w:bCs/>
-                <w:sz w:val="20"/>
-                <w:szCs w:val="20"/>
-              </w:rPr>
-              <w:t>Firebase, SQL Server, MongoDB, Leaflet/</w:t>
-            </w:r>
-            <w:proofErr w:type="spellStart"/>
-            <w:r>
-              <w:rPr>
-                <w:rFonts w:ascii="HelveticaNeueLT Pro 55 Roman" w:hAnsi="HelveticaNeueLT Pro 55 Roman"/>
-                <w:bCs/>
-                <w:sz w:val="20"/>
-                <w:szCs w:val="20"/>
-              </w:rPr>
-              <w:t>Mapbox</w:t>
-            </w:r>
-            <w:proofErr w:type="spellEnd"/>
-            <w:r>
-              <w:rPr>
-                <w:rFonts w:ascii="HelveticaNeueLT Pro 55 Roman" w:hAnsi="HelveticaNeueLT Pro 55 Roman"/>
-                <w:bCs/>
-                <w:sz w:val="20"/>
-                <w:szCs w:val="20"/>
-              </w:rPr>
-              <w:t xml:space="preserve">, Turf.js, Vite, </w:t>
-            </w:r>
-            <w:proofErr w:type="spellStart"/>
-            <w:r>
-              <w:rPr>
-                <w:rFonts w:ascii="HelveticaNeueLT Pro 55 Roman" w:hAnsi="HelveticaNeueLT Pro 55 Roman"/>
-                <w:bCs/>
-                <w:sz w:val="20"/>
-                <w:szCs w:val="20"/>
-              </w:rPr>
-              <w:t>Vercel</w:t>
-            </w:r>
-            <w:proofErr w:type="spellEnd"/>
-            <w:r>
-              <w:rPr>
-                <w:rFonts w:ascii="HelveticaNeueLT Pro 55 Roman" w:hAnsi="HelveticaNeueLT Pro 55 Roman"/>
-                <w:bCs/>
-                <w:sz w:val="20"/>
-                <w:szCs w:val="20"/>
-              </w:rPr>
-              <w:t>, Netlify, Cloudflare</w:t>
+              <w:t>Firebase, SQL Server, MongoDB, Leaflet/Mapbox, Turf.js, Vite, Vercel, Netlify, Cloudflare</w:t>
             </w:r>
           </w:p>
           <w:p>

</xml_diff>

<commit_message>
Update stats and improve caching
</commit_message>
<xml_diff>
--- a/resume.docx
+++ b/resume.docx
@@ -392,7 +392,6 @@
                 <w:ilvl w:val="0"/>
                 <w:numId w:val="1"/>
               </w:numPr>
-              <w:spacing w:line="264" w:lineRule="auto"/>
               <w:rPr>
                 <w:rFonts w:ascii="HelveticaNeueLT Pro 55 Roman" w:hAnsi="HelveticaNeueLT Pro 55 Roman" w:cs="Arial"/>
                 <w:sz w:val="22"/>
@@ -405,7 +404,98 @@
                 <w:sz w:val="22"/>
                 <w:szCs w:val="20"/>
               </w:rPr>
-              <w:t>Built production AI systems using OpenAI and Anthropic APIs, including streaming chat, real-time voice, and cost-managed caching layers.</w:t>
+              <w:t>Production AI systems using OpenAI and Anthropic APIs: streaming chat, real-time voice, cost-managed caching.</w:t>
+            </w:r>
+          </w:p>
+          <w:p>
+            <w:pPr>
+              <w:numPr>
+                <w:ilvl w:val="0"/>
+                <w:numId w:val="1"/>
+              </w:numPr>
+              <w:rPr>
+                <w:rFonts w:ascii="HelveticaNeueLT Pro 55 Roman" w:hAnsi="HelveticaNeueLT Pro 55 Roman" w:cs="Arial"/>
+                <w:sz w:val="22"/>
+                <w:szCs w:val="20"/>
+              </w:rPr>
+            </w:pPr>
+            <w:r>
+              <w:rPr>
+                <w:rFonts w:ascii="HelveticaNeueLT Pro 55 Roman" w:hAnsi="HelveticaNeueLT Pro 55 Roman" w:cs="Arial"/>
+                <w:sz w:val="22"/>
+                <w:szCs w:val="20"/>
+              </w:rPr>
+              <w:t>200+ PRs across 5 OSS repos at 9</w:t>
+            </w:r>
+            <w:r>
+              <w:rPr>
+                <w:rFonts w:ascii="HelveticaNeueLT Pro 55 Roman" w:hAnsi="HelveticaNeueLT Pro 55 Roman" w:cs="Arial"/>
+                <w:sz w:val="22"/>
+                <w:szCs w:val="20"/>
+              </w:rPr>
+              <w:t>8</w:t>
+            </w:r>
+            <w:r>
+              <w:rPr>
+                <w:rFonts w:ascii="HelveticaNeueLT Pro 55 Roman" w:hAnsi="HelveticaNeueLT Pro 55 Roman" w:cs="Arial"/>
+                <w:sz w:val="22"/>
+                <w:szCs w:val="20"/>
+              </w:rPr>
+              <w:t xml:space="preserve">%+ acceptance. </w:t>
+            </w:r>
+            <w:proofErr w:type="gramStart"/>
+            <w:r>
+              <w:rPr>
+                <w:rFonts w:ascii="HelveticaNeueLT Pro 55 Roman" w:hAnsi="HelveticaNeueLT Pro 55 Roman" w:cs="Arial"/>
+                <w:sz w:val="22"/>
+                <w:szCs w:val="20"/>
+              </w:rPr>
+              <w:t>Top-5</w:t>
+            </w:r>
+            <w:proofErr w:type="gramEnd"/>
+            <w:r>
+              <w:rPr>
+                <w:rFonts w:ascii="HelveticaNeueLT Pro 55 Roman" w:hAnsi="HelveticaNeueLT Pro 55 Roman" w:cs="Arial"/>
+                <w:sz w:val="22"/>
+                <w:szCs w:val="20"/>
+              </w:rPr>
+              <w:t xml:space="preserve"> contributor to </w:t>
+            </w:r>
+            <w:proofErr w:type="spellStart"/>
+            <w:r>
+              <w:rPr>
+                <w:rFonts w:ascii="HelveticaNeueLT Pro 55 Roman" w:hAnsi="HelveticaNeueLT Pro 55 Roman" w:cs="Arial"/>
+                <w:sz w:val="22"/>
+                <w:szCs w:val="20"/>
+              </w:rPr>
+              <w:t>claude</w:t>
+            </w:r>
+            <w:proofErr w:type="spellEnd"/>
+            <w:r>
+              <w:rPr>
+                <w:rFonts w:ascii="HelveticaNeueLT Pro 55 Roman" w:hAnsi="HelveticaNeueLT Pro 55 Roman" w:cs="Arial"/>
+                <w:sz w:val="22"/>
+                <w:szCs w:val="20"/>
+              </w:rPr>
+              <w:t xml:space="preserve">-mem (80K+ stars), second-highest contributor to </w:t>
+            </w:r>
+            <w:proofErr w:type="spellStart"/>
+            <w:r>
+              <w:rPr>
+                <w:rFonts w:ascii="HelveticaNeueLT Pro 55 Roman" w:hAnsi="HelveticaNeueLT Pro 55 Roman" w:cs="Arial"/>
+                <w:sz w:val="22"/>
+                <w:szCs w:val="20"/>
+              </w:rPr>
+              <w:t>hermes-webui</w:t>
+            </w:r>
+            <w:proofErr w:type="spellEnd"/>
+            <w:r>
+              <w:rPr>
+                <w:rFonts w:ascii="HelveticaNeueLT Pro 55 Roman" w:hAnsi="HelveticaNeueLT Pro 55 Roman" w:cs="Arial"/>
+                <w:sz w:val="22"/>
+                <w:szCs w:val="20"/>
+              </w:rPr>
+              <w:t xml:space="preserve"> (14K+ stars).</w:t>
             </w:r>
           </w:p>
           <w:p>
@@ -427,7 +517,7 @@
                 <w:sz w:val="22"/>
                 <w:szCs w:val="20"/>
               </w:rPr>
-              <w:t>WordPress Core contributor and architect of the WordPress.com VIP Partnership at NBC Sports.</w:t>
+              <w:t>234% conversion rate over e-commerce industry average; 42% YOY revenue growth (Shopify/Hydrogen).</w:t>
             </w:r>
           </w:p>
           <w:p>
@@ -449,125 +539,7 @@
                 <w:sz w:val="22"/>
                 <w:szCs w:val="20"/>
               </w:rPr>
-              <w:t>1</w:t>
-            </w:r>
-            <w:r>
-              <w:rPr>
-                <w:rFonts w:ascii="HelveticaNeueLT Pro 55 Roman" w:hAnsi="HelveticaNeueLT Pro 55 Roman" w:cs="Arial"/>
-                <w:sz w:val="22"/>
-                <w:szCs w:val="20"/>
-              </w:rPr>
-              <w:t>50+</w:t>
-            </w:r>
-            <w:r>
-              <w:rPr>
-                <w:rFonts w:ascii="HelveticaNeueLT Pro 55 Roman" w:hAnsi="HelveticaNeueLT Pro 55 Roman" w:cs="Arial"/>
-                <w:sz w:val="22"/>
-                <w:szCs w:val="20"/>
-              </w:rPr>
-              <w:t xml:space="preserve"> PRs shipped across </w:t>
-            </w:r>
-            <w:r>
-              <w:rPr>
-                <w:rFonts w:ascii="HelveticaNeueLT Pro 55 Roman" w:hAnsi="HelveticaNeueLT Pro 55 Roman" w:cs="Arial"/>
-                <w:sz w:val="22"/>
-                <w:szCs w:val="20"/>
-              </w:rPr>
-              <w:t>5</w:t>
-            </w:r>
-            <w:r>
-              <w:rPr>
-                <w:rFonts w:ascii="HelveticaNeueLT Pro 55 Roman" w:hAnsi="HelveticaNeueLT Pro 55 Roman" w:cs="Arial"/>
-                <w:sz w:val="22"/>
-                <w:szCs w:val="20"/>
-              </w:rPr>
-              <w:t xml:space="preserve"> open-source repositories at 9</w:t>
-            </w:r>
-            <w:r>
-              <w:rPr>
-                <w:rFonts w:ascii="HelveticaNeueLT Pro 55 Roman" w:hAnsi="HelveticaNeueLT Pro 55 Roman" w:cs="Arial"/>
-                <w:sz w:val="22"/>
-                <w:szCs w:val="20"/>
-              </w:rPr>
-              <w:t>5</w:t>
-            </w:r>
-            <w:r>
-              <w:rPr>
-                <w:rFonts w:ascii="HelveticaNeueLT Pro 55 Roman" w:hAnsi="HelveticaNeueLT Pro 55 Roman" w:cs="Arial"/>
-                <w:sz w:val="22"/>
-                <w:szCs w:val="20"/>
-              </w:rPr>
-              <w:t>%</w:t>
-            </w:r>
-            <w:r>
-              <w:rPr>
-                <w:rFonts w:ascii="HelveticaNeueLT Pro 55 Roman" w:hAnsi="HelveticaNeueLT Pro 55 Roman" w:cs="Arial"/>
-                <w:sz w:val="22"/>
-                <w:szCs w:val="20"/>
-              </w:rPr>
-              <w:t>+</w:t>
-            </w:r>
-            <w:r>
-              <w:rPr>
-                <w:rFonts w:ascii="HelveticaNeueLT Pro 55 Roman" w:hAnsi="HelveticaNeueLT Pro 55 Roman" w:cs="Arial"/>
-                <w:sz w:val="22"/>
-                <w:szCs w:val="20"/>
-              </w:rPr>
-              <w:t xml:space="preserve"> acceptance. Top-5 contributor to claude-mem (</w:t>
-            </w:r>
-            <w:r>
-              <w:rPr>
-                <w:rFonts w:ascii="HelveticaNeueLT Pro 55 Roman" w:hAnsi="HelveticaNeueLT Pro 55 Roman" w:cs="Arial"/>
-                <w:sz w:val="22"/>
-                <w:szCs w:val="20"/>
-              </w:rPr>
-              <w:t>80</w:t>
-            </w:r>
-            <w:r>
-              <w:rPr>
-                <w:rFonts w:ascii="HelveticaNeueLT Pro 55 Roman" w:hAnsi="HelveticaNeueLT Pro 55 Roman" w:cs="Arial"/>
-                <w:sz w:val="22"/>
-                <w:szCs w:val="20"/>
-              </w:rPr>
-              <w:t>K+ stars) and #</w:t>
-            </w:r>
-            <w:r>
-              <w:rPr>
-                <w:rFonts w:ascii="HelveticaNeueLT Pro 55 Roman" w:hAnsi="HelveticaNeueLT Pro 55 Roman" w:cs="Arial"/>
-                <w:sz w:val="22"/>
-                <w:szCs w:val="20"/>
-              </w:rPr>
-              <w:t>2</w:t>
-            </w:r>
-            <w:r>
-              <w:rPr>
-                <w:rFonts w:ascii="HelveticaNeueLT Pro 55 Roman" w:hAnsi="HelveticaNeueLT Pro 55 Roman" w:cs="Arial"/>
-                <w:sz w:val="22"/>
-                <w:szCs w:val="20"/>
-              </w:rPr>
-              <w:t xml:space="preserve"> on hermes-webui (14K+ stars).</w:t>
-            </w:r>
-          </w:p>
-          <w:p>
-            <w:pPr>
-              <w:numPr>
-                <w:ilvl w:val="0"/>
-                <w:numId w:val="1"/>
-              </w:numPr>
-              <w:spacing w:line="264" w:lineRule="auto"/>
-              <w:rPr>
-                <w:rFonts w:ascii="HelveticaNeueLT Pro 55 Roman" w:hAnsi="HelveticaNeueLT Pro 55 Roman" w:cs="Arial"/>
-                <w:sz w:val="22"/>
-                <w:szCs w:val="20"/>
-              </w:rPr>
-            </w:pPr>
-            <w:r>
-              <w:rPr>
-                <w:rFonts w:ascii="HelveticaNeueLT Pro 55 Roman" w:hAnsi="HelveticaNeueLT Pro 55 Roman" w:cs="Arial"/>
-                <w:sz w:val="22"/>
-                <w:szCs w:val="20"/>
-              </w:rPr>
-              <w:t>Drove 234% conversion rate over e-commerce industry average and 42% YOY revenue growth for a Shopify/Hydrogen client.</w:t>
+              <w:t>WordPress Core contributor and architect of the WordPress.com VIP Partnership at NBC Sports.</w:t>
             </w:r>
           </w:p>
         </w:tc>
@@ -668,6 +640,7 @@
                 <w:rFonts w:ascii="HelveticaNeueLT Pro 55 Roman" w:hAnsi="HelveticaNeueLT Pro 55 Roman" w:cs="Arial"/>
               </w:rPr>
             </w:pPr>
+            <w:proofErr w:type="spellStart"/>
             <w:r>
               <w:rPr>
                 <w:rFonts w:ascii="HelveticaNeueLT Pro 55 Roman" w:hAnsi="HelveticaNeueLT Pro 55 Roman" w:cs="Arial"/>
@@ -676,6 +649,7 @@
               </w:rPr>
               <w:t>Inkreel</w:t>
             </w:r>
+            <w:proofErr w:type="spellEnd"/>
             <w:r>
               <w:rPr>
                 <w:rFonts w:ascii="HelveticaNeueLT Pro 55 Roman" w:hAnsi="HelveticaNeueLT Pro 55 Roman" w:cs="Arial"/>
@@ -688,17 +662,29 @@
               </w:rPr>
               <w:t>(</w:t>
             </w:r>
-            <w:hyperlink r:id="rId10" w:history="1">
-              <w:r>
-                <w:rPr>
-                  <w:rStyle w:val="Hyperlink"/>
-                  <w:rFonts w:ascii="HelveticaNeueLT Pro 55 Roman" w:hAnsi="HelveticaNeueLT Pro 55 Roman" w:cs="Arial"/>
-                  <w:color w:val="auto"/>
-                  <w:u w:val="none"/>
-                </w:rPr>
-                <w:t>basedin.nyc</w:t>
-              </w:r>
-            </w:hyperlink>
+            <w:proofErr w:type="spellStart"/>
+            <w:r>
+              <w:fldChar w:fldCharType="begin"/>
+            </w:r>
+            <w:r>
+              <w:instrText>HYPERLINK "https://basedin.nyc/"</w:instrText>
+            </w:r>
+            <w:r>
+              <w:fldChar w:fldCharType="separate"/>
+            </w:r>
+            <w:r>
+              <w:rPr>
+                <w:rStyle w:val="Hyperlink"/>
+                <w:rFonts w:ascii="HelveticaNeueLT Pro 55 Roman" w:hAnsi="HelveticaNeueLT Pro 55 Roman" w:cs="Arial"/>
+                <w:color w:val="auto"/>
+                <w:u w:val="none"/>
+              </w:rPr>
+              <w:t>basedin.nyc</w:t>
+            </w:r>
+            <w:proofErr w:type="spellEnd"/>
+            <w:r>
+              <w:fldChar w:fldCharType="end"/>
+            </w:r>
             <w:r>
               <w:rPr>
                 <w:rFonts w:ascii="HelveticaNeueLT Pro 55 Roman" w:hAnsi="HelveticaNeueLT Pro 55 Roman" w:cs="Arial"/>
@@ -751,7 +737,35 @@
           <w:rFonts w:ascii="HelveticaNeueLT Pro 55 Roman" w:hAnsi="HelveticaNeueLT Pro 55 Roman"/>
           <w:sz w:val="18"/>
         </w:rPr>
-        <w:t xml:space="preserve">  |  December 2017 – Present</w:t>
+        <w:t xml:space="preserve"> </w:t>
+      </w:r>
+      <w:r>
+        <w:rPr>
+          <w:rFonts w:ascii="HelveticaNeueLT Pro 55 Roman" w:hAnsi="HelveticaNeueLT Pro 55 Roman"/>
+          <w:sz w:val="18"/>
+        </w:rPr>
+        <w:t xml:space="preserve"> </w:t>
+      </w:r>
+      <w:r>
+        <w:rPr>
+          <w:rFonts w:ascii="HelveticaNeueLT Pro 55 Roman" w:hAnsi="HelveticaNeueLT Pro 55 Roman"/>
+          <w:sz w:val="18"/>
+        </w:rPr>
+        <w:t xml:space="preserve"> |</w:t>
+      </w:r>
+      <w:r>
+        <w:rPr>
+          <w:rFonts w:ascii="HelveticaNeueLT Pro 55 Roman" w:hAnsi="HelveticaNeueLT Pro 55 Roman"/>
+          <w:sz w:val="18"/>
+        </w:rPr>
+        <w:t xml:space="preserve"> </w:t>
+      </w:r>
+      <w:r>
+        <w:rPr>
+          <w:rFonts w:ascii="HelveticaNeueLT Pro 55 Roman" w:hAnsi="HelveticaNeueLT Pro 55 Roman"/>
+          <w:sz w:val="18"/>
+        </w:rPr>
+        <w:t xml:space="preserve">  December 2017 – Present</w:t>
       </w:r>
     </w:p>
     <w:p>
@@ -769,7 +783,7 @@
           <w:sz w:val="22"/>
           <w:szCs w:val="20"/>
         </w:rPr>
-        <w:t>Independent consulting practice partnering with agencies and direct clients on full-stack development, AI integration, and e-commerce optimization.</w:t>
+        <w:t>Independent consulting on full-stack development, AI integration, and e-commerce.</w:t>
       </w:r>
     </w:p>
     <w:p>
@@ -795,7 +809,15 @@
           <w:sz w:val="22"/>
           <w:szCs w:val="20"/>
         </w:rPr>
-        <w:t xml:space="preserve"> Liberty Pest Control, Kim Seybert, Meridian Capital Group, VineSpring, and Pip’s Island. Agency partners</w:t>
+        <w:t xml:space="preserve"> Liberty Pest Control, Kim Seybert, Meridian Capital Group, VineSpring, and Pip’s Island. Agenc</w:t>
+      </w:r>
+      <w:r>
+        <w:rPr>
+          <w:rFonts w:ascii="HelveticaNeueLT Pro 55 Roman" w:hAnsi="HelveticaNeueLT Pro 55 Roman" w:cs="Arial"/>
+          <w:sz w:val="22"/>
+          <w:szCs w:val="20"/>
+        </w:rPr>
+        <w:t>ies</w:t>
       </w:r>
       <w:r>
         <w:rPr>
@@ -811,15 +833,23 @@
           <w:sz w:val="22"/>
           <w:szCs w:val="20"/>
         </w:rPr>
-        <w:t xml:space="preserve"> Razorfish (Publicis Sapient), Ruder Finn, CAHG, </w:t>
-      </w:r>
-      <w:r>
-        <w:rPr>
-          <w:rFonts w:ascii="HelveticaNeueLT Pro 55 Roman" w:hAnsi="HelveticaNeueLT Pro 55 Roman" w:cs="Arial"/>
-          <w:sz w:val="22"/>
-          <w:szCs w:val="20"/>
-        </w:rPr>
-        <w:t xml:space="preserve">and Story </w:t>
+        <w:t xml:space="preserve"> Ruder Finn, CAHG, </w:t>
+      </w:r>
+      <w:r>
+        <w:rPr>
+          <w:rFonts w:ascii="HelveticaNeueLT Pro 55 Roman" w:hAnsi="HelveticaNeueLT Pro 55 Roman" w:cs="Arial"/>
+          <w:sz w:val="22"/>
+          <w:szCs w:val="20"/>
+        </w:rPr>
+        <w:t>Story</w:t>
+      </w:r>
+      <w:r>
+        <w:rPr>
+          <w:rFonts w:ascii="HelveticaNeueLT Pro 55 Roman" w:hAnsi="HelveticaNeueLT Pro 55 Roman" w:cs="Arial"/>
+          <w:sz w:val="22"/>
+          <w:szCs w:val="20"/>
+        </w:rPr>
+        <w:t xml:space="preserve"> </w:t>
       </w:r>
       <w:r>
         <w:rPr>
@@ -849,20 +879,30 @@
           <w:sz w:val="18"/>
         </w:rPr>
       </w:pPr>
+      <w:proofErr w:type="gramStart"/>
       <w:r>
         <w:rPr>
           <w:rFonts w:ascii="HelveticaNeueLT Pro 55 Roman" w:hAnsi="HelveticaNeueLT Pro 55 Roman"/>
           <w:b/>
           <w:sz w:val="22"/>
         </w:rPr>
-        <w:t>Open Source Agent Pipeline</w:t>
-      </w:r>
-      <w:r>
-        <w:rPr>
-          <w:rFonts w:ascii="HelveticaNeueLT Pro 55 Roman" w:hAnsi="HelveticaNeueLT Pro 55 Roman"/>
-          <w:sz w:val="18"/>
-        </w:rPr>
-        <w:t xml:space="preserve">  (2025-2026)</w:t>
+        <w:t>Open Source</w:t>
+      </w:r>
+      <w:proofErr w:type="gramEnd"/>
+      <w:r>
+        <w:rPr>
+          <w:rFonts w:ascii="HelveticaNeueLT Pro 55 Roman" w:hAnsi="HelveticaNeueLT Pro 55 Roman"/>
+          <w:b/>
+          <w:sz w:val="22"/>
+        </w:rPr>
+        <w:t xml:space="preserve"> Agent Pipeline</w:t>
+      </w:r>
+      <w:r>
+        <w:rPr>
+          <w:rFonts w:ascii="HelveticaNeueLT Pro 55 Roman" w:hAnsi="HelveticaNeueLT Pro 55 Roman"/>
+          <w:sz w:val="18"/>
+        </w:rPr>
+        <w:t xml:space="preserve">  (2026)</w:t>
       </w:r>
     </w:p>
     <w:p>
@@ -885,203 +925,99 @@
       </w:pPr>
       <w:r>
         <w:rPr>
-          <w:rFonts w:ascii="HelveticaNeueLT Pro 55 Roman" w:hAnsi="HelveticaNeueLT Pro 55 Roman"/>
-          <w:sz w:val="22"/>
-        </w:rPr>
-        <w:t xml:space="preserve">Built </w:t>
-      </w:r>
-      <w:r>
-        <w:rPr>
-          <w:rFonts w:ascii="HelveticaNeueLT Pro 55 Roman" w:hAnsi="HelveticaNeueLT Pro 55 Roman"/>
-          <w:sz w:val="22"/>
-        </w:rPr>
-        <w:t>a multi-agent system that autonomously discovers issues, plans fixes, implements them in isolated git worktrees, runs cross-provider adversarial review, and ships PRs end-to-end.</w:t>
+          <w:rFonts w:ascii="HelveticaNeueLT Pro 55 Roman" w:hAnsi="HelveticaNeueLT Pro 55 Roman" w:cs="Arial"/>
+          <w:sz w:val="22"/>
+          <w:szCs w:val="20"/>
+        </w:rPr>
+        <w:t xml:space="preserve">Built an autonomous </w:t>
+      </w:r>
+      <w:r>
+        <w:rPr>
+          <w:rFonts w:ascii="HelveticaNeueLT Pro 55 Roman" w:hAnsi="HelveticaNeueLT Pro 55 Roman" w:cs="Arial"/>
+          <w:sz w:val="22"/>
+          <w:szCs w:val="20"/>
+        </w:rPr>
+        <w:t>multi-agent, multi-repo pipeline for upstream open-source contributions. Runs continuously. Cross-provider spe</w:t>
+      </w:r>
+      <w:r>
+        <w:rPr>
+          <w:rFonts w:ascii="HelveticaNeueLT Pro 55 Roman" w:hAnsi="HelveticaNeueLT Pro 55 Roman" w:cs="Arial"/>
+          <w:sz w:val="22"/>
+          <w:szCs w:val="20"/>
+        </w:rPr>
+        <w:t>c</w:t>
+      </w:r>
+      <w:r>
+        <w:rPr>
+          <w:rFonts w:ascii="HelveticaNeueLT Pro 55 Roman" w:hAnsi="HelveticaNeueLT Pro 55 Roman" w:cs="Arial"/>
+          <w:sz w:val="22"/>
+          <w:szCs w:val="20"/>
+        </w:rPr>
+        <w:t xml:space="preserve"> synthesis and reviews, behavioral regression testing, deterministic </w:t>
+      </w:r>
+      <w:proofErr w:type="gramStart"/>
+      <w:r>
+        <w:rPr>
+          <w:rFonts w:ascii="HelveticaNeueLT Pro 55 Roman" w:hAnsi="HelveticaNeueLT Pro 55 Roman" w:cs="Arial"/>
+          <w:sz w:val="22"/>
+          <w:szCs w:val="20"/>
+        </w:rPr>
+        <w:t>publish</w:t>
+      </w:r>
+      <w:proofErr w:type="gramEnd"/>
+      <w:r>
+        <w:rPr>
+          <w:rFonts w:ascii="HelveticaNeueLT Pro 55 Roman" w:hAnsi="HelveticaNeueLT Pro 55 Roman" w:cs="Arial"/>
+          <w:sz w:val="22"/>
+          <w:szCs w:val="20"/>
+        </w:rPr>
+        <w:t xml:space="preserve"> gates.</w:t>
+      </w:r>
+      <w:r>
+        <w:rPr>
+          <w:rFonts w:ascii="HelveticaNeueLT Pro 55 Roman" w:hAnsi="HelveticaNeueLT Pro 55 Roman" w:cs="Arial"/>
+          <w:sz w:val="22"/>
+          <w:szCs w:val="20"/>
+        </w:rPr>
+        <w:t xml:space="preserve"> Post-push</w:t>
+      </w:r>
+      <w:r>
+        <w:rPr>
+          <w:rFonts w:ascii="HelveticaNeueLT Pro 55 Roman" w:hAnsi="HelveticaNeueLT Pro 55 Roman" w:cs="Arial"/>
+          <w:sz w:val="22"/>
+          <w:szCs w:val="20"/>
+        </w:rPr>
+        <w:t xml:space="preserve"> </w:t>
+      </w:r>
+      <w:r>
+        <w:rPr>
+          <w:rFonts w:ascii="HelveticaNeueLT Pro 55 Roman" w:hAnsi="HelveticaNeueLT Pro 55 Roman" w:cs="Arial"/>
+          <w:sz w:val="22"/>
+          <w:szCs w:val="20"/>
+        </w:rPr>
+        <w:t>c</w:t>
+      </w:r>
+      <w:r>
+        <w:rPr>
+          <w:rFonts w:ascii="HelveticaNeueLT Pro 55 Roman" w:hAnsi="HelveticaNeueLT Pro 55 Roman" w:cs="Arial"/>
+          <w:sz w:val="22"/>
+          <w:szCs w:val="20"/>
+        </w:rPr>
+        <w:t>onvergence on CI and reviewer feedback.</w:t>
       </w:r>
     </w:p>
     <w:p>
       <w:pPr>
-        <w:numPr>
-          <w:ilvl w:val="0"/>
-          <w:numId w:val="1"/>
-        </w:numPr>
-        <w:tabs>
-          <w:tab w:val="clear" w:pos="288"/>
-          <w:tab w:val="left" w:pos="540"/>
-          <w:tab w:val="num" w:pos="576"/>
-        </w:tabs>
-        <w:spacing w:after="40" w:line="264" w:lineRule="auto"/>
-        <w:ind w:left="540"/>
-        <w:rPr>
-          <w:rFonts w:ascii="HelveticaNeueLT Pro 55 Roman" w:hAnsi="HelveticaNeueLT Pro 55 Roman" w:cs="Arial"/>
-          <w:sz w:val="22"/>
-          <w:szCs w:val="20"/>
-        </w:rPr>
-      </w:pPr>
-      <w:r>
-        <w:rPr>
-          <w:rFonts w:ascii="HelveticaNeueLT Pro 55 Roman" w:hAnsi="HelveticaNeueLT Pro 55 Roman"/>
-          <w:sz w:val="22"/>
-        </w:rPr>
-        <w:t>Parallelized issue discovery across repo-specific search dimensions; candidate</w:t>
-      </w:r>
-      <w:r>
-        <w:rPr>
-          <w:rFonts w:ascii="HelveticaNeueLT Pro 55 Roman" w:hAnsi="HelveticaNeueLT Pro 55 Roman"/>
-          <w:sz w:val="22"/>
-        </w:rPr>
-        <w:t>s</w:t>
-      </w:r>
-      <w:r>
-        <w:rPr>
-          <w:rFonts w:ascii="HelveticaNeueLT Pro 55 Roman" w:hAnsi="HelveticaNeueLT Pro 55 Roman"/>
-          <w:sz w:val="22"/>
-        </w:rPr>
-        <w:t xml:space="preserve"> verified</w:t>
-      </w:r>
-      <w:r>
-        <w:rPr>
-          <w:rFonts w:ascii="HelveticaNeueLT Pro 55 Roman" w:hAnsi="HelveticaNeueLT Pro 55 Roman"/>
-          <w:sz w:val="22"/>
-        </w:rPr>
-        <w:t xml:space="preserve"> against latest source, gated on prior work and active claims, with issues filed upstream when none exist.</w:t>
-      </w:r>
+        <w:spacing w:line="264" w:lineRule="auto"/>
+        <w:rPr>
+          <w:rFonts w:ascii="HelveticaNeueLT Pro 55 Roman" w:hAnsi="HelveticaNeueLT Pro 55 Roman" w:cs="Arial"/>
+          <w:sz w:val="18"/>
+          <w:szCs w:val="18"/>
+        </w:rPr>
+      </w:pPr>
     </w:p>
     <w:p>
       <w:pPr>
-        <w:numPr>
-          <w:ilvl w:val="0"/>
-          <w:numId w:val="1"/>
-        </w:numPr>
-        <w:tabs>
-          <w:tab w:val="clear" w:pos="288"/>
-          <w:tab w:val="left" w:pos="540"/>
-        </w:tabs>
-        <w:spacing w:after="40" w:line="264" w:lineRule="auto"/>
-        <w:ind w:left="540" w:hanging="252"/>
-        <w:rPr>
-          <w:rFonts w:ascii="HelveticaNeueLT Pro 55 Roman" w:hAnsi="HelveticaNeueLT Pro 55 Roman" w:cs="Arial"/>
-          <w:sz w:val="22"/>
-          <w:szCs w:val="20"/>
-        </w:rPr>
-      </w:pPr>
-      <w:r>
-        <w:rPr>
-          <w:rFonts w:ascii="HelveticaNeueLT Pro 55 Roman" w:hAnsi="HelveticaNeueLT Pro 55 Roman"/>
-          <w:sz w:val="22"/>
-        </w:rPr>
-        <w:t xml:space="preserve">Shipped </w:t>
-      </w:r>
-      <w:r>
-        <w:rPr>
-          <w:rFonts w:ascii="HelveticaNeueLT Pro 55 Roman" w:hAnsi="HelveticaNeueLT Pro 55 Roman"/>
-          <w:sz w:val="22"/>
-        </w:rPr>
-        <w:t>1</w:t>
-      </w:r>
-      <w:r>
-        <w:rPr>
-          <w:rFonts w:ascii="HelveticaNeueLT Pro 55 Roman" w:hAnsi="HelveticaNeueLT Pro 55 Roman"/>
-          <w:sz w:val="22"/>
-        </w:rPr>
-        <w:t>5</w:t>
-      </w:r>
-      <w:r>
-        <w:rPr>
-          <w:rFonts w:ascii="HelveticaNeueLT Pro 55 Roman" w:hAnsi="HelveticaNeueLT Pro 55 Roman"/>
-          <w:sz w:val="22"/>
-        </w:rPr>
-        <w:t xml:space="preserve">0+ </w:t>
-      </w:r>
-      <w:r>
-        <w:rPr>
-          <w:rFonts w:ascii="HelveticaNeueLT Pro 55 Roman" w:hAnsi="HelveticaNeueLT Pro 55 Roman"/>
-          <w:sz w:val="22"/>
-        </w:rPr>
-        <w:t xml:space="preserve">PRs </w:t>
-      </w:r>
-      <w:r>
-        <w:rPr>
-          <w:rFonts w:ascii="HelveticaNeueLT Pro 55 Roman" w:hAnsi="HelveticaNeueLT Pro 55 Roman"/>
-          <w:sz w:val="22"/>
-        </w:rPr>
-        <w:t>across 9 repositories</w:t>
-      </w:r>
-      <w:r>
-        <w:rPr>
-          <w:rFonts w:ascii="HelveticaNeueLT Pro 55 Roman" w:hAnsi="HelveticaNeueLT Pro 55 Roman"/>
-          <w:sz w:val="22"/>
-        </w:rPr>
-        <w:t xml:space="preserve"> with </w:t>
-      </w:r>
-      <w:r>
-        <w:rPr>
-          <w:rFonts w:ascii="HelveticaNeueLT Pro 55 Roman" w:hAnsi="HelveticaNeueLT Pro 55 Roman"/>
-          <w:sz w:val="22"/>
-        </w:rPr>
-        <w:t>9</w:t>
-      </w:r>
-      <w:r>
-        <w:rPr>
-          <w:rFonts w:ascii="HelveticaNeueLT Pro 55 Roman" w:hAnsi="HelveticaNeueLT Pro 55 Roman"/>
-          <w:sz w:val="22"/>
-        </w:rPr>
-        <w:t>5</w:t>
-      </w:r>
-      <w:r>
-        <w:rPr>
-          <w:rFonts w:ascii="HelveticaNeueLT Pro 55 Roman" w:hAnsi="HelveticaNeueLT Pro 55 Roman"/>
-          <w:sz w:val="22"/>
-        </w:rPr>
-        <w:t>% acceptance by external maintainers</w:t>
-      </w:r>
-      <w:r>
-        <w:rPr>
-          <w:rFonts w:ascii="HelveticaNeueLT Pro 55 Roman" w:hAnsi="HelveticaNeueLT Pro 55 Roman"/>
-          <w:sz w:val="22"/>
-        </w:rPr>
-        <w:t>.</w:t>
-      </w:r>
-    </w:p>
-    <w:p>
-      <w:pPr>
-        <w:numPr>
-          <w:ilvl w:val="0"/>
-          <w:numId w:val="1"/>
-        </w:numPr>
-        <w:tabs>
-          <w:tab w:val="clear" w:pos="288"/>
-          <w:tab w:val="left" w:pos="540"/>
-          <w:tab w:val="num" w:pos="576"/>
-        </w:tabs>
-        <w:spacing w:after="40" w:line="264" w:lineRule="auto"/>
-        <w:ind w:left="540"/>
-        <w:rPr>
-          <w:rFonts w:ascii="HelveticaNeueLT Pro 55 Roman" w:hAnsi="HelveticaNeueLT Pro 55 Roman" w:cs="Arial"/>
-          <w:sz w:val="22"/>
-          <w:szCs w:val="20"/>
-        </w:rPr>
-      </w:pPr>
-      <w:r>
-        <w:rPr>
-          <w:rFonts w:ascii="HelveticaNeueLT Pro 55 Roman" w:hAnsi="HelveticaNeueLT Pro 55 Roman" w:cs="Arial"/>
-          <w:sz w:val="22"/>
-          <w:szCs w:val="20"/>
-        </w:rPr>
-        <w:t>Post-push convergence loop diagnoses CI failures from actual run logs, triages per-repo bot comments, and handles reviewer rework autonomously through to merge.</w:t>
-      </w:r>
-    </w:p>
-    <w:p>
-      <w:pPr>
-        <w:spacing w:line="264" w:lineRule="auto"/>
-        <w:rPr>
-          <w:rFonts w:ascii="HelveticaNeueLT Pro 55 Roman" w:hAnsi="HelveticaNeueLT Pro 55 Roman" w:cs="Arial"/>
-          <w:sz w:val="18"/>
-          <w:szCs w:val="18"/>
-        </w:rPr>
-      </w:pPr>
-    </w:p>
-    <w:p>
-      <w:pPr>
         <w:spacing w:after="80" w:line="264" w:lineRule="auto"/>
         <w:ind w:left="288"/>
         <w:rPr>
@@ -1102,7 +1038,21 @@
           <w:rFonts w:ascii="HelveticaNeueLT Pro 55 Roman" w:hAnsi="HelveticaNeueLT Pro 55 Roman"/>
           <w:sz w:val="18"/>
         </w:rPr>
-        <w:t xml:space="preserve">  (2024)</w:t>
+        <w:t xml:space="preserve">  (2024</w:t>
+      </w:r>
+      <w:r>
+        <w:rPr>
+          <w:rFonts w:ascii="HelveticaNeueLT Pro 55 Roman" w:hAnsi="HelveticaNeueLT Pro 55 Roman"/>
+          <w:sz w:val="18"/>
+        </w:rPr>
+        <w:t>-2025</w:t>
+      </w:r>
+      <w:r>
+        <w:rPr>
+          <w:rFonts w:ascii="HelveticaNeueLT Pro 55 Roman" w:hAnsi="HelveticaNeueLT Pro 55 Roman"/>
+          <w:sz w:val="18"/>
+        </w:rPr>
+        <w:t>)</w:t>
       </w:r>
     </w:p>
     <w:p>
@@ -1221,7 +1171,28 @@
           <w:rFonts w:ascii="HelveticaNeueLT Pro 55 Roman" w:hAnsi="HelveticaNeueLT Pro 55 Roman"/>
           <w:sz w:val="22"/>
         </w:rPr>
-        <w:t>Designed a three-tier caching system (in-memory</w:t>
+        <w:t>T</w:t>
+      </w:r>
+      <w:r>
+        <w:rPr>
+          <w:rFonts w:ascii="HelveticaNeueLT Pro 55 Roman" w:hAnsi="HelveticaNeueLT Pro 55 Roman"/>
+          <w:sz w:val="22"/>
+        </w:rPr>
+        <w:t>hree-tier caching</w:t>
+      </w:r>
+      <w:r>
+        <w:rPr>
+          <w:rFonts w:ascii="HelveticaNeueLT Pro 55 Roman" w:hAnsi="HelveticaNeueLT Pro 55 Roman"/>
+          <w:sz w:val="22"/>
+        </w:rPr>
+        <w:t xml:space="preserve"> (</w:t>
+      </w:r>
+      <w:r>
+        <w:rPr>
+          <w:rFonts w:ascii="HelveticaNeueLT Pro 55 Roman" w:hAnsi="HelveticaNeueLT Pro 55 Roman"/>
+          <w:sz w:val="22"/>
+        </w:rPr>
+        <w:t>memory</w:t>
       </w:r>
       <w:r>
         <w:rPr>
@@ -1249,28 +1220,14 @@
           <w:rFonts w:ascii="HelveticaNeueLT Pro 55 Roman" w:hAnsi="HelveticaNeueLT Pro 55 Roman"/>
           <w:sz w:val="22"/>
         </w:rPr>
-        <w:t xml:space="preserve"> Firebase</w:t>
-      </w:r>
-      <w:r>
-        <w:rPr>
-          <w:rFonts w:ascii="HelveticaNeueLT Pro 55 Roman" w:hAnsi="HelveticaNeueLT Pro 55 Roman"/>
-          <w:sz w:val="22"/>
-        </w:rPr>
-        <w:t xml:space="preserve"> Firestore</w:t>
-      </w:r>
-      <w:r>
-        <w:rPr>
-          <w:rFonts w:ascii="HelveticaNeueLT Pro 55 Roman" w:hAnsi="HelveticaNeueLT Pro 55 Roman"/>
-          <w:sz w:val="22"/>
-        </w:rPr>
-        <w:t>) with SHA-1 fingerprinting for deduplication</w:t>
-      </w:r>
-      <w:r>
-        <w:rPr>
-          <w:rFonts w:ascii="HelveticaNeueLT Pro 55 Roman" w:hAnsi="HelveticaNeueLT Pro 55 Roman"/>
-          <w:sz w:val="22"/>
-        </w:rPr>
-        <w:t>. Built hot-swappable prompt management editable at runtime.</w:t>
+        <w:t xml:space="preserve"> Firebase)</w:t>
+      </w:r>
+      <w:r>
+        <w:rPr>
+          <w:rFonts w:ascii="HelveticaNeueLT Pro 55 Roman" w:hAnsi="HelveticaNeueLT Pro 55 Roman"/>
+          <w:sz w:val="22"/>
+        </w:rPr>
+        <w:t>, fingerprinting. Hot-swappable prompts.</w:t>
       </w:r>
     </w:p>
     <w:p>
@@ -1296,7 +1253,39 @@
           <w:rFonts w:ascii="HelveticaNeueLT Pro 55 Roman" w:hAnsi="HelveticaNeueLT Pro 55 Roman"/>
           <w:sz w:val="18"/>
         </w:rPr>
-        <w:t>React, Vite, Tailwind CSS, Node.js/Express, OpenAI API, Firebase, MS SQL Server (FreeTDS), TanStack Query.</w:t>
+        <w:t>React, Vite, Tailwind CSS, Node.js/Express, OpenAI API, Firebase, MS SQL Server (</w:t>
+      </w:r>
+      <w:proofErr w:type="spellStart"/>
+      <w:r>
+        <w:rPr>
+          <w:rFonts w:ascii="HelveticaNeueLT Pro 55 Roman" w:hAnsi="HelveticaNeueLT Pro 55 Roman"/>
+          <w:sz w:val="18"/>
+        </w:rPr>
+        <w:t>FreeTDS</w:t>
+      </w:r>
+      <w:proofErr w:type="spellEnd"/>
+      <w:r>
+        <w:rPr>
+          <w:rFonts w:ascii="HelveticaNeueLT Pro 55 Roman" w:hAnsi="HelveticaNeueLT Pro 55 Roman"/>
+          <w:sz w:val="18"/>
+        </w:rPr>
+        <w:t xml:space="preserve">), </w:t>
+      </w:r>
+      <w:proofErr w:type="spellStart"/>
+      <w:r>
+        <w:rPr>
+          <w:rFonts w:ascii="HelveticaNeueLT Pro 55 Roman" w:hAnsi="HelveticaNeueLT Pro 55 Roman"/>
+          <w:sz w:val="18"/>
+        </w:rPr>
+        <w:t>TanStack</w:t>
+      </w:r>
+      <w:proofErr w:type="spellEnd"/>
+      <w:r>
+        <w:rPr>
+          <w:rFonts w:ascii="HelveticaNeueLT Pro 55 Roman" w:hAnsi="HelveticaNeueLT Pro 55 Roman"/>
+          <w:sz w:val="18"/>
+        </w:rPr>
+        <w:t xml:space="preserve"> Query.</w:t>
       </w:r>
     </w:p>
     <w:p>
@@ -1324,7 +1313,6 @@
           <w:b/>
           <w:sz w:val="22"/>
         </w:rPr>
-        <w:lastRenderedPageBreak/>
         <w:t>Liberty Pest Control, Scheduling Optimization Engine</w:t>
       </w:r>
       <w:r>
@@ -1358,7 +1346,89 @@
           <w:sz w:val="22"/>
           <w:szCs w:val="22"/>
         </w:rPr>
-        <w:t>Designed a Vehicle Routing Problem solver assigning 5,500+ recurring services across 80 technicians in the NYC metro area. ~1,900-line algorithm in Node.js Worker Threads with</w:t>
+        <w:t xml:space="preserve">Designed a Vehicle Routing Problem solver </w:t>
+      </w:r>
+      <w:r>
+        <w:rPr>
+          <w:rFonts w:ascii="HelveticaNeueLT Pro 55 Roman" w:hAnsi="HelveticaNeueLT Pro 55 Roman"/>
+          <w:sz w:val="22"/>
+          <w:szCs w:val="22"/>
+        </w:rPr>
+        <w:t>for</w:t>
+      </w:r>
+      <w:r>
+        <w:rPr>
+          <w:rFonts w:ascii="HelveticaNeueLT Pro 55 Roman" w:hAnsi="HelveticaNeueLT Pro 55 Roman"/>
+          <w:sz w:val="22"/>
+          <w:szCs w:val="22"/>
+        </w:rPr>
+        <w:t xml:space="preserve"> 5,500+ services across 80 technicians</w:t>
+      </w:r>
+      <w:r>
+        <w:rPr>
+          <w:rFonts w:ascii="HelveticaNeueLT Pro 55 Roman" w:hAnsi="HelveticaNeueLT Pro 55 Roman"/>
+          <w:sz w:val="22"/>
+          <w:szCs w:val="22"/>
+        </w:rPr>
+        <w:t>.</w:t>
+      </w:r>
+    </w:p>
+    <w:p>
+      <w:pPr>
+        <w:numPr>
+          <w:ilvl w:val="0"/>
+          <w:numId w:val="1"/>
+        </w:numPr>
+        <w:tabs>
+          <w:tab w:val="clear" w:pos="288"/>
+        </w:tabs>
+        <w:spacing w:after="40" w:line="264" w:lineRule="auto"/>
+        <w:ind w:left="540" w:hanging="252"/>
+        <w:rPr>
+          <w:rFonts w:ascii="HelveticaNeueLT Pro 55 Roman" w:hAnsi="HelveticaNeueLT Pro 55 Roman" w:cs="Arial"/>
+          <w:sz w:val="22"/>
+          <w:szCs w:val="22"/>
+        </w:rPr>
+      </w:pPr>
+      <w:r>
+        <w:rPr>
+          <w:rFonts w:ascii="HelveticaNeueLT Pro 55 Roman" w:hAnsi="HelveticaNeueLT Pro 55 Roman"/>
+          <w:sz w:val="22"/>
+          <w:szCs w:val="22"/>
+        </w:rPr>
+        <w:t xml:space="preserve">Node.js </w:t>
+      </w:r>
+      <w:r>
+        <w:rPr>
+          <w:rFonts w:ascii="HelveticaNeueLT Pro 55 Roman" w:hAnsi="HelveticaNeueLT Pro 55 Roman"/>
+          <w:sz w:val="22"/>
+          <w:szCs w:val="22"/>
+        </w:rPr>
+        <w:t>w</w:t>
+      </w:r>
+      <w:r>
+        <w:rPr>
+          <w:rFonts w:ascii="HelveticaNeueLT Pro 55 Roman" w:hAnsi="HelveticaNeueLT Pro 55 Roman"/>
+          <w:sz w:val="22"/>
+          <w:szCs w:val="22"/>
+        </w:rPr>
+        <w:t xml:space="preserve">orker </w:t>
+      </w:r>
+      <w:r>
+        <w:rPr>
+          <w:rFonts w:ascii="HelveticaNeueLT Pro 55 Roman" w:hAnsi="HelveticaNeueLT Pro 55 Roman"/>
+          <w:sz w:val="22"/>
+          <w:szCs w:val="22"/>
+        </w:rPr>
+        <w:t>t</w:t>
+      </w:r>
+      <w:r>
+        <w:rPr>
+          <w:rFonts w:ascii="HelveticaNeueLT Pro 55 Roman" w:hAnsi="HelveticaNeueLT Pro 55 Roman"/>
+          <w:sz w:val="22"/>
+          <w:szCs w:val="22"/>
+        </w:rPr>
+        <w:t>hreads with</w:t>
       </w:r>
       <w:r>
         <w:rPr>
@@ -1425,15 +1495,31 @@
           <w:sz w:val="22"/>
           <w:szCs w:val="22"/>
         </w:rPr>
-        <w:t>T</w:t>
-      </w:r>
-      <w:r>
-        <w:rPr>
-          <w:rFonts w:ascii="HelveticaNeueLT Pro 55 Roman" w:hAnsi="HelveticaNeueLT Pro 55 Roman"/>
-          <w:sz w:val="22"/>
-          <w:szCs w:val="22"/>
-        </w:rPr>
-        <w:t>hree-layer API: legacy SQL → Next.js API routes (data</w:t>
+        <w:t>L</w:t>
+      </w:r>
+      <w:r>
+        <w:rPr>
+          <w:rFonts w:ascii="HelveticaNeueLT Pro 55 Roman" w:hAnsi="HelveticaNeueLT Pro 55 Roman"/>
+          <w:sz w:val="22"/>
+          <w:szCs w:val="22"/>
+        </w:rPr>
+        <w:t xml:space="preserve">egacy SQL </w:t>
+      </w:r>
+      <w:r>
+        <w:rPr>
+          <w:rFonts w:ascii="Arial" w:hAnsi="Arial" w:cs="Arial"/>
+          <w:sz w:val="22"/>
+          <w:szCs w:val="22"/>
+        </w:rPr>
+        <w:t>→</w:t>
+      </w:r>
+      <w:r>
+        <w:rPr>
+          <w:rFonts w:ascii="HelveticaNeueLT Pro 55 Roman" w:hAnsi="HelveticaNeueLT Pro 55 Roman"/>
+          <w:sz w:val="22"/>
+          <w:szCs w:val="22"/>
+        </w:rPr>
+        <w:t xml:space="preserve"> Next.js API routes (data</w:t>
       </w:r>
       <w:r>
         <w:rPr>
@@ -1454,37 +1540,32 @@
           <w:rFonts w:ascii="HelveticaNeueLT Pro 55 Roman" w:hAnsi="HelveticaNeueLT Pro 55 Roman"/>
           <w:sz w:val="22"/>
         </w:rPr>
-        <w:t>) → frontend visualization (Leaflet maps, react-big-calendar with per-technician views).</w:t>
+        <w:t xml:space="preserve">) </w:t>
+      </w:r>
+      <w:r>
+        <w:rPr>
+          <w:rFonts w:ascii="Arial" w:hAnsi="Arial" w:cs="Arial"/>
+          <w:sz w:val="22"/>
+        </w:rPr>
+        <w:t>→</w:t>
+      </w:r>
+      <w:r>
+        <w:rPr>
+          <w:rFonts w:ascii="HelveticaNeueLT Pro 55 Roman" w:hAnsi="HelveticaNeueLT Pro 55 Roman"/>
+          <w:sz w:val="22"/>
+        </w:rPr>
+        <w:t xml:space="preserve"> frontend visualization</w:t>
+      </w:r>
+      <w:r>
+        <w:rPr>
+          <w:rFonts w:ascii="HelveticaNeueLT Pro 55 Roman" w:hAnsi="HelveticaNeueLT Pro 55 Roman"/>
+          <w:sz w:val="22"/>
+        </w:rPr>
+        <w:t>.</w:t>
       </w:r>
     </w:p>
     <w:p>
       <w:pPr>
-        <w:numPr>
-          <w:ilvl w:val="0"/>
-          <w:numId w:val="1"/>
-        </w:numPr>
-        <w:tabs>
-          <w:tab w:val="clear" w:pos="288"/>
-          <w:tab w:val="num" w:pos="576"/>
-        </w:tabs>
-        <w:spacing w:after="40" w:line="264" w:lineRule="auto"/>
-        <w:ind w:left="540"/>
-        <w:rPr>
-          <w:rFonts w:ascii="HelveticaNeueLT Pro 55 Roman" w:hAnsi="HelveticaNeueLT Pro 55 Roman" w:cs="Arial"/>
-          <w:sz w:val="22"/>
-          <w:szCs w:val="20"/>
-        </w:rPr>
-      </w:pPr>
-      <w:r>
-        <w:rPr>
-          <w:rFonts w:ascii="HelveticaNeueLT Pro 55 Roman" w:hAnsi="HelveticaNeueLT Pro 55 Roman"/>
-          <w:sz w:val="22"/>
-        </w:rPr>
-        <w:t>Implemented Haversine distance matrices, GeoJSON ray-casting for NYC borough containment, and batch rendering to keep the UI responsive with thousands of calendar events.</w:t>
-      </w:r>
-    </w:p>
-    <w:p>
-      <w:pPr>
         <w:spacing w:before="120" w:after="40" w:line="264" w:lineRule="auto"/>
         <w:ind w:left="259"/>
         <w:rPr>
@@ -1507,7 +1588,25 @@
           <w:bCs/>
           <w:sz w:val="18"/>
         </w:rPr>
-        <w:t>Next.js (App Router), React, Tailwind CSS, Node.js Worker Threads, Leaflet/Mapbox, Turf.js, MS SQL Server.</w:t>
+        <w:t>Next.js (App Router), React, Tailwind CSS, Node.js Worker Threads, Leaflet/</w:t>
+      </w:r>
+      <w:proofErr w:type="spellStart"/>
+      <w:r>
+        <w:rPr>
+          <w:rFonts w:ascii="HelveticaNeueLT Pro 55 Roman" w:hAnsi="HelveticaNeueLT Pro 55 Roman"/>
+          <w:bCs/>
+          <w:sz w:val="18"/>
+        </w:rPr>
+        <w:t>Mapbox</w:t>
+      </w:r>
+      <w:proofErr w:type="spellEnd"/>
+      <w:r>
+        <w:rPr>
+          <w:rFonts w:ascii="HelveticaNeueLT Pro 55 Roman" w:hAnsi="HelveticaNeueLT Pro 55 Roman"/>
+          <w:bCs/>
+          <w:sz w:val="18"/>
+        </w:rPr>
+        <w:t>, Turf.js, MS SQL Server.</w:t>
       </w:r>
     </w:p>
     <w:p>
@@ -1542,14 +1641,17 @@
                 <w:i/>
               </w:rPr>
             </w:pPr>
+            <w:proofErr w:type="spellStart"/>
             <w:r>
               <w:rPr>
                 <w:rFonts w:ascii="HelveticaNeueLT Pro 55 Roman" w:hAnsi="HelveticaNeueLT Pro 55 Roman" w:cs="Arial"/>
                 <w:sz w:val="32"/>
                 <w:szCs w:val="32"/>
               </w:rPr>
+              <w:lastRenderedPageBreak/>
               <w:t>Mezocliq</w:t>
             </w:r>
+            <w:proofErr w:type="spellEnd"/>
           </w:p>
         </w:tc>
         <w:tc>
@@ -1596,7 +1698,35 @@
           <w:rFonts w:ascii="HelveticaNeueLT Pro 55 Roman" w:hAnsi="HelveticaNeueLT Pro 55 Roman"/>
           <w:sz w:val="18"/>
         </w:rPr>
-        <w:t xml:space="preserve">  |  July 2015 – November 2017</w:t>
+        <w:t xml:space="preserve">  </w:t>
+      </w:r>
+      <w:r>
+        <w:rPr>
+          <w:rFonts w:ascii="HelveticaNeueLT Pro 55 Roman" w:hAnsi="HelveticaNeueLT Pro 55 Roman"/>
+          <w:sz w:val="18"/>
+        </w:rPr>
+        <w:t xml:space="preserve">  </w:t>
+      </w:r>
+      <w:r>
+        <w:rPr>
+          <w:rFonts w:ascii="HelveticaNeueLT Pro 55 Roman" w:hAnsi="HelveticaNeueLT Pro 55 Roman"/>
+          <w:sz w:val="18"/>
+        </w:rPr>
+        <w:t>|</w:t>
+      </w:r>
+      <w:r>
+        <w:rPr>
+          <w:rFonts w:ascii="HelveticaNeueLT Pro 55 Roman" w:hAnsi="HelveticaNeueLT Pro 55 Roman"/>
+          <w:sz w:val="18"/>
+        </w:rPr>
+        <w:t xml:space="preserve">  </w:t>
+      </w:r>
+      <w:r>
+        <w:rPr>
+          <w:rFonts w:ascii="HelveticaNeueLT Pro 55 Roman" w:hAnsi="HelveticaNeueLT Pro 55 Roman"/>
+          <w:sz w:val="18"/>
+        </w:rPr>
+        <w:t xml:space="preserve"> July 2015 – November 2017</w:t>
       </w:r>
     </w:p>
     <w:p>
@@ -1608,7 +1738,7 @@
           <w:rFonts w:ascii="HelveticaNeueLT Pro 55 Roman" w:hAnsi="HelveticaNeueLT Pro 55 Roman"/>
           <w:sz w:val="22"/>
         </w:rPr>
-        <w:t>Owned development lifecycle for the company's website and enterprise web application. Built an immersive full-screen experience with 120fps hardware-accelerated motion graphics. Mobile-first responsive with progressive enhancement.</w:t>
+        <w:t>Owned development lifecycle for the company's website and enterprise web application.</w:t>
       </w:r>
     </w:p>
     <w:p>
@@ -1700,7 +1830,49 @@
           <w:rFonts w:ascii="HelveticaNeueLT Pro 55 Roman" w:hAnsi="HelveticaNeueLT Pro 55 Roman"/>
           <w:sz w:val="18"/>
         </w:rPr>
-        <w:t xml:space="preserve">  |  March 2012 – February 2014</w:t>
+        <w:t xml:space="preserve">  </w:t>
+      </w:r>
+      <w:r>
+        <w:rPr>
+          <w:rFonts w:ascii="HelveticaNeueLT Pro 55 Roman" w:hAnsi="HelveticaNeueLT Pro 55 Roman"/>
+          <w:sz w:val="18"/>
+        </w:rPr>
+        <w:t xml:space="preserve"> </w:t>
+      </w:r>
+      <w:r>
+        <w:rPr>
+          <w:rFonts w:ascii="HelveticaNeueLT Pro 55 Roman" w:hAnsi="HelveticaNeueLT Pro 55 Roman"/>
+          <w:sz w:val="18"/>
+        </w:rPr>
+        <w:t>|</w:t>
+      </w:r>
+      <w:r>
+        <w:rPr>
+          <w:rFonts w:ascii="HelveticaNeueLT Pro 55 Roman" w:hAnsi="HelveticaNeueLT Pro 55 Roman"/>
+          <w:sz w:val="18"/>
+        </w:rPr>
+        <w:t xml:space="preserve"> </w:t>
+      </w:r>
+      <w:r>
+        <w:rPr>
+          <w:rFonts w:ascii="HelveticaNeueLT Pro 55 Roman" w:hAnsi="HelveticaNeueLT Pro 55 Roman"/>
+          <w:sz w:val="18"/>
+        </w:rPr>
+        <w:t xml:space="preserve"> </w:t>
+      </w:r>
+      <w:r>
+        <w:rPr>
+          <w:rFonts w:ascii="HelveticaNeueLT Pro 55 Roman" w:hAnsi="HelveticaNeueLT Pro 55 Roman"/>
+          <w:sz w:val="18"/>
+        </w:rPr>
+        <w:t xml:space="preserve"> </w:t>
+      </w:r>
+      <w:r>
+        <w:rPr>
+          <w:rFonts w:ascii="HelveticaNeueLT Pro 55 Roman" w:hAnsi="HelveticaNeueLT Pro 55 Roman"/>
+          <w:sz w:val="18"/>
+        </w:rPr>
+        <w:t>March 2012 – February 2014</w:t>
       </w:r>
     </w:p>
     <w:p>
@@ -1718,25 +1890,31 @@
           <w:sz w:val="22"/>
           <w:szCs w:val="20"/>
         </w:rPr>
-        <w:t>Practice lead of full-stack development spanning frontend, mobile, UX/IA, backend, and server configuration. Supervised and mentored developers across parallel client engagements.</w:t>
-      </w:r>
-    </w:p>
-    <w:p>
-      <w:pPr>
-        <w:spacing w:after="20" w:line="264" w:lineRule="auto"/>
-        <w:rPr>
-          <w:rFonts w:ascii="HelveticaNeueLT Pro 55 Roman" w:hAnsi="HelveticaNeueLT Pro 55 Roman" w:cs="Arial"/>
-          <w:sz w:val="22"/>
-          <w:szCs w:val="20"/>
-        </w:rPr>
-      </w:pPr>
-      <w:r>
-        <w:rPr>
-          <w:rFonts w:ascii="HelveticaNeueLT Pro 55 Roman" w:hAnsi="HelveticaNeueLT Pro 55 Roman" w:cs="Arial"/>
-          <w:sz w:val="22"/>
-          <w:szCs w:val="20"/>
-        </w:rPr>
-        <w:t>Clients: Visa, Barclays, NFL, Chase, Hyatt, Apple, Disney, US Airways, PNC Bank, Virgin America, UBS, Ritz-Carlton, Sallie Mae, ADP, IOC, and AARP.</w:t>
+        <w:t xml:space="preserve">Clients: </w:t>
+      </w:r>
+      <w:r>
+        <w:rPr>
+          <w:rFonts w:ascii="HelveticaNeueLT Pro 55 Roman" w:hAnsi="HelveticaNeueLT Pro 55 Roman" w:cs="Arial"/>
+          <w:sz w:val="22"/>
+          <w:szCs w:val="20"/>
+        </w:rPr>
+        <w:t xml:space="preserve">Visa, Barclays, NFL, Chase, Hyatt, Apple, Disney, US Airways, PNC Bank, Virgin America, UBS, Ritz-Carlton, Sallie Mae, ADP, </w:t>
+      </w:r>
+      <w:r>
+        <w:rPr>
+          <w:rFonts w:ascii="HelveticaNeueLT Pro 55 Roman" w:hAnsi="HelveticaNeueLT Pro 55 Roman" w:cs="Arial"/>
+          <w:sz w:val="22"/>
+          <w:szCs w:val="20"/>
+        </w:rPr>
+        <w:t xml:space="preserve">IOC, </w:t>
+      </w:r>
+      <w:r>
+        <w:rPr>
+          <w:rFonts w:ascii="HelveticaNeueLT Pro 55 Roman" w:hAnsi="HelveticaNeueLT Pro 55 Roman" w:cs="Arial"/>
+          <w:sz w:val="22"/>
+          <w:szCs w:val="20"/>
+        </w:rPr>
+        <w:t>and AARP.</w:t>
       </w:r>
     </w:p>
     <w:p>
@@ -1824,57 +2002,35 @@
           <w:rFonts w:ascii="HelveticaNeueLT Pro 55 Roman" w:hAnsi="HelveticaNeueLT Pro 55 Roman"/>
           <w:sz w:val="18"/>
         </w:rPr>
-        <w:t xml:space="preserve">  |  June 2011 – March 2012</w:t>
-      </w:r>
-    </w:p>
-    <w:p>
-      <w:pPr>
-        <w:spacing w:after="20" w:line="264" w:lineRule="auto"/>
-        <w:rPr>
-          <w:rFonts w:ascii="HelveticaNeueLT Pro 55 Roman" w:hAnsi="HelveticaNeueLT Pro 55 Roman" w:cs="Arial"/>
-          <w:sz w:val="22"/>
-          <w:szCs w:val="20"/>
-        </w:rPr>
-      </w:pPr>
-      <w:r>
-        <w:rPr>
-          <w:rFonts w:ascii="HelveticaNeueLT Pro 55 Roman" w:hAnsi="HelveticaNeueLT Pro 55 Roman" w:cs="Arial"/>
-          <w:sz w:val="22"/>
-          <w:szCs w:val="20"/>
-        </w:rPr>
-        <w:t>Developed new e-commerce templates by leveraging APIs exposed by the platform’s CMS</w:t>
-      </w:r>
-      <w:r>
-        <w:rPr>
-          <w:rFonts w:ascii="HelveticaNeueLT Pro 55 Roman" w:hAnsi="HelveticaNeueLT Pro 55 Roman" w:cs="Arial"/>
-          <w:sz w:val="22"/>
-          <w:szCs w:val="20"/>
-        </w:rPr>
-        <w:t xml:space="preserve">. </w:t>
-      </w:r>
-      <w:r>
-        <w:rPr>
-          <w:rFonts w:ascii="HelveticaNeueLT Pro 55 Roman" w:hAnsi="HelveticaNeueLT Pro 55 Roman" w:cs="Arial"/>
-          <w:sz w:val="22"/>
-          <w:szCs w:val="20"/>
-        </w:rPr>
-        <w:t>Established coding standards and implemented frontend technologies.</w:t>
-      </w:r>
-      <w:r>
-        <w:rPr>
-          <w:rFonts w:ascii="HelveticaNeueLT Pro 55 Roman" w:hAnsi="HelveticaNeueLT Pro 55 Roman" w:cs="Arial"/>
-          <w:sz w:val="22"/>
-          <w:szCs w:val="20"/>
-        </w:rPr>
         <w:t xml:space="preserve"> </w:t>
       </w:r>
       <w:r>
         <w:rPr>
-          <w:rFonts w:ascii="HelveticaNeueLT Pro 55 Roman" w:hAnsi="HelveticaNeueLT Pro 55 Roman" w:cs="Arial"/>
-          <w:sz w:val="22"/>
-          <w:szCs w:val="20"/>
-        </w:rPr>
-        <w:t>Delivered every project on budget and ahead of schedule.</w:t>
+          <w:rFonts w:ascii="HelveticaNeueLT Pro 55 Roman" w:hAnsi="HelveticaNeueLT Pro 55 Roman"/>
+          <w:sz w:val="18"/>
+        </w:rPr>
+        <w:t xml:space="preserve"> </w:t>
+      </w:r>
+      <w:r>
+        <w:rPr>
+          <w:rFonts w:ascii="HelveticaNeueLT Pro 55 Roman" w:hAnsi="HelveticaNeueLT Pro 55 Roman"/>
+          <w:sz w:val="18"/>
+        </w:rPr>
+        <w:t xml:space="preserve"> |  </w:t>
+      </w:r>
+      <w:r>
+        <w:rPr>
+          <w:rFonts w:ascii="HelveticaNeueLT Pro 55 Roman" w:hAnsi="HelveticaNeueLT Pro 55 Roman"/>
+          <w:sz w:val="18"/>
+        </w:rPr>
+        <w:t xml:space="preserve"> </w:t>
+      </w:r>
+      <w:r>
+        <w:rPr>
+          <w:rFonts w:ascii="HelveticaNeueLT Pro 55 Roman" w:hAnsi="HelveticaNeueLT Pro 55 Roman"/>
+          <w:sz w:val="18"/>
+        </w:rPr>
+        <w:t>June 2011 – March 2012</w:t>
       </w:r>
     </w:p>
     <w:p>
@@ -1967,7 +2123,35 @@
           <w:rFonts w:ascii="HelveticaNeueLT Pro 55 Roman" w:hAnsi="HelveticaNeueLT Pro 55 Roman"/>
           <w:sz w:val="18"/>
         </w:rPr>
-        <w:t xml:space="preserve">  |  July 2007 – June 2011</w:t>
+        <w:t xml:space="preserve">  </w:t>
+      </w:r>
+      <w:r>
+        <w:rPr>
+          <w:rFonts w:ascii="HelveticaNeueLT Pro 55 Roman" w:hAnsi="HelveticaNeueLT Pro 55 Roman"/>
+          <w:sz w:val="18"/>
+        </w:rPr>
+        <w:t xml:space="preserve"> </w:t>
+      </w:r>
+      <w:r>
+        <w:rPr>
+          <w:rFonts w:ascii="HelveticaNeueLT Pro 55 Roman" w:hAnsi="HelveticaNeueLT Pro 55 Roman"/>
+          <w:sz w:val="18"/>
+        </w:rPr>
+        <w:t xml:space="preserve">|  </w:t>
+      </w:r>
+      <w:r>
+        <w:rPr>
+          <w:rFonts w:ascii="HelveticaNeueLT Pro 55 Roman" w:hAnsi="HelveticaNeueLT Pro 55 Roman"/>
+          <w:sz w:val="18"/>
+        </w:rPr>
+        <w:t xml:space="preserve"> </w:t>
+      </w:r>
+      <w:r>
+        <w:rPr>
+          <w:rFonts w:ascii="HelveticaNeueLT Pro 55 Roman" w:hAnsi="HelveticaNeueLT Pro 55 Roman"/>
+          <w:sz w:val="18"/>
+        </w:rPr>
+        <w:t>July 2007 – June 2011</w:t>
       </w:r>
     </w:p>
     <w:p>
@@ -1990,30 +2174,15 @@
           <w:sz w:val="22"/>
           <w:szCs w:val="20"/>
         </w:rPr>
-        <w:t>Established the WordPress.com VIP Partnership with Automattic and contributed to WordPress Core. Brought development in-house, reducing costs and improving delivery speed.</w:t>
-      </w:r>
-    </w:p>
-    <w:p>
-      <w:pPr>
-        <w:numPr>
-          <w:ilvl w:val="0"/>
-          <w:numId w:val="1"/>
-        </w:numPr>
-        <w:spacing w:line="264" w:lineRule="auto"/>
-        <w:ind w:hanging="198"/>
-        <w:rPr>
-          <w:rFonts w:ascii="HelveticaNeueLT Pro 55 Roman" w:hAnsi="HelveticaNeueLT Pro 55 Roman" w:cs="Arial"/>
-          <w:sz w:val="22"/>
-          <w:szCs w:val="20"/>
-        </w:rPr>
-      </w:pPr>
-      <w:r>
-        <w:rPr>
-          <w:rFonts w:ascii="HelveticaNeueLT Pro 55 Roman" w:hAnsi="HelveticaNeueLT Pro 55 Roman" w:cs="Arial"/>
-          <w:sz w:val="22"/>
-          <w:szCs w:val="20"/>
-        </w:rPr>
-        <w:t>Managed NBCSports.com relaunch and led frontend development. Code designated “best in class” by 360i in comScore’s Top 10 Digital Media Sports.</w:t>
+        <w:t>Established the WordPress.com VIP Partnership with Automattic</w:t>
+      </w:r>
+      <w:r>
+        <w:rPr>
+          <w:rFonts w:ascii="HelveticaNeueLT Pro 55 Roman" w:hAnsi="HelveticaNeueLT Pro 55 Roman" w:cs="Arial"/>
+          <w:sz w:val="22"/>
+          <w:szCs w:val="20"/>
+        </w:rPr>
+        <w:t>. WordPress Core contributions.</w:t>
       </w:r>
     </w:p>
     <w:p>
@@ -2108,63 +2277,55 @@
           <w:sz w:val="22"/>
           <w:szCs w:val="22"/>
         </w:rPr>
-        <w:t>15</w:t>
-      </w:r>
-      <w:r>
-        <w:rPr>
-          <w:rFonts w:ascii="HelveticaNeueLT Pro 55 Roman" w:hAnsi="HelveticaNeueLT Pro 55 Roman"/>
-          <w:sz w:val="22"/>
-          <w:szCs w:val="22"/>
-        </w:rPr>
-        <w:t>0</w:t>
-      </w:r>
-      <w:r>
-        <w:rPr>
-          <w:rFonts w:ascii="HelveticaNeueLT Pro 55 Roman" w:hAnsi="HelveticaNeueLT Pro 55 Roman"/>
-          <w:sz w:val="22"/>
-          <w:szCs w:val="22"/>
-        </w:rPr>
-        <w:t xml:space="preserve">+ PRs </w:t>
-      </w:r>
-      <w:r>
-        <w:rPr>
-          <w:rFonts w:ascii="HelveticaNeueLT Pro 55 Roman" w:hAnsi="HelveticaNeueLT Pro 55 Roman"/>
-          <w:sz w:val="22"/>
-          <w:szCs w:val="22"/>
-        </w:rPr>
-        <w:t xml:space="preserve">shipped </w:t>
-      </w:r>
-      <w:r>
-        <w:rPr>
-          <w:rFonts w:ascii="HelveticaNeueLT Pro 55 Roman" w:hAnsi="HelveticaNeueLT Pro 55 Roman"/>
-          <w:sz w:val="22"/>
-          <w:szCs w:val="22"/>
-        </w:rPr>
-        <w:t xml:space="preserve">across </w:t>
-      </w:r>
-      <w:r>
-        <w:rPr>
-          <w:rFonts w:ascii="HelveticaNeueLT Pro 55 Roman" w:hAnsi="HelveticaNeueLT Pro 55 Roman"/>
-          <w:sz w:val="22"/>
-          <w:szCs w:val="22"/>
-        </w:rPr>
-        <w:t>5</w:t>
-      </w:r>
-      <w:r>
-        <w:rPr>
-          <w:rFonts w:ascii="HelveticaNeueLT Pro 55 Roman" w:hAnsi="HelveticaNeueLT Pro 55 Roman"/>
-          <w:sz w:val="22"/>
-          <w:szCs w:val="22"/>
-        </w:rPr>
-        <w:t xml:space="preserve"> repositories at 9</w:t>
-      </w:r>
-      <w:r>
-        <w:rPr>
-          <w:rFonts w:ascii="HelveticaNeueLT Pro 55 Roman" w:hAnsi="HelveticaNeueLT Pro 55 Roman"/>
-          <w:sz w:val="22"/>
-          <w:szCs w:val="22"/>
-        </w:rPr>
-        <w:t>5</w:t>
+        <w:t xml:space="preserve">Over </w:t>
+      </w:r>
+      <w:r>
+        <w:rPr>
+          <w:rFonts w:ascii="HelveticaNeueLT Pro 55 Roman" w:hAnsi="HelveticaNeueLT Pro 55 Roman"/>
+          <w:sz w:val="22"/>
+          <w:szCs w:val="22"/>
+        </w:rPr>
+        <w:t>200</w:t>
+      </w:r>
+      <w:r>
+        <w:rPr>
+          <w:rFonts w:ascii="HelveticaNeueLT Pro 55 Roman" w:hAnsi="HelveticaNeueLT Pro 55 Roman"/>
+          <w:sz w:val="22"/>
+          <w:szCs w:val="22"/>
+        </w:rPr>
+        <w:t xml:space="preserve"> PRs </w:t>
+      </w:r>
+      <w:r>
+        <w:rPr>
+          <w:rFonts w:ascii="HelveticaNeueLT Pro 55 Roman" w:hAnsi="HelveticaNeueLT Pro 55 Roman"/>
+          <w:sz w:val="22"/>
+          <w:szCs w:val="22"/>
+        </w:rPr>
+        <w:t>shipped</w:t>
+      </w:r>
+      <w:r>
+        <w:rPr>
+          <w:rFonts w:ascii="HelveticaNeueLT Pro 55 Roman" w:hAnsi="HelveticaNeueLT Pro 55 Roman"/>
+          <w:sz w:val="22"/>
+          <w:szCs w:val="22"/>
+        </w:rPr>
+        <w:t xml:space="preserve"> to production </w:t>
+      </w:r>
+      <w:r>
+        <w:rPr>
+          <w:rFonts w:ascii="HelveticaNeueLT Pro 55 Roman" w:hAnsi="HelveticaNeueLT Pro 55 Roman"/>
+          <w:sz w:val="22"/>
+          <w:szCs w:val="22"/>
+        </w:rPr>
+        <w:t>at 9</w:t>
+      </w:r>
+      <w:r>
+        <w:rPr>
+          <w:rFonts w:ascii="HelveticaNeueLT Pro 55 Roman" w:hAnsi="HelveticaNeueLT Pro 55 Roman"/>
+          <w:sz w:val="22"/>
+          <w:szCs w:val="22"/>
+        </w:rPr>
+        <w:t>8</w:t>
       </w:r>
       <w:r>
         <w:rPr>
@@ -2206,7 +2367,7 @@
         </w:rPr>
         <w:t xml:space="preserve"> </w:t>
       </w:r>
-      <w:hyperlink r:id="rId11" w:history="1">
+      <w:hyperlink r:id="rId10" w:history="1">
         <w:r>
           <w:rPr>
             <w:rStyle w:val="Hyperlink"/>
@@ -2239,6 +2400,7 @@
           <w:szCs w:val="20"/>
         </w:rPr>
       </w:pPr>
+      <w:proofErr w:type="spellStart"/>
       <w:r>
         <w:rPr>
           <w:rFonts w:ascii="HelveticaNeueLT Pro 55 Roman" w:hAnsi="HelveticaNeueLT Pro 55 Roman"/>
@@ -2247,12 +2409,61 @@
         </w:rPr>
         <w:t>hermes-webui</w:t>
       </w:r>
-      <w:r>
-        <w:rPr>
-          <w:rFonts w:ascii="HelveticaNeueLT Pro 55 Roman" w:hAnsi="HelveticaNeueLT Pro 55 Roman"/>
-          <w:sz w:val="18"/>
-        </w:rPr>
-        <w:t xml:space="preserve">  ·  github.com/nesquena/hermes-webui (14K+ stars)  ·  </w:t>
+      <w:proofErr w:type="spellEnd"/>
+      <w:r>
+        <w:rPr>
+          <w:rFonts w:ascii="HelveticaNeueLT Pro 55 Roman" w:hAnsi="HelveticaNeueLT Pro 55 Roman"/>
+          <w:sz w:val="18"/>
+        </w:rPr>
+        <w:t xml:space="preserve">  ·  github.com/</w:t>
+      </w:r>
+      <w:proofErr w:type="spellStart"/>
+      <w:r>
+        <w:rPr>
+          <w:rFonts w:ascii="HelveticaNeueLT Pro 55 Roman" w:hAnsi="HelveticaNeueLT Pro 55 Roman"/>
+          <w:sz w:val="18"/>
+        </w:rPr>
+        <w:t>nesquena</w:t>
+      </w:r>
+      <w:proofErr w:type="spellEnd"/>
+      <w:r>
+        <w:rPr>
+          <w:rFonts w:ascii="HelveticaNeueLT Pro 55 Roman" w:hAnsi="HelveticaNeueLT Pro 55 Roman"/>
+          <w:sz w:val="18"/>
+        </w:rPr>
+        <w:t>/</w:t>
+      </w:r>
+      <w:proofErr w:type="spellStart"/>
+      <w:r>
+        <w:rPr>
+          <w:rFonts w:ascii="HelveticaNeueLT Pro 55 Roman" w:hAnsi="HelveticaNeueLT Pro 55 Roman"/>
+          <w:sz w:val="18"/>
+        </w:rPr>
+        <w:t>hermes-webui</w:t>
+      </w:r>
+      <w:proofErr w:type="spellEnd"/>
+      <w:r>
+        <w:rPr>
+          <w:rFonts w:ascii="HelveticaNeueLT Pro 55 Roman" w:hAnsi="HelveticaNeueLT Pro 55 Roman"/>
+          <w:sz w:val="18"/>
+        </w:rPr>
+        <w:t xml:space="preserve"> (14K+ </w:t>
+      </w:r>
+      <w:proofErr w:type="gramStart"/>
+      <w:r>
+        <w:rPr>
+          <w:rFonts w:ascii="HelveticaNeueLT Pro 55 Roman" w:hAnsi="HelveticaNeueLT Pro 55 Roman"/>
+          <w:sz w:val="18"/>
+        </w:rPr>
+        <w:t xml:space="preserve">stars)  · </w:t>
+      </w:r>
+      <w:proofErr w:type="gramEnd"/>
+      <w:r>
+        <w:rPr>
+          <w:rFonts w:ascii="HelveticaNeueLT Pro 55 Roman" w:hAnsi="HelveticaNeueLT Pro 55 Roman"/>
+          <w:sz w:val="18"/>
+        </w:rPr>
+        <w:t xml:space="preserve"> </w:t>
       </w:r>
       <w:r>
         <w:rPr>
@@ -2276,7 +2487,103 @@
           <w:sz w:val="22"/>
           <w:szCs w:val="22"/>
         </w:rPr>
-        <w:t xml:space="preserve"> contributor. Agent UX, streaming behavior, provider infrastructure, session recovery, cross-platform support.</w:t>
+        <w:t xml:space="preserve"> contributor. </w:t>
+      </w:r>
+      <w:r>
+        <w:rPr>
+          <w:rFonts w:ascii="HelveticaNeueLT Pro 55 Roman" w:hAnsi="HelveticaNeueLT Pro 55 Roman"/>
+          <w:sz w:val="22"/>
+          <w:szCs w:val="22"/>
+        </w:rPr>
+        <w:t>S</w:t>
+      </w:r>
+      <w:r>
+        <w:rPr>
+          <w:rFonts w:ascii="HelveticaNeueLT Pro 55 Roman" w:hAnsi="HelveticaNeueLT Pro 55 Roman"/>
+          <w:sz w:val="22"/>
+          <w:szCs w:val="22"/>
+        </w:rPr>
+        <w:t xml:space="preserve">treaming </w:t>
+      </w:r>
+      <w:r>
+        <w:rPr>
+          <w:rFonts w:ascii="HelveticaNeueLT Pro 55 Roman" w:hAnsi="HelveticaNeueLT Pro 55 Roman"/>
+          <w:sz w:val="22"/>
+          <w:szCs w:val="22"/>
+        </w:rPr>
+        <w:t>performance</w:t>
+      </w:r>
+      <w:r>
+        <w:rPr>
+          <w:rFonts w:ascii="HelveticaNeueLT Pro 55 Roman" w:hAnsi="HelveticaNeueLT Pro 55 Roman"/>
+          <w:sz w:val="22"/>
+          <w:szCs w:val="22"/>
+        </w:rPr>
+        <w:t xml:space="preserve">, provider </w:t>
+      </w:r>
+      <w:r>
+        <w:rPr>
+          <w:rFonts w:ascii="HelveticaNeueLT Pro 55 Roman" w:hAnsi="HelveticaNeueLT Pro 55 Roman"/>
+          <w:sz w:val="22"/>
+          <w:szCs w:val="22"/>
+        </w:rPr>
+        <w:t>routing</w:t>
+      </w:r>
+      <w:r>
+        <w:rPr>
+          <w:rFonts w:ascii="HelveticaNeueLT Pro 55 Roman" w:hAnsi="HelveticaNeueLT Pro 55 Roman"/>
+          <w:sz w:val="22"/>
+          <w:szCs w:val="22"/>
+        </w:rPr>
+        <w:t xml:space="preserve">, session </w:t>
+      </w:r>
+      <w:r>
+        <w:rPr>
+          <w:rFonts w:ascii="HelveticaNeueLT Pro 55 Roman" w:hAnsi="HelveticaNeueLT Pro 55 Roman"/>
+          <w:sz w:val="22"/>
+          <w:szCs w:val="22"/>
+        </w:rPr>
+        <w:t>lifecycle</w:t>
+      </w:r>
+      <w:r>
+        <w:rPr>
+          <w:rFonts w:ascii="HelveticaNeueLT Pro 55 Roman" w:hAnsi="HelveticaNeueLT Pro 55 Roman"/>
+          <w:sz w:val="22"/>
+          <w:szCs w:val="22"/>
+        </w:rPr>
+        <w:t>,</w:t>
+      </w:r>
+      <w:r>
+        <w:rPr>
+          <w:rFonts w:ascii="HelveticaNeueLT Pro 55 Roman" w:hAnsi="HelveticaNeueLT Pro 55 Roman"/>
+          <w:sz w:val="22"/>
+          <w:szCs w:val="22"/>
+        </w:rPr>
+        <w:t xml:space="preserve"> workspace, security,</w:t>
+      </w:r>
+      <w:r>
+        <w:rPr>
+          <w:rFonts w:ascii="HelveticaNeueLT Pro 55 Roman" w:hAnsi="HelveticaNeueLT Pro 55 Roman"/>
+          <w:sz w:val="22"/>
+          <w:szCs w:val="22"/>
+        </w:rPr>
+        <w:t xml:space="preserve"> </w:t>
+      </w:r>
+      <w:r>
+        <w:rPr>
+          <w:rFonts w:ascii="HelveticaNeueLT Pro 55 Roman" w:hAnsi="HelveticaNeueLT Pro 55 Roman"/>
+          <w:sz w:val="22"/>
+          <w:szCs w:val="22"/>
+        </w:rPr>
+        <w:t>Windows</w:t>
+      </w:r>
+      <w:r>
+        <w:rPr>
+          <w:rFonts w:ascii="HelveticaNeueLT Pro 55 Roman" w:hAnsi="HelveticaNeueLT Pro 55 Roman"/>
+          <w:sz w:val="22"/>
+          <w:szCs w:val="22"/>
+        </w:rPr>
+        <w:t xml:space="preserve"> support.</w:t>
       </w:r>
     </w:p>
     <w:p>
@@ -2299,20 +2606,62 @@
           <w:szCs w:val="22"/>
         </w:rPr>
       </w:pPr>
+      <w:proofErr w:type="spellStart"/>
       <w:r>
         <w:rPr>
           <w:rFonts w:ascii="HelveticaNeueLT Pro 55 Roman" w:hAnsi="HelveticaNeueLT Pro 55 Roman"/>
           <w:b/>
           <w:sz w:val="22"/>
         </w:rPr>
-        <w:t>claude-mem</w:t>
-      </w:r>
-      <w:r>
-        <w:rPr>
-          <w:rFonts w:ascii="HelveticaNeueLT Pro 55 Roman" w:hAnsi="HelveticaNeueLT Pro 55 Roman"/>
-          <w:sz w:val="18"/>
-        </w:rPr>
-        <w:t xml:space="preserve">  ·  github.com/thedotmack/claude-mem (</w:t>
+        <w:t>claude</w:t>
+      </w:r>
+      <w:proofErr w:type="spellEnd"/>
+      <w:r>
+        <w:rPr>
+          <w:rFonts w:ascii="HelveticaNeueLT Pro 55 Roman" w:hAnsi="HelveticaNeueLT Pro 55 Roman"/>
+          <w:b/>
+          <w:sz w:val="22"/>
+        </w:rPr>
+        <w:t>-mem</w:t>
+      </w:r>
+      <w:r>
+        <w:rPr>
+          <w:rFonts w:ascii="HelveticaNeueLT Pro 55 Roman" w:hAnsi="HelveticaNeueLT Pro 55 Roman"/>
+          <w:sz w:val="18"/>
+        </w:rPr>
+        <w:t xml:space="preserve">  ·  github.com/</w:t>
+      </w:r>
+      <w:proofErr w:type="spellStart"/>
+      <w:r>
+        <w:rPr>
+          <w:rFonts w:ascii="HelveticaNeueLT Pro 55 Roman" w:hAnsi="HelveticaNeueLT Pro 55 Roman"/>
+          <w:sz w:val="18"/>
+        </w:rPr>
+        <w:t>thedotmack</w:t>
+      </w:r>
+      <w:proofErr w:type="spellEnd"/>
+      <w:r>
+        <w:rPr>
+          <w:rFonts w:ascii="HelveticaNeueLT Pro 55 Roman" w:hAnsi="HelveticaNeueLT Pro 55 Roman"/>
+          <w:sz w:val="18"/>
+        </w:rPr>
+        <w:t>/</w:t>
+      </w:r>
+      <w:proofErr w:type="spellStart"/>
+      <w:r>
+        <w:rPr>
+          <w:rFonts w:ascii="HelveticaNeueLT Pro 55 Roman" w:hAnsi="HelveticaNeueLT Pro 55 Roman"/>
+          <w:sz w:val="18"/>
+        </w:rPr>
+        <w:t>claude</w:t>
+      </w:r>
+      <w:proofErr w:type="spellEnd"/>
+      <w:r>
+        <w:rPr>
+          <w:rFonts w:ascii="HelveticaNeueLT Pro 55 Roman" w:hAnsi="HelveticaNeueLT Pro 55 Roman"/>
+          <w:sz w:val="18"/>
+        </w:rPr>
+        <w:t>-mem (</w:t>
       </w:r>
       <w:r>
         <w:rPr>
@@ -2326,14 +2675,30 @@
           <w:rFonts w:ascii="HelveticaNeueLT Pro 55 Roman" w:hAnsi="HelveticaNeueLT Pro 55 Roman"/>
           <w:sz w:val="18"/>
         </w:rPr>
-        <w:t>K+ stars)</w:t>
-      </w:r>
-      <w:r>
-        <w:rPr>
-          <w:rFonts w:ascii="HelveticaNeueLT Pro 55 Roman" w:hAnsi="HelveticaNeueLT Pro 55 Roman"/>
-          <w:sz w:val="18"/>
-        </w:rPr>
-        <w:t xml:space="preserve">  ·  </w:t>
+        <w:t xml:space="preserve">K+ </w:t>
+      </w:r>
+      <w:proofErr w:type="gramStart"/>
+      <w:r>
+        <w:rPr>
+          <w:rFonts w:ascii="HelveticaNeueLT Pro 55 Roman" w:hAnsi="HelveticaNeueLT Pro 55 Roman"/>
+          <w:sz w:val="18"/>
+        </w:rPr>
+        <w:t>stars)</w:t>
+      </w:r>
+      <w:r>
+        <w:rPr>
+          <w:rFonts w:ascii="HelveticaNeueLT Pro 55 Roman" w:hAnsi="HelveticaNeueLT Pro 55 Roman"/>
+          <w:sz w:val="18"/>
+        </w:rPr>
+        <w:t xml:space="preserve">  · </w:t>
+      </w:r>
+      <w:proofErr w:type="gramEnd"/>
+      <w:r>
+        <w:rPr>
+          <w:rFonts w:ascii="HelveticaNeueLT Pro 55 Roman" w:hAnsi="HelveticaNeueLT Pro 55 Roman"/>
+          <w:sz w:val="18"/>
+        </w:rPr>
+        <w:t xml:space="preserve"> </w:t>
       </w:r>
       <w:r>
         <w:rPr>
@@ -2350,24 +2715,58 @@
         <w:rPr>
           <w:rFonts w:ascii="HelveticaNeueLT Pro 55 Roman" w:hAnsi="HelveticaNeueLT Pro 55 Roman" w:cs="Arial"/>
           <w:sz w:val="22"/>
-          <w:szCs w:val="22"/>
-        </w:rPr>
-      </w:pPr>
-      <w:r>
-        <w:rPr>
-          <w:rFonts w:ascii="HelveticaNeueLT Pro 55 Roman" w:hAnsi="HelveticaNeueLT Pro 55 Roman" w:cs="Arial"/>
-          <w:sz w:val="22"/>
-          <w:szCs w:val="20"/>
-        </w:rPr>
-        <w:t>Top-5</w:t>
-      </w:r>
-      <w:r>
-        <w:rPr>
-          <w:rFonts w:ascii="HelveticaNeueLT Pro 55 Roman" w:hAnsi="HelveticaNeueLT Pro 55 Roman" w:cs="Arial"/>
-          <w:sz w:val="22"/>
-          <w:szCs w:val="20"/>
-        </w:rPr>
-        <w:t xml:space="preserve"> contributor: s</w:t>
+          <w:szCs w:val="20"/>
+        </w:rPr>
+      </w:pPr>
+      <w:r>
+        <w:rPr>
+          <w:rFonts w:ascii="HelveticaNeueLT Pro 55 Roman" w:hAnsi="HelveticaNeueLT Pro 55 Roman" w:cs="Arial"/>
+          <w:sz w:val="22"/>
+          <w:szCs w:val="20"/>
+        </w:rPr>
+        <w:t>Top</w:t>
+      </w:r>
+      <w:r>
+        <w:rPr>
+          <w:rFonts w:ascii="HelveticaNeueLT Pro 55 Roman" w:hAnsi="HelveticaNeueLT Pro 55 Roman" w:cs="Arial"/>
+          <w:sz w:val="22"/>
+          <w:szCs w:val="20"/>
+        </w:rPr>
+        <w:t xml:space="preserve"> </w:t>
+      </w:r>
+      <w:r>
+        <w:rPr>
+          <w:rFonts w:ascii="HelveticaNeueLT Pro 55 Roman" w:hAnsi="HelveticaNeueLT Pro 55 Roman" w:cs="Arial"/>
+          <w:sz w:val="22"/>
+          <w:szCs w:val="20"/>
+        </w:rPr>
+        <w:t>5</w:t>
+      </w:r>
+      <w:r>
+        <w:rPr>
+          <w:rFonts w:ascii="HelveticaNeueLT Pro 55 Roman" w:hAnsi="HelveticaNeueLT Pro 55 Roman" w:cs="Arial"/>
+          <w:sz w:val="22"/>
+          <w:szCs w:val="20"/>
+        </w:rPr>
+        <w:t xml:space="preserve"> </w:t>
+      </w:r>
+      <w:proofErr w:type="gramStart"/>
+      <w:r>
+        <w:rPr>
+          <w:rFonts w:ascii="HelveticaNeueLT Pro 55 Roman" w:hAnsi="HelveticaNeueLT Pro 55 Roman" w:cs="Arial"/>
+          <w:sz w:val="22"/>
+          <w:szCs w:val="20"/>
+        </w:rPr>
+        <w:t>contributor</w:t>
+      </w:r>
+      <w:proofErr w:type="gramEnd"/>
+      <w:r>
+        <w:rPr>
+          <w:rFonts w:ascii="HelveticaNeueLT Pro 55 Roman" w:hAnsi="HelveticaNeueLT Pro 55 Roman" w:cs="Arial"/>
+          <w:sz w:val="22"/>
+          <w:szCs w:val="20"/>
+        </w:rPr>
+        <w:t>: s</w:t>
       </w:r>
       <w:r>
         <w:rPr>
@@ -2481,6 +2880,180 @@
         </w:rPr>
         <w:t>.</w:t>
       </w:r>
+    </w:p>
+    <w:p>
+      <w:pPr>
+        <w:spacing w:line="120" w:lineRule="auto"/>
+        <w:rPr>
+          <w:rFonts w:ascii="HelveticaNeueLT Pro 55 Roman" w:hAnsi="HelveticaNeueLT Pro 55 Roman"/>
+          <w:b/>
+          <w:sz w:val="10"/>
+          <w:szCs w:val="10"/>
+        </w:rPr>
+      </w:pPr>
+    </w:p>
+    <w:p>
+      <w:pPr>
+        <w:spacing w:before="60" w:line="276" w:lineRule="auto"/>
+        <w:rPr>
+          <w:rFonts w:ascii="HelveticaNeueLT Pro 55 Roman" w:hAnsi="HelveticaNeueLT Pro 55 Roman"/>
+          <w:sz w:val="22"/>
+          <w:szCs w:val="22"/>
+        </w:rPr>
+      </w:pPr>
+      <w:proofErr w:type="spellStart"/>
+      <w:r>
+        <w:rPr>
+          <w:rFonts w:ascii="HelveticaNeueLT Pro 55 Roman" w:hAnsi="HelveticaNeueLT Pro 55 Roman"/>
+          <w:b/>
+          <w:sz w:val="22"/>
+        </w:rPr>
+        <w:t>agentsview</w:t>
+      </w:r>
+      <w:proofErr w:type="spellEnd"/>
+      <w:r>
+        <w:rPr>
+          <w:rFonts w:ascii="HelveticaNeueLT Pro 55 Roman" w:hAnsi="HelveticaNeueLT Pro 55 Roman"/>
+          <w:sz w:val="18"/>
+        </w:rPr>
+        <w:t xml:space="preserve">  ·  github.com/</w:t>
+      </w:r>
+      <w:proofErr w:type="spellStart"/>
+      <w:r>
+        <w:rPr>
+          <w:rFonts w:ascii="HelveticaNeueLT Pro 55 Roman" w:hAnsi="HelveticaNeueLT Pro 55 Roman"/>
+          <w:sz w:val="18"/>
+        </w:rPr>
+        <w:t>thedotmack</w:t>
+      </w:r>
+      <w:proofErr w:type="spellEnd"/>
+      <w:r>
+        <w:rPr>
+          <w:rFonts w:ascii="HelveticaNeueLT Pro 55 Roman" w:hAnsi="HelveticaNeueLT Pro 55 Roman"/>
+          <w:sz w:val="18"/>
+        </w:rPr>
+        <w:t>/</w:t>
+      </w:r>
+      <w:proofErr w:type="spellStart"/>
+      <w:r>
+        <w:rPr>
+          <w:rFonts w:ascii="HelveticaNeueLT Pro 55 Roman" w:hAnsi="HelveticaNeueLT Pro 55 Roman"/>
+          <w:sz w:val="18"/>
+        </w:rPr>
+        <w:t>claude</w:t>
+      </w:r>
+      <w:proofErr w:type="spellEnd"/>
+      <w:r>
+        <w:rPr>
+          <w:rFonts w:ascii="HelveticaNeueLT Pro 55 Roman" w:hAnsi="HelveticaNeueLT Pro 55 Roman"/>
+          <w:sz w:val="18"/>
+        </w:rPr>
+        <w:t xml:space="preserve">-mem (80K+ </w:t>
+      </w:r>
+      <w:proofErr w:type="gramStart"/>
+      <w:r>
+        <w:rPr>
+          <w:rFonts w:ascii="HelveticaNeueLT Pro 55 Roman" w:hAnsi="HelveticaNeueLT Pro 55 Roman"/>
+          <w:sz w:val="18"/>
+        </w:rPr>
+        <w:t xml:space="preserve">stars)  · </w:t>
+      </w:r>
+      <w:proofErr w:type="gramEnd"/>
+      <w:r>
+        <w:rPr>
+          <w:rFonts w:ascii="HelveticaNeueLT Pro 55 Roman" w:hAnsi="HelveticaNeueLT Pro 55 Roman"/>
+          <w:sz w:val="18"/>
+        </w:rPr>
+        <w:t xml:space="preserve"> </w:t>
+      </w:r>
+      <w:proofErr w:type="gramStart"/>
+      <w:r>
+        <w:rPr>
+          <w:rFonts w:ascii="HelveticaNeueLT Pro 55 Roman" w:hAnsi="HelveticaNeueLT Pro 55 Roman"/>
+          <w:sz w:val="22"/>
+          <w:szCs w:val="22"/>
+        </w:rPr>
+        <w:t>Multi-session</w:t>
+      </w:r>
+      <w:proofErr w:type="gramEnd"/>
+      <w:r>
+        <w:rPr>
+          <w:rFonts w:ascii="HelveticaNeueLT Pro 55 Roman" w:hAnsi="HelveticaNeueLT Pro 55 Roman"/>
+          <w:sz w:val="22"/>
+          <w:szCs w:val="22"/>
+        </w:rPr>
+        <w:t xml:space="preserve"> viewer for AI coding tools</w:t>
+      </w:r>
+      <w:r>
+        <w:rPr>
+          <w:rFonts w:ascii="HelveticaNeueLT Pro 55 Roman" w:hAnsi="HelveticaNeueLT Pro 55 Roman"/>
+          <w:sz w:val="22"/>
+          <w:szCs w:val="22"/>
+        </w:rPr>
+        <w:t>.</w:t>
+      </w:r>
+    </w:p>
+    <w:p>
+      <w:pPr>
+        <w:spacing w:line="264" w:lineRule="auto"/>
+        <w:rPr>
+          <w:rFonts w:ascii="HelveticaNeueLT Pro 55 Roman" w:hAnsi="HelveticaNeueLT Pro 55 Roman" w:cs="Arial"/>
+          <w:sz w:val="22"/>
+          <w:szCs w:val="22"/>
+        </w:rPr>
+      </w:pPr>
+      <w:r>
+        <w:rPr>
+          <w:rFonts w:ascii="HelveticaNeueLT Pro 55 Roman" w:hAnsi="HelveticaNeueLT Pro 55 Roman" w:cs="Arial"/>
+          <w:sz w:val="22"/>
+          <w:szCs w:val="20"/>
+        </w:rPr>
+        <w:t xml:space="preserve">Postgres sync safety, orphan session recovery, </w:t>
+      </w:r>
+      <w:proofErr w:type="spellStart"/>
+      <w:r>
+        <w:rPr>
+          <w:rFonts w:ascii="HelveticaNeueLT Pro 55 Roman" w:hAnsi="HelveticaNeueLT Pro 55 Roman" w:cs="Arial"/>
+          <w:sz w:val="22"/>
+          <w:szCs w:val="20"/>
+        </w:rPr>
+        <w:t>OpenCode</w:t>
+      </w:r>
+      <w:proofErr w:type="spellEnd"/>
+      <w:r>
+        <w:rPr>
+          <w:rFonts w:ascii="HelveticaNeueLT Pro 55 Roman" w:hAnsi="HelveticaNeueLT Pro 55 Roman" w:cs="Arial"/>
+          <w:sz w:val="22"/>
+          <w:szCs w:val="20"/>
+        </w:rPr>
+        <w:t xml:space="preserve"> and </w:t>
+      </w:r>
+      <w:proofErr w:type="spellStart"/>
+      <w:r>
+        <w:rPr>
+          <w:rFonts w:ascii="HelveticaNeueLT Pro 55 Roman" w:hAnsi="HelveticaNeueLT Pro 55 Roman" w:cs="Arial"/>
+          <w:sz w:val="22"/>
+          <w:szCs w:val="20"/>
+        </w:rPr>
+        <w:t>Reasonix</w:t>
+      </w:r>
+      <w:proofErr w:type="spellEnd"/>
+      <w:r>
+        <w:rPr>
+          <w:rFonts w:ascii="HelveticaNeueLT Pro 55 Roman" w:hAnsi="HelveticaNeueLT Pro 55 Roman" w:cs="Arial"/>
+          <w:sz w:val="22"/>
+          <w:szCs w:val="20"/>
+        </w:rPr>
+        <w:t xml:space="preserve"> parser support.</w:t>
+      </w:r>
+    </w:p>
+    <w:p>
+      <w:pPr>
+        <w:spacing w:line="264" w:lineRule="auto"/>
+        <w:rPr>
+          <w:rFonts w:ascii="HelveticaNeueLT Pro 55 Roman" w:hAnsi="HelveticaNeueLT Pro 55 Roman" w:cs="Arial"/>
+        </w:rPr>
+      </w:pPr>
     </w:p>
     <w:tbl>
       <w:tblPr>
@@ -2515,7 +3088,6 @@
                 <w:b/>
                 <w:color w:val="999999"/>
               </w:rPr>
-              <w:lastRenderedPageBreak/>
               <w:t>SKILLS</w:t>
             </w:r>
           </w:p>
@@ -2617,8 +3189,39 @@
                 <w:sz w:val="20"/>
                 <w:szCs w:val="20"/>
               </w:rPr>
-              <w:t>, Anthropic API, MCP, REST APIs, GraphQL, WPGraphQL</w:t>
-            </w:r>
+              <w:t xml:space="preserve">, Anthropic API, MCP, REST APIs, </w:t>
+            </w:r>
+            <w:proofErr w:type="spellStart"/>
+            <w:r>
+              <w:rPr>
+                <w:rFonts w:ascii="HelveticaNeueLT Pro 55 Roman" w:hAnsi="HelveticaNeueLT Pro 55 Roman"/>
+                <w:bCs/>
+                <w:sz w:val="20"/>
+                <w:szCs w:val="20"/>
+              </w:rPr>
+              <w:t>GraphQL</w:t>
+            </w:r>
+            <w:proofErr w:type="spellEnd"/>
+            <w:r>
+              <w:rPr>
+                <w:rFonts w:ascii="HelveticaNeueLT Pro 55 Roman" w:hAnsi="HelveticaNeueLT Pro 55 Roman"/>
+                <w:bCs/>
+                <w:sz w:val="20"/>
+                <w:szCs w:val="20"/>
+              </w:rPr>
+              <w:t xml:space="preserve">, </w:t>
+            </w:r>
+            <w:proofErr w:type="spellStart"/>
+            <w:r>
+              <w:rPr>
+                <w:rFonts w:ascii="HelveticaNeueLT Pro 55 Roman" w:hAnsi="HelveticaNeueLT Pro 55 Roman"/>
+                <w:bCs/>
+                <w:sz w:val="20"/>
+                <w:szCs w:val="20"/>
+              </w:rPr>
+              <w:t>WPGraphQL</w:t>
+            </w:r>
+            <w:proofErr w:type="spellEnd"/>
           </w:p>
           <w:p>
             <w:pPr>
@@ -2692,7 +3295,47 @@
                 <w:sz w:val="20"/>
                 <w:szCs w:val="20"/>
               </w:rPr>
-              <w:t>Firebase, SQL Server, MongoDB, Leaflet/Mapbox, Turf.js, Vite, Vercel, Netlify, Cloudflare</w:t>
+              <w:t>Firebase, SQL Server, MongoDB, Leaflet/</w:t>
+            </w:r>
+            <w:proofErr w:type="spellStart"/>
+            <w:r>
+              <w:rPr>
+                <w:rFonts w:ascii="HelveticaNeueLT Pro 55 Roman" w:hAnsi="HelveticaNeueLT Pro 55 Roman"/>
+                <w:bCs/>
+                <w:sz w:val="20"/>
+                <w:szCs w:val="20"/>
+              </w:rPr>
+              <w:t>Mapbox</w:t>
+            </w:r>
+            <w:proofErr w:type="spellEnd"/>
+            <w:r>
+              <w:rPr>
+                <w:rFonts w:ascii="HelveticaNeueLT Pro 55 Roman" w:hAnsi="HelveticaNeueLT Pro 55 Roman"/>
+                <w:bCs/>
+                <w:sz w:val="20"/>
+                <w:szCs w:val="20"/>
+              </w:rPr>
+              <w:t xml:space="preserve">, Turf.js, Vite, </w:t>
+            </w:r>
+            <w:proofErr w:type="spellStart"/>
+            <w:r>
+              <w:rPr>
+                <w:rFonts w:ascii="HelveticaNeueLT Pro 55 Roman" w:hAnsi="HelveticaNeueLT Pro 55 Roman"/>
+                <w:bCs/>
+                <w:sz w:val="20"/>
+                <w:szCs w:val="20"/>
+              </w:rPr>
+              <w:t>Vercel</w:t>
+            </w:r>
+            <w:proofErr w:type="spellEnd"/>
+            <w:r>
+              <w:rPr>
+                <w:rFonts w:ascii="HelveticaNeueLT Pro 55 Roman" w:hAnsi="HelveticaNeueLT Pro 55 Roman"/>
+                <w:bCs/>
+                <w:sz w:val="20"/>
+                <w:szCs w:val="20"/>
+              </w:rPr>
+              <w:t>, Netlify, Cloudflare</w:t>
             </w:r>
           </w:p>
           <w:p>
@@ -2796,38 +3439,40 @@
           </w:tcPr>
           <w:p>
             <w:pPr>
-              <w:spacing w:line="264" w:lineRule="auto"/>
-              <w:rPr>
-                <w:rFonts w:ascii="HelveticaNeueLT Pro 55 Roman" w:hAnsi="HelveticaNeueLT Pro 55 Roman" w:cs="Arial"/>
-                <w:sz w:val="32"/>
-                <w:szCs w:val="32"/>
+              <w:spacing w:before="100" w:beforeAutospacing="1" w:line="264" w:lineRule="auto"/>
+              <w:rPr>
+                <w:rFonts w:ascii="HelveticaNeueLT Pro 55 Roman" w:hAnsi="HelveticaNeueLT Pro 55 Roman" w:cs="Arial"/>
               </w:rPr>
             </w:pPr>
             <w:r>
               <w:rPr>
                 <w:rFonts w:ascii="HelveticaNeueLT Pro 55 Roman" w:hAnsi="HelveticaNeueLT Pro 55 Roman" w:cs="Arial"/>
-                <w:sz w:val="32"/>
-                <w:szCs w:val="32"/>
               </w:rPr>
               <w:t>University of Virginia</w:t>
             </w:r>
-          </w:p>
-          <w:p>
-            <w:pPr>
-              <w:spacing w:before="80" w:after="160" w:line="264" w:lineRule="auto"/>
+            <w:r>
               <w:rPr>
                 <w:rFonts w:ascii="HelveticaNeueLT Pro 55 Roman" w:hAnsi="HelveticaNeueLT Pro 55 Roman" w:cs="Arial"/>
                 <w:sz w:val="20"/>
                 <w:szCs w:val="20"/>
               </w:rPr>
-            </w:pPr>
+              <w:t xml:space="preserve"> </w:t>
+            </w:r>
             <w:r>
               <w:rPr>
                 <w:rFonts w:ascii="HelveticaNeueLT Pro 55 Roman" w:hAnsi="HelveticaNeueLT Pro 55 Roman" w:cs="Arial"/>
                 <w:sz w:val="20"/>
                 <w:szCs w:val="20"/>
               </w:rPr>
-              <w:t>Doctoral studies, Molecular Medicine (Physiology, Pharmacology, Pathology)</w:t>
+              <w:t xml:space="preserve">  |   </w:t>
+            </w:r>
+            <w:r>
+              <w:rPr>
+                <w:rFonts w:ascii="HelveticaNeueLT Pro 55 Roman" w:hAnsi="HelveticaNeueLT Pro 55 Roman" w:cs="Arial"/>
+                <w:sz w:val="20"/>
+                <w:szCs w:val="20"/>
+              </w:rPr>
+              <w:t>Doctoral studies, Molecular Medicine</w:t>
             </w:r>
           </w:p>
         </w:tc>
@@ -2846,7 +3491,7 @@
           </w:tcPr>
           <w:p>
             <w:pPr>
-              <w:spacing w:before="35"/>
+              <w:spacing w:before="100" w:beforeAutospacing="1"/>
               <w:jc w:val="right"/>
               <w:rPr>
                 <w:rFonts w:ascii="HelveticaNeueLT Pro 55 Roman" w:hAnsi="HelveticaNeueLT Pro 55 Roman" w:cs="Arial"/>
@@ -2890,31 +3535,33 @@
           </w:tcPr>
           <w:p>
             <w:pPr>
-              <w:spacing w:line="264" w:lineRule="auto"/>
-              <w:rPr>
-                <w:rFonts w:ascii="HelveticaNeueLT Pro 55 Roman" w:hAnsi="HelveticaNeueLT Pro 55 Roman" w:cs="Arial"/>
-                <w:sz w:val="32"/>
-                <w:szCs w:val="32"/>
+              <w:spacing w:before="100" w:beforeAutospacing="1" w:line="264" w:lineRule="auto"/>
+              <w:rPr>
+                <w:rFonts w:ascii="HelveticaNeueLT Pro 55 Roman" w:hAnsi="HelveticaNeueLT Pro 55 Roman" w:cs="Arial"/>
               </w:rPr>
             </w:pPr>
             <w:r>
               <w:rPr>
                 <w:rFonts w:ascii="HelveticaNeueLT Pro 55 Roman" w:hAnsi="HelveticaNeueLT Pro 55 Roman" w:cs="Arial"/>
-                <w:sz w:val="32"/>
-                <w:szCs w:val="32"/>
               </w:rPr>
               <w:t>Stony Brook University</w:t>
             </w:r>
-          </w:p>
-          <w:p>
-            <w:pPr>
-              <w:spacing w:before="80" w:after="160" w:line="264" w:lineRule="auto"/>
+            <w:r>
               <w:rPr>
                 <w:rFonts w:ascii="HelveticaNeueLT Pro 55 Roman" w:hAnsi="HelveticaNeueLT Pro 55 Roman" w:cs="Arial"/>
                 <w:sz w:val="20"/>
                 <w:szCs w:val="20"/>
               </w:rPr>
-            </w:pPr>
+              <w:t xml:space="preserve"> </w:t>
+            </w:r>
+            <w:r>
+              <w:rPr>
+                <w:rFonts w:ascii="HelveticaNeueLT Pro 55 Roman" w:hAnsi="HelveticaNeueLT Pro 55 Roman" w:cs="Arial"/>
+                <w:sz w:val="20"/>
+                <w:szCs w:val="20"/>
+              </w:rPr>
+              <w:t xml:space="preserve">  |   </w:t>
+            </w:r>
             <w:r>
               <w:rPr>
                 <w:rFonts w:ascii="HelveticaNeueLT Pro 55 Roman" w:hAnsi="HelveticaNeueLT Pro 55 Roman" w:cs="Arial"/>
@@ -2937,7 +3584,7 @@
           </w:tcPr>
           <w:p>
             <w:pPr>
-              <w:spacing w:before="50"/>
+              <w:spacing w:before="100" w:beforeAutospacing="1"/>
               <w:jc w:val="right"/>
               <w:rPr>
                 <w:rFonts w:ascii="HelveticaNeueLT Pro 55 Roman" w:hAnsi="HelveticaNeueLT Pro 55 Roman" w:cs="Arial"/>
@@ -2971,18 +3618,14 @@
           </w:tcPr>
           <w:p>
             <w:pPr>
-              <w:spacing w:line="264" w:lineRule="auto"/>
-              <w:rPr>
-                <w:rFonts w:ascii="HelveticaNeueLT Pro 55 Roman" w:hAnsi="HelveticaNeueLT Pro 55 Roman" w:cs="Arial"/>
-                <w:sz w:val="32"/>
-                <w:szCs w:val="32"/>
+              <w:spacing w:before="100" w:beforeAutospacing="1" w:line="264" w:lineRule="auto"/>
+              <w:rPr>
+                <w:rFonts w:ascii="HelveticaNeueLT Pro 55 Roman" w:hAnsi="HelveticaNeueLT Pro 55 Roman" w:cs="Arial"/>
               </w:rPr>
             </w:pPr>
             <w:r>
               <w:rPr>
                 <w:rFonts w:ascii="HelveticaNeueLT Pro 55 Roman" w:hAnsi="HelveticaNeueLT Pro 55 Roman" w:cs="Arial"/>
-                <w:sz w:val="32"/>
-                <w:szCs w:val="32"/>
               </w:rPr>
               <w:t>The Bronx High School of Science</w:t>
             </w:r>
@@ -3000,7 +3643,7 @@
           </w:tcPr>
           <w:p>
             <w:pPr>
-              <w:spacing w:before="35"/>
+              <w:spacing w:before="100" w:beforeAutospacing="1"/>
               <w:jc w:val="right"/>
               <w:rPr>
                 <w:rFonts w:ascii="HelveticaNeueLT Pro 55 Roman" w:hAnsi="HelveticaNeueLT Pro 55 Roman" w:cs="Arial"/>
@@ -3056,41 +3699,6 @@
         </w:tc>
       </w:tr>
     </w:tbl>
-    <w:p>
-      <w:pPr>
-        <w:spacing w:line="264" w:lineRule="auto"/>
-        <w:rPr>
-          <w:rFonts w:ascii="HelveticaNeueLT Pro 55 Roman" w:hAnsi="HelveticaNeueLT Pro 55 Roman" w:cs="Arial"/>
-          <w:sz w:val="22"/>
-          <w:szCs w:val="20"/>
-        </w:rPr>
-      </w:pPr>
-    </w:p>
-    <w:p>
-      <w:pPr>
-        <w:spacing w:line="264" w:lineRule="auto"/>
-        <w:jc w:val="right"/>
-        <w:rPr>
-          <w:rFonts w:ascii="HelveticaNeueLT Pro 55 Roman" w:hAnsi="HelveticaNeueLT Pro 55 Roman" w:cs="Arial"/>
-          <w:w w:val="1"/>
-          <w:sz w:val="2"/>
-          <w:szCs w:val="2"/>
-        </w:rPr>
-      </w:pPr>
-    </w:p>
-    <w:p>
-      <w:pPr>
-        <w:spacing w:line="264" w:lineRule="auto"/>
-        <w:jc w:val="right"/>
-        <w:rPr>
-          <w:rFonts w:ascii="HelveticaNeueLT Pro 55 Roman" w:hAnsi="HelveticaNeueLT Pro 55 Roman" w:cs="Arial"/>
-          <w:w w:val="1"/>
-          <w:sz w:val="2"/>
-          <w:szCs w:val="2"/>
-        </w:rPr>
-      </w:pPr>
-    </w:p>
-    <w:p/>
     <w:p/>
     <w:sectPr>
       <w:pgSz w:w="12240" w:h="15840" w:code="1"/>
@@ -4128,7 +4736,7 @@
   <w:style w:type="paragraph" w:default="1" w:styleId="Normal">
     <w:name w:val="Normal"/>
     <w:qFormat/>
-    <w:rsid w:val="00676321"/>
+    <w:rsid w:val="002330C4"/>
     <w:rPr>
       <w:sz w:val="24"/>
       <w:szCs w:val="24"/>

</xml_diff>

<commit_message>
Use pdftocairo for svg generation via GitHub Actions
</commit_message>
<xml_diff>
--- a/resume.docx
+++ b/resume.docx
@@ -441,25 +441,7 @@
                 <w:sz w:val="22"/>
                 <w:szCs w:val="20"/>
               </w:rPr>
-              <w:t xml:space="preserve">%+ acceptance. </w:t>
-            </w:r>
-            <w:proofErr w:type="gramStart"/>
-            <w:r>
-              <w:rPr>
-                <w:rFonts w:ascii="HelveticaNeueLT Pro 55 Roman" w:hAnsi="HelveticaNeueLT Pro 55 Roman" w:cs="Arial"/>
-                <w:sz w:val="22"/>
-                <w:szCs w:val="20"/>
-              </w:rPr>
-              <w:t>Top-5</w:t>
-            </w:r>
-            <w:proofErr w:type="gramEnd"/>
-            <w:r>
-              <w:rPr>
-                <w:rFonts w:ascii="HelveticaNeueLT Pro 55 Roman" w:hAnsi="HelveticaNeueLT Pro 55 Roman" w:cs="Arial"/>
-                <w:sz w:val="22"/>
-                <w:szCs w:val="20"/>
-              </w:rPr>
-              <w:t xml:space="preserve"> contributor to </w:t>
+              <w:t xml:space="preserve">%+ acceptance. Top-5 contributor to </w:t>
             </w:r>
             <w:proofErr w:type="spellStart"/>
             <w:r>
@@ -879,23 +861,29 @@
           <w:sz w:val="18"/>
         </w:rPr>
       </w:pPr>
-      <w:proofErr w:type="gramStart"/>
       <w:r>
         <w:rPr>
           <w:rFonts w:ascii="HelveticaNeueLT Pro 55 Roman" w:hAnsi="HelveticaNeueLT Pro 55 Roman"/>
           <w:b/>
           <w:sz w:val="22"/>
         </w:rPr>
-        <w:t>Open Source</w:t>
-      </w:r>
-      <w:proofErr w:type="gramEnd"/>
+        <w:t xml:space="preserve">Open Source </w:t>
+      </w:r>
       <w:r>
         <w:rPr>
           <w:rFonts w:ascii="HelveticaNeueLT Pro 55 Roman" w:hAnsi="HelveticaNeueLT Pro 55 Roman"/>
           <w:b/>
           <w:sz w:val="22"/>
         </w:rPr>
-        <w:t xml:space="preserve"> Agent Pipeline</w:t>
+        <w:t>Contribution</w:t>
+      </w:r>
+      <w:r>
+        <w:rPr>
+          <w:rFonts w:ascii="HelveticaNeueLT Pro 55 Roman" w:hAnsi="HelveticaNeueLT Pro 55 Roman"/>
+          <w:b/>
+          <w:sz w:val="22"/>
+        </w:rPr>
+        <w:t xml:space="preserve"> Pipeline</w:t>
       </w:r>
       <w:r>
         <w:rPr>

</xml_diff>

<commit_message>
Batch update: refactoring, stats update, resume copy
</commit_message>
<xml_diff>
--- a/resume.docx
+++ b/resume.docx
@@ -4,13 +4,14 @@
   <w:body>
     <w:tbl>
       <w:tblPr>
-        <w:tblW w:w="10170" w:type="dxa"/>
+        <w:tblW w:w="15351" w:type="dxa"/>
         <w:tblInd w:w="108" w:type="dxa"/>
         <w:tblLayout w:type="fixed"/>
         <w:tblLook w:val="0000" w:firstRow="0" w:lastRow="0" w:firstColumn="0" w:lastColumn="0" w:noHBand="0" w:noVBand="0"/>
       </w:tblPr>
       <w:tblGrid>
         <w:gridCol w:w="4989"/>
+        <w:gridCol w:w="5181"/>
         <w:gridCol w:w="5181"/>
       </w:tblGrid>
       <w:tr>
@@ -28,8 +29,30 @@
               <w:rPr>
                 <w:rFonts w:ascii="HelveticaNeueLT Pro 55 Roman" w:hAnsi="HelveticaNeueLT Pro 55 Roman" w:cs="Arial"/>
                 <w:position w:val="2"/>
-                <w:sz w:val="46"/>
-                <w:szCs w:val="46"/>
+                <w:sz w:val="32"/>
+                <w:szCs w:val="32"/>
+              </w:rPr>
+            </w:pPr>
+            <w:r>
+              <w:rPr>
+                <w:rFonts w:ascii="HelveticaNeueLT Pro 55 Roman" w:hAnsi="HelveticaNeueLT Pro 55 Roman" w:cs="Arial"/>
+                <w:position w:val="2"/>
+                <w:sz w:val="32"/>
+                <w:szCs w:val="32"/>
+              </w:rPr>
+              <w:t>Rod Boev</w:t>
+            </w:r>
+          </w:p>
+          <w:p>
+            <w:pPr>
+              <w:spacing w:before="50"/>
+              <w:ind w:hanging="115"/>
+              <w:rPr>
+                <w:rFonts w:ascii="HelveticaNeueLT Pro 55 Roman" w:hAnsi="HelveticaNeueLT Pro 55 Roman" w:cs="Arial"/>
+                <w:position w:val="4"/>
+                <w:sz w:val="18"/>
+                <w:szCs w:val="18"/>
+                <w:u w:val="single"/>
               </w:rPr>
             </w:pPr>
             <w:r>
@@ -37,11 +60,11 @@
                 <w:rFonts w:ascii="HelveticaNeueLT Pro 55 Roman" w:hAnsi="HelveticaNeueLT Pro 55 Roman" w:cs="Arial"/>
                 <w:noProof/>
                 <w:position w:val="2"/>
-                <w:sz w:val="46"/>
-                <w:szCs w:val="46"/>
+                <w:sz w:val="32"/>
+                <w:szCs w:val="32"/>
               </w:rPr>
               <w:pict w14:anchorId="39A1D4B1">
-                <v:group id="_x0000_s3081" editas="canvas" style="position:absolute;left:0;text-align:left;margin-left:-5pt;margin-top:27.05pt;width:41.4pt;height:11.4pt;z-index:1" coordsize="795,219">
+                <v:group id="_x0000_s3105" editas="canvas" style="position:absolute;margin-left:-5pt;margin-top:2.05pt;width:41.4pt;height:11.4pt;z-index:1" coordorigin="-100,541" coordsize="828,228">
                   <o:lock v:ext="edit" aspectratio="t"/>
                   <v:shapetype id="_x0000_t75" coordsize="21600,21600" o:spt="75" o:preferrelative="t" path="m@4@5l@4@11@9@11@9@5xe" filled="f" stroked="f">
                     <v:stroke joinstyle="miter"/>
@@ -62,70 +85,48 @@
                     <v:path o:extrusionok="f" gradientshapeok="t" o:connecttype="rect"/>
                     <o:lock v:ext="edit" aspectratio="t"/>
                   </v:shapetype>
-                  <v:shape id="_x0000_s3082" type="#_x0000_t75" href="https://www.linkedin.com/in/rodboev/" style="position:absolute;width:795;height:219" o:preferrelative="f" o:button="t">
+                  <v:shape id="_x0000_s3106" type="#_x0000_t75" href="https://www.linkedin.com/in/rodboev/" style="position:absolute;left:-100;top:541;width:828;height:228" o:preferrelative="f" o:button="t">
                     <v:fill o:detectmouseclick="t"/>
                     <v:path o:extrusionok="t" o:connecttype="none"/>
                   </v:shape>
-                  <v:group id="_x0000_s3083" style="position:absolute;left:11;top:10;width:777;height:205" coordorigin="11,10" coordsize="777,205">
-                    <v:shape id="_x0000_s3084" href="https://www.linkedin.com/in/rodboev/" style="position:absolute;left:583;top:10;width:205;height:205" coordsize="425,428" o:button="t" path="m,30hdc,13,14,,31,,393,,393,,393,v18,,32,13,32,30c425,397,425,397,425,397v,17,-14,31,-32,31c31,428,31,428,31,428,14,428,,414,,397,,30,,30,,30xe" fillcolor="#999" stroked="f">
+                  <v:group id="_x0000_s3107" style="position:absolute;left:-89;top:544;width:810;height:214" coordorigin="11,10" coordsize="777,205">
+                    <v:shape id="_x0000_s3108" href="https://www.linkedin.com/in/rodboev/" style="position:absolute;left:583;top:10;width:205;height:205" coordsize="425,428" o:button="t" path="m,30hdc,13,14,,31,,393,,393,,393,v18,,32,13,32,30c425,397,425,397,425,397v,17,-14,31,-32,31c31,428,31,428,31,428,14,428,,414,,397,,30,,30,,30xe" fillcolor="#999" stroked="f">
                       <v:fill o:detectmouseclick="t"/>
                       <v:path arrowok="t"/>
                     </v:shape>
-                    <v:shape id="_x0000_s3085" style="position:absolute;left:11;top:51;width:85;height:132" coordsize="85,132" path="m,132r85,l85,104r-54,l31,,,,,132r,xe" fillcolor="black" stroked="f">
+                    <v:shape id="_x0000_s3109" style="position:absolute;left:11;top:51;width:85;height:132" coordsize="85,132" path="m,132r85,l85,104r-54,l31,,,,,132r,xe" fillcolor="black" stroked="f">
                       <v:path arrowok="t"/>
                     </v:shape>
-                    <v:shape id="_x0000_s3086" style="position:absolute;left:107;top:44;width:34;height:138" coordsize="72,286" path="m68,286hdc68,93,68,93,68,93,3,93,3,93,3,93v,193,,193,,193c68,286,68,286,68,286xm36,67c58,67,72,52,72,33,71,14,58,,36,,14,,,14,,33,,52,14,67,35,67v1,,1,,1,xe" fillcolor="black" stroked="f">
+                    <v:shape id="_x0000_s3110" style="position:absolute;left:107;top:44;width:34;height:138" coordsize="72,286" path="m68,286hdc68,93,68,93,68,93,3,93,3,93,3,93v,193,,193,,193c68,286,68,286,68,286xm36,67c58,67,72,52,72,33,71,14,58,,36,,14,,,14,,33,,52,14,67,35,67v1,,1,,1,xe" fillcolor="black" stroked="f">
                       <v:path arrowok="t"/>
                       <o:lock v:ext="edit" verticies="t"/>
                     </v:shape>
-                    <v:shape id="_x0000_s3087" style="position:absolute;left:153;top:86;width:95;height:96" coordsize="196,198" path="m,198hdc65,198,65,198,65,198,65,90,65,90,65,90v,-6,,-11,2,-15c71,63,82,51,100,51v23,,32,18,32,44c132,198,132,198,132,198v64,,64,,64,c196,87,196,87,196,87,196,28,165,,123,,88,,73,20,64,33v1,,1,,1,c65,5,65,5,65,5,,5,,5,,5,1,23,,198,,198xe" fillcolor="black" stroked="f">
+                    <v:shape id="_x0000_s3111" style="position:absolute;left:153;top:86;width:95;height:96" coordsize="196,198" path="m,198hdc65,198,65,198,65,198,65,90,65,90,65,90v,-6,,-11,2,-15c71,63,82,51,100,51v23,,32,18,32,44c132,198,132,198,132,198v64,,64,,64,c196,87,196,87,196,87,196,28,165,,123,,88,,73,20,64,33v1,,1,,1,c65,5,65,5,65,5,,5,,5,,5,1,23,,198,,198xe" fillcolor="black" stroked="f">
                       <v:path arrowok="t"/>
                     </v:shape>
-                    <v:shape id="_x0000_s3088" style="position:absolute;left:261;top:50;width:100;height:132" coordsize="209,275" path="m64,hdc,,,,,,,275,,275,,275v64,,64,,64,c64,213,64,213,64,213,80,192,80,192,80,192v50,83,50,83,50,83c209,275,209,275,209,275,125,155,125,155,125,155,199,74,199,74,199,74v-77,,-77,,-77,c122,74,69,147,64,155,64,,64,,64,xe" fillcolor="black" stroked="f">
+                    <v:shape id="_x0000_s3112" style="position:absolute;left:261;top:50;width:100;height:132" coordsize="209,275" path="m64,hdc,,,,,,,275,,275,,275v64,,64,,64,c64,213,64,213,64,213,80,192,80,192,80,192v50,83,50,83,50,83c209,275,209,275,209,275,125,155,125,155,125,155,199,74,199,74,199,74v-77,,-77,,-77,c122,74,69,147,64,155,64,,64,,64,xe" fillcolor="black" stroked="f">
                       <v:path arrowok="t"/>
                     </v:shape>
-                    <v:shape id="_x0000_s3089" style="position:absolute;left:351;top:83;width:94;height:101" coordsize="196,210" path="m194,126hdc195,121,196,111,196,100,196,50,171,,104,,33,,,56,,107v,64,40,103,110,103c138,210,164,206,185,197v-9,-42,-9,-42,-9,-42c159,161,141,164,119,164,89,164,63,151,61,125v133,1,133,1,133,1xm61,82c62,66,73,41,101,41v29,,36,26,36,41c61,82,61,82,61,82xe" fillcolor="black" stroked="f">
+                    <v:shape id="_x0000_s3113" style="position:absolute;left:351;top:83;width:94;height:101" coordsize="196,210" path="m194,126hdc195,121,196,111,196,100,196,50,171,,104,,33,,,56,,107v,64,40,103,110,103c138,210,164,206,185,197v-9,-42,-9,-42,-9,-42c159,161,141,164,119,164,89,164,63,151,61,125v133,1,133,1,133,1xm61,82c62,66,73,41,101,41v29,,36,26,36,41c61,82,61,82,61,82xe" fillcolor="black" stroked="f">
                       <v:path arrowok="t"/>
                       <o:lock v:ext="edit" verticies="t"/>
                     </v:shape>
-                    <v:shape id="_x0000_s3090" href="http://www.linkedin.com/in/rodboev" style="position:absolute;left:450;top:50;width:103;height:134" coordsize="214,280" o:button="t" path="m148,hdc148,92,148,92,148,92v-1,,-1,,-1,c138,78,118,69,92,69,43,69,,109,,176v,63,39,104,88,104c115,280,140,268,153,246v1,,1,,1,c157,275,157,275,157,275v57,,57,,57,c213,262,212,238,212,215,212,,212,,212,,148,,148,,148,xm148,186v,5,-1,10,-1,14c143,217,128,230,109,230,82,230,65,208,65,175v,-32,15,-58,44,-58c129,117,143,131,147,148v1,4,1,8,1,11c148,186,148,186,148,186xe" fillcolor="black" stroked="f">
+                    <v:shape id="_x0000_s3114" href="http://www.linkedin.com/in/rodboev" style="position:absolute;left:450;top:50;width:103;height:134" coordsize="214,280" o:button="t" path="m148,hdc148,92,148,92,148,92v-1,,-1,,-1,c138,78,118,69,92,69,43,69,,109,,176v,63,39,104,88,104c115,280,140,268,153,246v1,,1,,1,c157,275,157,275,157,275v57,,57,,57,c213,262,212,238,212,215,212,,212,,212,,148,,148,,148,xm148,186v,5,-1,10,-1,14c143,217,128,230,109,230,82,230,65,208,65,175v,-32,15,-58,44,-58c129,117,143,131,147,148v1,4,1,8,1,11c148,186,148,186,148,186xe" fillcolor="black" stroked="f">
                       <v:fill o:detectmouseclick="t"/>
                       <v:path arrowok="t"/>
                       <o:lock v:ext="edit" verticies="t"/>
                     </v:shape>
-                    <v:shape id="_x0000_s3091" style="position:absolute;left:613;top:44;width:34;height:138" coordsize="72,286" path="m68,286hdc68,93,68,93,68,93,3,93,3,93,3,93v,193,,193,,193c68,286,68,286,68,286xm35,66c58,66,72,51,72,33,71,14,58,,36,,14,,,14,,33,,51,13,66,35,66v,,,,,xe" stroked="f">
+                    <v:shape id="_x0000_s3115" style="position:absolute;left:613;top:44;width:34;height:138" coordsize="72,286" path="m68,286hdc68,93,68,93,68,93,3,93,3,93,3,93v,193,,193,,193c68,286,68,286,68,286xm35,66c58,66,72,51,72,33,71,14,58,,36,,14,,,14,,33,,51,13,66,35,66v,,,,,xe" stroked="f">
                       <v:path arrowok="t"/>
                       <o:lock v:ext="edit" verticies="t"/>
                     </v:shape>
-                    <v:shape id="_x0000_s3092" style="position:absolute;left:662;top:86;width:95;height:96" coordsize="196,198" path="m,198hdc64,198,64,198,64,198,64,90,64,90,64,90v,-6,1,-12,2,-16c71,63,82,51,99,51v24,,33,18,33,44c132,198,132,198,132,198v64,,64,,64,c196,87,196,87,196,87,196,28,164,,122,,88,,72,20,64,33v,,,,,c64,5,64,5,64,5,,5,,5,,5,1,23,,198,,198xe" stroked="f">
+                    <v:shape id="_x0000_s3116" style="position:absolute;left:662;top:86;width:95;height:96" coordsize="196,198" path="m,198hdc64,198,64,198,64,198,64,90,64,90,64,90v,-6,1,-12,2,-16c71,63,82,51,99,51v24,,33,18,33,44c132,198,132,198,132,198v64,,64,,64,c196,87,196,87,196,87,196,28,164,,122,,88,,72,20,64,33v,,,,,c64,5,64,5,64,5,,5,,5,,5,1,23,,198,,198xe" stroked="f">
                       <v:path arrowok="t"/>
                     </v:shape>
                   </v:group>
                 </v:group>
               </w:pict>
             </w:r>
-            <w:r>
-              <w:rPr>
-                <w:rFonts w:ascii="HelveticaNeueLT Pro 55 Roman" w:hAnsi="HelveticaNeueLT Pro 55 Roman" w:cs="Arial"/>
-                <w:position w:val="2"/>
-                <w:sz w:val="46"/>
-                <w:szCs w:val="46"/>
-              </w:rPr>
-              <w:t>Rod Boev</w:t>
-            </w:r>
-          </w:p>
-          <w:p>
-            <w:pPr>
-              <w:spacing w:before="50"/>
-              <w:ind w:hanging="115"/>
-              <w:rPr>
-                <w:rFonts w:ascii="HelveticaNeueLT Pro 55 Roman" w:hAnsi="HelveticaNeueLT Pro 55 Roman" w:cs="Arial"/>
-                <w:position w:val="4"/>
-                <w:sz w:val="18"/>
-                <w:szCs w:val="18"/>
-                <w:u w:val="single"/>
-              </w:rPr>
-            </w:pPr>
             <w:hyperlink r:id="rId8" w:history="1">
               <w:r>
                 <w:rPr>
@@ -147,8 +148,112 @@
                   <w:position w:val="4"/>
                   <w:sz w:val="18"/>
                   <w:szCs w:val="18"/>
+                  <w:u w:val="none"/>
                 </w:rPr>
                 <w:t>.com/in/rodboev</w:t>
+              </w:r>
+            </w:hyperlink>
+          </w:p>
+        </w:tc>
+        <w:tc>
+          <w:tcPr>
+            <w:tcW w:w="5181" w:type="dxa"/>
+          </w:tcPr>
+          <w:p>
+            <w:pPr>
+              <w:spacing w:line="300" w:lineRule="auto"/>
+              <w:ind w:right="-14"/>
+              <w:jc w:val="right"/>
+              <w:rPr>
+                <w:rFonts w:ascii="HelveticaNeueLT Pro 55 Roman" w:hAnsi="HelveticaNeueLT Pro 55 Roman"/>
+                <w:sz w:val="10"/>
+                <w:szCs w:val="10"/>
+              </w:rPr>
+            </w:pPr>
+            <w:r>
+              <w:rPr>
+                <w:rFonts w:ascii="HelveticaNeueLT Pro 55 Roman" w:hAnsi="HelveticaNeueLT Pro 55 Roman"/>
+                <w:sz w:val="10"/>
+                <w:szCs w:val="10"/>
+              </w:rPr>
+              <w:t xml:space="preserve"> </w:t>
+            </w:r>
+          </w:p>
+          <w:p>
+            <w:pPr>
+              <w:spacing w:line="300" w:lineRule="auto"/>
+              <w:ind w:right="-14"/>
+              <w:jc w:val="right"/>
+              <w:rPr>
+                <w:rFonts w:ascii="HelveticaNeueLT Pro 55 Roman" w:hAnsi="HelveticaNeueLT Pro 55 Roman" w:cs="Arial"/>
+                <w:sz w:val="18"/>
+                <w:szCs w:val="18"/>
+              </w:rPr>
+            </w:pPr>
+            <w:hyperlink r:id="rId9" w:history="1">
+              <w:r>
+                <w:rPr>
+                  <w:rStyle w:val="Hyperlink"/>
+                  <w:rFonts w:ascii="HelveticaNeueLT Pro 55 Roman" w:hAnsi="HelveticaNeueLT Pro 55 Roman"/>
+                  <w:color w:val="auto"/>
+                  <w:sz w:val="18"/>
+                  <w:u w:val="none"/>
+                </w:rPr>
+                <w:t>rod@basedin.nyc</w:t>
+              </w:r>
+            </w:hyperlink>
+          </w:p>
+          <w:p>
+            <w:pPr>
+              <w:spacing w:line="300" w:lineRule="auto"/>
+              <w:ind w:right="-14"/>
+              <w:jc w:val="right"/>
+              <w:rPr>
+                <w:rFonts w:ascii="HelveticaNeueLT Pro 55 Roman" w:hAnsi="HelveticaNeueLT Pro 55 Roman" w:cs="Arial"/>
+                <w:sz w:val="18"/>
+                <w:szCs w:val="18"/>
+              </w:rPr>
+            </w:pPr>
+            <w:hyperlink r:id="rId10" w:history="1">
+              <w:proofErr w:type="spellStart"/>
+              <w:r>
+                <w:rPr>
+                  <w:rStyle w:val="Hyperlink"/>
+                  <w:rFonts w:ascii="HelveticaNeueLT Pro 55 Roman" w:hAnsi="HelveticaNeueLT Pro 55 Roman" w:cs="Arial"/>
+                  <w:color w:val="auto"/>
+                  <w:sz w:val="18"/>
+                  <w:szCs w:val="18"/>
+                  <w:u w:val="none"/>
+                </w:rPr>
+                <w:t>basedin.nyc</w:t>
+              </w:r>
+              <w:proofErr w:type="spellEnd"/>
+            </w:hyperlink>
+            <w:r>
+              <w:rPr>
+                <w:rFonts w:ascii="HelveticaNeueLT Pro 55 Roman" w:hAnsi="HelveticaNeueLT Pro 55 Roman" w:cs="Arial"/>
+                <w:sz w:val="18"/>
+                <w:szCs w:val="18"/>
+              </w:rPr>
+              <w:t xml:space="preserve">  </w:t>
+            </w:r>
+            <w:r>
+              <w:rPr>
+                <w:rFonts w:ascii="HelveticaNeueLT Pro 55 Roman" w:hAnsi="HelveticaNeueLT Pro 55 Roman"/>
+                <w:sz w:val="18"/>
+              </w:rPr>
+              <w:t xml:space="preserve">·  </w:t>
+            </w:r>
+            <w:hyperlink r:id="rId11" w:history="1">
+              <w:r>
+                <w:rPr>
+                  <w:rStyle w:val="Hyperlink"/>
+                  <w:rFonts w:ascii="HelveticaNeueLT Pro 55 Roman" w:hAnsi="HelveticaNeueLT Pro 55 Roman"/>
+                  <w:color w:val="auto"/>
+                  <w:sz w:val="18"/>
+                  <w:u w:val="none"/>
+                </w:rPr>
+                <w:t>347-644-9001</w:t>
               </w:r>
             </w:hyperlink>
           </w:p>
@@ -160,79 +265,36 @@
           </w:tcPr>
           <w:p>
             <w:pPr>
-              <w:spacing w:before="40" w:line="300" w:lineRule="auto"/>
+              <w:spacing w:line="300" w:lineRule="auto"/>
               <w:ind w:right="-14"/>
               <w:jc w:val="right"/>
               <w:rPr>
-                <w:rStyle w:val="Hyperlink"/>
-                <w:rFonts w:ascii="HelveticaNeueLT Pro 55 Roman" w:hAnsi="HelveticaNeueLT Pro 55 Roman" w:cs="Arial"/>
-                <w:color w:val="auto"/>
+                <w:rFonts w:ascii="HelveticaNeueLT Pro 55 Roman" w:hAnsi="HelveticaNeueLT Pro 55 Roman" w:cs="Arial"/>
                 <w:sz w:val="18"/>
                 <w:szCs w:val="18"/>
               </w:rPr>
             </w:pPr>
+            <w:hyperlink r:id="rId12" w:history="1">
+              <w:r>
+                <w:rPr>
+                  <w:rStyle w:val="Hyperlink"/>
+                  <w:rFonts w:ascii="HelveticaNeueLT Pro 55 Roman" w:hAnsi="HelveticaNeueLT Pro 55 Roman" w:cs="Arial"/>
+                  <w:sz w:val="18"/>
+                  <w:szCs w:val="18"/>
+                </w:rPr>
+                <w:t>rod@basedin.nyc</w:t>
+              </w:r>
+            </w:hyperlink>
             <w:r>
               <w:rPr>
                 <w:rFonts w:ascii="HelveticaNeueLT Pro 55 Roman" w:hAnsi="HelveticaNeueLT Pro 55 Roman" w:cs="Arial"/>
                 <w:sz w:val="18"/>
                 <w:szCs w:val="18"/>
               </w:rPr>
-              <w:fldChar w:fldCharType="begin"/>
-            </w:r>
-            <w:r>
-              <w:rPr>
-                <w:rFonts w:ascii="HelveticaNeueLT Pro 55 Roman" w:hAnsi="HelveticaNeueLT Pro 55 Roman" w:cs="Arial"/>
-                <w:sz w:val="18"/>
-                <w:szCs w:val="18"/>
-              </w:rPr>
-              <w:instrText>HYPERLINK "mailto:rod@basedin.nyc"</w:instrText>
-            </w:r>
-            <w:r>
-              <w:rPr>
-                <w:rFonts w:ascii="HelveticaNeueLT Pro 55 Roman" w:hAnsi="HelveticaNeueLT Pro 55 Roman" w:cs="Arial"/>
-                <w:sz w:val="18"/>
-                <w:szCs w:val="18"/>
-              </w:rPr>
-            </w:r>
-            <w:r>
-              <w:rPr>
-                <w:rFonts w:ascii="HelveticaNeueLT Pro 55 Roman" w:hAnsi="HelveticaNeueLT Pro 55 Roman" w:cs="Arial"/>
-                <w:sz w:val="18"/>
-                <w:szCs w:val="18"/>
-              </w:rPr>
-              <w:fldChar w:fldCharType="separate"/>
-            </w:r>
-            <w:r>
-              <w:rPr>
-                <w:rStyle w:val="Hyperlink"/>
-                <w:rFonts w:ascii="HelveticaNeueLT Pro 55 Roman" w:hAnsi="HelveticaNeueLT Pro 55 Roman" w:cs="Arial"/>
-                <w:color w:val="auto"/>
-                <w:sz w:val="18"/>
-                <w:szCs w:val="18"/>
-              </w:rPr>
-              <w:t>rod@basedin.nyc</w:t>
-            </w:r>
-          </w:p>
-          <w:p>
-            <w:pPr>
-              <w:spacing w:line="276" w:lineRule="auto"/>
-              <w:ind w:right="-14"/>
-              <w:jc w:val="right"/>
-              <w:rPr>
-                <w:rFonts w:ascii="HelveticaNeueLT Pro 55 Roman" w:hAnsi="HelveticaNeueLT Pro 55 Roman" w:cs="Arial"/>
-                <w:sz w:val="18"/>
-                <w:szCs w:val="18"/>
-              </w:rPr>
-            </w:pPr>
-            <w:r>
-              <w:rPr>
-                <w:rFonts w:ascii="HelveticaNeueLT Pro 55 Roman" w:hAnsi="HelveticaNeueLT Pro 55 Roman" w:cs="Arial"/>
-                <w:sz w:val="18"/>
-                <w:szCs w:val="18"/>
-              </w:rPr>
-              <w:fldChar w:fldCharType="end"/>
-            </w:r>
-            <w:hyperlink r:id="rId9" w:history="1">
+              <w:br/>
+            </w:r>
+            <w:hyperlink r:id="rId13" w:history="1">
+              <w:proofErr w:type="spellStart"/>
               <w:r>
                 <w:rPr>
                   <w:rStyle w:val="Hyperlink"/>
@@ -241,36 +303,35 @@
                   <w:sz w:val="18"/>
                   <w:szCs w:val="18"/>
                 </w:rPr>
-                <w:t>https://basedin.nyc</w:t>
+                <w:t>basedin.nyc</w:t>
               </w:r>
+              <w:proofErr w:type="spellEnd"/>
             </w:hyperlink>
-          </w:p>
-          <w:p>
-            <w:pPr>
-              <w:spacing w:line="276" w:lineRule="auto"/>
-              <w:ind w:right="-14"/>
-              <w:jc w:val="right"/>
+            <w:r>
+              <w:t xml:space="preserve"> </w:t>
+            </w:r>
+            <w:r>
+              <w:rPr>
+                <w:rFonts w:ascii="HelveticaNeueLT Pro 55 Roman" w:hAnsi="HelveticaNeueLT Pro 55 Roman"/>
+                <w:sz w:val="18"/>
+              </w:rPr>
+              <w:t xml:space="preserve">·  </w:t>
+            </w:r>
+            <w:r>
               <w:rPr>
                 <w:rFonts w:ascii="HelveticaNeueLT Pro 55 Roman" w:hAnsi="HelveticaNeueLT Pro 55 Roman" w:cs="Arial"/>
                 <w:sz w:val="18"/>
                 <w:szCs w:val="18"/>
               </w:rPr>
-            </w:pPr>
+              <w:t>(347) 644-9</w:t>
+            </w:r>
             <w:r>
               <w:rPr>
                 <w:rFonts w:ascii="HelveticaNeueLT Pro 55 Roman" w:hAnsi="HelveticaNeueLT Pro 55 Roman" w:cs="Arial"/>
                 <w:sz w:val="18"/>
                 <w:szCs w:val="18"/>
               </w:rPr>
-              <w:t>(347) 644-9</w:t>
-            </w:r>
-            <w:r>
-              <w:rPr>
-                <w:rFonts w:ascii="Nirmala UI" w:hAnsi="Nirmala UI" w:cs="Nirmala UI"/>
-                <w:sz w:val="18"/>
-                <w:szCs w:val="18"/>
-              </w:rPr>
-              <w:t>᱐᱐</w:t>
+              <w:t>00</w:t>
             </w:r>
             <w:r>
               <w:rPr>
@@ -425,7 +486,7 @@
                 <w:sz w:val="22"/>
                 <w:szCs w:val="20"/>
               </w:rPr>
-              <w:t>200+ PRs across 5 OSS repos at 9</w:t>
+              <w:t>300</w:t>
             </w:r>
             <w:r>
               <w:rPr>
@@ -433,7 +494,7 @@
                 <w:sz w:val="22"/>
                 <w:szCs w:val="20"/>
               </w:rPr>
-              <w:t>8</w:t>
+              <w:t>+ PRs across</w:t>
             </w:r>
             <w:r>
               <w:rPr>
@@ -441,7 +502,73 @@
                 <w:sz w:val="22"/>
                 <w:szCs w:val="20"/>
               </w:rPr>
-              <w:t xml:space="preserve">%+ acceptance. Top-5 contributor to </w:t>
+              <w:t xml:space="preserve"> 5</w:t>
+            </w:r>
+            <w:r>
+              <w:rPr>
+                <w:rFonts w:ascii="HelveticaNeueLT Pro 55 Roman" w:hAnsi="HelveticaNeueLT Pro 55 Roman" w:cs="Arial"/>
+                <w:sz w:val="22"/>
+                <w:szCs w:val="20"/>
+              </w:rPr>
+              <w:t xml:space="preserve"> OSS repos at 9</w:t>
+            </w:r>
+            <w:r>
+              <w:rPr>
+                <w:rFonts w:ascii="HelveticaNeueLT Pro 55 Roman" w:hAnsi="HelveticaNeueLT Pro 55 Roman" w:cs="Arial"/>
+                <w:sz w:val="22"/>
+                <w:szCs w:val="20"/>
+              </w:rPr>
+              <w:t>7</w:t>
+            </w:r>
+            <w:r>
+              <w:rPr>
+                <w:rFonts w:ascii="HelveticaNeueLT Pro 55 Roman" w:hAnsi="HelveticaNeueLT Pro 55 Roman" w:cs="Arial"/>
+                <w:sz w:val="22"/>
+                <w:szCs w:val="20"/>
+              </w:rPr>
+              <w:t xml:space="preserve">%+ acceptance. </w:t>
+            </w:r>
+            <w:proofErr w:type="gramStart"/>
+            <w:r>
+              <w:rPr>
+                <w:rFonts w:ascii="HelveticaNeueLT Pro 55 Roman" w:hAnsi="HelveticaNeueLT Pro 55 Roman" w:cs="Arial"/>
+                <w:sz w:val="22"/>
+                <w:szCs w:val="20"/>
+              </w:rPr>
+              <w:t>Top-5</w:t>
+            </w:r>
+            <w:proofErr w:type="gramEnd"/>
+            <w:r>
+              <w:rPr>
+                <w:rFonts w:ascii="HelveticaNeueLT Pro 55 Roman" w:hAnsi="HelveticaNeueLT Pro 55 Roman" w:cs="Arial"/>
+                <w:sz w:val="22"/>
+                <w:szCs w:val="20"/>
+              </w:rPr>
+              <w:t xml:space="preserve"> </w:t>
+            </w:r>
+            <w:r>
+              <w:rPr>
+                <w:rFonts w:ascii="HelveticaNeueLT Pro 55 Roman" w:hAnsi="HelveticaNeueLT Pro 55 Roman" w:cs="Arial"/>
+                <w:sz w:val="22"/>
+                <w:szCs w:val="20"/>
+              </w:rPr>
+              <w:t>contributo</w:t>
+            </w:r>
+            <w:r>
+              <w:rPr>
+                <w:rFonts w:ascii="HelveticaNeueLT Pro 55 Roman" w:hAnsi="HelveticaNeueLT Pro 55 Roman" w:cs="Arial"/>
+                <w:sz w:val="22"/>
+                <w:szCs w:val="20"/>
+              </w:rPr>
+              <w:t>r</w:t>
+            </w:r>
+            <w:r>
+              <w:rPr>
+                <w:rFonts w:ascii="HelveticaNeueLT Pro 55 Roman" w:hAnsi="HelveticaNeueLT Pro 55 Roman" w:cs="Arial"/>
+                <w:sz w:val="22"/>
+                <w:szCs w:val="20"/>
+              </w:rPr>
+              <w:t xml:space="preserve"> to </w:t>
             </w:r>
             <w:proofErr w:type="spellStart"/>
             <w:r>
@@ -459,7 +586,49 @@
                 <w:sz w:val="22"/>
                 <w:szCs w:val="20"/>
               </w:rPr>
-              <w:t xml:space="preserve">-mem (80K+ stars), second-highest contributor to </w:t>
+              <w:t>-mem (80</w:t>
+            </w:r>
+            <w:r>
+              <w:rPr>
+                <w:rFonts w:ascii="HelveticaNeueLT Pro 55 Roman" w:hAnsi="HelveticaNeueLT Pro 55 Roman" w:cs="Arial"/>
+                <w:sz w:val="22"/>
+                <w:szCs w:val="20"/>
+              </w:rPr>
+              <w:t>k</w:t>
+            </w:r>
+            <w:r>
+              <w:rPr>
+                <w:rFonts w:ascii="HelveticaNeueLT Pro 55 Roman" w:hAnsi="HelveticaNeueLT Pro 55 Roman" w:cs="Arial"/>
+                <w:sz w:val="22"/>
+                <w:szCs w:val="20"/>
+              </w:rPr>
+              <w:t xml:space="preserve"> stars</w:t>
+            </w:r>
+            <w:proofErr w:type="gramStart"/>
+            <w:r>
+              <w:rPr>
+                <w:rFonts w:ascii="HelveticaNeueLT Pro 55 Roman" w:hAnsi="HelveticaNeueLT Pro 55 Roman" w:cs="Arial"/>
+                <w:sz w:val="22"/>
+                <w:szCs w:val="20"/>
+              </w:rPr>
+              <w:t>)</w:t>
+            </w:r>
+            <w:r>
+              <w:rPr>
+                <w:rFonts w:ascii="HelveticaNeueLT Pro 55 Roman" w:hAnsi="HelveticaNeueLT Pro 55 Roman" w:cs="Arial"/>
+                <w:sz w:val="22"/>
+                <w:szCs w:val="20"/>
+              </w:rPr>
+              <w:t>, #</w:t>
+            </w:r>
+            <w:proofErr w:type="gramEnd"/>
+            <w:r>
+              <w:rPr>
+                <w:rFonts w:ascii="HelveticaNeueLT Pro 55 Roman" w:hAnsi="HelveticaNeueLT Pro 55 Roman" w:cs="Arial"/>
+                <w:sz w:val="22"/>
+                <w:szCs w:val="20"/>
+              </w:rPr>
+              <w:t xml:space="preserve">2 on </w:t>
             </w:r>
             <w:proofErr w:type="spellStart"/>
             <w:r>
@@ -477,7 +646,81 @@
                 <w:sz w:val="22"/>
                 <w:szCs w:val="20"/>
               </w:rPr>
-              <w:t xml:space="preserve"> (14K+ stars).</w:t>
+              <w:t xml:space="preserve"> (14</w:t>
+            </w:r>
+            <w:r>
+              <w:rPr>
+                <w:rFonts w:ascii="HelveticaNeueLT Pro 55 Roman" w:hAnsi="HelveticaNeueLT Pro 55 Roman" w:cs="Arial"/>
+                <w:sz w:val="22"/>
+                <w:szCs w:val="20"/>
+              </w:rPr>
+              <w:t>k</w:t>
+            </w:r>
+            <w:r>
+              <w:rPr>
+                <w:rFonts w:ascii="HelveticaNeueLT Pro 55 Roman" w:hAnsi="HelveticaNeueLT Pro 55 Roman" w:cs="Arial"/>
+                <w:sz w:val="22"/>
+                <w:szCs w:val="20"/>
+              </w:rPr>
+              <w:t xml:space="preserve"> stars)</w:t>
+            </w:r>
+            <w:r>
+              <w:rPr>
+                <w:rFonts w:ascii="HelveticaNeueLT Pro 55 Roman" w:hAnsi="HelveticaNeueLT Pro 55 Roman" w:cs="Arial"/>
+                <w:sz w:val="22"/>
+                <w:szCs w:val="20"/>
+              </w:rPr>
+              <w:t xml:space="preserve"> and</w:t>
+            </w:r>
+            <w:r>
+              <w:rPr>
+                <w:rFonts w:ascii="HelveticaNeueLT Pro 55 Roman" w:hAnsi="HelveticaNeueLT Pro 55 Roman" w:cs="Arial"/>
+                <w:sz w:val="22"/>
+                <w:szCs w:val="20"/>
+              </w:rPr>
+              <w:t xml:space="preserve"> </w:t>
+            </w:r>
+            <w:proofErr w:type="spellStart"/>
+            <w:r>
+              <w:rPr>
+                <w:rFonts w:ascii="HelveticaNeueLT Pro 55 Roman" w:hAnsi="HelveticaNeueLT Pro 55 Roman" w:cs="Arial"/>
+                <w:sz w:val="22"/>
+                <w:szCs w:val="20"/>
+              </w:rPr>
+              <w:t>agentsview</w:t>
+            </w:r>
+            <w:proofErr w:type="spellEnd"/>
+            <w:r>
+              <w:rPr>
+                <w:rFonts w:ascii="HelveticaNeueLT Pro 55 Roman" w:hAnsi="HelveticaNeueLT Pro 55 Roman" w:cs="Arial"/>
+                <w:sz w:val="22"/>
+                <w:szCs w:val="20"/>
+              </w:rPr>
+              <w:t xml:space="preserve"> (3</w:t>
+            </w:r>
+            <w:r>
+              <w:rPr>
+                <w:rFonts w:ascii="HelveticaNeueLT Pro 55 Roman" w:hAnsi="HelveticaNeueLT Pro 55 Roman" w:cs="Arial"/>
+                <w:sz w:val="22"/>
+                <w:szCs w:val="20"/>
+              </w:rPr>
+              <w:t>k</w:t>
+            </w:r>
+            <w:r>
+              <w:rPr>
+                <w:rFonts w:ascii="HelveticaNeueLT Pro 55 Roman" w:hAnsi="HelveticaNeueLT Pro 55 Roman" w:cs="Arial"/>
+                <w:sz w:val="22"/>
+                <w:szCs w:val="20"/>
+              </w:rPr>
+              <w:t xml:space="preserve"> stars)</w:t>
+            </w:r>
+            <w:r>
+              <w:rPr>
+                <w:rFonts w:ascii="HelveticaNeueLT Pro 55 Roman" w:hAnsi="HelveticaNeueLT Pro 55 Roman" w:cs="Arial"/>
+                <w:sz w:val="22"/>
+                <w:szCs w:val="20"/>
+              </w:rPr>
+              <w:t>.</w:t>
             </w:r>
           </w:p>
           <w:p>
@@ -556,24 +799,6 @@
           </w:tcPr>
           <w:p>
             <w:pPr>
-              <w:spacing w:line="360" w:lineRule="auto"/>
-              <w:rPr>
-                <w:rFonts w:ascii="HelveticaNeueLT Pro 55 Roman" w:hAnsi="HelveticaNeueLT Pro 55 Roman" w:cs="Arial"/>
-                <w:sz w:val="8"/>
-                <w:szCs w:val="8"/>
-              </w:rPr>
-            </w:pPr>
-            <w:r>
-              <w:rPr>
-                <w:rFonts w:ascii="HelveticaNeueLT Pro 55 Roman" w:hAnsi="HelveticaNeueLT Pro 55 Roman" w:cs="Arial"/>
-                <w:sz w:val="8"/>
-                <w:szCs w:val="8"/>
-              </w:rPr>
-              <w:t xml:space="preserve"> </w:t>
-            </w:r>
-          </w:p>
-          <w:p>
-            <w:pPr>
               <w:spacing w:line="288" w:lineRule="auto"/>
               <w:ind w:left="-20"/>
               <w:rPr>
@@ -700,7 +925,7 @@
     </w:tbl>
     <w:p>
       <w:pPr>
-        <w:spacing w:before="20" w:after="80"/>
+        <w:spacing w:after="80"/>
         <w:rPr>
           <w:rFonts w:ascii="HelveticaNeueLT Pro 55 Roman" w:hAnsi="HelveticaNeueLT Pro 55 Roman" w:cs="Arial"/>
           <w:sz w:val="25"/>
@@ -854,20 +1079,30 @@
     </w:p>
     <w:p>
       <w:pPr>
-        <w:spacing w:after="80" w:line="264" w:lineRule="auto"/>
+        <w:spacing w:after="40" w:line="264" w:lineRule="auto"/>
         <w:ind w:left="288"/>
         <w:rPr>
           <w:rFonts w:ascii="HelveticaNeueLT Pro 55 Roman" w:hAnsi="HelveticaNeueLT Pro 55 Roman"/>
           <w:sz w:val="18"/>
         </w:rPr>
       </w:pPr>
+      <w:proofErr w:type="gramStart"/>
       <w:r>
         <w:rPr>
           <w:rFonts w:ascii="HelveticaNeueLT Pro 55 Roman" w:hAnsi="HelveticaNeueLT Pro 55 Roman"/>
           <w:b/>
           <w:sz w:val="22"/>
         </w:rPr>
-        <w:t xml:space="preserve">Open Source </w:t>
+        <w:t>Open Source</w:t>
+      </w:r>
+      <w:proofErr w:type="gramEnd"/>
+      <w:r>
+        <w:rPr>
+          <w:rFonts w:ascii="HelveticaNeueLT Pro 55 Roman" w:hAnsi="HelveticaNeueLT Pro 55 Roman"/>
+          <w:b/>
+          <w:sz w:val="22"/>
+        </w:rPr>
+        <w:t xml:space="preserve"> </w:t>
       </w:r>
       <w:r>
         <w:rPr>
@@ -917,130 +1152,23 @@
           <w:sz w:val="22"/>
           <w:szCs w:val="20"/>
         </w:rPr>
-        <w:t xml:space="preserve">Built an autonomous </w:t>
-      </w:r>
-      <w:r>
-        <w:rPr>
-          <w:rFonts w:ascii="HelveticaNeueLT Pro 55 Roman" w:hAnsi="HelveticaNeueLT Pro 55 Roman" w:cs="Arial"/>
-          <w:sz w:val="22"/>
-          <w:szCs w:val="20"/>
-        </w:rPr>
-        <w:t>multi-agent, multi-repo pipeline for upstream open-source contributions. Runs continuously. Cross-provider spe</w:t>
-      </w:r>
-      <w:r>
-        <w:rPr>
-          <w:rFonts w:ascii="HelveticaNeueLT Pro 55 Roman" w:hAnsi="HelveticaNeueLT Pro 55 Roman" w:cs="Arial"/>
-          <w:sz w:val="22"/>
-          <w:szCs w:val="20"/>
-        </w:rPr>
-        <w:t>c</w:t>
-      </w:r>
-      <w:r>
-        <w:rPr>
-          <w:rFonts w:ascii="HelveticaNeueLT Pro 55 Roman" w:hAnsi="HelveticaNeueLT Pro 55 Roman" w:cs="Arial"/>
-          <w:sz w:val="22"/>
-          <w:szCs w:val="20"/>
-        </w:rPr>
-        <w:t xml:space="preserve"> synthesis and reviews, behavioral regression testing, deterministic </w:t>
-      </w:r>
-      <w:proofErr w:type="gramStart"/>
-      <w:r>
-        <w:rPr>
-          <w:rFonts w:ascii="HelveticaNeueLT Pro 55 Roman" w:hAnsi="HelveticaNeueLT Pro 55 Roman" w:cs="Arial"/>
-          <w:sz w:val="22"/>
-          <w:szCs w:val="20"/>
-        </w:rPr>
-        <w:t>publish</w:t>
-      </w:r>
-      <w:proofErr w:type="gramEnd"/>
-      <w:r>
-        <w:rPr>
-          <w:rFonts w:ascii="HelveticaNeueLT Pro 55 Roman" w:hAnsi="HelveticaNeueLT Pro 55 Roman" w:cs="Arial"/>
-          <w:sz w:val="22"/>
-          <w:szCs w:val="20"/>
-        </w:rPr>
-        <w:t xml:space="preserve"> gates.</w:t>
-      </w:r>
-      <w:r>
-        <w:rPr>
-          <w:rFonts w:ascii="HelveticaNeueLT Pro 55 Roman" w:hAnsi="HelveticaNeueLT Pro 55 Roman" w:cs="Arial"/>
-          <w:sz w:val="22"/>
-          <w:szCs w:val="20"/>
-        </w:rPr>
-        <w:t xml:space="preserve"> Post-push</w:t>
-      </w:r>
-      <w:r>
-        <w:rPr>
-          <w:rFonts w:ascii="HelveticaNeueLT Pro 55 Roman" w:hAnsi="HelveticaNeueLT Pro 55 Roman" w:cs="Arial"/>
-          <w:sz w:val="22"/>
-          <w:szCs w:val="20"/>
-        </w:rPr>
-        <w:t xml:space="preserve"> </w:t>
-      </w:r>
-      <w:r>
-        <w:rPr>
-          <w:rFonts w:ascii="HelveticaNeueLT Pro 55 Roman" w:hAnsi="HelveticaNeueLT Pro 55 Roman" w:cs="Arial"/>
-          <w:sz w:val="22"/>
-          <w:szCs w:val="20"/>
-        </w:rPr>
-        <w:t>c</w:t>
-      </w:r>
-      <w:r>
-        <w:rPr>
-          <w:rFonts w:ascii="HelveticaNeueLT Pro 55 Roman" w:hAnsi="HelveticaNeueLT Pro 55 Roman" w:cs="Arial"/>
-          <w:sz w:val="22"/>
-          <w:szCs w:val="20"/>
-        </w:rPr>
-        <w:t>onvergence on CI and reviewer feedback.</w:t>
-      </w:r>
-    </w:p>
-    <w:p>
-      <w:pPr>
-        <w:spacing w:line="264" w:lineRule="auto"/>
-        <w:rPr>
-          <w:rFonts w:ascii="HelveticaNeueLT Pro 55 Roman" w:hAnsi="HelveticaNeueLT Pro 55 Roman" w:cs="Arial"/>
-          <w:sz w:val="18"/>
-          <w:szCs w:val="18"/>
-        </w:rPr>
-      </w:pPr>
-    </w:p>
-    <w:p>
-      <w:pPr>
-        <w:spacing w:after="80" w:line="264" w:lineRule="auto"/>
-        <w:ind w:left="288"/>
-        <w:rPr>
-          <w:rFonts w:ascii="HelveticaNeueLT Pro 55 Roman" w:hAnsi="HelveticaNeueLT Pro 55 Roman"/>
-          <w:sz w:val="18"/>
-        </w:rPr>
-      </w:pPr>
-      <w:r>
-        <w:rPr>
-          <w:rFonts w:ascii="HelveticaNeueLT Pro 55 Roman" w:hAnsi="HelveticaNeueLT Pro 55 Roman"/>
-          <w:b/>
-          <w:sz w:val="22"/>
-        </w:rPr>
-        <w:t>Liberty Pest Control, AI-Powered Business Tools</w:t>
-      </w:r>
-      <w:r>
-        <w:rPr>
-          <w:rFonts w:ascii="HelveticaNeueLT Pro 55 Roman" w:hAnsi="HelveticaNeueLT Pro 55 Roman"/>
-          <w:sz w:val="18"/>
-        </w:rPr>
-        <w:t xml:space="preserve">  (2024</w:t>
-      </w:r>
-      <w:r>
-        <w:rPr>
-          <w:rFonts w:ascii="HelveticaNeueLT Pro 55 Roman" w:hAnsi="HelveticaNeueLT Pro 55 Roman"/>
-          <w:sz w:val="18"/>
-        </w:rPr>
-        <w:t>-2025</w:t>
-      </w:r>
-      <w:r>
-        <w:rPr>
-          <w:rFonts w:ascii="HelveticaNeueLT Pro 55 Roman" w:hAnsi="HelveticaNeueLT Pro 55 Roman"/>
-          <w:sz w:val="18"/>
-        </w:rPr>
-        <w:t>)</w:t>
+        <w:t xml:space="preserve">Built </w:t>
+      </w:r>
+      <w:r>
+        <w:rPr>
+          <w:rFonts w:ascii="HelveticaNeueLT Pro 55 Roman" w:hAnsi="HelveticaNeueLT Pro 55 Roman" w:cs="Arial"/>
+          <w:sz w:val="22"/>
+          <w:szCs w:val="20"/>
+        </w:rPr>
+        <w:t>an autonomous multi-agent pipeline for upstream open-source contributions. Runs continuously. P</w:t>
+      </w:r>
+      <w:r>
+        <w:rPr>
+          <w:rFonts w:ascii="HelveticaNeueLT Pro 55 Roman" w:hAnsi="HelveticaNeueLT Pro 55 Roman" w:cs="Arial"/>
+          <w:sz w:val="22"/>
+          <w:szCs w:val="20"/>
+        </w:rPr>
+        <w:t>er-repo architectural knowledge graphs, style norms, and search dimensions. Cross-provider spec competition and synthesis with proof matrices and structural validation.</w:t>
       </w:r>
     </w:p>
     <w:p>
@@ -1051,35 +1179,72 @@
         </w:numPr>
         <w:tabs>
           <w:tab w:val="clear" w:pos="288"/>
+          <w:tab w:val="left" w:pos="540"/>
         </w:tabs>
         <w:spacing w:after="40" w:line="264" w:lineRule="auto"/>
-        <w:ind w:left="540" w:hanging="162"/>
-        <w:rPr>
-          <w:rFonts w:ascii="HelveticaNeueLT Pro 55 Roman" w:hAnsi="HelveticaNeueLT Pro 55 Roman" w:cs="Arial"/>
-          <w:sz w:val="22"/>
-          <w:szCs w:val="20"/>
-        </w:rPr>
-      </w:pPr>
-      <w:r>
-        <w:rPr>
-          <w:rFonts w:ascii="HelveticaNeueLT Pro 55 Roman" w:hAnsi="HelveticaNeueLT Pro 55 Roman"/>
-          <w:sz w:val="22"/>
-        </w:rPr>
-        <w:t>Built an internal platform that reads technician field notes from PestPac (MS SQL Server), processes them through GPT-4</w:t>
-      </w:r>
-      <w:r>
-        <w:rPr>
-          <w:rFonts w:ascii="HelveticaNeueLT Pro 55 Roman" w:hAnsi="HelveticaNeueLT Pro 55 Roman"/>
-          <w:sz w:val="22"/>
-        </w:rPr>
-        <w:t>o</w:t>
-      </w:r>
-      <w:r>
-        <w:rPr>
-          <w:rFonts w:ascii="HelveticaNeueLT Pro 55 Roman" w:hAnsi="HelveticaNeueLT Pro 55 Roman"/>
-          <w:sz w:val="22"/>
-        </w:rPr>
-        <w:t>, and generates contextual customer communications.</w:t>
+        <w:ind w:left="540" w:hanging="252"/>
+        <w:rPr>
+          <w:rFonts w:ascii="HelveticaNeueLT Pro 55 Roman" w:hAnsi="HelveticaNeueLT Pro 55 Roman" w:cs="Arial"/>
+          <w:sz w:val="22"/>
+          <w:szCs w:val="20"/>
+        </w:rPr>
+      </w:pPr>
+      <w:r>
+        <w:rPr>
+          <w:rFonts w:ascii="HelveticaNeueLT Pro 55 Roman" w:hAnsi="HelveticaNeueLT Pro 55 Roman" w:cs="Arial"/>
+          <w:sz w:val="22"/>
+          <w:szCs w:val="20"/>
+        </w:rPr>
+        <w:t>Mandatory test coverage: behavioral proofs, regression contracts, test surface enforcement. Multi-pass adversarial review with call-site tracing, import verification, and stale assertion detection. Deterministic publish gates with post-push convergence on CI and reviewer feedback.</w:t>
+      </w:r>
+    </w:p>
+    <w:p>
+      <w:pPr>
+        <w:spacing w:line="264" w:lineRule="auto"/>
+        <w:rPr>
+          <w:rFonts w:ascii="HelveticaNeueLT Pro 55 Roman" w:hAnsi="HelveticaNeueLT Pro 55 Roman" w:cs="Arial"/>
+          <w:sz w:val="18"/>
+          <w:szCs w:val="18"/>
+        </w:rPr>
+      </w:pPr>
+    </w:p>
+    <w:p>
+      <w:pPr>
+        <w:spacing w:after="40" w:line="264" w:lineRule="auto"/>
+        <w:ind w:left="288"/>
+        <w:rPr>
+          <w:rFonts w:ascii="HelveticaNeueLT Pro 55 Roman" w:hAnsi="HelveticaNeueLT Pro 55 Roman"/>
+          <w:sz w:val="18"/>
+        </w:rPr>
+      </w:pPr>
+      <w:r>
+        <w:rPr>
+          <w:rFonts w:ascii="HelveticaNeueLT Pro 55 Roman" w:hAnsi="HelveticaNeueLT Pro 55 Roman"/>
+          <w:b/>
+          <w:sz w:val="22"/>
+        </w:rPr>
+        <w:t>Liberty Pest Control, AI-Powered Business Tools</w:t>
+      </w:r>
+      <w:r>
+        <w:rPr>
+          <w:rFonts w:ascii="HelveticaNeueLT Pro 55 Roman" w:hAnsi="HelveticaNeueLT Pro 55 Roman"/>
+          <w:sz w:val="18"/>
+        </w:rPr>
+        <w:t xml:space="preserve">  (2024</w:t>
+      </w:r>
+      <w:r>
+        <w:rPr>
+          <w:rFonts w:ascii="HelveticaNeueLT Pro 55 Roman" w:hAnsi="HelveticaNeueLT Pro 55 Roman"/>
+          <w:sz w:val="18"/>
+        </w:rPr>
+        <w:t>-2025</w:t>
+      </w:r>
+      <w:r>
+        <w:rPr>
+          <w:rFonts w:ascii="HelveticaNeueLT Pro 55 Roman" w:hAnsi="HelveticaNeueLT Pro 55 Roman"/>
+          <w:sz w:val="18"/>
+        </w:rPr>
+        <w:t>)</w:t>
       </w:r>
     </w:p>
     <w:p>
@@ -1090,50 +1255,46 @@
         </w:numPr>
         <w:tabs>
           <w:tab w:val="clear" w:pos="288"/>
-          <w:tab w:val="num" w:pos="576"/>
+          <w:tab w:val="left" w:pos="540"/>
         </w:tabs>
         <w:spacing w:after="40" w:line="264" w:lineRule="auto"/>
-        <w:ind w:left="540" w:hanging="162"/>
-        <w:rPr>
-          <w:rFonts w:ascii="HelveticaNeueLT Pro 55 Roman" w:hAnsi="HelveticaNeueLT Pro 55 Roman" w:cs="Arial"/>
-          <w:sz w:val="22"/>
-          <w:szCs w:val="20"/>
-        </w:rPr>
-      </w:pPr>
-      <w:r>
-        <w:rPr>
-          <w:rFonts w:ascii="HelveticaNeueLT Pro 55 Roman" w:hAnsi="HelveticaNeueLT Pro 55 Roman"/>
-          <w:sz w:val="22"/>
-        </w:rPr>
-        <w:t>Implemented OpenAI’s</w:t>
-      </w:r>
-      <w:r>
-        <w:rPr>
-          <w:rFonts w:ascii="HelveticaNeueLT Pro 55 Roman" w:hAnsi="HelveticaNeueLT Pro 55 Roman"/>
-          <w:sz w:val="22"/>
-        </w:rPr>
-        <w:t xml:space="preserve"> streaming C</w:t>
-      </w:r>
-      <w:r>
-        <w:rPr>
-          <w:rFonts w:ascii="HelveticaNeueLT Pro 55 Roman" w:hAnsi="HelveticaNeueLT Pro 55 Roman"/>
-          <w:sz w:val="22"/>
-        </w:rPr>
-        <w:t>hat Completions API with real-time partial JSON parsing for progressive UI rendering, and the</w:t>
-      </w:r>
-      <w:r>
-        <w:rPr>
-          <w:rFonts w:ascii="HelveticaNeueLT Pro 55 Roman" w:hAnsi="HelveticaNeueLT Pro 55 Roman"/>
-          <w:sz w:val="22"/>
-        </w:rPr>
-        <w:t xml:space="preserve"> Realtime Voice API with WebSocket relay for live AI-driven phone calls</w:t>
-      </w:r>
-      <w:r>
-        <w:rPr>
-          <w:rFonts w:ascii="HelveticaNeueLT Pro 55 Roman" w:hAnsi="HelveticaNeueLT Pro 55 Roman"/>
-          <w:sz w:val="22"/>
-        </w:rPr>
-        <w:t>.</w:t>
+        <w:ind w:left="540" w:hanging="252"/>
+        <w:rPr>
+          <w:rFonts w:ascii="HelveticaNeueLT Pro 55 Roman" w:hAnsi="HelveticaNeueLT Pro 55 Roman" w:cs="Arial"/>
+          <w:sz w:val="22"/>
+          <w:szCs w:val="20"/>
+        </w:rPr>
+      </w:pPr>
+      <w:r>
+        <w:rPr>
+          <w:rFonts w:ascii="HelveticaNeueLT Pro 55 Roman" w:hAnsi="HelveticaNeueLT Pro 55 Roman"/>
+          <w:sz w:val="22"/>
+        </w:rPr>
+        <w:t>B</w:t>
+      </w:r>
+      <w:r>
+        <w:rPr>
+          <w:rFonts w:ascii="HelveticaNeueLT Pro 55 Roman" w:hAnsi="HelveticaNeueLT Pro 55 Roman" w:cs="Arial"/>
+          <w:sz w:val="22"/>
+          <w:szCs w:val="20"/>
+        </w:rPr>
+        <w:t>uilt an internal platform that reads technician field notes from PestPac (MS SQL Server), processes them through GPT-4</w:t>
+      </w:r>
+      <w:r>
+        <w:rPr>
+          <w:rFonts w:ascii="HelveticaNeueLT Pro 55 Roman" w:hAnsi="HelveticaNeueLT Pro 55 Roman" w:cs="Arial"/>
+          <w:sz w:val="22"/>
+          <w:szCs w:val="20"/>
+        </w:rPr>
+        <w:t>o</w:t>
+      </w:r>
+      <w:r>
+        <w:rPr>
+          <w:rFonts w:ascii="HelveticaNeueLT Pro 55 Roman" w:hAnsi="HelveticaNeueLT Pro 55 Roman" w:cs="Arial"/>
+          <w:sz w:val="22"/>
+          <w:szCs w:val="20"/>
+        </w:rPr>
+        <w:t>, and generates contextual customer communications.</w:t>
       </w:r>
     </w:p>
     <w:p>
@@ -1144,171 +1305,63 @@
         </w:numPr>
         <w:tabs>
           <w:tab w:val="clear" w:pos="288"/>
-          <w:tab w:val="num" w:pos="576"/>
+          <w:tab w:val="left" w:pos="540"/>
         </w:tabs>
         <w:spacing w:after="40" w:line="264" w:lineRule="auto"/>
-        <w:ind w:left="540" w:hanging="162"/>
-        <w:rPr>
-          <w:rFonts w:ascii="HelveticaNeueLT Pro 55 Roman" w:hAnsi="HelveticaNeueLT Pro 55 Roman" w:cs="Arial"/>
-          <w:sz w:val="22"/>
-          <w:szCs w:val="20"/>
-        </w:rPr>
-      </w:pPr>
-      <w:r>
-        <w:rPr>
-          <w:rFonts w:ascii="HelveticaNeueLT Pro 55 Roman" w:hAnsi="HelveticaNeueLT Pro 55 Roman"/>
-          <w:sz w:val="22"/>
-        </w:rPr>
-        <w:t>T</w:t>
-      </w:r>
-      <w:r>
-        <w:rPr>
-          <w:rFonts w:ascii="HelveticaNeueLT Pro 55 Roman" w:hAnsi="HelveticaNeueLT Pro 55 Roman"/>
-          <w:sz w:val="22"/>
-        </w:rPr>
-        <w:t>hree-tier caching</w:t>
-      </w:r>
-      <w:r>
-        <w:rPr>
-          <w:rFonts w:ascii="HelveticaNeueLT Pro 55 Roman" w:hAnsi="HelveticaNeueLT Pro 55 Roman"/>
-          <w:sz w:val="22"/>
-        </w:rPr>
-        <w:t xml:space="preserve"> (</w:t>
-      </w:r>
-      <w:r>
-        <w:rPr>
-          <w:rFonts w:ascii="HelveticaNeueLT Pro 55 Roman" w:hAnsi="HelveticaNeueLT Pro 55 Roman"/>
-          <w:sz w:val="22"/>
-        </w:rPr>
-        <w:t>memory</w:t>
-      </w:r>
-      <w:r>
-        <w:rPr>
-          <w:rFonts w:ascii="HelveticaNeueLT Pro 55 Roman" w:hAnsi="HelveticaNeueLT Pro 55 Roman"/>
-          <w:sz w:val="22"/>
-        </w:rPr>
-        <w:t>,</w:t>
-      </w:r>
-      <w:r>
-        <w:rPr>
-          <w:rFonts w:ascii="HelveticaNeueLT Pro 55 Roman" w:hAnsi="HelveticaNeueLT Pro 55 Roman"/>
-          <w:sz w:val="22"/>
-        </w:rPr>
-        <w:t xml:space="preserve"> disk</w:t>
-      </w:r>
-      <w:r>
-        <w:rPr>
-          <w:rFonts w:ascii="HelveticaNeueLT Pro 55 Roman" w:hAnsi="HelveticaNeueLT Pro 55 Roman"/>
-          <w:sz w:val="22"/>
-        </w:rPr>
-        <w:t>,</w:t>
-      </w:r>
-      <w:r>
-        <w:rPr>
-          <w:rFonts w:ascii="HelveticaNeueLT Pro 55 Roman" w:hAnsi="HelveticaNeueLT Pro 55 Roman"/>
-          <w:sz w:val="22"/>
-        </w:rPr>
-        <w:t xml:space="preserve"> Firebase)</w:t>
-      </w:r>
-      <w:r>
-        <w:rPr>
-          <w:rFonts w:ascii="HelveticaNeueLT Pro 55 Roman" w:hAnsi="HelveticaNeueLT Pro 55 Roman"/>
-          <w:sz w:val="22"/>
-        </w:rPr>
-        <w:t>, fingerprinting. Hot-swappable prompts.</w:t>
-      </w:r>
-    </w:p>
-    <w:p>
-      <w:pPr>
-        <w:spacing w:before="80" w:after="40" w:line="264" w:lineRule="auto"/>
-        <w:ind w:left="259"/>
-        <w:rPr>
-          <w:rFonts w:ascii="HelveticaNeueLT Pro 55 Roman" w:hAnsi="HelveticaNeueLT Pro 55 Roman" w:cs="Arial"/>
-          <w:sz w:val="22"/>
-          <w:szCs w:val="20"/>
-        </w:rPr>
-      </w:pPr>
-      <w:r>
-        <w:rPr>
-          <w:rFonts w:ascii="HelveticaNeueLT Pro 55 Roman" w:hAnsi="HelveticaNeueLT Pro 55 Roman"/>
-          <w:b/>
-          <w:sz w:val="18"/>
-        </w:rPr>
-        <w:t xml:space="preserve">Stack: </w:t>
-      </w:r>
-      <w:r>
-        <w:rPr>
-          <w:rFonts w:ascii="HelveticaNeueLT Pro 55 Roman" w:hAnsi="HelveticaNeueLT Pro 55 Roman"/>
-          <w:sz w:val="18"/>
-        </w:rPr>
-        <w:t>React, Vite, Tailwind CSS, Node.js/Express, OpenAI API, Firebase, MS SQL Server (</w:t>
-      </w:r>
-      <w:proofErr w:type="spellStart"/>
-      <w:r>
-        <w:rPr>
-          <w:rFonts w:ascii="HelveticaNeueLT Pro 55 Roman" w:hAnsi="HelveticaNeueLT Pro 55 Roman"/>
-          <w:sz w:val="18"/>
-        </w:rPr>
-        <w:t>FreeTDS</w:t>
-      </w:r>
-      <w:proofErr w:type="spellEnd"/>
-      <w:r>
-        <w:rPr>
-          <w:rFonts w:ascii="HelveticaNeueLT Pro 55 Roman" w:hAnsi="HelveticaNeueLT Pro 55 Roman"/>
-          <w:sz w:val="18"/>
-        </w:rPr>
-        <w:t xml:space="preserve">), </w:t>
-      </w:r>
-      <w:proofErr w:type="spellStart"/>
-      <w:r>
-        <w:rPr>
-          <w:rFonts w:ascii="HelveticaNeueLT Pro 55 Roman" w:hAnsi="HelveticaNeueLT Pro 55 Roman"/>
-          <w:sz w:val="18"/>
-        </w:rPr>
-        <w:t>TanStack</w:t>
-      </w:r>
-      <w:proofErr w:type="spellEnd"/>
-      <w:r>
-        <w:rPr>
-          <w:rFonts w:ascii="HelveticaNeueLT Pro 55 Roman" w:hAnsi="HelveticaNeueLT Pro 55 Roman"/>
-          <w:sz w:val="18"/>
-        </w:rPr>
-        <w:t xml:space="preserve"> Query.</w:t>
-      </w:r>
-    </w:p>
-    <w:p>
-      <w:pPr>
-        <w:spacing w:line="264" w:lineRule="auto"/>
-        <w:rPr>
-          <w:rFonts w:ascii="HelveticaNeueLT Pro 55 Roman" w:hAnsi="HelveticaNeueLT Pro 55 Roman" w:cs="Arial"/>
-          <w:sz w:val="18"/>
-          <w:szCs w:val="18"/>
-        </w:rPr>
-      </w:pPr>
-    </w:p>
-    <w:p>
-      <w:pPr>
-        <w:spacing w:after="80" w:line="264" w:lineRule="auto"/>
-        <w:ind w:left="288"/>
-        <w:rPr>
-          <w:rFonts w:ascii="HelveticaNeueLT Pro 55 Roman" w:hAnsi="HelveticaNeueLT Pro 55 Roman"/>
-          <w:sz w:val="18"/>
-        </w:rPr>
-      </w:pPr>
-      <w:r>
-        <w:rPr>
-          <w:rFonts w:ascii="HelveticaNeueLT Pro 55 Roman" w:hAnsi="HelveticaNeueLT Pro 55 Roman"/>
-          <w:b/>
-          <w:sz w:val="22"/>
-        </w:rPr>
-        <w:t>Liberty Pest Control, Scheduling Optimization Engine</w:t>
-      </w:r>
-      <w:r>
-        <w:rPr>
-          <w:rFonts w:ascii="HelveticaNeueLT Pro 55 Roman" w:hAnsi="HelveticaNeueLT Pro 55 Roman"/>
-          <w:sz w:val="18"/>
-        </w:rPr>
-        <w:t xml:space="preserve">  (2023–2024)</w:t>
+        <w:ind w:left="540" w:hanging="252"/>
+        <w:rPr>
+          <w:rFonts w:ascii="HelveticaNeueLT Pro 55 Roman" w:hAnsi="HelveticaNeueLT Pro 55 Roman" w:cs="Arial"/>
+          <w:sz w:val="22"/>
+          <w:szCs w:val="20"/>
+        </w:rPr>
+      </w:pPr>
+      <w:r>
+        <w:rPr>
+          <w:rFonts w:ascii="HelveticaNeueLT Pro 55 Roman" w:hAnsi="HelveticaNeueLT Pro 55 Roman" w:cs="Arial"/>
+          <w:sz w:val="22"/>
+          <w:szCs w:val="20"/>
+        </w:rPr>
+        <w:t>OpenAI</w:t>
+      </w:r>
+      <w:r>
+        <w:rPr>
+          <w:rFonts w:ascii="HelveticaNeueLT Pro 55 Roman" w:hAnsi="HelveticaNeueLT Pro 55 Roman" w:cs="Arial"/>
+          <w:sz w:val="22"/>
+          <w:szCs w:val="20"/>
+        </w:rPr>
+        <w:t xml:space="preserve"> C</w:t>
+      </w:r>
+      <w:r>
+        <w:rPr>
+          <w:rFonts w:ascii="HelveticaNeueLT Pro 55 Roman" w:hAnsi="HelveticaNeueLT Pro 55 Roman" w:cs="Arial"/>
+          <w:sz w:val="22"/>
+          <w:szCs w:val="20"/>
+        </w:rPr>
+        <w:t xml:space="preserve">hat Completions </w:t>
+      </w:r>
+      <w:r>
+        <w:rPr>
+          <w:rFonts w:ascii="HelveticaNeueLT Pro 55 Roman" w:hAnsi="HelveticaNeueLT Pro 55 Roman" w:cs="Arial"/>
+          <w:sz w:val="22"/>
+          <w:szCs w:val="20"/>
+        </w:rPr>
+        <w:t>with</w:t>
+      </w:r>
+      <w:r>
+        <w:rPr>
+          <w:rFonts w:ascii="HelveticaNeueLT Pro 55 Roman" w:hAnsi="HelveticaNeueLT Pro 55 Roman" w:cs="Arial"/>
+          <w:sz w:val="22"/>
+          <w:szCs w:val="20"/>
+        </w:rPr>
+        <w:t xml:space="preserve"> partial JSON parsing</w:t>
+      </w:r>
+      <w:r>
+        <w:rPr>
+          <w:rFonts w:ascii="HelveticaNeueLT Pro 55 Roman" w:hAnsi="HelveticaNeueLT Pro 55 Roman" w:cs="Arial"/>
+          <w:sz w:val="22"/>
+          <w:szCs w:val="20"/>
+        </w:rPr>
+        <w:t xml:space="preserve"> for email draft generation. Realtime Voice API for transcribed phone calls. Hot-swappable system prompt editable in the UI.</w:t>
       </w:r>
     </w:p>
     <w:p>
@@ -1319,46 +1372,185 @@
         </w:numPr>
         <w:tabs>
           <w:tab w:val="clear" w:pos="288"/>
+          <w:tab w:val="left" w:pos="540"/>
         </w:tabs>
         <w:spacing w:after="40" w:line="264" w:lineRule="auto"/>
         <w:ind w:left="540" w:hanging="252"/>
         <w:rPr>
           <w:rFonts w:ascii="HelveticaNeueLT Pro 55 Roman" w:hAnsi="HelveticaNeueLT Pro 55 Roman" w:cs="Arial"/>
           <w:sz w:val="22"/>
-          <w:szCs w:val="22"/>
-        </w:rPr>
-      </w:pPr>
-      <w:r>
-        <w:rPr>
-          <w:rFonts w:ascii="HelveticaNeueLT Pro 55 Roman" w:hAnsi="HelveticaNeueLT Pro 55 Roman"/>
-          <w:sz w:val="22"/>
-          <w:szCs w:val="22"/>
-        </w:rPr>
-        <w:t xml:space="preserve">Designed a Vehicle Routing Problem solver </w:t>
-      </w:r>
-      <w:r>
-        <w:rPr>
-          <w:rFonts w:ascii="HelveticaNeueLT Pro 55 Roman" w:hAnsi="HelveticaNeueLT Pro 55 Roman"/>
-          <w:sz w:val="22"/>
-          <w:szCs w:val="22"/>
-        </w:rPr>
-        <w:t>for</w:t>
-      </w:r>
-      <w:r>
-        <w:rPr>
-          <w:rFonts w:ascii="HelveticaNeueLT Pro 55 Roman" w:hAnsi="HelveticaNeueLT Pro 55 Roman"/>
-          <w:sz w:val="22"/>
-          <w:szCs w:val="22"/>
-        </w:rPr>
-        <w:t xml:space="preserve"> 5,500+ services across 80 technicians</w:t>
-      </w:r>
-      <w:r>
-        <w:rPr>
-          <w:rFonts w:ascii="HelveticaNeueLT Pro 55 Roman" w:hAnsi="HelveticaNeueLT Pro 55 Roman"/>
-          <w:sz w:val="22"/>
-          <w:szCs w:val="22"/>
+          <w:szCs w:val="20"/>
+        </w:rPr>
+      </w:pPr>
+      <w:r>
+        <w:rPr>
+          <w:rFonts w:ascii="HelveticaNeueLT Pro 55 Roman" w:hAnsi="HelveticaNeueLT Pro 55 Roman" w:cs="Arial"/>
+          <w:sz w:val="22"/>
+          <w:szCs w:val="20"/>
+        </w:rPr>
+        <w:t>T</w:t>
+      </w:r>
+      <w:r>
+        <w:rPr>
+          <w:rFonts w:ascii="HelveticaNeueLT Pro 55 Roman" w:hAnsi="HelveticaNeueLT Pro 55 Roman" w:cs="Arial"/>
+          <w:sz w:val="22"/>
+          <w:szCs w:val="20"/>
+        </w:rPr>
+        <w:t>hree-tier caching</w:t>
+      </w:r>
+      <w:r>
+        <w:rPr>
+          <w:rFonts w:ascii="HelveticaNeueLT Pro 55 Roman" w:hAnsi="HelveticaNeueLT Pro 55 Roman" w:cs="Arial"/>
+          <w:sz w:val="22"/>
+          <w:szCs w:val="20"/>
+        </w:rPr>
+        <w:t xml:space="preserve"> (</w:t>
+      </w:r>
+      <w:r>
+        <w:rPr>
+          <w:rFonts w:ascii="HelveticaNeueLT Pro 55 Roman" w:hAnsi="HelveticaNeueLT Pro 55 Roman" w:cs="Arial"/>
+          <w:sz w:val="22"/>
+          <w:szCs w:val="20"/>
+        </w:rPr>
+        <w:t>memory</w:t>
+      </w:r>
+      <w:r>
+        <w:rPr>
+          <w:rFonts w:ascii="HelveticaNeueLT Pro 55 Roman" w:hAnsi="HelveticaNeueLT Pro 55 Roman" w:cs="Arial"/>
+          <w:sz w:val="22"/>
+          <w:szCs w:val="20"/>
+        </w:rPr>
+        <w:t>,</w:t>
+      </w:r>
+      <w:r>
+        <w:rPr>
+          <w:rFonts w:ascii="HelveticaNeueLT Pro 55 Roman" w:hAnsi="HelveticaNeueLT Pro 55 Roman" w:cs="Arial"/>
+          <w:sz w:val="22"/>
+          <w:szCs w:val="20"/>
+        </w:rPr>
+        <w:t xml:space="preserve"> disk</w:t>
+      </w:r>
+      <w:r>
+        <w:rPr>
+          <w:rFonts w:ascii="HelveticaNeueLT Pro 55 Roman" w:hAnsi="HelveticaNeueLT Pro 55 Roman" w:cs="Arial"/>
+          <w:sz w:val="22"/>
+          <w:szCs w:val="20"/>
+        </w:rPr>
+        <w:t>,</w:t>
+      </w:r>
+      <w:r>
+        <w:rPr>
+          <w:rFonts w:ascii="HelveticaNeueLT Pro 55 Roman" w:hAnsi="HelveticaNeueLT Pro 55 Roman" w:cs="Arial"/>
+          <w:sz w:val="22"/>
+          <w:szCs w:val="20"/>
+        </w:rPr>
+        <w:t xml:space="preserve"> Firebase)</w:t>
+      </w:r>
+      <w:r>
+        <w:rPr>
+          <w:rFonts w:ascii="HelveticaNeueLT Pro 55 Roman" w:hAnsi="HelveticaNeueLT Pro 55 Roman" w:cs="Arial"/>
+          <w:sz w:val="22"/>
+          <w:szCs w:val="20"/>
+        </w:rPr>
+        <w:t>, fingerprinting</w:t>
+      </w:r>
+      <w:r>
+        <w:rPr>
+          <w:rFonts w:ascii="HelveticaNeueLT Pro 55 Roman" w:hAnsi="HelveticaNeueLT Pro 55 Roman" w:cs="Arial"/>
+          <w:sz w:val="22"/>
+          <w:szCs w:val="20"/>
+        </w:rPr>
+        <w:t xml:space="preserve"> and deduplication</w:t>
+      </w:r>
+      <w:r>
+        <w:rPr>
+          <w:rFonts w:ascii="HelveticaNeueLT Pro 55 Roman" w:hAnsi="HelveticaNeueLT Pro 55 Roman" w:cs="Arial"/>
+          <w:sz w:val="22"/>
+          <w:szCs w:val="20"/>
         </w:rPr>
         <w:t>.</w:t>
+      </w:r>
+    </w:p>
+    <w:p>
+      <w:pPr>
+        <w:spacing w:before="80" w:after="40" w:line="264" w:lineRule="auto"/>
+        <w:ind w:left="259"/>
+        <w:rPr>
+          <w:rFonts w:ascii="HelveticaNeueLT Pro 55 Roman" w:hAnsi="HelveticaNeueLT Pro 55 Roman" w:cs="Arial"/>
+          <w:sz w:val="22"/>
+          <w:szCs w:val="20"/>
+        </w:rPr>
+      </w:pPr>
+      <w:r>
+        <w:rPr>
+          <w:rFonts w:ascii="HelveticaNeueLT Pro 55 Roman" w:hAnsi="HelveticaNeueLT Pro 55 Roman"/>
+          <w:b/>
+          <w:sz w:val="18"/>
+        </w:rPr>
+        <w:t xml:space="preserve">Stack: </w:t>
+      </w:r>
+      <w:r>
+        <w:rPr>
+          <w:rFonts w:ascii="HelveticaNeueLT Pro 55 Roman" w:hAnsi="HelveticaNeueLT Pro 55 Roman"/>
+          <w:sz w:val="18"/>
+        </w:rPr>
+        <w:t xml:space="preserve">Next.js, React, TypeScript, </w:t>
+      </w:r>
+      <w:r>
+        <w:rPr>
+          <w:rFonts w:ascii="HelveticaNeueLT Pro 55 Roman" w:hAnsi="HelveticaNeueLT Pro 55 Roman"/>
+          <w:sz w:val="18"/>
+        </w:rPr>
+        <w:t xml:space="preserve">React </w:t>
+      </w:r>
+      <w:r>
+        <w:rPr>
+          <w:rFonts w:ascii="HelveticaNeueLT Pro 55 Roman" w:hAnsi="HelveticaNeueLT Pro 55 Roman"/>
+          <w:sz w:val="18"/>
+        </w:rPr>
+        <w:t xml:space="preserve">Query, </w:t>
+      </w:r>
+      <w:r>
+        <w:rPr>
+          <w:rFonts w:ascii="HelveticaNeueLT Pro 55 Roman" w:hAnsi="HelveticaNeueLT Pro 55 Roman"/>
+          <w:sz w:val="18"/>
+        </w:rPr>
+        <w:t>Tailwind CSS, Node.js/Express, OpenAI API, Firebase, MS SQL Server.</w:t>
+      </w:r>
+    </w:p>
+    <w:p>
+      <w:pPr>
+        <w:spacing w:line="264" w:lineRule="auto"/>
+        <w:rPr>
+          <w:rFonts w:ascii="HelveticaNeueLT Pro 55 Roman" w:hAnsi="HelveticaNeueLT Pro 55 Roman" w:cs="Arial"/>
+          <w:sz w:val="18"/>
+          <w:szCs w:val="18"/>
+        </w:rPr>
+      </w:pPr>
+    </w:p>
+    <w:p>
+      <w:pPr>
+        <w:spacing w:after="40" w:line="264" w:lineRule="auto"/>
+        <w:ind w:left="288"/>
+        <w:rPr>
+          <w:rFonts w:ascii="HelveticaNeueLT Pro 55 Roman" w:hAnsi="HelveticaNeueLT Pro 55 Roman"/>
+          <w:sz w:val="18"/>
+        </w:rPr>
+      </w:pPr>
+      <w:r>
+        <w:rPr>
+          <w:rFonts w:ascii="HelveticaNeueLT Pro 55 Roman" w:hAnsi="HelveticaNeueLT Pro 55 Roman"/>
+          <w:b/>
+          <w:sz w:val="22"/>
+        </w:rPr>
+        <w:t>Liberty Pest Control, Scheduling Optimization Engine</w:t>
+      </w:r>
+      <w:r>
+        <w:rPr>
+          <w:rFonts w:ascii="HelveticaNeueLT Pro 55 Roman" w:hAnsi="HelveticaNeueLT Pro 55 Roman"/>
+          <w:sz w:val="18"/>
+        </w:rPr>
+        <w:t xml:space="preserve">  (2023–2024)</w:t>
       </w:r>
     </w:p>
     <w:p>
@@ -1369,94 +1561,47 @@
         </w:numPr>
         <w:tabs>
           <w:tab w:val="clear" w:pos="288"/>
+          <w:tab w:val="left" w:pos="540"/>
         </w:tabs>
         <w:spacing w:after="40" w:line="264" w:lineRule="auto"/>
         <w:ind w:left="540" w:hanging="252"/>
         <w:rPr>
           <w:rFonts w:ascii="HelveticaNeueLT Pro 55 Roman" w:hAnsi="HelveticaNeueLT Pro 55 Roman" w:cs="Arial"/>
           <w:sz w:val="22"/>
-          <w:szCs w:val="22"/>
-        </w:rPr>
-      </w:pPr>
-      <w:r>
-        <w:rPr>
-          <w:rFonts w:ascii="HelveticaNeueLT Pro 55 Roman" w:hAnsi="HelveticaNeueLT Pro 55 Roman"/>
-          <w:sz w:val="22"/>
-          <w:szCs w:val="22"/>
-        </w:rPr>
-        <w:t xml:space="preserve">Node.js </w:t>
-      </w:r>
-      <w:r>
-        <w:rPr>
-          <w:rFonts w:ascii="HelveticaNeueLT Pro 55 Roman" w:hAnsi="HelveticaNeueLT Pro 55 Roman"/>
-          <w:sz w:val="22"/>
-          <w:szCs w:val="22"/>
-        </w:rPr>
-        <w:t>w</w:t>
-      </w:r>
-      <w:r>
-        <w:rPr>
-          <w:rFonts w:ascii="HelveticaNeueLT Pro 55 Roman" w:hAnsi="HelveticaNeueLT Pro 55 Roman"/>
-          <w:sz w:val="22"/>
-          <w:szCs w:val="22"/>
-        </w:rPr>
-        <w:t xml:space="preserve">orker </w:t>
-      </w:r>
-      <w:r>
-        <w:rPr>
-          <w:rFonts w:ascii="HelveticaNeueLT Pro 55 Roman" w:hAnsi="HelveticaNeueLT Pro 55 Roman"/>
-          <w:sz w:val="22"/>
-          <w:szCs w:val="22"/>
-        </w:rPr>
-        <w:t>t</w:t>
-      </w:r>
-      <w:r>
-        <w:rPr>
-          <w:rFonts w:ascii="HelveticaNeueLT Pro 55 Roman" w:hAnsi="HelveticaNeueLT Pro 55 Roman"/>
-          <w:sz w:val="22"/>
-          <w:szCs w:val="22"/>
-        </w:rPr>
-        <w:t>hreads with</w:t>
-      </w:r>
-      <w:r>
-        <w:rPr>
-          <w:rFonts w:ascii="HelveticaNeueLT Pro 55 Roman" w:hAnsi="HelveticaNeueLT Pro 55 Roman"/>
-          <w:sz w:val="22"/>
-          <w:szCs w:val="22"/>
-        </w:rPr>
-        <w:t xml:space="preserve"> gap-packing</w:t>
-      </w:r>
-      <w:r>
-        <w:rPr>
-          <w:rFonts w:ascii="HelveticaNeueLT Pro 55 Roman" w:hAnsi="HelveticaNeueLT Pro 55 Roman"/>
-          <w:sz w:val="22"/>
-          <w:szCs w:val="22"/>
-        </w:rPr>
-        <w:t xml:space="preserve">, </w:t>
-      </w:r>
-      <w:r>
-        <w:rPr>
-          <w:rFonts w:ascii="HelveticaNeueLT Pro 55 Roman" w:hAnsi="HelveticaNeueLT Pro 55 Roman"/>
-          <w:sz w:val="22"/>
-          <w:szCs w:val="22"/>
-        </w:rPr>
-        <w:t xml:space="preserve">weighted scoring, </w:t>
-      </w:r>
-      <w:r>
-        <w:rPr>
-          <w:rFonts w:ascii="HelveticaNeueLT Pro 55 Roman" w:hAnsi="HelveticaNeueLT Pro 55 Roman"/>
-          <w:sz w:val="22"/>
-          <w:szCs w:val="22"/>
-        </w:rPr>
-        <w:t>and</w:t>
-      </w:r>
-      <w:r>
-        <w:rPr>
-          <w:rFonts w:ascii="HelveticaNeueLT Pro 55 Roman" w:hAnsi="HelveticaNeueLT Pro 55 Roman"/>
-          <w:sz w:val="22"/>
-          <w:szCs w:val="22"/>
-        </w:rPr>
-        <w:t xml:space="preserve"> geographic continuity.</w:t>
+          <w:szCs w:val="20"/>
+        </w:rPr>
+      </w:pPr>
+      <w:r>
+        <w:rPr>
+          <w:rFonts w:ascii="HelveticaNeueLT Pro 55 Roman" w:hAnsi="HelveticaNeueLT Pro 55 Roman" w:cs="Arial"/>
+          <w:sz w:val="22"/>
+          <w:szCs w:val="20"/>
+        </w:rPr>
+        <w:t xml:space="preserve">Designed a Vehicle Routing Problem solver </w:t>
+      </w:r>
+      <w:r>
+        <w:rPr>
+          <w:rFonts w:ascii="HelveticaNeueLT Pro 55 Roman" w:hAnsi="HelveticaNeueLT Pro 55 Roman" w:cs="Arial"/>
+          <w:sz w:val="22"/>
+          <w:szCs w:val="20"/>
+        </w:rPr>
+        <w:t>for</w:t>
+      </w:r>
+      <w:r>
+        <w:rPr>
+          <w:rFonts w:ascii="HelveticaNeueLT Pro 55 Roman" w:hAnsi="HelveticaNeueLT Pro 55 Roman" w:cs="Arial"/>
+          <w:sz w:val="22"/>
+          <w:szCs w:val="20"/>
+        </w:rPr>
+        <w:t xml:space="preserve"> 5,500+ services across 80 technicians</w:t>
+      </w:r>
+      <w:r>
+        <w:rPr>
+          <w:rFonts w:ascii="HelveticaNeueLT Pro 55 Roman" w:hAnsi="HelveticaNeueLT Pro 55 Roman" w:cs="Arial"/>
+          <w:sz w:val="22"/>
+          <w:szCs w:val="20"/>
+        </w:rPr>
+        <w:t>.</w:t>
       </w:r>
     </w:p>
     <w:p>
@@ -1467,93 +1612,230 @@
         </w:numPr>
         <w:tabs>
           <w:tab w:val="clear" w:pos="288"/>
-          <w:tab w:val="num" w:pos="576"/>
+          <w:tab w:val="left" w:pos="540"/>
         </w:tabs>
         <w:spacing w:after="40" w:line="264" w:lineRule="auto"/>
-        <w:ind w:left="540"/>
-        <w:rPr>
-          <w:rFonts w:ascii="HelveticaNeueLT Pro 55 Roman" w:hAnsi="HelveticaNeueLT Pro 55 Roman" w:cs="Arial"/>
-          <w:sz w:val="22"/>
-          <w:szCs w:val="20"/>
-        </w:rPr>
-      </w:pPr>
-      <w:r>
-        <w:rPr>
-          <w:rFonts w:ascii="HelveticaNeueLT Pro 55 Roman" w:hAnsi="HelveticaNeueLT Pro 55 Roman"/>
-          <w:sz w:val="22"/>
-          <w:szCs w:val="22"/>
-        </w:rPr>
-        <w:t>L</w:t>
-      </w:r>
-      <w:r>
-        <w:rPr>
-          <w:rFonts w:ascii="HelveticaNeueLT Pro 55 Roman" w:hAnsi="HelveticaNeueLT Pro 55 Roman"/>
-          <w:sz w:val="22"/>
-          <w:szCs w:val="22"/>
-        </w:rPr>
-        <w:t xml:space="preserve">egacy SQL </w:t>
-      </w:r>
-      <w:r>
-        <w:rPr>
-          <w:rFonts w:ascii="Arial" w:hAnsi="Arial" w:cs="Arial"/>
-          <w:sz w:val="22"/>
-          <w:szCs w:val="22"/>
-        </w:rPr>
-        <w:t>→</w:t>
-      </w:r>
-      <w:r>
-        <w:rPr>
-          <w:rFonts w:ascii="HelveticaNeueLT Pro 55 Roman" w:hAnsi="HelveticaNeueLT Pro 55 Roman"/>
-          <w:sz w:val="22"/>
-          <w:szCs w:val="22"/>
-        </w:rPr>
-        <w:t xml:space="preserve"> Next.js API routes (data</w:t>
-      </w:r>
-      <w:r>
-        <w:rPr>
-          <w:rFonts w:ascii="HelveticaNeueLT Pro 55 Roman" w:hAnsi="HelveticaNeueLT Pro 55 Roman"/>
-          <w:sz w:val="22"/>
-        </w:rPr>
-        <w:t xml:space="preserve"> transformation, </w:t>
-      </w:r>
-      <w:r>
-        <w:rPr>
-          <w:rFonts w:ascii="HelveticaNeueLT Pro 55 Roman" w:hAnsi="HelveticaNeueLT Pro 55 Roman"/>
-          <w:sz w:val="22"/>
-        </w:rPr>
-        <w:t>validation</w:t>
-      </w:r>
-      <w:r>
-        <w:rPr>
-          <w:rFonts w:ascii="HelveticaNeueLT Pro 55 Roman" w:hAnsi="HelveticaNeueLT Pro 55 Roman"/>
-          <w:sz w:val="22"/>
-        </w:rPr>
-        <w:t xml:space="preserve">) </w:t>
-      </w:r>
-      <w:r>
-        <w:rPr>
-          <w:rFonts w:ascii="Arial" w:hAnsi="Arial" w:cs="Arial"/>
-          <w:sz w:val="22"/>
-        </w:rPr>
-        <w:t>→</w:t>
-      </w:r>
-      <w:r>
-        <w:rPr>
-          <w:rFonts w:ascii="HelveticaNeueLT Pro 55 Roman" w:hAnsi="HelveticaNeueLT Pro 55 Roman"/>
-          <w:sz w:val="22"/>
-        </w:rPr>
-        <w:t xml:space="preserve"> frontend visualization</w:t>
-      </w:r>
-      <w:r>
-        <w:rPr>
-          <w:rFonts w:ascii="HelveticaNeueLT Pro 55 Roman" w:hAnsi="HelveticaNeueLT Pro 55 Roman"/>
-          <w:sz w:val="22"/>
-        </w:rPr>
-        <w:t>.</w:t>
+        <w:ind w:left="540" w:hanging="252"/>
+        <w:rPr>
+          <w:rFonts w:ascii="HelveticaNeueLT Pro 55 Roman" w:hAnsi="HelveticaNeueLT Pro 55 Roman" w:cs="Arial"/>
+          <w:sz w:val="22"/>
+          <w:szCs w:val="20"/>
+        </w:rPr>
+      </w:pPr>
+      <w:r>
+        <w:rPr>
+          <w:rFonts w:ascii="HelveticaNeueLT Pro 55 Roman" w:hAnsi="HelveticaNeueLT Pro 55 Roman" w:cs="Arial"/>
+          <w:sz w:val="22"/>
+          <w:szCs w:val="20"/>
+        </w:rPr>
+        <w:t>TypeScript/</w:t>
+      </w:r>
+      <w:r>
+        <w:rPr>
+          <w:rFonts w:ascii="HelveticaNeueLT Pro 55 Roman" w:hAnsi="HelveticaNeueLT Pro 55 Roman" w:cs="Arial"/>
+          <w:sz w:val="22"/>
+          <w:szCs w:val="20"/>
+        </w:rPr>
+        <w:t xml:space="preserve">Node.js </w:t>
+      </w:r>
+      <w:r>
+        <w:rPr>
+          <w:rFonts w:ascii="HelveticaNeueLT Pro 55 Roman" w:hAnsi="HelveticaNeueLT Pro 55 Roman" w:cs="Arial"/>
+          <w:sz w:val="22"/>
+          <w:szCs w:val="20"/>
+        </w:rPr>
+        <w:t>w</w:t>
+      </w:r>
+      <w:r>
+        <w:rPr>
+          <w:rFonts w:ascii="HelveticaNeueLT Pro 55 Roman" w:hAnsi="HelveticaNeueLT Pro 55 Roman" w:cs="Arial"/>
+          <w:sz w:val="22"/>
+          <w:szCs w:val="20"/>
+        </w:rPr>
+        <w:t xml:space="preserve">orker </w:t>
+      </w:r>
+      <w:r>
+        <w:rPr>
+          <w:rFonts w:ascii="HelveticaNeueLT Pro 55 Roman" w:hAnsi="HelveticaNeueLT Pro 55 Roman" w:cs="Arial"/>
+          <w:sz w:val="22"/>
+          <w:szCs w:val="20"/>
+        </w:rPr>
+        <w:t>t</w:t>
+      </w:r>
+      <w:r>
+        <w:rPr>
+          <w:rFonts w:ascii="HelveticaNeueLT Pro 55 Roman" w:hAnsi="HelveticaNeueLT Pro 55 Roman" w:cs="Arial"/>
+          <w:sz w:val="22"/>
+          <w:szCs w:val="20"/>
+        </w:rPr>
+        <w:t>hreads</w:t>
+      </w:r>
+      <w:r>
+        <w:rPr>
+          <w:rFonts w:ascii="HelveticaNeueLT Pro 55 Roman" w:hAnsi="HelveticaNeueLT Pro 55 Roman" w:cs="Arial"/>
+          <w:sz w:val="22"/>
+          <w:szCs w:val="20"/>
+        </w:rPr>
+        <w:t>:</w:t>
+      </w:r>
+      <w:r>
+        <w:rPr>
+          <w:rFonts w:ascii="HelveticaNeueLT Pro 55 Roman" w:hAnsi="HelveticaNeueLT Pro 55 Roman" w:cs="Arial"/>
+          <w:sz w:val="22"/>
+          <w:szCs w:val="20"/>
+        </w:rPr>
+        <w:t xml:space="preserve"> gap-packing</w:t>
+      </w:r>
+      <w:r>
+        <w:rPr>
+          <w:rFonts w:ascii="HelveticaNeueLT Pro 55 Roman" w:hAnsi="HelveticaNeueLT Pro 55 Roman" w:cs="Arial"/>
+          <w:sz w:val="22"/>
+          <w:szCs w:val="20"/>
+        </w:rPr>
+        <w:t xml:space="preserve">, </w:t>
+      </w:r>
+      <w:r>
+        <w:rPr>
+          <w:rFonts w:ascii="HelveticaNeueLT Pro 55 Roman" w:hAnsi="HelveticaNeueLT Pro 55 Roman" w:cs="Arial"/>
+          <w:sz w:val="22"/>
+          <w:szCs w:val="20"/>
+        </w:rPr>
+        <w:t xml:space="preserve">weighted scoring, </w:t>
+      </w:r>
+      <w:r>
+        <w:rPr>
+          <w:rFonts w:ascii="HelveticaNeueLT Pro 55 Roman" w:hAnsi="HelveticaNeueLT Pro 55 Roman" w:cs="Arial"/>
+          <w:sz w:val="22"/>
+          <w:szCs w:val="20"/>
+        </w:rPr>
+        <w:t>and</w:t>
+      </w:r>
+      <w:r>
+        <w:rPr>
+          <w:rFonts w:ascii="HelveticaNeueLT Pro 55 Roman" w:hAnsi="HelveticaNeueLT Pro 55 Roman" w:cs="Arial"/>
+          <w:sz w:val="22"/>
+          <w:szCs w:val="20"/>
+        </w:rPr>
+        <w:t xml:space="preserve"> geographic continuity.</w:t>
       </w:r>
     </w:p>
     <w:p>
       <w:pPr>
+        <w:numPr>
+          <w:ilvl w:val="0"/>
+          <w:numId w:val="1"/>
+        </w:numPr>
+        <w:tabs>
+          <w:tab w:val="clear" w:pos="288"/>
+          <w:tab w:val="left" w:pos="540"/>
+        </w:tabs>
+        <w:spacing w:after="40" w:line="264" w:lineRule="auto"/>
+        <w:ind w:left="540" w:hanging="252"/>
+        <w:rPr>
+          <w:rFonts w:ascii="HelveticaNeueLT Pro 55 Roman" w:hAnsi="HelveticaNeueLT Pro 55 Roman" w:cs="Arial"/>
+          <w:sz w:val="22"/>
+          <w:szCs w:val="20"/>
+        </w:rPr>
+      </w:pPr>
+      <w:r>
+        <w:rPr>
+          <w:rFonts w:ascii="HelveticaNeueLT Pro 55 Roman" w:hAnsi="HelveticaNeueLT Pro 55 Roman" w:cs="Arial"/>
+          <w:sz w:val="22"/>
+          <w:szCs w:val="20"/>
+        </w:rPr>
+        <w:t xml:space="preserve">Three-tier architecture: </w:t>
+      </w:r>
+      <w:r>
+        <w:rPr>
+          <w:rFonts w:ascii="HelveticaNeueLT Pro 55 Roman" w:hAnsi="HelveticaNeueLT Pro 55 Roman" w:cs="Arial"/>
+          <w:sz w:val="22"/>
+          <w:szCs w:val="20"/>
+        </w:rPr>
+        <w:t>SQL</w:t>
+      </w:r>
+      <w:r>
+        <w:rPr>
+          <w:rFonts w:ascii="HelveticaNeueLT Pro 55 Roman" w:hAnsi="HelveticaNeueLT Pro 55 Roman" w:cs="Arial"/>
+          <w:sz w:val="22"/>
+          <w:szCs w:val="20"/>
+        </w:rPr>
+        <w:t xml:space="preserve"> Server</w:t>
+      </w:r>
+      <w:r>
+        <w:rPr>
+          <w:rFonts w:ascii="HelveticaNeueLT Pro 55 Roman" w:hAnsi="HelveticaNeueLT Pro 55 Roman" w:cs="Arial"/>
+          <w:sz w:val="22"/>
+          <w:szCs w:val="20"/>
+        </w:rPr>
+        <w:t xml:space="preserve"> </w:t>
+      </w:r>
+      <w:r>
+        <w:rPr>
+          <w:rFonts w:ascii="Arial" w:hAnsi="Arial" w:cs="Arial"/>
+          <w:sz w:val="22"/>
+          <w:szCs w:val="20"/>
+        </w:rPr>
+        <w:t>→</w:t>
+      </w:r>
+      <w:r>
+        <w:rPr>
+          <w:rFonts w:ascii="HelveticaNeueLT Pro 55 Roman" w:hAnsi="HelveticaNeueLT Pro 55 Roman" w:cs="Arial"/>
+          <w:sz w:val="22"/>
+          <w:szCs w:val="20"/>
+        </w:rPr>
+        <w:t xml:space="preserve"> Next.js API routes (data transformation, </w:t>
+      </w:r>
+      <w:r>
+        <w:rPr>
+          <w:rFonts w:ascii="HelveticaNeueLT Pro 55 Roman" w:hAnsi="HelveticaNeueLT Pro 55 Roman" w:cs="Arial"/>
+          <w:sz w:val="22"/>
+          <w:szCs w:val="20"/>
+        </w:rPr>
+        <w:t>validation</w:t>
+      </w:r>
+      <w:r>
+        <w:rPr>
+          <w:rFonts w:ascii="HelveticaNeueLT Pro 55 Roman" w:hAnsi="HelveticaNeueLT Pro 55 Roman" w:cs="Arial"/>
+          <w:sz w:val="22"/>
+          <w:szCs w:val="20"/>
+        </w:rPr>
+        <w:t xml:space="preserve">) </w:t>
+      </w:r>
+      <w:r>
+        <w:rPr>
+          <w:rFonts w:ascii="Arial" w:hAnsi="Arial" w:cs="Arial"/>
+          <w:sz w:val="22"/>
+          <w:szCs w:val="20"/>
+        </w:rPr>
+        <w:t>→</w:t>
+      </w:r>
+      <w:r>
+        <w:rPr>
+          <w:rFonts w:ascii="HelveticaNeueLT Pro 55 Roman" w:hAnsi="HelveticaNeueLT Pro 55 Roman" w:cs="Arial"/>
+          <w:sz w:val="22"/>
+          <w:szCs w:val="20"/>
+        </w:rPr>
+        <w:t xml:space="preserve"> frontend visualization</w:t>
+      </w:r>
+      <w:r>
+        <w:rPr>
+          <w:rFonts w:ascii="HelveticaNeueLT Pro 55 Roman" w:hAnsi="HelveticaNeueLT Pro 55 Roman" w:cs="Arial"/>
+          <w:sz w:val="22"/>
+          <w:szCs w:val="20"/>
+        </w:rPr>
+        <w:t xml:space="preserve"> with Leaflet maps, multi-tech calendar views, progressive rendering</w:t>
+      </w:r>
+      <w:r>
+        <w:rPr>
+          <w:rFonts w:ascii="HelveticaNeueLT Pro 55 Roman" w:hAnsi="HelveticaNeueLT Pro 55 Roman" w:cs="Arial"/>
+          <w:sz w:val="22"/>
+          <w:szCs w:val="20"/>
+        </w:rPr>
+        <w:t>.</w:t>
+      </w:r>
+    </w:p>
+    <w:p>
+      <w:pPr>
         <w:spacing w:before="120" w:after="40" w:line="264" w:lineRule="auto"/>
         <w:ind w:left="259"/>
         <w:rPr>
@@ -1568,7 +1850,10 @@
           <w:b/>
           <w:sz w:val="18"/>
         </w:rPr>
-        <w:t xml:space="preserve">Stack: </w:t>
+        <w:t>Stack:</w:t>
+      </w:r>
+      <w:r>
+        <w:t xml:space="preserve"> </w:t>
       </w:r>
       <w:r>
         <w:rPr>
@@ -1576,7 +1861,15 @@
           <w:bCs/>
           <w:sz w:val="18"/>
         </w:rPr>
-        <w:t>Next.js (App Router), React, Tailwind CSS, Node.js Worker Threads, Leaflet/</w:t>
+        <w:t>TypeScript, N</w:t>
+      </w:r>
+      <w:r>
+        <w:rPr>
+          <w:rFonts w:ascii="HelveticaNeueLT Pro 55 Roman" w:hAnsi="HelveticaNeueLT Pro 55 Roman"/>
+          <w:bCs/>
+          <w:sz w:val="18"/>
+        </w:rPr>
+        <w:t>ext.js (App Router), React, Tailwind CSS, Node.js Worker Threads, Leaflet/</w:t>
       </w:r>
       <w:proofErr w:type="spellStart"/>
       <w:r>
@@ -1594,7 +1887,7 @@
           <w:bCs/>
           <w:sz w:val="18"/>
         </w:rPr>
-        <w:t>, Turf.js, MS SQL Server.</w:t>
+        <w:t>, MS SQL Server.</w:t>
       </w:r>
     </w:p>
     <w:p>
@@ -1636,7 +1929,6 @@
                 <w:sz w:val="32"/>
                 <w:szCs w:val="32"/>
               </w:rPr>
-              <w:lastRenderedPageBreak/>
               <w:t>Mezocliq</w:t>
             </w:r>
             <w:proofErr w:type="spellEnd"/>
@@ -2144,12 +2436,7 @@
     </w:p>
     <w:p>
       <w:pPr>
-        <w:numPr>
-          <w:ilvl w:val="0"/>
-          <w:numId w:val="1"/>
-        </w:numPr>
         <w:spacing w:line="264" w:lineRule="auto"/>
-        <w:ind w:hanging="198"/>
         <w:rPr>
           <w:rFonts w:ascii="HelveticaNeueLT Pro 55 Roman" w:hAnsi="HelveticaNeueLT Pro 55 Roman" w:cs="Arial"/>
           <w:sz w:val="22"/>
@@ -2172,28 +2459,21 @@
         </w:rPr>
         <w:t>. WordPress Core contributions.</w:t>
       </w:r>
-    </w:p>
-    <w:p>
-      <w:pPr>
-        <w:numPr>
-          <w:ilvl w:val="0"/>
-          <w:numId w:val="1"/>
-        </w:numPr>
-        <w:spacing w:line="264" w:lineRule="auto"/>
-        <w:ind w:hanging="198"/>
-        <w:rPr>
-          <w:rFonts w:ascii="HelveticaNeueLT Pro 55 Roman" w:hAnsi="HelveticaNeueLT Pro 55 Roman" w:cs="Arial"/>
-          <w:sz w:val="22"/>
-          <w:szCs w:val="20"/>
-        </w:rPr>
-      </w:pPr>
-      <w:r>
-        <w:rPr>
-          <w:rFonts w:ascii="HelveticaNeueLT Pro 55 Roman" w:hAnsi="HelveticaNeueLT Pro 55 Roman" w:cs="Arial"/>
-          <w:sz w:val="22"/>
-          <w:szCs w:val="20"/>
-        </w:rPr>
-        <w:t>Designed NBCOlympics.com video player, viewed 1.3 billion times by 50 million people.</w:t>
+      <w:r>
+        <w:rPr>
+          <w:rFonts w:ascii="HelveticaNeueLT Pro 55 Roman" w:hAnsi="HelveticaNeueLT Pro 55 Roman" w:cs="Arial"/>
+          <w:sz w:val="22"/>
+          <w:szCs w:val="20"/>
+        </w:rPr>
+        <w:t xml:space="preserve"> D</w:t>
+      </w:r>
+      <w:r>
+        <w:rPr>
+          <w:rFonts w:ascii="HelveticaNeueLT Pro 55 Roman" w:hAnsi="HelveticaNeueLT Pro 55 Roman" w:cs="Arial"/>
+          <w:sz w:val="22"/>
+          <w:szCs w:val="20"/>
+        </w:rPr>
+        <w:t>esigned NBCOlympics.com video player, viewed 1.3 billion times by 50 million people.</w:t>
       </w:r>
     </w:p>
     <w:p>
@@ -2273,7 +2553,7 @@
           <w:sz w:val="22"/>
           <w:szCs w:val="22"/>
         </w:rPr>
-        <w:t>200</w:t>
+        <w:t>2</w:t>
       </w:r>
       <w:r>
         <w:rPr>
@@ -2281,6 +2561,22 @@
           <w:sz w:val="22"/>
           <w:szCs w:val="22"/>
         </w:rPr>
+        <w:t>5</w:t>
+      </w:r>
+      <w:r>
+        <w:rPr>
+          <w:rFonts w:ascii="HelveticaNeueLT Pro 55 Roman" w:hAnsi="HelveticaNeueLT Pro 55 Roman"/>
+          <w:sz w:val="22"/>
+          <w:szCs w:val="22"/>
+        </w:rPr>
+        <w:t>0</w:t>
+      </w:r>
+      <w:r>
+        <w:rPr>
+          <w:rFonts w:ascii="HelveticaNeueLT Pro 55 Roman" w:hAnsi="HelveticaNeueLT Pro 55 Roman"/>
+          <w:sz w:val="22"/>
+          <w:szCs w:val="22"/>
+        </w:rPr>
         <w:t xml:space="preserve"> PRs </w:t>
       </w:r>
       <w:r>
@@ -2313,7 +2609,7 @@
           <w:sz w:val="22"/>
           <w:szCs w:val="22"/>
         </w:rPr>
-        <w:t>8</w:t>
+        <w:t>7</w:t>
       </w:r>
       <w:r>
         <w:rPr>
@@ -2355,7 +2651,7 @@
         </w:rPr>
         <w:t xml:space="preserve"> </w:t>
       </w:r>
-      <w:hyperlink r:id="rId10" w:history="1">
+      <w:hyperlink r:id="rId14" w:history="1">
         <w:r>
           <w:rPr>
             <w:rStyle w:val="Hyperlink"/>
@@ -2435,7 +2731,7 @@
           <w:rFonts w:ascii="HelveticaNeueLT Pro 55 Roman" w:hAnsi="HelveticaNeueLT Pro 55 Roman"/>
           <w:sz w:val="18"/>
         </w:rPr>
-        <w:t xml:space="preserve"> (14K+ </w:t>
+        <w:t xml:space="preserve"> (14K </w:t>
       </w:r>
       <w:proofErr w:type="gramStart"/>
       <w:r>
@@ -2663,30 +2959,14 @@
           <w:rFonts w:ascii="HelveticaNeueLT Pro 55 Roman" w:hAnsi="HelveticaNeueLT Pro 55 Roman"/>
           <w:sz w:val="18"/>
         </w:rPr>
-        <w:t xml:space="preserve">K+ </w:t>
-      </w:r>
-      <w:proofErr w:type="gramStart"/>
-      <w:r>
-        <w:rPr>
-          <w:rFonts w:ascii="HelveticaNeueLT Pro 55 Roman" w:hAnsi="HelveticaNeueLT Pro 55 Roman"/>
-          <w:sz w:val="18"/>
-        </w:rPr>
-        <w:t>stars)</w:t>
-      </w:r>
-      <w:r>
-        <w:rPr>
-          <w:rFonts w:ascii="HelveticaNeueLT Pro 55 Roman" w:hAnsi="HelveticaNeueLT Pro 55 Roman"/>
-          <w:sz w:val="18"/>
-        </w:rPr>
-        <w:t xml:space="preserve">  · </w:t>
-      </w:r>
-      <w:proofErr w:type="gramEnd"/>
-      <w:r>
-        <w:rPr>
-          <w:rFonts w:ascii="HelveticaNeueLT Pro 55 Roman" w:hAnsi="HelveticaNeueLT Pro 55 Roman"/>
-          <w:sz w:val="18"/>
-        </w:rPr>
-        <w:t xml:space="preserve"> </w:t>
+        <w:t>K stars)</w:t>
+      </w:r>
+      <w:r>
+        <w:rPr>
+          <w:rFonts w:ascii="HelveticaNeueLT Pro 55 Roman" w:hAnsi="HelveticaNeueLT Pro 55 Roman"/>
+          <w:sz w:val="18"/>
+        </w:rPr>
+        <w:t xml:space="preserve">  ·  </w:t>
       </w:r>
       <w:r>
         <w:rPr>
@@ -2712,23 +2992,7 @@
           <w:sz w:val="22"/>
           <w:szCs w:val="20"/>
         </w:rPr>
-        <w:t>Top</w:t>
-      </w:r>
-      <w:r>
-        <w:rPr>
-          <w:rFonts w:ascii="HelveticaNeueLT Pro 55 Roman" w:hAnsi="HelveticaNeueLT Pro 55 Roman" w:cs="Arial"/>
-          <w:sz w:val="22"/>
-          <w:szCs w:val="20"/>
-        </w:rPr>
-        <w:t xml:space="preserve"> </w:t>
-      </w:r>
-      <w:r>
-        <w:rPr>
-          <w:rFonts w:ascii="HelveticaNeueLT Pro 55 Roman" w:hAnsi="HelveticaNeueLT Pro 55 Roman" w:cs="Arial"/>
-          <w:sz w:val="22"/>
-          <w:szCs w:val="20"/>
-        </w:rPr>
-        <w:t>5</w:t>
+        <w:t>Top 5</w:t>
       </w:r>
       <w:r>
         <w:rPr>
@@ -2912,7 +3176,7 @@
           <w:rFonts w:ascii="HelveticaNeueLT Pro 55 Roman" w:hAnsi="HelveticaNeueLT Pro 55 Roman"/>
           <w:sz w:val="18"/>
         </w:rPr>
-        <w:t>thedotmack</w:t>
+        <w:t>kenn</w:t>
       </w:r>
       <w:proofErr w:type="spellEnd"/>
       <w:r>
@@ -2920,7 +3184,7 @@
           <w:rFonts w:ascii="HelveticaNeueLT Pro 55 Roman" w:hAnsi="HelveticaNeueLT Pro 55 Roman"/>
           <w:sz w:val="18"/>
         </w:rPr>
-        <w:t>/</w:t>
+        <w:t>-io/</w:t>
       </w:r>
       <w:proofErr w:type="spellStart"/>
       <w:r>
@@ -2928,7 +3192,7 @@
           <w:rFonts w:ascii="HelveticaNeueLT Pro 55 Roman" w:hAnsi="HelveticaNeueLT Pro 55 Roman"/>
           <w:sz w:val="18"/>
         </w:rPr>
-        <w:t>claude</w:t>
+        <w:t>agentsview</w:t>
       </w:r>
       <w:proofErr w:type="spellEnd"/>
       <w:r>
@@ -2936,7 +3200,21 @@
           <w:rFonts w:ascii="HelveticaNeueLT Pro 55 Roman" w:hAnsi="HelveticaNeueLT Pro 55 Roman"/>
           <w:sz w:val="18"/>
         </w:rPr>
-        <w:t xml:space="preserve">-mem (80K+ </w:t>
+        <w:t xml:space="preserve"> (</w:t>
+      </w:r>
+      <w:r>
+        <w:rPr>
+          <w:rFonts w:ascii="HelveticaNeueLT Pro 55 Roman" w:hAnsi="HelveticaNeueLT Pro 55 Roman"/>
+          <w:sz w:val="18"/>
+        </w:rPr>
+        <w:t>3</w:t>
+      </w:r>
+      <w:r>
+        <w:rPr>
+          <w:rFonts w:ascii="HelveticaNeueLT Pro 55 Roman" w:hAnsi="HelveticaNeueLT Pro 55 Roman"/>
+          <w:sz w:val="18"/>
+        </w:rPr>
+        <w:t xml:space="preserve">K </w:t>
       </w:r>
       <w:proofErr w:type="gramStart"/>
       <w:r>
@@ -2996,6 +3274,32 @@
           <w:sz w:val="22"/>
           <w:szCs w:val="20"/>
         </w:rPr>
+        <w:t xml:space="preserve">Top 5 </w:t>
+      </w:r>
+      <w:proofErr w:type="gramStart"/>
+      <w:r>
+        <w:rPr>
+          <w:rFonts w:ascii="HelveticaNeueLT Pro 55 Roman" w:hAnsi="HelveticaNeueLT Pro 55 Roman" w:cs="Arial"/>
+          <w:sz w:val="22"/>
+          <w:szCs w:val="20"/>
+        </w:rPr>
+        <w:t>contributor</w:t>
+      </w:r>
+      <w:proofErr w:type="gramEnd"/>
+      <w:r>
+        <w:rPr>
+          <w:rFonts w:ascii="HelveticaNeueLT Pro 55 Roman" w:hAnsi="HelveticaNeueLT Pro 55 Roman" w:cs="Arial"/>
+          <w:sz w:val="22"/>
+          <w:szCs w:val="20"/>
+        </w:rPr>
+        <w:t xml:space="preserve">: </w:t>
+      </w:r>
+      <w:r>
+        <w:rPr>
+          <w:rFonts w:ascii="HelveticaNeueLT Pro 55 Roman" w:hAnsi="HelveticaNeueLT Pro 55 Roman" w:cs="Arial"/>
+          <w:sz w:val="22"/>
+          <w:szCs w:val="20"/>
+        </w:rPr>
         <w:t xml:space="preserve">Postgres sync safety, orphan session recovery, </w:t>
       </w:r>
       <w:proofErr w:type="spellStart"/>
@@ -3005,7 +3309,7 @@
           <w:sz w:val="22"/>
           <w:szCs w:val="20"/>
         </w:rPr>
-        <w:t>OpenCode</w:t>
+        <w:t>Reasonix</w:t>
       </w:r>
       <w:proofErr w:type="spellEnd"/>
       <w:r>
@@ -3014,25 +3318,15 @@
           <w:sz w:val="22"/>
           <w:szCs w:val="20"/>
         </w:rPr>
-        <w:t xml:space="preserve"> and </w:t>
-      </w:r>
-      <w:proofErr w:type="spellStart"/>
-      <w:r>
-        <w:rPr>
-          <w:rFonts w:ascii="HelveticaNeueLT Pro 55 Roman" w:hAnsi="HelveticaNeueLT Pro 55 Roman" w:cs="Arial"/>
-          <w:sz w:val="22"/>
-          <w:szCs w:val="20"/>
-        </w:rPr>
-        <w:t>Reasonix</w:t>
-      </w:r>
-      <w:proofErr w:type="spellEnd"/>
-      <w:r>
-        <w:rPr>
-          <w:rFonts w:ascii="HelveticaNeueLT Pro 55 Roman" w:hAnsi="HelveticaNeueLT Pro 55 Roman" w:cs="Arial"/>
-          <w:sz w:val="22"/>
-          <w:szCs w:val="20"/>
-        </w:rPr>
-        <w:t xml:space="preserve"> parser support.</w:t>
+        <w:t xml:space="preserve"> </w:t>
+      </w:r>
+      <w:r>
+        <w:rPr>
+          <w:rFonts w:ascii="HelveticaNeueLT Pro 55 Roman" w:hAnsi="HelveticaNeueLT Pro 55 Roman" w:cs="Arial"/>
+          <w:sz w:val="22"/>
+          <w:szCs w:val="20"/>
+        </w:rPr>
+        <w:t>parser support.</w:t>
       </w:r>
     </w:p>
     <w:p>
@@ -3690,7 +3984,7 @@
     <w:p/>
     <w:sectPr>
       <w:pgSz w:w="12240" w:h="15840" w:code="1"/>
-      <w:pgMar w:top="1224" w:right="1152" w:bottom="1080" w:left="994" w:header="720" w:footer="720" w:gutter="0"/>
+      <w:pgMar w:top="1152" w:right="1152" w:bottom="1080" w:left="994" w:header="720" w:footer="720" w:gutter="0"/>
       <w:cols w:space="720"/>
       <w:docGrid w:linePitch="360"/>
     </w:sectPr>

</xml_diff>

<commit_message>
Auto-run timeline injection after HTML generation
</commit_message>
<xml_diff>
--- a/resume.docx
+++ b/resume.docx
@@ -474,6 +474,7 @@
                 <w:ilvl w:val="0"/>
                 <w:numId w:val="1"/>
               </w:numPr>
+              <w:ind w:right="188"/>
               <w:rPr>
                 <w:rFonts w:ascii="HelveticaNeueLT Pro 55 Roman" w:hAnsi="HelveticaNeueLT Pro 55 Roman" w:cs="Arial"/>
                 <w:sz w:val="22"/>
@@ -502,7 +503,7 @@
                 <w:sz w:val="22"/>
                 <w:szCs w:val="20"/>
               </w:rPr>
-              <w:t xml:space="preserve"> 5</w:t>
+              <w:t xml:space="preserve"> </w:t>
             </w:r>
             <w:r>
               <w:rPr>
@@ -510,7 +511,7 @@
                 <w:sz w:val="22"/>
                 <w:szCs w:val="20"/>
               </w:rPr>
-              <w:t xml:space="preserve"> OSS repos at 9</w:t>
+              <w:t>five</w:t>
             </w:r>
             <w:r>
               <w:rPr>
@@ -518,6 +519,30 @@
                 <w:sz w:val="22"/>
                 <w:szCs w:val="20"/>
               </w:rPr>
+              <w:t xml:space="preserve"> </w:t>
+            </w:r>
+            <w:r>
+              <w:rPr>
+                <w:rFonts w:ascii="HelveticaNeueLT Pro 55 Roman" w:hAnsi="HelveticaNeueLT Pro 55 Roman" w:cs="Arial"/>
+                <w:sz w:val="22"/>
+                <w:szCs w:val="20"/>
+              </w:rPr>
+              <w:t>AI tooling</w:t>
+            </w:r>
+            <w:r>
+              <w:rPr>
+                <w:rFonts w:ascii="HelveticaNeueLT Pro 55 Roman" w:hAnsi="HelveticaNeueLT Pro 55 Roman" w:cs="Arial"/>
+                <w:sz w:val="22"/>
+                <w:szCs w:val="20"/>
+              </w:rPr>
+              <w:t xml:space="preserve"> repos at 9</w:t>
+            </w:r>
+            <w:r>
+              <w:rPr>
+                <w:rFonts w:ascii="HelveticaNeueLT Pro 55 Roman" w:hAnsi="HelveticaNeueLT Pro 55 Roman" w:cs="Arial"/>
+                <w:sz w:val="22"/>
+                <w:szCs w:val="20"/>
+              </w:rPr>
               <w:t>7</w:t>
             </w:r>
             <w:r>
@@ -570,23 +595,21 @@
               </w:rPr>
               <w:t xml:space="preserve"> to </w:t>
             </w:r>
-            <w:proofErr w:type="spellStart"/>
             <w:r>
               <w:rPr>
                 <w:rFonts w:ascii="HelveticaNeueLT Pro 55 Roman" w:hAnsi="HelveticaNeueLT Pro 55 Roman" w:cs="Arial"/>
                 <w:sz w:val="22"/>
                 <w:szCs w:val="20"/>
               </w:rPr>
-              <w:t>claude</w:t>
-            </w:r>
-            <w:proofErr w:type="spellEnd"/>
+              <w:t>claude-mem</w:t>
+            </w:r>
             <w:r>
               <w:rPr>
                 <w:rFonts w:ascii="HelveticaNeueLT Pro 55 Roman" w:hAnsi="HelveticaNeueLT Pro 55 Roman" w:cs="Arial"/>
                 <w:sz w:val="22"/>
                 <w:szCs w:val="20"/>
               </w:rPr>
-              <w:t>-mem (80</w:t>
+              <w:t xml:space="preserve"> </w:t>
             </w:r>
             <w:r>
               <w:rPr>
@@ -594,6 +617,14 @@
                 <w:sz w:val="22"/>
                 <w:szCs w:val="20"/>
               </w:rPr>
+              <w:t>(80</w:t>
+            </w:r>
+            <w:r>
+              <w:rPr>
+                <w:rFonts w:ascii="HelveticaNeueLT Pro 55 Roman" w:hAnsi="HelveticaNeueLT Pro 55 Roman" w:cs="Arial"/>
+                <w:sz w:val="22"/>
+                <w:szCs w:val="20"/>
+              </w:rPr>
               <w:t>k</w:t>
             </w:r>
             <w:r>
@@ -602,16 +633,15 @@
                 <w:sz w:val="22"/>
                 <w:szCs w:val="20"/>
               </w:rPr>
-              <w:t xml:space="preserve"> stars</w:t>
-            </w:r>
-            <w:proofErr w:type="gramStart"/>
+              <w:t xml:space="preserve"> stars)</w:t>
+            </w:r>
             <w:r>
               <w:rPr>
                 <w:rFonts w:ascii="HelveticaNeueLT Pro 55 Roman" w:hAnsi="HelveticaNeueLT Pro 55 Roman" w:cs="Arial"/>
                 <w:sz w:val="22"/>
                 <w:szCs w:val="20"/>
               </w:rPr>
-              <w:t>)</w:t>
+              <w:t xml:space="preserve">, #2 on </w:t>
             </w:r>
             <w:r>
               <w:rPr>
@@ -619,34 +649,31 @@
                 <w:sz w:val="22"/>
                 <w:szCs w:val="20"/>
               </w:rPr>
-              <w:t>, #</w:t>
-            </w:r>
-            <w:proofErr w:type="gramEnd"/>
+              <w:t>hermes-webui (14</w:t>
+            </w:r>
             <w:r>
               <w:rPr>
                 <w:rFonts w:ascii="HelveticaNeueLT Pro 55 Roman" w:hAnsi="HelveticaNeueLT Pro 55 Roman" w:cs="Arial"/>
                 <w:sz w:val="22"/>
                 <w:szCs w:val="20"/>
               </w:rPr>
-              <w:t xml:space="preserve">2 on </w:t>
-            </w:r>
-            <w:proofErr w:type="spellStart"/>
+              <w:t>k</w:t>
+            </w:r>
             <w:r>
               <w:rPr>
                 <w:rFonts w:ascii="HelveticaNeueLT Pro 55 Roman" w:hAnsi="HelveticaNeueLT Pro 55 Roman" w:cs="Arial"/>
                 <w:sz w:val="22"/>
                 <w:szCs w:val="20"/>
               </w:rPr>
-              <w:t>hermes-webui</w:t>
-            </w:r>
-            <w:proofErr w:type="spellEnd"/>
+              <w:t xml:space="preserve"> stars)</w:t>
+            </w:r>
             <w:r>
               <w:rPr>
                 <w:rFonts w:ascii="HelveticaNeueLT Pro 55 Roman" w:hAnsi="HelveticaNeueLT Pro 55 Roman" w:cs="Arial"/>
                 <w:sz w:val="22"/>
                 <w:szCs w:val="20"/>
               </w:rPr>
-              <w:t xml:space="preserve"> (14</w:t>
+              <w:t xml:space="preserve"> and</w:t>
             </w:r>
             <w:r>
               <w:rPr>
@@ -654,7 +681,7 @@
                 <w:sz w:val="22"/>
                 <w:szCs w:val="20"/>
               </w:rPr>
-              <w:t>k</w:t>
+              <w:t xml:space="preserve"> </w:t>
             </w:r>
             <w:r>
               <w:rPr>
@@ -662,41 +689,7 @@
                 <w:sz w:val="22"/>
                 <w:szCs w:val="20"/>
               </w:rPr>
-              <w:t xml:space="preserve"> stars)</w:t>
-            </w:r>
-            <w:r>
-              <w:rPr>
-                <w:rFonts w:ascii="HelveticaNeueLT Pro 55 Roman" w:hAnsi="HelveticaNeueLT Pro 55 Roman" w:cs="Arial"/>
-                <w:sz w:val="22"/>
-                <w:szCs w:val="20"/>
-              </w:rPr>
-              <w:t xml:space="preserve"> and</w:t>
-            </w:r>
-            <w:r>
-              <w:rPr>
-                <w:rFonts w:ascii="HelveticaNeueLT Pro 55 Roman" w:hAnsi="HelveticaNeueLT Pro 55 Roman" w:cs="Arial"/>
-                <w:sz w:val="22"/>
-                <w:szCs w:val="20"/>
-              </w:rPr>
-              <w:t xml:space="preserve"> </w:t>
-            </w:r>
-            <w:proofErr w:type="spellStart"/>
-            <w:r>
-              <w:rPr>
-                <w:rFonts w:ascii="HelveticaNeueLT Pro 55 Roman" w:hAnsi="HelveticaNeueLT Pro 55 Roman" w:cs="Arial"/>
-                <w:sz w:val="22"/>
-                <w:szCs w:val="20"/>
-              </w:rPr>
-              <w:t>agentsview</w:t>
-            </w:r>
-            <w:proofErr w:type="spellEnd"/>
-            <w:r>
-              <w:rPr>
-                <w:rFonts w:ascii="HelveticaNeueLT Pro 55 Roman" w:hAnsi="HelveticaNeueLT Pro 55 Roman" w:cs="Arial"/>
-                <w:sz w:val="22"/>
-                <w:szCs w:val="20"/>
-              </w:rPr>
-              <w:t xml:space="preserve"> (3</w:t>
+              <w:t>agentsview (3</w:t>
             </w:r>
             <w:r>
               <w:rPr>
@@ -742,7 +735,23 @@
                 <w:sz w:val="22"/>
                 <w:szCs w:val="20"/>
               </w:rPr>
-              <w:t>234% conversion rate over e-commerce industry average; 42% YOY revenue growth (Shopify/Hydrogen).</w:t>
+              <w:t>234% conversion rate over e-commerce industry average; 42% YOY revenue growth</w:t>
+            </w:r>
+            <w:r>
+              <w:rPr>
+                <w:rFonts w:ascii="HelveticaNeueLT Pro 55 Roman" w:hAnsi="HelveticaNeueLT Pro 55 Roman" w:cs="Arial"/>
+                <w:sz w:val="22"/>
+                <w:szCs w:val="20"/>
+              </w:rPr>
+              <w:t xml:space="preserve"> (</w:t>
+            </w:r>
+            <w:r>
+              <w:rPr>
+                <w:rFonts w:ascii="HelveticaNeueLT Pro 55 Roman" w:hAnsi="HelveticaNeueLT Pro 55 Roman" w:cs="Arial"/>
+                <w:sz w:val="22"/>
+                <w:szCs w:val="20"/>
+              </w:rPr>
+              <w:t>Shopify).</w:t>
             </w:r>
           </w:p>
           <w:p>
@@ -1072,8 +1081,8 @@
         <w:spacing w:line="264" w:lineRule="auto"/>
         <w:rPr>
           <w:rFonts w:ascii="HelveticaNeueLT Pro 55 Roman" w:hAnsi="HelveticaNeueLT Pro 55 Roman" w:cs="Arial"/>
-          <w:sz w:val="14"/>
-          <w:szCs w:val="14"/>
+          <w:sz w:val="18"/>
+          <w:szCs w:val="18"/>
         </w:rPr>
       </w:pPr>
     </w:p>
@@ -1836,7 +1845,7 @@
     </w:p>
     <w:p>
       <w:pPr>
-        <w:spacing w:before="120" w:after="40" w:line="264" w:lineRule="auto"/>
+        <w:spacing w:before="80" w:line="264" w:lineRule="auto"/>
         <w:ind w:left="259"/>
         <w:rPr>
           <w:rFonts w:ascii="HelveticaNeueLT Pro 55 Roman" w:hAnsi="HelveticaNeueLT Pro 55 Roman"/>
@@ -1869,25 +1878,7 @@
           <w:bCs/>
           <w:sz w:val="18"/>
         </w:rPr>
-        <w:t>ext.js (App Router), React, Tailwind CSS, Node.js Worker Threads, Leaflet/</w:t>
-      </w:r>
-      <w:proofErr w:type="spellStart"/>
-      <w:r>
-        <w:rPr>
-          <w:rFonts w:ascii="HelveticaNeueLT Pro 55 Roman" w:hAnsi="HelveticaNeueLT Pro 55 Roman"/>
-          <w:bCs/>
-          <w:sz w:val="18"/>
-        </w:rPr>
-        <w:t>Mapbox</w:t>
-      </w:r>
-      <w:proofErr w:type="spellEnd"/>
-      <w:r>
-        <w:rPr>
-          <w:rFonts w:ascii="HelveticaNeueLT Pro 55 Roman" w:hAnsi="HelveticaNeueLT Pro 55 Roman"/>
-          <w:bCs/>
-          <w:sz w:val="18"/>
-        </w:rPr>
-        <w:t>, MS SQL Server.</w:t>
+        <w:t>ext.js (App Router), React, Tailwind CSS, Node.js Worker Threads, Leaflet/Mapbox, MS SQL Server.</w:t>
       </w:r>
     </w:p>
     <w:p>
@@ -1895,8 +1886,8 @@
         <w:spacing w:after="40" w:line="264" w:lineRule="auto"/>
         <w:rPr>
           <w:rFonts w:ascii="HelveticaNeueLT Pro 55 Roman" w:hAnsi="HelveticaNeueLT Pro 55 Roman" w:cs="Arial"/>
-          <w:sz w:val="10"/>
-          <w:szCs w:val="10"/>
+          <w:sz w:val="22"/>
+          <w:szCs w:val="22"/>
         </w:rPr>
       </w:pPr>
     </w:p>
@@ -1922,16 +1913,15 @@
                 <w:i/>
               </w:rPr>
             </w:pPr>
-            <w:proofErr w:type="spellStart"/>
             <w:r>
               <w:rPr>
                 <w:rFonts w:ascii="HelveticaNeueLT Pro 55 Roman" w:hAnsi="HelveticaNeueLT Pro 55 Roman" w:cs="Arial"/>
                 <w:sz w:val="32"/>
                 <w:szCs w:val="32"/>
               </w:rPr>
+              <w:lastRenderedPageBreak/>
               <w:t>Mezocliq</w:t>
             </w:r>
-            <w:proofErr w:type="spellEnd"/>
           </w:p>
         </w:tc>
         <w:tc>
@@ -2178,23 +2168,15 @@
           <w:sz w:val="22"/>
           <w:szCs w:val="20"/>
         </w:rPr>
-        <w:t xml:space="preserve">Visa, Barclays, NFL, Chase, Hyatt, Apple, Disney, US Airways, PNC Bank, Virgin America, UBS, Ritz-Carlton, Sallie Mae, ADP, </w:t>
-      </w:r>
-      <w:r>
-        <w:rPr>
-          <w:rFonts w:ascii="HelveticaNeueLT Pro 55 Roman" w:hAnsi="HelveticaNeueLT Pro 55 Roman" w:cs="Arial"/>
-          <w:sz w:val="22"/>
-          <w:szCs w:val="20"/>
-        </w:rPr>
-        <w:t xml:space="preserve">IOC, </w:t>
-      </w:r>
-      <w:r>
-        <w:rPr>
-          <w:rFonts w:ascii="HelveticaNeueLT Pro 55 Roman" w:hAnsi="HelveticaNeueLT Pro 55 Roman" w:cs="Arial"/>
-          <w:sz w:val="22"/>
-          <w:szCs w:val="20"/>
-        </w:rPr>
-        <w:t>and AARP.</w:t>
+        <w:t>Visa, Barclays, NFL, Chase, Hyatt, Apple, Disney, US Airways, PNC Bank, Virgin America</w:t>
+      </w:r>
+      <w:r>
+        <w:rPr>
+          <w:rFonts w:ascii="HelveticaNeueLT Pro 55 Roman" w:hAnsi="HelveticaNeueLT Pro 55 Roman" w:cs="Arial"/>
+          <w:sz w:val="22"/>
+          <w:szCs w:val="20"/>
+        </w:rPr>
+        <w:t>.</w:t>
       </w:r>
     </w:p>
     <w:p>
@@ -2684,190 +2666,162 @@
           <w:szCs w:val="20"/>
         </w:rPr>
       </w:pPr>
-      <w:proofErr w:type="spellStart"/>
       <w:r>
         <w:rPr>
           <w:rFonts w:ascii="HelveticaNeueLT Pro 55 Roman" w:hAnsi="HelveticaNeueLT Pro 55 Roman"/>
           <w:b/>
           <w:sz w:val="22"/>
         </w:rPr>
-        <w:t>hermes-webui</w:t>
-      </w:r>
-      <w:proofErr w:type="spellEnd"/>
-      <w:r>
-        <w:rPr>
-          <w:rFonts w:ascii="HelveticaNeueLT Pro 55 Roman" w:hAnsi="HelveticaNeueLT Pro 55 Roman"/>
-          <w:sz w:val="18"/>
-        </w:rPr>
-        <w:t xml:space="preserve">  ·  github.com/</w:t>
-      </w:r>
-      <w:proofErr w:type="spellStart"/>
-      <w:r>
-        <w:rPr>
-          <w:rFonts w:ascii="HelveticaNeueLT Pro 55 Roman" w:hAnsi="HelveticaNeueLT Pro 55 Roman"/>
-          <w:sz w:val="18"/>
-        </w:rPr>
-        <w:t>nesquena</w:t>
-      </w:r>
-      <w:proofErr w:type="spellEnd"/>
-      <w:r>
-        <w:rPr>
-          <w:rFonts w:ascii="HelveticaNeueLT Pro 55 Roman" w:hAnsi="HelveticaNeueLT Pro 55 Roman"/>
-          <w:sz w:val="18"/>
-        </w:rPr>
-        <w:t>/</w:t>
-      </w:r>
-      <w:proofErr w:type="spellStart"/>
-      <w:r>
-        <w:rPr>
-          <w:rFonts w:ascii="HelveticaNeueLT Pro 55 Roman" w:hAnsi="HelveticaNeueLT Pro 55 Roman"/>
-          <w:sz w:val="18"/>
-        </w:rPr>
-        <w:t>hermes-webui</w:t>
-      </w:r>
-      <w:proofErr w:type="spellEnd"/>
-      <w:r>
-        <w:rPr>
-          <w:rFonts w:ascii="HelveticaNeueLT Pro 55 Roman" w:hAnsi="HelveticaNeueLT Pro 55 Roman"/>
-          <w:sz w:val="18"/>
-        </w:rPr>
-        <w:t xml:space="preserve"> (14K </w:t>
-      </w:r>
-      <w:proofErr w:type="gramStart"/>
-      <w:r>
-        <w:rPr>
-          <w:rFonts w:ascii="HelveticaNeueLT Pro 55 Roman" w:hAnsi="HelveticaNeueLT Pro 55 Roman"/>
-          <w:sz w:val="18"/>
-        </w:rPr>
-        <w:t xml:space="preserve">stars)  · </w:t>
-      </w:r>
-      <w:proofErr w:type="gramEnd"/>
-      <w:r>
-        <w:rPr>
-          <w:rFonts w:ascii="HelveticaNeueLT Pro 55 Roman" w:hAnsi="HelveticaNeueLT Pro 55 Roman"/>
-          <w:sz w:val="18"/>
+        <w:t>thedotmack/claude-mem</w:t>
+      </w:r>
+      <w:r>
+        <w:rPr>
+          <w:rFonts w:ascii="HelveticaNeueLT Pro 55 Roman" w:hAnsi="HelveticaNeueLT Pro 55 Roman"/>
+          <w:sz w:val="18"/>
+        </w:rPr>
+        <w:t xml:space="preserve"> (85k stars)  ·  </w:t>
+      </w:r>
+      <w:r>
+        <w:rPr>
+          <w:rFonts w:ascii="HelveticaNeueLT Pro 55 Roman" w:hAnsi="HelveticaNeueLT Pro 55 Roman"/>
+          <w:bCs/>
+          <w:sz w:val="18"/>
+        </w:rPr>
+        <w:t>TypeScript, JavaScript, Shell, HTML</w:t>
+      </w:r>
+      <w:r>
+        <w:rPr>
+          <w:rFonts w:ascii="HelveticaNeueLT Pro 55 Roman" w:hAnsi="HelveticaNeueLT Pro 55 Roman"/>
+          <w:sz w:val="18"/>
+        </w:rPr>
+        <w:t xml:space="preserve">  ·  </w:t>
+      </w:r>
+      <w:r>
+        <w:rPr>
+          <w:rFonts w:ascii="HelveticaNeueLT Pro 55 Roman" w:hAnsi="HelveticaNeueLT Pro 55 Roman"/>
+          <w:sz w:val="22"/>
+          <w:szCs w:val="22"/>
+        </w:rPr>
+        <w:t>Persistent memory for agents.</w:t>
+      </w:r>
+      <w:r>
+        <w:rPr>
+          <w:rFonts w:ascii="HelveticaNeueLT Pro 55 Roman" w:hAnsi="HelveticaNeueLT Pro 55 Roman"/>
+          <w:sz w:val="18"/>
+        </w:rPr>
+        <w:br/>
+      </w:r>
+      <w:r>
+        <w:rPr>
+          <w:rFonts w:ascii="HelveticaNeueLT Pro 55 Roman" w:hAnsi="HelveticaNeueLT Pro 55 Roman" w:cs="Arial"/>
+          <w:sz w:val="22"/>
+          <w:szCs w:val="20"/>
+        </w:rPr>
+        <w:t>Top 5 contributor. S</w:t>
+      </w:r>
+      <w:r>
+        <w:rPr>
+          <w:rFonts w:ascii="HelveticaNeueLT Pro 55 Roman" w:hAnsi="HelveticaNeueLT Pro 55 Roman" w:cs="Arial"/>
+          <w:sz w:val="22"/>
+          <w:szCs w:val="20"/>
+        </w:rPr>
+        <w:t xml:space="preserve">pawn storm </w:t>
+      </w:r>
+      <w:r>
+        <w:rPr>
+          <w:rFonts w:ascii="HelveticaNeueLT Pro 55 Roman" w:hAnsi="HelveticaNeueLT Pro 55 Roman" w:cs="Arial"/>
+          <w:sz w:val="22"/>
+          <w:szCs w:val="20"/>
+        </w:rPr>
+        <w:t>defense,</w:t>
+      </w:r>
+      <w:r>
+        <w:rPr>
+          <w:rFonts w:ascii="HelveticaNeueLT Pro 55 Roman" w:hAnsi="HelveticaNeueLT Pro 55 Roman" w:cs="Arial"/>
+          <w:sz w:val="22"/>
+          <w:szCs w:val="20"/>
         </w:rPr>
         <w:t xml:space="preserve"> </w:t>
       </w:r>
       <w:r>
         <w:rPr>
-          <w:rFonts w:ascii="HelveticaNeueLT Pro 55 Roman" w:hAnsi="HelveticaNeueLT Pro 55 Roman"/>
-          <w:sz w:val="22"/>
-          <w:szCs w:val="22"/>
-        </w:rPr>
-        <w:t>Web UI for Hermes Agent. #</w:t>
-      </w:r>
-      <w:r>
-        <w:rPr>
-          <w:rFonts w:ascii="HelveticaNeueLT Pro 55 Roman" w:hAnsi="HelveticaNeueLT Pro 55 Roman"/>
-          <w:sz w:val="22"/>
-          <w:szCs w:val="22"/>
-        </w:rPr>
-        <w:t>2</w:t>
-      </w:r>
-      <w:r>
-        <w:rPr>
-          <w:rFonts w:ascii="HelveticaNeueLT Pro 55 Roman" w:hAnsi="HelveticaNeueLT Pro 55 Roman"/>
-          <w:sz w:val="22"/>
-          <w:szCs w:val="22"/>
-        </w:rPr>
-        <w:t xml:space="preserve"> contributor. </w:t>
-      </w:r>
-      <w:r>
-        <w:rPr>
-          <w:rFonts w:ascii="HelveticaNeueLT Pro 55 Roman" w:hAnsi="HelveticaNeueLT Pro 55 Roman"/>
-          <w:sz w:val="22"/>
-          <w:szCs w:val="22"/>
-        </w:rPr>
-        <w:t>S</w:t>
-      </w:r>
-      <w:r>
-        <w:rPr>
-          <w:rFonts w:ascii="HelveticaNeueLT Pro 55 Roman" w:hAnsi="HelveticaNeueLT Pro 55 Roman"/>
-          <w:sz w:val="22"/>
-          <w:szCs w:val="22"/>
-        </w:rPr>
-        <w:t xml:space="preserve">treaming </w:t>
-      </w:r>
-      <w:r>
-        <w:rPr>
-          <w:rFonts w:ascii="HelveticaNeueLT Pro 55 Roman" w:hAnsi="HelveticaNeueLT Pro 55 Roman"/>
-          <w:sz w:val="22"/>
-          <w:szCs w:val="22"/>
-        </w:rPr>
-        <w:t>performance</w:t>
-      </w:r>
-      <w:r>
-        <w:rPr>
-          <w:rFonts w:ascii="HelveticaNeueLT Pro 55 Roman" w:hAnsi="HelveticaNeueLT Pro 55 Roman"/>
-          <w:sz w:val="22"/>
-          <w:szCs w:val="22"/>
-        </w:rPr>
-        <w:t xml:space="preserve">, provider </w:t>
-      </w:r>
-      <w:r>
-        <w:rPr>
-          <w:rFonts w:ascii="HelveticaNeueLT Pro 55 Roman" w:hAnsi="HelveticaNeueLT Pro 55 Roman"/>
-          <w:sz w:val="22"/>
-          <w:szCs w:val="22"/>
-        </w:rPr>
-        <w:t>routing</w:t>
-      </w:r>
-      <w:r>
-        <w:rPr>
-          <w:rFonts w:ascii="HelveticaNeueLT Pro 55 Roman" w:hAnsi="HelveticaNeueLT Pro 55 Roman"/>
-          <w:sz w:val="22"/>
-          <w:szCs w:val="22"/>
-        </w:rPr>
-        <w:t xml:space="preserve">, session </w:t>
-      </w:r>
-      <w:r>
-        <w:rPr>
-          <w:rFonts w:ascii="HelveticaNeueLT Pro 55 Roman" w:hAnsi="HelveticaNeueLT Pro 55 Roman"/>
-          <w:sz w:val="22"/>
-          <w:szCs w:val="22"/>
-        </w:rPr>
-        <w:t>lifecycle</w:t>
-      </w:r>
-      <w:r>
-        <w:rPr>
-          <w:rFonts w:ascii="HelveticaNeueLT Pro 55 Roman" w:hAnsi="HelveticaNeueLT Pro 55 Roman"/>
-          <w:sz w:val="22"/>
-          <w:szCs w:val="22"/>
+          <w:rFonts w:ascii="HelveticaNeueLT Pro 55 Roman" w:hAnsi="HelveticaNeueLT Pro 55 Roman" w:cs="Arial"/>
+          <w:sz w:val="22"/>
+          <w:szCs w:val="20"/>
+        </w:rPr>
+        <w:t>h</w:t>
+      </w:r>
+      <w:r>
+        <w:rPr>
+          <w:rFonts w:ascii="HelveticaNeueLT Pro 55 Roman" w:hAnsi="HelveticaNeueLT Pro 55 Roman" w:cs="Arial"/>
+          <w:sz w:val="22"/>
+          <w:szCs w:val="20"/>
+        </w:rPr>
+        <w:t xml:space="preserve">ook/worker </w:t>
+      </w:r>
+      <w:r>
+        <w:rPr>
+          <w:rFonts w:ascii="HelveticaNeueLT Pro 55 Roman" w:hAnsi="HelveticaNeueLT Pro 55 Roman" w:cs="Arial"/>
+          <w:sz w:val="22"/>
+          <w:szCs w:val="20"/>
+        </w:rPr>
+        <w:t xml:space="preserve">lifecycle </w:t>
+      </w:r>
+      <w:r>
+        <w:rPr>
+          <w:rFonts w:ascii="HelveticaNeueLT Pro 55 Roman" w:hAnsi="HelveticaNeueLT Pro 55 Roman" w:cs="Arial"/>
+          <w:sz w:val="22"/>
+          <w:szCs w:val="20"/>
+        </w:rPr>
+        <w:t>hardening</w:t>
+      </w:r>
+      <w:r>
+        <w:rPr>
+          <w:rFonts w:ascii="HelveticaNeueLT Pro 55 Roman" w:hAnsi="HelveticaNeueLT Pro 55 Roman" w:cs="Arial"/>
+          <w:sz w:val="22"/>
+          <w:szCs w:val="20"/>
         </w:rPr>
         <w:t>,</w:t>
       </w:r>
       <w:r>
         <w:rPr>
-          <w:rFonts w:ascii="HelveticaNeueLT Pro 55 Roman" w:hAnsi="HelveticaNeueLT Pro 55 Roman"/>
-          <w:sz w:val="22"/>
-          <w:szCs w:val="22"/>
-        </w:rPr>
-        <w:t xml:space="preserve"> workspace, security,</w:t>
-      </w:r>
-      <w:r>
-        <w:rPr>
-          <w:rFonts w:ascii="HelveticaNeueLT Pro 55 Roman" w:hAnsi="HelveticaNeueLT Pro 55 Roman"/>
-          <w:sz w:val="22"/>
-          <w:szCs w:val="22"/>
+          <w:rFonts w:ascii="HelveticaNeueLT Pro 55 Roman" w:hAnsi="HelveticaNeueLT Pro 55 Roman" w:cs="Arial"/>
+          <w:sz w:val="22"/>
+          <w:szCs w:val="20"/>
         </w:rPr>
         <w:t xml:space="preserve"> </w:t>
       </w:r>
       <w:r>
         <w:rPr>
-          <w:rFonts w:ascii="HelveticaNeueLT Pro 55 Roman" w:hAnsi="HelveticaNeueLT Pro 55 Roman"/>
-          <w:sz w:val="22"/>
-          <w:szCs w:val="22"/>
-        </w:rPr>
-        <w:t>Windows</w:t>
-      </w:r>
-      <w:r>
-        <w:rPr>
-          <w:rFonts w:ascii="HelveticaNeueLT Pro 55 Roman" w:hAnsi="HelveticaNeueLT Pro 55 Roman"/>
-          <w:sz w:val="22"/>
-          <w:szCs w:val="22"/>
-        </w:rPr>
-        <w:t xml:space="preserve"> support.</w:t>
+          <w:rFonts w:ascii="HelveticaNeueLT Pro 55 Roman" w:hAnsi="HelveticaNeueLT Pro 55 Roman" w:cs="Arial"/>
+          <w:sz w:val="22"/>
+          <w:szCs w:val="20"/>
+        </w:rPr>
+        <w:t>daemon</w:t>
+      </w:r>
+      <w:r>
+        <w:rPr>
+          <w:rFonts w:ascii="HelveticaNeueLT Pro 55 Roman" w:hAnsi="HelveticaNeueLT Pro 55 Roman" w:cs="Arial"/>
+          <w:sz w:val="22"/>
+          <w:szCs w:val="20"/>
+        </w:rPr>
+        <w:t xml:space="preserve"> </w:t>
+      </w:r>
+      <w:r>
+        <w:rPr>
+          <w:rFonts w:ascii="HelveticaNeueLT Pro 55 Roman" w:hAnsi="HelveticaNeueLT Pro 55 Roman" w:cs="Arial"/>
+          <w:sz w:val="22"/>
+          <w:szCs w:val="20"/>
+        </w:rPr>
+        <w:t>resilience</w:t>
+      </w:r>
+      <w:r>
+        <w:rPr>
+          <w:rFonts w:ascii="HelveticaNeueLT Pro 55 Roman" w:hAnsi="HelveticaNeueLT Pro 55 Roman" w:cs="Arial"/>
+          <w:sz w:val="22"/>
+          <w:szCs w:val="20"/>
+        </w:rPr>
+        <w:t>.</w:t>
       </w:r>
     </w:p>
     <w:p>
@@ -2890,76 +2844,50 @@
           <w:szCs w:val="22"/>
         </w:rPr>
       </w:pPr>
-      <w:proofErr w:type="spellStart"/>
       <w:r>
         <w:rPr>
           <w:rFonts w:ascii="HelveticaNeueLT Pro 55 Roman" w:hAnsi="HelveticaNeueLT Pro 55 Roman"/>
           <w:b/>
           <w:sz w:val="22"/>
         </w:rPr>
-        <w:t>claude</w:t>
-      </w:r>
-      <w:proofErr w:type="spellEnd"/>
+        <w:t>nesquena/</w:t>
+      </w:r>
       <w:r>
         <w:rPr>
           <w:rFonts w:ascii="HelveticaNeueLT Pro 55 Roman" w:hAnsi="HelveticaNeueLT Pro 55 Roman"/>
           <w:b/>
           <w:sz w:val="22"/>
         </w:rPr>
-        <w:t>-mem</w:t>
-      </w:r>
-      <w:r>
-        <w:rPr>
-          <w:rFonts w:ascii="HelveticaNeueLT Pro 55 Roman" w:hAnsi="HelveticaNeueLT Pro 55 Roman"/>
-          <w:sz w:val="18"/>
-        </w:rPr>
-        <w:t xml:space="preserve">  ·  github.com/</w:t>
-      </w:r>
-      <w:proofErr w:type="spellStart"/>
-      <w:r>
-        <w:rPr>
-          <w:rFonts w:ascii="HelveticaNeueLT Pro 55 Roman" w:hAnsi="HelveticaNeueLT Pro 55 Roman"/>
-          <w:sz w:val="18"/>
-        </w:rPr>
-        <w:t>thedotmack</w:t>
-      </w:r>
-      <w:proofErr w:type="spellEnd"/>
-      <w:r>
-        <w:rPr>
-          <w:rFonts w:ascii="HelveticaNeueLT Pro 55 Roman" w:hAnsi="HelveticaNeueLT Pro 55 Roman"/>
-          <w:sz w:val="18"/>
-        </w:rPr>
-        <w:t>/</w:t>
-      </w:r>
-      <w:proofErr w:type="spellStart"/>
-      <w:r>
-        <w:rPr>
-          <w:rFonts w:ascii="HelveticaNeueLT Pro 55 Roman" w:hAnsi="HelveticaNeueLT Pro 55 Roman"/>
-          <w:sz w:val="18"/>
-        </w:rPr>
-        <w:t>claude</w:t>
-      </w:r>
-      <w:proofErr w:type="spellEnd"/>
-      <w:r>
-        <w:rPr>
-          <w:rFonts w:ascii="HelveticaNeueLT Pro 55 Roman" w:hAnsi="HelveticaNeueLT Pro 55 Roman"/>
-          <w:sz w:val="18"/>
-        </w:rPr>
-        <w:t>-mem (</w:t>
-      </w:r>
-      <w:r>
-        <w:rPr>
-          <w:rFonts w:ascii="HelveticaNeueLT Pro 55 Roman" w:hAnsi="HelveticaNeueLT Pro 55 Roman"/>
-          <w:sz w:val="18"/>
-        </w:rPr>
-        <w:t>80</w:t>
-      </w:r>
-      <w:r>
-        <w:rPr>
-          <w:rFonts w:ascii="HelveticaNeueLT Pro 55 Roman" w:hAnsi="HelveticaNeueLT Pro 55 Roman"/>
-          <w:sz w:val="18"/>
-        </w:rPr>
-        <w:t>K stars)</w:t>
+        <w:t>hermes-webui</w:t>
+      </w:r>
+      <w:r>
+        <w:rPr>
+          <w:rFonts w:ascii="HelveticaNeueLT Pro 55 Roman" w:hAnsi="HelveticaNeueLT Pro 55 Roman"/>
+          <w:sz w:val="18"/>
+        </w:rPr>
+        <w:t xml:space="preserve">  </w:t>
+      </w:r>
+      <w:r>
+        <w:rPr>
+          <w:rFonts w:ascii="HelveticaNeueLT Pro 55 Roman" w:hAnsi="HelveticaNeueLT Pro 55 Roman"/>
+          <w:sz w:val="18"/>
+        </w:rPr>
+        <w:t xml:space="preserve">(15k stars)  </w:t>
+      </w:r>
+      <w:r>
+        <w:rPr>
+          <w:rFonts w:ascii="HelveticaNeueLT Pro 55 Roman" w:hAnsi="HelveticaNeueLT Pro 55 Roman"/>
+          <w:sz w:val="18"/>
+        </w:rPr>
+        <w:t xml:space="preserve">·  </w:t>
+      </w:r>
+      <w:r>
+        <w:rPr>
+          <w:rFonts w:ascii="HelveticaNeueLT Pro 55 Roman" w:hAnsi="HelveticaNeueLT Pro 55 Roman"/>
+          <w:bCs/>
+          <w:sz w:val="18"/>
+        </w:rPr>
+        <w:t>Python, JavaScript, CSS, HTML, Shell</w:t>
       </w:r>
       <w:r>
         <w:rPr>
@@ -2974,161 +2902,85 @@
           <w:sz w:val="22"/>
           <w:szCs w:val="22"/>
         </w:rPr>
-        <w:t>Persistent memory for AI coding agents.</w:t>
-      </w:r>
-    </w:p>
-    <w:p>
-      <w:pPr>
-        <w:spacing w:line="264" w:lineRule="auto"/>
-        <w:rPr>
-          <w:rFonts w:ascii="HelveticaNeueLT Pro 55 Roman" w:hAnsi="HelveticaNeueLT Pro 55 Roman" w:cs="Arial"/>
-          <w:sz w:val="22"/>
-          <w:szCs w:val="20"/>
-        </w:rPr>
-      </w:pPr>
-      <w:r>
-        <w:rPr>
-          <w:rFonts w:ascii="HelveticaNeueLT Pro 55 Roman" w:hAnsi="HelveticaNeueLT Pro 55 Roman" w:cs="Arial"/>
-          <w:sz w:val="22"/>
-          <w:szCs w:val="20"/>
-        </w:rPr>
-        <w:t>Top 5</w:t>
-      </w:r>
-      <w:r>
-        <w:rPr>
-          <w:rFonts w:ascii="HelveticaNeueLT Pro 55 Roman" w:hAnsi="HelveticaNeueLT Pro 55 Roman" w:cs="Arial"/>
-          <w:sz w:val="22"/>
-          <w:szCs w:val="20"/>
+        <w:t>W</w:t>
+      </w:r>
+      <w:r>
+        <w:rPr>
+          <w:rFonts w:ascii="HelveticaNeueLT Pro 55 Roman" w:hAnsi="HelveticaNeueLT Pro 55 Roman"/>
+          <w:sz w:val="22"/>
+          <w:szCs w:val="22"/>
+        </w:rPr>
+        <w:t>eb UI for Hermes Agent.</w:t>
+      </w:r>
+      <w:r>
+        <w:rPr>
+          <w:rFonts w:ascii="HelveticaNeueLT Pro 55 Roman" w:hAnsi="HelveticaNeueLT Pro 55 Roman"/>
+          <w:sz w:val="22"/>
+          <w:szCs w:val="22"/>
+        </w:rPr>
+        <w:br/>
+      </w:r>
+      <w:r>
+        <w:rPr>
+          <w:rFonts w:ascii="HelveticaNeueLT Pro 55 Roman" w:hAnsi="HelveticaNeueLT Pro 55 Roman"/>
+          <w:sz w:val="22"/>
+          <w:szCs w:val="22"/>
+        </w:rPr>
+        <w:t xml:space="preserve">#2 contributor. </w:t>
+      </w:r>
+      <w:r>
+        <w:rPr>
+          <w:rFonts w:ascii="HelveticaNeueLT Pro 55 Roman" w:hAnsi="HelveticaNeueLT Pro 55 Roman"/>
+          <w:sz w:val="22"/>
+          <w:szCs w:val="22"/>
+        </w:rPr>
+        <w:t>UX/UI, g</w:t>
+      </w:r>
+      <w:r>
+        <w:rPr>
+          <w:rFonts w:ascii="HelveticaNeueLT Pro 55 Roman" w:hAnsi="HelveticaNeueLT Pro 55 Roman"/>
+          <w:sz w:val="22"/>
+          <w:szCs w:val="22"/>
+        </w:rPr>
+        <w:t xml:space="preserve">ateway credential routing, session lifecycle, </w:t>
+      </w:r>
+      <w:r>
+        <w:rPr>
+          <w:rFonts w:ascii="HelveticaNeueLT Pro 55 Roman" w:hAnsi="HelveticaNeueLT Pro 55 Roman"/>
+          <w:sz w:val="22"/>
+          <w:szCs w:val="22"/>
+        </w:rPr>
+        <w:t>s</w:t>
+      </w:r>
+      <w:r>
+        <w:rPr>
+          <w:rFonts w:ascii="HelveticaNeueLT Pro 55 Roman" w:hAnsi="HelveticaNeueLT Pro 55 Roman"/>
+          <w:sz w:val="22"/>
+          <w:szCs w:val="22"/>
+        </w:rPr>
+        <w:t>ecurity,</w:t>
+      </w:r>
+      <w:r>
+        <w:rPr>
+          <w:rFonts w:ascii="HelveticaNeueLT Pro 55 Roman" w:hAnsi="HelveticaNeueLT Pro 55 Roman"/>
+          <w:sz w:val="22"/>
+          <w:szCs w:val="22"/>
         </w:rPr>
         <w:t xml:space="preserve"> </w:t>
       </w:r>
-      <w:proofErr w:type="gramStart"/>
-      <w:r>
-        <w:rPr>
-          <w:rFonts w:ascii="HelveticaNeueLT Pro 55 Roman" w:hAnsi="HelveticaNeueLT Pro 55 Roman" w:cs="Arial"/>
-          <w:sz w:val="22"/>
-          <w:szCs w:val="20"/>
-        </w:rPr>
-        <w:t>contributor</w:t>
-      </w:r>
-      <w:proofErr w:type="gramEnd"/>
-      <w:r>
-        <w:rPr>
-          <w:rFonts w:ascii="HelveticaNeueLT Pro 55 Roman" w:hAnsi="HelveticaNeueLT Pro 55 Roman" w:cs="Arial"/>
-          <w:sz w:val="22"/>
-          <w:szCs w:val="20"/>
-        </w:rPr>
-        <w:t>: s</w:t>
-      </w:r>
-      <w:r>
-        <w:rPr>
-          <w:rFonts w:ascii="HelveticaNeueLT Pro 55 Roman" w:hAnsi="HelveticaNeueLT Pro 55 Roman" w:cs="Arial"/>
-          <w:sz w:val="22"/>
-          <w:szCs w:val="20"/>
-        </w:rPr>
-        <w:t xml:space="preserve">pawn storm </w:t>
-      </w:r>
-      <w:r>
-        <w:rPr>
-          <w:rFonts w:ascii="HelveticaNeueLT Pro 55 Roman" w:hAnsi="HelveticaNeueLT Pro 55 Roman" w:cs="Arial"/>
-          <w:sz w:val="22"/>
-          <w:szCs w:val="20"/>
-        </w:rPr>
-        <w:t>defense,</w:t>
-      </w:r>
-      <w:r>
-        <w:rPr>
-          <w:rFonts w:ascii="HelveticaNeueLT Pro 55 Roman" w:hAnsi="HelveticaNeueLT Pro 55 Roman" w:cs="Arial"/>
-          <w:sz w:val="22"/>
-          <w:szCs w:val="20"/>
-        </w:rPr>
-        <w:t xml:space="preserve"> </w:t>
-      </w:r>
-      <w:r>
-        <w:rPr>
-          <w:rFonts w:ascii="HelveticaNeueLT Pro 55 Roman" w:hAnsi="HelveticaNeueLT Pro 55 Roman" w:cs="Arial"/>
-          <w:sz w:val="22"/>
-          <w:szCs w:val="20"/>
-        </w:rPr>
-        <w:t>h</w:t>
-      </w:r>
-      <w:r>
-        <w:rPr>
-          <w:rFonts w:ascii="HelveticaNeueLT Pro 55 Roman" w:hAnsi="HelveticaNeueLT Pro 55 Roman" w:cs="Arial"/>
-          <w:sz w:val="22"/>
-          <w:szCs w:val="20"/>
-        </w:rPr>
-        <w:t xml:space="preserve">ook/worker </w:t>
-      </w:r>
-      <w:r>
-        <w:rPr>
-          <w:rFonts w:ascii="HelveticaNeueLT Pro 55 Roman" w:hAnsi="HelveticaNeueLT Pro 55 Roman" w:cs="Arial"/>
-          <w:sz w:val="22"/>
-          <w:szCs w:val="20"/>
-        </w:rPr>
-        <w:t xml:space="preserve">lifecycle </w:t>
-      </w:r>
-      <w:r>
-        <w:rPr>
-          <w:rFonts w:ascii="HelveticaNeueLT Pro 55 Roman" w:hAnsi="HelveticaNeueLT Pro 55 Roman" w:cs="Arial"/>
-          <w:sz w:val="22"/>
-          <w:szCs w:val="20"/>
-        </w:rPr>
-        <w:t>hardening</w:t>
-      </w:r>
-      <w:r>
-        <w:rPr>
-          <w:rFonts w:ascii="HelveticaNeueLT Pro 55 Roman" w:hAnsi="HelveticaNeueLT Pro 55 Roman" w:cs="Arial"/>
-          <w:sz w:val="22"/>
-          <w:szCs w:val="20"/>
-        </w:rPr>
-        <w:t>,</w:t>
-      </w:r>
-      <w:r>
-        <w:rPr>
-          <w:rFonts w:ascii="HelveticaNeueLT Pro 55 Roman" w:hAnsi="HelveticaNeueLT Pro 55 Roman" w:cs="Arial"/>
-          <w:sz w:val="22"/>
-          <w:szCs w:val="20"/>
-        </w:rPr>
-        <w:t xml:space="preserve"> </w:t>
-      </w:r>
-      <w:r>
-        <w:rPr>
-          <w:rFonts w:ascii="HelveticaNeueLT Pro 55 Roman" w:hAnsi="HelveticaNeueLT Pro 55 Roman" w:cs="Arial"/>
-          <w:sz w:val="22"/>
-          <w:szCs w:val="20"/>
-        </w:rPr>
-        <w:t>d</w:t>
-      </w:r>
-      <w:r>
-        <w:rPr>
-          <w:rFonts w:ascii="HelveticaNeueLT Pro 55 Roman" w:hAnsi="HelveticaNeueLT Pro 55 Roman" w:cs="Arial"/>
-          <w:sz w:val="22"/>
-          <w:szCs w:val="20"/>
-        </w:rPr>
-        <w:t>aemon</w:t>
-      </w:r>
-      <w:r>
-        <w:rPr>
-          <w:rFonts w:ascii="HelveticaNeueLT Pro 55 Roman" w:hAnsi="HelveticaNeueLT Pro 55 Roman" w:cs="Arial"/>
-          <w:sz w:val="22"/>
-          <w:szCs w:val="20"/>
-        </w:rPr>
-        <w:t xml:space="preserve"> </w:t>
-      </w:r>
-      <w:r>
-        <w:rPr>
-          <w:rFonts w:ascii="HelveticaNeueLT Pro 55 Roman" w:hAnsi="HelveticaNeueLT Pro 55 Roman" w:cs="Arial"/>
-          <w:sz w:val="22"/>
-          <w:szCs w:val="20"/>
-        </w:rPr>
-        <w:t>resilience</w:t>
-      </w:r>
-      <w:r>
-        <w:rPr>
-          <w:rFonts w:ascii="HelveticaNeueLT Pro 55 Roman" w:hAnsi="HelveticaNeueLT Pro 55 Roman" w:cs="Arial"/>
-          <w:sz w:val="22"/>
-          <w:szCs w:val="20"/>
+      <w:r>
+        <w:rPr>
+          <w:rFonts w:ascii="HelveticaNeueLT Pro 55 Roman" w:hAnsi="HelveticaNeueLT Pro 55 Roman"/>
+          <w:sz w:val="22"/>
+          <w:szCs w:val="22"/>
+        </w:rPr>
+        <w:t>cost analytics</w:t>
+      </w:r>
+      <w:r>
+        <w:rPr>
+          <w:rFonts w:ascii="HelveticaNeueLT Pro 55 Roman" w:hAnsi="HelveticaNeueLT Pro 55 Roman"/>
+          <w:sz w:val="22"/>
+          <w:szCs w:val="22"/>
         </w:rPr>
         <w:t>.</w:t>
       </w:r>
@@ -3153,78 +3005,22 @@
           <w:szCs w:val="22"/>
         </w:rPr>
       </w:pPr>
-      <w:proofErr w:type="spellStart"/>
       <w:r>
         <w:rPr>
           <w:rFonts w:ascii="HelveticaNeueLT Pro 55 Roman" w:hAnsi="HelveticaNeueLT Pro 55 Roman"/>
           <w:b/>
           <w:sz w:val="22"/>
         </w:rPr>
+        <w:t>kenn-io/</w:t>
+      </w:r>
+      <w:r>
+        <w:rPr>
+          <w:rFonts w:ascii="HelveticaNeueLT Pro 55 Roman" w:hAnsi="HelveticaNeueLT Pro 55 Roman"/>
+          <w:b/>
+          <w:sz w:val="22"/>
+        </w:rPr>
         <w:t>agentsview</w:t>
       </w:r>
-      <w:proofErr w:type="spellEnd"/>
-      <w:r>
-        <w:rPr>
-          <w:rFonts w:ascii="HelveticaNeueLT Pro 55 Roman" w:hAnsi="HelveticaNeueLT Pro 55 Roman"/>
-          <w:sz w:val="18"/>
-        </w:rPr>
-        <w:t xml:space="preserve">  ·  github.com/</w:t>
-      </w:r>
-      <w:proofErr w:type="spellStart"/>
-      <w:r>
-        <w:rPr>
-          <w:rFonts w:ascii="HelveticaNeueLT Pro 55 Roman" w:hAnsi="HelveticaNeueLT Pro 55 Roman"/>
-          <w:sz w:val="18"/>
-        </w:rPr>
-        <w:t>kenn</w:t>
-      </w:r>
-      <w:proofErr w:type="spellEnd"/>
-      <w:r>
-        <w:rPr>
-          <w:rFonts w:ascii="HelveticaNeueLT Pro 55 Roman" w:hAnsi="HelveticaNeueLT Pro 55 Roman"/>
-          <w:sz w:val="18"/>
-        </w:rPr>
-        <w:t>-io/</w:t>
-      </w:r>
-      <w:proofErr w:type="spellStart"/>
-      <w:r>
-        <w:rPr>
-          <w:rFonts w:ascii="HelveticaNeueLT Pro 55 Roman" w:hAnsi="HelveticaNeueLT Pro 55 Roman"/>
-          <w:sz w:val="18"/>
-        </w:rPr>
-        <w:t>agentsview</w:t>
-      </w:r>
-      <w:proofErr w:type="spellEnd"/>
-      <w:r>
-        <w:rPr>
-          <w:rFonts w:ascii="HelveticaNeueLT Pro 55 Roman" w:hAnsi="HelveticaNeueLT Pro 55 Roman"/>
-          <w:sz w:val="18"/>
-        </w:rPr>
-        <w:t xml:space="preserve"> (</w:t>
-      </w:r>
-      <w:r>
-        <w:rPr>
-          <w:rFonts w:ascii="HelveticaNeueLT Pro 55 Roman" w:hAnsi="HelveticaNeueLT Pro 55 Roman"/>
-          <w:sz w:val="18"/>
-        </w:rPr>
-        <w:t>3</w:t>
-      </w:r>
-      <w:r>
-        <w:rPr>
-          <w:rFonts w:ascii="HelveticaNeueLT Pro 55 Roman" w:hAnsi="HelveticaNeueLT Pro 55 Roman"/>
-          <w:sz w:val="18"/>
-        </w:rPr>
-        <w:t xml:space="preserve">K </w:t>
-      </w:r>
-      <w:proofErr w:type="gramStart"/>
-      <w:r>
-        <w:rPr>
-          <w:rFonts w:ascii="HelveticaNeueLT Pro 55 Roman" w:hAnsi="HelveticaNeueLT Pro 55 Roman"/>
-          <w:sz w:val="18"/>
-        </w:rPr>
-        <w:t xml:space="preserve">stars)  · </w:t>
-      </w:r>
-      <w:proofErr w:type="gramEnd"/>
       <w:r>
         <w:rPr>
           <w:rFonts w:ascii="HelveticaNeueLT Pro 55 Roman" w:hAnsi="HelveticaNeueLT Pro 55 Roman"/>
@@ -3232,31 +3028,42 @@
         </w:rPr>
         <w:t xml:space="preserve"> </w:t>
       </w:r>
-      <w:proofErr w:type="gramStart"/>
+      <w:r>
+        <w:rPr>
+          <w:rFonts w:ascii="HelveticaNeueLT Pro 55 Roman" w:hAnsi="HelveticaNeueLT Pro 55 Roman"/>
+          <w:sz w:val="18"/>
+        </w:rPr>
+        <w:t xml:space="preserve"> (3k stars)  </w:t>
+      </w:r>
+      <w:r>
+        <w:rPr>
+          <w:rFonts w:ascii="HelveticaNeueLT Pro 55 Roman" w:hAnsi="HelveticaNeueLT Pro 55 Roman"/>
+          <w:sz w:val="18"/>
+        </w:rPr>
+        <w:t xml:space="preserve">·  </w:t>
+      </w:r>
+      <w:r>
+        <w:rPr>
+          <w:rFonts w:ascii="HelveticaNeueLT Pro 55 Roman" w:hAnsi="HelveticaNeueLT Pro 55 Roman"/>
+          <w:bCs/>
+          <w:sz w:val="18"/>
+        </w:rPr>
+        <w:t>Go, TypeScript, Svelte, Rust, Shell</w:t>
+      </w:r>
+      <w:r>
+        <w:rPr>
+          <w:rFonts w:ascii="HelveticaNeueLT Pro 55 Roman" w:hAnsi="HelveticaNeueLT Pro 55 Roman"/>
+          <w:sz w:val="18"/>
+        </w:rPr>
+        <w:t xml:space="preserve">  ·  </w:t>
+      </w:r>
       <w:r>
         <w:rPr>
           <w:rFonts w:ascii="HelveticaNeueLT Pro 55 Roman" w:hAnsi="HelveticaNeueLT Pro 55 Roman"/>
           <w:sz w:val="22"/>
           <w:szCs w:val="22"/>
         </w:rPr>
-        <w:t>Multi-session</w:t>
-      </w:r>
-      <w:proofErr w:type="gramEnd"/>
-      <w:r>
-        <w:rPr>
-          <w:rFonts w:ascii="HelveticaNeueLT Pro 55 Roman" w:hAnsi="HelveticaNeueLT Pro 55 Roman"/>
-          <w:sz w:val="22"/>
-          <w:szCs w:val="22"/>
-        </w:rPr>
-        <w:t xml:space="preserve"> viewer for AI coding tools</w:t>
-      </w:r>
-      <w:r>
-        <w:rPr>
-          <w:rFonts w:ascii="HelveticaNeueLT Pro 55 Roman" w:hAnsi="HelveticaNeueLT Pro 55 Roman"/>
-          <w:sz w:val="22"/>
-          <w:szCs w:val="22"/>
-        </w:rPr>
-        <w:t>.</w:t>
+        <w:t>Session analytics for coding agents.</w:t>
       </w:r>
     </w:p>
     <w:p>
@@ -3274,25 +3081,15 @@
           <w:sz w:val="22"/>
           <w:szCs w:val="20"/>
         </w:rPr>
-        <w:t xml:space="preserve">Top 5 </w:t>
-      </w:r>
-      <w:proofErr w:type="gramStart"/>
-      <w:r>
-        <w:rPr>
-          <w:rFonts w:ascii="HelveticaNeueLT Pro 55 Roman" w:hAnsi="HelveticaNeueLT Pro 55 Roman" w:cs="Arial"/>
-          <w:sz w:val="22"/>
-          <w:szCs w:val="20"/>
-        </w:rPr>
-        <w:t>contributor</w:t>
-      </w:r>
-      <w:proofErr w:type="gramEnd"/>
-      <w:r>
-        <w:rPr>
-          <w:rFonts w:ascii="HelveticaNeueLT Pro 55 Roman" w:hAnsi="HelveticaNeueLT Pro 55 Roman" w:cs="Arial"/>
-          <w:sz w:val="22"/>
-          <w:szCs w:val="20"/>
-        </w:rPr>
-        <w:t xml:space="preserve">: </w:t>
+        <w:t>#2 third-party</w:t>
+      </w:r>
+      <w:r>
+        <w:rPr>
+          <w:rFonts w:ascii="HelveticaNeueLT Pro 55 Roman" w:hAnsi="HelveticaNeueLT Pro 55 Roman" w:cs="Arial"/>
+          <w:sz w:val="22"/>
+          <w:szCs w:val="20"/>
+        </w:rPr>
+        <w:t xml:space="preserve"> contributor: </w:t>
       </w:r>
       <w:r>
         <w:rPr>
@@ -3302,7 +3099,6 @@
         </w:rPr>
         <w:t xml:space="preserve">Postgres sync safety, orphan session recovery, </w:t>
       </w:r>
-      <w:proofErr w:type="spellStart"/>
       <w:r>
         <w:rPr>
           <w:rFonts w:ascii="HelveticaNeueLT Pro 55 Roman" w:hAnsi="HelveticaNeueLT Pro 55 Roman" w:cs="Arial"/>
@@ -3311,7 +3107,6 @@
         </w:rPr>
         <w:t>Reasonix</w:t>
       </w:r>
-      <w:proofErr w:type="spellEnd"/>
       <w:r>
         <w:rPr>
           <w:rFonts w:ascii="HelveticaNeueLT Pro 55 Roman" w:hAnsi="HelveticaNeueLT Pro 55 Roman" w:cs="Arial"/>
@@ -3327,6 +3122,121 @@
           <w:szCs w:val="20"/>
         </w:rPr>
         <w:t>parser support.</w:t>
+      </w:r>
+    </w:p>
+    <w:p>
+      <w:pPr>
+        <w:spacing w:line="120" w:lineRule="auto"/>
+        <w:rPr>
+          <w:rFonts w:ascii="HelveticaNeueLT Pro 55 Roman" w:hAnsi="HelveticaNeueLT Pro 55 Roman"/>
+          <w:b/>
+          <w:sz w:val="10"/>
+          <w:szCs w:val="10"/>
+        </w:rPr>
+      </w:pPr>
+    </w:p>
+    <w:p>
+      <w:pPr>
+        <w:spacing w:before="60" w:line="276" w:lineRule="auto"/>
+        <w:rPr>
+          <w:rFonts w:ascii="HelveticaNeueLT Pro 55 Roman" w:hAnsi="HelveticaNeueLT Pro 55 Roman"/>
+          <w:sz w:val="22"/>
+          <w:szCs w:val="22"/>
+        </w:rPr>
+      </w:pPr>
+      <w:r>
+        <w:rPr>
+          <w:rFonts w:ascii="HelveticaNeueLT Pro 55 Roman" w:hAnsi="HelveticaNeueLT Pro 55 Roman"/>
+          <w:b/>
+          <w:sz w:val="22"/>
+        </w:rPr>
+        <w:t>headroomlabs-ai/headroom</w:t>
+      </w:r>
+      <w:r>
+        <w:rPr>
+          <w:rFonts w:ascii="HelveticaNeueLT Pro 55 Roman" w:hAnsi="HelveticaNeueLT Pro 55 Roman"/>
+          <w:sz w:val="18"/>
+        </w:rPr>
+        <w:t xml:space="preserve"> (50k stars)  ·  </w:t>
+      </w:r>
+      <w:r>
+        <w:rPr>
+          <w:rFonts w:ascii="HelveticaNeueLT Pro 55 Roman" w:hAnsi="HelveticaNeueLT Pro 55 Roman"/>
+          <w:bCs/>
+          <w:sz w:val="18"/>
+        </w:rPr>
+        <w:t>Go, TypeScript, Svelte, Rust</w:t>
+      </w:r>
+      <w:r>
+        <w:rPr>
+          <w:rFonts w:ascii="HelveticaNeueLT Pro 55 Roman" w:hAnsi="HelveticaNeueLT Pro 55 Roman"/>
+          <w:sz w:val="18"/>
+        </w:rPr>
+        <w:t xml:space="preserve">  ·  </w:t>
+      </w:r>
+      <w:r>
+        <w:rPr>
+          <w:rFonts w:ascii="HelveticaNeueLT Pro 55 Roman" w:hAnsi="HelveticaNeueLT Pro 55 Roman"/>
+          <w:sz w:val="22"/>
+          <w:szCs w:val="22"/>
+        </w:rPr>
+        <w:t>Top 10 contributor.</w:t>
+      </w:r>
+    </w:p>
+    <w:p>
+      <w:pPr>
+        <w:spacing w:before="60" w:line="276" w:lineRule="auto"/>
+        <w:rPr>
+          <w:rFonts w:ascii="HelveticaNeueLT Pro 55 Roman" w:hAnsi="HelveticaNeueLT Pro 55 Roman"/>
+          <w:sz w:val="22"/>
+          <w:szCs w:val="22"/>
+        </w:rPr>
+      </w:pPr>
+      <w:r>
+        <w:rPr>
+          <w:rFonts w:ascii="HelveticaNeueLT Pro 55 Roman" w:hAnsi="HelveticaNeueLT Pro 55 Roman"/>
+          <w:b/>
+          <w:sz w:val="22"/>
+        </w:rPr>
+        <w:t>mem0ai/mem0</w:t>
+      </w:r>
+      <w:r>
+        <w:rPr>
+          <w:rFonts w:ascii="HelveticaNeueLT Pro 55 Roman" w:hAnsi="HelveticaNeueLT Pro 55 Roman"/>
+          <w:sz w:val="18"/>
+        </w:rPr>
+        <w:t xml:space="preserve"> (59k stars)  ·  </w:t>
+      </w:r>
+      <w:r>
+        <w:rPr>
+          <w:rFonts w:ascii="HelveticaNeueLT Pro 55 Roman" w:hAnsi="HelveticaNeueLT Pro 55 Roman"/>
+          <w:bCs/>
+          <w:sz w:val="18"/>
+        </w:rPr>
+        <w:t>Python,</w:t>
+      </w:r>
+      <w:r>
+        <w:rPr>
+          <w:rFonts w:ascii="HelveticaNeueLT Pro 55 Roman" w:hAnsi="HelveticaNeueLT Pro 55 Roman"/>
+          <w:bCs/>
+          <w:sz w:val="18"/>
+        </w:rPr>
+        <w:t xml:space="preserve"> TypeScript</w:t>
+      </w:r>
+      <w:r>
+        <w:rPr>
+          <w:rFonts w:ascii="HelveticaNeueLT Pro 55 Roman" w:hAnsi="HelveticaNeueLT Pro 55 Roman"/>
+          <w:sz w:val="18"/>
+        </w:rPr>
+        <w:t xml:space="preserve">  ·  </w:t>
+      </w:r>
+      <w:r>
+        <w:rPr>
+          <w:rFonts w:ascii="HelveticaNeueLT Pro 55 Roman" w:hAnsi="HelveticaNeueLT Pro 55 Roman"/>
+          <w:sz w:val="22"/>
+          <w:szCs w:val="22"/>
+        </w:rPr>
+        <w:t>Top 10 third-party contributor.</w:t>
       </w:r>
     </w:p>
     <w:p>
@@ -3471,39 +3381,8 @@
                 <w:sz w:val="20"/>
                 <w:szCs w:val="20"/>
               </w:rPr>
-              <w:t xml:space="preserve">, Anthropic API, MCP, REST APIs, </w:t>
-            </w:r>
-            <w:proofErr w:type="spellStart"/>
-            <w:r>
-              <w:rPr>
-                <w:rFonts w:ascii="HelveticaNeueLT Pro 55 Roman" w:hAnsi="HelveticaNeueLT Pro 55 Roman"/>
-                <w:bCs/>
-                <w:sz w:val="20"/>
-                <w:szCs w:val="20"/>
-              </w:rPr>
-              <w:t>GraphQL</w:t>
-            </w:r>
-            <w:proofErr w:type="spellEnd"/>
-            <w:r>
-              <w:rPr>
-                <w:rFonts w:ascii="HelveticaNeueLT Pro 55 Roman" w:hAnsi="HelveticaNeueLT Pro 55 Roman"/>
-                <w:bCs/>
-                <w:sz w:val="20"/>
-                <w:szCs w:val="20"/>
-              </w:rPr>
-              <w:t xml:space="preserve">, </w:t>
-            </w:r>
-            <w:proofErr w:type="spellStart"/>
-            <w:r>
-              <w:rPr>
-                <w:rFonts w:ascii="HelveticaNeueLT Pro 55 Roman" w:hAnsi="HelveticaNeueLT Pro 55 Roman"/>
-                <w:bCs/>
-                <w:sz w:val="20"/>
-                <w:szCs w:val="20"/>
-              </w:rPr>
-              <w:t>WPGraphQL</w:t>
-            </w:r>
-            <w:proofErr w:type="spellEnd"/>
+              <w:t>, Anthropic API, MCP, REST APIs, GraphQL, WPGraphQL</w:t>
+            </w:r>
           </w:p>
           <w:p>
             <w:pPr>
@@ -3577,47 +3456,7 @@
                 <w:sz w:val="20"/>
                 <w:szCs w:val="20"/>
               </w:rPr>
-              <w:t>Firebase, SQL Server, MongoDB, Leaflet/</w:t>
-            </w:r>
-            <w:proofErr w:type="spellStart"/>
-            <w:r>
-              <w:rPr>
-                <w:rFonts w:ascii="HelveticaNeueLT Pro 55 Roman" w:hAnsi="HelveticaNeueLT Pro 55 Roman"/>
-                <w:bCs/>
-                <w:sz w:val="20"/>
-                <w:szCs w:val="20"/>
-              </w:rPr>
-              <w:t>Mapbox</w:t>
-            </w:r>
-            <w:proofErr w:type="spellEnd"/>
-            <w:r>
-              <w:rPr>
-                <w:rFonts w:ascii="HelveticaNeueLT Pro 55 Roman" w:hAnsi="HelveticaNeueLT Pro 55 Roman"/>
-                <w:bCs/>
-                <w:sz w:val="20"/>
-                <w:szCs w:val="20"/>
-              </w:rPr>
-              <w:t xml:space="preserve">, Turf.js, Vite, </w:t>
-            </w:r>
-            <w:proofErr w:type="spellStart"/>
-            <w:r>
-              <w:rPr>
-                <w:rFonts w:ascii="HelveticaNeueLT Pro 55 Roman" w:hAnsi="HelveticaNeueLT Pro 55 Roman"/>
-                <w:bCs/>
-                <w:sz w:val="20"/>
-                <w:szCs w:val="20"/>
-              </w:rPr>
-              <w:t>Vercel</w:t>
-            </w:r>
-            <w:proofErr w:type="spellEnd"/>
-            <w:r>
-              <w:rPr>
-                <w:rFonts w:ascii="HelveticaNeueLT Pro 55 Roman" w:hAnsi="HelveticaNeueLT Pro 55 Roman"/>
-                <w:bCs/>
-                <w:sz w:val="20"/>
-                <w:szCs w:val="20"/>
-              </w:rPr>
-              <w:t>, Netlify, Cloudflare</w:t>
+              <w:t>Firebase, SQL Server, MongoDB, Leaflet/Mapbox, Turf.js, Vite, Vercel, Netlify, Cloudflare</w:t>
             </w:r>
           </w:p>
           <w:p>
@@ -3714,7 +3553,7 @@
             </w:tcBorders>
             <w:shd w:val="clear" w:color="auto" w:fill="FFFFFF"/>
             <w:tcMar>
-              <w:top w:w="115" w:type="dxa"/>
+              <w:top w:w="144" w:type="dxa"/>
               <w:left w:w="115" w:type="dxa"/>
               <w:right w:w="115" w:type="dxa"/>
             </w:tcMar>
@@ -3766,7 +3605,7 @@
             </w:tcBorders>
             <w:shd w:val="clear" w:color="auto" w:fill="FFFFFF"/>
             <w:tcMar>
-              <w:top w:w="173" w:type="dxa"/>
+              <w:top w:w="144" w:type="dxa"/>
               <w:left w:w="115" w:type="dxa"/>
               <w:right w:w="115" w:type="dxa"/>
             </w:tcMar>
@@ -3810,7 +3649,7 @@
             <w:tcW w:w="7135" w:type="dxa"/>
             <w:shd w:val="clear" w:color="auto" w:fill="FFFFFF"/>
             <w:tcMar>
-              <w:top w:w="173" w:type="dxa"/>
+              <w:top w:w="144" w:type="dxa"/>
               <w:left w:w="115" w:type="dxa"/>
               <w:right w:w="115" w:type="dxa"/>
             </w:tcMar>
@@ -3859,7 +3698,7 @@
             <w:tcW w:w="3031" w:type="dxa"/>
             <w:shd w:val="clear" w:color="auto" w:fill="FFFFFF"/>
             <w:tcMar>
-              <w:top w:w="173" w:type="dxa"/>
+              <w:top w:w="144" w:type="dxa"/>
               <w:left w:w="115" w:type="dxa"/>
               <w:right w:w="115" w:type="dxa"/>
             </w:tcMar>
@@ -3893,7 +3732,7 @@
             <w:tcW w:w="7135" w:type="dxa"/>
             <w:shd w:val="clear" w:color="auto" w:fill="FFFFFF"/>
             <w:tcMar>
-              <w:top w:w="173" w:type="dxa"/>
+              <w:top w:w="144" w:type="dxa"/>
               <w:left w:w="115" w:type="dxa"/>
               <w:right w:w="115" w:type="dxa"/>
             </w:tcMar>
@@ -3918,7 +3757,7 @@
             <w:tcW w:w="3031" w:type="dxa"/>
             <w:shd w:val="clear" w:color="auto" w:fill="FFFFFF"/>
             <w:tcMar>
-              <w:top w:w="173" w:type="dxa"/>
+              <w:top w:w="144" w:type="dxa"/>
               <w:left w:w="115" w:type="dxa"/>
               <w:right w:w="115" w:type="dxa"/>
             </w:tcMar>
@@ -3984,7 +3823,7 @@
     <w:p/>
     <w:sectPr>
       <w:pgSz w:w="12240" w:h="15840" w:code="1"/>
-      <w:pgMar w:top="1152" w:right="1152" w:bottom="1080" w:left="994" w:header="720" w:footer="720" w:gutter="0"/>
+      <w:pgMar w:top="1152" w:right="1152" w:bottom="720" w:left="994" w:header="720" w:footer="720" w:gutter="0"/>
       <w:cols w:space="720"/>
       <w:docGrid w:linePitch="360"/>
     </w:sectPr>
@@ -5018,7 +4857,7 @@
   <w:style w:type="paragraph" w:default="1" w:styleId="Normal">
     <w:name w:val="Normal"/>
     <w:qFormat/>
-    <w:rsid w:val="002330C4"/>
+    <w:rsid w:val="00F6590A"/>
     <w:rPr>
       <w:sz w:val="24"/>
       <w:szCs w:val="24"/>

</xml_diff>

<commit_message>
Animate between date ranges
</commit_message>
<xml_diff>
--- a/resume.docx
+++ b/resume.docx
@@ -215,7 +215,6 @@
               </w:rPr>
             </w:pPr>
             <w:hyperlink r:id="rId10" w:history="1">
-              <w:proofErr w:type="spellStart"/>
               <w:r>
                 <w:rPr>
                   <w:rStyle w:val="Hyperlink"/>
@@ -227,7 +226,6 @@
                 </w:rPr>
                 <w:t>basedin.nyc</w:t>
               </w:r>
-              <w:proofErr w:type="spellEnd"/>
             </w:hyperlink>
             <w:r>
               <w:rPr>
@@ -294,7 +292,6 @@
               <w:br/>
             </w:r>
             <w:hyperlink r:id="rId13" w:history="1">
-              <w:proofErr w:type="spellStart"/>
               <w:r>
                 <w:rPr>
                   <w:rStyle w:val="Hyperlink"/>
@@ -305,7 +302,6 @@
                 </w:rPr>
                 <w:t>basedin.nyc</w:t>
               </w:r>
-              <w:proofErr w:type="spellEnd"/>
             </w:hyperlink>
             <w:r>
               <w:t xml:space="preserve"> </w:t>
@@ -487,7 +483,7 @@
                 <w:sz w:val="22"/>
                 <w:szCs w:val="20"/>
               </w:rPr>
-              <w:t>300</w:t>
+              <w:t>3</w:t>
             </w:r>
             <w:r>
               <w:rPr>
@@ -495,6 +491,22 @@
                 <w:sz w:val="22"/>
                 <w:szCs w:val="20"/>
               </w:rPr>
+              <w:t>5</w:t>
+            </w:r>
+            <w:r>
+              <w:rPr>
+                <w:rFonts w:ascii="HelveticaNeueLT Pro 55 Roman" w:hAnsi="HelveticaNeueLT Pro 55 Roman" w:cs="Arial"/>
+                <w:sz w:val="22"/>
+                <w:szCs w:val="20"/>
+              </w:rPr>
+              <w:t>0</w:t>
+            </w:r>
+            <w:r>
+              <w:rPr>
+                <w:rFonts w:ascii="HelveticaNeueLT Pro 55 Roman" w:hAnsi="HelveticaNeueLT Pro 55 Roman" w:cs="Arial"/>
+                <w:sz w:val="22"/>
+                <w:szCs w:val="20"/>
+              </w:rPr>
               <w:t>+ PRs across</w:t>
             </w:r>
             <w:r>
@@ -511,7 +523,7 @@
                 <w:sz w:val="22"/>
                 <w:szCs w:val="20"/>
               </w:rPr>
-              <w:t>five</w:t>
+              <w:t>5</w:t>
             </w:r>
             <w:r>
               <w:rPr>
@@ -551,24 +563,62 @@
                 <w:sz w:val="22"/>
                 <w:szCs w:val="20"/>
               </w:rPr>
-              <w:t xml:space="preserve">%+ acceptance. </w:t>
-            </w:r>
-            <w:proofErr w:type="gramStart"/>
+              <w:t>% acceptance. Top</w:t>
+            </w:r>
             <w:r>
               <w:rPr>
                 <w:rFonts w:ascii="HelveticaNeueLT Pro 55 Roman" w:hAnsi="HelveticaNeueLT Pro 55 Roman" w:cs="Arial"/>
                 <w:sz w:val="22"/>
                 <w:szCs w:val="20"/>
               </w:rPr>
-              <w:t>Top-5</w:t>
-            </w:r>
-            <w:proofErr w:type="gramEnd"/>
+              <w:t xml:space="preserve"> </w:t>
+            </w:r>
             <w:r>
               <w:rPr>
                 <w:rFonts w:ascii="HelveticaNeueLT Pro 55 Roman" w:hAnsi="HelveticaNeueLT Pro 55 Roman" w:cs="Arial"/>
                 <w:sz w:val="22"/>
                 <w:szCs w:val="20"/>
               </w:rPr>
+              <w:t xml:space="preserve">5 </w:t>
+            </w:r>
+            <w:r>
+              <w:rPr>
+                <w:rFonts w:ascii="HelveticaNeueLT Pro 55 Roman" w:hAnsi="HelveticaNeueLT Pro 55 Roman" w:cs="Arial"/>
+                <w:sz w:val="22"/>
+                <w:szCs w:val="20"/>
+              </w:rPr>
+              <w:t>contributo</w:t>
+            </w:r>
+            <w:r>
+              <w:rPr>
+                <w:rFonts w:ascii="HelveticaNeueLT Pro 55 Roman" w:hAnsi="HelveticaNeueLT Pro 55 Roman" w:cs="Arial"/>
+                <w:sz w:val="22"/>
+                <w:szCs w:val="20"/>
+              </w:rPr>
+              <w:t>r</w:t>
+            </w:r>
+            <w:r>
+              <w:rPr>
+                <w:rFonts w:ascii="HelveticaNeueLT Pro 55 Roman" w:hAnsi="HelveticaNeueLT Pro 55 Roman" w:cs="Arial"/>
+                <w:sz w:val="22"/>
+                <w:szCs w:val="20"/>
+              </w:rPr>
+              <w:t xml:space="preserve"> to </w:t>
+            </w:r>
+            <w:r>
+              <w:rPr>
+                <w:rFonts w:ascii="HelveticaNeueLT Pro 55 Roman" w:hAnsi="HelveticaNeueLT Pro 55 Roman" w:cs="Arial"/>
+                <w:sz w:val="22"/>
+                <w:szCs w:val="20"/>
+              </w:rPr>
+              <w:t>claude-mem</w:t>
+            </w:r>
+            <w:r>
+              <w:rPr>
+                <w:rFonts w:ascii="HelveticaNeueLT Pro 55 Roman" w:hAnsi="HelveticaNeueLT Pro 55 Roman" w:cs="Arial"/>
+                <w:sz w:val="22"/>
+                <w:szCs w:val="20"/>
+              </w:rPr>
               <w:t xml:space="preserve"> </w:t>
             </w:r>
             <w:r>
@@ -577,7 +627,7 @@
                 <w:sz w:val="22"/>
                 <w:szCs w:val="20"/>
               </w:rPr>
-              <w:t>contributo</w:t>
+              <w:t>(80</w:t>
             </w:r>
             <w:r>
               <w:rPr>
@@ -585,7 +635,7 @@
                 <w:sz w:val="22"/>
                 <w:szCs w:val="20"/>
               </w:rPr>
-              <w:t>r</w:t>
+              <w:t>k</w:t>
             </w:r>
             <w:r>
               <w:rPr>
@@ -593,7 +643,7 @@
                 <w:sz w:val="22"/>
                 <w:szCs w:val="20"/>
               </w:rPr>
-              <w:t xml:space="preserve"> to </w:t>
+              <w:t xml:space="preserve"> stars)</w:t>
             </w:r>
             <w:r>
               <w:rPr>
@@ -601,7 +651,7 @@
                 <w:sz w:val="22"/>
                 <w:szCs w:val="20"/>
               </w:rPr>
-              <w:t>claude-mem</w:t>
+              <w:t xml:space="preserve"> and headroom (5</w:t>
             </w:r>
             <w:r>
               <w:rPr>
@@ -609,7 +659,7 @@
                 <w:sz w:val="22"/>
                 <w:szCs w:val="20"/>
               </w:rPr>
-              <w:t xml:space="preserve"> </w:t>
+              <w:t>2</w:t>
             </w:r>
             <w:r>
               <w:rPr>
@@ -617,7 +667,7 @@
                 <w:sz w:val="22"/>
                 <w:szCs w:val="20"/>
               </w:rPr>
-              <w:t>(80</w:t>
+              <w:t>k stars)</w:t>
             </w:r>
             <w:r>
               <w:rPr>
@@ -625,7 +675,7 @@
                 <w:sz w:val="22"/>
                 <w:szCs w:val="20"/>
               </w:rPr>
-              <w:t>k</w:t>
+              <w:t>;</w:t>
             </w:r>
             <w:r>
               <w:rPr>
@@ -633,15 +683,7 @@
                 <w:sz w:val="22"/>
                 <w:szCs w:val="20"/>
               </w:rPr>
-              <w:t xml:space="preserve"> stars)</w:t>
-            </w:r>
-            <w:r>
-              <w:rPr>
-                <w:rFonts w:ascii="HelveticaNeueLT Pro 55 Roman" w:hAnsi="HelveticaNeueLT Pro 55 Roman" w:cs="Arial"/>
-                <w:sz w:val="22"/>
-                <w:szCs w:val="20"/>
-              </w:rPr>
-              <w:t xml:space="preserve">, #2 on </w:t>
+              <w:t xml:space="preserve"> #2 on </w:t>
             </w:r>
             <w:r>
               <w:rPr>
@@ -856,7 +898,6 @@
                 <w:rFonts w:ascii="HelveticaNeueLT Pro 55 Roman" w:hAnsi="HelveticaNeueLT Pro 55 Roman" w:cs="Arial"/>
               </w:rPr>
             </w:pPr>
-            <w:proofErr w:type="spellStart"/>
             <w:r>
               <w:rPr>
                 <w:rFonts w:ascii="HelveticaNeueLT Pro 55 Roman" w:hAnsi="HelveticaNeueLT Pro 55 Roman" w:cs="Arial"/>
@@ -865,7 +906,6 @@
               </w:rPr>
               <w:t>Inkreel</w:t>
             </w:r>
-            <w:proofErr w:type="spellEnd"/>
             <w:r>
               <w:rPr>
                 <w:rFonts w:ascii="HelveticaNeueLT Pro 55 Roman" w:hAnsi="HelveticaNeueLT Pro 55 Roman" w:cs="Arial"/>
@@ -878,29 +918,17 @@
               </w:rPr>
               <w:t>(</w:t>
             </w:r>
-            <w:proofErr w:type="spellStart"/>
-            <w:r>
-              <w:fldChar w:fldCharType="begin"/>
-            </w:r>
-            <w:r>
-              <w:instrText>HYPERLINK "https://basedin.nyc/"</w:instrText>
-            </w:r>
-            <w:r>
-              <w:fldChar w:fldCharType="separate"/>
-            </w:r>
-            <w:r>
-              <w:rPr>
-                <w:rStyle w:val="Hyperlink"/>
-                <w:rFonts w:ascii="HelveticaNeueLT Pro 55 Roman" w:hAnsi="HelveticaNeueLT Pro 55 Roman" w:cs="Arial"/>
-                <w:color w:val="auto"/>
-                <w:u w:val="none"/>
-              </w:rPr>
-              <w:t>basedin.nyc</w:t>
-            </w:r>
-            <w:proofErr w:type="spellEnd"/>
-            <w:r>
-              <w:fldChar w:fldCharType="end"/>
-            </w:r>
+            <w:hyperlink r:id="rId14" w:history="1">
+              <w:r>
+                <w:rPr>
+                  <w:rStyle w:val="Hyperlink"/>
+                  <w:rFonts w:ascii="HelveticaNeueLT Pro 55 Roman" w:hAnsi="HelveticaNeueLT Pro 55 Roman" w:cs="Arial"/>
+                  <w:color w:val="auto"/>
+                  <w:u w:val="none"/>
+                </w:rPr>
+                <w:t>basedin.nyc</w:t>
+              </w:r>
+            </w:hyperlink>
             <w:r>
               <w:rPr>
                 <w:rFonts w:ascii="HelveticaNeueLT Pro 55 Roman" w:hAnsi="HelveticaNeueLT Pro 55 Roman" w:cs="Arial"/>
@@ -1095,23 +1123,13 @@
           <w:sz w:val="18"/>
         </w:rPr>
       </w:pPr>
-      <w:proofErr w:type="gramStart"/>
       <w:r>
         <w:rPr>
           <w:rFonts w:ascii="HelveticaNeueLT Pro 55 Roman" w:hAnsi="HelveticaNeueLT Pro 55 Roman"/>
           <w:b/>
           <w:sz w:val="22"/>
         </w:rPr>
-        <w:t>Open Source</w:t>
-      </w:r>
-      <w:proofErr w:type="gramEnd"/>
-      <w:r>
-        <w:rPr>
-          <w:rFonts w:ascii="HelveticaNeueLT Pro 55 Roman" w:hAnsi="HelveticaNeueLT Pro 55 Roman"/>
-          <w:b/>
-          <w:sz w:val="22"/>
-        </w:rPr>
-        <w:t xml:space="preserve"> </w:t>
+        <w:t xml:space="preserve">Open Source </w:t>
       </w:r>
       <w:r>
         <w:rPr>
@@ -2633,7 +2651,7 @@
         </w:rPr>
         <w:t xml:space="preserve"> </w:t>
       </w:r>
-      <w:hyperlink r:id="rId14" w:history="1">
+      <w:hyperlink r:id="rId15" w:history="1">
         <w:r>
           <w:rPr>
             <w:rStyle w:val="Hyperlink"/>
@@ -3180,7 +3198,39 @@
           <w:sz w:val="22"/>
           <w:szCs w:val="22"/>
         </w:rPr>
-        <w:t>Top 10 contributor.</w:t>
+        <w:t xml:space="preserve">Top </w:t>
+      </w:r>
+      <w:r>
+        <w:rPr>
+          <w:rFonts w:ascii="HelveticaNeueLT Pro 55 Roman" w:hAnsi="HelveticaNeueLT Pro 55 Roman"/>
+          <w:sz w:val="22"/>
+          <w:szCs w:val="22"/>
+        </w:rPr>
+        <w:t>5</w:t>
+      </w:r>
+      <w:r>
+        <w:rPr>
+          <w:rFonts w:ascii="HelveticaNeueLT Pro 55 Roman" w:hAnsi="HelveticaNeueLT Pro 55 Roman"/>
+          <w:sz w:val="22"/>
+          <w:szCs w:val="22"/>
+        </w:rPr>
+        <w:t xml:space="preserve"> </w:t>
+      </w:r>
+      <w:r>
+        <w:rPr>
+          <w:rFonts w:ascii="HelveticaNeueLT Pro 55 Roman" w:hAnsi="HelveticaNeueLT Pro 55 Roman"/>
+          <w:sz w:val="22"/>
+          <w:szCs w:val="22"/>
+        </w:rPr>
+        <w:t xml:space="preserve">third-party </w:t>
+      </w:r>
+      <w:r>
+        <w:rPr>
+          <w:rFonts w:ascii="HelveticaNeueLT Pro 55 Roman" w:hAnsi="HelveticaNeueLT Pro 55 Roman"/>
+          <w:sz w:val="22"/>
+          <w:szCs w:val="22"/>
+        </w:rPr>
+        <w:t>contributor.</w:t>
       </w:r>
     </w:p>
     <w:p>

</xml_diff>

<commit_message>
Update stats for Jun 27
</commit_message>
<xml_diff>
--- a/resume.docx
+++ b/resume.docx
@@ -215,6 +215,7 @@
               </w:rPr>
             </w:pPr>
             <w:hyperlink r:id="rId10" w:history="1">
+              <w:proofErr w:type="spellStart"/>
               <w:r>
                 <w:rPr>
                   <w:rStyle w:val="Hyperlink"/>
@@ -226,6 +227,7 @@
                 </w:rPr>
                 <w:t>basedin.nyc</w:t>
               </w:r>
+              <w:proofErr w:type="spellEnd"/>
             </w:hyperlink>
             <w:r>
               <w:rPr>
@@ -292,6 +294,7 @@
               <w:br/>
             </w:r>
             <w:hyperlink r:id="rId13" w:history="1">
+              <w:proofErr w:type="spellStart"/>
               <w:r>
                 <w:rPr>
                   <w:rStyle w:val="Hyperlink"/>
@@ -302,6 +305,7 @@
                 </w:rPr>
                 <w:t>basedin.nyc</w:t>
               </w:r>
+              <w:proofErr w:type="spellEnd"/>
             </w:hyperlink>
             <w:r>
               <w:t xml:space="preserve"> </w:t>
@@ -491,6 +495,38 @@
                 <w:sz w:val="22"/>
                 <w:szCs w:val="20"/>
               </w:rPr>
+              <w:t>7</w:t>
+            </w:r>
+            <w:r>
+              <w:rPr>
+                <w:rFonts w:ascii="HelveticaNeueLT Pro 55 Roman" w:hAnsi="HelveticaNeueLT Pro 55 Roman" w:cs="Arial"/>
+                <w:sz w:val="22"/>
+                <w:szCs w:val="20"/>
+              </w:rPr>
+              <w:t>0</w:t>
+            </w:r>
+            <w:r>
+              <w:rPr>
+                <w:rFonts w:ascii="HelveticaNeueLT Pro 55 Roman" w:hAnsi="HelveticaNeueLT Pro 55 Roman" w:cs="Arial"/>
+                <w:sz w:val="22"/>
+                <w:szCs w:val="20"/>
+              </w:rPr>
+              <w:t>+ PRs across</w:t>
+            </w:r>
+            <w:r>
+              <w:rPr>
+                <w:rFonts w:ascii="HelveticaNeueLT Pro 55 Roman" w:hAnsi="HelveticaNeueLT Pro 55 Roman" w:cs="Arial"/>
+                <w:sz w:val="22"/>
+                <w:szCs w:val="20"/>
+              </w:rPr>
+              <w:t xml:space="preserve"> </w:t>
+            </w:r>
+            <w:r>
+              <w:rPr>
+                <w:rFonts w:ascii="HelveticaNeueLT Pro 55 Roman" w:hAnsi="HelveticaNeueLT Pro 55 Roman" w:cs="Arial"/>
+                <w:sz w:val="22"/>
+                <w:szCs w:val="20"/>
+              </w:rPr>
               <w:t>5</w:t>
             </w:r>
             <w:r>
@@ -499,7 +535,7 @@
                 <w:sz w:val="22"/>
                 <w:szCs w:val="20"/>
               </w:rPr>
-              <w:t>0</w:t>
+              <w:t xml:space="preserve"> </w:t>
             </w:r>
             <w:r>
               <w:rPr>
@@ -507,7 +543,7 @@
                 <w:sz w:val="22"/>
                 <w:szCs w:val="20"/>
               </w:rPr>
-              <w:t>+ PRs across</w:t>
+              <w:t>AI tooling</w:t>
             </w:r>
             <w:r>
               <w:rPr>
@@ -515,6 +551,46 @@
                 <w:sz w:val="22"/>
                 <w:szCs w:val="20"/>
               </w:rPr>
+              <w:t xml:space="preserve"> repos at 9</w:t>
+            </w:r>
+            <w:r>
+              <w:rPr>
+                <w:rFonts w:ascii="HelveticaNeueLT Pro 55 Roman" w:hAnsi="HelveticaNeueLT Pro 55 Roman" w:cs="Arial"/>
+                <w:sz w:val="22"/>
+                <w:szCs w:val="20"/>
+              </w:rPr>
+              <w:t>8</w:t>
+            </w:r>
+            <w:r>
+              <w:rPr>
+                <w:rFonts w:ascii="HelveticaNeueLT Pro 55 Roman" w:hAnsi="HelveticaNeueLT Pro 55 Roman" w:cs="Arial"/>
+                <w:sz w:val="22"/>
+                <w:szCs w:val="20"/>
+              </w:rPr>
+              <w:t xml:space="preserve">% acceptance. </w:t>
+            </w:r>
+            <w:r>
+              <w:rPr>
+                <w:rFonts w:ascii="HelveticaNeueLT Pro 55 Roman" w:hAnsi="HelveticaNeueLT Pro 55 Roman" w:cs="Arial"/>
+                <w:sz w:val="22"/>
+                <w:szCs w:val="20"/>
+              </w:rPr>
+              <w:t>#1</w:t>
+            </w:r>
+            <w:r>
+              <w:rPr>
+                <w:rFonts w:ascii="HelveticaNeueLT Pro 55 Roman" w:hAnsi="HelveticaNeueLT Pro 55 Roman" w:cs="Arial"/>
+                <w:sz w:val="22"/>
+                <w:szCs w:val="20"/>
+              </w:rPr>
+              <w:t xml:space="preserve"> contributor to</w:t>
+            </w:r>
+            <w:r>
+              <w:rPr>
+                <w:rFonts w:ascii="HelveticaNeueLT Pro 55 Roman" w:hAnsi="HelveticaNeueLT Pro 55 Roman" w:cs="Arial"/>
+                <w:sz w:val="22"/>
+                <w:szCs w:val="20"/>
+              </w:rPr>
               <w:t xml:space="preserve"> </w:t>
             </w:r>
             <w:r>
@@ -523,6 +599,102 @@
                 <w:sz w:val="22"/>
                 <w:szCs w:val="20"/>
               </w:rPr>
+              <w:t>hermes-webui (1</w:t>
+            </w:r>
+            <w:r>
+              <w:rPr>
+                <w:rFonts w:ascii="HelveticaNeueLT Pro 55 Roman" w:hAnsi="HelveticaNeueLT Pro 55 Roman" w:cs="Arial"/>
+                <w:sz w:val="22"/>
+                <w:szCs w:val="20"/>
+              </w:rPr>
+              <w:t>5k</w:t>
+            </w:r>
+            <w:r>
+              <w:rPr>
+                <w:rFonts w:ascii="HelveticaNeueLT Pro 55 Roman" w:hAnsi="HelveticaNeueLT Pro 55 Roman" w:cs="Arial"/>
+                <w:sz w:val="22"/>
+                <w:szCs w:val="20"/>
+              </w:rPr>
+              <w:t xml:space="preserve"> stars)</w:t>
+            </w:r>
+            <w:r>
+              <w:rPr>
+                <w:rFonts w:ascii="HelveticaNeueLT Pro 55 Roman" w:hAnsi="HelveticaNeueLT Pro 55 Roman" w:cs="Arial"/>
+                <w:sz w:val="22"/>
+                <w:szCs w:val="20"/>
+              </w:rPr>
+              <w:t xml:space="preserve"> and</w:t>
+            </w:r>
+            <w:r>
+              <w:rPr>
+                <w:rFonts w:ascii="HelveticaNeueLT Pro 55 Roman" w:hAnsi="HelveticaNeueLT Pro 55 Roman" w:cs="Arial"/>
+                <w:sz w:val="22"/>
+                <w:szCs w:val="20"/>
+              </w:rPr>
+              <w:t xml:space="preserve"> </w:t>
+            </w:r>
+            <w:r>
+              <w:rPr>
+                <w:rFonts w:ascii="HelveticaNeueLT Pro 55 Roman" w:hAnsi="HelveticaNeueLT Pro 55 Roman" w:cs="Arial"/>
+                <w:sz w:val="22"/>
+                <w:szCs w:val="20"/>
+              </w:rPr>
+              <w:t>agentsview (3</w:t>
+            </w:r>
+            <w:r>
+              <w:rPr>
+                <w:rFonts w:ascii="HelveticaNeueLT Pro 55 Roman" w:hAnsi="HelveticaNeueLT Pro 55 Roman" w:cs="Arial"/>
+                <w:sz w:val="22"/>
+                <w:szCs w:val="20"/>
+              </w:rPr>
+              <w:t xml:space="preserve">k </w:t>
+            </w:r>
+            <w:r>
+              <w:rPr>
+                <w:rFonts w:ascii="HelveticaNeueLT Pro 55 Roman" w:hAnsi="HelveticaNeueLT Pro 55 Roman" w:cs="Arial"/>
+                <w:sz w:val="22"/>
+                <w:szCs w:val="20"/>
+              </w:rPr>
+              <w:t>stars)</w:t>
+            </w:r>
+            <w:r>
+              <w:rPr>
+                <w:rFonts w:ascii="HelveticaNeueLT Pro 55 Roman" w:hAnsi="HelveticaNeueLT Pro 55 Roman" w:cs="Arial"/>
+                <w:sz w:val="22"/>
+                <w:szCs w:val="20"/>
+              </w:rPr>
+              <w:t>.</w:t>
+            </w:r>
+            <w:r>
+              <w:rPr>
+                <w:rFonts w:ascii="HelveticaNeueLT Pro 55 Roman" w:hAnsi="HelveticaNeueLT Pro 55 Roman" w:cs="Arial"/>
+                <w:sz w:val="22"/>
+                <w:szCs w:val="20"/>
+              </w:rPr>
+              <w:t xml:space="preserve"> </w:t>
+            </w:r>
+            <w:r>
+              <w:rPr>
+                <w:rFonts w:ascii="HelveticaNeueLT Pro 55 Roman" w:hAnsi="HelveticaNeueLT Pro 55 Roman" w:cs="Arial"/>
+                <w:sz w:val="22"/>
+                <w:szCs w:val="20"/>
+              </w:rPr>
+              <w:t>Top</w:t>
+            </w:r>
+            <w:r>
+              <w:rPr>
+                <w:rFonts w:ascii="HelveticaNeueLT Pro 55 Roman" w:hAnsi="HelveticaNeueLT Pro 55 Roman" w:cs="Arial"/>
+                <w:sz w:val="22"/>
+                <w:szCs w:val="20"/>
+              </w:rPr>
+              <w:t xml:space="preserve"> </w:t>
+            </w:r>
+            <w:r>
+              <w:rPr>
+                <w:rFonts w:ascii="HelveticaNeueLT Pro 55 Roman" w:hAnsi="HelveticaNeueLT Pro 55 Roman" w:cs="Arial"/>
+                <w:sz w:val="22"/>
+                <w:szCs w:val="20"/>
+              </w:rPr>
               <w:t>5</w:t>
             </w:r>
             <w:r>
@@ -531,6 +703,22 @@
                 <w:sz w:val="22"/>
                 <w:szCs w:val="20"/>
               </w:rPr>
+              <w:t xml:space="preserve"> on </w:t>
+            </w:r>
+            <w:r>
+              <w:rPr>
+                <w:rFonts w:ascii="HelveticaNeueLT Pro 55 Roman" w:hAnsi="HelveticaNeueLT Pro 55 Roman" w:cs="Arial"/>
+                <w:sz w:val="22"/>
+                <w:szCs w:val="20"/>
+              </w:rPr>
+              <w:t>claude-mem</w:t>
+            </w:r>
+            <w:r>
+              <w:rPr>
+                <w:rFonts w:ascii="HelveticaNeueLT Pro 55 Roman" w:hAnsi="HelveticaNeueLT Pro 55 Roman" w:cs="Arial"/>
+                <w:sz w:val="22"/>
+                <w:szCs w:val="20"/>
+              </w:rPr>
               <w:t xml:space="preserve"> </w:t>
             </w:r>
             <w:r>
@@ -539,7 +727,7 @@
                 <w:sz w:val="22"/>
                 <w:szCs w:val="20"/>
               </w:rPr>
-              <w:t>AI tooling</w:t>
+              <w:t>(8</w:t>
             </w:r>
             <w:r>
               <w:rPr>
@@ -547,7 +735,7 @@
                 <w:sz w:val="22"/>
                 <w:szCs w:val="20"/>
               </w:rPr>
-              <w:t xml:space="preserve"> repos at 9</w:t>
+              <w:t>5k</w:t>
             </w:r>
             <w:r>
               <w:rPr>
@@ -555,7 +743,7 @@
                 <w:sz w:val="22"/>
                 <w:szCs w:val="20"/>
               </w:rPr>
-              <w:t>7</w:t>
+              <w:t xml:space="preserve"> stars)</w:t>
             </w:r>
             <w:r>
               <w:rPr>
@@ -563,7 +751,7 @@
                 <w:sz w:val="22"/>
                 <w:szCs w:val="20"/>
               </w:rPr>
-              <w:t>% acceptance. Top</w:t>
+              <w:t xml:space="preserve"> and headroom (5</w:t>
             </w:r>
             <w:r>
               <w:rPr>
@@ -571,7 +759,7 @@
                 <w:sz w:val="22"/>
                 <w:szCs w:val="20"/>
               </w:rPr>
-              <w:t xml:space="preserve"> </w:t>
+              <w:t>3</w:t>
             </w:r>
             <w:r>
               <w:rPr>
@@ -579,183 +767,7 @@
                 <w:sz w:val="22"/>
                 <w:szCs w:val="20"/>
               </w:rPr>
-              <w:t xml:space="preserve">5 </w:t>
-            </w:r>
-            <w:r>
-              <w:rPr>
-                <w:rFonts w:ascii="HelveticaNeueLT Pro 55 Roman" w:hAnsi="HelveticaNeueLT Pro 55 Roman" w:cs="Arial"/>
-                <w:sz w:val="22"/>
-                <w:szCs w:val="20"/>
-              </w:rPr>
-              <w:t>contributo</w:t>
-            </w:r>
-            <w:r>
-              <w:rPr>
-                <w:rFonts w:ascii="HelveticaNeueLT Pro 55 Roman" w:hAnsi="HelveticaNeueLT Pro 55 Roman" w:cs="Arial"/>
-                <w:sz w:val="22"/>
-                <w:szCs w:val="20"/>
-              </w:rPr>
-              <w:t>r</w:t>
-            </w:r>
-            <w:r>
-              <w:rPr>
-                <w:rFonts w:ascii="HelveticaNeueLT Pro 55 Roman" w:hAnsi="HelveticaNeueLT Pro 55 Roman" w:cs="Arial"/>
-                <w:sz w:val="22"/>
-                <w:szCs w:val="20"/>
-              </w:rPr>
-              <w:t xml:space="preserve"> to </w:t>
-            </w:r>
-            <w:r>
-              <w:rPr>
-                <w:rFonts w:ascii="HelveticaNeueLT Pro 55 Roman" w:hAnsi="HelveticaNeueLT Pro 55 Roman" w:cs="Arial"/>
-                <w:sz w:val="22"/>
-                <w:szCs w:val="20"/>
-              </w:rPr>
-              <w:t>claude-mem</w:t>
-            </w:r>
-            <w:r>
-              <w:rPr>
-                <w:rFonts w:ascii="HelveticaNeueLT Pro 55 Roman" w:hAnsi="HelveticaNeueLT Pro 55 Roman" w:cs="Arial"/>
-                <w:sz w:val="22"/>
-                <w:szCs w:val="20"/>
-              </w:rPr>
-              <w:t xml:space="preserve"> </w:t>
-            </w:r>
-            <w:r>
-              <w:rPr>
-                <w:rFonts w:ascii="HelveticaNeueLT Pro 55 Roman" w:hAnsi="HelveticaNeueLT Pro 55 Roman" w:cs="Arial"/>
-                <w:sz w:val="22"/>
-                <w:szCs w:val="20"/>
-              </w:rPr>
-              <w:t>(80</w:t>
-            </w:r>
-            <w:r>
-              <w:rPr>
-                <w:rFonts w:ascii="HelveticaNeueLT Pro 55 Roman" w:hAnsi="HelveticaNeueLT Pro 55 Roman" w:cs="Arial"/>
-                <w:sz w:val="22"/>
-                <w:szCs w:val="20"/>
-              </w:rPr>
-              <w:t>k</w:t>
-            </w:r>
-            <w:r>
-              <w:rPr>
-                <w:rFonts w:ascii="HelveticaNeueLT Pro 55 Roman" w:hAnsi="HelveticaNeueLT Pro 55 Roman" w:cs="Arial"/>
-                <w:sz w:val="22"/>
-                <w:szCs w:val="20"/>
-              </w:rPr>
-              <w:t xml:space="preserve"> stars)</w:t>
-            </w:r>
-            <w:r>
-              <w:rPr>
-                <w:rFonts w:ascii="HelveticaNeueLT Pro 55 Roman" w:hAnsi="HelveticaNeueLT Pro 55 Roman" w:cs="Arial"/>
-                <w:sz w:val="22"/>
-                <w:szCs w:val="20"/>
-              </w:rPr>
-              <w:t xml:space="preserve"> and headroom (5</w:t>
-            </w:r>
-            <w:r>
-              <w:rPr>
-                <w:rFonts w:ascii="HelveticaNeueLT Pro 55 Roman" w:hAnsi="HelveticaNeueLT Pro 55 Roman" w:cs="Arial"/>
-                <w:sz w:val="22"/>
-                <w:szCs w:val="20"/>
-              </w:rPr>
-              <w:t>2</w:t>
-            </w:r>
-            <w:r>
-              <w:rPr>
-                <w:rFonts w:ascii="HelveticaNeueLT Pro 55 Roman" w:hAnsi="HelveticaNeueLT Pro 55 Roman" w:cs="Arial"/>
-                <w:sz w:val="22"/>
-                <w:szCs w:val="20"/>
-              </w:rPr>
-              <w:t>k stars)</w:t>
-            </w:r>
-            <w:r>
-              <w:rPr>
-                <w:rFonts w:ascii="HelveticaNeueLT Pro 55 Roman" w:hAnsi="HelveticaNeueLT Pro 55 Roman" w:cs="Arial"/>
-                <w:sz w:val="22"/>
-                <w:szCs w:val="20"/>
-              </w:rPr>
-              <w:t>;</w:t>
-            </w:r>
-            <w:r>
-              <w:rPr>
-                <w:rFonts w:ascii="HelveticaNeueLT Pro 55 Roman" w:hAnsi="HelveticaNeueLT Pro 55 Roman" w:cs="Arial"/>
-                <w:sz w:val="22"/>
-                <w:szCs w:val="20"/>
-              </w:rPr>
-              <w:t xml:space="preserve"> #2 on </w:t>
-            </w:r>
-            <w:r>
-              <w:rPr>
-                <w:rFonts w:ascii="HelveticaNeueLT Pro 55 Roman" w:hAnsi="HelveticaNeueLT Pro 55 Roman" w:cs="Arial"/>
-                <w:sz w:val="22"/>
-                <w:szCs w:val="20"/>
-              </w:rPr>
-              <w:t>hermes-webui (14</w:t>
-            </w:r>
-            <w:r>
-              <w:rPr>
-                <w:rFonts w:ascii="HelveticaNeueLT Pro 55 Roman" w:hAnsi="HelveticaNeueLT Pro 55 Roman" w:cs="Arial"/>
-                <w:sz w:val="22"/>
-                <w:szCs w:val="20"/>
-              </w:rPr>
-              <w:t>k</w:t>
-            </w:r>
-            <w:r>
-              <w:rPr>
-                <w:rFonts w:ascii="HelveticaNeueLT Pro 55 Roman" w:hAnsi="HelveticaNeueLT Pro 55 Roman" w:cs="Arial"/>
-                <w:sz w:val="22"/>
-                <w:szCs w:val="20"/>
-              </w:rPr>
-              <w:t xml:space="preserve"> stars)</w:t>
-            </w:r>
-            <w:r>
-              <w:rPr>
-                <w:rFonts w:ascii="HelveticaNeueLT Pro 55 Roman" w:hAnsi="HelveticaNeueLT Pro 55 Roman" w:cs="Arial"/>
-                <w:sz w:val="22"/>
-                <w:szCs w:val="20"/>
-              </w:rPr>
-              <w:t xml:space="preserve"> and</w:t>
-            </w:r>
-            <w:r>
-              <w:rPr>
-                <w:rFonts w:ascii="HelveticaNeueLT Pro 55 Roman" w:hAnsi="HelveticaNeueLT Pro 55 Roman" w:cs="Arial"/>
-                <w:sz w:val="22"/>
-                <w:szCs w:val="20"/>
-              </w:rPr>
-              <w:t xml:space="preserve"> </w:t>
-            </w:r>
-            <w:r>
-              <w:rPr>
-                <w:rFonts w:ascii="HelveticaNeueLT Pro 55 Roman" w:hAnsi="HelveticaNeueLT Pro 55 Roman" w:cs="Arial"/>
-                <w:sz w:val="22"/>
-                <w:szCs w:val="20"/>
-              </w:rPr>
-              <w:t>agentsview (3</w:t>
-            </w:r>
-            <w:r>
-              <w:rPr>
-                <w:rFonts w:ascii="HelveticaNeueLT Pro 55 Roman" w:hAnsi="HelveticaNeueLT Pro 55 Roman" w:cs="Arial"/>
-                <w:sz w:val="22"/>
-                <w:szCs w:val="20"/>
-              </w:rPr>
-              <w:t>k</w:t>
-            </w:r>
-            <w:r>
-              <w:rPr>
-                <w:rFonts w:ascii="HelveticaNeueLT Pro 55 Roman" w:hAnsi="HelveticaNeueLT Pro 55 Roman" w:cs="Arial"/>
-                <w:sz w:val="22"/>
-                <w:szCs w:val="20"/>
-              </w:rPr>
-              <w:t xml:space="preserve"> stars)</w:t>
-            </w:r>
-            <w:r>
-              <w:rPr>
-                <w:rFonts w:ascii="HelveticaNeueLT Pro 55 Roman" w:hAnsi="HelveticaNeueLT Pro 55 Roman" w:cs="Arial"/>
-                <w:sz w:val="22"/>
-                <w:szCs w:val="20"/>
-              </w:rPr>
-              <w:t>.</w:t>
+              <w:t>k stars.)</w:t>
             </w:r>
           </w:p>
           <w:p>
@@ -898,6 +910,7 @@
                 <w:rFonts w:ascii="HelveticaNeueLT Pro 55 Roman" w:hAnsi="HelveticaNeueLT Pro 55 Roman" w:cs="Arial"/>
               </w:rPr>
             </w:pPr>
+            <w:proofErr w:type="spellStart"/>
             <w:r>
               <w:rPr>
                 <w:rFonts w:ascii="HelveticaNeueLT Pro 55 Roman" w:hAnsi="HelveticaNeueLT Pro 55 Roman" w:cs="Arial"/>
@@ -906,6 +919,7 @@
               </w:rPr>
               <w:t>Inkreel</w:t>
             </w:r>
+            <w:proofErr w:type="spellEnd"/>
             <w:r>
               <w:rPr>
                 <w:rFonts w:ascii="HelveticaNeueLT Pro 55 Roman" w:hAnsi="HelveticaNeueLT Pro 55 Roman" w:cs="Arial"/>
@@ -918,17 +932,29 @@
               </w:rPr>
               <w:t>(</w:t>
             </w:r>
-            <w:hyperlink r:id="rId14" w:history="1">
-              <w:r>
-                <w:rPr>
-                  <w:rStyle w:val="Hyperlink"/>
-                  <w:rFonts w:ascii="HelveticaNeueLT Pro 55 Roman" w:hAnsi="HelveticaNeueLT Pro 55 Roman" w:cs="Arial"/>
-                  <w:color w:val="auto"/>
-                  <w:u w:val="none"/>
-                </w:rPr>
-                <w:t>basedin.nyc</w:t>
-              </w:r>
-            </w:hyperlink>
+            <w:proofErr w:type="spellStart"/>
+            <w:r>
+              <w:fldChar w:fldCharType="begin"/>
+            </w:r>
+            <w:r>
+              <w:instrText>HYPERLINK "https://basedin.nyc/"</w:instrText>
+            </w:r>
+            <w:r>
+              <w:fldChar w:fldCharType="separate"/>
+            </w:r>
+            <w:r>
+              <w:rPr>
+                <w:rStyle w:val="Hyperlink"/>
+                <w:rFonts w:ascii="HelveticaNeueLT Pro 55 Roman" w:hAnsi="HelveticaNeueLT Pro 55 Roman" w:cs="Arial"/>
+                <w:color w:val="auto"/>
+                <w:u w:val="none"/>
+              </w:rPr>
+              <w:t>basedin.nyc</w:t>
+            </w:r>
+            <w:proofErr w:type="spellEnd"/>
+            <w:r>
+              <w:fldChar w:fldCharType="end"/>
+            </w:r>
             <w:r>
               <w:rPr>
                 <w:rFonts w:ascii="HelveticaNeueLT Pro 55 Roman" w:hAnsi="HelveticaNeueLT Pro 55 Roman" w:cs="Arial"/>
@@ -1123,13 +1149,23 @@
           <w:sz w:val="18"/>
         </w:rPr>
       </w:pPr>
+      <w:proofErr w:type="gramStart"/>
       <w:r>
         <w:rPr>
           <w:rFonts w:ascii="HelveticaNeueLT Pro 55 Roman" w:hAnsi="HelveticaNeueLT Pro 55 Roman"/>
           <w:b/>
           <w:sz w:val="22"/>
         </w:rPr>
-        <w:t xml:space="preserve">Open Source </w:t>
+        <w:t>Open Source</w:t>
+      </w:r>
+      <w:proofErr w:type="gramEnd"/>
+      <w:r>
+        <w:rPr>
+          <w:rFonts w:ascii="HelveticaNeueLT Pro 55 Roman" w:hAnsi="HelveticaNeueLT Pro 55 Roman"/>
+          <w:b/>
+          <w:sz w:val="22"/>
+        </w:rPr>
+        <w:t xml:space="preserve"> </w:t>
       </w:r>
       <w:r>
         <w:rPr>
@@ -2020,13 +2056,59 @@
     <w:p>
       <w:pPr>
         <w:spacing w:after="20" w:line="264" w:lineRule="auto"/>
-      </w:pPr>
-      <w:r>
-        <w:rPr>
-          <w:rFonts w:ascii="HelveticaNeueLT Pro 55 Roman" w:hAnsi="HelveticaNeueLT Pro 55 Roman"/>
-          <w:sz w:val="22"/>
-        </w:rPr>
-        <w:t>Owned development lifecycle for the company's website and enterprise web application.</w:t>
+        <w:rPr>
+          <w:rFonts w:ascii="HelveticaNeueLT Pro 55 Roman" w:hAnsi="HelveticaNeueLT Pro 55 Roman"/>
+          <w:sz w:val="22"/>
+        </w:rPr>
+      </w:pPr>
+      <w:r>
+        <w:rPr>
+          <w:rFonts w:ascii="HelveticaNeueLT Pro 55 Roman" w:hAnsi="HelveticaNeueLT Pro 55 Roman"/>
+          <w:sz w:val="22"/>
+        </w:rPr>
+        <w:t xml:space="preserve">FinTech JV with Guggenheim Partners. </w:t>
+      </w:r>
+      <w:r>
+        <w:rPr>
+          <w:rFonts w:ascii="HelveticaNeueLT Pro 55 Roman" w:hAnsi="HelveticaNeueLT Pro 55 Roman"/>
+          <w:sz w:val="22"/>
+        </w:rPr>
+        <w:t>W</w:t>
+      </w:r>
+      <w:r>
+        <w:rPr>
+          <w:rFonts w:ascii="HelveticaNeueLT Pro 55 Roman" w:hAnsi="HelveticaNeueLT Pro 55 Roman"/>
+          <w:sz w:val="22"/>
+        </w:rPr>
+        <w:t>ebsite</w:t>
+      </w:r>
+      <w:r>
+        <w:rPr>
+          <w:rFonts w:ascii="HelveticaNeueLT Pro 55 Roman" w:hAnsi="HelveticaNeueLT Pro 55 Roman"/>
+          <w:sz w:val="22"/>
+        </w:rPr>
+        <w:t>,</w:t>
+      </w:r>
+      <w:r>
+        <w:rPr>
+          <w:rFonts w:ascii="HelveticaNeueLT Pro 55 Roman" w:hAnsi="HelveticaNeueLT Pro 55 Roman"/>
+          <w:sz w:val="22"/>
+        </w:rPr>
+        <w:t xml:space="preserve"> enterprise web app</w:t>
+      </w:r>
+      <w:r>
+        <w:rPr>
+          <w:rFonts w:ascii="HelveticaNeueLT Pro 55 Roman" w:hAnsi="HelveticaNeueLT Pro 55 Roman"/>
+          <w:sz w:val="22"/>
+        </w:rPr>
+        <w:t xml:space="preserve">, SOC 2 Type II </w:t>
+      </w:r>
+      <w:r>
+        <w:rPr>
+          <w:rFonts w:ascii="HelveticaNeueLT Pro 55 Roman" w:hAnsi="HelveticaNeueLT Pro 55 Roman"/>
+          <w:sz w:val="22"/>
+        </w:rPr>
+        <w:t>compliance.</w:t>
       </w:r>
     </w:p>
     <w:p>
@@ -2545,7 +2627,7 @@
           <w:sz w:val="22"/>
           <w:szCs w:val="22"/>
         </w:rPr>
-        <w:t xml:space="preserve">Over </w:t>
+        <w:t>Over 250</w:t>
       </w:r>
       <w:r>
         <w:rPr>
@@ -2553,7 +2635,7 @@
           <w:sz w:val="22"/>
           <w:szCs w:val="22"/>
         </w:rPr>
-        <w:t>2</w:t>
+        <w:t xml:space="preserve"> PRs </w:t>
       </w:r>
       <w:r>
         <w:rPr>
@@ -2561,7 +2643,7 @@
           <w:sz w:val="22"/>
           <w:szCs w:val="22"/>
         </w:rPr>
-        <w:t>5</w:t>
+        <w:t>shipped</w:t>
       </w:r>
       <w:r>
         <w:rPr>
@@ -2569,7 +2651,7 @@
           <w:sz w:val="22"/>
           <w:szCs w:val="22"/>
         </w:rPr>
-        <w:t>0</w:t>
+        <w:t xml:space="preserve"> to production </w:t>
       </w:r>
       <w:r>
         <w:rPr>
@@ -2577,7 +2659,7 @@
           <w:sz w:val="22"/>
           <w:szCs w:val="22"/>
         </w:rPr>
-        <w:t xml:space="preserve"> PRs </w:t>
+        <w:t>at 9</w:t>
       </w:r>
       <w:r>
         <w:rPr>
@@ -2585,7 +2667,7 @@
           <w:sz w:val="22"/>
           <w:szCs w:val="22"/>
         </w:rPr>
-        <w:t>shipped</w:t>
+        <w:t>8</w:t>
       </w:r>
       <w:r>
         <w:rPr>
@@ -2593,7 +2675,7 @@
           <w:sz w:val="22"/>
           <w:szCs w:val="22"/>
         </w:rPr>
-        <w:t xml:space="preserve"> to production </w:t>
+        <w:t>% acceptance</w:t>
       </w:r>
       <w:r>
         <w:rPr>
@@ -2601,7 +2683,7 @@
           <w:sz w:val="22"/>
           <w:szCs w:val="22"/>
         </w:rPr>
-        <w:t>at 9</w:t>
+        <w:t>:</w:t>
       </w:r>
       <w:r>
         <w:rPr>
@@ -2609,49 +2691,9 @@
           <w:sz w:val="22"/>
           <w:szCs w:val="22"/>
         </w:rPr>
-        <w:t>7</w:t>
-      </w:r>
-      <w:r>
-        <w:rPr>
-          <w:rFonts w:ascii="HelveticaNeueLT Pro 55 Roman" w:hAnsi="HelveticaNeueLT Pro 55 Roman"/>
-          <w:sz w:val="22"/>
-          <w:szCs w:val="22"/>
-        </w:rPr>
-        <w:t>%</w:t>
-      </w:r>
-      <w:r>
-        <w:rPr>
-          <w:rFonts w:ascii="HelveticaNeueLT Pro 55 Roman" w:hAnsi="HelveticaNeueLT Pro 55 Roman"/>
-          <w:sz w:val="22"/>
-          <w:szCs w:val="22"/>
-        </w:rPr>
-        <w:t>+</w:t>
-      </w:r>
-      <w:r>
-        <w:rPr>
-          <w:rFonts w:ascii="HelveticaNeueLT Pro 55 Roman" w:hAnsi="HelveticaNeueLT Pro 55 Roman"/>
-          <w:sz w:val="22"/>
-          <w:szCs w:val="22"/>
-        </w:rPr>
-        <w:t xml:space="preserve"> acceptance</w:t>
-      </w:r>
-      <w:r>
-        <w:rPr>
-          <w:rFonts w:ascii="HelveticaNeueLT Pro 55 Roman" w:hAnsi="HelveticaNeueLT Pro 55 Roman"/>
-          <w:sz w:val="22"/>
-          <w:szCs w:val="22"/>
-        </w:rPr>
-        <w:t>:</w:t>
-      </w:r>
-      <w:r>
-        <w:rPr>
-          <w:rFonts w:ascii="HelveticaNeueLT Pro 55 Roman" w:hAnsi="HelveticaNeueLT Pro 55 Roman"/>
-          <w:sz w:val="22"/>
-          <w:szCs w:val="22"/>
-        </w:rPr>
         <w:t xml:space="preserve"> </w:t>
       </w:r>
-      <w:hyperlink r:id="rId15" w:history="1">
+      <w:hyperlink r:id="rId14" w:history="1">
         <w:r>
           <w:rPr>
             <w:rStyle w:val="Hyperlink"/>
@@ -2735,7 +2777,25 @@
           <w:sz w:val="22"/>
           <w:szCs w:val="20"/>
         </w:rPr>
-        <w:t>Top 5 contributor. S</w:t>
+        <w:t xml:space="preserve">Top 5 </w:t>
+      </w:r>
+      <w:proofErr w:type="gramStart"/>
+      <w:r>
+        <w:rPr>
+          <w:rFonts w:ascii="HelveticaNeueLT Pro 55 Roman" w:hAnsi="HelveticaNeueLT Pro 55 Roman" w:cs="Arial"/>
+          <w:sz w:val="22"/>
+          <w:szCs w:val="20"/>
+        </w:rPr>
+        <w:t>contributor</w:t>
+      </w:r>
+      <w:proofErr w:type="gramEnd"/>
+      <w:r>
+        <w:rPr>
+          <w:rFonts w:ascii="HelveticaNeueLT Pro 55 Roman" w:hAnsi="HelveticaNeueLT Pro 55 Roman" w:cs="Arial"/>
+          <w:sz w:val="22"/>
+          <w:szCs w:val="20"/>
+        </w:rPr>
+        <w:t>. S</w:t>
       </w:r>
       <w:r>
         <w:rPr>
@@ -2944,7 +3004,15 @@
           <w:sz w:val="22"/>
           <w:szCs w:val="22"/>
         </w:rPr>
-        <w:t xml:space="preserve">#2 contributor. </w:t>
+        <w:t>#1</w:t>
+      </w:r>
+      <w:r>
+        <w:rPr>
+          <w:rFonts w:ascii="HelveticaNeueLT Pro 55 Roman" w:hAnsi="HelveticaNeueLT Pro 55 Roman"/>
+          <w:sz w:val="22"/>
+          <w:szCs w:val="22"/>
+        </w:rPr>
+        <w:t xml:space="preserve"> contributor. </w:t>
       </w:r>
       <w:r>
         <w:rPr>
@@ -3099,7 +3167,15 @@
           <w:sz w:val="22"/>
           <w:szCs w:val="20"/>
         </w:rPr>
-        <w:t>#2 third-party</w:t>
+        <w:t>#1</w:t>
+      </w:r>
+      <w:r>
+        <w:rPr>
+          <w:rFonts w:ascii="HelveticaNeueLT Pro 55 Roman" w:hAnsi="HelveticaNeueLT Pro 55 Roman" w:cs="Arial"/>
+          <w:sz w:val="22"/>
+          <w:szCs w:val="20"/>
+        </w:rPr>
+        <w:t xml:space="preserve"> third-party</w:t>
       </w:r>
       <w:r>
         <w:rPr>

</xml_diff>

<commit_message>
Apply more nuanced content checks to determine supersesion vs. acceptance
</commit_message>
<xml_diff>
--- a/resume.docx
+++ b/resume.docx
@@ -215,7 +215,6 @@
               </w:rPr>
             </w:pPr>
             <w:hyperlink r:id="rId10" w:history="1">
-              <w:proofErr w:type="spellStart"/>
               <w:r>
                 <w:rPr>
                   <w:rStyle w:val="Hyperlink"/>
@@ -227,7 +226,6 @@
                 </w:rPr>
                 <w:t>basedin.nyc</w:t>
               </w:r>
-              <w:proofErr w:type="spellEnd"/>
             </w:hyperlink>
             <w:r>
               <w:rPr>
@@ -294,7 +292,6 @@
               <w:br/>
             </w:r>
             <w:hyperlink r:id="rId13" w:history="1">
-              <w:proofErr w:type="spellStart"/>
               <w:r>
                 <w:rPr>
                   <w:rStyle w:val="Hyperlink"/>
@@ -305,7 +302,6 @@
                 </w:rPr>
                 <w:t>basedin.nyc</w:t>
               </w:r>
-              <w:proofErr w:type="spellEnd"/>
             </w:hyperlink>
             <w:r>
               <w:t xml:space="preserve"> </w:t>
@@ -487,7 +483,7 @@
                 <w:sz w:val="22"/>
                 <w:szCs w:val="20"/>
               </w:rPr>
-              <w:t>3</w:t>
+              <w:t>40</w:t>
             </w:r>
             <w:r>
               <w:rPr>
@@ -495,7 +491,7 @@
                 <w:sz w:val="22"/>
                 <w:szCs w:val="20"/>
               </w:rPr>
-              <w:t>7</w:t>
+              <w:t>0</w:t>
             </w:r>
             <w:r>
               <w:rPr>
@@ -503,7 +499,7 @@
                 <w:sz w:val="22"/>
                 <w:szCs w:val="20"/>
               </w:rPr>
-              <w:t>0</w:t>
+              <w:t>+ PRs across</w:t>
             </w:r>
             <w:r>
               <w:rPr>
@@ -511,7 +507,7 @@
                 <w:sz w:val="22"/>
                 <w:szCs w:val="20"/>
               </w:rPr>
-              <w:t>+ PRs across</w:t>
+              <w:t xml:space="preserve"> </w:t>
             </w:r>
             <w:r>
               <w:rPr>
@@ -519,6 +515,14 @@
                 <w:sz w:val="22"/>
                 <w:szCs w:val="20"/>
               </w:rPr>
+              <w:t>5</w:t>
+            </w:r>
+            <w:r>
+              <w:rPr>
+                <w:rFonts w:ascii="HelveticaNeueLT Pro 55 Roman" w:hAnsi="HelveticaNeueLT Pro 55 Roman" w:cs="Arial"/>
+                <w:sz w:val="22"/>
+                <w:szCs w:val="20"/>
+              </w:rPr>
               <w:t xml:space="preserve"> </w:t>
             </w:r>
             <w:r>
@@ -527,7 +531,7 @@
                 <w:sz w:val="22"/>
                 <w:szCs w:val="20"/>
               </w:rPr>
-              <w:t>5</w:t>
+              <w:t>AI tooling</w:t>
             </w:r>
             <w:r>
               <w:rPr>
@@ -535,7 +539,7 @@
                 <w:sz w:val="22"/>
                 <w:szCs w:val="20"/>
               </w:rPr>
-              <w:t xml:space="preserve"> </w:t>
+              <w:t xml:space="preserve"> repos at 9</w:t>
             </w:r>
             <w:r>
               <w:rPr>
@@ -543,7 +547,7 @@
                 <w:sz w:val="22"/>
                 <w:szCs w:val="20"/>
               </w:rPr>
-              <w:t>AI tooling</w:t>
+              <w:t>8</w:t>
             </w:r>
             <w:r>
               <w:rPr>
@@ -551,7 +555,7 @@
                 <w:sz w:val="22"/>
                 <w:szCs w:val="20"/>
               </w:rPr>
-              <w:t xml:space="preserve"> repos at 9</w:t>
+              <w:t xml:space="preserve">% acceptance. </w:t>
             </w:r>
             <w:r>
               <w:rPr>
@@ -559,23 +563,7 @@
                 <w:sz w:val="22"/>
                 <w:szCs w:val="20"/>
               </w:rPr>
-              <w:t>8</w:t>
-            </w:r>
-            <w:r>
-              <w:rPr>
-                <w:rFonts w:ascii="HelveticaNeueLT Pro 55 Roman" w:hAnsi="HelveticaNeueLT Pro 55 Roman" w:cs="Arial"/>
-                <w:sz w:val="22"/>
-                <w:szCs w:val="20"/>
-              </w:rPr>
-              <w:t xml:space="preserve">% acceptance. </w:t>
-            </w:r>
-            <w:r>
-              <w:rPr>
-                <w:rFonts w:ascii="HelveticaNeueLT Pro 55 Roman" w:hAnsi="HelveticaNeueLT Pro 55 Roman" w:cs="Arial"/>
-                <w:sz w:val="22"/>
-                <w:szCs w:val="20"/>
-              </w:rPr>
-              <w:t>#1</w:t>
+              <w:t>Top</w:t>
             </w:r>
             <w:r>
               <w:rPr>
@@ -910,7 +898,6 @@
                 <w:rFonts w:ascii="HelveticaNeueLT Pro 55 Roman" w:hAnsi="HelveticaNeueLT Pro 55 Roman" w:cs="Arial"/>
               </w:rPr>
             </w:pPr>
-            <w:proofErr w:type="spellStart"/>
             <w:r>
               <w:rPr>
                 <w:rFonts w:ascii="HelveticaNeueLT Pro 55 Roman" w:hAnsi="HelveticaNeueLT Pro 55 Roman" w:cs="Arial"/>
@@ -919,7 +906,6 @@
               </w:rPr>
               <w:t>Inkreel</w:t>
             </w:r>
-            <w:proofErr w:type="spellEnd"/>
             <w:r>
               <w:rPr>
                 <w:rFonts w:ascii="HelveticaNeueLT Pro 55 Roman" w:hAnsi="HelveticaNeueLT Pro 55 Roman" w:cs="Arial"/>
@@ -932,29 +918,17 @@
               </w:rPr>
               <w:t>(</w:t>
             </w:r>
-            <w:proofErr w:type="spellStart"/>
-            <w:r>
-              <w:fldChar w:fldCharType="begin"/>
-            </w:r>
-            <w:r>
-              <w:instrText>HYPERLINK "https://basedin.nyc/"</w:instrText>
-            </w:r>
-            <w:r>
-              <w:fldChar w:fldCharType="separate"/>
-            </w:r>
-            <w:r>
-              <w:rPr>
-                <w:rStyle w:val="Hyperlink"/>
-                <w:rFonts w:ascii="HelveticaNeueLT Pro 55 Roman" w:hAnsi="HelveticaNeueLT Pro 55 Roman" w:cs="Arial"/>
-                <w:color w:val="auto"/>
-                <w:u w:val="none"/>
-              </w:rPr>
-              <w:t>basedin.nyc</w:t>
-            </w:r>
-            <w:proofErr w:type="spellEnd"/>
-            <w:r>
-              <w:fldChar w:fldCharType="end"/>
-            </w:r>
+            <w:hyperlink r:id="rId14" w:history="1">
+              <w:r>
+                <w:rPr>
+                  <w:rStyle w:val="Hyperlink"/>
+                  <w:rFonts w:ascii="HelveticaNeueLT Pro 55 Roman" w:hAnsi="HelveticaNeueLT Pro 55 Roman" w:cs="Arial"/>
+                  <w:color w:val="auto"/>
+                  <w:u w:val="none"/>
+                </w:rPr>
+                <w:t>basedin.nyc</w:t>
+              </w:r>
+            </w:hyperlink>
             <w:r>
               <w:rPr>
                 <w:rFonts w:ascii="HelveticaNeueLT Pro 55 Roman" w:hAnsi="HelveticaNeueLT Pro 55 Roman" w:cs="Arial"/>
@@ -1149,23 +1123,13 @@
           <w:sz w:val="18"/>
         </w:rPr>
       </w:pPr>
-      <w:proofErr w:type="gramStart"/>
       <w:r>
         <w:rPr>
           <w:rFonts w:ascii="HelveticaNeueLT Pro 55 Roman" w:hAnsi="HelveticaNeueLT Pro 55 Roman"/>
           <w:b/>
           <w:sz w:val="22"/>
         </w:rPr>
-        <w:t>Open Source</w:t>
-      </w:r>
-      <w:proofErr w:type="gramEnd"/>
-      <w:r>
-        <w:rPr>
-          <w:rFonts w:ascii="HelveticaNeueLT Pro 55 Roman" w:hAnsi="HelveticaNeueLT Pro 55 Roman"/>
-          <w:b/>
-          <w:sz w:val="22"/>
-        </w:rPr>
-        <w:t xml:space="preserve"> </w:t>
+        <w:t xml:space="preserve">Open Source </w:t>
       </w:r>
       <w:r>
         <w:rPr>
@@ -2627,7 +2591,7 @@
           <w:sz w:val="22"/>
           <w:szCs w:val="22"/>
         </w:rPr>
-        <w:t>Over 250</w:t>
+        <w:t xml:space="preserve">Over </w:t>
       </w:r>
       <w:r>
         <w:rPr>
@@ -2635,6 +2599,14 @@
           <w:sz w:val="22"/>
           <w:szCs w:val="22"/>
         </w:rPr>
+        <w:t>300</w:t>
+      </w:r>
+      <w:r>
+        <w:rPr>
+          <w:rFonts w:ascii="HelveticaNeueLT Pro 55 Roman" w:hAnsi="HelveticaNeueLT Pro 55 Roman"/>
+          <w:sz w:val="22"/>
+          <w:szCs w:val="22"/>
+        </w:rPr>
         <w:t xml:space="preserve"> PRs </w:t>
       </w:r>
       <w:r>
@@ -2693,7 +2665,7 @@
         </w:rPr>
         <w:t xml:space="preserve"> </w:t>
       </w:r>
-      <w:hyperlink r:id="rId14" w:history="1">
+      <w:hyperlink r:id="rId15" w:history="1">
         <w:r>
           <w:rPr>
             <w:rStyle w:val="Hyperlink"/>
@@ -2777,25 +2749,7 @@
           <w:sz w:val="22"/>
           <w:szCs w:val="20"/>
         </w:rPr>
-        <w:t xml:space="preserve">Top 5 </w:t>
-      </w:r>
-      <w:proofErr w:type="gramStart"/>
-      <w:r>
-        <w:rPr>
-          <w:rFonts w:ascii="HelveticaNeueLT Pro 55 Roman" w:hAnsi="HelveticaNeueLT Pro 55 Roman" w:cs="Arial"/>
-          <w:sz w:val="22"/>
-          <w:szCs w:val="20"/>
-        </w:rPr>
-        <w:t>contributor</w:t>
-      </w:r>
-      <w:proofErr w:type="gramEnd"/>
-      <w:r>
-        <w:rPr>
-          <w:rFonts w:ascii="HelveticaNeueLT Pro 55 Roman" w:hAnsi="HelveticaNeueLT Pro 55 Roman" w:cs="Arial"/>
-          <w:sz w:val="22"/>
-          <w:szCs w:val="20"/>
-        </w:rPr>
-        <w:t>. S</w:t>
+        <w:t>Top 5 contributor. S</w:t>
       </w:r>
       <w:r>
         <w:rPr>
@@ -3004,7 +2958,7 @@
           <w:sz w:val="22"/>
           <w:szCs w:val="22"/>
         </w:rPr>
-        <w:t>#1</w:t>
+        <w:t xml:space="preserve">Top contributor: </w:t>
       </w:r>
       <w:r>
         <w:rPr>
@@ -3012,7 +2966,7 @@
           <w:sz w:val="22"/>
           <w:szCs w:val="22"/>
         </w:rPr>
-        <w:t xml:space="preserve"> contributor. </w:t>
+        <w:t>UX/UI</w:t>
       </w:r>
       <w:r>
         <w:rPr>
@@ -3020,7 +2974,15 @@
           <w:sz w:val="22"/>
           <w:szCs w:val="22"/>
         </w:rPr>
-        <w:t>UX/UI, g</w:t>
+        <w:t>/front-end</w:t>
+      </w:r>
+      <w:r>
+        <w:rPr>
+          <w:rFonts w:ascii="HelveticaNeueLT Pro 55 Roman" w:hAnsi="HelveticaNeueLT Pro 55 Roman"/>
+          <w:sz w:val="22"/>
+          <w:szCs w:val="22"/>
+        </w:rPr>
+        <w:t>, g</w:t>
       </w:r>
       <w:r>
         <w:rPr>
@@ -3167,7 +3129,7 @@
           <w:sz w:val="22"/>
           <w:szCs w:val="20"/>
         </w:rPr>
-        <w:t>#1</w:t>
+        <w:t>Top</w:t>
       </w:r>
       <w:r>
         <w:rPr>

</xml_diff>

<commit_message>
Add leaderboard generation and show progress updates during normal run
</commit_message>
<xml_diff>
--- a/resume.docx
+++ b/resume.docx
@@ -64,7 +64,7 @@
                 <w:szCs w:val="32"/>
               </w:rPr>
               <w:pict w14:anchorId="39A1D4B1">
-                <v:group id="_x0000_s3105" editas="canvas" style="position:absolute;margin-left:-5pt;margin-top:2.05pt;width:41.4pt;height:11.4pt;z-index:251659264" coordorigin="-100,541" coordsize="828,228">
+                <v:group id="_x0000_s3105" editas="canvas" style="position:absolute;margin-left:-5pt;margin-top:2.05pt;width:41.4pt;height:11.4pt;z-index:1" coordorigin="-100,541" coordsize="828,228">
                   <o:lock v:ext="edit" aspectratio="t"/>
                   <v:shapetype id="_x0000_t75" coordsize="21600,21600" o:spt="75" o:preferrelative="t" path="m@4@5l@4@11@9@11@9@5xe" filled="f" stroked="f">
                     <v:stroke joinstyle="miter"/>
@@ -215,6 +215,7 @@
               </w:rPr>
             </w:pPr>
             <w:hyperlink r:id="rId10" w:history="1">
+              <w:proofErr w:type="spellStart"/>
               <w:r>
                 <w:rPr>
                   <w:rStyle w:val="Hyperlink"/>
@@ -226,6 +227,7 @@
                 </w:rPr>
                 <w:t>basedin.nyc</w:t>
               </w:r>
+              <w:proofErr w:type="spellEnd"/>
             </w:hyperlink>
             <w:r>
               <w:rPr>
@@ -292,6 +294,7 @@
               <w:br/>
             </w:r>
             <w:hyperlink r:id="rId13" w:history="1">
+              <w:proofErr w:type="spellStart"/>
               <w:r>
                 <w:rPr>
                   <w:rStyle w:val="Hyperlink"/>
@@ -302,6 +305,7 @@
                 </w:rPr>
                 <w:t>basedin.nyc</w:t>
               </w:r>
+              <w:proofErr w:type="spellEnd"/>
             </w:hyperlink>
             <w:r>
               <w:t xml:space="preserve"> </w:t>
@@ -683,7 +687,7 @@
                 <w:sz w:val="22"/>
                 <w:szCs w:val="20"/>
               </w:rPr>
-              <w:t>5</w:t>
+              <w:t>3</w:t>
             </w:r>
             <w:r>
               <w:rPr>
@@ -898,6 +902,7 @@
                 <w:rFonts w:ascii="HelveticaNeueLT Pro 55 Roman" w:hAnsi="HelveticaNeueLT Pro 55 Roman" w:cs="Arial"/>
               </w:rPr>
             </w:pPr>
+            <w:proofErr w:type="spellStart"/>
             <w:r>
               <w:rPr>
                 <w:rFonts w:ascii="HelveticaNeueLT Pro 55 Roman" w:hAnsi="HelveticaNeueLT Pro 55 Roman" w:cs="Arial"/>
@@ -906,6 +911,7 @@
               </w:rPr>
               <w:t>Inkreel</w:t>
             </w:r>
+            <w:proofErr w:type="spellEnd"/>
             <w:r>
               <w:rPr>
                 <w:rFonts w:ascii="HelveticaNeueLT Pro 55 Roman" w:hAnsi="HelveticaNeueLT Pro 55 Roman" w:cs="Arial"/>
@@ -918,17 +924,29 @@
               </w:rPr>
               <w:t>(</w:t>
             </w:r>
-            <w:hyperlink r:id="rId14" w:history="1">
-              <w:r>
-                <w:rPr>
-                  <w:rStyle w:val="Hyperlink"/>
-                  <w:rFonts w:ascii="HelveticaNeueLT Pro 55 Roman" w:hAnsi="HelveticaNeueLT Pro 55 Roman" w:cs="Arial"/>
-                  <w:color w:val="auto"/>
-                  <w:u w:val="none"/>
-                </w:rPr>
-                <w:t>basedin.nyc</w:t>
-              </w:r>
-            </w:hyperlink>
+            <w:proofErr w:type="spellStart"/>
+            <w:r>
+              <w:fldChar w:fldCharType="begin"/>
+            </w:r>
+            <w:r>
+              <w:instrText>HYPERLINK "https://basedin.nyc/"</w:instrText>
+            </w:r>
+            <w:r>
+              <w:fldChar w:fldCharType="separate"/>
+            </w:r>
+            <w:r>
+              <w:rPr>
+                <w:rStyle w:val="Hyperlink"/>
+                <w:rFonts w:ascii="HelveticaNeueLT Pro 55 Roman" w:hAnsi="HelveticaNeueLT Pro 55 Roman" w:cs="Arial"/>
+                <w:color w:val="auto"/>
+                <w:u w:val="none"/>
+              </w:rPr>
+              <w:t>basedin.nyc</w:t>
+            </w:r>
+            <w:proofErr w:type="spellEnd"/>
+            <w:r>
+              <w:fldChar w:fldCharType="end"/>
+            </w:r>
             <w:r>
               <w:rPr>
                 <w:rFonts w:ascii="HelveticaNeueLT Pro 55 Roman" w:hAnsi="HelveticaNeueLT Pro 55 Roman" w:cs="Arial"/>
@@ -1123,13 +1141,23 @@
           <w:sz w:val="18"/>
         </w:rPr>
       </w:pPr>
+      <w:proofErr w:type="gramStart"/>
       <w:r>
         <w:rPr>
           <w:rFonts w:ascii="HelveticaNeueLT Pro 55 Roman" w:hAnsi="HelveticaNeueLT Pro 55 Roman"/>
           <w:b/>
           <w:sz w:val="22"/>
         </w:rPr>
-        <w:t xml:space="preserve">Open Source </w:t>
+        <w:t>Open Source</w:t>
+      </w:r>
+      <w:proofErr w:type="gramEnd"/>
+      <w:r>
+        <w:rPr>
+          <w:rFonts w:ascii="HelveticaNeueLT Pro 55 Roman" w:hAnsi="HelveticaNeueLT Pro 55 Roman"/>
+          <w:b/>
+          <w:sz w:val="22"/>
+        </w:rPr>
+        <w:t xml:space="preserve"> </w:t>
       </w:r>
       <w:r>
         <w:rPr>
@@ -2681,7 +2709,7 @@
         </w:rPr>
         <w:t xml:space="preserve"> </w:t>
       </w:r>
-      <w:hyperlink r:id="rId15" w:history="1">
+      <w:hyperlink r:id="rId14" w:history="1">
         <w:r>
           <w:rPr>
             <w:rStyle w:val="Hyperlink"/>
@@ -2765,7 +2793,39 @@
           <w:sz w:val="22"/>
           <w:szCs w:val="20"/>
         </w:rPr>
-        <w:t>Top 5 contributor. S</w:t>
+        <w:t>#2</w:t>
+      </w:r>
+      <w:r>
+        <w:rPr>
+          <w:rFonts w:ascii="HelveticaNeueLT Pro 55 Roman" w:hAnsi="HelveticaNeueLT Pro 55 Roman" w:cs="Arial"/>
+          <w:sz w:val="22"/>
+          <w:szCs w:val="20"/>
+        </w:rPr>
+        <w:t xml:space="preserve"> contributor</w:t>
+      </w:r>
+      <w:r>
+        <w:rPr>
+          <w:rFonts w:ascii="HelveticaNeueLT Pro 55 Roman" w:hAnsi="HelveticaNeueLT Pro 55 Roman" w:cs="Arial"/>
+          <w:sz w:val="22"/>
+          <w:szCs w:val="20"/>
+        </w:rPr>
+        <w:t>:</w:t>
+      </w:r>
+      <w:r>
+        <w:rPr>
+          <w:rFonts w:ascii="HelveticaNeueLT Pro 55 Roman" w:hAnsi="HelveticaNeueLT Pro 55 Roman" w:cs="Arial"/>
+          <w:sz w:val="22"/>
+          <w:szCs w:val="20"/>
+        </w:rPr>
+        <w:t xml:space="preserve"> </w:t>
+      </w:r>
+      <w:r>
+        <w:rPr>
+          <w:rFonts w:ascii="HelveticaNeueLT Pro 55 Roman" w:hAnsi="HelveticaNeueLT Pro 55 Roman" w:cs="Arial"/>
+          <w:sz w:val="22"/>
+          <w:szCs w:val="20"/>
+        </w:rPr>
+        <w:t>s</w:t>
       </w:r>
       <w:r>
         <w:rPr>
@@ -3229,7 +3289,21 @@
           <w:rFonts w:ascii="HelveticaNeueLT Pro 55 Roman" w:hAnsi="HelveticaNeueLT Pro 55 Roman"/>
           <w:sz w:val="18"/>
         </w:rPr>
-        <w:t xml:space="preserve"> (50k stars)  ·  </w:t>
+        <w:t xml:space="preserve"> (5</w:t>
+      </w:r>
+      <w:r>
+        <w:rPr>
+          <w:rFonts w:ascii="HelveticaNeueLT Pro 55 Roman" w:hAnsi="HelveticaNeueLT Pro 55 Roman"/>
+          <w:sz w:val="18"/>
+        </w:rPr>
+        <w:t>6</w:t>
+      </w:r>
+      <w:r>
+        <w:rPr>
+          <w:rFonts w:ascii="HelveticaNeueLT Pro 55 Roman" w:hAnsi="HelveticaNeueLT Pro 55 Roman"/>
+          <w:sz w:val="18"/>
+        </w:rPr>
+        <w:t xml:space="preserve">k stars)  ·  </w:t>
       </w:r>
       <w:r>
         <w:rPr>
@@ -3252,7 +3326,7 @@
           <w:sz w:val="22"/>
           <w:szCs w:val="22"/>
         </w:rPr>
-        <w:t xml:space="preserve">Top </w:t>
+        <w:t>To</w:t>
       </w:r>
       <w:r>
         <w:rPr>
@@ -3260,7 +3334,7 @@
           <w:sz w:val="22"/>
           <w:szCs w:val="22"/>
         </w:rPr>
-        <w:t>5</w:t>
+        <w:t>ken compression proxy for LLMs. To</w:t>
       </w:r>
       <w:r>
         <w:rPr>
@@ -3268,6 +3342,22 @@
           <w:sz w:val="22"/>
           <w:szCs w:val="22"/>
         </w:rPr>
+        <w:t xml:space="preserve">p </w:t>
+      </w:r>
+      <w:r>
+        <w:rPr>
+          <w:rFonts w:ascii="HelveticaNeueLT Pro 55 Roman" w:hAnsi="HelveticaNeueLT Pro 55 Roman"/>
+          <w:sz w:val="22"/>
+          <w:szCs w:val="22"/>
+        </w:rPr>
+        <w:t>3</w:t>
+      </w:r>
+      <w:r>
+        <w:rPr>
+          <w:rFonts w:ascii="HelveticaNeueLT Pro 55 Roman" w:hAnsi="HelveticaNeueLT Pro 55 Roman"/>
+          <w:sz w:val="22"/>
+          <w:szCs w:val="22"/>
+        </w:rPr>
         <w:t xml:space="preserve"> </w:t>
       </w:r>
       <w:r>
@@ -3278,69 +3368,23 @@
         </w:rPr>
         <w:t xml:space="preserve">third-party </w:t>
       </w:r>
+      <w:proofErr w:type="gramStart"/>
       <w:r>
         <w:rPr>
           <w:rFonts w:ascii="HelveticaNeueLT Pro 55 Roman" w:hAnsi="HelveticaNeueLT Pro 55 Roman"/>
           <w:sz w:val="22"/>
           <w:szCs w:val="22"/>
         </w:rPr>
-        <w:t>contributor.</w:t>
-      </w:r>
-    </w:p>
-    <w:p>
-      <w:pPr>
-        <w:spacing w:before="60" w:line="276" w:lineRule="auto"/>
+        <w:t>contributor</w:t>
+      </w:r>
+      <w:proofErr w:type="gramEnd"/>
+      <w:r>
         <w:rPr>
           <w:rFonts w:ascii="HelveticaNeueLT Pro 55 Roman" w:hAnsi="HelveticaNeueLT Pro 55 Roman"/>
           <w:sz w:val="22"/>
           <w:szCs w:val="22"/>
         </w:rPr>
-      </w:pPr>
-      <w:r>
-        <w:rPr>
-          <w:rFonts w:ascii="HelveticaNeueLT Pro 55 Roman" w:hAnsi="HelveticaNeueLT Pro 55 Roman"/>
-          <w:b/>
-          <w:sz w:val="22"/>
-        </w:rPr>
-        <w:t>mem0ai/mem0</w:t>
-      </w:r>
-      <w:r>
-        <w:rPr>
-          <w:rFonts w:ascii="HelveticaNeueLT Pro 55 Roman" w:hAnsi="HelveticaNeueLT Pro 55 Roman"/>
-          <w:sz w:val="18"/>
-        </w:rPr>
-        <w:t xml:space="preserve"> (59k stars)  ·  </w:t>
-      </w:r>
-      <w:r>
-        <w:rPr>
-          <w:rFonts w:ascii="HelveticaNeueLT Pro 55 Roman" w:hAnsi="HelveticaNeueLT Pro 55 Roman"/>
-          <w:bCs/>
-          <w:sz w:val="18"/>
-        </w:rPr>
-        <w:t>Python,</w:t>
-      </w:r>
-      <w:r>
-        <w:rPr>
-          <w:rFonts w:ascii="HelveticaNeueLT Pro 55 Roman" w:hAnsi="HelveticaNeueLT Pro 55 Roman"/>
-          <w:bCs/>
-          <w:sz w:val="18"/>
-        </w:rPr>
-        <w:t xml:space="preserve"> TypeScript</w:t>
-      </w:r>
-      <w:r>
-        <w:rPr>
-          <w:rFonts w:ascii="HelveticaNeueLT Pro 55 Roman" w:hAnsi="HelveticaNeueLT Pro 55 Roman"/>
-          <w:sz w:val="18"/>
-        </w:rPr>
-        <w:t xml:space="preserve">  ·  </w:t>
-      </w:r>
-      <w:r>
-        <w:rPr>
-          <w:rFonts w:ascii="HelveticaNeueLT Pro 55 Roman" w:hAnsi="HelveticaNeueLT Pro 55 Roman"/>
-          <w:sz w:val="22"/>
-          <w:szCs w:val="22"/>
-        </w:rPr>
-        <w:t>Top 10 third-party contributor.</w:t>
+        <w:t>: cache stability, compression-safe tool availability, session fidelity.</w:t>
       </w:r>
     </w:p>
     <w:p>

</xml_diff>

<commit_message>
Handle claude-mem community-edge merges and pin the logic
</commit_message>
<xml_diff>
--- a/resume.docx
+++ b/resume.docx
@@ -215,7 +215,6 @@
               </w:rPr>
             </w:pPr>
             <w:hyperlink r:id="rId10" w:history="1">
-              <w:proofErr w:type="spellStart"/>
               <w:r>
                 <w:rPr>
                   <w:rStyle w:val="Hyperlink"/>
@@ -227,7 +226,6 @@
                 </w:rPr>
                 <w:t>basedin.nyc</w:t>
               </w:r>
-              <w:proofErr w:type="spellEnd"/>
             </w:hyperlink>
             <w:r>
               <w:rPr>
@@ -294,7 +292,6 @@
               <w:br/>
             </w:r>
             <w:hyperlink r:id="rId13" w:history="1">
-              <w:proofErr w:type="spellStart"/>
               <w:r>
                 <w:rPr>
                   <w:rStyle w:val="Hyperlink"/>
@@ -305,7 +302,6 @@
                 </w:rPr>
                 <w:t>basedin.nyc</w:t>
               </w:r>
-              <w:proofErr w:type="spellEnd"/>
             </w:hyperlink>
             <w:r>
               <w:t xml:space="preserve"> </w:t>
@@ -487,7 +483,15 @@
                 <w:sz w:val="22"/>
                 <w:szCs w:val="20"/>
               </w:rPr>
-              <w:t>40</w:t>
+              <w:t>5</w:t>
+            </w:r>
+            <w:r>
+              <w:rPr>
+                <w:rFonts w:ascii="HelveticaNeueLT Pro 55 Roman" w:hAnsi="HelveticaNeueLT Pro 55 Roman" w:cs="Arial"/>
+                <w:sz w:val="22"/>
+                <w:szCs w:val="20"/>
+              </w:rPr>
+              <w:t>0</w:t>
             </w:r>
             <w:r>
               <w:rPr>
@@ -902,7 +906,6 @@
                 <w:rFonts w:ascii="HelveticaNeueLT Pro 55 Roman" w:hAnsi="HelveticaNeueLT Pro 55 Roman" w:cs="Arial"/>
               </w:rPr>
             </w:pPr>
-            <w:proofErr w:type="spellStart"/>
             <w:r>
               <w:rPr>
                 <w:rFonts w:ascii="HelveticaNeueLT Pro 55 Roman" w:hAnsi="HelveticaNeueLT Pro 55 Roman" w:cs="Arial"/>
@@ -911,7 +914,6 @@
               </w:rPr>
               <w:t>Inkreel</w:t>
             </w:r>
-            <w:proofErr w:type="spellEnd"/>
             <w:r>
               <w:rPr>
                 <w:rFonts w:ascii="HelveticaNeueLT Pro 55 Roman" w:hAnsi="HelveticaNeueLT Pro 55 Roman" w:cs="Arial"/>
@@ -924,29 +926,17 @@
               </w:rPr>
               <w:t>(</w:t>
             </w:r>
-            <w:proofErr w:type="spellStart"/>
-            <w:r>
-              <w:fldChar w:fldCharType="begin"/>
-            </w:r>
-            <w:r>
-              <w:instrText>HYPERLINK "https://basedin.nyc/"</w:instrText>
-            </w:r>
-            <w:r>
-              <w:fldChar w:fldCharType="separate"/>
-            </w:r>
-            <w:r>
-              <w:rPr>
-                <w:rStyle w:val="Hyperlink"/>
-                <w:rFonts w:ascii="HelveticaNeueLT Pro 55 Roman" w:hAnsi="HelveticaNeueLT Pro 55 Roman" w:cs="Arial"/>
-                <w:color w:val="auto"/>
-                <w:u w:val="none"/>
-              </w:rPr>
-              <w:t>basedin.nyc</w:t>
-            </w:r>
-            <w:proofErr w:type="spellEnd"/>
-            <w:r>
-              <w:fldChar w:fldCharType="end"/>
-            </w:r>
+            <w:hyperlink r:id="rId14" w:history="1">
+              <w:r>
+                <w:rPr>
+                  <w:rStyle w:val="Hyperlink"/>
+                  <w:rFonts w:ascii="HelveticaNeueLT Pro 55 Roman" w:hAnsi="HelveticaNeueLT Pro 55 Roman" w:cs="Arial"/>
+                  <w:color w:val="auto"/>
+                  <w:u w:val="none"/>
+                </w:rPr>
+                <w:t>basedin.nyc</w:t>
+              </w:r>
+            </w:hyperlink>
             <w:r>
               <w:rPr>
                 <w:rFonts w:ascii="HelveticaNeueLT Pro 55 Roman" w:hAnsi="HelveticaNeueLT Pro 55 Roman" w:cs="Arial"/>
@@ -1141,23 +1131,13 @@
           <w:sz w:val="18"/>
         </w:rPr>
       </w:pPr>
-      <w:proofErr w:type="gramStart"/>
       <w:r>
         <w:rPr>
           <w:rFonts w:ascii="HelveticaNeueLT Pro 55 Roman" w:hAnsi="HelveticaNeueLT Pro 55 Roman"/>
           <w:b/>
           <w:sz w:val="22"/>
         </w:rPr>
-        <w:t>Open Source</w:t>
-      </w:r>
-      <w:proofErr w:type="gramEnd"/>
-      <w:r>
-        <w:rPr>
-          <w:rFonts w:ascii="HelveticaNeueLT Pro 55 Roman" w:hAnsi="HelveticaNeueLT Pro 55 Roman"/>
-          <w:b/>
-          <w:sz w:val="22"/>
-        </w:rPr>
-        <w:t xml:space="preserve"> </w:t>
+        <w:t xml:space="preserve">Open Source </w:t>
       </w:r>
       <w:r>
         <w:rPr>
@@ -2627,7 +2607,7 @@
           <w:sz w:val="22"/>
           <w:szCs w:val="22"/>
         </w:rPr>
-        <w:t>3</w:t>
+        <w:t>40</w:t>
       </w:r>
       <w:r>
         <w:rPr>
@@ -2635,7 +2615,7 @@
           <w:sz w:val="22"/>
           <w:szCs w:val="22"/>
         </w:rPr>
-        <w:t>5</w:t>
+        <w:t>0</w:t>
       </w:r>
       <w:r>
         <w:rPr>
@@ -2643,7 +2623,7 @@
           <w:sz w:val="22"/>
           <w:szCs w:val="22"/>
         </w:rPr>
-        <w:t>0</w:t>
+        <w:t xml:space="preserve"> PRs </w:t>
       </w:r>
       <w:r>
         <w:rPr>
@@ -2651,7 +2631,7 @@
           <w:sz w:val="22"/>
           <w:szCs w:val="22"/>
         </w:rPr>
-        <w:t xml:space="preserve"> PRs </w:t>
+        <w:t>shipped</w:t>
       </w:r>
       <w:r>
         <w:rPr>
@@ -2659,7 +2639,7 @@
           <w:sz w:val="22"/>
           <w:szCs w:val="22"/>
         </w:rPr>
-        <w:t>shipped</w:t>
+        <w:t xml:space="preserve"> to production </w:t>
       </w:r>
       <w:r>
         <w:rPr>
@@ -2667,7 +2647,7 @@
           <w:sz w:val="22"/>
           <w:szCs w:val="22"/>
         </w:rPr>
-        <w:t xml:space="preserve"> to production </w:t>
+        <w:t>at 9</w:t>
       </w:r>
       <w:r>
         <w:rPr>
@@ -2675,7 +2655,7 @@
           <w:sz w:val="22"/>
           <w:szCs w:val="22"/>
         </w:rPr>
-        <w:t>at 9</w:t>
+        <w:t>8</w:t>
       </w:r>
       <w:r>
         <w:rPr>
@@ -2683,7 +2663,7 @@
           <w:sz w:val="22"/>
           <w:szCs w:val="22"/>
         </w:rPr>
-        <w:t>8</w:t>
+        <w:t>% acceptance</w:t>
       </w:r>
       <w:r>
         <w:rPr>
@@ -2691,7 +2671,7 @@
           <w:sz w:val="22"/>
           <w:szCs w:val="22"/>
         </w:rPr>
-        <w:t>% acceptance</w:t>
+        <w:t>:</w:t>
       </w:r>
       <w:r>
         <w:rPr>
@@ -2699,17 +2679,9 @@
           <w:sz w:val="22"/>
           <w:szCs w:val="22"/>
         </w:rPr>
-        <w:t>:</w:t>
-      </w:r>
-      <w:r>
-        <w:rPr>
-          <w:rFonts w:ascii="HelveticaNeueLT Pro 55 Roman" w:hAnsi="HelveticaNeueLT Pro 55 Roman"/>
-          <w:sz w:val="22"/>
-          <w:szCs w:val="22"/>
-        </w:rPr>
         <w:t xml:space="preserve"> </w:t>
       </w:r>
-      <w:hyperlink r:id="rId14" w:history="1">
+      <w:hyperlink r:id="rId15" w:history="1">
         <w:r>
           <w:rPr>
             <w:rStyle w:val="Hyperlink"/>
@@ -3368,7 +3340,6 @@
         </w:rPr>
         <w:t xml:space="preserve">third-party </w:t>
       </w:r>
-      <w:proofErr w:type="gramStart"/>
       <w:r>
         <w:rPr>
           <w:rFonts w:ascii="HelveticaNeueLT Pro 55 Roman" w:hAnsi="HelveticaNeueLT Pro 55 Roman"/>
@@ -3377,7 +3348,6 @@
         </w:rPr>
         <w:t>contributor</w:t>
       </w:r>
-      <w:proofErr w:type="gramEnd"/>
       <w:r>
         <w:rPr>
           <w:rFonts w:ascii="HelveticaNeueLT Pro 55 Roman" w:hAnsi="HelveticaNeueLT Pro 55 Roman"/>

</xml_diff>

<commit_message>
Add NVIDIA/SkillSpector; link to repos
</commit_message>
<xml_diff>
--- a/resume.docx
+++ b/resume.docx
@@ -487,7 +487,7 @@
                 <w:sz w:val="22"/>
                 <w:szCs w:val="20"/>
               </w:rPr>
-              <w:t>4</w:t>
+              <w:t>50</w:t>
             </w:r>
             <w:r>
               <w:rPr>
@@ -495,7 +495,7 @@
                 <w:sz w:val="22"/>
                 <w:szCs w:val="20"/>
               </w:rPr>
-              <w:t>50</w:t>
+              <w:t>0</w:t>
             </w:r>
             <w:r>
               <w:rPr>
@@ -551,23 +551,7 @@
                 <w:sz w:val="22"/>
                 <w:szCs w:val="20"/>
               </w:rPr>
-              <w:t>om (58</w:t>
-            </w:r>
-            <w:r>
-              <w:rPr>
-                <w:rFonts w:ascii="HelveticaNeueLT Pro 55 Roman" w:hAnsi="HelveticaNeueLT Pro 55 Roman" w:cs="Arial"/>
-                <w:sz w:val="22"/>
-                <w:szCs w:val="20"/>
-              </w:rPr>
-              <w:t>k</w:t>
-            </w:r>
-            <w:r>
-              <w:rPr>
-                <w:rFonts w:ascii="HelveticaNeueLT Pro 55 Roman" w:hAnsi="HelveticaNeueLT Pro 55 Roman" w:cs="Arial"/>
-                <w:sz w:val="22"/>
-                <w:szCs w:val="20"/>
-              </w:rPr>
-              <w:t>),</w:t>
+              <w:t>om (58k),</w:t>
             </w:r>
             <w:r>
               <w:rPr>
@@ -2507,15 +2491,7 @@
           <w:sz w:val="22"/>
           <w:szCs w:val="22"/>
         </w:rPr>
-        <w:t>4</w:t>
-      </w:r>
-      <w:r>
-        <w:rPr>
-          <w:rFonts w:ascii="HelveticaNeueLT Pro 55 Roman" w:hAnsi="HelveticaNeueLT Pro 55 Roman"/>
-          <w:sz w:val="22"/>
-          <w:szCs w:val="22"/>
-        </w:rPr>
-        <w:t>5</w:t>
+        <w:t>50</w:t>
       </w:r>
       <w:r>
         <w:rPr>

</xml_diff>

<commit_message>
Drop obsolete parity test pinning live credit counts to the frozen PS1 snapshot
</commit_message>
<xml_diff>
--- a/resume.docx
+++ b/resume.docx
@@ -215,7 +215,6 @@
               </w:rPr>
             </w:pPr>
             <w:hyperlink r:id="rId10" w:history="1">
-              <w:proofErr w:type="spellStart"/>
               <w:r>
                 <w:rPr>
                   <w:rStyle w:val="Hyperlink"/>
@@ -227,7 +226,6 @@
                 </w:rPr>
                 <w:t>basedin.nyc</w:t>
               </w:r>
-              <w:proofErr w:type="spellEnd"/>
             </w:hyperlink>
             <w:r>
               <w:rPr>
@@ -294,7 +292,6 @@
               <w:br/>
             </w:r>
             <w:hyperlink r:id="rId13" w:history="1">
-              <w:proofErr w:type="spellStart"/>
               <w:r>
                 <w:rPr>
                   <w:rStyle w:val="Hyperlink"/>
@@ -305,7 +302,6 @@
                 </w:rPr>
                 <w:t>basedin.nyc</w:t>
               </w:r>
-              <w:proofErr w:type="spellEnd"/>
             </w:hyperlink>
             <w:r>
               <w:t xml:space="preserve"> </w:t>
@@ -766,7 +762,6 @@
                 <w:rFonts w:ascii="HelveticaNeueLT Pro 55 Roman" w:hAnsi="HelveticaNeueLT Pro 55 Roman" w:cs="Arial"/>
               </w:rPr>
             </w:pPr>
-            <w:proofErr w:type="spellStart"/>
             <w:r>
               <w:rPr>
                 <w:rFonts w:ascii="HelveticaNeueLT Pro 55 Roman" w:hAnsi="HelveticaNeueLT Pro 55 Roman" w:cs="Arial"/>
@@ -775,7 +770,6 @@
               </w:rPr>
               <w:t>Inkreel</w:t>
             </w:r>
-            <w:proofErr w:type="spellEnd"/>
             <w:r>
               <w:rPr>
                 <w:rFonts w:ascii="HelveticaNeueLT Pro 55 Roman" w:hAnsi="HelveticaNeueLT Pro 55 Roman" w:cs="Arial"/>
@@ -788,29 +782,17 @@
               </w:rPr>
               <w:t>(</w:t>
             </w:r>
-            <w:proofErr w:type="spellStart"/>
-            <w:r>
-              <w:fldChar w:fldCharType="begin"/>
-            </w:r>
-            <w:r>
-              <w:instrText>HYPERLINK "https://basedin.nyc/"</w:instrText>
-            </w:r>
-            <w:r>
-              <w:fldChar w:fldCharType="separate"/>
-            </w:r>
-            <w:r>
-              <w:rPr>
-                <w:rStyle w:val="Hyperlink"/>
-                <w:rFonts w:ascii="HelveticaNeueLT Pro 55 Roman" w:hAnsi="HelveticaNeueLT Pro 55 Roman" w:cs="Arial"/>
-                <w:color w:val="auto"/>
-                <w:u w:val="none"/>
-              </w:rPr>
-              <w:t>basedin.nyc</w:t>
-            </w:r>
-            <w:proofErr w:type="spellEnd"/>
-            <w:r>
-              <w:fldChar w:fldCharType="end"/>
-            </w:r>
+            <w:hyperlink r:id="rId14" w:history="1">
+              <w:r>
+                <w:rPr>
+                  <w:rStyle w:val="Hyperlink"/>
+                  <w:rFonts w:ascii="HelveticaNeueLT Pro 55 Roman" w:hAnsi="HelveticaNeueLT Pro 55 Roman" w:cs="Arial"/>
+                  <w:color w:val="auto"/>
+                  <w:u w:val="none"/>
+                </w:rPr>
+                <w:t>basedin.nyc</w:t>
+              </w:r>
+            </w:hyperlink>
             <w:r>
               <w:rPr>
                 <w:rFonts w:ascii="HelveticaNeueLT Pro 55 Roman" w:hAnsi="HelveticaNeueLT Pro 55 Roman" w:cs="Arial"/>
@@ -1005,23 +987,13 @@
           <w:sz w:val="18"/>
         </w:rPr>
       </w:pPr>
-      <w:proofErr w:type="gramStart"/>
       <w:r>
         <w:rPr>
           <w:rFonts w:ascii="HelveticaNeueLT Pro 55 Roman" w:hAnsi="HelveticaNeueLT Pro 55 Roman"/>
           <w:b/>
           <w:sz w:val="22"/>
         </w:rPr>
-        <w:t>Open Source</w:t>
-      </w:r>
-      <w:proofErr w:type="gramEnd"/>
-      <w:r>
-        <w:rPr>
-          <w:rFonts w:ascii="HelveticaNeueLT Pro 55 Roman" w:hAnsi="HelveticaNeueLT Pro 55 Roman"/>
-          <w:b/>
-          <w:sz w:val="22"/>
-        </w:rPr>
-        <w:t xml:space="preserve"> </w:t>
+        <w:t xml:space="preserve">Open Source </w:t>
       </w:r>
       <w:r>
         <w:rPr>
@@ -2539,7 +2511,7 @@
           <w:sz w:val="22"/>
           <w:szCs w:val="22"/>
         </w:rPr>
-        <w:t>8</w:t>
+        <w:t>7</w:t>
       </w:r>
       <w:r>
         <w:rPr>
@@ -2565,7 +2537,7 @@
         </w:rPr>
         <w:t xml:space="preserve"> </w:t>
       </w:r>
-      <w:hyperlink r:id="rId14" w:history="1">
+      <w:hyperlink r:id="rId15" w:history="1">
         <w:r>
           <w:rPr>
             <w:rStyle w:val="Hyperlink"/>

</xml_diff>

<commit_message>
Seed the Breakdown from the load animation's first frame so the page does not jump when the animation starts
</commit_message>
<xml_diff>
--- a/resume.docx
+++ b/resume.docx
@@ -880,7 +880,7 @@
           <w:rFonts w:ascii="HelveticaNeueLT Pro 55 Roman" w:hAnsi="HelveticaNeueLT Pro 55 Roman"/>
           <w:sz w:val="25"/>
         </w:rPr>
-        <w:t>Full-Stack Developer &amp; Consultant</w:t>
+        <w:t xml:space="preserve">Full-Stack Developer </w:t>
       </w:r>
       <w:r>
         <w:rPr>
@@ -1029,13 +1029,23 @@
           <w:sz w:val="18"/>
         </w:rPr>
       </w:pPr>
+      <w:proofErr w:type="gramStart"/>
       <w:r>
         <w:rPr>
           <w:rFonts w:ascii="HelveticaNeueLT Pro 55 Roman" w:hAnsi="HelveticaNeueLT Pro 55 Roman"/>
           <w:b/>
           <w:sz w:val="22"/>
         </w:rPr>
-        <w:t xml:space="preserve">Open Source </w:t>
+        <w:t>Open Source</w:t>
+      </w:r>
+      <w:proofErr w:type="gramEnd"/>
+      <w:r>
+        <w:rPr>
+          <w:rFonts w:ascii="HelveticaNeueLT Pro 55 Roman" w:hAnsi="HelveticaNeueLT Pro 55 Roman"/>
+          <w:b/>
+          <w:sz w:val="22"/>
+        </w:rPr>
+        <w:t xml:space="preserve"> </w:t>
       </w:r>
       <w:r>
         <w:rPr>

</xml_diff>

<commit_message>
Let a credited takeover outrank the author's own close, rechecking young withdrawals until the replacement lands
</commit_message>
<xml_diff>
--- a/resume.docx
+++ b/resume.docx
@@ -64,7 +64,7 @@
                 <w:szCs w:val="32"/>
               </w:rPr>
               <w:pict w14:anchorId="39A1D4B1">
-                <v:group id="_x0000_s3105" editas="canvas" style="position:absolute;margin-left:-5pt;margin-top:2.05pt;width:41.4pt;height:11.4pt;z-index:1" coordorigin="-100,541" coordsize="828,228">
+                <v:group id="_x0000_s3105" editas="canvas" style="position:absolute;margin-left:-5pt;margin-top:2.05pt;width:41.4pt;height:11.4pt;z-index:251659264" coordorigin="-100,541" coordsize="828,228">
                   <o:lock v:ext="edit" aspectratio="t"/>
                   <v:shapetype id="_x0000_t75" coordsize="21600,21600" o:spt="75" o:preferrelative="t" path="m@4@5l@4@11@9@11@9@5xe" filled="f" stroked="f">
                     <v:stroke joinstyle="miter"/>
@@ -215,7 +215,6 @@
               </w:rPr>
             </w:pPr>
             <w:hyperlink r:id="rId10" w:history="1">
-              <w:proofErr w:type="spellStart"/>
               <w:r>
                 <w:rPr>
                   <w:rStyle w:val="Hyperlink"/>
@@ -227,7 +226,6 @@
                 </w:rPr>
                 <w:t>basedin.nyc</w:t>
               </w:r>
-              <w:proofErr w:type="spellEnd"/>
             </w:hyperlink>
             <w:r>
               <w:rPr>
@@ -244,18 +242,13 @@
               </w:rPr>
               <w:t xml:space="preserve">·  </w:t>
             </w:r>
-            <w:hyperlink r:id="rId11" w:history="1">
-              <w:r>
-                <w:rPr>
-                  <w:rStyle w:val="Hyperlink"/>
-                  <w:rFonts w:ascii="HelveticaNeueLT Pro 55 Roman" w:hAnsi="HelveticaNeueLT Pro 55 Roman"/>
-                  <w:color w:val="auto"/>
-                  <w:sz w:val="18"/>
-                  <w:u w:val="none"/>
-                </w:rPr>
-                <w:t>347-644-9001</w:t>
-              </w:r>
-            </w:hyperlink>
+            <w:r>
+              <w:rPr>
+                <w:rFonts w:ascii="HelveticaNeueLT Pro 55 Roman" w:hAnsi="HelveticaNeueLT Pro 55 Roman"/>
+                <w:sz w:val="18"/>
+              </w:rPr>
+              <w:t>347-644-9001</w:t>
+            </w:r>
           </w:p>
         </w:tc>
         <w:tc>
@@ -274,7 +267,7 @@
                 <w:szCs w:val="18"/>
               </w:rPr>
             </w:pPr>
-            <w:hyperlink r:id="rId12" w:history="1">
+            <w:hyperlink r:id="rId11" w:history="1">
               <w:r>
                 <w:rPr>
                   <w:rStyle w:val="Hyperlink"/>
@@ -293,8 +286,7 @@
               </w:rPr>
               <w:br/>
             </w:r>
-            <w:hyperlink r:id="rId13" w:history="1">
-              <w:proofErr w:type="spellStart"/>
+            <w:hyperlink r:id="rId12" w:history="1">
               <w:r>
                 <w:rPr>
                   <w:rStyle w:val="Hyperlink"/>
@@ -305,7 +297,6 @@
                 </w:rPr>
                 <w:t>basedin.nyc</w:t>
               </w:r>
-              <w:proofErr w:type="spellEnd"/>
             </w:hyperlink>
             <w:r>
               <w:t xml:space="preserve"> </w:t>
@@ -433,7 +424,63 @@
                 <w:sz w:val="22"/>
                 <w:szCs w:val="21"/>
               </w:rPr>
-              <w:t>Full-stack developer and technical lead with 15+ years building for Fortune 500 brands including NBC Sports, Victoria's Secret, Visa, Apple, Disney, and the NFL. I specialize in AI integration and orchestration, with deep roots in WordPress and e-commerce.</w:t>
+              <w:t xml:space="preserve">Full-stack developer and technical lead with 15+ years building for Fortune 500 brands including NBC Sports, Victoria's Secret, Visa, Apple, Disney, and the NFL. I specialize in </w:t>
+            </w:r>
+            <w:r>
+              <w:rPr>
+                <w:rFonts w:ascii="HelveticaNeueLT Pro 55 Roman" w:hAnsi="HelveticaNeueLT Pro 55 Roman" w:cs="Arial"/>
+                <w:sz w:val="22"/>
+                <w:szCs w:val="21"/>
+              </w:rPr>
+              <w:t>A</w:t>
+            </w:r>
+            <w:r>
+              <w:rPr>
+                <w:rFonts w:ascii="HelveticaNeueLT Pro 55 Roman" w:hAnsi="HelveticaNeueLT Pro 55 Roman" w:cs="Arial"/>
+                <w:sz w:val="22"/>
+                <w:szCs w:val="21"/>
+              </w:rPr>
+              <w:t xml:space="preserve">I integration </w:t>
+            </w:r>
+            <w:r>
+              <w:rPr>
+                <w:rFonts w:ascii="HelveticaNeueLT Pro 55 Roman" w:hAnsi="HelveticaNeueLT Pro 55 Roman" w:cs="Arial"/>
+                <w:sz w:val="22"/>
+                <w:szCs w:val="21"/>
+              </w:rPr>
+              <w:t>o</w:t>
+            </w:r>
+            <w:r>
+              <w:rPr>
+                <w:rFonts w:ascii="HelveticaNeueLT Pro 55 Roman" w:hAnsi="HelveticaNeueLT Pro 55 Roman" w:cs="Arial"/>
+                <w:sz w:val="22"/>
+                <w:szCs w:val="21"/>
+              </w:rPr>
+              <w:t>n a Next.js/React stack</w:t>
+            </w:r>
+            <w:r>
+              <w:rPr>
+                <w:rFonts w:ascii="HelveticaNeueLT Pro 55 Roman" w:hAnsi="HelveticaNeueLT Pro 55 Roman" w:cs="Arial"/>
+                <w:sz w:val="22"/>
+                <w:szCs w:val="21"/>
+              </w:rPr>
+              <w:t xml:space="preserve">, </w:t>
+            </w:r>
+            <w:r>
+              <w:rPr>
+                <w:rFonts w:ascii="HelveticaNeueLT Pro 55 Roman" w:hAnsi="HelveticaNeueLT Pro 55 Roman" w:cs="Arial"/>
+                <w:sz w:val="22"/>
+                <w:szCs w:val="21"/>
+              </w:rPr>
+              <w:t>with</w:t>
+            </w:r>
+            <w:r>
+              <w:rPr>
+                <w:rFonts w:ascii="HelveticaNeueLT Pro 55 Roman" w:hAnsi="HelveticaNeueLT Pro 55 Roman" w:cs="Arial"/>
+                <w:sz w:val="22"/>
+                <w:szCs w:val="21"/>
+              </w:rPr>
+              <w:t xml:space="preserve"> deep roots in WordPress and e-commerce.</w:t>
             </w:r>
           </w:p>
           <w:p>
@@ -465,7 +512,60 @@
                 <w:sz w:val="22"/>
                 <w:szCs w:val="20"/>
               </w:rPr>
-              <w:t>Production AI systems using OpenAI and Anthropic APIs: streaming chat, real-time voice, cost-managed caching.</w:t>
+              <w:t>Next.js</w:t>
+            </w:r>
+            <w:r>
+              <w:rPr>
+                <w:rFonts w:ascii="HelveticaNeueLT Pro 55 Roman" w:hAnsi="HelveticaNeueLT Pro 55 Roman" w:cs="Arial"/>
+                <w:sz w:val="22"/>
+                <w:szCs w:val="20"/>
+              </w:rPr>
+              <w:t xml:space="preserve"> App Router</w:t>
+            </w:r>
+            <w:r>
+              <w:rPr>
+                <w:rFonts w:ascii="HelveticaNeueLT Pro 55 Roman" w:hAnsi="HelveticaNeueLT Pro 55 Roman" w:cs="Arial"/>
+                <w:sz w:val="22"/>
+                <w:szCs w:val="20"/>
+              </w:rPr>
+              <w:t>, React, TypeScript, and Node.js across the stack.</w:t>
+            </w:r>
+          </w:p>
+          <w:p>
+            <w:pPr>
+              <w:numPr>
+                <w:ilvl w:val="0"/>
+                <w:numId w:val="1"/>
+              </w:numPr>
+              <w:rPr>
+                <w:rFonts w:ascii="HelveticaNeueLT Pro 55 Roman" w:hAnsi="HelveticaNeueLT Pro 55 Roman" w:cs="Arial"/>
+                <w:sz w:val="22"/>
+                <w:szCs w:val="20"/>
+              </w:rPr>
+            </w:pPr>
+            <w:r>
+              <w:rPr>
+                <w:rFonts w:ascii="HelveticaNeueLT Pro 55 Roman" w:hAnsi="HelveticaNeueLT Pro 55 Roman" w:cs="Arial"/>
+                <w:sz w:val="22"/>
+                <w:szCs w:val="20"/>
+              </w:rPr>
+              <w:t>Productio</w:t>
+            </w:r>
+            <w:r>
+              <w:rPr>
+                <w:rFonts w:ascii="HelveticaNeueLT Pro 55 Roman" w:hAnsi="HelveticaNeueLT Pro 55 Roman" w:cs="Arial"/>
+                <w:sz w:val="22"/>
+                <w:szCs w:val="20"/>
+              </w:rPr>
+              <w:t xml:space="preserve">n </w:t>
+            </w:r>
+            <w:r>
+              <w:rPr>
+                <w:rFonts w:ascii="HelveticaNeueLT Pro 55 Roman" w:hAnsi="HelveticaNeueLT Pro 55 Roman" w:cs="Arial"/>
+                <w:sz w:val="22"/>
+                <w:szCs w:val="20"/>
+              </w:rPr>
+              <w:t>AI systems using OpenAI and Anthropic APIs: streaming chat, real-time voice, cost-managed caching.</w:t>
             </w:r>
           </w:p>
           <w:p>
@@ -487,6 +587,38 @@
                 <w:sz w:val="22"/>
                 <w:szCs w:val="20"/>
               </w:rPr>
+              <w:t>60</w:t>
+            </w:r>
+            <w:r>
+              <w:rPr>
+                <w:rFonts w:ascii="HelveticaNeueLT Pro 55 Roman" w:hAnsi="HelveticaNeueLT Pro 55 Roman" w:cs="Arial"/>
+                <w:sz w:val="22"/>
+                <w:szCs w:val="20"/>
+              </w:rPr>
+              <w:t>0</w:t>
+            </w:r>
+            <w:r>
+              <w:rPr>
+                <w:rFonts w:ascii="HelveticaNeueLT Pro 55 Roman" w:hAnsi="HelveticaNeueLT Pro 55 Roman" w:cs="Arial"/>
+                <w:sz w:val="22"/>
+                <w:szCs w:val="20"/>
+              </w:rPr>
+              <w:t>+</w:t>
+            </w:r>
+            <w:r>
+              <w:rPr>
+                <w:rFonts w:ascii="HelveticaNeueLT Pro 55 Roman" w:hAnsi="HelveticaNeueLT Pro 55 Roman" w:cs="Arial"/>
+                <w:sz w:val="22"/>
+                <w:szCs w:val="20"/>
+              </w:rPr>
+              <w:t xml:space="preserve"> merged PRs across </w:t>
+            </w:r>
+            <w:r>
+              <w:rPr>
+                <w:rFonts w:ascii="HelveticaNeueLT Pro 55 Roman" w:hAnsi="HelveticaNeueLT Pro 55 Roman" w:cs="Arial"/>
+                <w:sz w:val="22"/>
+                <w:szCs w:val="20"/>
+              </w:rPr>
               <w:t>5</w:t>
             </w:r>
             <w:r>
@@ -495,31 +627,55 @@
                 <w:sz w:val="22"/>
                 <w:szCs w:val="20"/>
               </w:rPr>
-              <w:t>5</w:t>
-            </w:r>
-            <w:r>
-              <w:rPr>
-                <w:rFonts w:ascii="HelveticaNeueLT Pro 55 Roman" w:hAnsi="HelveticaNeueLT Pro 55 Roman" w:cs="Arial"/>
-                <w:sz w:val="22"/>
-                <w:szCs w:val="20"/>
-              </w:rPr>
-              <w:t>0</w:t>
-            </w:r>
-            <w:r>
-              <w:rPr>
-                <w:rFonts w:ascii="HelveticaNeueLT Pro 55 Roman" w:hAnsi="HelveticaNeueLT Pro 55 Roman" w:cs="Arial"/>
-                <w:sz w:val="22"/>
-                <w:szCs w:val="20"/>
-              </w:rPr>
-              <w:t>+</w:t>
-            </w:r>
-            <w:r>
-              <w:rPr>
-                <w:rFonts w:ascii="HelveticaNeueLT Pro 55 Roman" w:hAnsi="HelveticaNeueLT Pro 55 Roman" w:cs="Arial"/>
-                <w:sz w:val="22"/>
-                <w:szCs w:val="20"/>
-              </w:rPr>
-              <w:t xml:space="preserve"> merged PRs across </w:t>
+              <w:t xml:space="preserve"> </w:t>
+            </w:r>
+            <w:r>
+              <w:rPr>
+                <w:rFonts w:ascii="HelveticaNeueLT Pro 55 Roman" w:hAnsi="HelveticaNeueLT Pro 55 Roman" w:cs="Arial"/>
+                <w:sz w:val="22"/>
+                <w:szCs w:val="20"/>
+              </w:rPr>
+              <w:t xml:space="preserve">popular </w:t>
+            </w:r>
+            <w:r>
+              <w:rPr>
+                <w:rFonts w:ascii="HelveticaNeueLT Pro 55 Roman" w:hAnsi="HelveticaNeueLT Pro 55 Roman" w:cs="Arial"/>
+                <w:sz w:val="22"/>
+                <w:szCs w:val="20"/>
+              </w:rPr>
+              <w:t>AI tooling repos. #1 contributor</w:t>
+            </w:r>
+            <w:r>
+              <w:rPr>
+                <w:rFonts w:ascii="HelveticaNeueLT Pro 55 Roman" w:hAnsi="HelveticaNeueLT Pro 55 Roman" w:cs="Arial"/>
+                <w:sz w:val="22"/>
+                <w:szCs w:val="20"/>
+              </w:rPr>
+              <w:t xml:space="preserve"> </w:t>
+            </w:r>
+            <w:r>
+              <w:rPr>
+                <w:rFonts w:ascii="HelveticaNeueLT Pro 55 Roman" w:hAnsi="HelveticaNeueLT Pro 55 Roman" w:cs="Arial"/>
+                <w:sz w:val="22"/>
+                <w:szCs w:val="20"/>
+              </w:rPr>
+              <w:t>to</w:t>
+            </w:r>
+            <w:r>
+              <w:rPr>
+                <w:rFonts w:ascii="HelveticaNeueLT Pro 55 Roman" w:hAnsi="HelveticaNeueLT Pro 55 Roman" w:cs="Arial"/>
+                <w:sz w:val="22"/>
+                <w:szCs w:val="20"/>
+              </w:rPr>
+              <w:t xml:space="preserve"> </w:t>
+            </w:r>
+            <w:r>
+              <w:rPr>
+                <w:rFonts w:ascii="HelveticaNeueLT Pro 55 Roman" w:hAnsi="HelveticaNeueLT Pro 55 Roman" w:cs="Arial"/>
+                <w:sz w:val="22"/>
+                <w:szCs w:val="20"/>
+              </w:rPr>
+              <w:t>claude-mem (8</w:t>
             </w:r>
             <w:r>
               <w:rPr>
@@ -535,6 +691,118 @@
                 <w:sz w:val="22"/>
                 <w:szCs w:val="20"/>
               </w:rPr>
+              <w:t>k</w:t>
+            </w:r>
+            <w:r>
+              <w:rPr>
+                <w:rFonts w:ascii="HelveticaNeueLT Pro 55 Roman" w:hAnsi="HelveticaNeueLT Pro 55 Roman" w:cs="Arial"/>
+                <w:sz w:val="22"/>
+                <w:szCs w:val="20"/>
+              </w:rPr>
+              <w:t xml:space="preserve">), </w:t>
+            </w:r>
+            <w:r>
+              <w:rPr>
+                <w:rFonts w:ascii="HelveticaNeueLT Pro 55 Roman" w:hAnsi="HelveticaNeueLT Pro 55 Roman" w:cs="Arial"/>
+                <w:sz w:val="22"/>
+                <w:szCs w:val="20"/>
+              </w:rPr>
+              <w:t>hermes</w:t>
+            </w:r>
+            <w:r>
+              <w:rPr>
+                <w:rFonts w:ascii="HelveticaNeueLT Pro 55 Roman" w:hAnsi="HelveticaNeueLT Pro 55 Roman" w:cs="Arial"/>
+                <w:sz w:val="22"/>
+                <w:szCs w:val="20"/>
+              </w:rPr>
+              <w:t>-webui (16k)</w:t>
+            </w:r>
+            <w:r>
+              <w:rPr>
+                <w:rFonts w:ascii="HelveticaNeueLT Pro 55 Roman" w:hAnsi="HelveticaNeueLT Pro 55 Roman" w:cs="Arial"/>
+                <w:sz w:val="22"/>
+                <w:szCs w:val="20"/>
+              </w:rPr>
+              <w:t>,</w:t>
+            </w:r>
+            <w:r>
+              <w:rPr>
+                <w:rFonts w:ascii="HelveticaNeueLT Pro 55 Roman" w:hAnsi="HelveticaNeueLT Pro 55 Roman" w:cs="Arial"/>
+                <w:sz w:val="22"/>
+                <w:szCs w:val="20"/>
+              </w:rPr>
+              <w:t xml:space="preserve"> or</w:t>
+            </w:r>
+            <w:r>
+              <w:rPr>
+                <w:rFonts w:ascii="HelveticaNeueLT Pro 55 Roman" w:hAnsi="HelveticaNeueLT Pro 55 Roman" w:cs="Arial"/>
+                <w:sz w:val="22"/>
+                <w:szCs w:val="20"/>
+              </w:rPr>
+              <w:t>ca (</w:t>
+            </w:r>
+            <w:r>
+              <w:rPr>
+                <w:rFonts w:ascii="HelveticaNeueLT Pro 55 Roman" w:hAnsi="HelveticaNeueLT Pro 55 Roman" w:cs="Arial"/>
+                <w:sz w:val="22"/>
+                <w:szCs w:val="20"/>
+              </w:rPr>
+              <w:t>26</w:t>
+            </w:r>
+            <w:r>
+              <w:rPr>
+                <w:rFonts w:ascii="HelveticaNeueLT Pro 55 Roman" w:hAnsi="HelveticaNeueLT Pro 55 Roman" w:cs="Arial"/>
+                <w:sz w:val="22"/>
+                <w:szCs w:val="20"/>
+              </w:rPr>
+              <w:t>k)</w:t>
+            </w:r>
+            <w:r>
+              <w:rPr>
+                <w:rFonts w:ascii="HelveticaNeueLT Pro 55 Roman" w:hAnsi="HelveticaNeueLT Pro 55 Roman" w:cs="Arial"/>
+                <w:sz w:val="22"/>
+                <w:szCs w:val="20"/>
+              </w:rPr>
+              <w:t xml:space="preserve">, </w:t>
+            </w:r>
+            <w:r>
+              <w:rPr>
+                <w:rFonts w:ascii="HelveticaNeueLT Pro 55 Roman" w:hAnsi="HelveticaNeueLT Pro 55 Roman" w:cs="Arial"/>
+                <w:sz w:val="22"/>
+                <w:szCs w:val="20"/>
+              </w:rPr>
+              <w:t>agentsview (4</w:t>
+            </w:r>
+            <w:r>
+              <w:rPr>
+                <w:rFonts w:ascii="HelveticaNeueLT Pro 55 Roman" w:hAnsi="HelveticaNeueLT Pro 55 Roman" w:cs="Arial"/>
+                <w:sz w:val="22"/>
+                <w:szCs w:val="20"/>
+              </w:rPr>
+              <w:t>k)</w:t>
+            </w:r>
+            <w:r>
+              <w:rPr>
+                <w:rFonts w:ascii="HelveticaNeueLT Pro 55 Roman" w:hAnsi="HelveticaNeueLT Pro 55 Roman" w:cs="Arial"/>
+                <w:sz w:val="22"/>
+                <w:szCs w:val="20"/>
+              </w:rPr>
+              <w:t xml:space="preserve">; #2 </w:t>
+            </w:r>
+            <w:r>
+              <w:rPr>
+                <w:rFonts w:ascii="HelveticaNeueLT Pro 55 Roman" w:hAnsi="HelveticaNeueLT Pro 55 Roman" w:cs="Arial"/>
+                <w:sz w:val="22"/>
+                <w:szCs w:val="20"/>
+              </w:rPr>
+              <w:t>on</w:t>
+            </w:r>
+            <w:r>
+              <w:rPr>
+                <w:rFonts w:ascii="HelveticaNeueLT Pro 55 Roman" w:hAnsi="HelveticaNeueLT Pro 55 Roman" w:cs="Arial"/>
+                <w:sz w:val="22"/>
+                <w:szCs w:val="20"/>
+              </w:rPr>
               <w:t xml:space="preserve"> </w:t>
             </w:r>
             <w:r>
@@ -543,79 +811,15 @@
                 <w:sz w:val="22"/>
                 <w:szCs w:val="20"/>
               </w:rPr>
-              <w:t xml:space="preserve">popular </w:t>
-            </w:r>
-            <w:r>
-              <w:rPr>
-                <w:rFonts w:ascii="HelveticaNeueLT Pro 55 Roman" w:hAnsi="HelveticaNeueLT Pro 55 Roman" w:cs="Arial"/>
-                <w:sz w:val="22"/>
-                <w:szCs w:val="20"/>
-              </w:rPr>
-              <w:t>AI tooling repos. #1 contributor</w:t>
-            </w:r>
-            <w:r>
-              <w:rPr>
-                <w:rFonts w:ascii="HelveticaNeueLT Pro 55 Roman" w:hAnsi="HelveticaNeueLT Pro 55 Roman" w:cs="Arial"/>
-                <w:sz w:val="22"/>
-                <w:szCs w:val="20"/>
-              </w:rPr>
-              <w:t xml:space="preserve"> on</w:t>
-            </w:r>
-            <w:r>
-              <w:rPr>
-                <w:rFonts w:ascii="HelveticaNeueLT Pro 55 Roman" w:hAnsi="HelveticaNeueLT Pro 55 Roman" w:cs="Arial"/>
-                <w:sz w:val="22"/>
-                <w:szCs w:val="20"/>
-              </w:rPr>
-              <w:t xml:space="preserve"> headro</w:t>
-            </w:r>
-            <w:r>
-              <w:rPr>
-                <w:rFonts w:ascii="HelveticaNeueLT Pro 55 Roman" w:hAnsi="HelveticaNeueLT Pro 55 Roman" w:cs="Arial"/>
-                <w:sz w:val="22"/>
-                <w:szCs w:val="20"/>
-              </w:rPr>
-              <w:t>om (58k),</w:t>
-            </w:r>
-            <w:r>
-              <w:rPr>
-                <w:rFonts w:ascii="HelveticaNeueLT Pro 55 Roman" w:hAnsi="HelveticaNeueLT Pro 55 Roman" w:cs="Arial"/>
-                <w:sz w:val="22"/>
-                <w:szCs w:val="20"/>
-              </w:rPr>
-              <w:br/>
-            </w:r>
-            <w:r>
-              <w:rPr>
-                <w:rFonts w:ascii="HelveticaNeueLT Pro 55 Roman" w:hAnsi="HelveticaNeueLT Pro 55 Roman" w:cs="Arial"/>
-                <w:sz w:val="22"/>
-                <w:szCs w:val="20"/>
-              </w:rPr>
-              <w:t>hermes</w:t>
-            </w:r>
-            <w:r>
-              <w:rPr>
-                <w:rFonts w:ascii="HelveticaNeueLT Pro 55 Roman" w:hAnsi="HelveticaNeueLT Pro 55 Roman" w:cs="Arial"/>
-                <w:sz w:val="22"/>
-                <w:szCs w:val="20"/>
-              </w:rPr>
-              <w:t>-webui (16k), orca (14</w:t>
-            </w:r>
-            <w:r>
-              <w:rPr>
-                <w:rFonts w:ascii="HelveticaNeueLT Pro 55 Roman" w:hAnsi="HelveticaNeueLT Pro 55 Roman" w:cs="Arial"/>
-                <w:sz w:val="22"/>
-                <w:szCs w:val="20"/>
-              </w:rPr>
-              <w:t>k</w:t>
-            </w:r>
-            <w:r>
-              <w:rPr>
-                <w:rFonts w:ascii="HelveticaNeueLT Pro 55 Roman" w:hAnsi="HelveticaNeueLT Pro 55 Roman" w:cs="Arial"/>
-                <w:sz w:val="22"/>
-                <w:szCs w:val="20"/>
-              </w:rPr>
-              <w:t>), and agentsview (4</w:t>
+              <w:t>headroom (</w:t>
+            </w:r>
+            <w:r>
+              <w:rPr>
+                <w:rFonts w:ascii="HelveticaNeueLT Pro 55 Roman" w:hAnsi="HelveticaNeueLT Pro 55 Roman" w:cs="Arial"/>
+                <w:sz w:val="22"/>
+                <w:szCs w:val="20"/>
+              </w:rPr>
+              <w:t>61</w:t>
             </w:r>
             <w:r>
               <w:rPr>
@@ -624,22 +828,6 @@
                 <w:szCs w:val="20"/>
               </w:rPr>
               <w:t>k)</w:t>
-            </w:r>
-            <w:r>
-              <w:rPr>
-                <w:rFonts w:ascii="HelveticaNeueLT Pro 55 Roman" w:hAnsi="HelveticaNeueLT Pro 55 Roman" w:cs="Arial"/>
-                <w:sz w:val="22"/>
-                <w:szCs w:val="20"/>
-              </w:rPr>
-              <w:t>; #2 on claude-mem (86k</w:t>
-            </w:r>
-            <w:r>
-              <w:rPr>
-                <w:rFonts w:ascii="HelveticaNeueLT Pro 55 Roman" w:hAnsi="HelveticaNeueLT Pro 55 Roman" w:cs="Arial"/>
-                <w:sz w:val="22"/>
-                <w:szCs w:val="20"/>
-              </w:rPr>
-              <w:t>)</w:t>
             </w:r>
             <w:r>
               <w:rPr>
@@ -686,28 +874,6 @@
                 <w:szCs w:val="20"/>
               </w:rPr>
               <w:t>Shopify).</w:t>
-            </w:r>
-          </w:p>
-          <w:p>
-            <w:pPr>
-              <w:numPr>
-                <w:ilvl w:val="0"/>
-                <w:numId w:val="1"/>
-              </w:numPr>
-              <w:spacing w:line="264" w:lineRule="auto"/>
-              <w:rPr>
-                <w:rFonts w:ascii="HelveticaNeueLT Pro 55 Roman" w:hAnsi="HelveticaNeueLT Pro 55 Roman" w:cs="Arial"/>
-                <w:sz w:val="22"/>
-                <w:szCs w:val="20"/>
-              </w:rPr>
-            </w:pPr>
-            <w:r>
-              <w:rPr>
-                <w:rFonts w:ascii="HelveticaNeueLT Pro 55 Roman" w:hAnsi="HelveticaNeueLT Pro 55 Roman" w:cs="Arial"/>
-                <w:sz w:val="22"/>
-                <w:szCs w:val="20"/>
-              </w:rPr>
-              <w:t>WordPress Core contributor and architect of the WordPress.com VIP Partnership at NBC Sports.</w:t>
             </w:r>
           </w:p>
         </w:tc>
@@ -812,29 +978,17 @@
               </w:rPr>
               <w:t>(</w:t>
             </w:r>
-            <w:proofErr w:type="spellStart"/>
-            <w:r>
-              <w:fldChar w:fldCharType="begin"/>
-            </w:r>
-            <w:r>
-              <w:instrText>HYPERLINK "https://basedin.nyc/"</w:instrText>
-            </w:r>
-            <w:r>
-              <w:fldChar w:fldCharType="separate"/>
-            </w:r>
-            <w:r>
-              <w:rPr>
-                <w:rStyle w:val="Hyperlink"/>
-                <w:rFonts w:ascii="HelveticaNeueLT Pro 55 Roman" w:hAnsi="HelveticaNeueLT Pro 55 Roman" w:cs="Arial"/>
-                <w:color w:val="auto"/>
-                <w:u w:val="none"/>
-              </w:rPr>
-              <w:t>basedin.nyc</w:t>
-            </w:r>
-            <w:proofErr w:type="spellEnd"/>
-            <w:r>
-              <w:fldChar w:fldCharType="end"/>
-            </w:r>
+            <w:hyperlink r:id="rId13" w:history="1">
+              <w:r>
+                <w:rPr>
+                  <w:rStyle w:val="Hyperlink"/>
+                  <w:rFonts w:ascii="HelveticaNeueLT Pro 55 Roman" w:hAnsi="HelveticaNeueLT Pro 55 Roman" w:cs="Arial"/>
+                  <w:color w:val="auto"/>
+                  <w:u w:val="none"/>
+                </w:rPr>
+                <w:t>basedin.nyc</w:t>
+              </w:r>
+            </w:hyperlink>
             <w:r>
               <w:rPr>
                 <w:rFonts w:ascii="HelveticaNeueLT Pro 55 Roman" w:hAnsi="HelveticaNeueLT Pro 55 Roman" w:cs="Arial"/>
@@ -927,13 +1081,55 @@
           <w:szCs w:val="20"/>
         </w:rPr>
       </w:pPr>
+      <w:proofErr w:type="gramStart"/>
       <w:r>
         <w:rPr>
           <w:rFonts w:ascii="HelveticaNeueLT Pro 55 Roman" w:hAnsi="HelveticaNeueLT Pro 55 Roman" w:cs="Arial"/>
           <w:sz w:val="22"/>
           <w:szCs w:val="20"/>
         </w:rPr>
-        <w:t>Independent consulting on full-stack development, AI integration, and e-commerce.</w:t>
+        <w:t>Open source</w:t>
+      </w:r>
+      <w:proofErr w:type="gramEnd"/>
+      <w:r>
+        <w:rPr>
+          <w:rFonts w:ascii="HelveticaNeueLT Pro 55 Roman" w:hAnsi="HelveticaNeueLT Pro 55 Roman" w:cs="Arial"/>
+          <w:sz w:val="22"/>
+          <w:szCs w:val="20"/>
+        </w:rPr>
+        <w:t xml:space="preserve"> work and f</w:t>
+      </w:r>
+      <w:r>
+        <w:rPr>
+          <w:rFonts w:ascii="HelveticaNeueLT Pro 55 Roman" w:hAnsi="HelveticaNeueLT Pro 55 Roman" w:cs="Arial"/>
+          <w:sz w:val="22"/>
+          <w:szCs w:val="20"/>
+        </w:rPr>
+        <w:t>ull-stack Next.js/Node.js</w:t>
+      </w:r>
+      <w:r>
+        <w:rPr>
+          <w:rFonts w:ascii="HelveticaNeueLT Pro 55 Roman" w:hAnsi="HelveticaNeueLT Pro 55 Roman" w:cs="Arial"/>
+          <w:sz w:val="22"/>
+          <w:szCs w:val="20"/>
+        </w:rPr>
+        <w:t xml:space="preserve"> consultin</w:t>
+      </w:r>
+      <w:r>
+        <w:rPr>
+          <w:rFonts w:ascii="HelveticaNeueLT Pro 55 Roman" w:hAnsi="HelveticaNeueLT Pro 55 Roman" w:cs="Arial"/>
+          <w:sz w:val="22"/>
+          <w:szCs w:val="20"/>
+        </w:rPr>
+        <w:t>g with A</w:t>
+      </w:r>
+      <w:r>
+        <w:rPr>
+          <w:rFonts w:ascii="HelveticaNeueLT Pro 55 Roman" w:hAnsi="HelveticaNeueLT Pro 55 Roman" w:cs="Arial"/>
+          <w:sz w:val="22"/>
+          <w:szCs w:val="20"/>
+        </w:rPr>
+        <w:t>I integration and e-commerce.</w:t>
       </w:r>
     </w:p>
     <w:p>
@@ -1029,7 +1225,6 @@
           <w:sz w:val="18"/>
         </w:rPr>
       </w:pPr>
-      <w:proofErr w:type="gramStart"/>
       <w:r>
         <w:rPr>
           <w:rFonts w:ascii="HelveticaNeueLT Pro 55 Roman" w:hAnsi="HelveticaNeueLT Pro 55 Roman"/>
@@ -1038,37 +1233,213 @@
         </w:rPr>
         <w:t>Open Source</w:t>
       </w:r>
-      <w:proofErr w:type="gramEnd"/>
-      <w:r>
-        <w:rPr>
-          <w:rFonts w:ascii="HelveticaNeueLT Pro 55 Roman" w:hAnsi="HelveticaNeueLT Pro 55 Roman"/>
-          <w:b/>
-          <w:sz w:val="22"/>
+      <w:r>
+        <w:rPr>
+          <w:rFonts w:ascii="HelveticaNeueLT Pro 55 Roman" w:hAnsi="HelveticaNeueLT Pro 55 Roman"/>
+          <w:sz w:val="18"/>
+        </w:rPr>
+        <w:t xml:space="preserve">  (2026)</w:t>
+      </w:r>
+      <w:r>
+        <w:rPr>
+          <w:rFonts w:ascii="HelveticaNeueLT Pro 55 Roman" w:hAnsi="HelveticaNeueLT Pro 55 Roman"/>
+          <w:sz w:val="18"/>
+        </w:rPr>
+        <w:t xml:space="preserve">  ·  </w:t>
+      </w:r>
+      <w:r>
+        <w:rPr>
+          <w:rFonts w:ascii="HelveticaNeueLT Pro 55 Roman" w:hAnsi="HelveticaNeueLT Pro 55 Roman"/>
+          <w:sz w:val="18"/>
+        </w:rPr>
+        <w:t>60</w:t>
+      </w:r>
+      <w:r>
+        <w:rPr>
+          <w:rFonts w:ascii="HelveticaNeueLT Pro 55 Roman" w:hAnsi="HelveticaNeueLT Pro 55 Roman"/>
+          <w:bCs/>
+          <w:sz w:val="18"/>
+        </w:rPr>
+        <w:t>0+ PRs shipped to production at 97% acceptance</w:t>
+      </w:r>
+      <w:r>
+        <w:rPr>
+          <w:rFonts w:ascii="HelveticaNeueLT Pro 55 Roman" w:hAnsi="HelveticaNeueLT Pro 55 Roman"/>
+          <w:bCs/>
+          <w:sz w:val="18"/>
+        </w:rPr>
+        <w:t xml:space="preserve">: </w:t>
+      </w:r>
+      <w:hyperlink r:id="rId14" w:history="1">
+        <w:r>
+          <w:rPr>
+            <w:rStyle w:val="Hyperlink"/>
+            <w:rFonts w:ascii="HelveticaNeueLT Pro 55 Roman" w:hAnsi="HelveticaNeueLT Pro 55 Roman"/>
+            <w:bCs/>
+            <w:color w:val="auto"/>
+            <w:sz w:val="18"/>
+          </w:rPr>
+          <w:t>basedin.nyc/pr-stats</w:t>
+        </w:r>
+      </w:hyperlink>
+    </w:p>
+    <w:p>
+      <w:pPr>
+        <w:numPr>
+          <w:ilvl w:val="0"/>
+          <w:numId w:val="6"/>
+        </w:numPr>
+        <w:spacing w:before="60" w:line="276" w:lineRule="auto"/>
+        <w:rPr>
+          <w:rFonts w:ascii="HelveticaNeueLT Pro 55 Roman" w:hAnsi="HelveticaNeueLT Pro 55 Roman" w:cs="Arial"/>
+          <w:sz w:val="22"/>
+          <w:szCs w:val="20"/>
+        </w:rPr>
+      </w:pPr>
+      <w:hyperlink r:id="rId15" w:history="1">
+        <w:r>
+          <w:rPr>
+            <w:rStyle w:val="Hyperlink"/>
+            <w:rFonts w:ascii="HelveticaNeueLT Pro 55 Roman" w:hAnsi="HelveticaNeueLT Pro 55 Roman"/>
+            <w:b/>
+            <w:color w:val="auto"/>
+            <w:sz w:val="22"/>
+            <w:u w:val="none"/>
+          </w:rPr>
+          <w:t>thedotmack/claude-mem</w:t>
+        </w:r>
+      </w:hyperlink>
+      <w:r>
+        <w:rPr>
+          <w:rFonts w:ascii="HelveticaNeueLT Pro 55 Roman" w:hAnsi="HelveticaNeueLT Pro 55 Roman"/>
+          <w:sz w:val="18"/>
+        </w:rPr>
+        <w:t xml:space="preserve"> (8</w:t>
+      </w:r>
+      <w:r>
+        <w:rPr>
+          <w:rFonts w:ascii="HelveticaNeueLT Pro 55 Roman" w:hAnsi="HelveticaNeueLT Pro 55 Roman"/>
+          <w:sz w:val="18"/>
+        </w:rPr>
+        <w:t>8</w:t>
+      </w:r>
+      <w:r>
+        <w:rPr>
+          <w:rFonts w:ascii="HelveticaNeueLT Pro 55 Roman" w:hAnsi="HelveticaNeueLT Pro 55 Roman"/>
+          <w:sz w:val="18"/>
+        </w:rPr>
+        <w:t xml:space="preserve">k stars)  ·  </w:t>
+      </w:r>
+      <w:r>
+        <w:rPr>
+          <w:rFonts w:ascii="HelveticaNeueLT Pro 55 Roman" w:hAnsi="HelveticaNeueLT Pro 55 Roman"/>
+          <w:bCs/>
+          <w:sz w:val="18"/>
+        </w:rPr>
+        <w:t>TypeScript, JavaScript, Shell, HTML</w:t>
+      </w:r>
+      <w:r>
+        <w:rPr>
+          <w:rFonts w:ascii="HelveticaNeueLT Pro 55 Roman" w:hAnsi="HelveticaNeueLT Pro 55 Roman"/>
+          <w:sz w:val="18"/>
+        </w:rPr>
+        <w:t xml:space="preserve">  ·  </w:t>
+      </w:r>
+      <w:r>
+        <w:rPr>
+          <w:rFonts w:ascii="HelveticaNeueLT Pro 55 Roman" w:hAnsi="HelveticaNeueLT Pro 55 Roman"/>
+          <w:sz w:val="22"/>
+          <w:szCs w:val="22"/>
+        </w:rPr>
+        <w:t>Memory compression for Claude Code</w:t>
+      </w:r>
+      <w:r>
+        <w:rPr>
+          <w:rFonts w:ascii="HelveticaNeueLT Pro 55 Roman" w:hAnsi="HelveticaNeueLT Pro 55 Roman"/>
+          <w:sz w:val="22"/>
+          <w:szCs w:val="22"/>
+        </w:rPr>
+        <w:t xml:space="preserve">. </w:t>
+      </w:r>
+      <w:r>
+        <w:rPr>
+          <w:rFonts w:ascii="HelveticaNeueLT Pro 55 Roman" w:hAnsi="HelveticaNeueLT Pro 55 Roman" w:cs="Arial"/>
+          <w:sz w:val="22"/>
+          <w:szCs w:val="20"/>
+        </w:rPr>
+        <w:t>#</w:t>
+      </w:r>
+      <w:r>
+        <w:rPr>
+          <w:rFonts w:ascii="HelveticaNeueLT Pro 55 Roman" w:hAnsi="HelveticaNeueLT Pro 55 Roman" w:cs="Arial"/>
+          <w:sz w:val="22"/>
+          <w:szCs w:val="20"/>
+        </w:rPr>
+        <w:t>1</w:t>
+      </w:r>
+      <w:r>
+        <w:rPr>
+          <w:rFonts w:ascii="HelveticaNeueLT Pro 55 Roman" w:hAnsi="HelveticaNeueLT Pro 55 Roman" w:cs="Arial"/>
+          <w:sz w:val="22"/>
+          <w:szCs w:val="20"/>
+        </w:rPr>
+        <w:t xml:space="preserve"> contributor: s</w:t>
+      </w:r>
+      <w:r>
+        <w:rPr>
+          <w:rFonts w:ascii="HelveticaNeueLT Pro 55 Roman" w:hAnsi="HelveticaNeueLT Pro 55 Roman" w:cs="Arial"/>
+          <w:sz w:val="22"/>
+          <w:szCs w:val="20"/>
+        </w:rPr>
+        <w:t xml:space="preserve">pawn storm </w:t>
+      </w:r>
+      <w:r>
+        <w:rPr>
+          <w:rFonts w:ascii="HelveticaNeueLT Pro 55 Roman" w:hAnsi="HelveticaNeueLT Pro 55 Roman" w:cs="Arial"/>
+          <w:sz w:val="22"/>
+          <w:szCs w:val="20"/>
+        </w:rPr>
+        <w:t>defense,</w:t>
+      </w:r>
+      <w:r>
+        <w:rPr>
+          <w:rFonts w:ascii="HelveticaNeueLT Pro 55 Roman" w:hAnsi="HelveticaNeueLT Pro 55 Roman" w:cs="Arial"/>
+          <w:sz w:val="22"/>
+          <w:szCs w:val="20"/>
         </w:rPr>
         <w:t xml:space="preserve"> </w:t>
       </w:r>
       <w:r>
         <w:rPr>
-          <w:rFonts w:ascii="HelveticaNeueLT Pro 55 Roman" w:hAnsi="HelveticaNeueLT Pro 55 Roman"/>
-          <w:b/>
-          <w:sz w:val="22"/>
-        </w:rPr>
-        <w:t>Contribution</w:t>
-      </w:r>
-      <w:r>
-        <w:rPr>
-          <w:rFonts w:ascii="HelveticaNeueLT Pro 55 Roman" w:hAnsi="HelveticaNeueLT Pro 55 Roman"/>
-          <w:b/>
-          <w:sz w:val="22"/>
-        </w:rPr>
-        <w:t xml:space="preserve"> Pipeline</w:t>
-      </w:r>
-      <w:r>
-        <w:rPr>
-          <w:rFonts w:ascii="HelveticaNeueLT Pro 55 Roman" w:hAnsi="HelveticaNeueLT Pro 55 Roman"/>
-          <w:sz w:val="18"/>
-        </w:rPr>
-        <w:t xml:space="preserve">  (2026)</w:t>
+          <w:rFonts w:ascii="HelveticaNeueLT Pro 55 Roman" w:hAnsi="HelveticaNeueLT Pro 55 Roman" w:cs="Arial"/>
+          <w:sz w:val="22"/>
+          <w:szCs w:val="20"/>
+        </w:rPr>
+        <w:t>h</w:t>
+      </w:r>
+      <w:r>
+        <w:rPr>
+          <w:rFonts w:ascii="HelveticaNeueLT Pro 55 Roman" w:hAnsi="HelveticaNeueLT Pro 55 Roman" w:cs="Arial"/>
+          <w:sz w:val="22"/>
+          <w:szCs w:val="20"/>
+        </w:rPr>
+        <w:t xml:space="preserve">ook/worker </w:t>
+      </w:r>
+      <w:r>
+        <w:rPr>
+          <w:rFonts w:ascii="HelveticaNeueLT Pro 55 Roman" w:hAnsi="HelveticaNeueLT Pro 55 Roman" w:cs="Arial"/>
+          <w:sz w:val="22"/>
+          <w:szCs w:val="20"/>
+        </w:rPr>
+        <w:t xml:space="preserve">lifecycle </w:t>
+      </w:r>
+      <w:r>
+        <w:rPr>
+          <w:rFonts w:ascii="HelveticaNeueLT Pro 55 Roman" w:hAnsi="HelveticaNeueLT Pro 55 Roman" w:cs="Arial"/>
+          <w:sz w:val="22"/>
+          <w:szCs w:val="20"/>
+        </w:rPr>
+        <w:t>hardening.</w:t>
       </w:r>
     </w:p>
     <w:p>
@@ -1089,29 +1460,56 @@
           <w:szCs w:val="20"/>
         </w:rPr>
       </w:pPr>
-      <w:r>
-        <w:rPr>
-          <w:rFonts w:ascii="HelveticaNeueLT Pro 55 Roman" w:hAnsi="HelveticaNeueLT Pro 55 Roman" w:cs="Arial"/>
-          <w:sz w:val="22"/>
-          <w:szCs w:val="20"/>
-        </w:rPr>
-        <w:t xml:space="preserve">Built </w:t>
-      </w:r>
-      <w:r>
-        <w:rPr>
-          <w:rFonts w:ascii="HelveticaNeueLT Pro 55 Roman" w:hAnsi="HelveticaNeueLT Pro 55 Roman" w:cs="Arial"/>
-          <w:sz w:val="22"/>
-          <w:szCs w:val="20"/>
-        </w:rPr>
-        <w:t>an autonomous multi-agent pipeline for upstream open-source contributions. Runs continuously. P</w:t>
-      </w:r>
-      <w:r>
-        <w:rPr>
-          <w:rFonts w:ascii="HelveticaNeueLT Pro 55 Roman" w:hAnsi="HelveticaNeueLT Pro 55 Roman" w:cs="Arial"/>
-          <w:sz w:val="22"/>
-          <w:szCs w:val="20"/>
-        </w:rPr>
-        <w:t>er-repo architectural knowledge graphs, style norms, and search dimensions. Cross-provider spec competition and synthesis with proof matrices and structural validation.</w:t>
+      <w:hyperlink r:id="rId16" w:history="1">
+        <w:r>
+          <w:rPr>
+            <w:rStyle w:val="Hyperlink"/>
+            <w:rFonts w:ascii="HelveticaNeueLT Pro 55 Roman" w:hAnsi="HelveticaNeueLT Pro 55 Roman"/>
+            <w:b/>
+            <w:color w:val="auto"/>
+            <w:sz w:val="22"/>
+            <w:u w:val="none"/>
+          </w:rPr>
+          <w:t>nesquena/hermes-webui</w:t>
+        </w:r>
+      </w:hyperlink>
+      <w:r>
+        <w:rPr>
+          <w:rFonts w:ascii="HelveticaNeueLT Pro 55 Roman" w:hAnsi="HelveticaNeueLT Pro 55 Roman"/>
+          <w:sz w:val="18"/>
+        </w:rPr>
+        <w:t xml:space="preserve">  (16k stars)  ·  </w:t>
+      </w:r>
+      <w:r>
+        <w:rPr>
+          <w:rFonts w:ascii="HelveticaNeueLT Pro 55 Roman" w:hAnsi="HelveticaNeueLT Pro 55 Roman"/>
+          <w:bCs/>
+          <w:sz w:val="18"/>
+        </w:rPr>
+        <w:t>Python, JavaScript, CSS, HTML, Shell</w:t>
+      </w:r>
+      <w:r>
+        <w:rPr>
+          <w:rFonts w:ascii="HelveticaNeueLT Pro 55 Roman" w:hAnsi="HelveticaNeueLT Pro 55 Roman"/>
+          <w:sz w:val="18"/>
+        </w:rPr>
+        <w:t xml:space="preserve">  ·  </w:t>
+      </w:r>
+      <w:r>
+        <w:rPr>
+          <w:rFonts w:ascii="HelveticaNeueLT Pro 55 Roman" w:hAnsi="HelveticaNeueLT Pro 55 Roman"/>
+          <w:sz w:val="22"/>
+          <w:szCs w:val="22"/>
+        </w:rPr>
+        <w:t>Web UI and Bridge API for Hermes Agent. Highest all-time contributor with 300+ PRs across the core product surface</w:t>
+      </w:r>
+      <w:r>
+        <w:rPr>
+          <w:rFonts w:ascii="HelveticaNeueLT Pro 55 Roman" w:hAnsi="HelveticaNeueLT Pro 55 Roman"/>
+          <w:sz w:val="22"/>
+          <w:szCs w:val="22"/>
+        </w:rPr>
+        <w:t>: cost analytics, saved prompts, gateway credential routing, scroll virtualization, session lifecycle.</w:t>
       </w:r>
     </w:p>
     <w:p>
@@ -1132,62 +1530,72 @@
           <w:szCs w:val="20"/>
         </w:rPr>
       </w:pPr>
+      <w:hyperlink r:id="rId17" w:history="1">
+        <w:r>
+          <w:rPr>
+            <w:rStyle w:val="Hyperlink"/>
+            <w:rFonts w:ascii="HelveticaNeueLT Pro 55 Roman" w:hAnsi="HelveticaNeueLT Pro 55 Roman"/>
+            <w:b/>
+            <w:color w:val="auto"/>
+            <w:sz w:val="22"/>
+            <w:u w:val="none"/>
+          </w:rPr>
+          <w:t>kenn-io/agentsview</w:t>
+        </w:r>
+      </w:hyperlink>
+      <w:r>
+        <w:rPr>
+          <w:rFonts w:ascii="HelveticaNeueLT Pro 55 Roman" w:hAnsi="HelveticaNeueLT Pro 55 Roman"/>
+          <w:sz w:val="18"/>
+        </w:rPr>
+        <w:t xml:space="preserve">  (4k stars)  ·  </w:t>
+      </w:r>
+      <w:r>
+        <w:rPr>
+          <w:rFonts w:ascii="HelveticaNeueLT Pro 55 Roman" w:hAnsi="HelveticaNeueLT Pro 55 Roman"/>
+          <w:bCs/>
+          <w:sz w:val="18"/>
+        </w:rPr>
+        <w:t>Go, TypeScript, Svelte, Rust, Shell</w:t>
+      </w:r>
+      <w:r>
+        <w:rPr>
+          <w:rFonts w:ascii="HelveticaNeueLT Pro 55 Roman" w:hAnsi="HelveticaNeueLT Pro 55 Roman"/>
+          <w:sz w:val="18"/>
+        </w:rPr>
+        <w:t xml:space="preserve">  ·  </w:t>
+      </w:r>
+      <w:r>
+        <w:rPr>
+          <w:rFonts w:ascii="HelveticaNeueLT Pro 55 Roman" w:hAnsi="HelveticaNeueLT Pro 55 Roman"/>
+          <w:sz w:val="22"/>
+          <w:szCs w:val="22"/>
+        </w:rPr>
+        <w:t xml:space="preserve">Local-first analytics for </w:t>
+      </w:r>
+      <w:r>
+        <w:rPr>
+          <w:rFonts w:ascii="HelveticaNeueLT Pro 55 Roman" w:hAnsi="HelveticaNeueLT Pro 55 Roman"/>
+          <w:sz w:val="22"/>
+          <w:szCs w:val="22"/>
+        </w:rPr>
+        <w:t xml:space="preserve">AI </w:t>
+      </w:r>
+      <w:r>
+        <w:rPr>
+          <w:rFonts w:ascii="HelveticaNeueLT Pro 55 Roman" w:hAnsi="HelveticaNeueLT Pro 55 Roman"/>
+          <w:sz w:val="22"/>
+          <w:szCs w:val="22"/>
+        </w:rPr>
+        <w:t xml:space="preserve">agents. </w:t>
+      </w:r>
       <w:r>
         <w:rPr>
           <w:rFonts w:ascii="HelveticaNeueLT Pro 55 Roman" w:hAnsi="HelveticaNeueLT Pro 55 Roman" w:cs="Arial"/>
           <w:sz w:val="22"/>
           <w:szCs w:val="20"/>
         </w:rPr>
-        <w:t>Mandatory test coverage: behavioral proofs, regression contracts, test surface enforcement. Multi-pass adversarial review with call-site tracing, import verification, and stale assertion detection. Deterministic publish gates with post-push convergence on CI and reviewer feedback.</w:t>
-      </w:r>
-    </w:p>
-    <w:p>
-      <w:pPr>
-        <w:spacing w:line="264" w:lineRule="auto"/>
-        <w:rPr>
-          <w:rFonts w:ascii="HelveticaNeueLT Pro 55 Roman" w:hAnsi="HelveticaNeueLT Pro 55 Roman" w:cs="Arial"/>
-          <w:sz w:val="18"/>
-          <w:szCs w:val="18"/>
-        </w:rPr>
-      </w:pPr>
-    </w:p>
-    <w:p>
-      <w:pPr>
-        <w:spacing w:after="40" w:line="264" w:lineRule="auto"/>
-        <w:ind w:left="288"/>
-        <w:rPr>
-          <w:rFonts w:ascii="HelveticaNeueLT Pro 55 Roman" w:hAnsi="HelveticaNeueLT Pro 55 Roman"/>
-          <w:sz w:val="18"/>
-        </w:rPr>
-      </w:pPr>
-      <w:r>
-        <w:rPr>
-          <w:rFonts w:ascii="HelveticaNeueLT Pro 55 Roman" w:hAnsi="HelveticaNeueLT Pro 55 Roman"/>
-          <w:b/>
-          <w:sz w:val="22"/>
-        </w:rPr>
-        <w:t>Liberty Pest Control, AI-Powered Business Tools</w:t>
-      </w:r>
-      <w:r>
-        <w:rPr>
-          <w:rFonts w:ascii="HelveticaNeueLT Pro 55 Roman" w:hAnsi="HelveticaNeueLT Pro 55 Roman"/>
-          <w:sz w:val="18"/>
-        </w:rPr>
-        <w:t xml:space="preserve">  (2024</w:t>
-      </w:r>
-      <w:r>
-        <w:rPr>
-          <w:rFonts w:ascii="HelveticaNeueLT Pro 55 Roman" w:hAnsi="HelveticaNeueLT Pro 55 Roman"/>
-          <w:sz w:val="18"/>
-        </w:rPr>
-        <w:t>-2025</w:t>
-      </w:r>
-      <w:r>
-        <w:rPr>
-          <w:rFonts w:ascii="HelveticaNeueLT Pro 55 Roman" w:hAnsi="HelveticaNeueLT Pro 55 Roman"/>
-          <w:sz w:val="18"/>
-        </w:rPr>
-        <w:t>)</w:t>
+        <w:t>Top third-party contributor: Postgres sync safety, orphan session recovery, parser support.</w:t>
       </w:r>
     </w:p>
     <w:p>
@@ -1204,40 +1612,66 @@
         <w:ind w:left="540" w:hanging="252"/>
         <w:rPr>
           <w:rFonts w:ascii="HelveticaNeueLT Pro 55 Roman" w:hAnsi="HelveticaNeueLT Pro 55 Roman" w:cs="Arial"/>
-          <w:sz w:val="22"/>
-          <w:szCs w:val="20"/>
-        </w:rPr>
-      </w:pPr>
-      <w:r>
-        <w:rPr>
-          <w:rFonts w:ascii="HelveticaNeueLT Pro 55 Roman" w:hAnsi="HelveticaNeueLT Pro 55 Roman"/>
-          <w:sz w:val="22"/>
-        </w:rPr>
-        <w:t>B</w:t>
-      </w:r>
-      <w:r>
-        <w:rPr>
-          <w:rFonts w:ascii="HelveticaNeueLT Pro 55 Roman" w:hAnsi="HelveticaNeueLT Pro 55 Roman" w:cs="Arial"/>
-          <w:sz w:val="22"/>
-          <w:szCs w:val="20"/>
-        </w:rPr>
-        <w:t>uilt an internal platform that reads technician field notes from PestPac (MS SQL Server), processes them through GPT-4</w:t>
-      </w:r>
-      <w:r>
-        <w:rPr>
-          <w:rFonts w:ascii="HelveticaNeueLT Pro 55 Roman" w:hAnsi="HelveticaNeueLT Pro 55 Roman" w:cs="Arial"/>
-          <w:sz w:val="22"/>
-          <w:szCs w:val="20"/>
-        </w:rPr>
-        <w:t>o</w:t>
-      </w:r>
-      <w:r>
-        <w:rPr>
-          <w:rFonts w:ascii="HelveticaNeueLT Pro 55 Roman" w:hAnsi="HelveticaNeueLT Pro 55 Roman" w:cs="Arial"/>
-          <w:sz w:val="22"/>
-          <w:szCs w:val="20"/>
-        </w:rPr>
-        <w:t>, and generates contextual customer communications.</w:t>
+          <w:sz w:val="18"/>
+          <w:szCs w:val="18"/>
+        </w:rPr>
+      </w:pPr>
+      <w:hyperlink r:id="rId18" w:history="1">
+        <w:r>
+          <w:rPr>
+            <w:rStyle w:val="Hyperlink"/>
+            <w:rFonts w:ascii="HelveticaNeueLT Pro 55 Roman" w:hAnsi="HelveticaNeueLT Pro 55 Roman"/>
+            <w:b/>
+            <w:color w:val="auto"/>
+            <w:sz w:val="22"/>
+            <w:u w:val="none"/>
+          </w:rPr>
+          <w:t>headroomlabs-ai/headroom</w:t>
+        </w:r>
+      </w:hyperlink>
+      <w:r>
+        <w:rPr>
+          <w:rFonts w:ascii="HelveticaNeueLT Pro 55 Roman" w:hAnsi="HelveticaNeueLT Pro 55 Roman"/>
+          <w:sz w:val="18"/>
+        </w:rPr>
+        <w:t xml:space="preserve"> (</w:t>
+      </w:r>
+      <w:r>
+        <w:rPr>
+          <w:rFonts w:ascii="HelveticaNeueLT Pro 55 Roman" w:hAnsi="HelveticaNeueLT Pro 55 Roman"/>
+          <w:sz w:val="18"/>
+        </w:rPr>
+        <w:t>61</w:t>
+      </w:r>
+      <w:r>
+        <w:rPr>
+          <w:rFonts w:ascii="HelveticaNeueLT Pro 55 Roman" w:hAnsi="HelveticaNeueLT Pro 55 Roman"/>
+          <w:sz w:val="18"/>
+        </w:rPr>
+        <w:t xml:space="preserve">k stars)  ·  </w:t>
+      </w:r>
+      <w:r>
+        <w:rPr>
+          <w:rFonts w:ascii="HelveticaNeueLT Pro 55 Roman" w:hAnsi="HelveticaNeueLT Pro 55 Roman"/>
+          <w:bCs/>
+          <w:sz w:val="18"/>
+        </w:rPr>
+        <w:t>Go, TypeScript, Svelte, Rust</w:t>
+      </w:r>
+      <w:r>
+        <w:rPr>
+          <w:rFonts w:ascii="HelveticaNeueLT Pro 55 Roman" w:hAnsi="HelveticaNeueLT Pro 55 Roman"/>
+          <w:sz w:val="18"/>
+        </w:rPr>
+        <w:t xml:space="preserve">  ·  </w:t>
+      </w:r>
+      <w:r>
+        <w:rPr>
+          <w:rFonts w:ascii="HelveticaNeueLT Pro 55 Roman" w:hAnsi="HelveticaNeueLT Pro 55 Roman"/>
+          <w:sz w:val="22"/>
+          <w:szCs w:val="22"/>
+        </w:rPr>
+        <w:t>Token compression proxy for LLMs. #2 third-party contributor: cache stability, compression-safe tool calls, session fidelity.</w:t>
       </w:r>
     </w:p>
     <w:p>
@@ -1254,57 +1688,204 @@
         <w:ind w:left="540" w:hanging="252"/>
         <w:rPr>
           <w:rFonts w:ascii="HelveticaNeueLT Pro 55 Roman" w:hAnsi="HelveticaNeueLT Pro 55 Roman" w:cs="Arial"/>
-          <w:sz w:val="22"/>
-          <w:szCs w:val="20"/>
-        </w:rPr>
-      </w:pPr>
-      <w:r>
-        <w:rPr>
-          <w:rFonts w:ascii="HelveticaNeueLT Pro 55 Roman" w:hAnsi="HelveticaNeueLT Pro 55 Roman" w:cs="Arial"/>
-          <w:sz w:val="22"/>
-          <w:szCs w:val="20"/>
-        </w:rPr>
-        <w:t>OpenAI</w:t>
-      </w:r>
-      <w:r>
-        <w:rPr>
-          <w:rFonts w:ascii="HelveticaNeueLT Pro 55 Roman" w:hAnsi="HelveticaNeueLT Pro 55 Roman" w:cs="Arial"/>
-          <w:sz w:val="22"/>
-          <w:szCs w:val="20"/>
-        </w:rPr>
-        <w:t xml:space="preserve"> C</w:t>
-      </w:r>
-      <w:r>
-        <w:rPr>
-          <w:rFonts w:ascii="HelveticaNeueLT Pro 55 Roman" w:hAnsi="HelveticaNeueLT Pro 55 Roman" w:cs="Arial"/>
-          <w:sz w:val="22"/>
-          <w:szCs w:val="20"/>
-        </w:rPr>
-        <w:t xml:space="preserve">hat Completions </w:t>
-      </w:r>
-      <w:r>
-        <w:rPr>
-          <w:rFonts w:ascii="HelveticaNeueLT Pro 55 Roman" w:hAnsi="HelveticaNeueLT Pro 55 Roman" w:cs="Arial"/>
-          <w:sz w:val="22"/>
-          <w:szCs w:val="20"/>
-        </w:rPr>
-        <w:t>with</w:t>
-      </w:r>
-      <w:r>
-        <w:rPr>
-          <w:rFonts w:ascii="HelveticaNeueLT Pro 55 Roman" w:hAnsi="HelveticaNeueLT Pro 55 Roman" w:cs="Arial"/>
-          <w:sz w:val="22"/>
-          <w:szCs w:val="20"/>
-        </w:rPr>
-        <w:t xml:space="preserve"> partial JSON parsing</w:t>
-      </w:r>
-      <w:r>
-        <w:rPr>
-          <w:rFonts w:ascii="HelveticaNeueLT Pro 55 Roman" w:hAnsi="HelveticaNeueLT Pro 55 Roman" w:cs="Arial"/>
-          <w:sz w:val="22"/>
-          <w:szCs w:val="20"/>
-        </w:rPr>
-        <w:t xml:space="preserve"> for email draft generation. Realtime Voice API for transcribed phone calls. Hot-swappable system prompt editable in the UI.</w:t>
+          <w:sz w:val="18"/>
+          <w:szCs w:val="18"/>
+        </w:rPr>
+      </w:pPr>
+      <w:hyperlink r:id="rId19" w:history="1">
+        <w:proofErr w:type="spellStart"/>
+        <w:r>
+          <w:rPr>
+            <w:rStyle w:val="Hyperlink"/>
+            <w:rFonts w:ascii="HelveticaNeueLT Pro 55 Roman" w:hAnsi="HelveticaNeueLT Pro 55 Roman"/>
+            <w:b/>
+            <w:color w:val="auto"/>
+            <w:sz w:val="22"/>
+            <w:u w:val="none"/>
+          </w:rPr>
+          <w:t>stablyai</w:t>
+        </w:r>
+        <w:proofErr w:type="spellEnd"/>
+        <w:r>
+          <w:rPr>
+            <w:rStyle w:val="Hyperlink"/>
+            <w:rFonts w:ascii="HelveticaNeueLT Pro 55 Roman" w:hAnsi="HelveticaNeueLT Pro 55 Roman"/>
+            <w:b/>
+            <w:color w:val="auto"/>
+            <w:sz w:val="22"/>
+            <w:u w:val="none"/>
+          </w:rPr>
+          <w:t>/orca</w:t>
+        </w:r>
+      </w:hyperlink>
+      <w:r>
+        <w:rPr>
+          <w:rFonts w:ascii="HelveticaNeueLT Pro 55 Roman" w:hAnsi="HelveticaNeueLT Pro 55 Roman"/>
+          <w:b/>
+          <w:sz w:val="22"/>
+        </w:rPr>
+        <w:t xml:space="preserve"> </w:t>
+      </w:r>
+      <w:r>
+        <w:rPr>
+          <w:rFonts w:ascii="HelveticaNeueLT Pro 55 Roman" w:hAnsi="HelveticaNeueLT Pro 55 Roman"/>
+          <w:sz w:val="18"/>
+        </w:rPr>
+        <w:t xml:space="preserve">(26k stars)  ·  </w:t>
+      </w:r>
+      <w:r>
+        <w:rPr>
+          <w:rFonts w:ascii="HelveticaNeueLT Pro 55 Roman" w:hAnsi="HelveticaNeueLT Pro 55 Roman"/>
+          <w:bCs/>
+          <w:sz w:val="18"/>
+        </w:rPr>
+        <w:t>TypeScript, JavaScript, CSS, HTML</w:t>
+      </w:r>
+      <w:r>
+        <w:rPr>
+          <w:rFonts w:ascii="HelveticaNeueLT Pro 55 Roman" w:hAnsi="HelveticaNeueLT Pro 55 Roman"/>
+          <w:sz w:val="18"/>
+        </w:rPr>
+        <w:t xml:space="preserve">  ·  </w:t>
+      </w:r>
+      <w:r>
+        <w:rPr>
+          <w:rFonts w:ascii="HelveticaNeueLT Pro 55 Roman" w:hAnsi="HelveticaNeueLT Pro 55 Roman"/>
+          <w:sz w:val="22"/>
+          <w:szCs w:val="22"/>
+        </w:rPr>
+        <w:t xml:space="preserve">IDE for parallel coding-agent </w:t>
+      </w:r>
+      <w:proofErr w:type="spellStart"/>
+      <w:r>
+        <w:rPr>
+          <w:rFonts w:ascii="HelveticaNeueLT Pro 55 Roman" w:hAnsi="HelveticaNeueLT Pro 55 Roman"/>
+          <w:sz w:val="22"/>
+          <w:szCs w:val="22"/>
+        </w:rPr>
+        <w:t>worktrees</w:t>
+      </w:r>
+      <w:proofErr w:type="spellEnd"/>
+      <w:r>
+        <w:rPr>
+          <w:rFonts w:ascii="HelveticaNeueLT Pro 55 Roman" w:hAnsi="HelveticaNeueLT Pro 55 Roman"/>
+          <w:sz w:val="22"/>
+          <w:szCs w:val="22"/>
+        </w:rPr>
+        <w:t xml:space="preserve">. #1 third-party contributor: </w:t>
+      </w:r>
+      <w:r>
+        <w:rPr>
+          <w:rFonts w:ascii="HelveticaNeueLT Pro 55 Roman" w:hAnsi="HelveticaNeueLT Pro 55 Roman"/>
+          <w:sz w:val="22"/>
+          <w:szCs w:val="22"/>
+        </w:rPr>
+        <w:t xml:space="preserve">orchestration </w:t>
+      </w:r>
+      <w:r>
+        <w:rPr>
+          <w:rFonts w:ascii="HelveticaNeueLT Pro 55 Roman" w:hAnsi="HelveticaNeueLT Pro 55 Roman"/>
+          <w:sz w:val="22"/>
+          <w:szCs w:val="22"/>
+        </w:rPr>
+        <w:t>management</w:t>
+      </w:r>
+      <w:r>
+        <w:rPr>
+          <w:rFonts w:ascii="HelveticaNeueLT Pro 55 Roman" w:hAnsi="HelveticaNeueLT Pro 55 Roman"/>
+          <w:sz w:val="22"/>
+          <w:szCs w:val="22"/>
+        </w:rPr>
+        <w:t>,</w:t>
+      </w:r>
+      <w:r>
+        <w:rPr>
+          <w:rFonts w:ascii="HelveticaNeueLT Pro 55 Roman" w:hAnsi="HelveticaNeueLT Pro 55 Roman"/>
+          <w:sz w:val="22"/>
+          <w:szCs w:val="22"/>
+        </w:rPr>
+        <w:t xml:space="preserve"> agent observability,</w:t>
+      </w:r>
+      <w:r>
+        <w:rPr>
+          <w:rFonts w:ascii="HelveticaNeueLT Pro 55 Roman" w:hAnsi="HelveticaNeueLT Pro 55 Roman"/>
+          <w:sz w:val="22"/>
+          <w:szCs w:val="22"/>
+        </w:rPr>
+        <w:t xml:space="preserve"> </w:t>
+      </w:r>
+      <w:r>
+        <w:rPr>
+          <w:rFonts w:ascii="HelveticaNeueLT Pro 55 Roman" w:hAnsi="HelveticaNeueLT Pro 55 Roman"/>
+          <w:sz w:val="22"/>
+          <w:szCs w:val="22"/>
+        </w:rPr>
+        <w:t xml:space="preserve">rate-limit </w:t>
+      </w:r>
+      <w:r>
+        <w:rPr>
+          <w:rFonts w:ascii="HelveticaNeueLT Pro 55 Roman" w:hAnsi="HelveticaNeueLT Pro 55 Roman"/>
+          <w:sz w:val="22"/>
+          <w:szCs w:val="22"/>
+        </w:rPr>
+        <w:t>switching</w:t>
+      </w:r>
+      <w:r>
+        <w:rPr>
+          <w:rFonts w:ascii="HelveticaNeueLT Pro 55 Roman" w:hAnsi="HelveticaNeueLT Pro 55 Roman"/>
+          <w:sz w:val="22"/>
+          <w:szCs w:val="22"/>
+        </w:rPr>
+        <w:t>.</w:t>
+      </w:r>
+    </w:p>
+    <w:p>
+      <w:pPr>
+        <w:spacing w:after="40" w:line="264" w:lineRule="auto"/>
+        <w:rPr>
+          <w:rFonts w:ascii="HelveticaNeueLT Pro 55 Roman" w:hAnsi="HelveticaNeueLT Pro 55 Roman"/>
+          <w:b/>
+          <w:sz w:val="22"/>
+        </w:rPr>
+      </w:pPr>
+    </w:p>
+    <w:p>
+      <w:pPr>
+        <w:spacing w:after="40" w:line="264" w:lineRule="auto"/>
+        <w:ind w:left="288"/>
+        <w:rPr>
+          <w:rFonts w:ascii="HelveticaNeueLT Pro 55 Roman" w:hAnsi="HelveticaNeueLT Pro 55 Roman"/>
+          <w:sz w:val="18"/>
+        </w:rPr>
+      </w:pPr>
+      <w:r>
+        <w:rPr>
+          <w:rFonts w:ascii="HelveticaNeueLT Pro 55 Roman" w:hAnsi="HelveticaNeueLT Pro 55 Roman"/>
+          <w:b/>
+          <w:sz w:val="22"/>
+        </w:rPr>
+        <w:t>Liberty Pest Control, AI-Powered Business Tools</w:t>
+      </w:r>
+      <w:r>
+        <w:rPr>
+          <w:rFonts w:ascii="HelveticaNeueLT Pro 55 Roman" w:hAnsi="HelveticaNeueLT Pro 55 Roman"/>
+          <w:sz w:val="18"/>
+        </w:rPr>
+        <w:t xml:space="preserve">  (2024</w:t>
+      </w:r>
+      <w:r>
+        <w:rPr>
+          <w:rFonts w:ascii="HelveticaNeueLT Pro 55 Roman" w:hAnsi="HelveticaNeueLT Pro 55 Roman"/>
+          <w:sz w:val="18"/>
+        </w:rPr>
+        <w:t>-2025</w:t>
+      </w:r>
+      <w:r>
+        <w:rPr>
+          <w:rFonts w:ascii="HelveticaNeueLT Pro 55 Roman" w:hAnsi="HelveticaNeueLT Pro 55 Roman"/>
+          <w:sz w:val="18"/>
+        </w:rPr>
+        <w:t>)</w:t>
       </w:r>
     </w:p>
     <w:p>
@@ -1327,173 +1908,45 @@
       </w:pPr>
       <w:r>
         <w:rPr>
-          <w:rFonts w:ascii="HelveticaNeueLT Pro 55 Roman" w:hAnsi="HelveticaNeueLT Pro 55 Roman" w:cs="Arial"/>
-          <w:sz w:val="22"/>
-          <w:szCs w:val="20"/>
-        </w:rPr>
-        <w:t>T</w:t>
-      </w:r>
-      <w:r>
-        <w:rPr>
-          <w:rFonts w:ascii="HelveticaNeueLT Pro 55 Roman" w:hAnsi="HelveticaNeueLT Pro 55 Roman" w:cs="Arial"/>
-          <w:sz w:val="22"/>
-          <w:szCs w:val="20"/>
-        </w:rPr>
-        <w:t>hree-tier caching</w:t>
-      </w:r>
-      <w:r>
-        <w:rPr>
-          <w:rFonts w:ascii="HelveticaNeueLT Pro 55 Roman" w:hAnsi="HelveticaNeueLT Pro 55 Roman" w:cs="Arial"/>
-          <w:sz w:val="22"/>
-          <w:szCs w:val="20"/>
-        </w:rPr>
-        <w:t xml:space="preserve"> (</w:t>
-      </w:r>
-      <w:r>
-        <w:rPr>
-          <w:rFonts w:ascii="HelveticaNeueLT Pro 55 Roman" w:hAnsi="HelveticaNeueLT Pro 55 Roman" w:cs="Arial"/>
-          <w:sz w:val="22"/>
-          <w:szCs w:val="20"/>
-        </w:rPr>
-        <w:t>memory</w:t>
-      </w:r>
-      <w:r>
-        <w:rPr>
-          <w:rFonts w:ascii="HelveticaNeueLT Pro 55 Roman" w:hAnsi="HelveticaNeueLT Pro 55 Roman" w:cs="Arial"/>
-          <w:sz w:val="22"/>
-          <w:szCs w:val="20"/>
-        </w:rPr>
-        <w:t>,</w:t>
-      </w:r>
-      <w:r>
-        <w:rPr>
-          <w:rFonts w:ascii="HelveticaNeueLT Pro 55 Roman" w:hAnsi="HelveticaNeueLT Pro 55 Roman" w:cs="Arial"/>
-          <w:sz w:val="22"/>
-          <w:szCs w:val="20"/>
-        </w:rPr>
-        <w:t xml:space="preserve"> disk</w:t>
-      </w:r>
-      <w:r>
-        <w:rPr>
-          <w:rFonts w:ascii="HelveticaNeueLT Pro 55 Roman" w:hAnsi="HelveticaNeueLT Pro 55 Roman" w:cs="Arial"/>
-          <w:sz w:val="22"/>
-          <w:szCs w:val="20"/>
-        </w:rPr>
-        <w:t>,</w:t>
-      </w:r>
-      <w:r>
-        <w:rPr>
-          <w:rFonts w:ascii="HelveticaNeueLT Pro 55 Roman" w:hAnsi="HelveticaNeueLT Pro 55 Roman" w:cs="Arial"/>
-          <w:sz w:val="22"/>
-          <w:szCs w:val="20"/>
-        </w:rPr>
-        <w:t xml:space="preserve"> Firebase)</w:t>
-      </w:r>
-      <w:r>
-        <w:rPr>
-          <w:rFonts w:ascii="HelveticaNeueLT Pro 55 Roman" w:hAnsi="HelveticaNeueLT Pro 55 Roman" w:cs="Arial"/>
-          <w:sz w:val="22"/>
-          <w:szCs w:val="20"/>
-        </w:rPr>
-        <w:t>, fingerprinting</w:t>
-      </w:r>
-      <w:r>
-        <w:rPr>
-          <w:rFonts w:ascii="HelveticaNeueLT Pro 55 Roman" w:hAnsi="HelveticaNeueLT Pro 55 Roman" w:cs="Arial"/>
-          <w:sz w:val="22"/>
-          <w:szCs w:val="20"/>
-        </w:rPr>
-        <w:t xml:space="preserve"> and deduplication</w:t>
-      </w:r>
-      <w:r>
-        <w:rPr>
-          <w:rFonts w:ascii="HelveticaNeueLT Pro 55 Roman" w:hAnsi="HelveticaNeueLT Pro 55 Roman" w:cs="Arial"/>
-          <w:sz w:val="22"/>
-          <w:szCs w:val="20"/>
-        </w:rPr>
-        <w:t>.</w:t>
-      </w:r>
-    </w:p>
-    <w:p>
-      <w:pPr>
-        <w:spacing w:before="80" w:after="40" w:line="264" w:lineRule="auto"/>
-        <w:ind w:left="259"/>
-        <w:rPr>
-          <w:rFonts w:ascii="HelveticaNeueLT Pro 55 Roman" w:hAnsi="HelveticaNeueLT Pro 55 Roman" w:cs="Arial"/>
-          <w:sz w:val="22"/>
-          <w:szCs w:val="20"/>
-        </w:rPr>
-      </w:pPr>
-      <w:r>
-        <w:rPr>
-          <w:rFonts w:ascii="HelveticaNeueLT Pro 55 Roman" w:hAnsi="HelveticaNeueLT Pro 55 Roman"/>
-          <w:b/>
-          <w:sz w:val="18"/>
-        </w:rPr>
-        <w:t xml:space="preserve">Stack: </w:t>
-      </w:r>
-      <w:r>
-        <w:rPr>
-          <w:rFonts w:ascii="HelveticaNeueLT Pro 55 Roman" w:hAnsi="HelveticaNeueLT Pro 55 Roman"/>
-          <w:sz w:val="18"/>
-        </w:rPr>
-        <w:t xml:space="preserve">Next.js, React, TypeScript, </w:t>
-      </w:r>
-      <w:r>
-        <w:rPr>
-          <w:rFonts w:ascii="HelveticaNeueLT Pro 55 Roman" w:hAnsi="HelveticaNeueLT Pro 55 Roman"/>
-          <w:sz w:val="18"/>
-        </w:rPr>
-        <w:t xml:space="preserve">React </w:t>
-      </w:r>
-      <w:r>
-        <w:rPr>
-          <w:rFonts w:ascii="HelveticaNeueLT Pro 55 Roman" w:hAnsi="HelveticaNeueLT Pro 55 Roman"/>
-          <w:sz w:val="18"/>
-        </w:rPr>
-        <w:t xml:space="preserve">Query, </w:t>
-      </w:r>
-      <w:r>
-        <w:rPr>
-          <w:rFonts w:ascii="HelveticaNeueLT Pro 55 Roman" w:hAnsi="HelveticaNeueLT Pro 55 Roman"/>
-          <w:sz w:val="18"/>
-        </w:rPr>
-        <w:t>Tailwind CSS, Node.js/Express, OpenAI API, Firebase, MS SQL Server.</w:t>
-      </w:r>
-    </w:p>
-    <w:p>
-      <w:pPr>
-        <w:spacing w:line="264" w:lineRule="auto"/>
-        <w:rPr>
-          <w:rFonts w:ascii="HelveticaNeueLT Pro 55 Roman" w:hAnsi="HelveticaNeueLT Pro 55 Roman" w:cs="Arial"/>
-          <w:sz w:val="18"/>
-          <w:szCs w:val="18"/>
-        </w:rPr>
-      </w:pPr>
-    </w:p>
-    <w:p>
-      <w:pPr>
-        <w:spacing w:after="40" w:line="264" w:lineRule="auto"/>
-        <w:ind w:left="288"/>
-        <w:rPr>
-          <w:rFonts w:ascii="HelveticaNeueLT Pro 55 Roman" w:hAnsi="HelveticaNeueLT Pro 55 Roman"/>
-          <w:sz w:val="18"/>
-        </w:rPr>
-      </w:pPr>
-      <w:r>
-        <w:rPr>
-          <w:rFonts w:ascii="HelveticaNeueLT Pro 55 Roman" w:hAnsi="HelveticaNeueLT Pro 55 Roman"/>
-          <w:b/>
-          <w:sz w:val="22"/>
-        </w:rPr>
-        <w:t>Liberty Pest Control, Scheduling Optimization Engine</w:t>
-      </w:r>
-      <w:r>
-        <w:rPr>
-          <w:rFonts w:ascii="HelveticaNeueLT Pro 55 Roman" w:hAnsi="HelveticaNeueLT Pro 55 Roman"/>
-          <w:sz w:val="18"/>
-        </w:rPr>
-        <w:t xml:space="preserve">  (2023–2024)</w:t>
+          <w:rFonts w:ascii="HelveticaNeueLT Pro 55 Roman" w:hAnsi="HelveticaNeueLT Pro 55 Roman"/>
+          <w:sz w:val="22"/>
+        </w:rPr>
+        <w:t>Internal AI platform</w:t>
+      </w:r>
+      <w:r>
+        <w:rPr>
+          <w:rFonts w:ascii="HelveticaNeueLT Pro 55 Roman" w:hAnsi="HelveticaNeueLT Pro 55 Roman"/>
+          <w:sz w:val="22"/>
+        </w:rPr>
+        <w:t xml:space="preserve"> on Next.js </w:t>
+      </w:r>
+      <w:r>
+        <w:rPr>
+          <w:rFonts w:ascii="HelveticaNeueLT Pro 55 Roman" w:hAnsi="HelveticaNeueLT Pro 55 Roman"/>
+          <w:sz w:val="22"/>
+        </w:rPr>
+        <w:t>(</w:t>
+      </w:r>
+      <w:r>
+        <w:rPr>
+          <w:rFonts w:ascii="HelveticaNeueLT Pro 55 Roman" w:hAnsi="HelveticaNeueLT Pro 55 Roman"/>
+          <w:sz w:val="22"/>
+        </w:rPr>
+        <w:t>App Router</w:t>
+      </w:r>
+      <w:r>
+        <w:rPr>
+          <w:rFonts w:ascii="HelveticaNeueLT Pro 55 Roman" w:hAnsi="HelveticaNeueLT Pro 55 Roman"/>
+          <w:sz w:val="22"/>
+        </w:rPr>
+        <w:t>)</w:t>
+      </w:r>
+      <w:r>
+        <w:rPr>
+          <w:rFonts w:ascii="HelveticaNeueLT Pro 55 Roman" w:hAnsi="HelveticaNeueLT Pro 55 Roman"/>
+          <w:sz w:val="22"/>
+        </w:rPr>
+        <w:t>: reads technician field notes from PestPac (MS SQL Server) through GPT-4o to generate contextual customer communications. OpenAI Chat Completions with partial JSON parsing, Realtime Voice API for transcribed calls, hot-swappable UI-editable prompts, three-tier caching (memory, disk, Firebase).</w:t>
       </w:r>
     </w:p>
     <w:p>
@@ -1520,7 +1973,7 @@
           <w:sz w:val="22"/>
           <w:szCs w:val="20"/>
         </w:rPr>
-        <w:t xml:space="preserve">Designed a Vehicle Routing Problem solver </w:t>
+        <w:t xml:space="preserve">Vehicle Routing Problem solver for 5,500+ services across 80 technicians: </w:t>
       </w:r>
       <w:r>
         <w:rPr>
@@ -1528,7 +1981,7 @@
           <w:sz w:val="22"/>
           <w:szCs w:val="20"/>
         </w:rPr>
-        <w:t>for</w:t>
+        <w:t xml:space="preserve">Next.js API routes spawn </w:t>
       </w:r>
       <w:r>
         <w:rPr>
@@ -1536,7 +1989,7 @@
           <w:sz w:val="22"/>
           <w:szCs w:val="20"/>
         </w:rPr>
-        <w:t xml:space="preserve"> 5,500+ services across 80 technicians</w:t>
+        <w:t xml:space="preserve">Node.js worker threads for gap-packing, weighted scoring, and geographic continuity; Leaflet map and multi-tech calendar views with </w:t>
       </w:r>
       <w:r>
         <w:rPr>
@@ -1544,21 +1997,21 @@
           <w:sz w:val="22"/>
           <w:szCs w:val="20"/>
         </w:rPr>
-        <w:t>.</w:t>
+        <w:t>batched</w:t>
+      </w:r>
+      <w:r>
+        <w:rPr>
+          <w:rFonts w:ascii="HelveticaNeueLT Pro 55 Roman" w:hAnsi="HelveticaNeueLT Pro 55 Roman" w:cs="Arial"/>
+          <w:sz w:val="22"/>
+          <w:szCs w:val="20"/>
+        </w:rPr>
+        <w:t xml:space="preserve"> rendering.</w:t>
       </w:r>
     </w:p>
     <w:p>
       <w:pPr>
-        <w:numPr>
-          <w:ilvl w:val="0"/>
-          <w:numId w:val="1"/>
-        </w:numPr>
-        <w:tabs>
-          <w:tab w:val="clear" w:pos="288"/>
-          <w:tab w:val="left" w:pos="540"/>
-        </w:tabs>
-        <w:spacing w:after="40" w:line="264" w:lineRule="auto"/>
-        <w:ind w:left="540" w:hanging="252"/>
+        <w:spacing w:before="80" w:after="40" w:line="264" w:lineRule="auto"/>
+        <w:ind w:left="259"/>
         <w:rPr>
           <w:rFonts w:ascii="HelveticaNeueLT Pro 55 Roman" w:hAnsi="HelveticaNeueLT Pro 55 Roman" w:cs="Arial"/>
           <w:sz w:val="22"/>
@@ -1567,252 +2020,39 @@
       </w:pPr>
       <w:r>
         <w:rPr>
-          <w:rFonts w:ascii="HelveticaNeueLT Pro 55 Roman" w:hAnsi="HelveticaNeueLT Pro 55 Roman" w:cs="Arial"/>
-          <w:sz w:val="22"/>
-          <w:szCs w:val="20"/>
-        </w:rPr>
-        <w:t>TypeScript/</w:t>
-      </w:r>
-      <w:r>
-        <w:rPr>
-          <w:rFonts w:ascii="HelveticaNeueLT Pro 55 Roman" w:hAnsi="HelveticaNeueLT Pro 55 Roman" w:cs="Arial"/>
-          <w:sz w:val="22"/>
-          <w:szCs w:val="20"/>
-        </w:rPr>
-        <w:t xml:space="preserve">Node.js </w:t>
-      </w:r>
-      <w:r>
-        <w:rPr>
-          <w:rFonts w:ascii="HelveticaNeueLT Pro 55 Roman" w:hAnsi="HelveticaNeueLT Pro 55 Roman" w:cs="Arial"/>
-          <w:sz w:val="22"/>
-          <w:szCs w:val="20"/>
-        </w:rPr>
-        <w:t>w</w:t>
-      </w:r>
-      <w:r>
-        <w:rPr>
-          <w:rFonts w:ascii="HelveticaNeueLT Pro 55 Roman" w:hAnsi="HelveticaNeueLT Pro 55 Roman" w:cs="Arial"/>
-          <w:sz w:val="22"/>
-          <w:szCs w:val="20"/>
-        </w:rPr>
-        <w:t xml:space="preserve">orker </w:t>
-      </w:r>
-      <w:r>
-        <w:rPr>
-          <w:rFonts w:ascii="HelveticaNeueLT Pro 55 Roman" w:hAnsi="HelveticaNeueLT Pro 55 Roman" w:cs="Arial"/>
-          <w:sz w:val="22"/>
-          <w:szCs w:val="20"/>
-        </w:rPr>
-        <w:t>t</w:t>
-      </w:r>
-      <w:r>
-        <w:rPr>
-          <w:rFonts w:ascii="HelveticaNeueLT Pro 55 Roman" w:hAnsi="HelveticaNeueLT Pro 55 Roman" w:cs="Arial"/>
-          <w:sz w:val="22"/>
-          <w:szCs w:val="20"/>
-        </w:rPr>
-        <w:t>hreads</w:t>
-      </w:r>
-      <w:r>
-        <w:rPr>
-          <w:rFonts w:ascii="HelveticaNeueLT Pro 55 Roman" w:hAnsi="HelveticaNeueLT Pro 55 Roman" w:cs="Arial"/>
-          <w:sz w:val="22"/>
-          <w:szCs w:val="20"/>
-        </w:rPr>
-        <w:t>:</w:t>
-      </w:r>
-      <w:r>
-        <w:rPr>
-          <w:rFonts w:ascii="HelveticaNeueLT Pro 55 Roman" w:hAnsi="HelveticaNeueLT Pro 55 Roman" w:cs="Arial"/>
-          <w:sz w:val="22"/>
-          <w:szCs w:val="20"/>
-        </w:rPr>
-        <w:t xml:space="preserve"> gap-packing</w:t>
-      </w:r>
-      <w:r>
-        <w:rPr>
-          <w:rFonts w:ascii="HelveticaNeueLT Pro 55 Roman" w:hAnsi="HelveticaNeueLT Pro 55 Roman" w:cs="Arial"/>
-          <w:sz w:val="22"/>
-          <w:szCs w:val="20"/>
-        </w:rPr>
-        <w:t xml:space="preserve">, </w:t>
-      </w:r>
-      <w:r>
-        <w:rPr>
-          <w:rFonts w:ascii="HelveticaNeueLT Pro 55 Roman" w:hAnsi="HelveticaNeueLT Pro 55 Roman" w:cs="Arial"/>
-          <w:sz w:val="22"/>
-          <w:szCs w:val="20"/>
-        </w:rPr>
-        <w:t xml:space="preserve">weighted scoring, </w:t>
-      </w:r>
-      <w:r>
-        <w:rPr>
-          <w:rFonts w:ascii="HelveticaNeueLT Pro 55 Roman" w:hAnsi="HelveticaNeueLT Pro 55 Roman" w:cs="Arial"/>
-          <w:sz w:val="22"/>
-          <w:szCs w:val="20"/>
-        </w:rPr>
-        <w:t>and</w:t>
-      </w:r>
-      <w:r>
-        <w:rPr>
-          <w:rFonts w:ascii="HelveticaNeueLT Pro 55 Roman" w:hAnsi="HelveticaNeueLT Pro 55 Roman" w:cs="Arial"/>
-          <w:sz w:val="22"/>
-          <w:szCs w:val="20"/>
-        </w:rPr>
-        <w:t xml:space="preserve"> geographic continuity.</w:t>
-      </w:r>
-    </w:p>
-    <w:p>
-      <w:pPr>
-        <w:numPr>
-          <w:ilvl w:val="0"/>
-          <w:numId w:val="1"/>
-        </w:numPr>
-        <w:tabs>
-          <w:tab w:val="clear" w:pos="288"/>
-          <w:tab w:val="left" w:pos="540"/>
-        </w:tabs>
-        <w:spacing w:after="40" w:line="264" w:lineRule="auto"/>
-        <w:ind w:left="540" w:hanging="252"/>
-        <w:rPr>
-          <w:rFonts w:ascii="HelveticaNeueLT Pro 55 Roman" w:hAnsi="HelveticaNeueLT Pro 55 Roman" w:cs="Arial"/>
-          <w:sz w:val="22"/>
-          <w:szCs w:val="20"/>
-        </w:rPr>
-      </w:pPr>
-      <w:r>
-        <w:rPr>
-          <w:rFonts w:ascii="HelveticaNeueLT Pro 55 Roman" w:hAnsi="HelveticaNeueLT Pro 55 Roman" w:cs="Arial"/>
-          <w:sz w:val="22"/>
-          <w:szCs w:val="20"/>
-        </w:rPr>
-        <w:t xml:space="preserve">Three-tier architecture: </w:t>
-      </w:r>
-      <w:r>
-        <w:rPr>
-          <w:rFonts w:ascii="HelveticaNeueLT Pro 55 Roman" w:hAnsi="HelveticaNeueLT Pro 55 Roman" w:cs="Arial"/>
-          <w:sz w:val="22"/>
-          <w:szCs w:val="20"/>
-        </w:rPr>
-        <w:t>SQL</w:t>
-      </w:r>
-      <w:r>
-        <w:rPr>
-          <w:rFonts w:ascii="HelveticaNeueLT Pro 55 Roman" w:hAnsi="HelveticaNeueLT Pro 55 Roman" w:cs="Arial"/>
-          <w:sz w:val="22"/>
-          <w:szCs w:val="20"/>
-        </w:rPr>
-        <w:t xml:space="preserve"> Server</w:t>
-      </w:r>
-      <w:r>
-        <w:rPr>
-          <w:rFonts w:ascii="HelveticaNeueLT Pro 55 Roman" w:hAnsi="HelveticaNeueLT Pro 55 Roman" w:cs="Arial"/>
-          <w:sz w:val="22"/>
-          <w:szCs w:val="20"/>
-        </w:rPr>
-        <w:t xml:space="preserve"> </w:t>
-      </w:r>
-      <w:r>
-        <w:rPr>
-          <w:rFonts w:ascii="Arial" w:hAnsi="Arial" w:cs="Arial"/>
-          <w:sz w:val="22"/>
-          <w:szCs w:val="20"/>
-        </w:rPr>
-        <w:t>→</w:t>
-      </w:r>
-      <w:r>
-        <w:rPr>
-          <w:rFonts w:ascii="HelveticaNeueLT Pro 55 Roman" w:hAnsi="HelveticaNeueLT Pro 55 Roman" w:cs="Arial"/>
-          <w:sz w:val="22"/>
-          <w:szCs w:val="20"/>
-        </w:rPr>
-        <w:t xml:space="preserve"> Next.js API routes (data transformation, </w:t>
-      </w:r>
-      <w:r>
-        <w:rPr>
-          <w:rFonts w:ascii="HelveticaNeueLT Pro 55 Roman" w:hAnsi="HelveticaNeueLT Pro 55 Roman" w:cs="Arial"/>
-          <w:sz w:val="22"/>
-          <w:szCs w:val="20"/>
-        </w:rPr>
-        <w:t>validation</w:t>
-      </w:r>
-      <w:r>
-        <w:rPr>
-          <w:rFonts w:ascii="HelveticaNeueLT Pro 55 Roman" w:hAnsi="HelveticaNeueLT Pro 55 Roman" w:cs="Arial"/>
-          <w:sz w:val="22"/>
-          <w:szCs w:val="20"/>
-        </w:rPr>
-        <w:t xml:space="preserve">) </w:t>
-      </w:r>
-      <w:r>
-        <w:rPr>
-          <w:rFonts w:ascii="Arial" w:hAnsi="Arial" w:cs="Arial"/>
-          <w:sz w:val="22"/>
-          <w:szCs w:val="20"/>
-        </w:rPr>
-        <w:t>→</w:t>
-      </w:r>
-      <w:r>
-        <w:rPr>
-          <w:rFonts w:ascii="HelveticaNeueLT Pro 55 Roman" w:hAnsi="HelveticaNeueLT Pro 55 Roman" w:cs="Arial"/>
-          <w:sz w:val="22"/>
-          <w:szCs w:val="20"/>
-        </w:rPr>
-        <w:t xml:space="preserve"> frontend visualization</w:t>
-      </w:r>
-      <w:r>
-        <w:rPr>
-          <w:rFonts w:ascii="HelveticaNeueLT Pro 55 Roman" w:hAnsi="HelveticaNeueLT Pro 55 Roman" w:cs="Arial"/>
-          <w:sz w:val="22"/>
-          <w:szCs w:val="20"/>
-        </w:rPr>
-        <w:t xml:space="preserve"> with Leaflet maps, multi-tech calendar views, progressive rendering</w:t>
-      </w:r>
-      <w:r>
-        <w:rPr>
-          <w:rFonts w:ascii="HelveticaNeueLT Pro 55 Roman" w:hAnsi="HelveticaNeueLT Pro 55 Roman" w:cs="Arial"/>
-          <w:sz w:val="22"/>
-          <w:szCs w:val="20"/>
-        </w:rPr>
-        <w:t>.</w:t>
-      </w:r>
-    </w:p>
-    <w:p>
-      <w:pPr>
-        <w:spacing w:before="80" w:line="264" w:lineRule="auto"/>
-        <w:ind w:left="259"/>
-        <w:rPr>
           <w:rFonts w:ascii="HelveticaNeueLT Pro 55 Roman" w:hAnsi="HelveticaNeueLT Pro 55 Roman"/>
           <w:b/>
           <w:sz w:val="18"/>
         </w:rPr>
-      </w:pPr>
-      <w:r>
-        <w:rPr>
-          <w:rFonts w:ascii="HelveticaNeueLT Pro 55 Roman" w:hAnsi="HelveticaNeueLT Pro 55 Roman"/>
-          <w:b/>
-          <w:sz w:val="18"/>
-        </w:rPr>
-        <w:t>Stack:</w:t>
-      </w:r>
-      <w:r>
-        <w:t xml:space="preserve"> </w:t>
-      </w:r>
-      <w:r>
-        <w:rPr>
-          <w:rFonts w:ascii="HelveticaNeueLT Pro 55 Roman" w:hAnsi="HelveticaNeueLT Pro 55 Roman"/>
-          <w:bCs/>
-          <w:sz w:val="18"/>
-        </w:rPr>
-        <w:t>TypeScript, N</w:t>
-      </w:r>
-      <w:r>
-        <w:rPr>
-          <w:rFonts w:ascii="HelveticaNeueLT Pro 55 Roman" w:hAnsi="HelveticaNeueLT Pro 55 Roman"/>
-          <w:bCs/>
-          <w:sz w:val="18"/>
-        </w:rPr>
-        <w:t>ext.js (App Router), React, Tailwind CSS, Node.js Worker Threads, Leaflet/Mapbox, MS SQL Server.</w:t>
+        <w:t xml:space="preserve">Stack: </w:t>
+      </w:r>
+      <w:r>
+        <w:rPr>
+          <w:rFonts w:ascii="HelveticaNeueLT Pro 55 Roman" w:hAnsi="HelveticaNeueLT Pro 55 Roman"/>
+          <w:sz w:val="18"/>
+        </w:rPr>
+        <w:t xml:space="preserve">Next.js, React, TypeScript, </w:t>
+      </w:r>
+      <w:r>
+        <w:rPr>
+          <w:rFonts w:ascii="HelveticaNeueLT Pro 55 Roman" w:hAnsi="HelveticaNeueLT Pro 55 Roman"/>
+          <w:sz w:val="18"/>
+        </w:rPr>
+        <w:t xml:space="preserve">React </w:t>
+      </w:r>
+      <w:r>
+        <w:rPr>
+          <w:rFonts w:ascii="HelveticaNeueLT Pro 55 Roman" w:hAnsi="HelveticaNeueLT Pro 55 Roman"/>
+          <w:sz w:val="18"/>
+        </w:rPr>
+        <w:t xml:space="preserve">Query, </w:t>
+      </w:r>
+      <w:r>
+        <w:rPr>
+          <w:rFonts w:ascii="HelveticaNeueLT Pro 55 Roman" w:hAnsi="HelveticaNeueLT Pro 55 Roman"/>
+          <w:sz w:val="18"/>
+        </w:rPr>
+        <w:t>Tailwind CSS, Node.js/Express, OpenAI API, Firebase, MS SQL Server.</w:t>
       </w:r>
     </w:p>
     <w:p>
@@ -1946,7 +2186,21 @@
           <w:rFonts w:ascii="HelveticaNeueLT Pro 55 Roman" w:hAnsi="HelveticaNeueLT Pro 55 Roman"/>
           <w:sz w:val="22"/>
         </w:rPr>
-        <w:t xml:space="preserve">FinTech JV with Guggenheim Partners. </w:t>
+        <w:t xml:space="preserve">FinTech </w:t>
+      </w:r>
+      <w:r>
+        <w:rPr>
+          <w:rFonts w:ascii="HelveticaNeueLT Pro 55 Roman" w:hAnsi="HelveticaNeueLT Pro 55 Roman"/>
+          <w:sz w:val="22"/>
+        </w:rPr>
+        <w:t>venture</w:t>
+      </w:r>
+      <w:r>
+        <w:rPr>
+          <w:rFonts w:ascii="HelveticaNeueLT Pro 55 Roman" w:hAnsi="HelveticaNeueLT Pro 55 Roman"/>
+          <w:sz w:val="22"/>
+        </w:rPr>
+        <w:t xml:space="preserve"> with Guggenheim Partners. </w:t>
       </w:r>
       <w:r>
         <w:rPr>
@@ -2140,23 +2394,7 @@
           <w:sz w:val="22"/>
           <w:szCs w:val="20"/>
         </w:rPr>
-        <w:t xml:space="preserve">Clients: </w:t>
-      </w:r>
-      <w:r>
-        <w:rPr>
-          <w:rFonts w:ascii="HelveticaNeueLT Pro 55 Roman" w:hAnsi="HelveticaNeueLT Pro 55 Roman" w:cs="Arial"/>
-          <w:sz w:val="22"/>
-          <w:szCs w:val="20"/>
-        </w:rPr>
-        <w:t>Visa, Barclays, NFL, Chase, Hyatt, Apple, Disney, US Airways, PNC Bank, Virgin America</w:t>
-      </w:r>
-      <w:r>
-        <w:rPr>
-          <w:rFonts w:ascii="HelveticaNeueLT Pro 55 Roman" w:hAnsi="HelveticaNeueLT Pro 55 Roman" w:cs="Arial"/>
-          <w:sz w:val="22"/>
-          <w:szCs w:val="20"/>
-        </w:rPr>
-        <w:t>.</w:t>
+        <w:t>Clients: Visa, Barclays, NFL, Chase, Hyatt, Apple, Disney, US Airways, PNC Bank, Virgin America, UBS, Ritz-Carlton, Sallie Mae, ADP, IOC, and AARP.</w:t>
       </w:r>
     </w:p>
     <w:p>
@@ -2273,6 +2511,24 @@
           <w:sz w:val="18"/>
         </w:rPr>
         <w:t>June 2011 – March 2012</w:t>
+      </w:r>
+    </w:p>
+    <w:p>
+      <w:pPr>
+        <w:spacing w:after="20" w:line="264" w:lineRule="auto"/>
+        <w:rPr>
+          <w:rFonts w:ascii="HelveticaNeueLT Pro 55 Roman" w:hAnsi="HelveticaNeueLT Pro 55 Roman" w:cs="Arial"/>
+          <w:sz w:val="22"/>
+          <w:szCs w:val="20"/>
+        </w:rPr>
+      </w:pPr>
+      <w:r>
+        <w:rPr>
+          <w:rFonts w:ascii="HelveticaNeueLT Pro 55 Roman" w:hAnsi="HelveticaNeueLT Pro 55 Roman" w:cs="Arial"/>
+          <w:sz w:val="22"/>
+          <w:szCs w:val="20"/>
+        </w:rPr>
+        <w:t>Developed headless e-commerce CMS templates. Checkout optimization with multivariate testing.</w:t>
       </w:r>
     </w:p>
     <w:p>
@@ -2445,921 +2701,6 @@
           <w:rFonts w:ascii="HelveticaNeueLT Pro 55 Roman" w:hAnsi="HelveticaNeueLT Pro 55 Roman" w:cs="Arial"/>
           <w:sz w:val="18"/>
           <w:szCs w:val="18"/>
-        </w:rPr>
-      </w:pPr>
-    </w:p>
-    <w:tbl>
-      <w:tblPr>
-        <w:tblW w:w="0" w:type="auto"/>
-        <w:tblBorders>
-          <w:bottom w:val="single" w:sz="4" w:space="0" w:color="999999"/>
-        </w:tblBorders>
-        <w:tblLook w:val="04A0" w:firstRow="1" w:lastRow="0" w:firstColumn="1" w:lastColumn="0" w:noHBand="0" w:noVBand="1"/>
-      </w:tblPr>
-      <w:tblGrid>
-        <w:gridCol w:w="10098"/>
-      </w:tblGrid>
-      <w:tr>
-        <w:tc>
-          <w:tcPr>
-            <w:tcW w:w="10098" w:type="dxa"/>
-          </w:tcPr>
-          <w:p>
-            <w:pPr>
-              <w:spacing w:before="120" w:after="40"/>
-            </w:pPr>
-            <w:r>
-              <w:rPr>
-                <w:rFonts w:ascii="HelveticaNeueLT Pro 55 Roman" w:hAnsi="HelveticaNeueLT Pro 55 Roman"/>
-                <w:b/>
-                <w:color w:val="999999"/>
-                <w:sz w:val="22"/>
-              </w:rPr>
-              <w:t>OPEN SOURCE</w:t>
-            </w:r>
-          </w:p>
-        </w:tc>
-      </w:tr>
-    </w:tbl>
-    <w:p>
-      <w:pPr>
-        <w:spacing w:line="120" w:lineRule="auto"/>
-        <w:rPr>
-          <w:rFonts w:ascii="HelveticaNeueLT Pro 55 Roman" w:hAnsi="HelveticaNeueLT Pro 55 Roman"/>
-          <w:b/>
-          <w:sz w:val="14"/>
-          <w:szCs w:val="14"/>
-        </w:rPr>
-      </w:pPr>
-    </w:p>
-    <w:p>
-      <w:pPr>
-        <w:spacing w:before="60" w:line="276" w:lineRule="auto"/>
-        <w:rPr>
-          <w:rFonts w:ascii="HelveticaNeueLT Pro 55 Roman" w:hAnsi="HelveticaNeueLT Pro 55 Roman"/>
-          <w:sz w:val="22"/>
-          <w:szCs w:val="22"/>
-        </w:rPr>
-      </w:pPr>
-      <w:r>
-        <w:rPr>
-          <w:rFonts w:ascii="HelveticaNeueLT Pro 55 Roman" w:hAnsi="HelveticaNeueLT Pro 55 Roman"/>
-          <w:sz w:val="22"/>
-          <w:szCs w:val="22"/>
-        </w:rPr>
-        <w:t xml:space="preserve">Over </w:t>
-      </w:r>
-      <w:r>
-        <w:rPr>
-          <w:rFonts w:ascii="HelveticaNeueLT Pro 55 Roman" w:hAnsi="HelveticaNeueLT Pro 55 Roman"/>
-          <w:sz w:val="22"/>
-          <w:szCs w:val="22"/>
-        </w:rPr>
-        <w:t>5</w:t>
-      </w:r>
-      <w:r>
-        <w:rPr>
-          <w:rFonts w:ascii="HelveticaNeueLT Pro 55 Roman" w:hAnsi="HelveticaNeueLT Pro 55 Roman"/>
-          <w:sz w:val="22"/>
-          <w:szCs w:val="22"/>
-        </w:rPr>
-        <w:t>5</w:t>
-      </w:r>
-      <w:r>
-        <w:rPr>
-          <w:rFonts w:ascii="HelveticaNeueLT Pro 55 Roman" w:hAnsi="HelveticaNeueLT Pro 55 Roman"/>
-          <w:sz w:val="22"/>
-          <w:szCs w:val="22"/>
-        </w:rPr>
-        <w:t>0</w:t>
-      </w:r>
-      <w:r>
-        <w:rPr>
-          <w:rFonts w:ascii="HelveticaNeueLT Pro 55 Roman" w:hAnsi="HelveticaNeueLT Pro 55 Roman"/>
-          <w:sz w:val="22"/>
-          <w:szCs w:val="22"/>
-        </w:rPr>
-        <w:t xml:space="preserve"> PRs </w:t>
-      </w:r>
-      <w:r>
-        <w:rPr>
-          <w:rFonts w:ascii="HelveticaNeueLT Pro 55 Roman" w:hAnsi="HelveticaNeueLT Pro 55 Roman"/>
-          <w:sz w:val="22"/>
-          <w:szCs w:val="22"/>
-        </w:rPr>
-        <w:t>shipped</w:t>
-      </w:r>
-      <w:r>
-        <w:rPr>
-          <w:rFonts w:ascii="HelveticaNeueLT Pro 55 Roman" w:hAnsi="HelveticaNeueLT Pro 55 Roman"/>
-          <w:sz w:val="22"/>
-          <w:szCs w:val="22"/>
-        </w:rPr>
-        <w:t xml:space="preserve"> to production </w:t>
-      </w:r>
-      <w:r>
-        <w:rPr>
-          <w:rFonts w:ascii="HelveticaNeueLT Pro 55 Roman" w:hAnsi="HelveticaNeueLT Pro 55 Roman"/>
-          <w:sz w:val="22"/>
-          <w:szCs w:val="22"/>
-        </w:rPr>
-        <w:t>at 9</w:t>
-      </w:r>
-      <w:r>
-        <w:rPr>
-          <w:rFonts w:ascii="HelveticaNeueLT Pro 55 Roman" w:hAnsi="HelveticaNeueLT Pro 55 Roman"/>
-          <w:sz w:val="22"/>
-          <w:szCs w:val="22"/>
-        </w:rPr>
-        <w:t>7</w:t>
-      </w:r>
-      <w:r>
-        <w:rPr>
-          <w:rFonts w:ascii="HelveticaNeueLT Pro 55 Roman" w:hAnsi="HelveticaNeueLT Pro 55 Roman"/>
-          <w:sz w:val="22"/>
-          <w:szCs w:val="22"/>
-        </w:rPr>
-        <w:t>% acceptance</w:t>
-      </w:r>
-      <w:r>
-        <w:rPr>
-          <w:rFonts w:ascii="HelveticaNeueLT Pro 55 Roman" w:hAnsi="HelveticaNeueLT Pro 55 Roman"/>
-          <w:sz w:val="22"/>
-          <w:szCs w:val="22"/>
-        </w:rPr>
-        <w:t>:</w:t>
-      </w:r>
-      <w:r>
-        <w:rPr>
-          <w:rFonts w:ascii="HelveticaNeueLT Pro 55 Roman" w:hAnsi="HelveticaNeueLT Pro 55 Roman"/>
-          <w:sz w:val="22"/>
-          <w:szCs w:val="22"/>
-        </w:rPr>
-        <w:t xml:space="preserve"> </w:t>
-      </w:r>
-      <w:hyperlink r:id="rId14" w:history="1">
-        <w:r>
-          <w:rPr>
-            <w:rStyle w:val="Hyperlink"/>
-            <w:rFonts w:ascii="HelveticaNeueLT Pro 55 Roman" w:hAnsi="HelveticaNeueLT Pro 55 Roman"/>
-            <w:color w:val="auto"/>
-            <w:sz w:val="22"/>
-            <w:szCs w:val="22"/>
-          </w:rPr>
-          <w:t>https://basedin.nyc/pr-stats</w:t>
-        </w:r>
-      </w:hyperlink>
-    </w:p>
-    <w:p>
-      <w:pPr>
-        <w:spacing w:line="120" w:lineRule="auto"/>
-        <w:rPr>
-          <w:rFonts w:ascii="HelveticaNeueLT Pro 55 Roman" w:hAnsi="HelveticaNeueLT Pro 55 Roman"/>
-          <w:b/>
-          <w:sz w:val="10"/>
-          <w:szCs w:val="10"/>
-        </w:rPr>
-      </w:pPr>
-    </w:p>
-    <w:p>
-      <w:pPr>
-        <w:spacing w:before="60" w:line="276" w:lineRule="auto"/>
-        <w:rPr>
-          <w:rFonts w:ascii="HelveticaNeueLT Pro 55 Roman" w:hAnsi="HelveticaNeueLT Pro 55 Roman" w:cs="Arial"/>
-          <w:sz w:val="22"/>
-          <w:szCs w:val="20"/>
-        </w:rPr>
-      </w:pPr>
-      <w:r>
-        <w:rPr>
-          <w:rFonts w:ascii="HelveticaNeueLT Pro 55 Roman" w:hAnsi="HelveticaNeueLT Pro 55 Roman"/>
-          <w:b/>
-          <w:sz w:val="22"/>
-        </w:rPr>
-        <w:t>thedotmack/claude-mem</w:t>
-      </w:r>
-      <w:r>
-        <w:rPr>
-          <w:rFonts w:ascii="HelveticaNeueLT Pro 55 Roman" w:hAnsi="HelveticaNeueLT Pro 55 Roman"/>
-          <w:sz w:val="18"/>
-        </w:rPr>
-        <w:t xml:space="preserve"> (8</w:t>
-      </w:r>
-      <w:r>
-        <w:rPr>
-          <w:rFonts w:ascii="HelveticaNeueLT Pro 55 Roman" w:hAnsi="HelveticaNeueLT Pro 55 Roman"/>
-          <w:sz w:val="18"/>
-        </w:rPr>
-        <w:t>6</w:t>
-      </w:r>
-      <w:r>
-        <w:rPr>
-          <w:rFonts w:ascii="HelveticaNeueLT Pro 55 Roman" w:hAnsi="HelveticaNeueLT Pro 55 Roman"/>
-          <w:sz w:val="18"/>
-        </w:rPr>
-        <w:t xml:space="preserve">k stars)  ·  </w:t>
-      </w:r>
-      <w:r>
-        <w:rPr>
-          <w:rFonts w:ascii="HelveticaNeueLT Pro 55 Roman" w:hAnsi="HelveticaNeueLT Pro 55 Roman"/>
-          <w:bCs/>
-          <w:sz w:val="18"/>
-        </w:rPr>
-        <w:t>TypeScript, JavaScript, Shell, HTML</w:t>
-      </w:r>
-      <w:r>
-        <w:rPr>
-          <w:rFonts w:ascii="HelveticaNeueLT Pro 55 Roman" w:hAnsi="HelveticaNeueLT Pro 55 Roman"/>
-          <w:sz w:val="18"/>
-        </w:rPr>
-        <w:t xml:space="preserve">  ·  </w:t>
-      </w:r>
-      <w:r>
-        <w:rPr>
-          <w:rFonts w:ascii="HelveticaNeueLT Pro 55 Roman" w:hAnsi="HelveticaNeueLT Pro 55 Roman"/>
-          <w:sz w:val="22"/>
-          <w:szCs w:val="22"/>
-        </w:rPr>
-        <w:t>Persistent memory for agents.</w:t>
-      </w:r>
-      <w:r>
-        <w:rPr>
-          <w:rFonts w:ascii="HelveticaNeueLT Pro 55 Roman" w:hAnsi="HelveticaNeueLT Pro 55 Roman"/>
-          <w:sz w:val="18"/>
-        </w:rPr>
-        <w:br/>
-      </w:r>
-      <w:r>
-        <w:rPr>
-          <w:rFonts w:ascii="HelveticaNeueLT Pro 55 Roman" w:hAnsi="HelveticaNeueLT Pro 55 Roman" w:cs="Arial"/>
-          <w:sz w:val="22"/>
-          <w:szCs w:val="20"/>
-        </w:rPr>
-        <w:t>#2</w:t>
-      </w:r>
-      <w:r>
-        <w:rPr>
-          <w:rFonts w:ascii="HelveticaNeueLT Pro 55 Roman" w:hAnsi="HelveticaNeueLT Pro 55 Roman" w:cs="Arial"/>
-          <w:sz w:val="22"/>
-          <w:szCs w:val="20"/>
-        </w:rPr>
-        <w:t xml:space="preserve"> contributor</w:t>
-      </w:r>
-      <w:r>
-        <w:rPr>
-          <w:rFonts w:ascii="HelveticaNeueLT Pro 55 Roman" w:hAnsi="HelveticaNeueLT Pro 55 Roman" w:cs="Arial"/>
-          <w:sz w:val="22"/>
-          <w:szCs w:val="20"/>
-        </w:rPr>
-        <w:t>:</w:t>
-      </w:r>
-      <w:r>
-        <w:rPr>
-          <w:rFonts w:ascii="HelveticaNeueLT Pro 55 Roman" w:hAnsi="HelveticaNeueLT Pro 55 Roman" w:cs="Arial"/>
-          <w:sz w:val="22"/>
-          <w:szCs w:val="20"/>
-        </w:rPr>
-        <w:t xml:space="preserve"> </w:t>
-      </w:r>
-      <w:r>
-        <w:rPr>
-          <w:rFonts w:ascii="HelveticaNeueLT Pro 55 Roman" w:hAnsi="HelveticaNeueLT Pro 55 Roman" w:cs="Arial"/>
-          <w:sz w:val="22"/>
-          <w:szCs w:val="20"/>
-        </w:rPr>
-        <w:t>s</w:t>
-      </w:r>
-      <w:r>
-        <w:rPr>
-          <w:rFonts w:ascii="HelveticaNeueLT Pro 55 Roman" w:hAnsi="HelveticaNeueLT Pro 55 Roman" w:cs="Arial"/>
-          <w:sz w:val="22"/>
-          <w:szCs w:val="20"/>
-        </w:rPr>
-        <w:t xml:space="preserve">pawn storm </w:t>
-      </w:r>
-      <w:r>
-        <w:rPr>
-          <w:rFonts w:ascii="HelveticaNeueLT Pro 55 Roman" w:hAnsi="HelveticaNeueLT Pro 55 Roman" w:cs="Arial"/>
-          <w:sz w:val="22"/>
-          <w:szCs w:val="20"/>
-        </w:rPr>
-        <w:t>defense,</w:t>
-      </w:r>
-      <w:r>
-        <w:rPr>
-          <w:rFonts w:ascii="HelveticaNeueLT Pro 55 Roman" w:hAnsi="HelveticaNeueLT Pro 55 Roman" w:cs="Arial"/>
-          <w:sz w:val="22"/>
-          <w:szCs w:val="20"/>
-        </w:rPr>
-        <w:t xml:space="preserve"> </w:t>
-      </w:r>
-      <w:r>
-        <w:rPr>
-          <w:rFonts w:ascii="HelveticaNeueLT Pro 55 Roman" w:hAnsi="HelveticaNeueLT Pro 55 Roman" w:cs="Arial"/>
-          <w:sz w:val="22"/>
-          <w:szCs w:val="20"/>
-        </w:rPr>
-        <w:t>h</w:t>
-      </w:r>
-      <w:r>
-        <w:rPr>
-          <w:rFonts w:ascii="HelveticaNeueLT Pro 55 Roman" w:hAnsi="HelveticaNeueLT Pro 55 Roman" w:cs="Arial"/>
-          <w:sz w:val="22"/>
-          <w:szCs w:val="20"/>
-        </w:rPr>
-        <w:t xml:space="preserve">ook/worker </w:t>
-      </w:r>
-      <w:r>
-        <w:rPr>
-          <w:rFonts w:ascii="HelveticaNeueLT Pro 55 Roman" w:hAnsi="HelveticaNeueLT Pro 55 Roman" w:cs="Arial"/>
-          <w:sz w:val="22"/>
-          <w:szCs w:val="20"/>
-        </w:rPr>
-        <w:t xml:space="preserve">lifecycle </w:t>
-      </w:r>
-      <w:r>
-        <w:rPr>
-          <w:rFonts w:ascii="HelveticaNeueLT Pro 55 Roman" w:hAnsi="HelveticaNeueLT Pro 55 Roman" w:cs="Arial"/>
-          <w:sz w:val="22"/>
-          <w:szCs w:val="20"/>
-        </w:rPr>
-        <w:t>hardening</w:t>
-      </w:r>
-      <w:r>
-        <w:rPr>
-          <w:rFonts w:ascii="HelveticaNeueLT Pro 55 Roman" w:hAnsi="HelveticaNeueLT Pro 55 Roman" w:cs="Arial"/>
-          <w:sz w:val="22"/>
-          <w:szCs w:val="20"/>
-        </w:rPr>
-        <w:t>,</w:t>
-      </w:r>
-      <w:r>
-        <w:rPr>
-          <w:rFonts w:ascii="HelveticaNeueLT Pro 55 Roman" w:hAnsi="HelveticaNeueLT Pro 55 Roman" w:cs="Arial"/>
-          <w:sz w:val="22"/>
-          <w:szCs w:val="20"/>
-        </w:rPr>
-        <w:t xml:space="preserve"> </w:t>
-      </w:r>
-      <w:r>
-        <w:rPr>
-          <w:rFonts w:ascii="HelveticaNeueLT Pro 55 Roman" w:hAnsi="HelveticaNeueLT Pro 55 Roman" w:cs="Arial"/>
-          <w:sz w:val="22"/>
-          <w:szCs w:val="20"/>
-        </w:rPr>
-        <w:t>daemon</w:t>
-      </w:r>
-      <w:r>
-        <w:rPr>
-          <w:rFonts w:ascii="HelveticaNeueLT Pro 55 Roman" w:hAnsi="HelveticaNeueLT Pro 55 Roman" w:cs="Arial"/>
-          <w:sz w:val="22"/>
-          <w:szCs w:val="20"/>
-        </w:rPr>
-        <w:t xml:space="preserve"> </w:t>
-      </w:r>
-      <w:r>
-        <w:rPr>
-          <w:rFonts w:ascii="HelveticaNeueLT Pro 55 Roman" w:hAnsi="HelveticaNeueLT Pro 55 Roman" w:cs="Arial"/>
-          <w:sz w:val="22"/>
-          <w:szCs w:val="20"/>
-        </w:rPr>
-        <w:t>resilience</w:t>
-      </w:r>
-      <w:r>
-        <w:rPr>
-          <w:rFonts w:ascii="HelveticaNeueLT Pro 55 Roman" w:hAnsi="HelveticaNeueLT Pro 55 Roman" w:cs="Arial"/>
-          <w:sz w:val="22"/>
-          <w:szCs w:val="20"/>
-        </w:rPr>
-        <w:t>.</w:t>
-      </w:r>
-    </w:p>
-    <w:p>
-      <w:pPr>
-        <w:spacing w:line="120" w:lineRule="auto"/>
-        <w:rPr>
-          <w:rFonts w:ascii="HelveticaNeueLT Pro 55 Roman" w:hAnsi="HelveticaNeueLT Pro 55 Roman"/>
-          <w:b/>
-          <w:sz w:val="10"/>
-          <w:szCs w:val="10"/>
-        </w:rPr>
-      </w:pPr>
-    </w:p>
-    <w:p>
-      <w:pPr>
-        <w:spacing w:before="60" w:line="276" w:lineRule="auto"/>
-        <w:rPr>
-          <w:rFonts w:ascii="HelveticaNeueLT Pro 55 Roman" w:hAnsi="HelveticaNeueLT Pro 55 Roman"/>
-          <w:sz w:val="22"/>
-          <w:szCs w:val="22"/>
-        </w:rPr>
-      </w:pPr>
-      <w:r>
-        <w:rPr>
-          <w:rFonts w:ascii="HelveticaNeueLT Pro 55 Roman" w:hAnsi="HelveticaNeueLT Pro 55 Roman"/>
-          <w:b/>
-          <w:sz w:val="22"/>
-        </w:rPr>
-        <w:t>nesquena/</w:t>
-      </w:r>
-      <w:r>
-        <w:rPr>
-          <w:rFonts w:ascii="HelveticaNeueLT Pro 55 Roman" w:hAnsi="HelveticaNeueLT Pro 55 Roman"/>
-          <w:b/>
-          <w:sz w:val="22"/>
-        </w:rPr>
-        <w:t>hermes-webui</w:t>
-      </w:r>
-      <w:r>
-        <w:rPr>
-          <w:rFonts w:ascii="HelveticaNeueLT Pro 55 Roman" w:hAnsi="HelveticaNeueLT Pro 55 Roman"/>
-          <w:sz w:val="18"/>
-        </w:rPr>
-        <w:t xml:space="preserve">  </w:t>
-      </w:r>
-      <w:r>
-        <w:rPr>
-          <w:rFonts w:ascii="HelveticaNeueLT Pro 55 Roman" w:hAnsi="HelveticaNeueLT Pro 55 Roman"/>
-          <w:sz w:val="18"/>
-        </w:rPr>
-        <w:t>(1</w:t>
-      </w:r>
-      <w:r>
-        <w:rPr>
-          <w:rFonts w:ascii="HelveticaNeueLT Pro 55 Roman" w:hAnsi="HelveticaNeueLT Pro 55 Roman"/>
-          <w:sz w:val="18"/>
-        </w:rPr>
-        <w:t>6</w:t>
-      </w:r>
-      <w:r>
-        <w:rPr>
-          <w:rFonts w:ascii="HelveticaNeueLT Pro 55 Roman" w:hAnsi="HelveticaNeueLT Pro 55 Roman"/>
-          <w:sz w:val="18"/>
-        </w:rPr>
-        <w:t xml:space="preserve">k stars)  </w:t>
-      </w:r>
-      <w:r>
-        <w:rPr>
-          <w:rFonts w:ascii="HelveticaNeueLT Pro 55 Roman" w:hAnsi="HelveticaNeueLT Pro 55 Roman"/>
-          <w:sz w:val="18"/>
-        </w:rPr>
-        <w:t xml:space="preserve">·  </w:t>
-      </w:r>
-      <w:r>
-        <w:rPr>
-          <w:rFonts w:ascii="HelveticaNeueLT Pro 55 Roman" w:hAnsi="HelveticaNeueLT Pro 55 Roman"/>
-          <w:bCs/>
-          <w:sz w:val="18"/>
-        </w:rPr>
-        <w:t>Python, JavaScript, CSS, HTML, Shell</w:t>
-      </w:r>
-      <w:r>
-        <w:rPr>
-          <w:rFonts w:ascii="HelveticaNeueLT Pro 55 Roman" w:hAnsi="HelveticaNeueLT Pro 55 Roman"/>
-          <w:sz w:val="18"/>
-        </w:rPr>
-        <w:t xml:space="preserve">  ·  </w:t>
-      </w:r>
-      <w:r>
-        <w:rPr>
-          <w:rFonts w:ascii="HelveticaNeueLT Pro 55 Roman" w:hAnsi="HelveticaNeueLT Pro 55 Roman"/>
-          <w:sz w:val="22"/>
-          <w:szCs w:val="22"/>
-        </w:rPr>
-        <w:t>W</w:t>
-      </w:r>
-      <w:r>
-        <w:rPr>
-          <w:rFonts w:ascii="HelveticaNeueLT Pro 55 Roman" w:hAnsi="HelveticaNeueLT Pro 55 Roman"/>
-          <w:sz w:val="22"/>
-          <w:szCs w:val="22"/>
-        </w:rPr>
-        <w:t>eb UI for Hermes Agent.</w:t>
-      </w:r>
-      <w:r>
-        <w:rPr>
-          <w:rFonts w:ascii="HelveticaNeueLT Pro 55 Roman" w:hAnsi="HelveticaNeueLT Pro 55 Roman"/>
-          <w:sz w:val="22"/>
-          <w:szCs w:val="22"/>
-        </w:rPr>
-        <w:br/>
-      </w:r>
-      <w:r>
-        <w:rPr>
-          <w:rFonts w:ascii="HelveticaNeueLT Pro 55 Roman" w:hAnsi="HelveticaNeueLT Pro 55 Roman"/>
-          <w:sz w:val="22"/>
-          <w:szCs w:val="22"/>
-        </w:rPr>
-        <w:t>Core</w:t>
-      </w:r>
-      <w:r>
-        <w:rPr>
-          <w:rFonts w:ascii="HelveticaNeueLT Pro 55 Roman" w:hAnsi="HelveticaNeueLT Pro 55 Roman"/>
-          <w:sz w:val="22"/>
-          <w:szCs w:val="22"/>
-        </w:rPr>
-        <w:t xml:space="preserve"> contributor: </w:t>
-      </w:r>
-      <w:r>
-        <w:rPr>
-          <w:rFonts w:ascii="HelveticaNeueLT Pro 55 Roman" w:hAnsi="HelveticaNeueLT Pro 55 Roman"/>
-          <w:sz w:val="22"/>
-          <w:szCs w:val="22"/>
-        </w:rPr>
-        <w:t xml:space="preserve">UX/UI, </w:t>
-      </w:r>
-      <w:r>
-        <w:rPr>
-          <w:rFonts w:ascii="HelveticaNeueLT Pro 55 Roman" w:hAnsi="HelveticaNeueLT Pro 55 Roman"/>
-          <w:sz w:val="22"/>
-          <w:szCs w:val="22"/>
-        </w:rPr>
-        <w:t xml:space="preserve">turn routing, </w:t>
-      </w:r>
-      <w:r>
-        <w:rPr>
-          <w:rFonts w:ascii="HelveticaNeueLT Pro 55 Roman" w:hAnsi="HelveticaNeueLT Pro 55 Roman"/>
-          <w:sz w:val="22"/>
-          <w:szCs w:val="22"/>
-        </w:rPr>
-        <w:t>g</w:t>
-      </w:r>
-      <w:r>
-        <w:rPr>
-          <w:rFonts w:ascii="HelveticaNeueLT Pro 55 Roman" w:hAnsi="HelveticaNeueLT Pro 55 Roman"/>
-          <w:sz w:val="22"/>
-          <w:szCs w:val="22"/>
-        </w:rPr>
-        <w:t xml:space="preserve">ateway </w:t>
-      </w:r>
-      <w:r>
-        <w:rPr>
-          <w:rFonts w:ascii="HelveticaNeueLT Pro 55 Roman" w:hAnsi="HelveticaNeueLT Pro 55 Roman"/>
-          <w:sz w:val="22"/>
-          <w:szCs w:val="22"/>
-        </w:rPr>
-        <w:t>credentials</w:t>
-      </w:r>
-      <w:r>
-        <w:rPr>
-          <w:rFonts w:ascii="HelveticaNeueLT Pro 55 Roman" w:hAnsi="HelveticaNeueLT Pro 55 Roman"/>
-          <w:sz w:val="22"/>
-          <w:szCs w:val="22"/>
-        </w:rPr>
-        <w:t xml:space="preserve">, session lifecycle, </w:t>
-      </w:r>
-      <w:r>
-        <w:rPr>
-          <w:rFonts w:ascii="HelveticaNeueLT Pro 55 Roman" w:hAnsi="HelveticaNeueLT Pro 55 Roman"/>
-          <w:sz w:val="22"/>
-          <w:szCs w:val="22"/>
-        </w:rPr>
-        <w:t>s</w:t>
-      </w:r>
-      <w:r>
-        <w:rPr>
-          <w:rFonts w:ascii="HelveticaNeueLT Pro 55 Roman" w:hAnsi="HelveticaNeueLT Pro 55 Roman"/>
-          <w:sz w:val="22"/>
-          <w:szCs w:val="22"/>
-        </w:rPr>
-        <w:t>ecurity,</w:t>
-      </w:r>
-      <w:r>
-        <w:rPr>
-          <w:rFonts w:ascii="HelveticaNeueLT Pro 55 Roman" w:hAnsi="HelveticaNeueLT Pro 55 Roman"/>
-          <w:sz w:val="22"/>
-          <w:szCs w:val="22"/>
-        </w:rPr>
-        <w:t xml:space="preserve"> </w:t>
-      </w:r>
-      <w:r>
-        <w:rPr>
-          <w:rFonts w:ascii="HelveticaNeueLT Pro 55 Roman" w:hAnsi="HelveticaNeueLT Pro 55 Roman"/>
-          <w:sz w:val="22"/>
-          <w:szCs w:val="22"/>
-        </w:rPr>
-        <w:t>cost analytics</w:t>
-      </w:r>
-      <w:r>
-        <w:rPr>
-          <w:rFonts w:ascii="HelveticaNeueLT Pro 55 Roman" w:hAnsi="HelveticaNeueLT Pro 55 Roman"/>
-          <w:sz w:val="22"/>
-          <w:szCs w:val="22"/>
-        </w:rPr>
-        <w:t>.</w:t>
-      </w:r>
-    </w:p>
-    <w:p>
-      <w:pPr>
-        <w:spacing w:line="120" w:lineRule="auto"/>
-        <w:rPr>
-          <w:rFonts w:ascii="HelveticaNeueLT Pro 55 Roman" w:hAnsi="HelveticaNeueLT Pro 55 Roman"/>
-          <w:b/>
-          <w:sz w:val="10"/>
-          <w:szCs w:val="10"/>
-        </w:rPr>
-      </w:pPr>
-    </w:p>
-    <w:p>
-      <w:pPr>
-        <w:spacing w:before="60" w:line="276" w:lineRule="auto"/>
-        <w:rPr>
-          <w:rFonts w:ascii="HelveticaNeueLT Pro 55 Roman" w:hAnsi="HelveticaNeueLT Pro 55 Roman"/>
-          <w:sz w:val="22"/>
-          <w:szCs w:val="22"/>
-        </w:rPr>
-      </w:pPr>
-      <w:r>
-        <w:rPr>
-          <w:rFonts w:ascii="HelveticaNeueLT Pro 55 Roman" w:hAnsi="HelveticaNeueLT Pro 55 Roman"/>
-          <w:b/>
-          <w:sz w:val="22"/>
-        </w:rPr>
-        <w:t>kenn-io/</w:t>
-      </w:r>
-      <w:r>
-        <w:rPr>
-          <w:rFonts w:ascii="HelveticaNeueLT Pro 55 Roman" w:hAnsi="HelveticaNeueLT Pro 55 Roman"/>
-          <w:b/>
-          <w:sz w:val="22"/>
-        </w:rPr>
-        <w:t>agentsview</w:t>
-      </w:r>
-      <w:r>
-        <w:rPr>
-          <w:rFonts w:ascii="HelveticaNeueLT Pro 55 Roman" w:hAnsi="HelveticaNeueLT Pro 55 Roman"/>
-          <w:sz w:val="18"/>
-        </w:rPr>
-        <w:t xml:space="preserve"> </w:t>
-      </w:r>
-      <w:r>
-        <w:rPr>
-          <w:rFonts w:ascii="HelveticaNeueLT Pro 55 Roman" w:hAnsi="HelveticaNeueLT Pro 55 Roman"/>
-          <w:sz w:val="18"/>
-        </w:rPr>
-        <w:t xml:space="preserve"> (</w:t>
-      </w:r>
-      <w:r>
-        <w:rPr>
-          <w:rFonts w:ascii="HelveticaNeueLT Pro 55 Roman" w:hAnsi="HelveticaNeueLT Pro 55 Roman"/>
-          <w:sz w:val="18"/>
-        </w:rPr>
-        <w:t>4</w:t>
-      </w:r>
-      <w:r>
-        <w:rPr>
-          <w:rFonts w:ascii="HelveticaNeueLT Pro 55 Roman" w:hAnsi="HelveticaNeueLT Pro 55 Roman"/>
-          <w:sz w:val="18"/>
-        </w:rPr>
-        <w:t xml:space="preserve">k stars)  </w:t>
-      </w:r>
-      <w:r>
-        <w:rPr>
-          <w:rFonts w:ascii="HelveticaNeueLT Pro 55 Roman" w:hAnsi="HelveticaNeueLT Pro 55 Roman"/>
-          <w:sz w:val="18"/>
-        </w:rPr>
-        <w:t xml:space="preserve">·  </w:t>
-      </w:r>
-      <w:r>
-        <w:rPr>
-          <w:rFonts w:ascii="HelveticaNeueLT Pro 55 Roman" w:hAnsi="HelveticaNeueLT Pro 55 Roman"/>
-          <w:bCs/>
-          <w:sz w:val="18"/>
-        </w:rPr>
-        <w:t>Go, TypeScript, Svelte, Rust, Shell</w:t>
-      </w:r>
-      <w:r>
-        <w:rPr>
-          <w:rFonts w:ascii="HelveticaNeueLT Pro 55 Roman" w:hAnsi="HelveticaNeueLT Pro 55 Roman"/>
-          <w:sz w:val="18"/>
-        </w:rPr>
-        <w:t xml:space="preserve">  ·  </w:t>
-      </w:r>
-      <w:r>
-        <w:rPr>
-          <w:rFonts w:ascii="HelveticaNeueLT Pro 55 Roman" w:hAnsi="HelveticaNeueLT Pro 55 Roman"/>
-          <w:sz w:val="22"/>
-          <w:szCs w:val="22"/>
-        </w:rPr>
-        <w:t>Session analytics for coding agents.</w:t>
-      </w:r>
-    </w:p>
-    <w:p>
-      <w:pPr>
-        <w:spacing w:line="264" w:lineRule="auto"/>
-        <w:rPr>
-          <w:rFonts w:ascii="HelveticaNeueLT Pro 55 Roman" w:hAnsi="HelveticaNeueLT Pro 55 Roman" w:cs="Arial"/>
-          <w:sz w:val="22"/>
-          <w:szCs w:val="22"/>
-        </w:rPr>
-      </w:pPr>
-      <w:r>
-        <w:rPr>
-          <w:rFonts w:ascii="HelveticaNeueLT Pro 55 Roman" w:hAnsi="HelveticaNeueLT Pro 55 Roman" w:cs="Arial"/>
-          <w:sz w:val="22"/>
-          <w:szCs w:val="20"/>
-        </w:rPr>
-        <w:t>Top</w:t>
-      </w:r>
-      <w:r>
-        <w:rPr>
-          <w:rFonts w:ascii="HelveticaNeueLT Pro 55 Roman" w:hAnsi="HelveticaNeueLT Pro 55 Roman" w:cs="Arial"/>
-          <w:sz w:val="22"/>
-          <w:szCs w:val="20"/>
-        </w:rPr>
-        <w:t xml:space="preserve"> third-party</w:t>
-      </w:r>
-      <w:r>
-        <w:rPr>
-          <w:rFonts w:ascii="HelveticaNeueLT Pro 55 Roman" w:hAnsi="HelveticaNeueLT Pro 55 Roman" w:cs="Arial"/>
-          <w:sz w:val="22"/>
-          <w:szCs w:val="20"/>
-        </w:rPr>
-        <w:t xml:space="preserve"> contributor: </w:t>
-      </w:r>
-      <w:r>
-        <w:rPr>
-          <w:rFonts w:ascii="HelveticaNeueLT Pro 55 Roman" w:hAnsi="HelveticaNeueLT Pro 55 Roman" w:cs="Arial"/>
-          <w:sz w:val="22"/>
-          <w:szCs w:val="20"/>
-        </w:rPr>
-        <w:t xml:space="preserve">Postgres sync safety, orphan session recovery, </w:t>
-      </w:r>
-      <w:r>
-        <w:rPr>
-          <w:rFonts w:ascii="HelveticaNeueLT Pro 55 Roman" w:hAnsi="HelveticaNeueLT Pro 55 Roman" w:cs="Arial"/>
-          <w:sz w:val="22"/>
-          <w:szCs w:val="20"/>
-        </w:rPr>
-        <w:t>Reasonix</w:t>
-      </w:r>
-      <w:r>
-        <w:rPr>
-          <w:rFonts w:ascii="HelveticaNeueLT Pro 55 Roman" w:hAnsi="HelveticaNeueLT Pro 55 Roman" w:cs="Arial"/>
-          <w:sz w:val="22"/>
-          <w:szCs w:val="20"/>
-        </w:rPr>
-        <w:t xml:space="preserve"> </w:t>
-      </w:r>
-      <w:r>
-        <w:rPr>
-          <w:rFonts w:ascii="HelveticaNeueLT Pro 55 Roman" w:hAnsi="HelveticaNeueLT Pro 55 Roman" w:cs="Arial"/>
-          <w:sz w:val="22"/>
-          <w:szCs w:val="20"/>
-        </w:rPr>
-        <w:t>parser support.</w:t>
-      </w:r>
-    </w:p>
-    <w:p>
-      <w:pPr>
-        <w:spacing w:line="120" w:lineRule="auto"/>
-        <w:rPr>
-          <w:rFonts w:ascii="HelveticaNeueLT Pro 55 Roman" w:hAnsi="HelveticaNeueLT Pro 55 Roman"/>
-          <w:b/>
-          <w:sz w:val="10"/>
-          <w:szCs w:val="10"/>
-        </w:rPr>
-      </w:pPr>
-    </w:p>
-    <w:p>
-      <w:pPr>
-        <w:spacing w:before="60" w:line="276" w:lineRule="auto"/>
-        <w:rPr>
-          <w:rFonts w:ascii="HelveticaNeueLT Pro 55 Roman" w:hAnsi="HelveticaNeueLT Pro 55 Roman"/>
-          <w:sz w:val="22"/>
-          <w:szCs w:val="22"/>
-        </w:rPr>
-      </w:pPr>
-      <w:r>
-        <w:rPr>
-          <w:rFonts w:ascii="HelveticaNeueLT Pro 55 Roman" w:hAnsi="HelveticaNeueLT Pro 55 Roman"/>
-          <w:b/>
-          <w:sz w:val="22"/>
-        </w:rPr>
-        <w:t>headroomlabs-ai/headroom</w:t>
-      </w:r>
-      <w:r>
-        <w:rPr>
-          <w:rFonts w:ascii="HelveticaNeueLT Pro 55 Roman" w:hAnsi="HelveticaNeueLT Pro 55 Roman"/>
-          <w:sz w:val="18"/>
-        </w:rPr>
-        <w:t xml:space="preserve"> (5</w:t>
-      </w:r>
-      <w:r>
-        <w:rPr>
-          <w:rFonts w:ascii="HelveticaNeueLT Pro 55 Roman" w:hAnsi="HelveticaNeueLT Pro 55 Roman"/>
-          <w:sz w:val="18"/>
-        </w:rPr>
-        <w:t>8</w:t>
-      </w:r>
-      <w:r>
-        <w:rPr>
-          <w:rFonts w:ascii="HelveticaNeueLT Pro 55 Roman" w:hAnsi="HelveticaNeueLT Pro 55 Roman"/>
-          <w:sz w:val="18"/>
-        </w:rPr>
-        <w:t xml:space="preserve">k stars)  ·  </w:t>
-      </w:r>
-      <w:r>
-        <w:rPr>
-          <w:rFonts w:ascii="HelveticaNeueLT Pro 55 Roman" w:hAnsi="HelveticaNeueLT Pro 55 Roman"/>
-          <w:bCs/>
-          <w:sz w:val="18"/>
-        </w:rPr>
-        <w:t>Go, TypeScript, Svelte, Rust</w:t>
-      </w:r>
-      <w:r>
-        <w:rPr>
-          <w:rFonts w:ascii="HelveticaNeueLT Pro 55 Roman" w:hAnsi="HelveticaNeueLT Pro 55 Roman"/>
-          <w:sz w:val="18"/>
-        </w:rPr>
-        <w:t xml:space="preserve">  ·  </w:t>
-      </w:r>
-      <w:r>
-        <w:rPr>
-          <w:rFonts w:ascii="HelveticaNeueLT Pro 55 Roman" w:hAnsi="HelveticaNeueLT Pro 55 Roman"/>
-          <w:sz w:val="22"/>
-          <w:szCs w:val="22"/>
-        </w:rPr>
-        <w:t>To</w:t>
-      </w:r>
-      <w:r>
-        <w:rPr>
-          <w:rFonts w:ascii="HelveticaNeueLT Pro 55 Roman" w:hAnsi="HelveticaNeueLT Pro 55 Roman"/>
-          <w:sz w:val="22"/>
-          <w:szCs w:val="22"/>
-        </w:rPr>
-        <w:t xml:space="preserve">ken compression proxy for LLMs. </w:t>
-      </w:r>
-      <w:r>
-        <w:rPr>
-          <w:rFonts w:ascii="HelveticaNeueLT Pro 55 Roman" w:hAnsi="HelveticaNeueLT Pro 55 Roman"/>
-          <w:sz w:val="22"/>
-          <w:szCs w:val="22"/>
-        </w:rPr>
-        <w:t>Top</w:t>
-      </w:r>
-      <w:r>
-        <w:rPr>
-          <w:rFonts w:ascii="HelveticaNeueLT Pro 55 Roman" w:hAnsi="HelveticaNeueLT Pro 55 Roman"/>
-          <w:sz w:val="22"/>
-          <w:szCs w:val="22"/>
-        </w:rPr>
-        <w:t xml:space="preserve"> </w:t>
-      </w:r>
-      <w:r>
-        <w:rPr>
-          <w:rFonts w:ascii="HelveticaNeueLT Pro 55 Roman" w:hAnsi="HelveticaNeueLT Pro 55 Roman"/>
-          <w:sz w:val="22"/>
-          <w:szCs w:val="22"/>
-        </w:rPr>
-        <w:t xml:space="preserve">third-party </w:t>
-      </w:r>
-      <w:r>
-        <w:rPr>
-          <w:rFonts w:ascii="HelveticaNeueLT Pro 55 Roman" w:hAnsi="HelveticaNeueLT Pro 55 Roman"/>
-          <w:sz w:val="22"/>
-          <w:szCs w:val="22"/>
-        </w:rPr>
-        <w:t>contributor</w:t>
-      </w:r>
-      <w:r>
-        <w:rPr>
-          <w:rFonts w:ascii="HelveticaNeueLT Pro 55 Roman" w:hAnsi="HelveticaNeueLT Pro 55 Roman"/>
-          <w:sz w:val="22"/>
-          <w:szCs w:val="22"/>
-        </w:rPr>
-        <w:t>: cache stability, compression-safe tool</w:t>
-      </w:r>
-      <w:r>
-        <w:rPr>
-          <w:rFonts w:ascii="HelveticaNeueLT Pro 55 Roman" w:hAnsi="HelveticaNeueLT Pro 55 Roman"/>
-          <w:sz w:val="22"/>
-          <w:szCs w:val="22"/>
-        </w:rPr>
-        <w:t xml:space="preserve"> call</w:t>
-      </w:r>
-      <w:r>
-        <w:rPr>
-          <w:rFonts w:ascii="HelveticaNeueLT Pro 55 Roman" w:hAnsi="HelveticaNeueLT Pro 55 Roman"/>
-          <w:sz w:val="22"/>
-          <w:szCs w:val="22"/>
-        </w:rPr>
-        <w:t>s</w:t>
-      </w:r>
-      <w:r>
-        <w:rPr>
-          <w:rFonts w:ascii="HelveticaNeueLT Pro 55 Roman" w:hAnsi="HelveticaNeueLT Pro 55 Roman"/>
-          <w:sz w:val="22"/>
-          <w:szCs w:val="22"/>
-        </w:rPr>
-        <w:t>, session fidelity.</w:t>
-      </w:r>
-    </w:p>
-    <w:p>
-      <w:pPr>
-        <w:spacing w:line="264" w:lineRule="auto"/>
-        <w:rPr>
-          <w:rFonts w:ascii="HelveticaNeueLT Pro 55 Roman" w:hAnsi="HelveticaNeueLT Pro 55 Roman" w:cs="Arial"/>
         </w:rPr>
       </w:pPr>
     </w:p>
@@ -3939,7 +3280,7 @@
     <w:p/>
     <w:sectPr>
       <w:pgSz w:w="12240" w:h="15840" w:code="1"/>
-      <w:pgMar w:top="1152" w:right="1152" w:bottom="720" w:left="994" w:header="720" w:footer="720" w:gutter="0"/>
+      <w:pgMar w:top="1296" w:right="1152" w:bottom="720" w:left="994" w:header="720" w:footer="720" w:gutter="0"/>
       <w:cols w:space="720"/>
       <w:docGrid w:linePitch="360"/>
     </w:sectPr>
@@ -4128,9 +3469,125 @@
     </w:lvl>
   </w:abstractNum>
   <w:abstractNum w:abstractNumId="1" w15:restartNumberingAfterBreak="0">
+    <w:nsid w:val="272023CC"/>
+    <w:multiLevelType w:val="hybridMultilevel"/>
+    <w:tmpl w:val="EFBCAEE6"/>
+    <w:lvl w:ilvl="0" w:tplc="15388B4C">
+      <w:start w:val="1"/>
+      <w:numFmt w:val="bullet"/>
+      <w:lvlText w:val="•"/>
+      <w:lvlJc w:val="left"/>
+      <w:pPr>
+        <w:tabs>
+          <w:tab w:val="num" w:pos="576"/>
+        </w:tabs>
+        <w:ind w:left="576" w:hanging="288"/>
+      </w:pPr>
+      <w:rPr>
+        <w:rFonts w:ascii="Arial" w:hAnsi="Arial" w:hint="default"/>
+      </w:rPr>
+    </w:lvl>
+    <w:lvl w:ilvl="1" w:tplc="04090003" w:tentative="1">
+      <w:start w:val="1"/>
+      <w:numFmt w:val="bullet"/>
+      <w:lvlText w:val="o"/>
+      <w:lvlJc w:val="left"/>
+      <w:pPr>
+        <w:ind w:left="1728" w:hanging="360"/>
+      </w:pPr>
+      <w:rPr>
+        <w:rFonts w:ascii="Courier New" w:hAnsi="Courier New" w:cs="Courier New" w:hint="default"/>
+      </w:rPr>
+    </w:lvl>
+    <w:lvl w:ilvl="2" w:tplc="04090005" w:tentative="1">
+      <w:start w:val="1"/>
+      <w:numFmt w:val="bullet"/>
+      <w:lvlText w:val=""/>
+      <w:lvlJc w:val="left"/>
+      <w:pPr>
+        <w:ind w:left="2448" w:hanging="360"/>
+      </w:pPr>
+      <w:rPr>
+        <w:rFonts w:ascii="Wingdings" w:hAnsi="Wingdings" w:hint="default"/>
+      </w:rPr>
+    </w:lvl>
+    <w:lvl w:ilvl="3" w:tplc="04090001" w:tentative="1">
+      <w:start w:val="1"/>
+      <w:numFmt w:val="bullet"/>
+      <w:lvlText w:val=""/>
+      <w:lvlJc w:val="left"/>
+      <w:pPr>
+        <w:ind w:left="3168" w:hanging="360"/>
+      </w:pPr>
+      <w:rPr>
+        <w:rFonts w:ascii="Symbol" w:hAnsi="Symbol" w:hint="default"/>
+      </w:rPr>
+    </w:lvl>
+    <w:lvl w:ilvl="4" w:tplc="04090003" w:tentative="1">
+      <w:start w:val="1"/>
+      <w:numFmt w:val="bullet"/>
+      <w:lvlText w:val="o"/>
+      <w:lvlJc w:val="left"/>
+      <w:pPr>
+        <w:ind w:left="3888" w:hanging="360"/>
+      </w:pPr>
+      <w:rPr>
+        <w:rFonts w:ascii="Courier New" w:hAnsi="Courier New" w:cs="Courier New" w:hint="default"/>
+      </w:rPr>
+    </w:lvl>
+    <w:lvl w:ilvl="5" w:tplc="04090005" w:tentative="1">
+      <w:start w:val="1"/>
+      <w:numFmt w:val="bullet"/>
+      <w:lvlText w:val=""/>
+      <w:lvlJc w:val="left"/>
+      <w:pPr>
+        <w:ind w:left="4608" w:hanging="360"/>
+      </w:pPr>
+      <w:rPr>
+        <w:rFonts w:ascii="Wingdings" w:hAnsi="Wingdings" w:hint="default"/>
+      </w:rPr>
+    </w:lvl>
+    <w:lvl w:ilvl="6" w:tplc="04090001" w:tentative="1">
+      <w:start w:val="1"/>
+      <w:numFmt w:val="bullet"/>
+      <w:lvlText w:val=""/>
+      <w:lvlJc w:val="left"/>
+      <w:pPr>
+        <w:ind w:left="5328" w:hanging="360"/>
+      </w:pPr>
+      <w:rPr>
+        <w:rFonts w:ascii="Symbol" w:hAnsi="Symbol" w:hint="default"/>
+      </w:rPr>
+    </w:lvl>
+    <w:lvl w:ilvl="7" w:tplc="04090003" w:tentative="1">
+      <w:start w:val="1"/>
+      <w:numFmt w:val="bullet"/>
+      <w:lvlText w:val="o"/>
+      <w:lvlJc w:val="left"/>
+      <w:pPr>
+        <w:ind w:left="6048" w:hanging="360"/>
+      </w:pPr>
+      <w:rPr>
+        <w:rFonts w:ascii="Courier New" w:hAnsi="Courier New" w:cs="Courier New" w:hint="default"/>
+      </w:rPr>
+    </w:lvl>
+    <w:lvl w:ilvl="8" w:tplc="04090005" w:tentative="1">
+      <w:start w:val="1"/>
+      <w:numFmt w:val="bullet"/>
+      <w:lvlText w:val=""/>
+      <w:lvlJc w:val="left"/>
+      <w:pPr>
+        <w:ind w:left="6768" w:hanging="360"/>
+      </w:pPr>
+      <w:rPr>
+        <w:rFonts w:ascii="Wingdings" w:hAnsi="Wingdings" w:hint="default"/>
+      </w:rPr>
+    </w:lvl>
+  </w:abstractNum>
+  <w:abstractNum w:abstractNumId="2" w15:restartNumberingAfterBreak="0">
     <w:nsid w:val="2CCA71DA"/>
     <w:multiLevelType w:val="hybridMultilevel"/>
-    <w:tmpl w:val="4FBC6056"/>
+    <w:tmpl w:val="910E4FCA"/>
     <w:lvl w:ilvl="0" w:tplc="15388B4C">
       <w:start w:val="1"/>
       <w:numFmt w:val="bullet"/>
@@ -4161,7 +3618,7 @@
         <w:rFonts w:ascii="Courier New" w:hAnsi="Courier New" w:cs="Courier New" w:hint="default"/>
       </w:rPr>
     </w:lvl>
-    <w:lvl w:ilvl="2" w:tplc="04090005" w:tentative="1">
+    <w:lvl w:ilvl="2" w:tplc="04090005">
       <w:start w:val="1"/>
       <w:numFmt w:val="bullet"/>
       <w:lvlText w:val=""/>
@@ -4267,7 +3724,7 @@
       </w:rPr>
     </w:lvl>
   </w:abstractNum>
-  <w:abstractNum w:abstractNumId="2" w15:restartNumberingAfterBreak="0">
+  <w:abstractNum w:abstractNumId="3" w15:restartNumberingAfterBreak="0">
     <w:nsid w:val="483A2AB0"/>
     <w:multiLevelType w:val="hybridMultilevel"/>
     <w:tmpl w:val="0F5804BA"/>
@@ -4407,7 +3864,7 @@
       </w:rPr>
     </w:lvl>
   </w:abstractNum>
-  <w:abstractNum w:abstractNumId="3" w15:restartNumberingAfterBreak="0">
+  <w:abstractNum w:abstractNumId="4" w15:restartNumberingAfterBreak="0">
     <w:nsid w:val="50A760DA"/>
     <w:multiLevelType w:val="hybridMultilevel"/>
     <w:tmpl w:val="AA2601DC"/>
@@ -4547,7 +4004,7 @@
       </w:rPr>
     </w:lvl>
   </w:abstractNum>
-  <w:abstractNum w:abstractNumId="4" w15:restartNumberingAfterBreak="0">
+  <w:abstractNum w:abstractNumId="5" w15:restartNumberingAfterBreak="0">
     <w:nsid w:val="6A743133"/>
     <w:multiLevelType w:val="hybridMultilevel"/>
     <w:tmpl w:val="63369B64"/>
@@ -4661,19 +4118,22 @@
     </w:lvl>
   </w:abstractNum>
   <w:num w:numId="1" w16cid:durableId="1579362751">
-    <w:abstractNumId w:val="1"/>
+    <w:abstractNumId w:val="2"/>
   </w:num>
   <w:num w:numId="2" w16cid:durableId="898441863">
-    <w:abstractNumId w:val="2"/>
+    <w:abstractNumId w:val="3"/>
   </w:num>
   <w:num w:numId="3" w16cid:durableId="1339230515">
-    <w:abstractNumId w:val="3"/>
+    <w:abstractNumId w:val="4"/>
   </w:num>
   <w:num w:numId="4" w16cid:durableId="444155564">
     <w:abstractNumId w:val="0"/>
   </w:num>
   <w:num w:numId="5" w16cid:durableId="1716853494">
-    <w:abstractNumId w:val="4"/>
+    <w:abstractNumId w:val="5"/>
+  </w:num>
+  <w:num w:numId="6" w16cid:durableId="1376782323">
+    <w:abstractNumId w:val="1"/>
   </w:num>
 </w:numbering>
 </file>
@@ -4973,7 +4433,7 @@
   <w:style w:type="paragraph" w:default="1" w:styleId="Normal">
     <w:name w:val="Normal"/>
     <w:qFormat/>
-    <w:rsid w:val="00F6590A"/>
+    <w:rsid w:val="00ED3B66"/>
     <w:rPr>
       <w:sz w:val="24"/>
       <w:szCs w:val="24"/>

</xml_diff>

<commit_message>
Give a lone leaderboard the whole row instead of half of one
</commit_message>
<xml_diff>
--- a/resume.docx
+++ b/resume.docx
@@ -64,7 +64,7 @@
                 <w:szCs w:val="32"/>
               </w:rPr>
               <w:pict w14:anchorId="39A1D4B1">
-                <v:group id="_x0000_s3105" editas="canvas" style="position:absolute;margin-left:-5pt;margin-top:2.05pt;width:41.4pt;height:11.4pt;z-index:251659264" coordorigin="-100,541" coordsize="828,228">
+                <v:group id="_x0000_s3105" editas="canvas" style="position:absolute;margin-left:-5pt;margin-top:2.05pt;width:41.4pt;height:11.4pt;z-index:1" coordorigin="-100,541" coordsize="828,228">
                   <o:lock v:ext="edit" aspectratio="t"/>
                   <v:shapetype id="_x0000_t75" coordsize="21600,21600" o:spt="75" o:preferrelative="t" path="m@4@5l@4@11@9@11@9@5xe" filled="f" stroked="f">
                     <v:stroke joinstyle="miter"/>
@@ -587,31 +587,23 @@
                 <w:sz w:val="22"/>
                 <w:szCs w:val="20"/>
               </w:rPr>
-              <w:t>60</w:t>
-            </w:r>
-            <w:r>
-              <w:rPr>
-                <w:rFonts w:ascii="HelveticaNeueLT Pro 55 Roman" w:hAnsi="HelveticaNeueLT Pro 55 Roman" w:cs="Arial"/>
-                <w:sz w:val="22"/>
-                <w:szCs w:val="20"/>
-              </w:rPr>
-              <w:t>0</w:t>
-            </w:r>
-            <w:r>
-              <w:rPr>
-                <w:rFonts w:ascii="HelveticaNeueLT Pro 55 Roman" w:hAnsi="HelveticaNeueLT Pro 55 Roman" w:cs="Arial"/>
-                <w:sz w:val="22"/>
-                <w:szCs w:val="20"/>
-              </w:rPr>
-              <w:t>+</w:t>
-            </w:r>
-            <w:r>
-              <w:rPr>
-                <w:rFonts w:ascii="HelveticaNeueLT Pro 55 Roman" w:hAnsi="HelveticaNeueLT Pro 55 Roman" w:cs="Arial"/>
-                <w:sz w:val="22"/>
-                <w:szCs w:val="20"/>
-              </w:rPr>
-              <w:t xml:space="preserve"> merged PRs across </w:t>
+              <w:t>6</w:t>
+            </w:r>
+            <w:r>
+              <w:rPr>
+                <w:rFonts w:ascii="HelveticaNeueLT Pro 55 Roman" w:hAnsi="HelveticaNeueLT Pro 55 Roman" w:cs="Arial"/>
+                <w:sz w:val="22"/>
+                <w:szCs w:val="20"/>
+              </w:rPr>
+              <w:t>5</w:t>
+            </w:r>
+            <w:r>
+              <w:rPr>
+                <w:rFonts w:ascii="HelveticaNeueLT Pro 55 Roman" w:hAnsi="HelveticaNeueLT Pro 55 Roman" w:cs="Arial"/>
+                <w:sz w:val="22"/>
+                <w:szCs w:val="20"/>
+              </w:rPr>
+              <w:t xml:space="preserve">0 merged PRs across </w:t>
             </w:r>
             <w:r>
               <w:rPr>
@@ -978,17 +970,29 @@
               </w:rPr>
               <w:t>(</w:t>
             </w:r>
-            <w:hyperlink r:id="rId13" w:history="1">
-              <w:r>
-                <w:rPr>
-                  <w:rStyle w:val="Hyperlink"/>
-                  <w:rFonts w:ascii="HelveticaNeueLT Pro 55 Roman" w:hAnsi="HelveticaNeueLT Pro 55 Roman" w:cs="Arial"/>
-                  <w:color w:val="auto"/>
-                  <w:u w:val="none"/>
-                </w:rPr>
-                <w:t>basedin.nyc</w:t>
-              </w:r>
-            </w:hyperlink>
+            <w:proofErr w:type="spellStart"/>
+            <w:r>
+              <w:fldChar w:fldCharType="begin"/>
+            </w:r>
+            <w:r>
+              <w:instrText>HYPERLINK "https://basedin.nyc/"</w:instrText>
+            </w:r>
+            <w:r>
+              <w:fldChar w:fldCharType="separate"/>
+            </w:r>
+            <w:r>
+              <w:rPr>
+                <w:rStyle w:val="Hyperlink"/>
+                <w:rFonts w:ascii="HelveticaNeueLT Pro 55 Roman" w:hAnsi="HelveticaNeueLT Pro 55 Roman" w:cs="Arial"/>
+                <w:color w:val="auto"/>
+                <w:u w:val="none"/>
+              </w:rPr>
+              <w:t>basedin.nyc</w:t>
+            </w:r>
+            <w:proofErr w:type="spellEnd"/>
+            <w:r>
+              <w:fldChar w:fldCharType="end"/>
+            </w:r>
             <w:r>
               <w:rPr>
                 <w:rFonts w:ascii="HelveticaNeueLT Pro 55 Roman" w:hAnsi="HelveticaNeueLT Pro 55 Roman" w:cs="Arial"/>
@@ -1252,7 +1256,14 @@
           <w:rFonts w:ascii="HelveticaNeueLT Pro 55 Roman" w:hAnsi="HelveticaNeueLT Pro 55 Roman"/>
           <w:sz w:val="18"/>
         </w:rPr>
-        <w:t>60</w:t>
+        <w:t>6</w:t>
+      </w:r>
+      <w:r>
+        <w:rPr>
+          <w:rFonts w:ascii="HelveticaNeueLT Pro 55 Roman" w:hAnsi="HelveticaNeueLT Pro 55 Roman"/>
+          <w:sz w:val="18"/>
+        </w:rPr>
+        <w:t>5</w:t>
       </w:r>
       <w:r>
         <w:rPr>
@@ -1260,7 +1271,7 @@
           <w:bCs/>
           <w:sz w:val="18"/>
         </w:rPr>
-        <w:t>0+ PRs shipped to production at 97% acceptance</w:t>
+        <w:t>0 PRs shipped to production at 9</w:t>
       </w:r>
       <w:r>
         <w:rPr>
@@ -1268,9 +1279,26 @@
           <w:bCs/>
           <w:sz w:val="18"/>
         </w:rPr>
+        <w:t>5</w:t>
+      </w:r>
+      <w:r>
+        <w:rPr>
+          <w:rFonts w:ascii="HelveticaNeueLT Pro 55 Roman" w:hAnsi="HelveticaNeueLT Pro 55 Roman"/>
+          <w:bCs/>
+          <w:sz w:val="18"/>
+        </w:rPr>
+        <w:t>% acceptance</w:t>
+      </w:r>
+      <w:r>
+        <w:rPr>
+          <w:rFonts w:ascii="HelveticaNeueLT Pro 55 Roman" w:hAnsi="HelveticaNeueLT Pro 55 Roman"/>
+          <w:bCs/>
+          <w:sz w:val="18"/>
+        </w:rPr>
         <w:t xml:space="preserve">: </w:t>
       </w:r>
-      <w:hyperlink r:id="rId14" w:history="1">
+      <w:hyperlink r:id="rId13" w:history="1">
+        <w:proofErr w:type="spellStart"/>
         <w:r>
           <w:rPr>
             <w:rStyle w:val="Hyperlink"/>
@@ -1279,7 +1307,18 @@
             <w:color w:val="auto"/>
             <w:sz w:val="18"/>
           </w:rPr>
-          <w:t>basedin.nyc/pr-stats</w:t>
+          <w:t>basedin.nyc</w:t>
+        </w:r>
+        <w:proofErr w:type="spellEnd"/>
+        <w:r>
+          <w:rPr>
+            <w:rStyle w:val="Hyperlink"/>
+            <w:rFonts w:ascii="HelveticaNeueLT Pro 55 Roman" w:hAnsi="HelveticaNeueLT Pro 55 Roman"/>
+            <w:bCs/>
+            <w:color w:val="auto"/>
+            <w:sz w:val="18"/>
+          </w:rPr>
+          <w:t>/pr-stats</w:t>
         </w:r>
       </w:hyperlink>
     </w:p>
@@ -1290,6 +1329,192 @@
           <w:numId w:val="6"/>
         </w:numPr>
         <w:spacing w:before="60" w:line="276" w:lineRule="auto"/>
+        <w:rPr>
+          <w:rFonts w:ascii="HelveticaNeueLT Pro 55 Roman" w:hAnsi="HelveticaNeueLT Pro 55 Roman" w:cs="Arial"/>
+          <w:sz w:val="22"/>
+          <w:szCs w:val="20"/>
+        </w:rPr>
+      </w:pPr>
+      <w:hyperlink r:id="rId14" w:history="1">
+        <w:r>
+          <w:rPr>
+            <w:rStyle w:val="Hyperlink"/>
+            <w:rFonts w:ascii="HelveticaNeueLT Pro 55 Roman" w:hAnsi="HelveticaNeueLT Pro 55 Roman"/>
+            <w:b/>
+            <w:color w:val="auto"/>
+            <w:sz w:val="22"/>
+            <w:u w:val="none"/>
+          </w:rPr>
+          <w:t>thedotmack</w:t>
+        </w:r>
+        <w:r>
+          <w:rPr>
+            <w:rStyle w:val="Hyperlink"/>
+            <w:rFonts w:ascii="HelveticaNeueLT Pro 55 Roman" w:hAnsi="HelveticaNeueLT Pro 55 Roman"/>
+            <w:b/>
+            <w:color w:val="auto"/>
+            <w:sz w:val="22"/>
+            <w:u w:val="none"/>
+          </w:rPr>
+          <w:t>/</w:t>
+        </w:r>
+        <w:r>
+          <w:rPr>
+            <w:rStyle w:val="Hyperlink"/>
+            <w:rFonts w:ascii="HelveticaNeueLT Pro 55 Roman" w:hAnsi="HelveticaNeueLT Pro 55 Roman"/>
+            <w:b/>
+            <w:color w:val="auto"/>
+            <w:sz w:val="22"/>
+            <w:u w:val="none"/>
+          </w:rPr>
+          <w:t>claude-mem</w:t>
+        </w:r>
+      </w:hyperlink>
+      <w:r>
+        <w:rPr>
+          <w:rFonts w:ascii="HelveticaNeueLT Pro 55 Roman" w:hAnsi="HelveticaNeueLT Pro 55 Roman"/>
+          <w:sz w:val="18"/>
+        </w:rPr>
+        <w:t xml:space="preserve"> (8</w:t>
+      </w:r>
+      <w:r>
+        <w:rPr>
+          <w:rFonts w:ascii="HelveticaNeueLT Pro 55 Roman" w:hAnsi="HelveticaNeueLT Pro 55 Roman"/>
+          <w:sz w:val="18"/>
+        </w:rPr>
+        <w:t>9</w:t>
+      </w:r>
+      <w:r>
+        <w:rPr>
+          <w:rFonts w:ascii="HelveticaNeueLT Pro 55 Roman" w:hAnsi="HelveticaNeueLT Pro 55 Roman"/>
+          <w:sz w:val="18"/>
+        </w:rPr>
+        <w:t xml:space="preserve">k stars)  ·  </w:t>
+      </w:r>
+      <w:r>
+        <w:rPr>
+          <w:rFonts w:ascii="HelveticaNeueLT Pro 55 Roman" w:hAnsi="HelveticaNeueLT Pro 55 Roman"/>
+          <w:bCs/>
+          <w:sz w:val="18"/>
+        </w:rPr>
+        <w:t>TypeScript, JavaScript, Shell, HTML</w:t>
+      </w:r>
+      <w:r>
+        <w:rPr>
+          <w:rFonts w:ascii="HelveticaNeueLT Pro 55 Roman" w:hAnsi="HelveticaNeueLT Pro 55 Roman"/>
+          <w:sz w:val="18"/>
+        </w:rPr>
+        <w:t xml:space="preserve">  ·  </w:t>
+      </w:r>
+      <w:r>
+        <w:rPr>
+          <w:rFonts w:ascii="HelveticaNeueLT Pro 55 Roman" w:hAnsi="HelveticaNeueLT Pro 55 Roman"/>
+          <w:sz w:val="22"/>
+          <w:szCs w:val="22"/>
+        </w:rPr>
+        <w:t>Memory compression for Claude Code</w:t>
+      </w:r>
+      <w:r>
+        <w:rPr>
+          <w:rFonts w:ascii="HelveticaNeueLT Pro 55 Roman" w:hAnsi="HelveticaNeueLT Pro 55 Roman"/>
+          <w:sz w:val="22"/>
+          <w:szCs w:val="22"/>
+        </w:rPr>
+        <w:t xml:space="preserve">. </w:t>
+      </w:r>
+      <w:r>
+        <w:rPr>
+          <w:rFonts w:ascii="HelveticaNeueLT Pro 55 Roman" w:hAnsi="HelveticaNeueLT Pro 55 Roman" w:cs="Arial"/>
+          <w:sz w:val="22"/>
+          <w:szCs w:val="20"/>
+        </w:rPr>
+        <w:t>#</w:t>
+      </w:r>
+      <w:r>
+        <w:rPr>
+          <w:rFonts w:ascii="HelveticaNeueLT Pro 55 Roman" w:hAnsi="HelveticaNeueLT Pro 55 Roman" w:cs="Arial"/>
+          <w:sz w:val="22"/>
+          <w:szCs w:val="20"/>
+        </w:rPr>
+        <w:t>1</w:t>
+      </w:r>
+      <w:r>
+        <w:rPr>
+          <w:rFonts w:ascii="HelveticaNeueLT Pro 55 Roman" w:hAnsi="HelveticaNeueLT Pro 55 Roman" w:cs="Arial"/>
+          <w:sz w:val="22"/>
+          <w:szCs w:val="20"/>
+        </w:rPr>
+        <w:t xml:space="preserve"> contributor: s</w:t>
+      </w:r>
+      <w:r>
+        <w:rPr>
+          <w:rFonts w:ascii="HelveticaNeueLT Pro 55 Roman" w:hAnsi="HelveticaNeueLT Pro 55 Roman" w:cs="Arial"/>
+          <w:sz w:val="22"/>
+          <w:szCs w:val="20"/>
+        </w:rPr>
+        <w:t xml:space="preserve">pawn storm </w:t>
+      </w:r>
+      <w:r>
+        <w:rPr>
+          <w:rFonts w:ascii="HelveticaNeueLT Pro 55 Roman" w:hAnsi="HelveticaNeueLT Pro 55 Roman" w:cs="Arial"/>
+          <w:sz w:val="22"/>
+          <w:szCs w:val="20"/>
+        </w:rPr>
+        <w:t>defense,</w:t>
+      </w:r>
+      <w:r>
+        <w:rPr>
+          <w:rFonts w:ascii="HelveticaNeueLT Pro 55 Roman" w:hAnsi="HelveticaNeueLT Pro 55 Roman" w:cs="Arial"/>
+          <w:sz w:val="22"/>
+          <w:szCs w:val="20"/>
+        </w:rPr>
+        <w:t xml:space="preserve"> </w:t>
+      </w:r>
+      <w:r>
+        <w:rPr>
+          <w:rFonts w:ascii="HelveticaNeueLT Pro 55 Roman" w:hAnsi="HelveticaNeueLT Pro 55 Roman" w:cs="Arial"/>
+          <w:sz w:val="22"/>
+          <w:szCs w:val="20"/>
+        </w:rPr>
+        <w:t>h</w:t>
+      </w:r>
+      <w:r>
+        <w:rPr>
+          <w:rFonts w:ascii="HelveticaNeueLT Pro 55 Roman" w:hAnsi="HelveticaNeueLT Pro 55 Roman" w:cs="Arial"/>
+          <w:sz w:val="22"/>
+          <w:szCs w:val="20"/>
+        </w:rPr>
+        <w:t xml:space="preserve">ook/worker </w:t>
+      </w:r>
+      <w:r>
+        <w:rPr>
+          <w:rFonts w:ascii="HelveticaNeueLT Pro 55 Roman" w:hAnsi="HelveticaNeueLT Pro 55 Roman" w:cs="Arial"/>
+          <w:sz w:val="22"/>
+          <w:szCs w:val="20"/>
+        </w:rPr>
+        <w:t xml:space="preserve">lifecycle </w:t>
+      </w:r>
+      <w:r>
+        <w:rPr>
+          <w:rFonts w:ascii="HelveticaNeueLT Pro 55 Roman" w:hAnsi="HelveticaNeueLT Pro 55 Roman" w:cs="Arial"/>
+          <w:sz w:val="22"/>
+          <w:szCs w:val="20"/>
+        </w:rPr>
+        <w:t>hardening.</w:t>
+      </w:r>
+    </w:p>
+    <w:p>
+      <w:pPr>
+        <w:numPr>
+          <w:ilvl w:val="0"/>
+          <w:numId w:val="1"/>
+        </w:numPr>
+        <w:tabs>
+          <w:tab w:val="clear" w:pos="288"/>
+          <w:tab w:val="left" w:pos="540"/>
+        </w:tabs>
+        <w:spacing w:after="40" w:line="264" w:lineRule="auto"/>
+        <w:ind w:left="540" w:hanging="252"/>
         <w:rPr>
           <w:rFonts w:ascii="HelveticaNeueLT Pro 55 Roman" w:hAnsi="HelveticaNeueLT Pro 55 Roman" w:cs="Arial"/>
           <w:sz w:val="22"/>
@@ -1306,7 +1531,29 @@
             <w:sz w:val="22"/>
             <w:u w:val="none"/>
           </w:rPr>
-          <w:t>thedotmack/claude-mem</w:t>
+          <w:t>nesquena/her</w:t>
+        </w:r>
+        <w:r>
+          <w:rPr>
+            <w:rStyle w:val="Hyperlink"/>
+            <w:rFonts w:ascii="HelveticaNeueLT Pro 55 Roman" w:hAnsi="HelveticaNeueLT Pro 55 Roman"/>
+            <w:b/>
+            <w:color w:val="auto"/>
+            <w:sz w:val="22"/>
+            <w:u w:val="none"/>
+          </w:rPr>
+          <w:t>m</w:t>
+        </w:r>
+        <w:r>
+          <w:rPr>
+            <w:rStyle w:val="Hyperlink"/>
+            <w:rFonts w:ascii="HelveticaNeueLT Pro 55 Roman" w:hAnsi="HelveticaNeueLT Pro 55 Roman"/>
+            <w:b/>
+            <w:color w:val="auto"/>
+            <w:sz w:val="22"/>
+            <w:u w:val="none"/>
+          </w:rPr>
+          <w:t>es-webui</w:t>
         </w:r>
       </w:hyperlink>
       <w:r>
@@ -1314,21 +1561,7 @@
           <w:rFonts w:ascii="HelveticaNeueLT Pro 55 Roman" w:hAnsi="HelveticaNeueLT Pro 55 Roman"/>
           <w:sz w:val="18"/>
         </w:rPr>
-        <w:t xml:space="preserve"> (8</w:t>
-      </w:r>
-      <w:r>
-        <w:rPr>
-          <w:rFonts w:ascii="HelveticaNeueLT Pro 55 Roman" w:hAnsi="HelveticaNeueLT Pro 55 Roman"/>
-          <w:sz w:val="18"/>
-        </w:rPr>
-        <w:t>8</w:t>
-      </w:r>
-      <w:r>
-        <w:rPr>
-          <w:rFonts w:ascii="HelveticaNeueLT Pro 55 Roman" w:hAnsi="HelveticaNeueLT Pro 55 Roman"/>
-          <w:sz w:val="18"/>
-        </w:rPr>
-        <w:t xml:space="preserve">k stars)  ·  </w:t>
+        <w:t xml:space="preserve">  (16k stars)  ·  </w:t>
       </w:r>
       <w:r>
         <w:rPr>
@@ -1336,7 +1569,7 @@
           <w:bCs/>
           <w:sz w:val="18"/>
         </w:rPr>
-        <w:t>TypeScript, JavaScript, Shell, HTML</w:t>
+        <w:t>Python, JavaScript, CSS, HTML, Shell</w:t>
       </w:r>
       <w:r>
         <w:rPr>
@@ -1351,7 +1584,7 @@
           <w:sz w:val="22"/>
           <w:szCs w:val="22"/>
         </w:rPr>
-        <w:t>Memory compression for Claude Code</w:t>
+        <w:t>Web UI and Bridge API for Hermes Agent. Highest all-time contributor with 300+ PRs across the core product surface</w:t>
       </w:r>
       <w:r>
         <w:rPr>
@@ -1359,87 +1592,7 @@
           <w:sz w:val="22"/>
           <w:szCs w:val="22"/>
         </w:rPr>
-        <w:t xml:space="preserve">. </w:t>
-      </w:r>
-      <w:r>
-        <w:rPr>
-          <w:rFonts w:ascii="HelveticaNeueLT Pro 55 Roman" w:hAnsi="HelveticaNeueLT Pro 55 Roman" w:cs="Arial"/>
-          <w:sz w:val="22"/>
-          <w:szCs w:val="20"/>
-        </w:rPr>
-        <w:t>#</w:t>
-      </w:r>
-      <w:r>
-        <w:rPr>
-          <w:rFonts w:ascii="HelveticaNeueLT Pro 55 Roman" w:hAnsi="HelveticaNeueLT Pro 55 Roman" w:cs="Arial"/>
-          <w:sz w:val="22"/>
-          <w:szCs w:val="20"/>
-        </w:rPr>
-        <w:t>1</w:t>
-      </w:r>
-      <w:r>
-        <w:rPr>
-          <w:rFonts w:ascii="HelveticaNeueLT Pro 55 Roman" w:hAnsi="HelveticaNeueLT Pro 55 Roman" w:cs="Arial"/>
-          <w:sz w:val="22"/>
-          <w:szCs w:val="20"/>
-        </w:rPr>
-        <w:t xml:space="preserve"> contributor: s</w:t>
-      </w:r>
-      <w:r>
-        <w:rPr>
-          <w:rFonts w:ascii="HelveticaNeueLT Pro 55 Roman" w:hAnsi="HelveticaNeueLT Pro 55 Roman" w:cs="Arial"/>
-          <w:sz w:val="22"/>
-          <w:szCs w:val="20"/>
-        </w:rPr>
-        <w:t xml:space="preserve">pawn storm </w:t>
-      </w:r>
-      <w:r>
-        <w:rPr>
-          <w:rFonts w:ascii="HelveticaNeueLT Pro 55 Roman" w:hAnsi="HelveticaNeueLT Pro 55 Roman" w:cs="Arial"/>
-          <w:sz w:val="22"/>
-          <w:szCs w:val="20"/>
-        </w:rPr>
-        <w:t>defense,</w:t>
-      </w:r>
-      <w:r>
-        <w:rPr>
-          <w:rFonts w:ascii="HelveticaNeueLT Pro 55 Roman" w:hAnsi="HelveticaNeueLT Pro 55 Roman" w:cs="Arial"/>
-          <w:sz w:val="22"/>
-          <w:szCs w:val="20"/>
-        </w:rPr>
-        <w:t xml:space="preserve"> </w:t>
-      </w:r>
-      <w:r>
-        <w:rPr>
-          <w:rFonts w:ascii="HelveticaNeueLT Pro 55 Roman" w:hAnsi="HelveticaNeueLT Pro 55 Roman" w:cs="Arial"/>
-          <w:sz w:val="22"/>
-          <w:szCs w:val="20"/>
-        </w:rPr>
-        <w:t>h</w:t>
-      </w:r>
-      <w:r>
-        <w:rPr>
-          <w:rFonts w:ascii="HelveticaNeueLT Pro 55 Roman" w:hAnsi="HelveticaNeueLT Pro 55 Roman" w:cs="Arial"/>
-          <w:sz w:val="22"/>
-          <w:szCs w:val="20"/>
-        </w:rPr>
-        <w:t xml:space="preserve">ook/worker </w:t>
-      </w:r>
-      <w:r>
-        <w:rPr>
-          <w:rFonts w:ascii="HelveticaNeueLT Pro 55 Roman" w:hAnsi="HelveticaNeueLT Pro 55 Roman" w:cs="Arial"/>
-          <w:sz w:val="22"/>
-          <w:szCs w:val="20"/>
-        </w:rPr>
-        <w:t xml:space="preserve">lifecycle </w:t>
-      </w:r>
-      <w:r>
-        <w:rPr>
-          <w:rFonts w:ascii="HelveticaNeueLT Pro 55 Roman" w:hAnsi="HelveticaNeueLT Pro 55 Roman" w:cs="Arial"/>
-          <w:sz w:val="22"/>
-          <w:szCs w:val="20"/>
-        </w:rPr>
-        <w:t>hardening.</w:t>
+        <w:t>: cost analytics, saved prompts, gateway credential routing, scroll virtualization, session lifecycle.</w:t>
       </w:r>
     </w:p>
     <w:p>
@@ -1470,7 +1623,29 @@
             <w:sz w:val="22"/>
             <w:u w:val="none"/>
           </w:rPr>
-          <w:t>nesquena/hermes-webui</w:t>
+          <w:t>kenn-io/agentsv</w:t>
+        </w:r>
+        <w:r>
+          <w:rPr>
+            <w:rStyle w:val="Hyperlink"/>
+            <w:rFonts w:ascii="HelveticaNeueLT Pro 55 Roman" w:hAnsi="HelveticaNeueLT Pro 55 Roman"/>
+            <w:b/>
+            <w:color w:val="auto"/>
+            <w:sz w:val="22"/>
+            <w:u w:val="none"/>
+          </w:rPr>
+          <w:t>i</w:t>
+        </w:r>
+        <w:r>
+          <w:rPr>
+            <w:rStyle w:val="Hyperlink"/>
+            <w:rFonts w:ascii="HelveticaNeueLT Pro 55 Roman" w:hAnsi="HelveticaNeueLT Pro 55 Roman"/>
+            <w:b/>
+            <w:color w:val="auto"/>
+            <w:sz w:val="22"/>
+            <w:u w:val="none"/>
+          </w:rPr>
+          <w:t>ew</w:t>
         </w:r>
       </w:hyperlink>
       <w:r>
@@ -1478,7 +1653,7 @@
           <w:rFonts w:ascii="HelveticaNeueLT Pro 55 Roman" w:hAnsi="HelveticaNeueLT Pro 55 Roman"/>
           <w:sz w:val="18"/>
         </w:rPr>
-        <w:t xml:space="preserve">  (16k stars)  ·  </w:t>
+        <w:t xml:space="preserve">  (4k stars)  ·  </w:t>
       </w:r>
       <w:r>
         <w:rPr>
@@ -1486,7 +1661,7 @@
           <w:bCs/>
           <w:sz w:val="18"/>
         </w:rPr>
-        <w:t>Python, JavaScript, CSS, HTML, Shell</w:t>
+        <w:t>Go, TypeScript, Svelte, Rust, Shell</w:t>
       </w:r>
       <w:r>
         <w:rPr>
@@ -1501,7 +1676,7 @@
           <w:sz w:val="22"/>
           <w:szCs w:val="22"/>
         </w:rPr>
-        <w:t>Web UI and Bridge API for Hermes Agent. Highest all-time contributor with 300+ PRs across the core product surface</w:t>
+        <w:t xml:space="preserve">Local-first analytics for </w:t>
       </w:r>
       <w:r>
         <w:rPr>
@@ -1509,7 +1684,23 @@
           <w:sz w:val="22"/>
           <w:szCs w:val="22"/>
         </w:rPr>
-        <w:t>: cost analytics, saved prompts, gateway credential routing, scroll virtualization, session lifecycle.</w:t>
+        <w:t xml:space="preserve">AI </w:t>
+      </w:r>
+      <w:r>
+        <w:rPr>
+          <w:rFonts w:ascii="HelveticaNeueLT Pro 55 Roman" w:hAnsi="HelveticaNeueLT Pro 55 Roman"/>
+          <w:sz w:val="22"/>
+          <w:szCs w:val="22"/>
+        </w:rPr>
+        <w:t xml:space="preserve">agents. </w:t>
+      </w:r>
+      <w:r>
+        <w:rPr>
+          <w:rFonts w:ascii="HelveticaNeueLT Pro 55 Roman" w:hAnsi="HelveticaNeueLT Pro 55 Roman" w:cs="Arial"/>
+          <w:sz w:val="22"/>
+          <w:szCs w:val="20"/>
+        </w:rPr>
+        <w:t>Top third-party contributor: Postgres sync safety, orphan session recovery, parser support.</w:t>
       </w:r>
     </w:p>
     <w:p>
@@ -1526,8 +1717,8 @@
         <w:ind w:left="540" w:hanging="252"/>
         <w:rPr>
           <w:rFonts w:ascii="HelveticaNeueLT Pro 55 Roman" w:hAnsi="HelveticaNeueLT Pro 55 Roman" w:cs="Arial"/>
-          <w:sz w:val="22"/>
-          <w:szCs w:val="20"/>
+          <w:sz w:val="18"/>
+          <w:szCs w:val="18"/>
         </w:rPr>
       </w:pPr>
       <w:hyperlink r:id="rId17" w:history="1">
@@ -1540,7 +1731,29 @@
             <w:sz w:val="22"/>
             <w:u w:val="none"/>
           </w:rPr>
-          <w:t>kenn-io/agentsview</w:t>
+          <w:t>headroomlabs-ai</w:t>
+        </w:r>
+        <w:r>
+          <w:rPr>
+            <w:rStyle w:val="Hyperlink"/>
+            <w:rFonts w:ascii="HelveticaNeueLT Pro 55 Roman" w:hAnsi="HelveticaNeueLT Pro 55 Roman"/>
+            <w:b/>
+            <w:color w:val="auto"/>
+            <w:sz w:val="22"/>
+            <w:u w:val="none"/>
+          </w:rPr>
+          <w:t>/</w:t>
+        </w:r>
+        <w:r>
+          <w:rPr>
+            <w:rStyle w:val="Hyperlink"/>
+            <w:rFonts w:ascii="HelveticaNeueLT Pro 55 Roman" w:hAnsi="HelveticaNeueLT Pro 55 Roman"/>
+            <w:b/>
+            <w:color w:val="auto"/>
+            <w:sz w:val="22"/>
+            <w:u w:val="none"/>
+          </w:rPr>
+          <w:t>headroom</w:t>
         </w:r>
       </w:hyperlink>
       <w:r>
@@ -1548,7 +1761,28 @@
           <w:rFonts w:ascii="HelveticaNeueLT Pro 55 Roman" w:hAnsi="HelveticaNeueLT Pro 55 Roman"/>
           <w:sz w:val="18"/>
         </w:rPr>
-        <w:t xml:space="preserve">  (4k stars)  ·  </w:t>
+        <w:t xml:space="preserve"> (</w:t>
+      </w:r>
+      <w:r>
+        <w:rPr>
+          <w:rFonts w:ascii="HelveticaNeueLT Pro 55 Roman" w:hAnsi="HelveticaNeueLT Pro 55 Roman"/>
+          <w:sz w:val="18"/>
+        </w:rPr>
+        <w:t>6</w:t>
+      </w:r>
+      <w:r>
+        <w:rPr>
+          <w:rFonts w:ascii="HelveticaNeueLT Pro 55 Roman" w:hAnsi="HelveticaNeueLT Pro 55 Roman"/>
+          <w:sz w:val="18"/>
+        </w:rPr>
+        <w:t>4</w:t>
+      </w:r>
+      <w:r>
+        <w:rPr>
+          <w:rFonts w:ascii="HelveticaNeueLT Pro 55 Roman" w:hAnsi="HelveticaNeueLT Pro 55 Roman"/>
+          <w:sz w:val="18"/>
+        </w:rPr>
+        <w:t xml:space="preserve">k stars)  ·  </w:t>
       </w:r>
       <w:r>
         <w:rPr>
@@ -1556,7 +1790,7 @@
           <w:bCs/>
           <w:sz w:val="18"/>
         </w:rPr>
-        <w:t>Go, TypeScript, Svelte, Rust, Shell</w:t>
+        <w:t>Go, TypeScript, Svelte, Rust</w:t>
       </w:r>
       <w:r>
         <w:rPr>
@@ -1571,31 +1805,7 @@
           <w:sz w:val="22"/>
           <w:szCs w:val="22"/>
         </w:rPr>
-        <w:t xml:space="preserve">Local-first analytics for </w:t>
-      </w:r>
-      <w:r>
-        <w:rPr>
-          <w:rFonts w:ascii="HelveticaNeueLT Pro 55 Roman" w:hAnsi="HelveticaNeueLT Pro 55 Roman"/>
-          <w:sz w:val="22"/>
-          <w:szCs w:val="22"/>
-        </w:rPr>
-        <w:t xml:space="preserve">AI </w:t>
-      </w:r>
-      <w:r>
-        <w:rPr>
-          <w:rFonts w:ascii="HelveticaNeueLT Pro 55 Roman" w:hAnsi="HelveticaNeueLT Pro 55 Roman"/>
-          <w:sz w:val="22"/>
-          <w:szCs w:val="22"/>
-        </w:rPr>
-        <w:t xml:space="preserve">agents. </w:t>
-      </w:r>
-      <w:r>
-        <w:rPr>
-          <w:rFonts w:ascii="HelveticaNeueLT Pro 55 Roman" w:hAnsi="HelveticaNeueLT Pro 55 Roman" w:cs="Arial"/>
-          <w:sz w:val="22"/>
-          <w:szCs w:val="20"/>
-        </w:rPr>
-        <w:t>Top third-party contributor: Postgres sync safety, orphan session recovery, parser support.</w:t>
+        <w:t>Token compression proxy for LLMs. #2 third-party contributor: cache stability, compression-safe tool calls, session fidelity.</w:t>
       </w:r>
     </w:p>
     <w:p>
@@ -1617,82 +1827,6 @@
         </w:rPr>
       </w:pPr>
       <w:hyperlink r:id="rId18" w:history="1">
-        <w:r>
-          <w:rPr>
-            <w:rStyle w:val="Hyperlink"/>
-            <w:rFonts w:ascii="HelveticaNeueLT Pro 55 Roman" w:hAnsi="HelveticaNeueLT Pro 55 Roman"/>
-            <w:b/>
-            <w:color w:val="auto"/>
-            <w:sz w:val="22"/>
-            <w:u w:val="none"/>
-          </w:rPr>
-          <w:t>headroomlabs-ai/headroom</w:t>
-        </w:r>
-      </w:hyperlink>
-      <w:r>
-        <w:rPr>
-          <w:rFonts w:ascii="HelveticaNeueLT Pro 55 Roman" w:hAnsi="HelveticaNeueLT Pro 55 Roman"/>
-          <w:sz w:val="18"/>
-        </w:rPr>
-        <w:t xml:space="preserve"> (</w:t>
-      </w:r>
-      <w:r>
-        <w:rPr>
-          <w:rFonts w:ascii="HelveticaNeueLT Pro 55 Roman" w:hAnsi="HelveticaNeueLT Pro 55 Roman"/>
-          <w:sz w:val="18"/>
-        </w:rPr>
-        <w:t>61</w:t>
-      </w:r>
-      <w:r>
-        <w:rPr>
-          <w:rFonts w:ascii="HelveticaNeueLT Pro 55 Roman" w:hAnsi="HelveticaNeueLT Pro 55 Roman"/>
-          <w:sz w:val="18"/>
-        </w:rPr>
-        <w:t xml:space="preserve">k stars)  ·  </w:t>
-      </w:r>
-      <w:r>
-        <w:rPr>
-          <w:rFonts w:ascii="HelveticaNeueLT Pro 55 Roman" w:hAnsi="HelveticaNeueLT Pro 55 Roman"/>
-          <w:bCs/>
-          <w:sz w:val="18"/>
-        </w:rPr>
-        <w:t>Go, TypeScript, Svelte, Rust</w:t>
-      </w:r>
-      <w:r>
-        <w:rPr>
-          <w:rFonts w:ascii="HelveticaNeueLT Pro 55 Roman" w:hAnsi="HelveticaNeueLT Pro 55 Roman"/>
-          <w:sz w:val="18"/>
-        </w:rPr>
-        <w:t xml:space="preserve">  ·  </w:t>
-      </w:r>
-      <w:r>
-        <w:rPr>
-          <w:rFonts w:ascii="HelveticaNeueLT Pro 55 Roman" w:hAnsi="HelveticaNeueLT Pro 55 Roman"/>
-          <w:sz w:val="22"/>
-          <w:szCs w:val="22"/>
-        </w:rPr>
-        <w:t>Token compression proxy for LLMs. #2 third-party contributor: cache stability, compression-safe tool calls, session fidelity.</w:t>
-      </w:r>
-    </w:p>
-    <w:p>
-      <w:pPr>
-        <w:numPr>
-          <w:ilvl w:val="0"/>
-          <w:numId w:val="1"/>
-        </w:numPr>
-        <w:tabs>
-          <w:tab w:val="clear" w:pos="288"/>
-          <w:tab w:val="left" w:pos="540"/>
-        </w:tabs>
-        <w:spacing w:after="40" w:line="264" w:lineRule="auto"/>
-        <w:ind w:left="540" w:hanging="252"/>
-        <w:rPr>
-          <w:rFonts w:ascii="HelveticaNeueLT Pro 55 Roman" w:hAnsi="HelveticaNeueLT Pro 55 Roman" w:cs="Arial"/>
-          <w:sz w:val="18"/>
-          <w:szCs w:val="18"/>
-        </w:rPr>
-      </w:pPr>
-      <w:hyperlink r:id="rId19" w:history="1">
         <w:proofErr w:type="spellStart"/>
         <w:r>
           <w:rPr>
@@ -1715,7 +1849,29 @@
             <w:sz w:val="22"/>
             <w:u w:val="none"/>
           </w:rPr>
-          <w:t>/orca</w:t>
+          <w:t>/or</w:t>
+        </w:r>
+        <w:r>
+          <w:rPr>
+            <w:rStyle w:val="Hyperlink"/>
+            <w:rFonts w:ascii="HelveticaNeueLT Pro 55 Roman" w:hAnsi="HelveticaNeueLT Pro 55 Roman"/>
+            <w:b/>
+            <w:color w:val="auto"/>
+            <w:sz w:val="22"/>
+            <w:u w:val="none"/>
+          </w:rPr>
+          <w:t>c</w:t>
+        </w:r>
+        <w:r>
+          <w:rPr>
+            <w:rStyle w:val="Hyperlink"/>
+            <w:rFonts w:ascii="HelveticaNeueLT Pro 55 Roman" w:hAnsi="HelveticaNeueLT Pro 55 Roman"/>
+            <w:b/>
+            <w:color w:val="auto"/>
+            <w:sz w:val="22"/>
+            <w:u w:val="none"/>
+          </w:rPr>
+          <w:t>a</w:t>
         </w:r>
       </w:hyperlink>
       <w:r>
@@ -1731,7 +1887,21 @@
           <w:rFonts w:ascii="HelveticaNeueLT Pro 55 Roman" w:hAnsi="HelveticaNeueLT Pro 55 Roman"/>
           <w:sz w:val="18"/>
         </w:rPr>
-        <w:t xml:space="preserve">(26k stars)  ·  </w:t>
+        <w:t>(</w:t>
+      </w:r>
+      <w:r>
+        <w:rPr>
+          <w:rFonts w:ascii="HelveticaNeueLT Pro 55 Roman" w:hAnsi="HelveticaNeueLT Pro 55 Roman"/>
+          <w:sz w:val="18"/>
+        </w:rPr>
+        <w:t>37</w:t>
+      </w:r>
+      <w:r>
+        <w:rPr>
+          <w:rFonts w:ascii="HelveticaNeueLT Pro 55 Roman" w:hAnsi="HelveticaNeueLT Pro 55 Roman"/>
+          <w:sz w:val="18"/>
+        </w:rPr>
+        <w:t xml:space="preserve">k stars)  ·  </w:t>
       </w:r>
       <w:r>
         <w:rPr>

</xml_diff>

<commit_message>
Count LOC on the day they merge instead of when they are authored
</commit_message>
<xml_diff>
--- a/resume.docx
+++ b/resume.docx
@@ -1345,29 +1345,7 @@
             <w:sz w:val="22"/>
             <w:u w:val="none"/>
           </w:rPr>
-          <w:t>thedotmack</w:t>
-        </w:r>
-        <w:r>
-          <w:rPr>
-            <w:rStyle w:val="Hyperlink"/>
-            <w:rFonts w:ascii="HelveticaNeueLT Pro 55 Roman" w:hAnsi="HelveticaNeueLT Pro 55 Roman"/>
-            <w:b/>
-            <w:color w:val="auto"/>
-            <w:sz w:val="22"/>
-            <w:u w:val="none"/>
-          </w:rPr>
-          <w:t>/</w:t>
-        </w:r>
-        <w:r>
-          <w:rPr>
-            <w:rStyle w:val="Hyperlink"/>
-            <w:rFonts w:ascii="HelveticaNeueLT Pro 55 Roman" w:hAnsi="HelveticaNeueLT Pro 55 Roman"/>
-            <w:b/>
-            <w:color w:val="auto"/>
-            <w:sz w:val="22"/>
-            <w:u w:val="none"/>
-          </w:rPr>
-          <w:t>claude-mem</w:t>
+          <w:t>thedotmack/claude-mem</w:t>
         </w:r>
       </w:hyperlink>
       <w:r>
@@ -1531,29 +1509,7 @@
             <w:sz w:val="22"/>
             <w:u w:val="none"/>
           </w:rPr>
-          <w:t>nesquena/her</w:t>
-        </w:r>
-        <w:r>
-          <w:rPr>
-            <w:rStyle w:val="Hyperlink"/>
-            <w:rFonts w:ascii="HelveticaNeueLT Pro 55 Roman" w:hAnsi="HelveticaNeueLT Pro 55 Roman"/>
-            <w:b/>
-            <w:color w:val="auto"/>
-            <w:sz w:val="22"/>
-            <w:u w:val="none"/>
-          </w:rPr>
-          <w:t>m</w:t>
-        </w:r>
-        <w:r>
-          <w:rPr>
-            <w:rStyle w:val="Hyperlink"/>
-            <w:rFonts w:ascii="HelveticaNeueLT Pro 55 Roman" w:hAnsi="HelveticaNeueLT Pro 55 Roman"/>
-            <w:b/>
-            <w:color w:val="auto"/>
-            <w:sz w:val="22"/>
-            <w:u w:val="none"/>
-          </w:rPr>
-          <w:t>es-webui</w:t>
+          <w:t>nesquena/hermes-webui</w:t>
         </w:r>
       </w:hyperlink>
       <w:r>
@@ -1623,29 +1579,7 @@
             <w:sz w:val="22"/>
             <w:u w:val="none"/>
           </w:rPr>
-          <w:t>kenn-io/agentsv</w:t>
-        </w:r>
-        <w:r>
-          <w:rPr>
-            <w:rStyle w:val="Hyperlink"/>
-            <w:rFonts w:ascii="HelveticaNeueLT Pro 55 Roman" w:hAnsi="HelveticaNeueLT Pro 55 Roman"/>
-            <w:b/>
-            <w:color w:val="auto"/>
-            <w:sz w:val="22"/>
-            <w:u w:val="none"/>
-          </w:rPr>
-          <w:t>i</w:t>
-        </w:r>
-        <w:r>
-          <w:rPr>
-            <w:rStyle w:val="Hyperlink"/>
-            <w:rFonts w:ascii="HelveticaNeueLT Pro 55 Roman" w:hAnsi="HelveticaNeueLT Pro 55 Roman"/>
-            <w:b/>
-            <w:color w:val="auto"/>
-            <w:sz w:val="22"/>
-            <w:u w:val="none"/>
-          </w:rPr>
-          <w:t>ew</w:t>
+          <w:t>kenn-io/agentsview</w:t>
         </w:r>
       </w:hyperlink>
       <w:r>
@@ -1731,29 +1665,7 @@
             <w:sz w:val="22"/>
             <w:u w:val="none"/>
           </w:rPr>
-          <w:t>headroomlabs-ai</w:t>
-        </w:r>
-        <w:r>
-          <w:rPr>
-            <w:rStyle w:val="Hyperlink"/>
-            <w:rFonts w:ascii="HelveticaNeueLT Pro 55 Roman" w:hAnsi="HelveticaNeueLT Pro 55 Roman"/>
-            <w:b/>
-            <w:color w:val="auto"/>
-            <w:sz w:val="22"/>
-            <w:u w:val="none"/>
-          </w:rPr>
-          <w:t>/</w:t>
-        </w:r>
-        <w:r>
-          <w:rPr>
-            <w:rStyle w:val="Hyperlink"/>
-            <w:rFonts w:ascii="HelveticaNeueLT Pro 55 Roman" w:hAnsi="HelveticaNeueLT Pro 55 Roman"/>
-            <w:b/>
-            <w:color w:val="auto"/>
-            <w:sz w:val="22"/>
-            <w:u w:val="none"/>
-          </w:rPr>
-          <w:t>headroom</w:t>
+          <w:t>headroomlabs-ai/headroom</w:t>
         </w:r>
       </w:hyperlink>
       <w:r>
@@ -1849,29 +1761,7 @@
             <w:sz w:val="22"/>
             <w:u w:val="none"/>
           </w:rPr>
-          <w:t>/or</w:t>
-        </w:r>
-        <w:r>
-          <w:rPr>
-            <w:rStyle w:val="Hyperlink"/>
-            <w:rFonts w:ascii="HelveticaNeueLT Pro 55 Roman" w:hAnsi="HelveticaNeueLT Pro 55 Roman"/>
-            <w:b/>
-            <w:color w:val="auto"/>
-            <w:sz w:val="22"/>
-            <w:u w:val="none"/>
-          </w:rPr>
-          <w:t>c</w:t>
-        </w:r>
-        <w:r>
-          <w:rPr>
-            <w:rStyle w:val="Hyperlink"/>
-            <w:rFonts w:ascii="HelveticaNeueLT Pro 55 Roman" w:hAnsi="HelveticaNeueLT Pro 55 Roman"/>
-            <w:b/>
-            <w:color w:val="auto"/>
-            <w:sz w:val="22"/>
-            <w:u w:val="none"/>
-          </w:rPr>
-          <w:t>a</w:t>
+          <w:t>/orca</w:t>
         </w:r>
       </w:hyperlink>
       <w:r>
@@ -2564,12 +2454,12 @@
           <w:sz w:val="22"/>
           <w:szCs w:val="20"/>
         </w:rPr>
-        <w:t>Clients: Visa, Barclays, NFL, Chase, Hyatt, Apple, Disney, US Airways, PNC Bank, Virgin America, UBS, Ritz-Carlton, Sallie Mae, ADP, IOC, and AARP.</w:t>
+        <w:t>Marketing agency serving financial services clients. Developed and instrumented campaign websites and microsites for Visa, Barclays, Chase, UBS, and other card program launches.</w:t>
       </w:r>
     </w:p>
     <w:p>
       <w:pPr>
-        <w:spacing w:after="40"/>
+        <w:spacing w:after="20" w:line="264" w:lineRule="auto"/>
         <w:rPr>
           <w:sz w:val="14"/>
           <w:szCs w:val="14"/>
@@ -2698,7 +2588,23 @@
           <w:sz w:val="22"/>
           <w:szCs w:val="20"/>
         </w:rPr>
-        <w:t>Developed headless e-commerce CMS templates. Checkout optimization with multivariate testing.</w:t>
+        <w:t xml:space="preserve">Developed headless e-commerce CMS templates. Checkout optimization with </w:t>
+      </w:r>
+      <w:r>
+        <w:rPr>
+          <w:rFonts w:ascii="HelveticaNeueLT Pro 55 Roman" w:hAnsi="HelveticaNeueLT Pro 55 Roman" w:cs="Arial"/>
+          <w:sz w:val="22"/>
+          <w:szCs w:val="20"/>
+        </w:rPr>
+        <w:t xml:space="preserve">A/B and </w:t>
+      </w:r>
+      <w:r>
+        <w:rPr>
+          <w:rFonts w:ascii="HelveticaNeueLT Pro 55 Roman" w:hAnsi="HelveticaNeueLT Pro 55 Roman" w:cs="Arial"/>
+          <w:sz w:val="22"/>
+          <w:szCs w:val="20"/>
+        </w:rPr>
+        <w:t>multivariate testing.</w:t>
       </w:r>
     </w:p>
     <w:p>

</xml_diff>

<commit_message>
Add diagrams and update stats
</commit_message>
<xml_diff>
--- a/resume.docx
+++ b/resume.docx
@@ -4,15 +4,14 @@
   <w:body>
     <w:tbl>
       <w:tblPr>
-        <w:tblW w:w="15351" w:type="dxa"/>
+        <w:tblW w:w="9900" w:type="dxa"/>
         <w:tblInd w:w="108" w:type="dxa"/>
         <w:tblLayout w:type="fixed"/>
         <w:tblLook w:val="0000" w:firstRow="0" w:lastRow="0" w:firstColumn="0" w:lastColumn="0" w:noHBand="0" w:noVBand="0"/>
       </w:tblPr>
       <w:tblGrid>
-        <w:gridCol w:w="4989"/>
-        <w:gridCol w:w="5181"/>
-        <w:gridCol w:w="5181"/>
+        <w:gridCol w:w="3241"/>
+        <w:gridCol w:w="6659"/>
       </w:tblGrid>
       <w:tr>
         <w:trPr>
@@ -20,7 +19,7 @@
         </w:trPr>
         <w:tc>
           <w:tcPr>
-            <w:tcW w:w="4989" w:type="dxa"/>
+            <w:tcW w:w="3241" w:type="dxa"/>
           </w:tcPr>
           <w:p>
             <w:pPr>
@@ -64,7 +63,7 @@
                 <w:szCs w:val="32"/>
               </w:rPr>
               <w:pict w14:anchorId="39A1D4B1">
-                <v:group id="_x0000_s3105" editas="canvas" style="position:absolute;margin-left:-5pt;margin-top:2.05pt;width:41.4pt;height:11.4pt;z-index:1" coordorigin="-100,541" coordsize="828,228">
+                <v:group id="_x0000_s3117" editas="canvas" style="position:absolute;margin-left:-5pt;margin-top:2.05pt;width:41.4pt;height:11.4pt;z-index:1" coordorigin="-100,541" coordsize="828,228">
                   <o:lock v:ext="edit" aspectratio="t"/>
                   <v:shapetype id="_x0000_t75" coordsize="21600,21600" o:spt="75" o:preferrelative="t" path="m@4@5l@4@11@9@11@9@5xe" filled="f" stroked="f">
                     <v:stroke joinstyle="miter"/>
@@ -85,42 +84,42 @@
                     <v:path o:extrusionok="f" gradientshapeok="t" o:connecttype="rect"/>
                     <o:lock v:ext="edit" aspectratio="t"/>
                   </v:shapetype>
-                  <v:shape id="_x0000_s3106" type="#_x0000_t75" href="https://www.linkedin.com/in/rodboev/" style="position:absolute;left:-100;top:541;width:828;height:228" o:preferrelative="f" o:button="t">
+                  <v:shape id="_x0000_s3118" type="#_x0000_t75" href="https://www.linkedin.com/in/rodboev/" style="position:absolute;left:-100;top:541;width:828;height:228" o:preferrelative="f" o:button="t">
                     <v:fill o:detectmouseclick="t"/>
                     <v:path o:extrusionok="t" o:connecttype="none"/>
                   </v:shape>
-                  <v:group id="_x0000_s3107" style="position:absolute;left:-89;top:544;width:810;height:214" coordorigin="11,10" coordsize="777,205">
-                    <v:shape id="_x0000_s3108" href="https://www.linkedin.com/in/rodboev/" style="position:absolute;left:583;top:10;width:205;height:205" coordsize="425,428" o:button="t" path="m,30hdc,13,14,,31,,393,,393,,393,v18,,32,13,32,30c425,397,425,397,425,397v,17,-14,31,-32,31c31,428,31,428,31,428,14,428,,414,,397,,30,,30,,30xe" fillcolor="#999" stroked="f">
+                  <v:group id="_x0000_s3119" style="position:absolute;left:-89;top:544;width:810;height:214" coordorigin="11,10" coordsize="777,205">
+                    <v:shape id="_x0000_s3120" href="https://www.linkedin.com/in/rodboev/" style="position:absolute;left:583;top:10;width:205;height:205" coordsize="425,428" o:button="t" path="m,30hdc,13,14,,31,,393,,393,,393,v18,,32,13,32,30c425,397,425,397,425,397v,17,-14,31,-32,31c31,428,31,428,31,428,14,428,,414,,397,,30,,30,,30xe" fillcolor="#999" stroked="f">
                       <v:fill o:detectmouseclick="t"/>
                       <v:path arrowok="t"/>
                     </v:shape>
-                    <v:shape id="_x0000_s3109" style="position:absolute;left:11;top:51;width:85;height:132" coordsize="85,132" path="m,132r85,l85,104r-54,l31,,,,,132r,xe" fillcolor="black" stroked="f">
+                    <v:shape id="_x0000_s3121" style="position:absolute;left:11;top:51;width:85;height:132" coordsize="85,132" path="m,132r85,l85,104r-54,l31,,,,,132r,xe" fillcolor="black" stroked="f">
                       <v:path arrowok="t"/>
                     </v:shape>
-                    <v:shape id="_x0000_s3110" style="position:absolute;left:107;top:44;width:34;height:138" coordsize="72,286" path="m68,286hdc68,93,68,93,68,93,3,93,3,93,3,93v,193,,193,,193c68,286,68,286,68,286xm36,67c58,67,72,52,72,33,71,14,58,,36,,14,,,14,,33,,52,14,67,35,67v1,,1,,1,xe" fillcolor="black" stroked="f">
+                    <v:shape id="_x0000_s3122" style="position:absolute;left:107;top:44;width:34;height:138" coordsize="72,286" path="m68,286hdc68,93,68,93,68,93,3,93,3,93,3,93v,193,,193,,193c68,286,68,286,68,286xm36,67c58,67,72,52,72,33,71,14,58,,36,,14,,,14,,33,,52,14,67,35,67v1,,1,,1,xe" fillcolor="black" stroked="f">
                       <v:path arrowok="t"/>
                       <o:lock v:ext="edit" verticies="t"/>
                     </v:shape>
-                    <v:shape id="_x0000_s3111" style="position:absolute;left:153;top:86;width:95;height:96" coordsize="196,198" path="m,198hdc65,198,65,198,65,198,65,90,65,90,65,90v,-6,,-11,2,-15c71,63,82,51,100,51v23,,32,18,32,44c132,198,132,198,132,198v64,,64,,64,c196,87,196,87,196,87,196,28,165,,123,,88,,73,20,64,33v1,,1,,1,c65,5,65,5,65,5,,5,,5,,5,1,23,,198,,198xe" fillcolor="black" stroked="f">
+                    <v:shape id="_x0000_s3123" style="position:absolute;left:153;top:86;width:95;height:96" coordsize="196,198" path="m,198hdc65,198,65,198,65,198,65,90,65,90,65,90v,-6,,-11,2,-15c71,63,82,51,100,51v23,,32,18,32,44c132,198,132,198,132,198v64,,64,,64,c196,87,196,87,196,87,196,28,165,,123,,88,,73,20,64,33v1,,1,,1,c65,5,65,5,65,5,,5,,5,,5,1,23,,198,,198xe" fillcolor="black" stroked="f">
                       <v:path arrowok="t"/>
                     </v:shape>
-                    <v:shape id="_x0000_s3112" style="position:absolute;left:261;top:50;width:100;height:132" coordsize="209,275" path="m64,hdc,,,,,,,275,,275,,275v64,,64,,64,c64,213,64,213,64,213,80,192,80,192,80,192v50,83,50,83,50,83c209,275,209,275,209,275,125,155,125,155,125,155,199,74,199,74,199,74v-77,,-77,,-77,c122,74,69,147,64,155,64,,64,,64,xe" fillcolor="black" stroked="f">
+                    <v:shape id="_x0000_s3124" style="position:absolute;left:261;top:50;width:100;height:132" coordsize="209,275" path="m64,hdc,,,,,,,275,,275,,275v64,,64,,64,c64,213,64,213,64,213,80,192,80,192,80,192v50,83,50,83,50,83c209,275,209,275,209,275,125,155,125,155,125,155,199,74,199,74,199,74v-77,,-77,,-77,c122,74,69,147,64,155,64,,64,,64,xe" fillcolor="black" stroked="f">
                       <v:path arrowok="t"/>
                     </v:shape>
-                    <v:shape id="_x0000_s3113" style="position:absolute;left:351;top:83;width:94;height:101" coordsize="196,210" path="m194,126hdc195,121,196,111,196,100,196,50,171,,104,,33,,,56,,107v,64,40,103,110,103c138,210,164,206,185,197v-9,-42,-9,-42,-9,-42c159,161,141,164,119,164,89,164,63,151,61,125v133,1,133,1,133,1xm61,82c62,66,73,41,101,41v29,,36,26,36,41c61,82,61,82,61,82xe" fillcolor="black" stroked="f">
+                    <v:shape id="_x0000_s3125" style="position:absolute;left:351;top:83;width:94;height:101" coordsize="196,210" path="m194,126hdc195,121,196,111,196,100,196,50,171,,104,,33,,,56,,107v,64,40,103,110,103c138,210,164,206,185,197v-9,-42,-9,-42,-9,-42c159,161,141,164,119,164,89,164,63,151,61,125v133,1,133,1,133,1xm61,82c62,66,73,41,101,41v29,,36,26,36,41c61,82,61,82,61,82xe" fillcolor="black" stroked="f">
                       <v:path arrowok="t"/>
                       <o:lock v:ext="edit" verticies="t"/>
                     </v:shape>
-                    <v:shape id="_x0000_s3114" href="http://www.linkedin.com/in/rodboev" style="position:absolute;left:450;top:50;width:103;height:134" coordsize="214,280" o:button="t" path="m148,hdc148,92,148,92,148,92v-1,,-1,,-1,c138,78,118,69,92,69,43,69,,109,,176v,63,39,104,88,104c115,280,140,268,153,246v1,,1,,1,c157,275,157,275,157,275v57,,57,,57,c213,262,212,238,212,215,212,,212,,212,,148,,148,,148,xm148,186v,5,-1,10,-1,14c143,217,128,230,109,230,82,230,65,208,65,175v,-32,15,-58,44,-58c129,117,143,131,147,148v1,4,1,8,1,11c148,186,148,186,148,186xe" fillcolor="black" stroked="f">
+                    <v:shape id="_x0000_s3126" href="http://www.linkedin.com/in/rodboev" style="position:absolute;left:450;top:50;width:103;height:134" coordsize="214,280" o:button="t" path="m148,hdc148,92,148,92,148,92v-1,,-1,,-1,c138,78,118,69,92,69,43,69,,109,,176v,63,39,104,88,104c115,280,140,268,153,246v1,,1,,1,c157,275,157,275,157,275v57,,57,,57,c213,262,212,238,212,215,212,,212,,212,,148,,148,,148,xm148,186v,5,-1,10,-1,14c143,217,128,230,109,230,82,230,65,208,65,175v,-32,15,-58,44,-58c129,117,143,131,147,148v1,4,1,8,1,11c148,186,148,186,148,186xe" fillcolor="black" stroked="f">
                       <v:fill o:detectmouseclick="t"/>
                       <v:path arrowok="t"/>
                       <o:lock v:ext="edit" verticies="t"/>
                     </v:shape>
-                    <v:shape id="_x0000_s3115" style="position:absolute;left:613;top:44;width:34;height:138" coordsize="72,286" path="m68,286hdc68,93,68,93,68,93,3,93,3,93,3,93v,193,,193,,193c68,286,68,286,68,286xm35,66c58,66,72,51,72,33,71,14,58,,36,,14,,,14,,33,,51,13,66,35,66v,,,,,xe" stroked="f">
+                    <v:shape id="_x0000_s3127" style="position:absolute;left:613;top:44;width:34;height:138" coordsize="72,286" path="m68,286hdc68,93,68,93,68,93,3,93,3,93,3,93v,193,,193,,193c68,286,68,286,68,286xm35,66c58,66,72,51,72,33,71,14,58,,36,,14,,,14,,33,,51,13,66,35,66v,,,,,xe" stroked="f">
                       <v:path arrowok="t"/>
                       <o:lock v:ext="edit" verticies="t"/>
                     </v:shape>
-                    <v:shape id="_x0000_s3116" style="position:absolute;left:662;top:86;width:95;height:96" coordsize="196,198" path="m,198hdc64,198,64,198,64,198,64,90,64,90,64,90v,-6,1,-12,2,-16c71,63,82,51,99,51v24,,33,18,33,44c132,198,132,198,132,198v64,,64,,64,c196,87,196,87,196,87,196,28,164,,122,,88,,72,20,64,33v,,,,,c64,5,64,5,64,5,,5,,5,,5,1,23,,198,,198xe" stroked="f">
+                    <v:shape id="_x0000_s3128" style="position:absolute;left:662;top:86;width:95;height:96" coordsize="196,198" path="m,198hdc64,198,64,198,64,198,64,90,64,90,64,90v,-6,1,-12,2,-16c71,63,82,51,99,51v24,,33,18,33,44c132,198,132,198,132,198v64,,64,,64,c196,87,196,87,196,87,196,28,164,,122,,88,,72,20,64,33v,,,,,c64,5,64,5,64,5,,5,,5,,5,1,23,,198,,198xe" stroked="f">
                       <v:path arrowok="t"/>
                     </v:shape>
                   </v:group>
@@ -157,7 +156,7 @@
         </w:tc>
         <w:tc>
           <w:tcPr>
-            <w:tcW w:w="5181" w:type="dxa"/>
+            <w:tcW w:w="6659" w:type="dxa"/>
           </w:tcPr>
           <w:p>
             <w:pPr>
@@ -215,6 +214,7 @@
               </w:rPr>
             </w:pPr>
             <w:hyperlink r:id="rId10" w:history="1">
+              <w:proofErr w:type="spellStart"/>
               <w:r>
                 <w:rPr>
                   <w:rStyle w:val="Hyperlink"/>
@@ -226,6 +226,7 @@
                 </w:rPr>
                 <w:t>basedin.nyc</w:t>
               </w:r>
+              <w:proofErr w:type="spellEnd"/>
             </w:hyperlink>
             <w:r>
               <w:rPr>
@@ -248,89 +249,6 @@
                 <w:sz w:val="18"/>
               </w:rPr>
               <w:t>347-644-9001</w:t>
-            </w:r>
-          </w:p>
-        </w:tc>
-        <w:tc>
-          <w:tcPr>
-            <w:tcW w:w="5181" w:type="dxa"/>
-            <w:vAlign w:val="bottom"/>
-          </w:tcPr>
-          <w:p>
-            <w:pPr>
-              <w:spacing w:line="300" w:lineRule="auto"/>
-              <w:ind w:right="-14"/>
-              <w:jc w:val="right"/>
-              <w:rPr>
-                <w:rFonts w:ascii="HelveticaNeueLT Pro 55 Roman" w:hAnsi="HelveticaNeueLT Pro 55 Roman" w:cs="Arial"/>
-                <w:sz w:val="18"/>
-                <w:szCs w:val="18"/>
-              </w:rPr>
-            </w:pPr>
-            <w:hyperlink r:id="rId11" w:history="1">
-              <w:r>
-                <w:rPr>
-                  <w:rStyle w:val="Hyperlink"/>
-                  <w:rFonts w:ascii="HelveticaNeueLT Pro 55 Roman" w:hAnsi="HelveticaNeueLT Pro 55 Roman" w:cs="Arial"/>
-                  <w:sz w:val="18"/>
-                  <w:szCs w:val="18"/>
-                </w:rPr>
-                <w:t>rod@basedin.nyc</w:t>
-              </w:r>
-            </w:hyperlink>
-            <w:r>
-              <w:rPr>
-                <w:rFonts w:ascii="HelveticaNeueLT Pro 55 Roman" w:hAnsi="HelveticaNeueLT Pro 55 Roman" w:cs="Arial"/>
-                <w:sz w:val="18"/>
-                <w:szCs w:val="18"/>
-              </w:rPr>
-              <w:br/>
-            </w:r>
-            <w:hyperlink r:id="rId12" w:history="1">
-              <w:r>
-                <w:rPr>
-                  <w:rStyle w:val="Hyperlink"/>
-                  <w:rFonts w:ascii="HelveticaNeueLT Pro 55 Roman" w:hAnsi="HelveticaNeueLT Pro 55 Roman" w:cs="Arial"/>
-                  <w:color w:val="auto"/>
-                  <w:sz w:val="18"/>
-                  <w:szCs w:val="18"/>
-                </w:rPr>
-                <w:t>basedin.nyc</w:t>
-              </w:r>
-            </w:hyperlink>
-            <w:r>
-              <w:t xml:space="preserve"> </w:t>
-            </w:r>
-            <w:r>
-              <w:rPr>
-                <w:rFonts w:ascii="HelveticaNeueLT Pro 55 Roman" w:hAnsi="HelveticaNeueLT Pro 55 Roman"/>
-                <w:sz w:val="18"/>
-              </w:rPr>
-              <w:t xml:space="preserve">·  </w:t>
-            </w:r>
-            <w:r>
-              <w:rPr>
-                <w:rFonts w:ascii="HelveticaNeueLT Pro 55 Roman" w:hAnsi="HelveticaNeueLT Pro 55 Roman" w:cs="Arial"/>
-                <w:sz w:val="18"/>
-                <w:szCs w:val="18"/>
-              </w:rPr>
-              <w:t>(347) 644-9</w:t>
-            </w:r>
-            <w:r>
-              <w:rPr>
-                <w:rFonts w:ascii="HelveticaNeueLT Pro 55 Roman" w:hAnsi="HelveticaNeueLT Pro 55 Roman" w:cs="Arial"/>
-                <w:sz w:val="18"/>
-                <w:szCs w:val="18"/>
-              </w:rPr>
-              <w:t>00</w:t>
-            </w:r>
-            <w:r>
-              <w:rPr>
-                <w:rFonts w:ascii="HelveticaNeueLT Pro 55 Roman" w:hAnsi="HelveticaNeueLT Pro 55 Roman" w:cs="Arial"/>
-                <w:sz w:val="18"/>
-                <w:szCs w:val="18"/>
-              </w:rPr>
-              <w:t>1</w:t>
             </w:r>
           </w:p>
         </w:tc>
@@ -341,8 +259,8 @@
         <w:spacing w:line="360" w:lineRule="auto"/>
         <w:rPr>
           <w:rFonts w:ascii="HelveticaNeueLT Pro 55 Roman" w:hAnsi="HelveticaNeueLT Pro 55 Roman" w:cs="Arial"/>
-          <w:sz w:val="14"/>
-          <w:szCs w:val="14"/>
+          <w:sz w:val="18"/>
+          <w:szCs w:val="18"/>
         </w:rPr>
       </w:pPr>
       <w:r>
@@ -356,18 +274,18 @@
     </w:p>
     <w:tbl>
       <w:tblPr>
-        <w:tblW w:w="10314" w:type="dxa"/>
+        <w:tblW w:w="10080" w:type="dxa"/>
         <w:shd w:val="clear" w:color="auto" w:fill="FFFFFF"/>
         <w:tblLayout w:type="fixed"/>
         <w:tblLook w:val="0000" w:firstRow="0" w:lastRow="0" w:firstColumn="0" w:lastColumn="0" w:noHBand="0" w:noVBand="0"/>
       </w:tblPr>
       <w:tblGrid>
-        <w:gridCol w:w="10314"/>
+        <w:gridCol w:w="10080"/>
       </w:tblGrid>
       <w:tr>
         <w:tc>
           <w:tcPr>
-            <w:tcW w:w="10314" w:type="dxa"/>
+            <w:tcW w:w="10080" w:type="dxa"/>
             <w:tcBorders>
               <w:bottom w:val="single" w:sz="6" w:space="0" w:color="C0C0C0"/>
             </w:tcBorders>
@@ -398,7 +316,7 @@
         </w:trPr>
         <w:tc>
           <w:tcPr>
-            <w:tcW w:w="10314" w:type="dxa"/>
+            <w:tcW w:w="10080" w:type="dxa"/>
             <w:tcBorders>
               <w:top w:val="single" w:sz="6" w:space="0" w:color="C0C0C0"/>
             </w:tcBorders>
@@ -500,6 +418,7 @@
                 <w:ilvl w:val="0"/>
                 <w:numId w:val="1"/>
               </w:numPr>
+              <w:spacing w:before="60" w:after="40"/>
               <w:rPr>
                 <w:rFonts w:ascii="HelveticaNeueLT Pro 55 Roman" w:hAnsi="HelveticaNeueLT Pro 55 Roman" w:cs="Arial"/>
                 <w:sz w:val="22"/>
@@ -537,6 +456,7 @@
                 <w:ilvl w:val="0"/>
                 <w:numId w:val="1"/>
               </w:numPr>
+              <w:spacing w:before="60" w:after="40"/>
               <w:rPr>
                 <w:rFonts w:ascii="HelveticaNeueLT Pro 55 Roman" w:hAnsi="HelveticaNeueLT Pro 55 Roman" w:cs="Arial"/>
                 <w:sz w:val="22"/>
@@ -574,6 +494,7 @@
                 <w:ilvl w:val="0"/>
                 <w:numId w:val="1"/>
               </w:numPr>
+              <w:spacing w:before="60" w:after="40"/>
               <w:ind w:right="188"/>
               <w:rPr>
                 <w:rFonts w:ascii="HelveticaNeueLT Pro 55 Roman" w:hAnsi="HelveticaNeueLT Pro 55 Roman" w:cs="Arial"/>
@@ -587,6 +508,30 @@
                 <w:sz w:val="22"/>
                 <w:szCs w:val="20"/>
               </w:rPr>
+              <w:t>65</w:t>
+            </w:r>
+            <w:r>
+              <w:rPr>
+                <w:rFonts w:ascii="HelveticaNeueLT Pro 55 Roman" w:hAnsi="HelveticaNeueLT Pro 55 Roman" w:cs="Arial"/>
+                <w:sz w:val="22"/>
+                <w:szCs w:val="20"/>
+              </w:rPr>
+              <w:t>0</w:t>
+            </w:r>
+            <w:r>
+              <w:rPr>
+                <w:rFonts w:ascii="HelveticaNeueLT Pro 55 Roman" w:hAnsi="HelveticaNeueLT Pro 55 Roman" w:cs="Arial"/>
+                <w:sz w:val="22"/>
+                <w:szCs w:val="20"/>
+              </w:rPr>
+              <w:t xml:space="preserve"> merged PRs across </w:t>
+            </w:r>
+            <w:r>
+              <w:rPr>
+                <w:rFonts w:ascii="HelveticaNeueLT Pro 55 Roman" w:hAnsi="HelveticaNeueLT Pro 55 Roman" w:cs="Arial"/>
+                <w:sz w:val="22"/>
+                <w:szCs w:val="20"/>
+              </w:rPr>
               <w:t>6</w:t>
             </w:r>
             <w:r>
@@ -595,6 +540,174 @@
                 <w:sz w:val="22"/>
                 <w:szCs w:val="20"/>
               </w:rPr>
+              <w:t xml:space="preserve"> </w:t>
+            </w:r>
+            <w:r>
+              <w:rPr>
+                <w:rFonts w:ascii="HelveticaNeueLT Pro 55 Roman" w:hAnsi="HelveticaNeueLT Pro 55 Roman" w:cs="Arial"/>
+                <w:sz w:val="22"/>
+                <w:szCs w:val="20"/>
+              </w:rPr>
+              <w:t xml:space="preserve">popular </w:t>
+            </w:r>
+            <w:r>
+              <w:rPr>
+                <w:rFonts w:ascii="HelveticaNeueLT Pro 55 Roman" w:hAnsi="HelveticaNeueLT Pro 55 Roman" w:cs="Arial"/>
+                <w:sz w:val="22"/>
+                <w:szCs w:val="20"/>
+              </w:rPr>
+              <w:t>AI tooling repos. #1 contributor</w:t>
+            </w:r>
+            <w:r>
+              <w:rPr>
+                <w:rFonts w:ascii="HelveticaNeueLT Pro 55 Roman" w:hAnsi="HelveticaNeueLT Pro 55 Roman" w:cs="Arial"/>
+                <w:sz w:val="22"/>
+                <w:szCs w:val="20"/>
+              </w:rPr>
+              <w:t xml:space="preserve"> </w:t>
+            </w:r>
+            <w:r>
+              <w:rPr>
+                <w:rFonts w:ascii="HelveticaNeueLT Pro 55 Roman" w:hAnsi="HelveticaNeueLT Pro 55 Roman" w:cs="Arial"/>
+                <w:sz w:val="22"/>
+                <w:szCs w:val="20"/>
+              </w:rPr>
+              <w:t>to</w:t>
+            </w:r>
+            <w:r>
+              <w:rPr>
+                <w:rFonts w:ascii="HelveticaNeueLT Pro 55 Roman" w:hAnsi="HelveticaNeueLT Pro 55 Roman" w:cs="Arial"/>
+                <w:sz w:val="22"/>
+                <w:szCs w:val="20"/>
+              </w:rPr>
+              <w:t xml:space="preserve"> </w:t>
+            </w:r>
+            <w:r>
+              <w:rPr>
+                <w:rFonts w:ascii="HelveticaNeueLT Pro 55 Roman" w:hAnsi="HelveticaNeueLT Pro 55 Roman" w:cs="Arial"/>
+                <w:sz w:val="22"/>
+                <w:szCs w:val="20"/>
+              </w:rPr>
+              <w:t>claude-mem (</w:t>
+            </w:r>
+            <w:r>
+              <w:rPr>
+                <w:rFonts w:ascii="HelveticaNeueLT Pro 55 Roman" w:hAnsi="HelveticaNeueLT Pro 55 Roman" w:cs="Arial"/>
+                <w:sz w:val="22"/>
+                <w:szCs w:val="20"/>
+              </w:rPr>
+              <w:t>92</w:t>
+            </w:r>
+            <w:r>
+              <w:rPr>
+                <w:rFonts w:ascii="HelveticaNeueLT Pro 55 Roman" w:hAnsi="HelveticaNeueLT Pro 55 Roman" w:cs="Arial"/>
+                <w:sz w:val="22"/>
+                <w:szCs w:val="20"/>
+              </w:rPr>
+              <w:t>k</w:t>
+            </w:r>
+            <w:r>
+              <w:rPr>
+                <w:rFonts w:ascii="HelveticaNeueLT Pro 55 Roman" w:hAnsi="HelveticaNeueLT Pro 55 Roman" w:cs="Arial"/>
+                <w:sz w:val="22"/>
+                <w:szCs w:val="20"/>
+              </w:rPr>
+              <w:t xml:space="preserve">), </w:t>
+            </w:r>
+            <w:r>
+              <w:rPr>
+                <w:rFonts w:ascii="HelveticaNeueLT Pro 55 Roman" w:hAnsi="HelveticaNeueLT Pro 55 Roman" w:cs="Arial"/>
+                <w:sz w:val="22"/>
+                <w:szCs w:val="20"/>
+              </w:rPr>
+              <w:t>hermes</w:t>
+            </w:r>
+            <w:r>
+              <w:rPr>
+                <w:rFonts w:ascii="HelveticaNeueLT Pro 55 Roman" w:hAnsi="HelveticaNeueLT Pro 55 Roman" w:cs="Arial"/>
+                <w:sz w:val="22"/>
+                <w:szCs w:val="20"/>
+              </w:rPr>
+              <w:t>-webui (1</w:t>
+            </w:r>
+            <w:r>
+              <w:rPr>
+                <w:rFonts w:ascii="HelveticaNeueLT Pro 55 Roman" w:hAnsi="HelveticaNeueLT Pro 55 Roman" w:cs="Arial"/>
+                <w:sz w:val="22"/>
+                <w:szCs w:val="20"/>
+              </w:rPr>
+              <w:t>8</w:t>
+            </w:r>
+            <w:r>
+              <w:rPr>
+                <w:rFonts w:ascii="HelveticaNeueLT Pro 55 Roman" w:hAnsi="HelveticaNeueLT Pro 55 Roman" w:cs="Arial"/>
+                <w:sz w:val="22"/>
+                <w:szCs w:val="20"/>
+              </w:rPr>
+              <w:t>k)</w:t>
+            </w:r>
+            <w:r>
+              <w:rPr>
+                <w:rFonts w:ascii="HelveticaNeueLT Pro 55 Roman" w:hAnsi="HelveticaNeueLT Pro 55 Roman" w:cs="Arial"/>
+                <w:sz w:val="22"/>
+                <w:szCs w:val="20"/>
+              </w:rPr>
+              <w:t>,</w:t>
+            </w:r>
+            <w:r>
+              <w:rPr>
+                <w:rFonts w:ascii="HelveticaNeueLT Pro 55 Roman" w:hAnsi="HelveticaNeueLT Pro 55 Roman" w:cs="Arial"/>
+                <w:sz w:val="22"/>
+                <w:szCs w:val="20"/>
+              </w:rPr>
+              <w:t xml:space="preserve"> or</w:t>
+            </w:r>
+            <w:r>
+              <w:rPr>
+                <w:rFonts w:ascii="HelveticaNeueLT Pro 55 Roman" w:hAnsi="HelveticaNeueLT Pro 55 Roman" w:cs="Arial"/>
+                <w:sz w:val="22"/>
+                <w:szCs w:val="20"/>
+              </w:rPr>
+              <w:t>ca (</w:t>
+            </w:r>
+            <w:r>
+              <w:rPr>
+                <w:rFonts w:ascii="HelveticaNeueLT Pro 55 Roman" w:hAnsi="HelveticaNeueLT Pro 55 Roman" w:cs="Arial"/>
+                <w:sz w:val="22"/>
+                <w:szCs w:val="20"/>
+              </w:rPr>
+              <w:t>52</w:t>
+            </w:r>
+            <w:r>
+              <w:rPr>
+                <w:rFonts w:ascii="HelveticaNeueLT Pro 55 Roman" w:hAnsi="HelveticaNeueLT Pro 55 Roman" w:cs="Arial"/>
+                <w:sz w:val="22"/>
+                <w:szCs w:val="20"/>
+              </w:rPr>
+              <w:t>k)</w:t>
+            </w:r>
+            <w:r>
+              <w:rPr>
+                <w:rFonts w:ascii="HelveticaNeueLT Pro 55 Roman" w:hAnsi="HelveticaNeueLT Pro 55 Roman" w:cs="Arial"/>
+                <w:sz w:val="22"/>
+                <w:szCs w:val="20"/>
+              </w:rPr>
+              <w:t xml:space="preserve">, </w:t>
+            </w:r>
+            <w:r>
+              <w:rPr>
+                <w:rFonts w:ascii="HelveticaNeueLT Pro 55 Roman" w:hAnsi="HelveticaNeueLT Pro 55 Roman" w:cs="Arial"/>
+                <w:sz w:val="22"/>
+                <w:szCs w:val="20"/>
+              </w:rPr>
+              <w:t>agentsview (</w:t>
+            </w:r>
+            <w:r>
+              <w:rPr>
+                <w:rFonts w:ascii="HelveticaNeueLT Pro 55 Roman" w:hAnsi="HelveticaNeueLT Pro 55 Roman" w:cs="Arial"/>
+                <w:sz w:val="22"/>
+                <w:szCs w:val="20"/>
+              </w:rPr>
               <w:t>5</w:t>
             </w:r>
             <w:r>
@@ -603,15 +716,23 @@
                 <w:sz w:val="22"/>
                 <w:szCs w:val="20"/>
               </w:rPr>
-              <w:t xml:space="preserve">0 merged PRs across </w:t>
-            </w:r>
-            <w:r>
-              <w:rPr>
-                <w:rFonts w:ascii="HelveticaNeueLT Pro 55 Roman" w:hAnsi="HelveticaNeueLT Pro 55 Roman" w:cs="Arial"/>
-                <w:sz w:val="22"/>
-                <w:szCs w:val="20"/>
-              </w:rPr>
-              <w:t>5</w:t>
+              <w:t>k)</w:t>
+            </w:r>
+            <w:r>
+              <w:rPr>
+                <w:rFonts w:ascii="HelveticaNeueLT Pro 55 Roman" w:hAnsi="HelveticaNeueLT Pro 55 Roman" w:cs="Arial"/>
+                <w:sz w:val="22"/>
+                <w:szCs w:val="20"/>
+              </w:rPr>
+              <w:t xml:space="preserve">; #2 </w:t>
+            </w:r>
+            <w:r>
+              <w:rPr>
+                <w:rFonts w:ascii="HelveticaNeueLT Pro 55 Roman" w:hAnsi="HelveticaNeueLT Pro 55 Roman" w:cs="Arial"/>
+                <w:sz w:val="22"/>
+                <w:szCs w:val="20"/>
+              </w:rPr>
+              <w:t>on</w:t>
             </w:r>
             <w:r>
               <w:rPr>
@@ -627,47 +748,15 @@
                 <w:sz w:val="22"/>
                 <w:szCs w:val="20"/>
               </w:rPr>
-              <w:t xml:space="preserve">popular </w:t>
-            </w:r>
-            <w:r>
-              <w:rPr>
-                <w:rFonts w:ascii="HelveticaNeueLT Pro 55 Roman" w:hAnsi="HelveticaNeueLT Pro 55 Roman" w:cs="Arial"/>
-                <w:sz w:val="22"/>
-                <w:szCs w:val="20"/>
-              </w:rPr>
-              <w:t>AI tooling repos. #1 contributor</w:t>
-            </w:r>
-            <w:r>
-              <w:rPr>
-                <w:rFonts w:ascii="HelveticaNeueLT Pro 55 Roman" w:hAnsi="HelveticaNeueLT Pro 55 Roman" w:cs="Arial"/>
-                <w:sz w:val="22"/>
-                <w:szCs w:val="20"/>
-              </w:rPr>
-              <w:t xml:space="preserve"> </w:t>
-            </w:r>
-            <w:r>
-              <w:rPr>
-                <w:rFonts w:ascii="HelveticaNeueLT Pro 55 Roman" w:hAnsi="HelveticaNeueLT Pro 55 Roman" w:cs="Arial"/>
-                <w:sz w:val="22"/>
-                <w:szCs w:val="20"/>
-              </w:rPr>
-              <w:t>to</w:t>
-            </w:r>
-            <w:r>
-              <w:rPr>
-                <w:rFonts w:ascii="HelveticaNeueLT Pro 55 Roman" w:hAnsi="HelveticaNeueLT Pro 55 Roman" w:cs="Arial"/>
-                <w:sz w:val="22"/>
-                <w:szCs w:val="20"/>
-              </w:rPr>
-              <w:t xml:space="preserve"> </w:t>
-            </w:r>
-            <w:r>
-              <w:rPr>
-                <w:rFonts w:ascii="HelveticaNeueLT Pro 55 Roman" w:hAnsi="HelveticaNeueLT Pro 55 Roman" w:cs="Arial"/>
-                <w:sz w:val="22"/>
-                <w:szCs w:val="20"/>
-              </w:rPr>
-              <w:t>claude-mem (8</w:t>
+              <w:t>headroom (</w:t>
+            </w:r>
+            <w:r>
+              <w:rPr>
+                <w:rFonts w:ascii="HelveticaNeueLT Pro 55 Roman" w:hAnsi="HelveticaNeueLT Pro 55 Roman" w:cs="Arial"/>
+                <w:sz w:val="22"/>
+                <w:szCs w:val="20"/>
+              </w:rPr>
+              <w:t>6</w:t>
             </w:r>
             <w:r>
               <w:rPr>
@@ -676,142 +765,6 @@
                 <w:szCs w:val="20"/>
               </w:rPr>
               <w:t>8</w:t>
-            </w:r>
-            <w:r>
-              <w:rPr>
-                <w:rFonts w:ascii="HelveticaNeueLT Pro 55 Roman" w:hAnsi="HelveticaNeueLT Pro 55 Roman" w:cs="Arial"/>
-                <w:sz w:val="22"/>
-                <w:szCs w:val="20"/>
-              </w:rPr>
-              <w:t>k</w:t>
-            </w:r>
-            <w:r>
-              <w:rPr>
-                <w:rFonts w:ascii="HelveticaNeueLT Pro 55 Roman" w:hAnsi="HelveticaNeueLT Pro 55 Roman" w:cs="Arial"/>
-                <w:sz w:val="22"/>
-                <w:szCs w:val="20"/>
-              </w:rPr>
-              <w:t xml:space="preserve">), </w:t>
-            </w:r>
-            <w:r>
-              <w:rPr>
-                <w:rFonts w:ascii="HelveticaNeueLT Pro 55 Roman" w:hAnsi="HelveticaNeueLT Pro 55 Roman" w:cs="Arial"/>
-                <w:sz w:val="22"/>
-                <w:szCs w:val="20"/>
-              </w:rPr>
-              <w:t>hermes</w:t>
-            </w:r>
-            <w:r>
-              <w:rPr>
-                <w:rFonts w:ascii="HelveticaNeueLT Pro 55 Roman" w:hAnsi="HelveticaNeueLT Pro 55 Roman" w:cs="Arial"/>
-                <w:sz w:val="22"/>
-                <w:szCs w:val="20"/>
-              </w:rPr>
-              <w:t>-webui (16k)</w:t>
-            </w:r>
-            <w:r>
-              <w:rPr>
-                <w:rFonts w:ascii="HelveticaNeueLT Pro 55 Roman" w:hAnsi="HelveticaNeueLT Pro 55 Roman" w:cs="Arial"/>
-                <w:sz w:val="22"/>
-                <w:szCs w:val="20"/>
-              </w:rPr>
-              <w:t>,</w:t>
-            </w:r>
-            <w:r>
-              <w:rPr>
-                <w:rFonts w:ascii="HelveticaNeueLT Pro 55 Roman" w:hAnsi="HelveticaNeueLT Pro 55 Roman" w:cs="Arial"/>
-                <w:sz w:val="22"/>
-                <w:szCs w:val="20"/>
-              </w:rPr>
-              <w:t xml:space="preserve"> or</w:t>
-            </w:r>
-            <w:r>
-              <w:rPr>
-                <w:rFonts w:ascii="HelveticaNeueLT Pro 55 Roman" w:hAnsi="HelveticaNeueLT Pro 55 Roman" w:cs="Arial"/>
-                <w:sz w:val="22"/>
-                <w:szCs w:val="20"/>
-              </w:rPr>
-              <w:t>ca (</w:t>
-            </w:r>
-            <w:r>
-              <w:rPr>
-                <w:rFonts w:ascii="HelveticaNeueLT Pro 55 Roman" w:hAnsi="HelveticaNeueLT Pro 55 Roman" w:cs="Arial"/>
-                <w:sz w:val="22"/>
-                <w:szCs w:val="20"/>
-              </w:rPr>
-              <w:t>26</w:t>
-            </w:r>
-            <w:r>
-              <w:rPr>
-                <w:rFonts w:ascii="HelveticaNeueLT Pro 55 Roman" w:hAnsi="HelveticaNeueLT Pro 55 Roman" w:cs="Arial"/>
-                <w:sz w:val="22"/>
-                <w:szCs w:val="20"/>
-              </w:rPr>
-              <w:t>k)</w:t>
-            </w:r>
-            <w:r>
-              <w:rPr>
-                <w:rFonts w:ascii="HelveticaNeueLT Pro 55 Roman" w:hAnsi="HelveticaNeueLT Pro 55 Roman" w:cs="Arial"/>
-                <w:sz w:val="22"/>
-                <w:szCs w:val="20"/>
-              </w:rPr>
-              <w:t xml:space="preserve">, </w:t>
-            </w:r>
-            <w:r>
-              <w:rPr>
-                <w:rFonts w:ascii="HelveticaNeueLT Pro 55 Roman" w:hAnsi="HelveticaNeueLT Pro 55 Roman" w:cs="Arial"/>
-                <w:sz w:val="22"/>
-                <w:szCs w:val="20"/>
-              </w:rPr>
-              <w:t>agentsview (4</w:t>
-            </w:r>
-            <w:r>
-              <w:rPr>
-                <w:rFonts w:ascii="HelveticaNeueLT Pro 55 Roman" w:hAnsi="HelveticaNeueLT Pro 55 Roman" w:cs="Arial"/>
-                <w:sz w:val="22"/>
-                <w:szCs w:val="20"/>
-              </w:rPr>
-              <w:t>k)</w:t>
-            </w:r>
-            <w:r>
-              <w:rPr>
-                <w:rFonts w:ascii="HelveticaNeueLT Pro 55 Roman" w:hAnsi="HelveticaNeueLT Pro 55 Roman" w:cs="Arial"/>
-                <w:sz w:val="22"/>
-                <w:szCs w:val="20"/>
-              </w:rPr>
-              <w:t xml:space="preserve">; #2 </w:t>
-            </w:r>
-            <w:r>
-              <w:rPr>
-                <w:rFonts w:ascii="HelveticaNeueLT Pro 55 Roman" w:hAnsi="HelveticaNeueLT Pro 55 Roman" w:cs="Arial"/>
-                <w:sz w:val="22"/>
-                <w:szCs w:val="20"/>
-              </w:rPr>
-              <w:t>on</w:t>
-            </w:r>
-            <w:r>
-              <w:rPr>
-                <w:rFonts w:ascii="HelveticaNeueLT Pro 55 Roman" w:hAnsi="HelveticaNeueLT Pro 55 Roman" w:cs="Arial"/>
-                <w:sz w:val="22"/>
-                <w:szCs w:val="20"/>
-              </w:rPr>
-              <w:t xml:space="preserve"> </w:t>
-            </w:r>
-            <w:r>
-              <w:rPr>
-                <w:rFonts w:ascii="HelveticaNeueLT Pro 55 Roman" w:hAnsi="HelveticaNeueLT Pro 55 Roman" w:cs="Arial"/>
-                <w:sz w:val="22"/>
-                <w:szCs w:val="20"/>
-              </w:rPr>
-              <w:t>headroom (</w:t>
-            </w:r>
-            <w:r>
-              <w:rPr>
-                <w:rFonts w:ascii="HelveticaNeueLT Pro 55 Roman" w:hAnsi="HelveticaNeueLT Pro 55 Roman" w:cs="Arial"/>
-                <w:sz w:val="22"/>
-                <w:szCs w:val="20"/>
-              </w:rPr>
-              <w:t>61</w:t>
             </w:r>
             <w:r>
               <w:rPr>
@@ -836,7 +789,7 @@
                 <w:ilvl w:val="0"/>
                 <w:numId w:val="1"/>
               </w:numPr>
-              <w:spacing w:line="264" w:lineRule="auto"/>
+              <w:spacing w:before="60" w:after="40" w:line="264" w:lineRule="auto"/>
               <w:rPr>
                 <w:rFonts w:ascii="HelveticaNeueLT Pro 55 Roman" w:hAnsi="HelveticaNeueLT Pro 55 Roman" w:cs="Arial"/>
                 <w:sz w:val="22"/>
@@ -874,13 +827,14 @@
     <w:p>
       <w:pPr>
         <w:rPr>
-          <w:rFonts w:ascii="HelveticaNeueLT Pro 55 Roman" w:hAnsi="HelveticaNeueLT Pro 55 Roman"/>
+          <w:sz w:val="28"/>
+          <w:szCs w:val="28"/>
         </w:rPr>
       </w:pPr>
     </w:p>
     <w:tbl>
       <w:tblPr>
-        <w:tblW w:w="10260" w:type="dxa"/>
+        <w:tblW w:w="10062" w:type="dxa"/>
         <w:tblInd w:w="18" w:type="dxa"/>
         <w:tblBorders>
           <w:bottom w:val="single" w:sz="6" w:space="0" w:color="C0C0C0"/>
@@ -890,12 +844,12 @@
         <w:tblLook w:val="0000" w:firstRow="0" w:lastRow="0" w:firstColumn="0" w:lastColumn="0" w:noHBand="0" w:noVBand="0"/>
       </w:tblPr>
       <w:tblGrid>
-        <w:gridCol w:w="10260"/>
+        <w:gridCol w:w="10062"/>
       </w:tblGrid>
       <w:tr>
         <w:tc>
           <w:tcPr>
-            <w:tcW w:w="10260" w:type="dxa"/>
+            <w:tcW w:w="10062" w:type="dxa"/>
             <w:shd w:val="clear" w:color="auto" w:fill="FFFFFF"/>
           </w:tcPr>
           <w:p>
@@ -922,24 +876,21 @@
     <w:p>
       <w:pPr>
         <w:spacing w:line="96" w:lineRule="auto"/>
-        <w:rPr>
-          <w:rFonts w:ascii="HelveticaNeueLT Pro 55 Roman" w:hAnsi="HelveticaNeueLT Pro 55 Roman" w:cs="Arial"/>
-        </w:rPr>
       </w:pPr>
     </w:p>
     <w:tbl>
       <w:tblPr>
-        <w:tblW w:w="10278" w:type="dxa"/>
+        <w:tblW w:w="10080" w:type="dxa"/>
         <w:tblLook w:val="0000" w:firstRow="0" w:lastRow="0" w:firstColumn="0" w:lastColumn="0" w:noHBand="0" w:noVBand="0"/>
       </w:tblPr>
       <w:tblGrid>
-        <w:gridCol w:w="8028"/>
-        <w:gridCol w:w="2250"/>
+        <w:gridCol w:w="7873"/>
+        <w:gridCol w:w="2207"/>
       </w:tblGrid>
       <w:tr>
         <w:tc>
           <w:tcPr>
-            <w:tcW w:w="8028" w:type="dxa"/>
+            <w:tcW w:w="7873" w:type="dxa"/>
           </w:tcPr>
           <w:p>
             <w:pPr>
@@ -1003,7 +954,7 @@
         </w:tc>
         <w:tc>
           <w:tcPr>
-            <w:tcW w:w="2250" w:type="dxa"/>
+            <w:tcW w:w="2207" w:type="dxa"/>
             <w:vAlign w:val="bottom"/>
           </w:tcPr>
           <w:p>
@@ -1038,7 +989,21 @@
           <w:rFonts w:ascii="HelveticaNeueLT Pro 55 Roman" w:hAnsi="HelveticaNeueLT Pro 55 Roman"/>
           <w:sz w:val="25"/>
         </w:rPr>
-        <w:t xml:space="preserve">Full-Stack Developer </w:t>
+        <w:t xml:space="preserve">Full-Stack </w:t>
+      </w:r>
+      <w:r>
+        <w:rPr>
+          <w:rFonts w:ascii="HelveticaNeueLT Pro 55 Roman" w:hAnsi="HelveticaNeueLT Pro 55 Roman"/>
+          <w:sz w:val="25"/>
+        </w:rPr>
+        <w:t>Engineer</w:t>
+      </w:r>
+      <w:r>
+        <w:rPr>
+          <w:rFonts w:ascii="HelveticaNeueLT Pro 55 Roman" w:hAnsi="HelveticaNeueLT Pro 55 Roman"/>
+          <w:sz w:val="25"/>
+        </w:rPr>
+        <w:t xml:space="preserve"> </w:t>
       </w:r>
       <w:r>
         <w:rPr>
@@ -1159,7 +1124,39 @@
           <w:sz w:val="22"/>
           <w:szCs w:val="20"/>
         </w:rPr>
-        <w:t xml:space="preserve"> Liberty Pest Control, Kim Seybert, Meridian Capital Group, VineSpring, and Pip’s Island. Agenc</w:t>
+        <w:t xml:space="preserve"> Liberty Pest Control, </w:t>
+      </w:r>
+      <w:r>
+        <w:rPr>
+          <w:rFonts w:ascii="HelveticaNeueLT Pro 55 Roman" w:hAnsi="HelveticaNeueLT Pro 55 Roman" w:cs="Arial"/>
+          <w:sz w:val="22"/>
+          <w:szCs w:val="20"/>
+        </w:rPr>
+        <w:t>Meridian Capital Group</w:t>
+      </w:r>
+      <w:r>
+        <w:rPr>
+          <w:rFonts w:ascii="HelveticaNeueLT Pro 55 Roman" w:hAnsi="HelveticaNeueLT Pro 55 Roman" w:cs="Arial"/>
+          <w:sz w:val="22"/>
+          <w:szCs w:val="20"/>
+        </w:rPr>
+        <w:t xml:space="preserve"> (CRE)</w:t>
+      </w:r>
+      <w:r>
+        <w:rPr>
+          <w:rFonts w:ascii="HelveticaNeueLT Pro 55 Roman" w:hAnsi="HelveticaNeueLT Pro 55 Roman" w:cs="Arial"/>
+          <w:sz w:val="22"/>
+          <w:szCs w:val="20"/>
+        </w:rPr>
+        <w:t xml:space="preserve">, </w:t>
+      </w:r>
+      <w:r>
+        <w:rPr>
+          <w:rFonts w:ascii="HelveticaNeueLT Pro 55 Roman" w:hAnsi="HelveticaNeueLT Pro 55 Roman" w:cs="Arial"/>
+          <w:sz w:val="22"/>
+          <w:szCs w:val="20"/>
+        </w:rPr>
+        <w:t>Kim Seybert, VineSpring, and Pip’s Island. Agenc</w:t>
       </w:r>
       <w:r>
         <w:rPr>
@@ -1229,6 +1226,7 @@
           <w:sz w:val="18"/>
         </w:rPr>
       </w:pPr>
+      <w:proofErr w:type="gramStart"/>
       <w:r>
         <w:rPr>
           <w:rFonts w:ascii="HelveticaNeueLT Pro 55 Roman" w:hAnsi="HelveticaNeueLT Pro 55 Roman"/>
@@ -1237,6 +1235,15 @@
         </w:rPr>
         <w:t>Open Source</w:t>
       </w:r>
+      <w:proofErr w:type="gramEnd"/>
+      <w:r>
+        <w:rPr>
+          <w:rFonts w:ascii="HelveticaNeueLT Pro 55 Roman" w:hAnsi="HelveticaNeueLT Pro 55 Roman"/>
+          <w:b/>
+          <w:sz w:val="22"/>
+        </w:rPr>
+        <w:t xml:space="preserve"> Highlights</w:t>
+      </w:r>
       <w:r>
         <w:rPr>
           <w:rFonts w:ascii="HelveticaNeueLT Pro 55 Roman" w:hAnsi="HelveticaNeueLT Pro 55 Roman"/>
@@ -1297,7 +1304,7 @@
         </w:rPr>
         <w:t xml:space="preserve">: </w:t>
       </w:r>
-      <w:hyperlink r:id="rId13" w:history="1">
+      <w:hyperlink r:id="rId11" w:history="1">
         <w:proofErr w:type="spellStart"/>
         <w:r>
           <w:rPr>
@@ -1326,159 +1333,418 @@
       <w:pPr>
         <w:numPr>
           <w:ilvl w:val="0"/>
-          <w:numId w:val="6"/>
+          <w:numId w:val="1"/>
         </w:numPr>
-        <w:spacing w:before="60" w:line="276" w:lineRule="auto"/>
-        <w:rPr>
-          <w:rFonts w:ascii="HelveticaNeueLT Pro 55 Roman" w:hAnsi="HelveticaNeueLT Pro 55 Roman" w:cs="Arial"/>
-          <w:sz w:val="22"/>
-          <w:szCs w:val="20"/>
-        </w:rPr>
-      </w:pPr>
-      <w:hyperlink r:id="rId14" w:history="1">
-        <w:r>
-          <w:rPr>
-            <w:rStyle w:val="Hyperlink"/>
-            <w:rFonts w:ascii="HelveticaNeueLT Pro 55 Roman" w:hAnsi="HelveticaNeueLT Pro 55 Roman"/>
-            <w:b/>
-            <w:color w:val="auto"/>
-            <w:sz w:val="22"/>
-            <w:u w:val="none"/>
-          </w:rPr>
-          <w:t>thedotmack/claude-mem</w:t>
-        </w:r>
-      </w:hyperlink>
-      <w:r>
-        <w:rPr>
-          <w:rFonts w:ascii="HelveticaNeueLT Pro 55 Roman" w:hAnsi="HelveticaNeueLT Pro 55 Roman"/>
-          <w:sz w:val="18"/>
-        </w:rPr>
-        <w:t xml:space="preserve"> (8</w:t>
-      </w:r>
-      <w:r>
-        <w:rPr>
-          <w:rFonts w:ascii="HelveticaNeueLT Pro 55 Roman" w:hAnsi="HelveticaNeueLT Pro 55 Roman"/>
-          <w:sz w:val="18"/>
-        </w:rPr>
-        <w:t>9</w:t>
-      </w:r>
-      <w:r>
-        <w:rPr>
-          <w:rFonts w:ascii="HelveticaNeueLT Pro 55 Roman" w:hAnsi="HelveticaNeueLT Pro 55 Roman"/>
-          <w:sz w:val="18"/>
-        </w:rPr>
-        <w:t xml:space="preserve">k stars)  ·  </w:t>
-      </w:r>
-      <w:r>
-        <w:rPr>
-          <w:rFonts w:ascii="HelveticaNeueLT Pro 55 Roman" w:hAnsi="HelveticaNeueLT Pro 55 Roman"/>
+        <w:tabs>
+          <w:tab w:val="clear" w:pos="288"/>
+        </w:tabs>
+        <w:spacing w:before="80" w:after="40" w:line="264" w:lineRule="auto"/>
+        <w:ind w:left="547" w:hanging="259"/>
+        <w:rPr>
+          <w:rFonts w:ascii="HelveticaNeueLT Pro 55 Roman" w:hAnsi="HelveticaNeueLT Pro 55 Roman" w:cs="Arial"/>
+          <w:b/>
           <w:bCs/>
-          <w:sz w:val="18"/>
-        </w:rPr>
-        <w:t>TypeScript, JavaScript, Shell, HTML</w:t>
-      </w:r>
-      <w:r>
-        <w:rPr>
-          <w:rFonts w:ascii="HelveticaNeueLT Pro 55 Roman" w:hAnsi="HelveticaNeueLT Pro 55 Roman"/>
-          <w:sz w:val="18"/>
-        </w:rPr>
-        <w:t xml:space="preserve">  ·  </w:t>
-      </w:r>
-      <w:r>
-        <w:rPr>
-          <w:rFonts w:ascii="HelveticaNeueLT Pro 55 Roman" w:hAnsi="HelveticaNeueLT Pro 55 Roman"/>
-          <w:sz w:val="22"/>
-          <w:szCs w:val="22"/>
-        </w:rPr>
-        <w:t>Memory compression for Claude Code</w:t>
-      </w:r>
-      <w:r>
-        <w:rPr>
-          <w:rFonts w:ascii="HelveticaNeueLT Pro 55 Roman" w:hAnsi="HelveticaNeueLT Pro 55 Roman"/>
-          <w:sz w:val="22"/>
-          <w:szCs w:val="22"/>
-        </w:rPr>
-        <w:t xml:space="preserve">. </w:t>
-      </w:r>
-      <w:r>
-        <w:rPr>
-          <w:rFonts w:ascii="HelveticaNeueLT Pro 55 Roman" w:hAnsi="HelveticaNeueLT Pro 55 Roman" w:cs="Arial"/>
-          <w:sz w:val="22"/>
-          <w:szCs w:val="20"/>
-        </w:rPr>
-        <w:t>#</w:t>
-      </w:r>
-      <w:r>
-        <w:rPr>
-          <w:rFonts w:ascii="HelveticaNeueLT Pro 55 Roman" w:hAnsi="HelveticaNeueLT Pro 55 Roman" w:cs="Arial"/>
-          <w:sz w:val="22"/>
-          <w:szCs w:val="20"/>
+          <w:sz w:val="22"/>
+          <w:szCs w:val="20"/>
+        </w:rPr>
+      </w:pPr>
+      <w:r>
+        <w:rPr>
+          <w:rFonts w:ascii="HelveticaNeueLT Pro 55 Roman" w:hAnsi="HelveticaNeueLT Pro 55 Roman" w:cs="Arial"/>
+          <w:b/>
+          <w:bCs/>
+          <w:sz w:val="22"/>
+          <w:szCs w:val="20"/>
+        </w:rPr>
+        <w:t>H</w:t>
+      </w:r>
+      <w:r>
+        <w:rPr>
+          <w:rFonts w:ascii="HelveticaNeueLT Pro 55 Roman" w:hAnsi="HelveticaNeueLT Pro 55 Roman" w:cs="Arial"/>
+          <w:b/>
+          <w:bCs/>
+          <w:sz w:val="22"/>
+          <w:szCs w:val="20"/>
+        </w:rPr>
+        <w:t>ermes</w:t>
+      </w:r>
+      <w:r>
+        <w:rPr>
+          <w:rFonts w:ascii="HelveticaNeueLT Pro 55 Roman" w:hAnsi="HelveticaNeueLT Pro 55 Roman" w:cs="Arial"/>
+          <w:b/>
+          <w:bCs/>
+          <w:sz w:val="22"/>
+          <w:szCs w:val="20"/>
+        </w:rPr>
+        <w:t xml:space="preserve"> </w:t>
+      </w:r>
+      <w:proofErr w:type="spellStart"/>
+      <w:r>
+        <w:rPr>
+          <w:rFonts w:ascii="HelveticaNeueLT Pro 55 Roman" w:hAnsi="HelveticaNeueLT Pro 55 Roman" w:cs="Arial"/>
+          <w:b/>
+          <w:bCs/>
+          <w:sz w:val="22"/>
+          <w:szCs w:val="20"/>
+        </w:rPr>
+        <w:t>WebUI</w:t>
+      </w:r>
+      <w:proofErr w:type="spellEnd"/>
+      <w:r>
+        <w:rPr>
+          <w:rFonts w:ascii="HelveticaNeueLT Pro 55 Roman" w:hAnsi="HelveticaNeueLT Pro 55 Roman" w:cs="Arial"/>
+          <w:b/>
+          <w:bCs/>
+          <w:sz w:val="22"/>
+          <w:szCs w:val="20"/>
+        </w:rPr>
+        <w:t xml:space="preserve">: </w:t>
+      </w:r>
+      <w:r>
+        <w:rPr>
+          <w:rFonts w:ascii="HelveticaNeueLT Pro 55 Roman" w:hAnsi="HelveticaNeueLT Pro 55 Roman" w:cs="Arial"/>
+          <w:sz w:val="22"/>
+          <w:szCs w:val="20"/>
+        </w:rPr>
+        <w:t xml:space="preserve">Core contributor: </w:t>
+      </w:r>
+      <w:r>
+        <w:rPr>
+          <w:rFonts w:ascii="HelveticaNeueLT Pro 55 Roman" w:hAnsi="HelveticaNeueLT Pro 55 Roman" w:cs="Arial"/>
+          <w:sz w:val="22"/>
+          <w:szCs w:val="20"/>
+        </w:rPr>
+        <w:t>s</w:t>
+      </w:r>
+      <w:r>
+        <w:rPr>
+          <w:rFonts w:ascii="HelveticaNeueLT Pro 55 Roman" w:hAnsi="HelveticaNeueLT Pro 55 Roman" w:cs="Arial"/>
+          <w:sz w:val="22"/>
+          <w:szCs w:val="20"/>
+        </w:rPr>
+        <w:t>croll virtualization (viewport clipping, DOM recycling), agent streaming</w:t>
+      </w:r>
+      <w:r>
+        <w:rPr>
+          <w:rFonts w:ascii="HelveticaNeueLT Pro 55 Roman" w:hAnsi="HelveticaNeueLT Pro 55 Roman" w:cs="Arial"/>
+          <w:sz w:val="22"/>
+          <w:szCs w:val="20"/>
+        </w:rPr>
+        <w:t xml:space="preserve"> </w:t>
+      </w:r>
+      <w:r>
+        <w:rPr>
+          <w:rFonts w:ascii="HelveticaNeueLT Pro 55 Roman" w:hAnsi="HelveticaNeueLT Pro 55 Roman" w:cs="Arial"/>
+          <w:sz w:val="22"/>
+          <w:szCs w:val="20"/>
+        </w:rPr>
+        <w:t>(</w:t>
+      </w:r>
+      <w:r>
+        <w:rPr>
+          <w:rFonts w:ascii="HelveticaNeueLT Pro 55 Roman" w:hAnsi="HelveticaNeueLT Pro 55 Roman" w:cs="Arial"/>
+          <w:sz w:val="22"/>
+          <w:szCs w:val="20"/>
+        </w:rPr>
+        <w:t xml:space="preserve">transparent trace, compact worklog, </w:t>
+      </w:r>
+      <w:proofErr w:type="gramStart"/>
+      <w:r>
+        <w:rPr>
+          <w:rFonts w:ascii="HelveticaNeueLT Pro 55 Roman" w:hAnsi="HelveticaNeueLT Pro 55 Roman" w:cs="Arial"/>
+          <w:sz w:val="22"/>
+          <w:szCs w:val="20"/>
+        </w:rPr>
+        <w:t>final-answer</w:t>
+      </w:r>
+      <w:proofErr w:type="gramEnd"/>
+      <w:r>
+        <w:rPr>
+          <w:rFonts w:ascii="HelveticaNeueLT Pro 55 Roman" w:hAnsi="HelveticaNeueLT Pro 55 Roman" w:cs="Arial"/>
+          <w:sz w:val="22"/>
+          <w:szCs w:val="20"/>
+        </w:rPr>
+        <w:t xml:space="preserve"> only</w:t>
+      </w:r>
+      <w:r>
+        <w:rPr>
+          <w:rFonts w:ascii="HelveticaNeueLT Pro 55 Roman" w:hAnsi="HelveticaNeueLT Pro 55 Roman" w:cs="Arial"/>
+          <w:sz w:val="22"/>
+          <w:szCs w:val="20"/>
+        </w:rPr>
+        <w:t xml:space="preserve">), Playwright CI </w:t>
+      </w:r>
+      <w:r>
+        <w:rPr>
+          <w:rFonts w:ascii="HelveticaNeueLT Pro 55 Roman" w:hAnsi="HelveticaNeueLT Pro 55 Roman" w:cs="Arial"/>
+          <w:sz w:val="22"/>
+          <w:szCs w:val="20"/>
+        </w:rPr>
+        <w:t>layout linter</w:t>
+      </w:r>
+      <w:r>
+        <w:rPr>
+          <w:rFonts w:ascii="HelveticaNeueLT Pro 55 Roman" w:hAnsi="HelveticaNeueLT Pro 55 Roman" w:cs="Arial"/>
+          <w:sz w:val="22"/>
+          <w:szCs w:val="20"/>
+        </w:rPr>
+        <w:t>.</w:t>
+      </w:r>
+    </w:p>
+    <w:p>
+      <w:pPr>
+        <w:numPr>
+          <w:ilvl w:val="0"/>
+          <w:numId w:val="1"/>
+        </w:numPr>
+        <w:tabs>
+          <w:tab w:val="clear" w:pos="288"/>
+        </w:tabs>
+        <w:spacing w:before="80" w:after="40" w:line="264" w:lineRule="auto"/>
+        <w:ind w:left="547" w:hanging="259"/>
+        <w:rPr>
+          <w:rFonts w:ascii="HelveticaNeueLT Pro 55 Roman" w:hAnsi="HelveticaNeueLT Pro 55 Roman" w:cs="Arial"/>
+          <w:sz w:val="22"/>
+          <w:szCs w:val="20"/>
+        </w:rPr>
+      </w:pPr>
+      <w:r>
+        <w:rPr>
+          <w:rFonts w:ascii="HelveticaNeueLT Pro 55 Roman" w:hAnsi="HelveticaNeueLT Pro 55 Roman" w:cs="Arial"/>
+          <w:b/>
+          <w:bCs/>
+          <w:sz w:val="22"/>
+          <w:szCs w:val="20"/>
+        </w:rPr>
+        <w:t>Agentsview:</w:t>
+      </w:r>
+      <w:r>
+        <w:rPr>
+          <w:rFonts w:ascii="HelveticaNeueLT Pro 55 Roman" w:hAnsi="HelveticaNeueLT Pro 55 Roman" w:cs="Arial"/>
+          <w:b/>
+          <w:bCs/>
+          <w:sz w:val="22"/>
+          <w:szCs w:val="20"/>
+        </w:rPr>
+        <w:t xml:space="preserve"> </w:t>
+      </w:r>
+      <w:r>
+        <w:rPr>
+          <w:rFonts w:ascii="HelveticaNeueLT Pro 55 Roman" w:hAnsi="HelveticaNeueLT Pro 55 Roman" w:cs="Arial"/>
+          <w:sz w:val="22"/>
+          <w:szCs w:val="20"/>
+        </w:rPr>
+        <w:t>Provider-scoped incremental sync</w:t>
+      </w:r>
+      <w:r>
+        <w:rPr>
+          <w:rFonts w:ascii="HelveticaNeueLT Pro 55 Roman" w:hAnsi="HelveticaNeueLT Pro 55 Roman" w:cs="Arial"/>
+          <w:sz w:val="22"/>
+          <w:szCs w:val="20"/>
+        </w:rPr>
+        <w:t>, subagent cost analytics, transcript UX.</w:t>
+      </w:r>
+    </w:p>
+    <w:p>
+      <w:pPr>
+        <w:numPr>
+          <w:ilvl w:val="0"/>
+          <w:numId w:val="1"/>
+        </w:numPr>
+        <w:tabs>
+          <w:tab w:val="clear" w:pos="288"/>
+        </w:tabs>
+        <w:spacing w:before="80" w:after="40" w:line="264" w:lineRule="auto"/>
+        <w:ind w:left="547" w:hanging="259"/>
+        <w:rPr>
+          <w:rFonts w:ascii="HelveticaNeueLT Pro 55 Roman" w:hAnsi="HelveticaNeueLT Pro 55 Roman" w:cs="Arial"/>
+          <w:sz w:val="22"/>
+          <w:szCs w:val="20"/>
+        </w:rPr>
+      </w:pPr>
+      <w:r>
+        <w:rPr>
+          <w:rFonts w:ascii="HelveticaNeueLT Pro 55 Roman" w:hAnsi="HelveticaNeueLT Pro 55 Roman" w:cs="Arial"/>
+          <w:b/>
+          <w:bCs/>
+          <w:sz w:val="22"/>
+          <w:szCs w:val="20"/>
+        </w:rPr>
+        <w:t>Headroom:</w:t>
+      </w:r>
+      <w:r>
+        <w:rPr>
+          <w:rFonts w:ascii="HelveticaNeueLT Pro 55 Roman" w:hAnsi="HelveticaNeueLT Pro 55 Roman" w:cs="Arial"/>
+          <w:b/>
+          <w:bCs/>
+          <w:sz w:val="22"/>
+          <w:szCs w:val="20"/>
+        </w:rPr>
+        <w:t xml:space="preserve"> </w:t>
+      </w:r>
+      <w:r>
+        <w:rPr>
+          <w:rFonts w:ascii="HelveticaNeueLT Pro 55 Roman" w:hAnsi="HelveticaNeueLT Pro 55 Roman" w:cs="Arial"/>
+          <w:sz w:val="22"/>
+          <w:szCs w:val="20"/>
+        </w:rPr>
+        <w:t>Byte-</w:t>
+      </w:r>
+      <w:r>
+        <w:rPr>
+          <w:rFonts w:ascii="HelveticaNeueLT Pro 55 Roman" w:hAnsi="HelveticaNeueLT Pro 55 Roman" w:cs="Arial"/>
+          <w:sz w:val="22"/>
+          <w:szCs w:val="20"/>
+        </w:rPr>
+        <w:t>faithful</w:t>
+      </w:r>
+      <w:r>
+        <w:rPr>
+          <w:rFonts w:ascii="HelveticaNeueLT Pro 55 Roman" w:hAnsi="HelveticaNeueLT Pro 55 Roman" w:cs="Arial"/>
+          <w:sz w:val="22"/>
+          <w:szCs w:val="20"/>
+        </w:rPr>
+        <w:t xml:space="preserve"> tool forwarding, compression-safe tools, timeout hardening.</w:t>
+      </w:r>
+    </w:p>
+    <w:p>
+      <w:pPr>
+        <w:numPr>
+          <w:ilvl w:val="0"/>
+          <w:numId w:val="1"/>
+        </w:numPr>
+        <w:tabs>
+          <w:tab w:val="clear" w:pos="288"/>
+        </w:tabs>
+        <w:spacing w:before="80" w:after="40" w:line="264" w:lineRule="auto"/>
+        <w:ind w:left="547" w:hanging="259"/>
+        <w:rPr>
+          <w:rFonts w:ascii="HelveticaNeueLT Pro 55 Roman" w:hAnsi="HelveticaNeueLT Pro 55 Roman" w:cs="Arial"/>
+          <w:sz w:val="22"/>
+          <w:szCs w:val="20"/>
+        </w:rPr>
+      </w:pPr>
+      <w:r>
+        <w:rPr>
+          <w:rFonts w:ascii="HelveticaNeueLT Pro 55 Roman" w:hAnsi="HelveticaNeueLT Pro 55 Roman" w:cs="Arial"/>
+          <w:b/>
+          <w:bCs/>
+          <w:sz w:val="22"/>
+          <w:szCs w:val="20"/>
+        </w:rPr>
+        <w:t>Presidio:</w:t>
+      </w:r>
+      <w:r>
+        <w:rPr>
+          <w:rFonts w:ascii="HelveticaNeueLT Pro 55 Roman" w:hAnsi="HelveticaNeueLT Pro 55 Roman" w:cs="Arial"/>
+          <w:sz w:val="22"/>
+          <w:szCs w:val="20"/>
+        </w:rPr>
+        <w:t xml:space="preserve"> Configurable per-entity PII detection confidence thresholds.</w:t>
+      </w:r>
+    </w:p>
+    <w:p>
+      <w:pPr>
+        <w:spacing w:before="100" w:after="40" w:line="264" w:lineRule="auto"/>
+        <w:ind w:left="288"/>
+        <w:rPr>
+          <w:rFonts w:ascii="HelveticaNeueLT Pro 55 Roman" w:hAnsi="HelveticaNeueLT Pro 55 Roman" w:cs="Arial"/>
+          <w:sz w:val="18"/>
+          <w:szCs w:val="18"/>
+        </w:rPr>
+      </w:pPr>
+      <w:r>
+        <w:rPr>
+          <w:rFonts w:ascii="HelveticaNeueLT Pro 55 Roman" w:hAnsi="HelveticaNeueLT Pro 55 Roman"/>
+          <w:b/>
+          <w:sz w:val="18"/>
+        </w:rPr>
+        <w:t xml:space="preserve">Stack: </w:t>
+      </w:r>
+      <w:r>
+        <w:rPr>
+          <w:rFonts w:ascii="HelveticaNeueLT Pro 55 Roman" w:hAnsi="HelveticaNeueLT Pro 55 Roman"/>
+          <w:sz w:val="18"/>
+        </w:rPr>
+        <w:t xml:space="preserve">TypeScript, </w:t>
+      </w:r>
+      <w:r>
+        <w:rPr>
+          <w:rFonts w:ascii="HelveticaNeueLT Pro 55 Roman" w:hAnsi="HelveticaNeueLT Pro 55 Roman"/>
+          <w:sz w:val="18"/>
+        </w:rPr>
+        <w:t xml:space="preserve">JavaScript, CSS, HTML, Python, Go, Svelte, </w:t>
+      </w:r>
+      <w:r>
+        <w:rPr>
+          <w:rFonts w:ascii="HelveticaNeueLT Pro 55 Roman" w:hAnsi="HelveticaNeueLT Pro 55 Roman"/>
+          <w:sz w:val="18"/>
+        </w:rPr>
+        <w:t>SQLite, PostgreSQL</w:t>
+      </w:r>
+      <w:r>
+        <w:rPr>
+          <w:rFonts w:ascii="HelveticaNeueLT Pro 55 Roman" w:hAnsi="HelveticaNeueLT Pro 55 Roman"/>
+          <w:sz w:val="18"/>
+        </w:rPr>
+        <w:t>, Anthropic and OpenAI APIs.</w:t>
+      </w:r>
+    </w:p>
+    <w:p>
+      <w:pPr>
+        <w:spacing w:after="40" w:line="264" w:lineRule="auto"/>
+        <w:rPr>
+          <w:rFonts w:ascii="HelveticaNeueLT Pro 55 Roman" w:hAnsi="HelveticaNeueLT Pro 55 Roman"/>
+          <w:b/>
+          <w:sz w:val="18"/>
+          <w:szCs w:val="18"/>
+        </w:rPr>
+      </w:pPr>
+    </w:p>
+    <w:p>
+      <w:pPr>
+        <w:spacing w:after="40" w:line="264" w:lineRule="auto"/>
+        <w:ind w:left="288"/>
+        <w:rPr>
+          <w:rFonts w:ascii="HelveticaNeueLT Pro 55 Roman" w:hAnsi="HelveticaNeueLT Pro 55 Roman"/>
+          <w:sz w:val="18"/>
+        </w:rPr>
+      </w:pPr>
+      <w:r>
+        <w:rPr>
+          <w:rFonts w:ascii="HelveticaNeueLT Pro 55 Roman" w:hAnsi="HelveticaNeueLT Pro 55 Roman"/>
+          <w:b/>
+          <w:sz w:val="22"/>
+        </w:rPr>
+        <w:t>Liberty Pest Control, AI-Powered Business Tools</w:t>
+      </w:r>
+      <w:r>
+        <w:rPr>
+          <w:rFonts w:ascii="HelveticaNeueLT Pro 55 Roman" w:hAnsi="HelveticaNeueLT Pro 55 Roman"/>
+          <w:sz w:val="18"/>
+        </w:rPr>
+        <w:t xml:space="preserve">  (202</w:t>
+      </w:r>
+      <w:r>
+        <w:rPr>
+          <w:rFonts w:ascii="HelveticaNeueLT Pro 55 Roman" w:hAnsi="HelveticaNeueLT Pro 55 Roman"/>
+          <w:sz w:val="18"/>
         </w:rPr>
         <w:t>1</w:t>
       </w:r>
       <w:r>
         <w:rPr>
-          <w:rFonts w:ascii="HelveticaNeueLT Pro 55 Roman" w:hAnsi="HelveticaNeueLT Pro 55 Roman" w:cs="Arial"/>
-          <w:sz w:val="22"/>
-          <w:szCs w:val="20"/>
-        </w:rPr>
-        <w:t xml:space="preserve"> contributor: s</w:t>
-      </w:r>
-      <w:r>
-        <w:rPr>
-          <w:rFonts w:ascii="HelveticaNeueLT Pro 55 Roman" w:hAnsi="HelveticaNeueLT Pro 55 Roman" w:cs="Arial"/>
-          <w:sz w:val="22"/>
-          <w:szCs w:val="20"/>
-        </w:rPr>
-        <w:t xml:space="preserve">pawn storm </w:t>
-      </w:r>
-      <w:r>
-        <w:rPr>
-          <w:rFonts w:ascii="HelveticaNeueLT Pro 55 Roman" w:hAnsi="HelveticaNeueLT Pro 55 Roman" w:cs="Arial"/>
-          <w:sz w:val="22"/>
-          <w:szCs w:val="20"/>
-        </w:rPr>
-        <w:t>defense,</w:t>
-      </w:r>
-      <w:r>
-        <w:rPr>
-          <w:rFonts w:ascii="HelveticaNeueLT Pro 55 Roman" w:hAnsi="HelveticaNeueLT Pro 55 Roman" w:cs="Arial"/>
-          <w:sz w:val="22"/>
-          <w:szCs w:val="20"/>
-        </w:rPr>
-        <w:t xml:space="preserve"> </w:t>
-      </w:r>
-      <w:r>
-        <w:rPr>
-          <w:rFonts w:ascii="HelveticaNeueLT Pro 55 Roman" w:hAnsi="HelveticaNeueLT Pro 55 Roman" w:cs="Arial"/>
-          <w:sz w:val="22"/>
-          <w:szCs w:val="20"/>
-        </w:rPr>
-        <w:t>h</w:t>
-      </w:r>
-      <w:r>
-        <w:rPr>
-          <w:rFonts w:ascii="HelveticaNeueLT Pro 55 Roman" w:hAnsi="HelveticaNeueLT Pro 55 Roman" w:cs="Arial"/>
-          <w:sz w:val="22"/>
-          <w:szCs w:val="20"/>
-        </w:rPr>
-        <w:t xml:space="preserve">ook/worker </w:t>
-      </w:r>
-      <w:r>
-        <w:rPr>
-          <w:rFonts w:ascii="HelveticaNeueLT Pro 55 Roman" w:hAnsi="HelveticaNeueLT Pro 55 Roman" w:cs="Arial"/>
-          <w:sz w:val="22"/>
-          <w:szCs w:val="20"/>
-        </w:rPr>
-        <w:t xml:space="preserve">lifecycle </w:t>
-      </w:r>
-      <w:r>
-        <w:rPr>
-          <w:rFonts w:ascii="HelveticaNeueLT Pro 55 Roman" w:hAnsi="HelveticaNeueLT Pro 55 Roman" w:cs="Arial"/>
-          <w:sz w:val="22"/>
-          <w:szCs w:val="20"/>
-        </w:rPr>
-        <w:t>hardening.</w:t>
+          <w:rFonts w:ascii="HelveticaNeueLT Pro 55 Roman" w:hAnsi="HelveticaNeueLT Pro 55 Roman"/>
+          <w:sz w:val="18"/>
+        </w:rPr>
+        <w:t>-2025</w:t>
+      </w:r>
+      <w:r>
+        <w:rPr>
+          <w:rFonts w:ascii="HelveticaNeueLT Pro 55 Roman" w:hAnsi="HelveticaNeueLT Pro 55 Roman"/>
+          <w:sz w:val="18"/>
+        </w:rPr>
+        <w:t>)</w:t>
       </w:r>
     </w:p>
     <w:p>
@@ -1491,64 +1757,83 @@
           <w:tab w:val="clear" w:pos="288"/>
           <w:tab w:val="left" w:pos="540"/>
         </w:tabs>
-        <w:spacing w:after="40" w:line="264" w:lineRule="auto"/>
-        <w:ind w:left="540" w:hanging="252"/>
-        <w:rPr>
-          <w:rFonts w:ascii="HelveticaNeueLT Pro 55 Roman" w:hAnsi="HelveticaNeueLT Pro 55 Roman" w:cs="Arial"/>
-          <w:sz w:val="22"/>
-          <w:szCs w:val="20"/>
-        </w:rPr>
-      </w:pPr>
-      <w:hyperlink r:id="rId15" w:history="1">
-        <w:r>
-          <w:rPr>
-            <w:rStyle w:val="Hyperlink"/>
-            <w:rFonts w:ascii="HelveticaNeueLT Pro 55 Roman" w:hAnsi="HelveticaNeueLT Pro 55 Roman"/>
-            <w:b/>
-            <w:color w:val="auto"/>
-            <w:sz w:val="22"/>
-            <w:u w:val="none"/>
-          </w:rPr>
-          <w:t>nesquena/hermes-webui</w:t>
-        </w:r>
-      </w:hyperlink>
-      <w:r>
-        <w:rPr>
-          <w:rFonts w:ascii="HelveticaNeueLT Pro 55 Roman" w:hAnsi="HelveticaNeueLT Pro 55 Roman"/>
-          <w:sz w:val="18"/>
-        </w:rPr>
-        <w:t xml:space="preserve">  (16k stars)  ·  </w:t>
-      </w:r>
-      <w:r>
-        <w:rPr>
-          <w:rFonts w:ascii="HelveticaNeueLT Pro 55 Roman" w:hAnsi="HelveticaNeueLT Pro 55 Roman"/>
-          <w:bCs/>
-          <w:sz w:val="18"/>
-        </w:rPr>
-        <w:t>Python, JavaScript, CSS, HTML, Shell</w:t>
-      </w:r>
-      <w:r>
-        <w:rPr>
-          <w:rFonts w:ascii="HelveticaNeueLT Pro 55 Roman" w:hAnsi="HelveticaNeueLT Pro 55 Roman"/>
-          <w:sz w:val="18"/>
-        </w:rPr>
-        <w:t xml:space="preserve">  ·  </w:t>
-      </w:r>
-      <w:r>
-        <w:rPr>
-          <w:rFonts w:ascii="HelveticaNeueLT Pro 55 Roman" w:hAnsi="HelveticaNeueLT Pro 55 Roman"/>
-          <w:sz w:val="22"/>
-          <w:szCs w:val="22"/>
-        </w:rPr>
-        <w:t>Web UI and Bridge API for Hermes Agent. Highest all-time contributor with 300+ PRs across the core product surface</w:t>
-      </w:r>
-      <w:r>
-        <w:rPr>
-          <w:rFonts w:ascii="HelveticaNeueLT Pro 55 Roman" w:hAnsi="HelveticaNeueLT Pro 55 Roman"/>
-          <w:sz w:val="22"/>
-          <w:szCs w:val="22"/>
-        </w:rPr>
-        <w:t>: cost analytics, saved prompts, gateway credential routing, scroll virtualization, session lifecycle.</w:t>
+        <w:spacing w:before="80" w:after="40" w:line="264" w:lineRule="auto"/>
+        <w:ind w:left="547" w:hanging="259"/>
+        <w:rPr>
+          <w:rFonts w:ascii="HelveticaNeueLT Pro 55 Roman" w:hAnsi="HelveticaNeueLT Pro 55 Roman" w:cs="Arial"/>
+          <w:sz w:val="22"/>
+          <w:szCs w:val="20"/>
+        </w:rPr>
+      </w:pPr>
+      <w:r>
+        <w:rPr>
+          <w:rFonts w:ascii="HelveticaNeueLT Pro 55 Roman" w:hAnsi="HelveticaNeueLT Pro 55 Roman"/>
+          <w:sz w:val="22"/>
+        </w:rPr>
+        <w:t>Internal AI platform</w:t>
+      </w:r>
+      <w:r>
+        <w:rPr>
+          <w:rFonts w:ascii="HelveticaNeueLT Pro 55 Roman" w:hAnsi="HelveticaNeueLT Pro 55 Roman"/>
+          <w:sz w:val="22"/>
+        </w:rPr>
+        <w:t xml:space="preserve"> on Next.js </w:t>
+      </w:r>
+      <w:r>
+        <w:rPr>
+          <w:rFonts w:ascii="HelveticaNeueLT Pro 55 Roman" w:hAnsi="HelveticaNeueLT Pro 55 Roman"/>
+          <w:sz w:val="22"/>
+        </w:rPr>
+        <w:t>(</w:t>
+      </w:r>
+      <w:r>
+        <w:rPr>
+          <w:rFonts w:ascii="HelveticaNeueLT Pro 55 Roman" w:hAnsi="HelveticaNeueLT Pro 55 Roman"/>
+          <w:sz w:val="22"/>
+        </w:rPr>
+        <w:t>App Router</w:t>
+      </w:r>
+      <w:r>
+        <w:rPr>
+          <w:rFonts w:ascii="HelveticaNeueLT Pro 55 Roman" w:hAnsi="HelveticaNeueLT Pro 55 Roman"/>
+          <w:sz w:val="22"/>
+        </w:rPr>
+        <w:t>)</w:t>
+      </w:r>
+      <w:r>
+        <w:rPr>
+          <w:rFonts w:ascii="HelveticaNeueLT Pro 55 Roman" w:hAnsi="HelveticaNeueLT Pro 55 Roman"/>
+          <w:sz w:val="22"/>
+        </w:rPr>
+        <w:t>: reads technician field notes from PestPac (MS SQL Server)</w:t>
+      </w:r>
+      <w:r>
+        <w:rPr>
+          <w:rFonts w:ascii="HelveticaNeueLT Pro 55 Roman" w:hAnsi="HelveticaNeueLT Pro 55 Roman"/>
+          <w:sz w:val="22"/>
+        </w:rPr>
+        <w:t xml:space="preserve"> for</w:t>
+      </w:r>
+      <w:r>
+        <w:rPr>
+          <w:rFonts w:ascii="HelveticaNeueLT Pro 55 Roman" w:hAnsi="HelveticaNeueLT Pro 55 Roman"/>
+          <w:sz w:val="22"/>
+        </w:rPr>
+        <w:t xml:space="preserve"> GPT</w:t>
+      </w:r>
+      <w:r>
+        <w:rPr>
+          <w:rFonts w:ascii="HelveticaNeueLT Pro 55 Roman" w:hAnsi="HelveticaNeueLT Pro 55 Roman"/>
+          <w:sz w:val="22"/>
+        </w:rPr>
+        <w:t>-streamed</w:t>
+      </w:r>
+      <w:r>
+        <w:rPr>
+          <w:rFonts w:ascii="HelveticaNeueLT Pro 55 Roman" w:hAnsi="HelveticaNeueLT Pro 55 Roman"/>
+          <w:sz w:val="22"/>
+        </w:rPr>
+        <w:t xml:space="preserve"> contextual customer communications. OpenAI Chat Completions with partial JSON parsing, Realtime Voice API for transcribed calls, hot-swappable UI-editable prompts, three-tier caching (memory, disk, Firebase).</w:t>
       </w:r>
     </w:p>
     <w:p>
@@ -1561,583 +1846,168 @@
           <w:tab w:val="clear" w:pos="288"/>
           <w:tab w:val="left" w:pos="540"/>
         </w:tabs>
-        <w:spacing w:after="40" w:line="264" w:lineRule="auto"/>
-        <w:ind w:left="540" w:hanging="252"/>
-        <w:rPr>
-          <w:rFonts w:ascii="HelveticaNeueLT Pro 55 Roman" w:hAnsi="HelveticaNeueLT Pro 55 Roman" w:cs="Arial"/>
-          <w:sz w:val="22"/>
-          <w:szCs w:val="20"/>
-        </w:rPr>
-      </w:pPr>
-      <w:hyperlink r:id="rId16" w:history="1">
-        <w:r>
-          <w:rPr>
-            <w:rStyle w:val="Hyperlink"/>
-            <w:rFonts w:ascii="HelveticaNeueLT Pro 55 Roman" w:hAnsi="HelveticaNeueLT Pro 55 Roman"/>
-            <w:b/>
-            <w:color w:val="auto"/>
-            <w:sz w:val="22"/>
-            <w:u w:val="none"/>
-          </w:rPr>
-          <w:t>kenn-io/agentsview</w:t>
-        </w:r>
-      </w:hyperlink>
-      <w:r>
-        <w:rPr>
-          <w:rFonts w:ascii="HelveticaNeueLT Pro 55 Roman" w:hAnsi="HelveticaNeueLT Pro 55 Roman"/>
-          <w:sz w:val="18"/>
-        </w:rPr>
-        <w:t xml:space="preserve">  (4k stars)  ·  </w:t>
-      </w:r>
-      <w:r>
-        <w:rPr>
-          <w:rFonts w:ascii="HelveticaNeueLT Pro 55 Roman" w:hAnsi="HelveticaNeueLT Pro 55 Roman"/>
-          <w:bCs/>
-          <w:sz w:val="18"/>
-        </w:rPr>
-        <w:t>Go, TypeScript, Svelte, Rust, Shell</w:t>
-      </w:r>
-      <w:r>
-        <w:rPr>
-          <w:rFonts w:ascii="HelveticaNeueLT Pro 55 Roman" w:hAnsi="HelveticaNeueLT Pro 55 Roman"/>
-          <w:sz w:val="18"/>
-        </w:rPr>
-        <w:t xml:space="preserve">  ·  </w:t>
-      </w:r>
-      <w:r>
-        <w:rPr>
-          <w:rFonts w:ascii="HelveticaNeueLT Pro 55 Roman" w:hAnsi="HelveticaNeueLT Pro 55 Roman"/>
-          <w:sz w:val="22"/>
-          <w:szCs w:val="22"/>
-        </w:rPr>
-        <w:t xml:space="preserve">Local-first analytics for </w:t>
-      </w:r>
-      <w:r>
-        <w:rPr>
-          <w:rFonts w:ascii="HelveticaNeueLT Pro 55 Roman" w:hAnsi="HelveticaNeueLT Pro 55 Roman"/>
-          <w:sz w:val="22"/>
-          <w:szCs w:val="22"/>
-        </w:rPr>
-        <w:t xml:space="preserve">AI </w:t>
-      </w:r>
-      <w:r>
-        <w:rPr>
-          <w:rFonts w:ascii="HelveticaNeueLT Pro 55 Roman" w:hAnsi="HelveticaNeueLT Pro 55 Roman"/>
-          <w:sz w:val="22"/>
-          <w:szCs w:val="22"/>
-        </w:rPr>
-        <w:t xml:space="preserve">agents. </w:t>
-      </w:r>
-      <w:r>
-        <w:rPr>
-          <w:rFonts w:ascii="HelveticaNeueLT Pro 55 Roman" w:hAnsi="HelveticaNeueLT Pro 55 Roman" w:cs="Arial"/>
-          <w:sz w:val="22"/>
-          <w:szCs w:val="20"/>
-        </w:rPr>
-        <w:t>Top third-party contributor: Postgres sync safety, orphan session recovery, parser support.</w:t>
+        <w:spacing w:before="80" w:after="40" w:line="264" w:lineRule="auto"/>
+        <w:ind w:left="547" w:hanging="259"/>
+        <w:rPr>
+          <w:rFonts w:ascii="HelveticaNeueLT Pro 55 Roman" w:hAnsi="HelveticaNeueLT Pro 55 Roman" w:cs="Arial"/>
+          <w:sz w:val="22"/>
+          <w:szCs w:val="20"/>
+        </w:rPr>
+      </w:pPr>
+      <w:r>
+        <w:rPr>
+          <w:rFonts w:ascii="HelveticaNeueLT Pro 55 Roman" w:hAnsi="HelveticaNeueLT Pro 55 Roman" w:cs="Arial"/>
+          <w:sz w:val="22"/>
+          <w:szCs w:val="20"/>
+        </w:rPr>
+        <w:t xml:space="preserve">Vehicle Routing Problem solver for 5,500+ services across 80 technicians: </w:t>
+      </w:r>
+      <w:r>
+        <w:rPr>
+          <w:rFonts w:ascii="HelveticaNeueLT Pro 55 Roman" w:hAnsi="HelveticaNeueLT Pro 55 Roman" w:cs="Arial"/>
+          <w:sz w:val="22"/>
+          <w:szCs w:val="20"/>
+        </w:rPr>
+        <w:t xml:space="preserve">Next.js API routes spawn </w:t>
+      </w:r>
+      <w:r>
+        <w:rPr>
+          <w:rFonts w:ascii="HelveticaNeueLT Pro 55 Roman" w:hAnsi="HelveticaNeueLT Pro 55 Roman" w:cs="Arial"/>
+          <w:sz w:val="22"/>
+          <w:szCs w:val="20"/>
+        </w:rPr>
+        <w:t xml:space="preserve">Node.js worker threads for gap-packing, weighted scoring, and geographic continuity; Leaflet map and multi-tech calendar views with </w:t>
+      </w:r>
+      <w:r>
+        <w:rPr>
+          <w:rFonts w:ascii="HelveticaNeueLT Pro 55 Roman" w:hAnsi="HelveticaNeueLT Pro 55 Roman" w:cs="Arial"/>
+          <w:sz w:val="22"/>
+          <w:szCs w:val="20"/>
+        </w:rPr>
+        <w:t>batched</w:t>
+      </w:r>
+      <w:r>
+        <w:rPr>
+          <w:rFonts w:ascii="HelveticaNeueLT Pro 55 Roman" w:hAnsi="HelveticaNeueLT Pro 55 Roman" w:cs="Arial"/>
+          <w:sz w:val="22"/>
+          <w:szCs w:val="20"/>
+        </w:rPr>
+        <w:t xml:space="preserve"> rendering.</w:t>
       </w:r>
     </w:p>
     <w:p>
       <w:pPr>
-        <w:numPr>
-          <w:ilvl w:val="0"/>
-          <w:numId w:val="1"/>
-        </w:numPr>
-        <w:tabs>
-          <w:tab w:val="clear" w:pos="288"/>
-          <w:tab w:val="left" w:pos="540"/>
-        </w:tabs>
-        <w:spacing w:after="40" w:line="264" w:lineRule="auto"/>
-        <w:ind w:left="540" w:hanging="252"/>
-        <w:rPr>
-          <w:rFonts w:ascii="HelveticaNeueLT Pro 55 Roman" w:hAnsi="HelveticaNeueLT Pro 55 Roman" w:cs="Arial"/>
-          <w:sz w:val="18"/>
-          <w:szCs w:val="18"/>
-        </w:rPr>
-      </w:pPr>
-      <w:hyperlink r:id="rId17" w:history="1">
-        <w:r>
-          <w:rPr>
-            <w:rStyle w:val="Hyperlink"/>
-            <w:rFonts w:ascii="HelveticaNeueLT Pro 55 Roman" w:hAnsi="HelveticaNeueLT Pro 55 Roman"/>
-            <w:b/>
-            <w:color w:val="auto"/>
-            <w:sz w:val="22"/>
-            <w:u w:val="none"/>
-          </w:rPr>
-          <w:t>headroomlabs-ai/headroom</w:t>
-        </w:r>
-      </w:hyperlink>
-      <w:r>
-        <w:rPr>
-          <w:rFonts w:ascii="HelveticaNeueLT Pro 55 Roman" w:hAnsi="HelveticaNeueLT Pro 55 Roman"/>
-          <w:sz w:val="18"/>
-        </w:rPr>
-        <w:t xml:space="preserve"> (</w:t>
-      </w:r>
-      <w:r>
-        <w:rPr>
-          <w:rFonts w:ascii="HelveticaNeueLT Pro 55 Roman" w:hAnsi="HelveticaNeueLT Pro 55 Roman"/>
-          <w:sz w:val="18"/>
-        </w:rPr>
-        <w:t>6</w:t>
-      </w:r>
-      <w:r>
-        <w:rPr>
-          <w:rFonts w:ascii="HelveticaNeueLT Pro 55 Roman" w:hAnsi="HelveticaNeueLT Pro 55 Roman"/>
-          <w:sz w:val="18"/>
-        </w:rPr>
-        <w:t>4</w:t>
-      </w:r>
-      <w:r>
-        <w:rPr>
-          <w:rFonts w:ascii="HelveticaNeueLT Pro 55 Roman" w:hAnsi="HelveticaNeueLT Pro 55 Roman"/>
-          <w:sz w:val="18"/>
-        </w:rPr>
-        <w:t xml:space="preserve">k stars)  ·  </w:t>
-      </w:r>
-      <w:r>
-        <w:rPr>
-          <w:rFonts w:ascii="HelveticaNeueLT Pro 55 Roman" w:hAnsi="HelveticaNeueLT Pro 55 Roman"/>
-          <w:bCs/>
-          <w:sz w:val="18"/>
-        </w:rPr>
-        <w:t>Go, TypeScript, Svelte, Rust</w:t>
-      </w:r>
-      <w:r>
-        <w:rPr>
-          <w:rFonts w:ascii="HelveticaNeueLT Pro 55 Roman" w:hAnsi="HelveticaNeueLT Pro 55 Roman"/>
-          <w:sz w:val="18"/>
-        </w:rPr>
-        <w:t xml:space="preserve">  ·  </w:t>
-      </w:r>
-      <w:r>
-        <w:rPr>
-          <w:rFonts w:ascii="HelveticaNeueLT Pro 55 Roman" w:hAnsi="HelveticaNeueLT Pro 55 Roman"/>
-          <w:sz w:val="22"/>
-          <w:szCs w:val="22"/>
-        </w:rPr>
-        <w:t>Token compression proxy for LLMs. #2 third-party contributor: cache stability, compression-safe tool calls, session fidelity.</w:t>
+        <w:spacing w:before="120" w:after="40" w:line="264" w:lineRule="auto"/>
+        <w:ind w:left="259"/>
+        <w:rPr>
+          <w:rFonts w:ascii="HelveticaNeueLT Pro 55 Roman" w:hAnsi="HelveticaNeueLT Pro 55 Roman" w:cs="Arial"/>
+          <w:sz w:val="22"/>
+          <w:szCs w:val="20"/>
+        </w:rPr>
+      </w:pPr>
+      <w:r>
+        <w:rPr>
+          <w:rFonts w:ascii="HelveticaNeueLT Pro 55 Roman" w:hAnsi="HelveticaNeueLT Pro 55 Roman"/>
+          <w:b/>
+          <w:sz w:val="18"/>
+        </w:rPr>
+        <w:t xml:space="preserve">Stack: </w:t>
+      </w:r>
+      <w:r>
+        <w:rPr>
+          <w:rFonts w:ascii="HelveticaNeueLT Pro 55 Roman" w:hAnsi="HelveticaNeueLT Pro 55 Roman"/>
+          <w:sz w:val="18"/>
+        </w:rPr>
+        <w:t xml:space="preserve">Next.js, React, </w:t>
+      </w:r>
+      <w:r>
+        <w:rPr>
+          <w:rFonts w:ascii="HelveticaNeueLT Pro 55 Roman" w:hAnsi="HelveticaNeueLT Pro 55 Roman"/>
+          <w:sz w:val="18"/>
+        </w:rPr>
+        <w:t xml:space="preserve">React </w:t>
+      </w:r>
+      <w:r>
+        <w:rPr>
+          <w:rFonts w:ascii="HelveticaNeueLT Pro 55 Roman" w:hAnsi="HelveticaNeueLT Pro 55 Roman"/>
+          <w:sz w:val="18"/>
+        </w:rPr>
+        <w:t xml:space="preserve">Query, </w:t>
+      </w:r>
+      <w:r>
+        <w:rPr>
+          <w:rFonts w:ascii="HelveticaNeueLT Pro 55 Roman" w:hAnsi="HelveticaNeueLT Pro 55 Roman"/>
+          <w:sz w:val="18"/>
+        </w:rPr>
+        <w:t>Tailwind CSS, Node.js</w:t>
+      </w:r>
+      <w:r>
+        <w:rPr>
+          <w:rFonts w:ascii="HelveticaNeueLT Pro 55 Roman" w:hAnsi="HelveticaNeueLT Pro 55 Roman"/>
+          <w:sz w:val="18"/>
+        </w:rPr>
+        <w:t xml:space="preserve">, </w:t>
+      </w:r>
+      <w:r>
+        <w:rPr>
+          <w:rFonts w:ascii="HelveticaNeueLT Pro 55 Roman" w:hAnsi="HelveticaNeueLT Pro 55 Roman"/>
+          <w:sz w:val="18"/>
+        </w:rPr>
+        <w:t>Express,</w:t>
+      </w:r>
+      <w:r>
+        <w:rPr>
+          <w:rFonts w:ascii="HelveticaNeueLT Pro 55 Roman" w:hAnsi="HelveticaNeueLT Pro 55 Roman"/>
+          <w:sz w:val="18"/>
+        </w:rPr>
+        <w:t xml:space="preserve"> </w:t>
+      </w:r>
+      <w:r>
+        <w:rPr>
+          <w:rFonts w:ascii="HelveticaNeueLT Pro 55 Roman" w:hAnsi="HelveticaNeueLT Pro 55 Roman"/>
+          <w:sz w:val="18"/>
+        </w:rPr>
+        <w:t>OpenAI API, Firebase, MS SQL Server</w:t>
+      </w:r>
+      <w:r>
+        <w:rPr>
+          <w:rFonts w:ascii="HelveticaNeueLT Pro 55 Roman" w:hAnsi="HelveticaNeueLT Pro 55 Roman"/>
+          <w:sz w:val="18"/>
+        </w:rPr>
+        <w:t>, Redis</w:t>
+      </w:r>
+      <w:r>
+        <w:rPr>
+          <w:rFonts w:ascii="HelveticaNeueLT Pro 55 Roman" w:hAnsi="HelveticaNeueLT Pro 55 Roman"/>
+          <w:sz w:val="18"/>
+        </w:rPr>
+        <w:t>.</w:t>
       </w:r>
     </w:p>
     <w:p>
       <w:pPr>
-        <w:numPr>
-          <w:ilvl w:val="0"/>
-          <w:numId w:val="1"/>
-        </w:numPr>
-        <w:tabs>
-          <w:tab w:val="clear" w:pos="288"/>
-          <w:tab w:val="left" w:pos="540"/>
-        </w:tabs>
-        <w:spacing w:after="40" w:line="264" w:lineRule="auto"/>
-        <w:ind w:left="540" w:hanging="252"/>
-        <w:rPr>
-          <w:rFonts w:ascii="HelveticaNeueLT Pro 55 Roman" w:hAnsi="HelveticaNeueLT Pro 55 Roman" w:cs="Arial"/>
-          <w:sz w:val="18"/>
-          <w:szCs w:val="18"/>
-        </w:rPr>
-      </w:pPr>
-      <w:hyperlink r:id="rId18" w:history="1">
-        <w:proofErr w:type="spellStart"/>
-        <w:r>
-          <w:rPr>
-            <w:rStyle w:val="Hyperlink"/>
-            <w:rFonts w:ascii="HelveticaNeueLT Pro 55 Roman" w:hAnsi="HelveticaNeueLT Pro 55 Roman"/>
-            <w:b/>
-            <w:color w:val="auto"/>
-            <w:sz w:val="22"/>
-            <w:u w:val="none"/>
-          </w:rPr>
-          <w:t>stablyai</w:t>
-        </w:r>
-        <w:proofErr w:type="spellEnd"/>
-        <w:r>
-          <w:rPr>
-            <w:rStyle w:val="Hyperlink"/>
-            <w:rFonts w:ascii="HelveticaNeueLT Pro 55 Roman" w:hAnsi="HelveticaNeueLT Pro 55 Roman"/>
-            <w:b/>
-            <w:color w:val="auto"/>
-            <w:sz w:val="22"/>
-            <w:u w:val="none"/>
-          </w:rPr>
-          <w:t>/orca</w:t>
-        </w:r>
-      </w:hyperlink>
-      <w:r>
-        <w:rPr>
-          <w:rFonts w:ascii="HelveticaNeueLT Pro 55 Roman" w:hAnsi="HelveticaNeueLT Pro 55 Roman"/>
-          <w:b/>
-          <w:sz w:val="22"/>
-        </w:rPr>
-        <w:t xml:space="preserve"> </w:t>
-      </w:r>
-      <w:r>
-        <w:rPr>
-          <w:rFonts w:ascii="HelveticaNeueLT Pro 55 Roman" w:hAnsi="HelveticaNeueLT Pro 55 Roman"/>
-          <w:sz w:val="18"/>
-        </w:rPr>
-        <w:t>(</w:t>
-      </w:r>
-      <w:r>
-        <w:rPr>
-          <w:rFonts w:ascii="HelveticaNeueLT Pro 55 Roman" w:hAnsi="HelveticaNeueLT Pro 55 Roman"/>
-          <w:sz w:val="18"/>
-        </w:rPr>
-        <w:t>37</w:t>
-      </w:r>
-      <w:r>
-        <w:rPr>
-          <w:rFonts w:ascii="HelveticaNeueLT Pro 55 Roman" w:hAnsi="HelveticaNeueLT Pro 55 Roman"/>
-          <w:sz w:val="18"/>
-        </w:rPr>
-        <w:t xml:space="preserve">k stars)  ·  </w:t>
-      </w:r>
-      <w:r>
-        <w:rPr>
-          <w:rFonts w:ascii="HelveticaNeueLT Pro 55 Roman" w:hAnsi="HelveticaNeueLT Pro 55 Roman"/>
-          <w:bCs/>
-          <w:sz w:val="18"/>
-        </w:rPr>
-        <w:t>TypeScript, JavaScript, CSS, HTML</w:t>
-      </w:r>
-      <w:r>
-        <w:rPr>
-          <w:rFonts w:ascii="HelveticaNeueLT Pro 55 Roman" w:hAnsi="HelveticaNeueLT Pro 55 Roman"/>
-          <w:sz w:val="18"/>
-        </w:rPr>
-        <w:t xml:space="preserve">  ·  </w:t>
-      </w:r>
-      <w:r>
-        <w:rPr>
-          <w:rFonts w:ascii="HelveticaNeueLT Pro 55 Roman" w:hAnsi="HelveticaNeueLT Pro 55 Roman"/>
-          <w:sz w:val="22"/>
-          <w:szCs w:val="22"/>
-        </w:rPr>
-        <w:t xml:space="preserve">IDE for parallel coding-agent </w:t>
-      </w:r>
-      <w:proofErr w:type="spellStart"/>
-      <w:r>
-        <w:rPr>
-          <w:rFonts w:ascii="HelveticaNeueLT Pro 55 Roman" w:hAnsi="HelveticaNeueLT Pro 55 Roman"/>
-          <w:sz w:val="22"/>
-          <w:szCs w:val="22"/>
-        </w:rPr>
-        <w:t>worktrees</w:t>
-      </w:r>
-      <w:proofErr w:type="spellEnd"/>
-      <w:r>
-        <w:rPr>
-          <w:rFonts w:ascii="HelveticaNeueLT Pro 55 Roman" w:hAnsi="HelveticaNeueLT Pro 55 Roman"/>
-          <w:sz w:val="22"/>
-          <w:szCs w:val="22"/>
-        </w:rPr>
-        <w:t xml:space="preserve">. #1 third-party contributor: </w:t>
-      </w:r>
-      <w:r>
-        <w:rPr>
-          <w:rFonts w:ascii="HelveticaNeueLT Pro 55 Roman" w:hAnsi="HelveticaNeueLT Pro 55 Roman"/>
-          <w:sz w:val="22"/>
-          <w:szCs w:val="22"/>
-        </w:rPr>
-        <w:t xml:space="preserve">orchestration </w:t>
-      </w:r>
-      <w:r>
-        <w:rPr>
-          <w:rFonts w:ascii="HelveticaNeueLT Pro 55 Roman" w:hAnsi="HelveticaNeueLT Pro 55 Roman"/>
-          <w:sz w:val="22"/>
-          <w:szCs w:val="22"/>
-        </w:rPr>
-        <w:t>management</w:t>
-      </w:r>
-      <w:r>
-        <w:rPr>
-          <w:rFonts w:ascii="HelveticaNeueLT Pro 55 Roman" w:hAnsi="HelveticaNeueLT Pro 55 Roman"/>
-          <w:sz w:val="22"/>
-          <w:szCs w:val="22"/>
-        </w:rPr>
-        <w:t>,</w:t>
-      </w:r>
-      <w:r>
-        <w:rPr>
-          <w:rFonts w:ascii="HelveticaNeueLT Pro 55 Roman" w:hAnsi="HelveticaNeueLT Pro 55 Roman"/>
-          <w:sz w:val="22"/>
-          <w:szCs w:val="22"/>
-        </w:rPr>
-        <w:t xml:space="preserve"> agent observability,</w:t>
-      </w:r>
-      <w:r>
-        <w:rPr>
-          <w:rFonts w:ascii="HelveticaNeueLT Pro 55 Roman" w:hAnsi="HelveticaNeueLT Pro 55 Roman"/>
-          <w:sz w:val="22"/>
-          <w:szCs w:val="22"/>
-        </w:rPr>
-        <w:t xml:space="preserve"> </w:t>
-      </w:r>
-      <w:r>
-        <w:rPr>
-          <w:rFonts w:ascii="HelveticaNeueLT Pro 55 Roman" w:hAnsi="HelveticaNeueLT Pro 55 Roman"/>
-          <w:sz w:val="22"/>
-          <w:szCs w:val="22"/>
-        </w:rPr>
-        <w:t xml:space="preserve">rate-limit </w:t>
-      </w:r>
-      <w:r>
-        <w:rPr>
-          <w:rFonts w:ascii="HelveticaNeueLT Pro 55 Roman" w:hAnsi="HelveticaNeueLT Pro 55 Roman"/>
-          <w:sz w:val="22"/>
-          <w:szCs w:val="22"/>
-        </w:rPr>
-        <w:t>switching</w:t>
-      </w:r>
-      <w:r>
-        <w:rPr>
-          <w:rFonts w:ascii="HelveticaNeueLT Pro 55 Roman" w:hAnsi="HelveticaNeueLT Pro 55 Roman"/>
-          <w:sz w:val="22"/>
-          <w:szCs w:val="22"/>
-        </w:rPr>
-        <w:t>.</w:t>
-      </w:r>
-    </w:p>
-    <w:p>
-      <w:pPr>
-        <w:spacing w:after="40" w:line="264" w:lineRule="auto"/>
-        <w:rPr>
-          <w:rFonts w:ascii="HelveticaNeueLT Pro 55 Roman" w:hAnsi="HelveticaNeueLT Pro 55 Roman"/>
-          <w:b/>
-          <w:sz w:val="22"/>
-        </w:rPr>
-      </w:pPr>
-    </w:p>
-    <w:p>
-      <w:pPr>
-        <w:spacing w:after="40" w:line="264" w:lineRule="auto"/>
-        <w:ind w:left="288"/>
-        <w:rPr>
-          <w:rFonts w:ascii="HelveticaNeueLT Pro 55 Roman" w:hAnsi="HelveticaNeueLT Pro 55 Roman"/>
-          <w:sz w:val="18"/>
-        </w:rPr>
-      </w:pPr>
-      <w:r>
-        <w:rPr>
-          <w:rFonts w:ascii="HelveticaNeueLT Pro 55 Roman" w:hAnsi="HelveticaNeueLT Pro 55 Roman"/>
-          <w:b/>
-          <w:sz w:val="22"/>
-        </w:rPr>
-        <w:t>Liberty Pest Control, AI-Powered Business Tools</w:t>
-      </w:r>
-      <w:r>
-        <w:rPr>
-          <w:rFonts w:ascii="HelveticaNeueLT Pro 55 Roman" w:hAnsi="HelveticaNeueLT Pro 55 Roman"/>
-          <w:sz w:val="18"/>
-        </w:rPr>
-        <w:t xml:space="preserve">  (2024</w:t>
-      </w:r>
-      <w:r>
-        <w:rPr>
-          <w:rFonts w:ascii="HelveticaNeueLT Pro 55 Roman" w:hAnsi="HelveticaNeueLT Pro 55 Roman"/>
-          <w:sz w:val="18"/>
-        </w:rPr>
-        <w:t>-2025</w:t>
-      </w:r>
-      <w:r>
-        <w:rPr>
-          <w:rFonts w:ascii="HelveticaNeueLT Pro 55 Roman" w:hAnsi="HelveticaNeueLT Pro 55 Roman"/>
-          <w:sz w:val="18"/>
-        </w:rPr>
-        <w:t>)</w:t>
-      </w:r>
-    </w:p>
-    <w:p>
-      <w:pPr>
-        <w:numPr>
-          <w:ilvl w:val="0"/>
-          <w:numId w:val="1"/>
-        </w:numPr>
-        <w:tabs>
-          <w:tab w:val="clear" w:pos="288"/>
-          <w:tab w:val="left" w:pos="540"/>
-        </w:tabs>
-        <w:spacing w:after="40" w:line="264" w:lineRule="auto"/>
-        <w:ind w:left="540" w:hanging="252"/>
-        <w:rPr>
-          <w:rFonts w:ascii="HelveticaNeueLT Pro 55 Roman" w:hAnsi="HelveticaNeueLT Pro 55 Roman" w:cs="Arial"/>
-          <w:sz w:val="22"/>
-          <w:szCs w:val="20"/>
-        </w:rPr>
-      </w:pPr>
-      <w:r>
-        <w:rPr>
-          <w:rFonts w:ascii="HelveticaNeueLT Pro 55 Roman" w:hAnsi="HelveticaNeueLT Pro 55 Roman"/>
-          <w:sz w:val="22"/>
-        </w:rPr>
-        <w:t>Internal AI platform</w:t>
-      </w:r>
-      <w:r>
-        <w:rPr>
-          <w:rFonts w:ascii="HelveticaNeueLT Pro 55 Roman" w:hAnsi="HelveticaNeueLT Pro 55 Roman"/>
-          <w:sz w:val="22"/>
-        </w:rPr>
-        <w:t xml:space="preserve"> on Next.js </w:t>
-      </w:r>
-      <w:r>
-        <w:rPr>
-          <w:rFonts w:ascii="HelveticaNeueLT Pro 55 Roman" w:hAnsi="HelveticaNeueLT Pro 55 Roman"/>
-          <w:sz w:val="22"/>
-        </w:rPr>
-        <w:t>(</w:t>
-      </w:r>
-      <w:r>
-        <w:rPr>
-          <w:rFonts w:ascii="HelveticaNeueLT Pro 55 Roman" w:hAnsi="HelveticaNeueLT Pro 55 Roman"/>
-          <w:sz w:val="22"/>
-        </w:rPr>
-        <w:t>App Router</w:t>
-      </w:r>
-      <w:r>
-        <w:rPr>
-          <w:rFonts w:ascii="HelveticaNeueLT Pro 55 Roman" w:hAnsi="HelveticaNeueLT Pro 55 Roman"/>
-          <w:sz w:val="22"/>
-        </w:rPr>
-        <w:t>)</w:t>
-      </w:r>
-      <w:r>
-        <w:rPr>
-          <w:rFonts w:ascii="HelveticaNeueLT Pro 55 Roman" w:hAnsi="HelveticaNeueLT Pro 55 Roman"/>
-          <w:sz w:val="22"/>
-        </w:rPr>
-        <w:t>: reads technician field notes from PestPac (MS SQL Server) through GPT-4o to generate contextual customer communications. OpenAI Chat Completions with partial JSON parsing, Realtime Voice API for transcribed calls, hot-swappable UI-editable prompts, three-tier caching (memory, disk, Firebase).</w:t>
-      </w:r>
-    </w:p>
-    <w:p>
-      <w:pPr>
-        <w:numPr>
-          <w:ilvl w:val="0"/>
-          <w:numId w:val="1"/>
-        </w:numPr>
-        <w:tabs>
-          <w:tab w:val="clear" w:pos="288"/>
-          <w:tab w:val="left" w:pos="540"/>
-        </w:tabs>
-        <w:spacing w:after="40" w:line="264" w:lineRule="auto"/>
-        <w:ind w:left="540" w:hanging="252"/>
-        <w:rPr>
-          <w:rFonts w:ascii="HelveticaNeueLT Pro 55 Roman" w:hAnsi="HelveticaNeueLT Pro 55 Roman" w:cs="Arial"/>
-          <w:sz w:val="22"/>
-          <w:szCs w:val="20"/>
-        </w:rPr>
-      </w:pPr>
-      <w:r>
-        <w:rPr>
-          <w:rFonts w:ascii="HelveticaNeueLT Pro 55 Roman" w:hAnsi="HelveticaNeueLT Pro 55 Roman" w:cs="Arial"/>
-          <w:sz w:val="22"/>
-          <w:szCs w:val="20"/>
-        </w:rPr>
-        <w:t xml:space="preserve">Vehicle Routing Problem solver for 5,500+ services across 80 technicians: </w:t>
-      </w:r>
-      <w:r>
-        <w:rPr>
-          <w:rFonts w:ascii="HelveticaNeueLT Pro 55 Roman" w:hAnsi="HelveticaNeueLT Pro 55 Roman" w:cs="Arial"/>
-          <w:sz w:val="22"/>
-          <w:szCs w:val="20"/>
-        </w:rPr>
-        <w:t xml:space="preserve">Next.js API routes spawn </w:t>
-      </w:r>
-      <w:r>
-        <w:rPr>
-          <w:rFonts w:ascii="HelveticaNeueLT Pro 55 Roman" w:hAnsi="HelveticaNeueLT Pro 55 Roman" w:cs="Arial"/>
-          <w:sz w:val="22"/>
-          <w:szCs w:val="20"/>
-        </w:rPr>
-        <w:t xml:space="preserve">Node.js worker threads for gap-packing, weighted scoring, and geographic continuity; Leaflet map and multi-tech calendar views with </w:t>
-      </w:r>
-      <w:r>
-        <w:rPr>
-          <w:rFonts w:ascii="HelveticaNeueLT Pro 55 Roman" w:hAnsi="HelveticaNeueLT Pro 55 Roman" w:cs="Arial"/>
-          <w:sz w:val="22"/>
-          <w:szCs w:val="20"/>
-        </w:rPr>
-        <w:t>batched</w:t>
-      </w:r>
-      <w:r>
-        <w:rPr>
-          <w:rFonts w:ascii="HelveticaNeueLT Pro 55 Roman" w:hAnsi="HelveticaNeueLT Pro 55 Roman" w:cs="Arial"/>
-          <w:sz w:val="22"/>
-          <w:szCs w:val="20"/>
-        </w:rPr>
-        <w:t xml:space="preserve"> rendering.</w:t>
-      </w:r>
-    </w:p>
-    <w:p>
-      <w:pPr>
         <w:spacing w:before="80" w:after="40" w:line="264" w:lineRule="auto"/>
         <w:ind w:left="259"/>
         <w:rPr>
           <w:rFonts w:ascii="HelveticaNeueLT Pro 55 Roman" w:hAnsi="HelveticaNeueLT Pro 55 Roman" w:cs="Arial"/>
           <w:sz w:val="22"/>
           <w:szCs w:val="20"/>
-        </w:rPr>
-      </w:pPr>
-      <w:r>
-        <w:rPr>
-          <w:rFonts w:ascii="HelveticaNeueLT Pro 55 Roman" w:hAnsi="HelveticaNeueLT Pro 55 Roman"/>
-          <w:b/>
-          <w:sz w:val="18"/>
-        </w:rPr>
-        <w:t xml:space="preserve">Stack: </w:t>
-      </w:r>
-      <w:r>
-        <w:rPr>
-          <w:rFonts w:ascii="HelveticaNeueLT Pro 55 Roman" w:hAnsi="HelveticaNeueLT Pro 55 Roman"/>
-          <w:sz w:val="18"/>
-        </w:rPr>
-        <w:t xml:space="preserve">Next.js, React, TypeScript, </w:t>
-      </w:r>
-      <w:r>
-        <w:rPr>
-          <w:rFonts w:ascii="HelveticaNeueLT Pro 55 Roman" w:hAnsi="HelveticaNeueLT Pro 55 Roman"/>
-          <w:sz w:val="18"/>
-        </w:rPr>
-        <w:t xml:space="preserve">React </w:t>
-      </w:r>
-      <w:r>
-        <w:rPr>
-          <w:rFonts w:ascii="HelveticaNeueLT Pro 55 Roman" w:hAnsi="HelveticaNeueLT Pro 55 Roman"/>
-          <w:sz w:val="18"/>
-        </w:rPr>
-        <w:t xml:space="preserve">Query, </w:t>
-      </w:r>
-      <w:r>
-        <w:rPr>
-          <w:rFonts w:ascii="HelveticaNeueLT Pro 55 Roman" w:hAnsi="HelveticaNeueLT Pro 55 Roman"/>
-          <w:sz w:val="18"/>
-        </w:rPr>
-        <w:t>Tailwind CSS, Node.js/Express, OpenAI API, Firebase, MS SQL Server.</w:t>
-      </w:r>
-    </w:p>
-    <w:p>
-      <w:pPr>
-        <w:spacing w:after="40" w:line="264" w:lineRule="auto"/>
-        <w:rPr>
-          <w:rFonts w:ascii="HelveticaNeueLT Pro 55 Roman" w:hAnsi="HelveticaNeueLT Pro 55 Roman" w:cs="Arial"/>
-          <w:sz w:val="22"/>
-          <w:szCs w:val="22"/>
         </w:rPr>
       </w:pPr>
     </w:p>
     <w:tbl>
       <w:tblPr>
-        <w:tblW w:w="10278" w:type="dxa"/>
+        <w:tblW w:w="10080" w:type="dxa"/>
         <w:tblLook w:val="0000" w:firstRow="0" w:lastRow="0" w:firstColumn="0" w:lastColumn="0" w:noHBand="0" w:noVBand="0"/>
       </w:tblPr>
       <w:tblGrid>
-        <w:gridCol w:w="5085"/>
-        <w:gridCol w:w="5193"/>
+        <w:gridCol w:w="4987"/>
+        <w:gridCol w:w="5093"/>
       </w:tblGrid>
       <w:tr>
         <w:tc>
           <w:tcPr>
-            <w:tcW w:w="5085" w:type="dxa"/>
+            <w:tcW w:w="4987" w:type="dxa"/>
           </w:tcPr>
           <w:p>
             <w:pPr>
@@ -2160,7 +2030,7 @@
         </w:tc>
         <w:tc>
           <w:tcPr>
-            <w:tcW w:w="5193" w:type="dxa"/>
+            <w:tcW w:w="5093" w:type="dxa"/>
             <w:vAlign w:val="bottom"/>
           </w:tcPr>
           <w:p>
@@ -2195,7 +2065,7 @@
           <w:rFonts w:ascii="HelveticaNeueLT Pro 55 Roman" w:hAnsi="HelveticaNeueLT Pro 55 Roman"/>
           <w:sz w:val="25"/>
         </w:rPr>
-        <w:t>Director, Development</w:t>
+        <w:t>Director</w:t>
       </w:r>
       <w:r>
         <w:rPr>
@@ -2253,6 +2123,13 @@
           <w:rFonts w:ascii="HelveticaNeueLT Pro 55 Roman" w:hAnsi="HelveticaNeueLT Pro 55 Roman"/>
           <w:sz w:val="22"/>
         </w:rPr>
+        <w:t xml:space="preserve">join </w:t>
+      </w:r>
+      <w:r>
+        <w:rPr>
+          <w:rFonts w:ascii="HelveticaNeueLT Pro 55 Roman" w:hAnsi="HelveticaNeueLT Pro 55 Roman"/>
+          <w:sz w:val="22"/>
+        </w:rPr>
         <w:t>venture</w:t>
       </w:r>
       <w:r>
@@ -2303,6 +2180,27 @@
           <w:sz w:val="22"/>
         </w:rPr>
         <w:t>compliance.</w:t>
+      </w:r>
+      <w:r>
+        <w:rPr>
+          <w:rFonts w:ascii="HelveticaNeueLT Pro 55 Roman" w:hAnsi="HelveticaNeueLT Pro 55 Roman"/>
+          <w:sz w:val="22"/>
+        </w:rPr>
+        <w:t xml:space="preserve"> Low-latency WebSocket, </w:t>
+      </w:r>
+      <w:r>
+        <w:rPr>
+          <w:rFonts w:ascii="HelveticaNeueLT Pro 55 Roman" w:hAnsi="HelveticaNeueLT Pro 55 Roman"/>
+          <w:sz w:val="22"/>
+        </w:rPr>
+        <w:t>in-memory buffering, batched rendering</w:t>
+      </w:r>
+      <w:r>
+        <w:rPr>
+          <w:rFonts w:ascii="HelveticaNeueLT Pro 55 Roman" w:hAnsi="HelveticaNeueLT Pro 55 Roman"/>
+          <w:sz w:val="22"/>
+        </w:rPr>
+        <w:t>.</w:t>
       </w:r>
     </w:p>
     <w:p>
@@ -2318,17 +2216,17 @@
     </w:p>
     <w:tbl>
       <w:tblPr>
-        <w:tblW w:w="10278" w:type="dxa"/>
+        <w:tblW w:w="10080" w:type="dxa"/>
         <w:tblLook w:val="0000" w:firstRow="0" w:lastRow="0" w:firstColumn="0" w:lastColumn="0" w:noHBand="0" w:noVBand="0"/>
       </w:tblPr>
       <w:tblGrid>
-        <w:gridCol w:w="5085"/>
-        <w:gridCol w:w="5193"/>
+        <w:gridCol w:w="4987"/>
+        <w:gridCol w:w="5093"/>
       </w:tblGrid>
       <w:tr>
         <w:tc>
           <w:tcPr>
-            <w:tcW w:w="5085" w:type="dxa"/>
+            <w:tcW w:w="4987" w:type="dxa"/>
           </w:tcPr>
           <w:p>
             <w:pPr>
@@ -2352,7 +2250,7 @@
         </w:tc>
         <w:tc>
           <w:tcPr>
-            <w:tcW w:w="5193" w:type="dxa"/>
+            <w:tcW w:w="5093" w:type="dxa"/>
             <w:vAlign w:val="bottom"/>
           </w:tcPr>
           <w:p>
@@ -2454,7 +2352,119 @@
           <w:sz w:val="22"/>
           <w:szCs w:val="20"/>
         </w:rPr>
-        <w:t>Marketing agency serving financial services clients. Developed and instrumented campaign websites and microsites for Visa, Barclays, Chase, UBS, and other card program launches.</w:t>
+        <w:t>Marketing agency serving financial services clients. Developed</w:t>
+      </w:r>
+      <w:r>
+        <w:rPr>
+          <w:rFonts w:ascii="HelveticaNeueLT Pro 55 Roman" w:hAnsi="HelveticaNeueLT Pro 55 Roman" w:cs="Arial"/>
+          <w:sz w:val="22"/>
+          <w:szCs w:val="20"/>
+        </w:rPr>
+        <w:t xml:space="preserve"> </w:t>
+      </w:r>
+      <w:r>
+        <w:rPr>
+          <w:rFonts w:ascii="HelveticaNeueLT Pro 55 Roman" w:hAnsi="HelveticaNeueLT Pro 55 Roman" w:cs="Arial"/>
+          <w:sz w:val="22"/>
+          <w:szCs w:val="20"/>
+        </w:rPr>
+        <w:t>and instrumented campaign websites for</w:t>
+      </w:r>
+      <w:r>
+        <w:rPr>
+          <w:rFonts w:ascii="HelveticaNeueLT Pro 55 Roman" w:hAnsi="HelveticaNeueLT Pro 55 Roman" w:cs="Arial"/>
+          <w:sz w:val="22"/>
+          <w:szCs w:val="20"/>
+        </w:rPr>
+        <w:t xml:space="preserve"> </w:t>
+      </w:r>
+      <w:r>
+        <w:rPr>
+          <w:rFonts w:ascii="HelveticaNeueLT Pro 55 Roman" w:hAnsi="HelveticaNeueLT Pro 55 Roman" w:cs="Arial"/>
+          <w:sz w:val="22"/>
+          <w:szCs w:val="20"/>
+        </w:rPr>
+        <w:t xml:space="preserve">Visa, </w:t>
+      </w:r>
+      <w:r>
+        <w:rPr>
+          <w:rFonts w:ascii="HelveticaNeueLT Pro 55 Roman" w:hAnsi="HelveticaNeueLT Pro 55 Roman" w:cs="Arial"/>
+          <w:sz w:val="22"/>
+          <w:szCs w:val="20"/>
+        </w:rPr>
+        <w:t>Barclay</w:t>
+      </w:r>
+      <w:r>
+        <w:rPr>
+          <w:rFonts w:ascii="HelveticaNeueLT Pro 55 Roman" w:hAnsi="HelveticaNeueLT Pro 55 Roman" w:cs="Arial"/>
+          <w:sz w:val="22"/>
+          <w:szCs w:val="20"/>
+        </w:rPr>
+        <w:t>s</w:t>
+      </w:r>
+      <w:r>
+        <w:rPr>
+          <w:rFonts w:ascii="HelveticaNeueLT Pro 55 Roman" w:hAnsi="HelveticaNeueLT Pro 55 Roman" w:cs="Arial"/>
+          <w:sz w:val="22"/>
+          <w:szCs w:val="20"/>
+        </w:rPr>
+        <w:t xml:space="preserve">, Chase, UBS, </w:t>
+      </w:r>
+      <w:r>
+        <w:rPr>
+          <w:rFonts w:ascii="HelveticaNeueLT Pro 55 Roman" w:hAnsi="HelveticaNeueLT Pro 55 Roman" w:cs="Arial"/>
+          <w:sz w:val="22"/>
+          <w:szCs w:val="20"/>
+        </w:rPr>
+        <w:t xml:space="preserve">PNC Bank, </w:t>
+      </w:r>
+      <w:r>
+        <w:rPr>
+          <w:rFonts w:ascii="HelveticaNeueLT Pro 55 Roman" w:hAnsi="HelveticaNeueLT Pro 55 Roman" w:cs="Arial"/>
+          <w:sz w:val="22"/>
+          <w:szCs w:val="20"/>
+        </w:rPr>
+        <w:t>and other</w:t>
+      </w:r>
+      <w:r>
+        <w:rPr>
+          <w:rFonts w:ascii="HelveticaNeueLT Pro 55 Roman" w:hAnsi="HelveticaNeueLT Pro 55 Roman" w:cs="Arial"/>
+          <w:sz w:val="22"/>
+          <w:szCs w:val="20"/>
+        </w:rPr>
+        <w:t xml:space="preserve"> </w:t>
+      </w:r>
+      <w:r>
+        <w:rPr>
+          <w:rFonts w:ascii="HelveticaNeueLT Pro 55 Roman" w:hAnsi="HelveticaNeueLT Pro 55 Roman" w:cs="Arial"/>
+          <w:sz w:val="22"/>
+          <w:szCs w:val="20"/>
+        </w:rPr>
+        <w:t xml:space="preserve">card </w:t>
+      </w:r>
+      <w:r>
+        <w:rPr>
+          <w:rFonts w:ascii="HelveticaNeueLT Pro 55 Roman" w:hAnsi="HelveticaNeueLT Pro 55 Roman" w:cs="Arial"/>
+          <w:sz w:val="22"/>
+          <w:szCs w:val="20"/>
+        </w:rPr>
+        <w:t>launches. Adobe DTM</w:t>
+      </w:r>
+      <w:r>
+        <w:rPr>
+          <w:rFonts w:ascii="HelveticaNeueLT Pro 55 Roman" w:hAnsi="HelveticaNeueLT Pro 55 Roman" w:cs="Arial"/>
+          <w:sz w:val="22"/>
+          <w:szCs w:val="20"/>
+        </w:rPr>
+        <w:t xml:space="preserve"> + Test &amp; Target</w:t>
+      </w:r>
+      <w:r>
+        <w:rPr>
+          <w:rFonts w:ascii="HelveticaNeueLT Pro 55 Roman" w:hAnsi="HelveticaNeueLT Pro 55 Roman" w:cs="Arial"/>
+          <w:sz w:val="22"/>
+          <w:szCs w:val="20"/>
+        </w:rPr>
+        <w:t>.</w:t>
       </w:r>
     </w:p>
     <w:p>
@@ -2468,17 +2478,17 @@
     </w:p>
     <w:tbl>
       <w:tblPr>
-        <w:tblW w:w="10278" w:type="dxa"/>
+        <w:tblW w:w="10080" w:type="dxa"/>
         <w:tblLook w:val="0000" w:firstRow="0" w:lastRow="0" w:firstColumn="0" w:lastColumn="0" w:noHBand="0" w:noVBand="0"/>
       </w:tblPr>
       <w:tblGrid>
-        <w:gridCol w:w="5082"/>
-        <w:gridCol w:w="5196"/>
+        <w:gridCol w:w="4984"/>
+        <w:gridCol w:w="5096"/>
       </w:tblGrid>
       <w:tr>
         <w:tc>
           <w:tcPr>
-            <w:tcW w:w="5082" w:type="dxa"/>
+            <w:tcW w:w="4984" w:type="dxa"/>
           </w:tcPr>
           <w:bookmarkEnd w:id="0"/>
           <w:p>
@@ -2500,7 +2510,7 @@
         </w:tc>
         <w:tc>
           <w:tcPr>
-            <w:tcW w:w="5196" w:type="dxa"/>
+            <w:tcW w:w="5096" w:type="dxa"/>
             <w:vAlign w:val="bottom"/>
           </w:tcPr>
           <w:p>
@@ -2588,7 +2598,23 @@
           <w:sz w:val="22"/>
           <w:szCs w:val="20"/>
         </w:rPr>
-        <w:t xml:space="preserve">Developed headless e-commerce CMS templates. Checkout optimization with </w:t>
+        <w:t xml:space="preserve">Developed </w:t>
+      </w:r>
+      <w:r>
+        <w:rPr>
+          <w:rFonts w:ascii="HelveticaNeueLT Pro 55 Roman" w:hAnsi="HelveticaNeueLT Pro 55 Roman" w:cs="Arial"/>
+          <w:sz w:val="22"/>
+          <w:szCs w:val="20"/>
+        </w:rPr>
+        <w:t>e</w:t>
+      </w:r>
+      <w:r>
+        <w:rPr>
+          <w:rFonts w:ascii="HelveticaNeueLT Pro 55 Roman" w:hAnsi="HelveticaNeueLT Pro 55 Roman" w:cs="Arial"/>
+          <w:sz w:val="22"/>
+          <w:szCs w:val="20"/>
+        </w:rPr>
+        <w:t xml:space="preserve">-commerce CMS templates. Checkout optimization with </w:t>
       </w:r>
       <w:r>
         <w:rPr>
@@ -2604,7 +2630,15 @@
           <w:sz w:val="22"/>
           <w:szCs w:val="20"/>
         </w:rPr>
-        <w:t>multivariate testing.</w:t>
+        <w:t>multivariate testing</w:t>
+      </w:r>
+      <w:r>
+        <w:rPr>
+          <w:rFonts w:ascii="HelveticaNeueLT Pro 55 Roman" w:hAnsi="HelveticaNeueLT Pro 55 Roman" w:cs="Arial"/>
+          <w:sz w:val="22"/>
+          <w:szCs w:val="20"/>
+        </w:rPr>
+        <w:t>.</w:t>
       </w:r>
     </w:p>
     <w:p>
@@ -2619,7 +2653,7 @@
     </w:p>
     <w:tbl>
       <w:tblPr>
-        <w:tblW w:w="10285" w:type="dxa"/>
+        <w:tblW w:w="10080" w:type="dxa"/>
         <w:tblCellMar>
           <w:left w:w="115" w:type="dxa"/>
           <w:right w:w="115" w:type="dxa"/>
@@ -2627,13 +2661,13 @@
         <w:tblLook w:val="0000" w:firstRow="0" w:lastRow="0" w:firstColumn="0" w:lastColumn="0" w:noHBand="0" w:noVBand="0"/>
       </w:tblPr>
       <w:tblGrid>
-        <w:gridCol w:w="5082"/>
-        <w:gridCol w:w="5203"/>
+        <w:gridCol w:w="4981"/>
+        <w:gridCol w:w="5099"/>
       </w:tblGrid>
       <w:tr>
         <w:tc>
           <w:tcPr>
-            <w:tcW w:w="5082" w:type="dxa"/>
+            <w:tcW w:w="4981" w:type="dxa"/>
           </w:tcPr>
           <w:p>
             <w:pPr>
@@ -2655,7 +2689,7 @@
         </w:tc>
         <w:tc>
           <w:tcPr>
-            <w:tcW w:w="5203" w:type="dxa"/>
+            <w:tcW w:w="5099" w:type="dxa"/>
             <w:vAlign w:val="bottom"/>
           </w:tcPr>
           <w:p>
@@ -2743,31 +2777,31 @@
           <w:sz w:val="22"/>
           <w:szCs w:val="20"/>
         </w:rPr>
-        <w:t>Established the WordPress.com VIP Partnership with Automattic</w:t>
-      </w:r>
-      <w:r>
-        <w:rPr>
-          <w:rFonts w:ascii="HelveticaNeueLT Pro 55 Roman" w:hAnsi="HelveticaNeueLT Pro 55 Roman" w:cs="Arial"/>
-          <w:sz w:val="22"/>
-          <w:szCs w:val="20"/>
-        </w:rPr>
-        <w:t>. WordPress Core contributions.</w:t>
-      </w:r>
-      <w:r>
-        <w:rPr>
-          <w:rFonts w:ascii="HelveticaNeueLT Pro 55 Roman" w:hAnsi="HelveticaNeueLT Pro 55 Roman" w:cs="Arial"/>
-          <w:sz w:val="22"/>
-          <w:szCs w:val="20"/>
-        </w:rPr>
-        <w:t xml:space="preserve"> D</w:t>
-      </w:r>
-      <w:r>
-        <w:rPr>
-          <w:rFonts w:ascii="HelveticaNeueLT Pro 55 Roman" w:hAnsi="HelveticaNeueLT Pro 55 Roman" w:cs="Arial"/>
-          <w:sz w:val="22"/>
-          <w:szCs w:val="20"/>
-        </w:rPr>
-        <w:t>esigned NBCOlympics.com video player, viewed 1.3 billion times by 50 million people.</w:t>
+        <w:t xml:space="preserve">Website development (JavaScript, HTML, CSS, </w:t>
+      </w:r>
+      <w:r>
+        <w:rPr>
+          <w:rFonts w:ascii="HelveticaNeueLT Pro 55 Roman" w:hAnsi="HelveticaNeueLT Pro 55 Roman" w:cs="Arial"/>
+          <w:sz w:val="22"/>
+          <w:szCs w:val="20"/>
+        </w:rPr>
+        <w:t>ASP</w:t>
+      </w:r>
+      <w:r>
+        <w:rPr>
+          <w:rFonts w:ascii="HelveticaNeueLT Pro 55 Roman" w:hAnsi="HelveticaNeueLT Pro 55 Roman" w:cs="Arial"/>
+          <w:sz w:val="22"/>
+          <w:szCs w:val="20"/>
+        </w:rPr>
+        <w:t xml:space="preserve">.NET, MS SQL.) </w:t>
+      </w:r>
+      <w:r>
+        <w:rPr>
+          <w:rFonts w:ascii="HelveticaNeueLT Pro 55 Roman" w:hAnsi="HelveticaNeueLT Pro 55 Roman" w:cs="Arial"/>
+          <w:sz w:val="22"/>
+          <w:szCs w:val="20"/>
+        </w:rPr>
+        <w:t>Migrated legacy stack to cloud-based WordPress.com VIP. Contributed to WordPress Core (PHP) in this capacity.</w:t>
       </w:r>
     </w:p>
     <w:p>
@@ -2782,18 +2816,18 @@
     </w:p>
     <w:tbl>
       <w:tblPr>
-        <w:tblW w:w="10332" w:type="dxa"/>
+        <w:tblW w:w="10007" w:type="dxa"/>
         <w:tblInd w:w="73" w:type="dxa"/>
         <w:shd w:val="clear" w:color="auto" w:fill="FFFFFF"/>
         <w:tblLook w:val="0000" w:firstRow="0" w:lastRow="0" w:firstColumn="0" w:lastColumn="0" w:noHBand="0" w:noVBand="0"/>
       </w:tblPr>
       <w:tblGrid>
-        <w:gridCol w:w="10332"/>
+        <w:gridCol w:w="10007"/>
       </w:tblGrid>
       <w:tr>
         <w:tc>
           <w:tcPr>
-            <w:tcW w:w="10332" w:type="dxa"/>
+            <w:tcW w:w="10007" w:type="dxa"/>
             <w:tcBorders>
               <w:bottom w:val="single" w:sz="6" w:space="0" w:color="C0C0C0"/>
             </w:tcBorders>
@@ -2821,7 +2855,7 @@
       <w:tr>
         <w:tc>
           <w:tcPr>
-            <w:tcW w:w="10332" w:type="dxa"/>
+            <w:tcW w:w="10007" w:type="dxa"/>
             <w:tcBorders>
               <w:top w:val="single" w:sz="6" w:space="0" w:color="C0C0C0"/>
             </w:tcBorders>
@@ -2867,7 +2901,25 @@
                 <w:sz w:val="20"/>
                 <w:szCs w:val="20"/>
               </w:rPr>
-              <w:t>TypeScript, React, Next.js, Node.js, PHP, Astro, Tailwind CSS, HTML5, CSS3/SCSS</w:t>
+              <w:t xml:space="preserve">TypeScript, React, Next.js, Node.js, PHP, Astro, Tailwind CSS, HTML5, </w:t>
+            </w:r>
+            <w:r>
+              <w:rPr>
+                <w:rFonts w:ascii="HelveticaNeueLT Pro 55 Roman" w:hAnsi="HelveticaNeueLT Pro 55 Roman"/>
+                <w:bCs/>
+                <w:sz w:val="20"/>
+                <w:szCs w:val="20"/>
+              </w:rPr>
+              <w:t>S</w:t>
+            </w:r>
+            <w:r>
+              <w:rPr>
+                <w:rFonts w:ascii="HelveticaNeueLT Pro 55 Roman" w:hAnsi="HelveticaNeueLT Pro 55 Roman"/>
+                <w:bCs/>
+                <w:sz w:val="20"/>
+                <w:szCs w:val="20"/>
+              </w:rPr>
+              <w:t>CSS</w:t>
             </w:r>
           </w:p>
           <w:p>
@@ -2914,7 +2966,7 @@
                 <w:sz w:val="20"/>
                 <w:szCs w:val="20"/>
               </w:rPr>
-              <w:t>, Anthropic API, MCP, REST APIs, GraphQL, WPGraphQL</w:t>
+              <w:t>, Anthropic API, MCP, REST APIs, GraphQL</w:t>
             </w:r>
           </w:p>
           <w:p>
@@ -2952,7 +3004,45 @@
                 <w:sz w:val="20"/>
                 <w:szCs w:val="20"/>
               </w:rPr>
-              <w:t>Shopify Hydrogen/Liquid, WordPress (Core contributor), WordPress.com VIP, Faust.js</w:t>
+              <w:t>Shopify, WordPress</w:t>
+            </w:r>
+            <w:r>
+              <w:rPr>
+                <w:rFonts w:ascii="HelveticaNeueLT Pro 55 Roman" w:hAnsi="HelveticaNeueLT Pro 55 Roman"/>
+                <w:bCs/>
+                <w:sz w:val="20"/>
+                <w:szCs w:val="20"/>
+              </w:rPr>
+              <w:t xml:space="preserve">, Segment, </w:t>
+            </w:r>
+            <w:proofErr w:type="spellStart"/>
+            <w:r>
+              <w:rPr>
+                <w:rFonts w:ascii="HelveticaNeueLT Pro 55 Roman" w:hAnsi="HelveticaNeueLT Pro 55 Roman"/>
+                <w:bCs/>
+                <w:sz w:val="20"/>
+                <w:szCs w:val="20"/>
+              </w:rPr>
+              <w:t>PostHog</w:t>
+            </w:r>
+            <w:proofErr w:type="spellEnd"/>
+            <w:r>
+              <w:rPr>
+                <w:rFonts w:ascii="HelveticaNeueLT Pro 55 Roman" w:hAnsi="HelveticaNeueLT Pro 55 Roman"/>
+                <w:bCs/>
+                <w:sz w:val="20"/>
+                <w:szCs w:val="20"/>
+              </w:rPr>
+              <w:t xml:space="preserve">, CRO, PPC, SEM, SEO, </w:t>
+            </w:r>
+            <w:r>
+              <w:rPr>
+                <w:rFonts w:ascii="HelveticaNeueLT Pro 55 Roman" w:hAnsi="HelveticaNeueLT Pro 55 Roman"/>
+                <w:bCs/>
+                <w:sz w:val="20"/>
+                <w:szCs w:val="20"/>
+              </w:rPr>
+              <w:t>A/B testing, MVT</w:t>
             </w:r>
           </w:p>
           <w:p>
@@ -2989,34 +3079,7 @@
                 <w:sz w:val="20"/>
                 <w:szCs w:val="20"/>
               </w:rPr>
-              <w:t>Firebase, SQL Server, MongoDB, Leaflet/Mapbox, Turf.js, Vite, Vercel, Netlify, Cloudflare</w:t>
-            </w:r>
-          </w:p>
-          <w:p>
-            <w:pPr>
-              <w:spacing w:after="40" w:line="288" w:lineRule="auto"/>
-              <w:rPr>
-                <w:rFonts w:ascii="HelveticaNeueLT Pro 55 Roman" w:hAnsi="HelveticaNeueLT Pro 55 Roman" w:cs="Arial"/>
-                <w:sz w:val="22"/>
-                <w:szCs w:val="20"/>
-              </w:rPr>
-            </w:pPr>
-            <w:r>
-              <w:rPr>
-                <w:rFonts w:ascii="HelveticaNeueLT Pro 55 Roman" w:hAnsi="HelveticaNeueLT Pro 55 Roman"/>
-                <w:b/>
-                <w:sz w:val="20"/>
-                <w:szCs w:val="20"/>
-              </w:rPr>
-              <w:t>Analytics &amp; Optimization:</w:t>
-            </w:r>
-            <w:r>
-              <w:rPr>
-                <w:rFonts w:ascii="HelveticaNeueLT Pro 55 Roman" w:hAnsi="HelveticaNeueLT Pro 55 Roman"/>
-                <w:sz w:val="20"/>
-                <w:szCs w:val="20"/>
-              </w:rPr>
-              <w:t xml:space="preserve"> A/B testing, conversion optimization, user behavior analytics, PPC/SEM, SEO</w:t>
+              <w:t>Firebase, SQL Server, MongoDB, Leaflet, Turf.js, Vite, Vercel, Netlify, Cloudflare</w:t>
             </w:r>
           </w:p>
         </w:tc>
@@ -3044,13 +3107,13 @@
         <w:tblLook w:val="0000" w:firstRow="0" w:lastRow="0" w:firstColumn="0" w:lastColumn="0" w:noHBand="0" w:noVBand="0"/>
       </w:tblPr>
       <w:tblGrid>
-        <w:gridCol w:w="7135"/>
-        <w:gridCol w:w="3031"/>
+        <w:gridCol w:w="7075"/>
+        <w:gridCol w:w="3005"/>
       </w:tblGrid>
       <w:tr>
         <w:tc>
           <w:tcPr>
-            <w:tcW w:w="10166" w:type="dxa"/>
+            <w:tcW w:w="10080" w:type="dxa"/>
             <w:gridSpan w:val="2"/>
             <w:tcBorders>
               <w:bottom w:val="single" w:sz="6" w:space="0" w:color="C0C0C0"/>
@@ -3080,7 +3143,7 @@
       <w:tr>
         <w:tc>
           <w:tcPr>
-            <w:tcW w:w="7135" w:type="dxa"/>
+            <w:tcW w:w="7075" w:type="dxa"/>
             <w:tcBorders>
               <w:top w:val="single" w:sz="6" w:space="0" w:color="C0C0C0"/>
             </w:tcBorders>
@@ -3132,7 +3195,7 @@
         </w:tc>
         <w:tc>
           <w:tcPr>
-            <w:tcW w:w="3031" w:type="dxa"/>
+            <w:tcW w:w="3005" w:type="dxa"/>
             <w:tcBorders>
               <w:top w:val="single" w:sz="6" w:space="0" w:color="C0C0C0"/>
             </w:tcBorders>
@@ -3179,7 +3242,7 @@
       <w:tr>
         <w:tc>
           <w:tcPr>
-            <w:tcW w:w="7135" w:type="dxa"/>
+            <w:tcW w:w="7075" w:type="dxa"/>
             <w:shd w:val="clear" w:color="auto" w:fill="FFFFFF"/>
             <w:tcMar>
               <w:top w:w="144" w:type="dxa"/>
@@ -3228,7 +3291,7 @@
         </w:tc>
         <w:tc>
           <w:tcPr>
-            <w:tcW w:w="3031" w:type="dxa"/>
+            <w:tcW w:w="3005" w:type="dxa"/>
             <w:shd w:val="clear" w:color="auto" w:fill="FFFFFF"/>
             <w:tcMar>
               <w:top w:w="144" w:type="dxa"/>
@@ -3262,7 +3325,7 @@
       <w:tr>
         <w:tc>
           <w:tcPr>
-            <w:tcW w:w="7135" w:type="dxa"/>
+            <w:tcW w:w="7075" w:type="dxa"/>
             <w:shd w:val="clear" w:color="auto" w:fill="FFFFFF"/>
             <w:tcMar>
               <w:top w:w="144" w:type="dxa"/>
@@ -3287,7 +3350,7 @@
         </w:tc>
         <w:tc>
           <w:tcPr>
-            <w:tcW w:w="3031" w:type="dxa"/>
+            <w:tcW w:w="3005" w:type="dxa"/>
             <w:shd w:val="clear" w:color="auto" w:fill="FFFFFF"/>
             <w:tcMar>
               <w:top w:w="144" w:type="dxa"/>
@@ -3356,7 +3419,7 @@
     <w:p/>
     <w:sectPr>
       <w:pgSz w:w="12240" w:h="15840" w:code="1"/>
-      <w:pgMar w:top="1296" w:right="1152" w:bottom="720" w:left="994" w:header="720" w:footer="720" w:gutter="0"/>
+      <w:pgMar w:top="1440" w:right="1080" w:bottom="1296" w:left="1080" w:header="720" w:footer="720" w:gutter="0"/>
       <w:cols w:space="720"/>
       <w:docGrid w:linePitch="360"/>
     </w:sectPr>
@@ -4509,7 +4572,7 @@
   <w:style w:type="paragraph" w:default="1" w:styleId="Normal">
     <w:name w:val="Normal"/>
     <w:qFormat/>
-    <w:rsid w:val="00ED3B66"/>
+    <w:rsid w:val="00724ACB"/>
     <w:rPr>
       <w:sz w:val="24"/>
       <w:szCs w:val="24"/>

</xml_diff>